<commit_message>
Clarify model use and the first property investigation round
</commit_message>
<xml_diff>
--- a/final-report/report-2026-10-04/Final_Report.docx
+++ b/final-report/report-2026-10-04/Final_Report.docx
@@ -788,7 +788,13 @@
     <w:p>
       <w:pPr/>
       <w:r>
-        <w:t>The 906 reference homes give an upper-quarter cutoff of 29.75 reviews, rounded up to 30. Their hosts stay outside model training and testing. Missing-value treatment and category coding use training data only. Three homes lack minimum-stay values, so their derived one-night acceptance category uses the most common training category. Appendix A gives the preparation details.</w:t>
+        <w:t xml:space="preserve">A separate full-snapshot price check excludes 6,801 listings with missing or out-of-range prices. The supplied recent-review count is zero for 82% of these listings, compared with 23.7% of retained listings. Price screening therefore favours more active homes. Our comparison focuses on established, priced homes.</w:t>
+      </w:r>
+    </w:p>
+    <w:p>
+      <w:pPr/>
+      <w:r>
+        <w:t xml:space="preserve">The 906 reference homes give an upper-quarter cutoff of 29.75 reviews, rounded up to 30. Their hosts stay outside model training and testing. Category definitions were fixed after earlier exploration. Each training sample supplies missing-value replacements and comparable-price medians. Three homes lack minimum-stay values; we fill their one-night acceptance category with the most common training category. Appendix A gives the preparation details.</w:t>
       </w:r>
     </w:p>
     <w:p>
@@ -1002,7 +1008,7 @@
     <w:p>
       <w:pPr/>
       <w:r>
-        <w:t>The complete model beats the baseline in 46 of the 50 tests and falls behind in four. This is a strong reason to use it as an additional screening tool once the client has chosen the search groups.</w:t>
+        <w:t xml:space="preserve">The complete model beats the baseline in 46 of the 50 tests and falls behind in four. This supports using it to prioritise investigations within the chosen groups. Gains vary across the overlapping test samples, so use the average improvement as a planning reference.</w:t>
       </w:r>
     </w:p>
     <w:p>
@@ -1472,7 +1478,7 @@
     <w:p>
       <w:pPr/>
       <w:r>
-        <w:t>We recommend a 25% list as a starting point for planning. Widen it if too few homes meet the client's practical requirements. The right list size depends on the time available for inspections and checks.</w:t>
+        <w:t xml:space="preserve">Use the 25% results to assess investigation capacity. Begin the practical search with ten candidates, then prioritise detailed checks according to available operating information. Widen the pool when too few homes meet the client's requirements.</w:t>
       </w:r>
     </w:p>
     <w:p>
@@ -1567,7 +1573,7 @@
     <w:p>
       <w:pPr/>
       <w:r>
-        <w:t>Rank comparable established homes with the complete model using consistent price, minimum-stay and amenity information. For new rental candidates, label proposed settings and confirm them during investigation.</w:t>
+        <w:t xml:space="preserve">Use the complete model to rank established homes with comparable price, minimum-stay and amenity information. For new rental candidates, use the priority groups to organise the search and compare permissions, rent and operating costs. Scores from proposed settings serve as scenario comparisons. Test these rankings on new openings before using them to choose properties.</w:t>
       </w:r>
     </w:p>
     <w:p>
@@ -1624,15 +1630,16 @@
               <w:right w:val="single" w:sz="4" w:color="D9D9D9"/>
             </w:tcBorders>
             <w:tcMar>
-              <w:top w:w="85" w:type="dxa"/>
+              <w:top w:w="65" w:type="dxa"/>
               <w:left w:w="85" w:type="dxa"/>
-              <w:bottom w:w="85" w:type="dxa"/>
+              <w:bottom w:w="65" w:type="dxa"/>
               <w:right w:w="85" w:type="dxa"/>
             </w:tcMar>
           </w:tcPr>
           <w:p>
             <w:pPr>
-              <w:spacing w:after="60" w:before="60" w:line="252" w:lineRule="auto"/>
+              <w:spacing w:after="40" w:before="40" w:line="252" w:lineRule="auto"/>
+              <w:keepNext/>
             </w:pPr>
             <w:r>
               <w:rPr>
@@ -1655,15 +1662,16 @@
               <w:right w:val="single" w:sz="4" w:color="D9D9D9"/>
             </w:tcBorders>
             <w:tcMar>
-              <w:top w:w="85" w:type="dxa"/>
+              <w:top w:w="65" w:type="dxa"/>
               <w:left w:w="85" w:type="dxa"/>
-              <w:bottom w:w="85" w:type="dxa"/>
+              <w:bottom w:w="65" w:type="dxa"/>
               <w:right w:w="85" w:type="dxa"/>
             </w:tcMar>
           </w:tcPr>
           <w:p>
             <w:pPr>
-              <w:spacing w:after="60" w:before="60" w:line="252" w:lineRule="auto"/>
+              <w:spacing w:after="40" w:before="40" w:line="252" w:lineRule="auto"/>
+              <w:keepNext/>
             </w:pPr>
             <w:r>
               <w:rPr>
@@ -1686,15 +1694,16 @@
               <w:right w:val="single" w:sz="4" w:color="D9D9D9"/>
             </w:tcBorders>
             <w:tcMar>
-              <w:top w:w="85" w:type="dxa"/>
+              <w:top w:w="65" w:type="dxa"/>
               <w:left w:w="85" w:type="dxa"/>
-              <w:bottom w:w="85" w:type="dxa"/>
+              <w:bottom w:w="65" w:type="dxa"/>
               <w:right w:w="85" w:type="dxa"/>
             </w:tcMar>
           </w:tcPr>
           <w:p>
             <w:pPr>
-              <w:spacing w:after="60" w:before="60" w:line="252" w:lineRule="auto"/>
+              <w:spacing w:after="40" w:before="40" w:line="252" w:lineRule="auto"/>
+              <w:keepNext/>
             </w:pPr>
             <w:r>
               <w:rPr>
@@ -1722,15 +1731,16 @@
               <w:right w:val="single" w:sz="4" w:color="D9D9D9"/>
             </w:tcBorders>
             <w:tcMar>
-              <w:top w:w="85" w:type="dxa"/>
+              <w:top w:w="65" w:type="dxa"/>
               <w:left w:w="85" w:type="dxa"/>
-              <w:bottom w:w="85" w:type="dxa"/>
+              <w:bottom w:w="65" w:type="dxa"/>
               <w:right w:w="85" w:type="dxa"/>
             </w:tcMar>
           </w:tcPr>
           <w:p>
             <w:pPr>
-              <w:spacing w:after="60" w:before="60" w:line="252" w:lineRule="auto"/>
+              <w:spacing w:after="40" w:before="40" w:line="252" w:lineRule="auto"/>
+              <w:keepNext/>
             </w:pPr>
             <w:r>
               <w:rPr>
@@ -1753,22 +1763,23 @@
               <w:right w:val="single" w:sz="4" w:color="D9D9D9"/>
             </w:tcBorders>
             <w:tcMar>
-              <w:top w:w="85" w:type="dxa"/>
+              <w:top w:w="65" w:type="dxa"/>
               <w:left w:w="85" w:type="dxa"/>
-              <w:bottom w:w="85" w:type="dxa"/>
+              <w:bottom w:w="65" w:type="dxa"/>
               <w:right w:w="85" w:type="dxa"/>
             </w:tcMar>
           </w:tcPr>
           <w:p>
             <w:pPr>
-              <w:spacing w:after="60" w:before="60" w:line="252" w:lineRule="auto"/>
+              <w:spacing w:after="40" w:before="40" w:line="252" w:lineRule="auto"/>
+              <w:keepNext/>
             </w:pPr>
             <w:r>
               <w:rPr>
                 <w:b w:val="0"/>
                 <w:sz w:val="20"/>
               </w:rPr>
-              <w:t>Find ten candidates across the priority groups</w:t>
+              <w:t xml:space="preserve">Find ten initial candidates and prioritise checks using available operating information</w:t>
             </w:r>
           </w:p>
         </w:tc>
@@ -1784,22 +1795,23 @@
               <w:right w:val="single" w:sz="4" w:color="D9D9D9"/>
             </w:tcBorders>
             <w:tcMar>
-              <w:top w:w="85" w:type="dxa"/>
+              <w:top w:w="65" w:type="dxa"/>
               <w:left w:w="85" w:type="dxa"/>
-              <w:bottom w:w="85" w:type="dxa"/>
+              <w:bottom w:w="65" w:type="dxa"/>
               <w:right w:w="85" w:type="dxa"/>
             </w:tcMar>
           </w:tcPr>
           <w:p>
             <w:pPr>
-              <w:spacing w:after="60" w:before="60" w:line="252" w:lineRule="auto"/>
+              <w:spacing w:after="40" w:before="40" w:line="252" w:lineRule="auto"/>
+              <w:keepNext/>
             </w:pPr>
             <w:r>
               <w:rPr>
                 <w:b w:val="0"/>
                 <w:sz w:val="20"/>
               </w:rPr>
-              <w:t>Confirm availability and property scope</w:t>
+              <w:t xml:space="preserve">Confirm availability; use group priorities for new rentals</w:t>
             </w:r>
           </w:p>
         </w:tc>
@@ -1820,15 +1832,16 @@
               <w:right w:val="single" w:sz="4" w:color="D9D9D9"/>
             </w:tcBorders>
             <w:tcMar>
-              <w:top w:w="85" w:type="dxa"/>
+              <w:top w:w="65" w:type="dxa"/>
               <w:left w:w="85" w:type="dxa"/>
-              <w:bottom w:w="85" w:type="dxa"/>
+              <w:bottom w:w="65" w:type="dxa"/>
               <w:right w:w="85" w:type="dxa"/>
             </w:tcMar>
           </w:tcPr>
           <w:p>
             <w:pPr>
-              <w:spacing w:after="60" w:before="60" w:line="252" w:lineRule="auto"/>
+              <w:spacing w:after="40" w:before="40" w:line="252" w:lineRule="auto"/>
+              <w:keepNext/>
             </w:pPr>
             <w:r>
               <w:rPr>
@@ -1851,15 +1864,16 @@
               <w:right w:val="single" w:sz="4" w:color="D9D9D9"/>
             </w:tcBorders>
             <w:tcMar>
-              <w:top w:w="85" w:type="dxa"/>
+              <w:top w:w="65" w:type="dxa"/>
               <w:left w:w="85" w:type="dxa"/>
-              <w:bottom w:w="85" w:type="dxa"/>
+              <w:bottom w:w="65" w:type="dxa"/>
               <w:right w:w="85" w:type="dxa"/>
             </w:tcMar>
           </w:tcPr>
           <w:p>
             <w:pPr>
-              <w:spacing w:after="60" w:before="60" w:line="252" w:lineRule="auto"/>
+              <w:spacing w:after="40" w:before="40" w:line="252" w:lineRule="auto"/>
+              <w:keepNext/>
             </w:pPr>
             <w:r>
               <w:rPr>
@@ -1882,15 +1896,16 @@
               <w:right w:val="single" w:sz="4" w:color="D9D9D9"/>
             </w:tcBorders>
             <w:tcMar>
-              <w:top w:w="85" w:type="dxa"/>
+              <w:top w:w="65" w:type="dxa"/>
               <w:left w:w="85" w:type="dxa"/>
-              <w:bottom w:w="85" w:type="dxa"/>
+              <w:bottom w:w="65" w:type="dxa"/>
               <w:right w:w="85" w:type="dxa"/>
             </w:tcMar>
           </w:tcPr>
           <w:p>
             <w:pPr>
-              <w:spacing w:after="60" w:before="60" w:line="252" w:lineRule="auto"/>
+              <w:spacing w:after="40" w:before="40" w:line="252" w:lineRule="auto"/>
+              <w:keepNext/>
             </w:pPr>
             <w:r>
               <w:rPr>
@@ -1918,15 +1933,16 @@
               <w:right w:val="single" w:sz="4" w:color="D9D9D9"/>
             </w:tcBorders>
             <w:tcMar>
-              <w:top w:w="85" w:type="dxa"/>
+              <w:top w:w="65" w:type="dxa"/>
               <w:left w:w="85" w:type="dxa"/>
-              <w:bottom w:w="85" w:type="dxa"/>
+              <w:bottom w:w="65" w:type="dxa"/>
               <w:right w:w="85" w:type="dxa"/>
             </w:tcMar>
           </w:tcPr>
           <w:p>
             <w:pPr>
-              <w:spacing w:after="60" w:before="60" w:line="252" w:lineRule="auto"/>
+              <w:spacing w:after="40" w:before="40" w:line="252" w:lineRule="auto"/>
+              <w:keepNext/>
             </w:pPr>
             <w:r>
               <w:rPr>
@@ -1949,15 +1965,16 @@
               <w:right w:val="single" w:sz="4" w:color="D9D9D9"/>
             </w:tcBorders>
             <w:tcMar>
-              <w:top w:w="85" w:type="dxa"/>
+              <w:top w:w="65" w:type="dxa"/>
               <w:left w:w="85" w:type="dxa"/>
-              <w:bottom w:w="85" w:type="dxa"/>
+              <w:bottom w:w="65" w:type="dxa"/>
               <w:right w:w="85" w:type="dxa"/>
             </w:tcMar>
           </w:tcPr>
           <w:p>
             <w:pPr>
-              <w:spacing w:after="60" w:before="60" w:line="252" w:lineRule="auto"/>
+              <w:spacing w:after="40" w:before="40" w:line="252" w:lineRule="auto"/>
+              <w:keepNext/>
             </w:pPr>
             <w:r>
               <w:rPr>
@@ -1980,15 +1997,16 @@
               <w:right w:val="single" w:sz="4" w:color="D9D9D9"/>
             </w:tcBorders>
             <w:tcMar>
-              <w:top w:w="85" w:type="dxa"/>
+              <w:top w:w="65" w:type="dxa"/>
               <w:left w:w="85" w:type="dxa"/>
-              <w:bottom w:w="85" w:type="dxa"/>
+              <w:bottom w:w="65" w:type="dxa"/>
               <w:right w:w="85" w:type="dxa"/>
             </w:tcMar>
           </w:tcPr>
           <w:p>
             <w:pPr>
-              <w:spacing w:after="60" w:before="60" w:line="252" w:lineRule="auto"/>
+              <w:spacing w:after="40" w:before="40" w:line="252" w:lineRule="auto"/>
+              <w:keepNext/>
             </w:pPr>
             <w:r>
               <w:rPr>
@@ -2016,15 +2034,15 @@
               <w:right w:val="single" w:sz="4" w:color="D9D9D9"/>
             </w:tcBorders>
             <w:tcMar>
-              <w:top w:w="85" w:type="dxa"/>
+              <w:top w:w="65" w:type="dxa"/>
               <w:left w:w="85" w:type="dxa"/>
-              <w:bottom w:w="85" w:type="dxa"/>
+              <w:bottom w:w="65" w:type="dxa"/>
               <w:right w:w="85" w:type="dxa"/>
             </w:tcMar>
           </w:tcPr>
           <w:p>
             <w:pPr>
-              <w:spacing w:after="60" w:before="60" w:line="252" w:lineRule="auto"/>
+              <w:spacing w:after="40" w:before="40" w:line="252" w:lineRule="auto"/>
             </w:pPr>
             <w:r>
               <w:rPr>
@@ -2047,15 +2065,15 @@
               <w:right w:val="single" w:sz="4" w:color="D9D9D9"/>
             </w:tcBorders>
             <w:tcMar>
-              <w:top w:w="85" w:type="dxa"/>
+              <w:top w:w="65" w:type="dxa"/>
               <w:left w:w="85" w:type="dxa"/>
-              <w:bottom w:w="85" w:type="dxa"/>
+              <w:bottom w:w="65" w:type="dxa"/>
               <w:right w:w="85" w:type="dxa"/>
             </w:tcMar>
           </w:tcPr>
           <w:p>
             <w:pPr>
-              <w:spacing w:after="60" w:before="60" w:line="252" w:lineRule="auto"/>
+              <w:spacing w:after="40" w:before="40" w:line="252" w:lineRule="auto"/>
             </w:pPr>
             <w:r>
               <w:rPr>
@@ -2078,15 +2096,15 @@
               <w:right w:val="single" w:sz="4" w:color="D9D9D9"/>
             </w:tcBorders>
             <w:tcMar>
-              <w:top w:w="85" w:type="dxa"/>
+              <w:top w:w="65" w:type="dxa"/>
               <w:left w:w="85" w:type="dxa"/>
-              <w:bottom w:w="85" w:type="dxa"/>
+              <w:bottom w:w="65" w:type="dxa"/>
               <w:right w:w="85" w:type="dxa"/>
             </w:tcMar>
           </w:tcPr>
           <w:p>
             <w:pPr>
-              <w:spacing w:after="60" w:before="60" w:line="252" w:lineRule="auto"/>
+              <w:spacing w:after="40" w:before="40" w:line="252" w:lineRule="auto"/>
             </w:pPr>
             <w:r>
               <w:rPr>
@@ -2107,7 +2125,7 @@
     <w:p>
       <w:pPr/>
       <w:r>
-        <w:t>Ten candidates and 30 days are suggested planning limits. Extend the search when needed, and leave unsuitable leases unsigned. If practical testing finds little benefit from the model, use group rates as the main guide.</w:t>
+        <w:t xml:space="preserve">The ten homes form the initial pool. Investigate higher-priority homes first and replace rejected candidates. Ten candidates and 30 days are planning limits; extend the search when needed. If practical testing finds little benefit from the model, use group rates as the main guide.</w:t>
       </w:r>
     </w:p>
     <w:p>
@@ -2151,7 +2169,9 @@
       </w:r>
     </w:p>
     <w:p>
-      <w:pPr/>
+      <w:pPr>
+        <w:spacing w:after="40"/>
+      </w:pPr>
       <w:r>
         <w:t xml:space="preserve">Inside Airbnb. (2026). </w:t>
       </w:r>
@@ -2166,7 +2186,9 @@
       </w:r>
     </w:p>
     <w:p>
-      <w:pPr/>
+      <w:pPr>
+        <w:spacing w:after="40"/>
+      </w:pPr>
       <w:r>
         <w:t xml:space="preserve">R Core Team. (n.d.). </w:t>
       </w:r>
@@ -2193,7 +2215,9 @@
       </w:r>
     </w:p>
     <w:p>
-      <w:pPr/>
+      <w:pPr>
+        <w:spacing w:after="40"/>
+      </w:pPr>
       <w:r>
         <w:t xml:space="preserve">TheNextChapter. (2026). </w:t>
       </w:r>
@@ -2220,7 +2244,9 @@
       </w:r>
     </w:p>
     <w:p>
-      <w:pPr/>
+      <w:pPr>
+        <w:spacing w:after="40"/>
+      </w:pPr>
       <w:r>
         <w:t xml:space="preserve">OpenAI. (2026). </w:t>
       </w:r>
@@ -2235,7 +2261,9 @@
       </w:r>
     </w:p>
     <w:p>
-      <w:pPr/>
+      <w:pPr>
+        <w:spacing w:after="40"/>
+      </w:pPr>
       <w:r>
         <w:t xml:space="preserve">Anthropic. (2026). </w:t>
       </w:r>
@@ -2252,6 +2280,7 @@
     <w:p>
       <w:pPr>
         <w:pStyle w:val="Heading2"/>
+        <w:spacing w:before="120"/>
       </w:pPr>
       <w:r>
         <w:t>AI acknowledgement</w:t>
@@ -3016,37 +3045,37 @@
     <w:p>
       <w:pPr/>
       <w:r>
-        <w:t xml:space="preserve">Data and group checks are in </w:t>
+        <w:t xml:space="preserve">Price diagnostics in reports/supporting/revenue-analysis.md use the supplied count, including one extra boundary date. Main results use reconstructed 365-day counts. Group and temporal checks are in reports/tables and final-presentation/analysis/reference. Model code and results are in final-report/paired-analysis-2026-10-02 and final-report/screening-followup-2026-10-03. The published verifier reconstructs scores and metrics without refitting models or rebuilding raw reviews.</w:t>
       </w:r>
       <w:r>
-        <w:t>reports/tables</w:t>
+        <w:t/>
       </w:r>
       <w:r>
-        <w:t xml:space="preserve"> and </w:t>
+        <w:t xml:space="preserve"/>
       </w:r>
       <w:r>
-        <w:t>final-presentation/analysis/reference</w:t>
+        <w:t/>
       </w:r>
       <w:r>
-        <w:t xml:space="preserve">, which also contains </w:t>
+        <w:t xml:space="preserve"/>
       </w:r>
       <w:r>
-        <w:t>temporal-validation</w:t>
+        <w:t/>
       </w:r>
       <w:r>
-        <w:t xml:space="preserve">. Model results and source scripts are in </w:t>
+        <w:t xml:space="preserve"/>
       </w:r>
       <w:r>
-        <w:t>final-report/paired-analysis-2026-10-02</w:t>
+        <w:t/>
       </w:r>
       <w:r>
-        <w:t xml:space="preserve"> and </w:t>
+        <w:t xml:space="preserve"/>
       </w:r>
       <w:r>
-        <w:t>final-report/screening-followup-2026-10-03</w:t>
+        <w:t/>
       </w:r>
       <w:r>
-        <w:t>. The published verifier reconstructs scores and metrics without refitting coefficients or rebuilding raw reviews.</w:t>
+        <w:t/>
       </w:r>
     </w:p>
     <w:p>

</xml_diff>

<commit_message>
Refine final report business narrative and clarify sample coverage
</commit_message>
<xml_diff>
--- a/final-report/report-2026-10-04/Final_Report.docx
+++ b/final-report/report-2026-10-04/Final_Report.docx
@@ -51,19 +51,19 @@
     <w:p>
       <w:pPr/>
       <w:r>
-        <w:t>Our client plans to rent residential properties and offer short stays through Airbnb. Choosing a property means committing to rent and setup costs before knowing how much guest income it will generate. With limited startup funds, the client needs to decide where to look and which homes deserve a closer inspection.</w:t>
+        <w:t xml:space="preserve">Our client plans to lease homes and offer short stays through Airbnb. Rent and setup costs commit scarce startup funds before guest income arrives. The first task is to focus the property search on areas and home types with stronger evidence of guest activity.</w:t>
       </w:r>
     </w:p>
     <w:p>
       <w:pPr/>
       <w:r>
-        <w:t>We use the Melbourne Inside Airbnb dataset supplied through the subject LMS to help make these choices. Dated guest reviews provide a record of past guest activity. We compare this activity across property groups, then test whether a simple model helps select homes within the most promising groups.</w:t>
+        <w:t xml:space="preserve">We recommend starting with two- and three-bedroom apartments in the City of Melbourne. Three-bedroom houses and townhouses in Yarra Ranges provide a second search option. These groups have the strongest historical review activity in our residential comparison.</w:t>
       </w:r>
     </w:p>
     <w:p>
       <w:pPr/>
       <w:r>
-        <w:t>We recommend starting with two- and three-bedroom apartments in the City of Melbourne. Three-bedroom houses and townhouses in Yarra Ranges offer another search option. Within these groups, 49.6% of homes selected by the model reach at least 30 annual reviews on average, compared with 32.4% using group rates alone. We explain how the client can use these findings to organise a search and assess candidates before signing a lease.</w:t>
+        <w:t xml:space="preserve">We then test how to narrow the search within these groups. When selecting a quarter of homes in each group, a simple model produces lists where 49.6% reach at least 30 annual reviews, compared with 32.4% using group rates alone. This gives the client an evidence-based order for investigating established homes with comparable operating information. Lease permissions, quotes and cash flow determine which candidates to pursue.</w:t>
       </w:r>
     </w:p>
     <w:p>
@@ -77,7 +77,7 @@
     <w:p>
       <w:pPr/>
       <w:r>
-        <w:t>The client faces two decisions. First, which parts of the market deserve attention? Second, how should the client narrow the list of properties found there? We address them through two research questions:</w:t>
+        <w:t xml:space="preserve">The client needs to decide where to search and which properties to investigate first. We address two questions:</w:t>
       </w:r>
     </w:p>
     <w:p>
@@ -95,13 +95,13 @@
     <w:p>
       <w:pPr/>
       <w:r>
-        <w:t>A group combines council area, dwelling type and bedroom count. Our analysis covers standard entire homes with one to three bedrooms and at least one year of recorded review history. We define high review activity as at least 30 reviews in the preceding 365 days. This threshold comes from the upper quarter of a separate reference sample.</w:t>
+        <w:t xml:space="preserve">A group combines council area, dwelling type and bedroom count. We compare entire apartments, houses and townhouses with one to three bedrooms and at least one year of recorded review history. A home reaches our target when it receives at least 30 reviews in the preceding 365 days. The target reflects the upper quarter of a separate reference sample, giving every group the same benchmark.</w:t>
       </w:r>
     </w:p>
     <w:p>
       <w:pPr/>
       <w:r>
-        <w:t>Since the interim report, we have replaced the more complex model with logistic regression and added 50 repeated comparisons, including tests within the three priority groups. All completed analysis uses the supplied dataset.</w:t>
+        <w:t xml:space="preserve">The final analysis builds on the interim report with a simpler logistic regression model and 50 repeated comparisons, including selection within the three priority groups. All analysis uses the Melbourne Inside Airbnb dataset supplied through the subject LMS.</w:t>
       </w:r>
     </w:p>
     <w:p>
@@ -115,19 +115,19 @@
     <w:p>
       <w:pPr/>
       <w:r>
-        <w:t>The dataset contains 25,728 listings collected between 17 June and 1 July 2026 (Inside Airbnb, 2026). We match property details to dated reviews and count reviews in the 365 days before each property's collection date. Calendar availability cannot separate bookings from dates blocked by the host, so we use dated reviews to measure recorded guest activity.</w:t>
+        <w:t xml:space="preserve">The snapshot contains 25,728 listings collected between 17 June and 1 July 2026 (Inside Airbnb, 2026). We link property details to dated reviews and count reviews in the year before each listing's collection date. Reviews record past guest activity. Calendar availability combines bookings and host-blocked dates, making reviews the clearer measure for this comparison.</w:t>
       </w:r>
     </w:p>
     <w:p>
       <w:pPr/>
       <w:r>
-        <w:t>We keep entire rental units, condos, homes and townhouses with one to three bedrooms. We combine rental units and condos as apartments/units, and homes and townhouses as houses/townhouses. These types fit the client's leasing business. Homes need a quoted nightly price of AUD30-1,500 and a first review at least 365 days before collection. The price range is an initial analysis boundary; the history rule provides a longer review record.</w:t>
+        <w:t xml:space="preserve">Our residential scope includes four recorded property types: entire rental units, condos, homes and townhouses. Rental units and condos form the apartment/unit category; homes and townhouses form the house/townhouse category. We keep one to three bedrooms, quoted nightly prices of AUD30-1,500 and a first review at least 365 days before collection. The price range sets an exploratory boundary, while the history rule gives each home a full year of observable review history.</w:t>
       </w:r>
     </w:p>
     <w:p>
       <w:pPr/>
       <w:r>
-        <w:t>We set aside reference hosts before modelling, dividing the 6,891 eligible homes into 5,549 analysis homes and 1,342 reference homes. Keeping groups with at least 50 analysis homes provides a minimum base for comparison. Table 1 shows the sample.</w:t>
+        <w:t xml:space="preserve">These rules leave 6,891 eligible homes. We set aside 1,342 homes from separate reference hosts, leaving 5,549 for analysis. Retaining groups with at least 50 analysis homes leaves 3,873 homes in 14 groups. The reference sample then contains 906 homes in those same groups. Table 1 separates the analysis path from the reference branch.</w:t>
       </w:r>
     </w:p>
     <w:p>
@@ -138,7 +138,7 @@
         <w:rPr>
           <w:b/>
         </w:rPr>
-        <w:t>Table 1. How the comparison sample is formed</w:t>
+        <w:t xml:space="preserve">Table 1. From the supplied listings to the comparison sample</w:t>
       </w:r>
     </w:p>
     <w:tbl>
@@ -192,7 +192,7 @@
                 <w:b/>
                 <w:sz w:val="20"/>
               </w:rPr>
-              <w:t>Population</w:t>
+              <w:t xml:space="preserve">Sample stage</w:t>
             </w:r>
           </w:p>
         </w:tc>
@@ -260,7 +260,7 @@
                 <w:b w:val="0"/>
                 <w:sz w:val="20"/>
               </w:rPr>
-              <w:t>Supplied snapshot</w:t>
+              <w:t xml:space="preserve">Supplied snapshot covering all listing types</w:t>
             </w:r>
           </w:p>
         </w:tc>
@@ -396,7 +396,7 @@
                 <w:b w:val="0"/>
                 <w:sz w:val="20"/>
               </w:rPr>
-              <w:t>Four standard dwelling types</w:t>
+              <w:t xml:space="preserve">Rental units, condos, homes and townhouses</w:t>
             </w:r>
           </w:p>
         </w:tc>
@@ -464,7 +464,7 @@
                 <w:b w:val="0"/>
                 <w:sz w:val="20"/>
               </w:rPr>
-              <w:t>Eligible prices and review history</w:t>
+              <w:t xml:space="preserve">Nightly price AUD30-1,500 and at least 365 days of review history</w:t>
             </w:r>
           </w:p>
         </w:tc>
@@ -532,7 +532,7 @@
                 <w:b w:val="0"/>
                 <w:sz w:val="20"/>
               </w:rPr>
-              <w:t>Analysis population before minimum group size</w:t>
+              <w:t xml:space="preserve">Analysis homes after reference hosts are set aside</w:t>
             </w:r>
           </w:p>
         </w:tc>
@@ -600,7 +600,7 @@
                 <w:b w:val="0"/>
                 <w:sz w:val="20"/>
               </w:rPr>
-              <w:t>Final analysis sample in 14 groups</w:t>
+              <w:t xml:space="preserve">Final analysis homes in groups with at least 50 homes each</w:t>
             </w:r>
           </w:p>
         </w:tc>
@@ -668,7 +668,7 @@
                 <w:b w:val="0"/>
                 <w:sz w:val="20"/>
               </w:rPr>
-              <w:t>Separate reference population before group restriction</w:t>
+              <w:t xml:space="preserve">Separate reference branch before group restriction</w:t>
             </w:r>
           </w:p>
         </w:tc>
@@ -736,7 +736,7 @@
                 <w:b w:val="0"/>
                 <w:sz w:val="20"/>
               </w:rPr>
-              <w:t>Reference within the same 14 groups</w:t>
+              <w:t xml:space="preserve">Reference homes within the same 14 groups</w:t>
             </w:r>
           </w:p>
         </w:tc>
@@ -782,19 +782,19 @@
     <w:p>
       <w:pPr/>
       <w:r>
-        <w:t>The final comparison uses 3,873 homes from 1,726 hosts across six council areas. About 64% are in the City of Melbourne. The median home has 15 annual reviews, and 334 homes, or 8.6%, have none. Keeping these zero-review homes makes quieter listings part of the comparison.</w:t>
+        <w:t xml:space="preserve">The 3,873 homes belong to 1,726 hosts across six council areas; about 64% are in the City of Melbourne. The median home has 15 annual reviews. We retain all 334 homes with zero annual reviews, or 8.6%, so the comparison includes quieter properties.</w:t>
       </w:r>
     </w:p>
     <w:p>
       <w:pPr/>
       <w:r>
-        <w:t xml:space="preserve">A separate full-snapshot price check excludes 6,801 listings with missing or out-of-range prices. The supplied recent-review count is zero for 82% of these listings, compared with 23.7% of retained listings. Price screening therefore favours more active homes. Our comparison focuses on established, priced homes.</w:t>
+        <w:t xml:space="preserve">A separate check across the full snapshot finds 6,801 listings with missing or out-of-range prices. The supplied recent-review count is zero for 82% of these listings, against 23.7% of listings retained by the price check. The price rule therefore shifts the sample towards more active properties. The findings describe established, priced residential homes in the covered areas.</w:t>
       </w:r>
     </w:p>
     <w:p>
       <w:pPr/>
       <w:r>
-        <w:t xml:space="preserve">The 906 reference homes give an upper-quarter cutoff of 29.75 reviews, rounded up to 30. Their hosts stay outside model training and testing. Category definitions were fixed after earlier exploration. Each training sample supplies missing-value replacements and comparable-price medians. Three homes lack minimum-stay values; we fill their one-night acceptance category with the most common training category. Appendix A gives the preparation details.</w:t>
+        <w:t xml:space="preserve">The 906 reference homes have an upper-quarter cutoff of 29.75 reviews, rounded up to 30. Their hosts remain separate from model training and testing. Category definitions were fixed after earlier exploration; each training sample supplies missing-value replacements and comparable-price medians. Three missing minimum-stay values are filled using the most common training category. Appendix A records the preparation details.</w:t>
       </w:r>
     </w:p>
     <w:p>
@@ -808,37 +808,37 @@
     <w:p>
       <w:pPr/>
       <w:r>
-        <w:t>We begin with a straightforward comparison: what share of homes in each group reach 30 annual reviews? We also resample hosts and recalculate the shares to show how much the results vary. Each host's properties stay together because they can share management practices.</w:t>
+        <w:t xml:space="preserve">We first compare the share of homes reaching 30 annual reviews in each group. Repeating the calculation on resampled hosts shows how much those shares vary. Each host's properties stay together because they can share management practices.</w:t>
       </w:r>
     </w:p>
     <w:p>
       <w:pPr/>
       <w:r>
-        <w:t>For individual homes, we use logistic regression in R (R Core Team, n.d.). It suits our two possible outcomes: a home either reaches 30 reviews or falls below that level. The model learns weights from training homes for six inputs: council area, dwelling type, bedrooms, price compared with similar homes, acceptance of one-night stays and number of amenities. It adds their weighted contributions to form a ranking score. Across the 50 fits, lower relative prices, one-night acceptance and more amenities raise the score when other inputs stay the same. Higher-scoring homes come earlier in the investigation list.</w:t>
+        <w:t xml:space="preserve">We use logistic regression in R to rank individual homes (R Core Team, n.d.). Its outcome is whether a home reaches 30 annual reviews. The six inputs are council area, dwelling type, bedroom count, price relative to similar homes, acceptance of one-night stays and amenity count. The model learns a weight for each input from training homes and combines their contributions into a score. Higher scores move homes earlier in the investigation list.</w:t>
       </w:r>
     </w:p>
     <w:p>
       <w:pPr/>
       <w:r>
-        <w:t>The group-rate baseline uses each group's training rate, adjusted towards the overall training rate. Homes in the same group receive the same score, leaving them equally ranked. We also test a reduced model without price and minimum-stay information to measure how much those two inputs add together.</w:t>
+        <w:t xml:space="preserve">Our comparison method assigns every home its group's training success rate, adjusted towards the overall training rate. Homes in one group receive equal scores. A second model removes price and minimum-stay information, showing how much these operating details add to selection.</w:t>
       </w:r>
     </w:p>
     <w:p>
       <w:pPr/>
       <w:r>
-        <w:t>We test the methods 50 times. Each time, 70% of hosts provide training homes and the remaining 30% provide test homes. Homes from the same host always stay on the same side. All methods see the same test homes and select the same number for investigation.</w:t>
+        <w:t xml:space="preserve">We compare the methods over 50 host splits. Each split uses 70% of hosts for training and 30% for testing. All properties belonging to a host stay on the same side. The methods select equal numbers from the same test homes, keeping the comparison fair.</w:t>
       </w:r>
     </w:p>
     <w:p>
       <w:pPr/>
       <w:r>
-        <w:t>Our main test selects 25% of homes separately within each priority group, asking whether the model helps once the search areas are decided. We average the selected homes' target rate over 50 tests. Trying 10% and 50% lists shows the effect of changing investigation capacity. Appendix A explains rounding and equal treatment of tied scores.</w:t>
+        <w:t xml:space="preserve">The main comparison selects 25% of homes separately within each priority group and averages the selected homes' target rate across the 50 tests. We also test 10% and 50% to show how investigation capacity affects the results. Appendix A explains rounding and tied scores.</w:t>
       </w:r>
     </w:p>
     <w:p>
       <w:pPr/>
       <w:r>
-        <w:t>Finally, we reconstruct two annual review windows from the same snapshot for homes with longer histories. We identify the earlier leading groups and check their performance in the later year. That comparison uses its own 34-review target, set from the earlier reference window.</w:t>
+        <w:t xml:space="preserve">To check whether the search priorities hold across time, we reconstruct two consecutive annual review windows from the same snapshot. We choose the earlier leading groups and follow their activity in the later window. This separate comparison uses a 34-review target, fixed from the earlier reference window.</w:t>
       </w:r>
     </w:p>
     <w:p>
@@ -854,19 +854,19 @@
         <w:pStyle w:val="Heading2"/>
       </w:pPr>
       <w:r>
-        <w:t>City apartments provide a clear starting point</w:t>
+        <w:t xml:space="preserve">City apartments are the first search priority</w:t>
       </w:r>
     </w:p>
     <w:p>
       <w:pPr/>
       <w:r>
-        <w:t>Across the full analysis sample, 981 of 3,873 homes reach 30 annual reviews, or 25.3%. Group rates range from 8.2% to 36.6%. A single average would hide these differences.</w:t>
+        <w:t xml:space="preserve">Across the analysis sample, 981 of 3,873 homes reach 30 annual reviews, or 25.3%. Group rates range from 8.2% to 36.6%, giving the client a clear reason to focus the search.</w:t>
       </w:r>
     </w:p>
     <w:p>
       <w:pPr/>
       <w:r>
-        <w:t>City of Melbourne three-bedroom apartments have the highest observed rate: 112 of 306 homes reach the target, or 36.6%. Two-bedroom apartments follow at 32.8%, with 405 of 1,235 homes qualifying. Yarra Ranges three-bedroom houses and townhouses reach 30.0%, or 27 of 90 homes. The two city groups combine stronger observed activity with larger samples, making them our first search priority.</w:t>
+        <w:t xml:space="preserve">City of Melbourne three-bedroom apartments lead at 36.6%, with 112 of 306 homes reaching the target. Two-bedroom apartments follow at 32.8%, or 405 of 1,235. Yarra Ranges three-bedroom houses and townhouses reach 30.0%, or 27 of 90. The city groups combine stronger observed activity with larger samples, supporting their position as the first search priority.</w:t>
       </w:r>
     </w:p>
     <w:p>
@@ -927,7 +927,7 @@
     <w:p>
       <w:pPr/>
       <w:r>
-        <w:t>The same three groups remain when the minimum size is 30 or 75 homes, or when we remove the price or history restriction. Broader rules can swap second and third place. The useful result is the shortlist of three groups. Specialised accommodation changes that list, so we keep the residential scope that matches the client's search.</w:t>
+        <w:t xml:space="preserve">The same three groups lead when minimum group size changes to 30 or 75 homes, or when the price or history rule is removed. Their order can change, so use the three-group shortlist to guide the search. Adding specialised accommodation changes the shortlist and addresses a broader market than the client's residential search.</w:t>
       </w:r>
     </w:p>
     <w:p>
@@ -935,19 +935,19 @@
         <w:pStyle w:val="Heading2"/>
       </w:pPr>
       <w:r>
-        <w:t>The model helps narrow the list within these groups</w:t>
+        <w:t xml:space="preserve">The model improves selection within the priority groups</w:t>
       </w:r>
     </w:p>
     <w:p>
       <w:pPr/>
       <w:r>
-        <w:t>Choosing a group still leaves many homes to investigate. The complete model helps with this next decision. When each method selects 25% within each priority group, the selected homes' average historical target rate is 49.6% for the complete model, 38.6% for the reduced model and 32.4% for the group-rate baseline.</w:t>
+        <w:t xml:space="preserve">The complete model helps decide which homes to investigate first. Selecting 25% within each priority group produces an average historical target rate of 49.6%, compared with 38.6% for the model without price and minimum stay and 32.4% for group rates alone.</w:t>
       </w:r>
     </w:p>
     <w:p>
       <w:pPr/>
       <w:r>
-        <w:t>The complete model's gain is 17.2 percentage points. In practical terms, a list of 100 selected homes contains about 17 more homes with at least 30 annual reviews than a list selected using group rates alone. The model improves the concentration of past guest activity in the investigation list.</w:t>
+        <w:t xml:space="preserve">The complete model adds 17.2 percentage points. For a list of 100 selected homes, that means about 17 more homes with at least 30 annual reviews. It directs investigation time towards homes with stronger recorded guest activity.</w:t>
       </w:r>
     </w:p>
     <w:p>
@@ -1008,13 +1008,13 @@
     <w:p>
       <w:pPr/>
       <w:r>
-        <w:t xml:space="preserve">The complete model beats the baseline in 46 of the 50 tests and falls behind in four. This supports using it to prioritise investigations within the chosen groups. Gains vary across the overlapping test samples, so use the average improvement as a planning reference.</w:t>
+        <w:t xml:space="preserve">The complete model leads in 46 of the 50 tests and trails in four. Gains fluctuate: the middle 90% run from -0.7 to 31.8 percentage points. These overlapping historical tests support prioritising investigations while showing how much performance varies with the homes available.</w:t>
       </w:r>
     </w:p>
     <w:p>
       <w:pPr/>
       <w:r>
-        <w:t>Price and minimum-stay information make a substantial difference. Including them raises the average selected rate by 11.0 percentage points over the reduced model. Within a fixed group, the reduced model can distinguish homes only by amenity count. In City of Melbourne three-bedroom apartments, its rate is 33.9%, below the baseline's 35.9%. Our recommendation is therefore to use the complete model for homes with comparable operating information. Group comparisons provide the starting point when that information is unavailable.</w:t>
+        <w:t xml:space="preserve">Price and minimum-stay information add 11.0 percentage points over the reduced model. Within a fixed group, that reduced model ranks homes using amenity count alone. For city three-bedroom apartments, it reaches 33.9%, below the baseline's 35.9%. The full six-input model is therefore the stronger tool for established homes with comparable operating details. New rental searches start with the group priorities.</w:t>
       </w:r>
     </w:p>
     <w:p>
@@ -1022,13 +1022,13 @@
         <w:pStyle w:val="Heading2"/>
       </w:pPr>
       <w:r>
-        <w:t>Investigation capacity changes what the client finds</w:t>
+        <w:t xml:space="preserve">Investigation capacity determines list size and coverage</w:t>
       </w:r>
     </w:p>
     <w:p>
       <w:pPr/>
       <w:r>
-        <w:t>A smaller list concentrates attention on homes with stronger historical activity. A larger list finds more of the homes that reach the target. Table 2 shows this trade-off for the complete model within the three priority groups.</w:t>
+        <w:t xml:space="preserve">Shorter lists concentrate on stronger historical activity. Longer lists capture more qualifying homes. Table 2 shows the choice available to a client with limited investigation time.</w:t>
       </w:r>
     </w:p>
     <w:p>
@@ -1472,13 +1472,13 @@
     <w:p>
       <w:pPr/>
       <w:r>
-        <w:t>Values are averages over the 50 tests. At 10% capacity, more than half the selected homes reach the target, but the list finds only 17.1% of all qualifying homes in these groups. At 50%, it finds about two-thirds. The model improves on the baseline at every tested capacity on average, by 22.0, 17.2 and 10.7 percentage points respectively.</w:t>
+        <w:t xml:space="preserve">Values are averages over the 50 tests. Investigating 10% gives a list where more than half reach the target, while capturing 17.1% of all qualifying homes. At 50%, the list captures about two-thirds. Average gains over group rates are 22.0, 17.2 and 10.7 percentage points at the three capacities.</w:t>
       </w:r>
     </w:p>
     <w:p>
       <w:pPr/>
       <w:r>
-        <w:t xml:space="preserve">Use the 25% results to assess investigation capacity. Begin the practical search with ten candidates, then prioritise detailed checks according to available operating information. Widen the pool when too few homes meet the client's requirements.</w:t>
+        <w:t xml:space="preserve">The 25% result is a reference for allocating investigation effort. Our proposed first round starts with ten available candidates, checked in priority order. The operator chooses how many detailed checks the budget supports and expands the pool when suitable homes are scarce.</w:t>
       </w:r>
     </w:p>
     <w:p>
@@ -1486,13 +1486,13 @@
         <w:pStyle w:val="Heading2"/>
       </w:pPr>
       <w:r>
-        <w:t>Earlier leading groups stay ahead in the following year</w:t>
+        <w:t xml:space="preserve">Earlier leading groups retain their advantage</w:t>
       </w:r>
     </w:p>
     <w:p>
       <w:pPr/>
       <w:r>
-        <w:t>The two-year comparison follows 2,657 homes across ten groups. At the fixed 34-review target, 27.1% of homes in the earlier top-three groups qualify in the later year, compared with 14.9% elsewhere. They retain an advantage of around 12 percentage points.</w:t>
+        <w:t xml:space="preserve">The two-year comparison follows the same 2,657 homes across ten groups. In the later year, 27.1% of homes in the earlier leading three groups reach the fixed 34-review target, compared with 14.9% in the other seven groups. The advantage is 12.3 percentage points.</w:t>
       </w:r>
     </w:p>
     <w:p>
@@ -1553,7 +1553,7 @@
     <w:p>
       <w:pPr/>
       <w:r>
-        <w:t>The earlier leaders stay ahead as activity falls. Keep them on the search list and check current conditions for each property.</w:t>
+        <w:t xml:space="preserve">The leading groups retain their relative advantage as overall activity falls. This supports keeping them as search priorities and assessing current demand for each candidate property.</w:t>
       </w:r>
     </w:p>
     <w:p>
@@ -1567,19 +1567,19 @@
     <w:p>
       <w:pPr/>
       <w:r>
-        <w:t>Search City of Melbourne two- and three-bedroom apartments first. Consider Yarra Ranges three-bedroom houses and townhouses when city homes have unsuitable lease terms or limited availability.</w:t>
+        <w:t xml:space="preserve">Search City of Melbourne two- and three-bedroom apartments first. Use Yarra Ranges three-bedroom houses and townhouses as an alternative when city lease terms or availability are unsuitable.</w:t>
       </w:r>
     </w:p>
     <w:p>
       <w:pPr/>
       <w:r>
-        <w:t xml:space="preserve">Use the complete model to rank established homes with comparable price, minimum-stay and amenity information. For new rental candidates, use the priority groups to organise the search and compare permissions, rent and operating costs. Scores from proposed settings serve as scenario comparisons. Test these rankings on new openings before using them to choose properties.</w:t>
+        <w:t xml:space="preserve">For established homes, collect comparable nightly prices, minimum-stay rules and amenity information, then use the complete model to order investigations. For new rentals, use group priorities and compare permissions, rent and operating costs. Scores based on proposed settings are scenario estimates; their use for selecting new openings needs a prospective test.</w:t>
       </w:r>
     </w:p>
     <w:p>
       <w:pPr/>
       <w:r>
-        <w:t>Before signing, confirm permitted short-stay use in writing and obtain rent, setup and operating cost quotes. Assess achievable nightly rates and paid nights. Proceed when the expected and downside cash flows meet the client's agreed return and cash-buffer requirements.</w:t>
+        <w:t xml:space="preserve">Before signing, obtain written confirmation of permitted short-stay use and quotes for rent, setup and operating costs. Estimate cash flow using achievable nightly rates and paid nights under expected and weaker-demand conditions. Choose a property that meets the client's agreed return and cash-buffer requirements under both conditions.</w:t>
       </w:r>
     </w:p>
     <w:p>
@@ -1779,7 +1779,7 @@
                 <w:b w:val="0"/>
                 <w:sz w:val="20"/>
               </w:rPr>
-              <w:t xml:space="preserve">Find ten initial candidates and prioritise checks using available operating information</w:t>
+              <w:t xml:space="preserve">Find ten available candidates in the priority groups and order investigations using comparable operating details</w:t>
             </w:r>
           </w:p>
         </w:tc>
@@ -1811,7 +1811,7 @@
                 <w:b w:val="0"/>
                 <w:sz w:val="20"/>
               </w:rPr>
-              <w:t xml:space="preserve">Confirm availability; use group priorities for new rentals</w:t>
+              <w:t xml:space="preserve">Use group priorities for new rentals</w:t>
             </w:r>
           </w:p>
         </w:tc>
@@ -1880,7 +1880,7 @@
                 <w:b w:val="0"/>
                 <w:sz w:val="20"/>
               </w:rPr>
-              <w:t>Check permissions, obtain quotes and assess guest demand</w:t>
+              <w:t xml:space="preserve">Confirm permissions, obtain cost quotes and assess current guest demand</w:t>
             </w:r>
           </w:p>
         </w:tc>
@@ -1912,7 +1912,7 @@
                 <w:b w:val="0"/>
                 <w:sz w:val="20"/>
               </w:rPr>
-              <w:t>Keep incomplete cases pending and reject homes that fail requirements</w:t>
+              <w:t xml:space="preserve">Keep incomplete cases pending; reject homes that fail the client's requirements</w:t>
             </w:r>
           </w:p>
         </w:tc>
@@ -1981,7 +1981,7 @@
                 <w:b w:val="0"/>
                 <w:sz w:val="20"/>
               </w:rPr>
-              <w:t>Compare the qualified homes and their cash-flow estimates</w:t>
+              <w:t xml:space="preserve">Compare qualified homes using expected and weaker-demand cash flows</w:t>
             </w:r>
           </w:p>
         </w:tc>
@@ -2013,7 +2013,7 @@
                 <w:b w:val="0"/>
                 <w:sz w:val="20"/>
               </w:rPr>
-              <w:t>Proceed when downside cash flow and cash-buffer requirements are met</w:t>
+              <w:t xml:space="preserve">Select a home that meets return and cash-buffer requirements</w:t>
             </w:r>
           </w:p>
         </w:tc>
@@ -2111,7 +2111,7 @@
                 <w:b w:val="0"/>
                 <w:sz w:val="20"/>
               </w:rPr>
-              <w:t>Review actual results before expanding</w:t>
+              <w:t xml:space="preserve">Review actual performance before expanding</w:t>
             </w:r>
           </w:p>
         </w:tc>
@@ -2125,7 +2125,7 @@
     <w:p>
       <w:pPr/>
       <w:r>
-        <w:t xml:space="preserve">The ten homes form the initial pool. Investigate higher-priority homes first and replace rejected candidates. Ten candidates and 30 days are planning limits; extend the search when needed. If practical testing finds little benefit from the model, use group rates as the main guide.</w:t>
+        <w:t xml:space="preserve">Ten homes form the initial search pool. Investigate higher-priority candidates first and replace rejected homes. Ten candidates and 30 days set the first round's workload; extend the search when necessary. If the model adds little value in the trial, continue using group rates to direct the search.</w:t>
       </w:r>
     </w:p>
     <w:p>
@@ -2139,25 +2139,25 @@
     <w:p>
       <w:pPr/>
       <w:r>
-        <w:t>The findings support a focused search. Profitability still depends on paid nights, stay length and costs, which reviews do not measure directly. A trial should record these outcomes alongside review activity.</w:t>
+        <w:t xml:space="preserve">Reviews measure recorded guest activity. Paid nights, stay length and costs determine profit. The operating trial should collect these measures alongside reviews to connect our search priorities to financial performance.</w:t>
       </w:r>
     </w:p>
     <w:p>
       <w:pPr/>
       <w:r>
-        <w:t>Our sample covers established homes in selected areas. A first review shows the length of the review record, and continuous operation remains unknown. The next coverage check should include new entrants and other areas. Leaving price out of the model also leaves the original price-filtered sample unchanged.</w:t>
+        <w:t xml:space="preserve">The sample covers established, priced homes in selected council areas. The first-review rule establishes the length of the review record; continuous operation remains unknown. The next coverage test should include new entrants, other areas and homes excluded by price screening. Removing price as a model input still uses the original price-filtered sample.</w:t>
       </w:r>
     </w:p>
     <w:p>
       <w:pPr/>
       <w:r>
-        <w:t>Price and minimum-stay settings were recorded at collection and can reflect earlier performance. Their combined contribution supports screening with that information; the effect of changing either setting needs a separate prospective test.</w:t>
+        <w:t xml:space="preserve">Price and minimum-stay settings were recorded at collection and may reflect earlier performance. Across the 50 fits, lower relative prices, one-night acceptance and more amenities raise model scores when other inputs stay fixed. Test planned changes prospectively to establish their effect on guest activity.</w:t>
       </w:r>
     </w:p>
     <w:p>
       <w:pPr/>
       <w:r>
-        <w:t>The next validation should freeze the chosen groups, model and selection rule before testing newly observed outcomes. The current 50 comparisons reuse records and follow earlier exploration. We should also check how well scores match observed rates before presenting them as individual probabilities. Appendix A records the uncertainty in the published comparisons.</w:t>
+        <w:t xml:space="preserve">For the next validation, fix the search groups, model and selection rule before collecting new outcomes. This creates a fresh test beyond the overlapping historical comparisons and earlier exploration. Check whether model scores match observed rates before using them as individual probabilities. Appendix A provides the full comparison evidence.</w:t>
       </w:r>
     </w:p>
     <w:p>

</xml_diff>

<commit_message>
Add priority-group listing benchmarks and operating coefficient details
</commit_message>
<xml_diff>
--- a/final-report/report-2026-10-04/Final_Report.docx
+++ b/final-report/report-2026-10-04/Final_Report.docx
@@ -23,7 +23,7 @@
         <w:spacing w:after="80"/>
       </w:pPr>
       <w:r>
-        <w:t>Eric Huang, Loc Le, Qihang Sun and Maksym Xu</w:t>
+        <w:t>Eric Huang and Maksym Xu</w:t>
       </w:r>
     </w:p>
     <w:p>
@@ -866,7 +866,7 @@
     <w:p>
       <w:pPr/>
       <w:r>
-        <w:t xml:space="preserve">City of Melbourne three-bedroom apartments lead at 36.6%, with 112 of 306 homes reaching the target. Two-bedroom apartments follow at 32.8%, or 405 of 1,235. Yarra Ranges three-bedroom houses and townhouses reach 30.0%, or 27 of 90. The city groups combine stronger observed activity with larger samples, supporting their position as the first search priority.</w:t>
+        <w:t xml:space="preserve">City of Melbourne three-bedroom apartments lead at 36.6%, with 112 of 306 homes reaching the target. Two-bedroom apartments follow at 32.8%, or 405 of 1,235. Yarra Ranges three-bedroom houses and townhouses reach 30.0%, or 27 of 90. The city groups combine stronger observed activity with larger samples, supporting their position as the first search priority. In the supplied snapshot, median quoted nightly prices are AUD285, AUD450 and AUD425.75 for Melbourne two-bedroom apartments, Melbourne three-bedroom apartments and Yarra Ranges three-bedroom houses/townhouses, respectively. One-night acceptance ranges from 22.2% to 59.8%, and median amenity counts from 44 to 55. These are advertised rates, not rents or prices actually paid.</w:t>
       </w:r>
     </w:p>
     <w:p>
@@ -2295,7 +2295,6 @@
     <w:p>
       <w:pPr>
         <w:pStyle w:val="Heading1"/>
-        <w:pageBreakBefore/>
       </w:pPr>
       <w:r>
         <w:t>Appendix A Model specification and comparison evidence</w:t>
@@ -2316,7 +2315,7 @@
         <w:t>(group positives + 10 * overall positive share) / (group count + 10)</w:t>
       </w:r>
       <w:r>
-        <w:t>. The reduced model retains area, dwelling type, bedrooms and amenities and is refitted on each training set. All 50 reduced fits converge without warnings.</w:t>
+        <w:t>. The reduced model retains area, dwelling type, bedrooms and amenities and is refitted on each training set. All 50 reduced fits converge without warnings. Across the 50 repeated training fits, mean log-odds weights are +1.183 for one-night acceptance (odds ratio 3.27), +0.237 per ten additional amenities (1.27), and -0.127 per price increase equal to 10% of the training-group median (0.88). All three directions persist in 50/50 fits. These odds ratios describe conditional historical associations, not probability changes or causal effects.</w:t>
       </w:r>
     </w:p>
     <w:p>
@@ -3081,7 +3080,6 @@
     <w:p>
       <w:pPr>
         <w:pStyle w:val="Heading1"/>
-        <w:pageBreakBefore/>
       </w:pPr>
       <w:r>
         <w:t>Appendix B Full group comparison</w:t>

</xml_diff>

<commit_message>
Publish Group 2 final report with APA 7 references and refreshed project naming
</commit_message>
<xml_diff>
--- a/final-report/report-2026-10-04/Final_Report.docx
+++ b/final-report/report-2026-10-04/Final_Report.docx
@@ -5,137 +5,322 @@
     <w:p>
       <w:pPr>
         <w:pStyle w:val="Title"/>
+        <w:keepNext/>
+        <w:widowControl/>
       </w:pPr>
       <w:r>
-        <w:t>Melbourne Airbnb Market Screening</w:t>
+        <w:rPr>
+          <w:rFonts w:ascii="Arial" w:hAnsi="Arial" w:eastAsia="Arial" w:cs="Arial"/>
+          <w:w w:val="100"/>
+        </w:rPr>
+        <w:t xml:space="preserve">Melbourne Airbnb Market Screening</w:t>
       </w:r>
     </w:p>
     <w:p>
       <w:pPr>
-        <w:spacing w:after="60"/>
+        <w:widowControl/>
+        <w:spacing w:after="120" w:line="259" w:lineRule="auto"/>
+        <w:jc w:val="left"/>
       </w:pPr>
       <w:r>
-        <w:t>CMCE30005 Final Project Report  |  TheNextChapter Group 2</w:t>
+        <w:rPr>
+          <w:rFonts w:ascii="Arial" w:hAnsi="Arial" w:eastAsia="Arial" w:cs="Arial"/>
+          <w:w w:val="100"/>
+          <w:b/>
+        </w:rPr>
+        <w:t xml:space="preserve">CMCE30005 Final Project Report | Group 2</w:t>
       </w:r>
     </w:p>
     <w:p>
       <w:pPr>
-        <w:spacing w:after="80"/>
+        <w:widowControl/>
+        <w:spacing w:after="120" w:line="259" w:lineRule="auto"/>
+        <w:jc w:val="left"/>
       </w:pPr>
       <w:r>
-        <w:t>Eric Huang and Maksym Xu</w:t>
+        <w:rPr>
+          <w:rFonts w:ascii="Arial" w:hAnsi="Arial" w:eastAsia="Arial" w:cs="Arial"/>
+          <w:w w:val="100"/>
+          <w:b/>
+        </w:rPr>
+        <w:t xml:space="preserve">Eric Huang and Maksym Xu</w:t>
       </w:r>
     </w:p>
     <w:p>
+      <w:pPr>
+        <w:widowControl/>
+        <w:spacing w:after="120" w:line="259" w:lineRule="auto"/>
+        <w:jc w:val="left"/>
+      </w:pPr>
       <w:r>
-        <w:t xml:space="preserve">Project repository: </w:t>
+        <w:rPr>
+          <w:rFonts w:ascii="Arial" w:hAnsi="Arial" w:eastAsia="Arial" w:cs="Arial"/>
+          <w:w w:val="100"/>
+          <w:b/>
+        </w:rPr>
+        <w:t xml:space="preserve">Project repository:</w:t>
+      </w:r>
+      <w:r>
+        <w:rPr>
+          <w:rFonts w:ascii="Arial" w:hAnsi="Arial" w:eastAsia="Arial" w:cs="Arial"/>
+          <w:w w:val="100"/>
+        </w:rPr>
+        <w:t xml:space="preserve"> </w:t>
       </w:r>
       <w:hyperlink r:id="rId9">
         <w:r>
           <w:rPr>
-            <w:color w:val="2166A1"/>
+            <w:rFonts w:ascii="Arial" w:hAnsi="Arial" w:eastAsia="Arial" w:cs="Arial"/>
+            <w:w w:val="100"/>
+            <w:color w:val="0563C1"/>
             <w:u w:val="single"/>
           </w:rPr>
-          <w:t>final report and analysis</w:t>
+          <w:t xml:space="preserve">final report and analysis</w:t>
         </w:r>
       </w:hyperlink>
     </w:p>
     <w:p>
       <w:pPr>
         <w:pStyle w:val="Heading1"/>
+        <w:keepNext/>
+        <w:widowControl/>
       </w:pPr>
       <w:r>
-        <w:t>1 Introduction</w:t>
+        <w:rPr>
+          <w:rFonts w:ascii="Arial" w:hAnsi="Arial" w:eastAsia="Arial" w:cs="Arial"/>
+          <w:w w:val="100"/>
+        </w:rPr>
+        <w:t xml:space="preserve">1. Introduction</w:t>
       </w:r>
     </w:p>
     <w:p>
-      <w:pPr/>
+      <w:pPr>
+        <w:widowControl/>
+        <w:spacing w:after="120" w:line="259" w:lineRule="auto"/>
+        <w:jc w:val="left"/>
+      </w:pPr>
       <w:r>
-        <w:t xml:space="preserve">Our client plans to lease homes and offer short stays through Airbnb. Rent and setup costs commit scarce startup funds before guest income arrives. The first task is to focus the property search on areas and home types with stronger evidence of guest activity.</w:t>
+        <w:rPr>
+          <w:rFonts w:ascii="Arial" w:hAnsi="Arial" w:eastAsia="Arial" w:cs="Arial"/>
+          <w:w w:val="100"/>
+        </w:rPr>
+        <w:t xml:space="preserve">Our client plans to lease homes in Greater Melbourne and offer short stays through Airbnb. Rent and setup costs commit scarce startup funds before guest income arrives. The first task is to focus the property search on council areas and home types with stronger evidence of guest activity.</w:t>
       </w:r>
     </w:p>
     <w:p>
-      <w:pPr/>
+      <w:pPr>
+        <w:widowControl/>
+        <w:spacing w:after="120" w:line="259" w:lineRule="auto"/>
+        <w:jc w:val="left"/>
+      </w:pPr>
       <w:r>
-        <w:t xml:space="preserve">We recommend starting with two- and three-bedroom apartments in the City of Melbourne. Three-bedroom houses and townhouses in Yarra Ranges provide a second search option. These groups have the strongest historical review activity in our residential comparison.</w:t>
+        <w:rPr>
+          <w:rFonts w:ascii="Arial" w:hAnsi="Arial" w:eastAsia="Arial" w:cs="Arial"/>
+          <w:w w:val="100"/>
+        </w:rPr>
+        <w:t xml:space="preserve">We recommend starting with two- and three-bedroom apartments in the City of Melbourne. Three-bedroom houses and townhouses in Yarra Ranges provide a second search option. These three groups have the strongest historical review activity in our residential comparison.</w:t>
       </w:r>
     </w:p>
     <w:p>
-      <w:pPr/>
+      <w:pPr>
+        <w:widowControl/>
+        <w:spacing w:after="120" w:line="259" w:lineRule="auto"/>
+        <w:jc w:val="left"/>
+      </w:pPr>
       <w:r>
-        <w:t xml:space="preserve">We then test how to narrow the search within these groups. When selecting a quarter of homes in each group, a simple model produces lists where 49.6% reach at least 30 annual reviews, compared with 32.4% using group rates alone. This gives the client an evidence-based order for investigating established homes with comparable operating information. Lease permissions, quotes and cash flow determine which candidates to pursue.</w:t>
+        <w:rPr>
+          <w:rFonts w:ascii="Arial" w:hAnsi="Arial" w:eastAsia="Arial" w:cs="Arial"/>
+          <w:w w:val="100"/>
+        </w:rPr>
+        <w:t xml:space="preserve">We then test how to narrow the search within these priority groups. When selecting a quarter of homes in each group, a six-input logistic regression model produces lists where 49.6% reach at least 30 annual reviews, compared with 32.4% using group rates alone. This gives the client an evidence-based order for investigating established listings that already have comparable price, minimum-stay and amenity information. Lease permissions, quotes and cash flow determine which candidates to pursue.</w:t>
       </w:r>
     </w:p>
     <w:p>
       <w:pPr>
         <w:pStyle w:val="Heading1"/>
+        <w:keepNext/>
+        <w:widowControl/>
       </w:pPr>
       <w:r>
-        <w:t>2 Problem Definition and Objectives</w:t>
+        <w:rPr>
+          <w:rFonts w:ascii="Arial" w:hAnsi="Arial" w:eastAsia="Arial" w:cs="Arial"/>
+          <w:w w:val="100"/>
+        </w:rPr>
+        <w:t xml:space="preserve">2. Problem Definition and Objectives</w:t>
       </w:r>
     </w:p>
     <w:p>
-      <w:pPr/>
+      <w:pPr>
+        <w:widowControl/>
+        <w:spacing w:after="120" w:line="259" w:lineRule="auto"/>
+        <w:jc w:val="left"/>
+      </w:pPr>
       <w:r>
+        <w:rPr>
+          <w:rFonts w:ascii="Arial" w:hAnsi="Arial" w:eastAsia="Arial" w:cs="Arial"/>
+          <w:w w:val="100"/>
+        </w:rPr>
         <w:t xml:space="preserve">The client needs to decide where to search and which properties to investigate first. We address two questions:</w:t>
       </w:r>
     </w:p>
     <w:p>
-      <w:pPr/>
+      <w:pPr>
+        <w:widowControl/>
+        <w:spacing w:after="120" w:line="259" w:lineRule="auto"/>
+        <w:jc w:val="left"/>
+      </w:pPr>
       <w:r>
-        <w:t>1. Which property groups have the strongest historical guest-review activity?</w:t>
+        <w:rPr>
+          <w:rFonts w:ascii="Arial" w:hAnsi="Arial" w:eastAsia="Arial" w:cs="Arial"/>
+          <w:w w:val="100"/>
+        </w:rPr>
+        <w:t xml:space="preserve">1. Which residential property groups have the strongest historical guest-review activity?</w:t>
       </w:r>
     </w:p>
     <w:p>
-      <w:pPr/>
+      <w:pPr>
+        <w:widowControl/>
+        <w:spacing w:after="120" w:line="259" w:lineRule="auto"/>
+        <w:jc w:val="left"/>
+      </w:pPr>
       <w:r>
-        <w:t>2. Does information about individual homes improve selection beyond each group's historical rate?</w:t>
+        <w:rPr>
+          <w:rFonts w:ascii="Arial" w:hAnsi="Arial" w:eastAsia="Arial" w:cs="Arial"/>
+          <w:w w:val="100"/>
+        </w:rPr>
+        <w:t xml:space="preserve">2. Within those priority groups, does property-level information improve selection beyond each group's historical rate?</w:t>
       </w:r>
     </w:p>
     <w:p>
-      <w:pPr/>
+      <w:pPr>
+        <w:widowControl/>
+        <w:spacing w:after="120" w:line="259" w:lineRule="auto"/>
+        <w:jc w:val="left"/>
+      </w:pPr>
       <w:r>
-        <w:t xml:space="preserve">A group combines council area, dwelling type and bedroom count. We compare entire apartments, houses and townhouses with one to three bedrooms and at least one year of recorded review history. A home reaches our target when it receives at least 30 reviews in the preceding 365 days. The target reflects the upper quarter of a separate reference sample, giving every group the same benchmark.</w:t>
+        <w:rPr>
+          <w:rFonts w:ascii="Arial" w:hAnsi="Arial" w:eastAsia="Arial" w:cs="Arial"/>
+          <w:w w:val="100"/>
+        </w:rPr>
+        <w:t xml:space="preserve">A group combines council area, dwelling type and bedroom count. We compare entire apartments, houses and townhouses with one to three bedrooms and at least one year of recorded review history. A home reaches our target when it receives at least 30 dated reviews in the preceding 365 days. The target reflects the upper quarter (75th percentile) of a separate reference sample, giving every group the same benchmark.</w:t>
       </w:r>
     </w:p>
     <w:p>
-      <w:pPr/>
+      <w:pPr>
+        <w:widowControl/>
+        <w:spacing w:after="120" w:line="259" w:lineRule="auto"/>
+        <w:jc w:val="left"/>
+      </w:pPr>
       <w:r>
-        <w:t xml:space="preserve">The final analysis builds on the interim report with a simpler logistic regression model and 50 repeated comparisons, including selection within the three priority groups. All analysis uses the Melbourne Inside Airbnb dataset supplied through the subject LMS.</w:t>
+        <w:rPr>
+          <w:rFonts w:ascii="Arial" w:hAnsi="Arial" w:eastAsia="Arial" w:cs="Arial"/>
+          <w:w w:val="100"/>
+        </w:rPr>
+        <w:t xml:space="preserve">The final analysis builds on the interim report with a simpler logistic regression model and 50 repeated host-level comparisons, including selection within the three priority groups. All analysis uses the Melbourne Inside Airbnb dataset supplied through the subject LMS.</w:t>
       </w:r>
     </w:p>
     <w:p>
       <w:pPr>
         <w:pStyle w:val="Heading1"/>
+        <w:keepNext/>
+        <w:widowControl/>
       </w:pPr>
       <w:r>
-        <w:t>3 Data Description and Preparation</w:t>
-      </w:r>
-    </w:p>
-    <w:p>
-      <w:pPr/>
-      <w:r>
-        <w:t xml:space="preserve">The snapshot contains 25,728 listings collected between 17 June and 1 July 2026 (Inside Airbnb, 2026). We link property details to dated reviews and count reviews in the year before each listing's collection date. Reviews record past guest activity. Calendar availability combines bookings and host-blocked dates, making reviews the clearer measure for this comparison.</w:t>
-      </w:r>
-    </w:p>
-    <w:p>
-      <w:pPr/>
-      <w:r>
-        <w:t xml:space="preserve">Our residential scope includes four recorded property types: entire rental units, condos, homes and townhouses. Rental units and condos form the apartment/unit category; homes and townhouses form the house/townhouse category. We keep one to three bedrooms, quoted nightly prices of AUD30-1,500 and a first review at least 365 days before collection. The price range sets an exploratory boundary, while the history rule gives each home a full year of observable review history.</w:t>
-      </w:r>
-    </w:p>
-    <w:p>
-      <w:pPr/>
-      <w:r>
-        <w:t xml:space="preserve">These rules leave 6,891 eligible homes. We set aside 1,342 homes from separate reference hosts, leaving 5,549 for analysis. Retaining groups with at least 50 analysis homes leaves 3,873 homes in 14 groups. The reference sample then contains 906 homes in those same groups. Table 1 separates the analysis path from the reference branch.</w:t>
+        <w:rPr>
+          <w:rFonts w:ascii="Arial" w:hAnsi="Arial" w:eastAsia="Arial" w:cs="Arial"/>
+          <w:w w:val="100"/>
+        </w:rPr>
+        <w:t xml:space="preserve">3. Data Description and Preparation</w:t>
       </w:r>
     </w:p>
     <w:p>
       <w:pPr>
+        <w:widowControl/>
+        <w:spacing w:after="120" w:line="259" w:lineRule="auto"/>
+        <w:jc w:val="left"/>
+      </w:pPr>
+      <w:r>
+        <w:rPr>
+          <w:rFonts w:ascii="Arial" w:hAnsi="Arial" w:eastAsia="Arial" w:cs="Arial"/>
+          <w:w w:val="100"/>
+        </w:rPr>
+        <w:t xml:space="preserve">The snapshot contains 25,728 listings collected between 17 June and 1 July 2026 (Inside Airbnb, 2026). We link property details to dated reviews and count reviews in the 365 days before each listing's collection date. Reviews record past guest activity, whereas calendar availability combines bookings and host-blocked dates, making reviews the clearer measure for this comparison.</w:t>
+      </w:r>
+    </w:p>
+    <w:p>
+      <w:pPr>
+        <w:widowControl/>
+        <w:spacing w:after="120" w:line="259" w:lineRule="auto"/>
+        <w:jc w:val="left"/>
+      </w:pPr>
+      <w:r>
+        <w:rPr>
+          <w:rFonts w:ascii="Arial" w:hAnsi="Arial" w:eastAsia="Arial" w:cs="Arial"/>
+          <w:w w:val="100"/>
+        </w:rPr>
+        <w:t xml:space="preserve">Our residential scope includes four recorded property types: entire rental units and condos form the </w:t>
+      </w:r>
+      <w:r>
+        <w:rPr>
+          <w:rFonts w:ascii="Arial" w:hAnsi="Arial" w:eastAsia="Arial" w:cs="Arial"/>
+          <w:w w:val="100"/>
+          <w:i/>
+        </w:rPr>
+        <w:t xml:space="preserve">apartment/unit</w:t>
+      </w:r>
+      <w:r>
+        <w:rPr>
+          <w:rFonts w:ascii="Arial" w:hAnsi="Arial" w:eastAsia="Arial" w:cs="Arial"/>
+          <w:w w:val="100"/>
+        </w:rPr>
+        <w:t xml:space="preserve"> category; entire homes and townhouses form the </w:t>
+      </w:r>
+      <w:r>
+        <w:rPr>
+          <w:rFonts w:ascii="Arial" w:hAnsi="Arial" w:eastAsia="Arial" w:cs="Arial"/>
+          <w:w w:val="100"/>
+          <w:i/>
+        </w:rPr>
+        <w:t xml:space="preserve">house/townhouse</w:t>
+      </w:r>
+      <w:r>
+        <w:rPr>
+          <w:rFonts w:ascii="Arial" w:hAnsi="Arial" w:eastAsia="Arial" w:cs="Arial"/>
+          <w:w w:val="100"/>
+        </w:rPr>
+        <w:t xml:space="preserve"> category. We keep one to three bedrooms, quoted nightly prices of AUD 30–1,500 and a first review at least 365 days before collection. The price range removes unpriced listings and extreme outliers, while the 365-day rule ensures a full year of observable review history.</w:t>
+      </w:r>
+    </w:p>
+    <w:p>
+      <w:pPr>
+        <w:widowControl/>
+        <w:spacing w:after="120" w:line="259" w:lineRule="auto"/>
+        <w:jc w:val="left"/>
+      </w:pPr>
+      <w:r>
+        <w:rPr>
+          <w:rFonts w:ascii="Arial" w:hAnsi="Arial" w:eastAsia="Arial" w:cs="Arial"/>
+          <w:w w:val="100"/>
+        </w:rPr>
+        <w:t xml:space="preserve">These rules leave 6,891 eligible homes. Before comparing groups or fitting models, we set aside 20% of hosts (1,342 homes) as a separate reference branch, leaving 80% of hosts (5,549 homes) for analysis. Retaining groups with at least 50 analysis homes leaves 3,873 analysis homes and 906 reference homes across the same 14 groups (Table 1).</w:t>
+      </w:r>
+    </w:p>
+    <w:p>
+      <w:pPr>
+        <w:spacing w:before="0" w:after="0" w:line="220" w:lineRule="exact"/>
+      </w:pPr>
+    </w:p>
+    <w:p>
+      <w:pPr>
+        <w:widowControl/>
+        <w:spacing w:after="120" w:line="259" w:lineRule="auto" w:before="80"/>
+        <w:jc w:val="left"/>
         <w:keepNext/>
       </w:pPr>
       <w:r>
         <w:rPr>
+          <w:rFonts w:ascii="Arial" w:hAnsi="Arial" w:eastAsia="Arial" w:cs="Arial"/>
+          <w:w w:val="100"/>
           <w:b/>
         </w:rPr>
         <w:t xml:space="preserve">Table 1. From the supplied listings to the comparison sample</w:t>
@@ -157,8 +342,8 @@
         </w:tblBorders>
       </w:tblPr>
       <w:tblGrid>
-        <w:gridCol w:w="4933"/>
-        <w:gridCol w:w="4933"/>
+        <w:gridCol w:w="7900"/>
+        <w:gridCol w:w="1966"/>
       </w:tblGrid>
       <w:tr>
         <w:trPr>
@@ -167,7 +352,7 @@
         </w:trPr>
         <w:tc>
           <w:tcPr>
-            <w:tcW w:type="dxa" w:w="7920"/>
+            <w:tcW w:type="dxa" w:w="7900"/>
             <w:vAlign w:val="center"/>
             <w:shd w:fill="E9EEF3"/>
             <w:tcBorders>
@@ -185,12 +370,16 @@
           </w:tcPr>
           <w:p>
             <w:pPr>
-              <w:spacing w:after="60" w:before="60" w:line="252" w:lineRule="auto"/>
+              <w:widowControl/>
+              <w:spacing w:after="40" w:line="240" w:lineRule="auto" w:before="40"/>
+              <w:jc w:val="left"/>
             </w:pPr>
             <w:r>
               <w:rPr>
+                <w:rFonts w:ascii="Arial" w:hAnsi="Arial" w:eastAsia="Arial" w:cs="Arial"/>
+                <w:w w:val="100"/>
+                <w:sz w:val="21"/>
                 <w:b/>
-                <w:sz w:val="20"/>
               </w:rPr>
               <w:t xml:space="preserve">Sample stage</w:t>
             </w:r>
@@ -198,7 +387,7 @@
         </w:tc>
         <w:tc>
           <w:tcPr>
-            <w:tcW w:type="dxa" w:w="1944"/>
+            <w:tcW w:type="dxa" w:w="1966"/>
             <w:vAlign w:val="center"/>
             <w:shd w:fill="E9EEF3"/>
             <w:tcBorders>
@@ -216,15 +405,18 @@
           </w:tcPr>
           <w:p>
             <w:pPr>
-              <w:spacing w:after="60" w:before="60" w:line="252" w:lineRule="auto"/>
-              <w:jc w:val="center"/>
+              <w:widowControl/>
+              <w:spacing w:after="40" w:line="240" w:lineRule="auto" w:before="40"/>
+              <w:jc w:val="left"/>
             </w:pPr>
             <w:r>
               <w:rPr>
+                <w:rFonts w:ascii="Arial" w:hAnsi="Arial" w:eastAsia="Arial" w:cs="Arial"/>
+                <w:w w:val="100"/>
+                <w:sz w:val="21"/>
                 <w:b/>
-                <w:sz w:val="20"/>
               </w:rPr>
-              <w:t>Listings</w:t>
+              <w:t xml:space="preserve">Listings</w:t>
             </w:r>
           </w:p>
         </w:tc>
@@ -235,7 +427,7 @@
         </w:trPr>
         <w:tc>
           <w:tcPr>
-            <w:tcW w:type="dxa" w:w="7920"/>
+            <w:tcW w:type="dxa" w:w="7900"/>
             <w:vAlign w:val="center"/>
             <w:shd w:fill="FFFFFF"/>
             <w:tcBorders>
@@ -253,12 +445,15 @@
           </w:tcPr>
           <w:p>
             <w:pPr>
-              <w:spacing w:after="60" w:before="60" w:line="252" w:lineRule="auto"/>
+              <w:widowControl/>
+              <w:spacing w:after="40" w:line="240" w:lineRule="auto" w:before="40"/>
+              <w:jc w:val="left"/>
             </w:pPr>
             <w:r>
               <w:rPr>
-                <w:b w:val="0"/>
-                <w:sz w:val="20"/>
+                <w:rFonts w:ascii="Arial" w:hAnsi="Arial" w:eastAsia="Arial" w:cs="Arial"/>
+                <w:w w:val="100"/>
+                <w:sz w:val="21"/>
               </w:rPr>
               <w:t xml:space="preserve">Supplied snapshot covering all listing types</w:t>
             </w:r>
@@ -266,7 +461,7 @@
         </w:tc>
         <w:tc>
           <w:tcPr>
-            <w:tcW w:type="dxa" w:w="1944"/>
+            <w:tcW w:type="dxa" w:w="1966"/>
             <w:vAlign w:val="center"/>
             <w:shd w:fill="FFFFFF"/>
             <w:tcBorders>
@@ -284,15 +479,17 @@
           </w:tcPr>
           <w:p>
             <w:pPr>
-              <w:spacing w:after="60" w:before="60" w:line="252" w:lineRule="auto"/>
-              <w:jc w:val="center"/>
+              <w:widowControl/>
+              <w:spacing w:after="40" w:line="240" w:lineRule="auto" w:before="40"/>
+              <w:jc w:val="left"/>
             </w:pPr>
             <w:r>
               <w:rPr>
-                <w:b w:val="0"/>
-                <w:sz w:val="20"/>
+                <w:rFonts w:ascii="Arial" w:hAnsi="Arial" w:eastAsia="Arial" w:cs="Arial"/>
+                <w:w w:val="100"/>
+                <w:sz w:val="21"/>
               </w:rPr>
-              <w:t>25,728</w:t>
+              <w:t xml:space="preserve">25,728</w:t>
             </w:r>
           </w:p>
         </w:tc>
@@ -303,7 +500,7 @@
         </w:trPr>
         <w:tc>
           <w:tcPr>
-            <w:tcW w:type="dxa" w:w="7920"/>
+            <w:tcW w:type="dxa" w:w="7900"/>
             <w:vAlign w:val="center"/>
             <w:shd w:fill="FFFFFF"/>
             <w:tcBorders>
@@ -321,20 +518,23 @@
           </w:tcPr>
           <w:p>
             <w:pPr>
-              <w:spacing w:after="60" w:before="60" w:line="252" w:lineRule="auto"/>
+              <w:widowControl/>
+              <w:spacing w:after="40" w:line="240" w:lineRule="auto" w:before="40"/>
+              <w:jc w:val="left"/>
             </w:pPr>
             <w:r>
               <w:rPr>
-                <w:b w:val="0"/>
-                <w:sz w:val="20"/>
+                <w:rFonts w:ascii="Arial" w:hAnsi="Arial" w:eastAsia="Arial" w:cs="Arial"/>
+                <w:w w:val="100"/>
+                <w:sz w:val="21"/>
               </w:rPr>
-              <w:t>Entire homes with one to three bedrooms</w:t>
+              <w:t xml:space="preserve">Entire homes with one to three bedrooms</w:t>
             </w:r>
           </w:p>
         </w:tc>
         <w:tc>
           <w:tcPr>
-            <w:tcW w:type="dxa" w:w="1944"/>
+            <w:tcW w:type="dxa" w:w="1966"/>
             <w:vAlign w:val="center"/>
             <w:shd w:fill="FFFFFF"/>
             <w:tcBorders>
@@ -352,15 +552,17 @@
           </w:tcPr>
           <w:p>
             <w:pPr>
-              <w:spacing w:after="60" w:before="60" w:line="252" w:lineRule="auto"/>
-              <w:jc w:val="center"/>
+              <w:widowControl/>
+              <w:spacing w:after="40" w:line="240" w:lineRule="auto" w:before="40"/>
+              <w:jc w:val="left"/>
             </w:pPr>
             <w:r>
               <w:rPr>
-                <w:b w:val="0"/>
-                <w:sz w:val="20"/>
+                <w:rFonts w:ascii="Arial" w:hAnsi="Arial" w:eastAsia="Arial" w:cs="Arial"/>
+                <w:w w:val="100"/>
+                <w:sz w:val="21"/>
               </w:rPr>
-              <w:t>16,576</w:t>
+              <w:t xml:space="preserve">16,576</w:t>
             </w:r>
           </w:p>
         </w:tc>
@@ -371,7 +573,7 @@
         </w:trPr>
         <w:tc>
           <w:tcPr>
-            <w:tcW w:type="dxa" w:w="7920"/>
+            <w:tcW w:type="dxa" w:w="7900"/>
             <w:vAlign w:val="center"/>
             <w:shd w:fill="FFFFFF"/>
             <w:tcBorders>
@@ -389,20 +591,23 @@
           </w:tcPr>
           <w:p>
             <w:pPr>
-              <w:spacing w:after="60" w:before="60" w:line="252" w:lineRule="auto"/>
+              <w:widowControl/>
+              <w:spacing w:after="40" w:line="240" w:lineRule="auto" w:before="40"/>
+              <w:jc w:val="left"/>
             </w:pPr>
             <w:r>
               <w:rPr>
-                <w:b w:val="0"/>
-                <w:sz w:val="20"/>
+                <w:rFonts w:ascii="Arial" w:hAnsi="Arial" w:eastAsia="Arial" w:cs="Arial"/>
+                <w:w w:val="100"/>
+                <w:sz w:val="21"/>
               </w:rPr>
-              <w:t xml:space="preserve">Rental units, condos, homes and townhouses</w:t>
+              <w:t xml:space="preserve">Residential scope: rental units, condos, homes and townhouses</w:t>
             </w:r>
           </w:p>
         </w:tc>
         <w:tc>
           <w:tcPr>
-            <w:tcW w:type="dxa" w:w="1944"/>
+            <w:tcW w:type="dxa" w:w="1966"/>
             <w:vAlign w:val="center"/>
             <w:shd w:fill="FFFFFF"/>
             <w:tcBorders>
@@ -420,15 +625,17 @@
           </w:tcPr>
           <w:p>
             <w:pPr>
-              <w:spacing w:after="60" w:before="60" w:line="252" w:lineRule="auto"/>
-              <w:jc w:val="center"/>
+              <w:widowControl/>
+              <w:spacing w:after="40" w:line="240" w:lineRule="auto" w:before="40"/>
+              <w:jc w:val="left"/>
             </w:pPr>
             <w:r>
               <w:rPr>
-                <w:b w:val="0"/>
-                <w:sz w:val="20"/>
+                <w:rFonts w:ascii="Arial" w:hAnsi="Arial" w:eastAsia="Arial" w:cs="Arial"/>
+                <w:w w:val="100"/>
+                <w:sz w:val="21"/>
               </w:rPr>
-              <w:t>14,895</w:t>
+              <w:t xml:space="preserve">14,895</w:t>
             </w:r>
           </w:p>
         </w:tc>
@@ -439,7 +646,7 @@
         </w:trPr>
         <w:tc>
           <w:tcPr>
-            <w:tcW w:type="dxa" w:w="7920"/>
+            <w:tcW w:type="dxa" w:w="7900"/>
             <w:vAlign w:val="center"/>
             <w:shd w:fill="FFFFFF"/>
             <w:tcBorders>
@@ -457,20 +664,23 @@
           </w:tcPr>
           <w:p>
             <w:pPr>
-              <w:spacing w:after="60" w:before="60" w:line="252" w:lineRule="auto"/>
+              <w:widowControl/>
+              <w:spacing w:after="40" w:line="240" w:lineRule="auto" w:before="40"/>
+              <w:jc w:val="left"/>
             </w:pPr>
             <w:r>
               <w:rPr>
-                <w:b w:val="0"/>
-                <w:sz w:val="20"/>
+                <w:rFonts w:ascii="Arial" w:hAnsi="Arial" w:eastAsia="Arial" w:cs="Arial"/>
+                <w:w w:val="100"/>
+                <w:sz w:val="21"/>
               </w:rPr>
-              <w:t xml:space="preserve">Nightly price AUD30-1,500 and at least 365 days of review history</w:t>
+              <w:t xml:space="preserve">Eligible homes: nightly price AUD 30–1,500 and at least 365 days of review history</w:t>
             </w:r>
           </w:p>
         </w:tc>
         <w:tc>
           <w:tcPr>
-            <w:tcW w:type="dxa" w:w="1944"/>
+            <w:tcW w:type="dxa" w:w="1966"/>
             <w:vAlign w:val="center"/>
             <w:shd w:fill="FFFFFF"/>
             <w:tcBorders>
@@ -488,15 +698,17 @@
           </w:tcPr>
           <w:p>
             <w:pPr>
-              <w:spacing w:after="60" w:before="60" w:line="252" w:lineRule="auto"/>
-              <w:jc w:val="center"/>
+              <w:widowControl/>
+              <w:spacing w:after="40" w:line="240" w:lineRule="auto" w:before="40"/>
+              <w:jc w:val="left"/>
             </w:pPr>
             <w:r>
               <w:rPr>
-                <w:b w:val="0"/>
-                <w:sz w:val="20"/>
+                <w:rFonts w:ascii="Arial" w:hAnsi="Arial" w:eastAsia="Arial" w:cs="Arial"/>
+                <w:w w:val="100"/>
+                <w:sz w:val="21"/>
               </w:rPr>
-              <w:t>6,891</w:t>
+              <w:t xml:space="preserve">6,891</w:t>
             </w:r>
           </w:p>
         </w:tc>
@@ -507,7 +719,7 @@
         </w:trPr>
         <w:tc>
           <w:tcPr>
-            <w:tcW w:type="dxa" w:w="7920"/>
+            <w:tcW w:type="dxa" w:w="7900"/>
             <w:vAlign w:val="center"/>
             <w:shd w:fill="FFFFFF"/>
             <w:tcBorders>
@@ -525,20 +737,23 @@
           </w:tcPr>
           <w:p>
             <w:pPr>
-              <w:spacing w:after="60" w:before="60" w:line="252" w:lineRule="auto"/>
+              <w:widowControl/>
+              <w:spacing w:after="40" w:line="240" w:lineRule="auto" w:before="40"/>
+              <w:jc w:val="left"/>
             </w:pPr>
             <w:r>
               <w:rPr>
-                <w:b w:val="0"/>
-                <w:sz w:val="20"/>
+                <w:rFonts w:ascii="Arial" w:hAnsi="Arial" w:eastAsia="Arial" w:cs="Arial"/>
+                <w:w w:val="100"/>
+                <w:sz w:val="21"/>
               </w:rPr>
-              <w:t xml:space="preserve">Analysis homes after reference hosts are set aside</w:t>
+              <w:t xml:space="preserve">Analysis branch: homes after setting aside reference hosts (from 6,891)</w:t>
             </w:r>
           </w:p>
         </w:tc>
         <w:tc>
           <w:tcPr>
-            <w:tcW w:type="dxa" w:w="1944"/>
+            <w:tcW w:type="dxa" w:w="1966"/>
             <w:vAlign w:val="center"/>
             <w:shd w:fill="FFFFFF"/>
             <w:tcBorders>
@@ -556,15 +771,17 @@
           </w:tcPr>
           <w:p>
             <w:pPr>
-              <w:spacing w:after="60" w:before="60" w:line="252" w:lineRule="auto"/>
-              <w:jc w:val="center"/>
+              <w:widowControl/>
+              <w:spacing w:after="40" w:line="240" w:lineRule="auto" w:before="40"/>
+              <w:jc w:val="left"/>
             </w:pPr>
             <w:r>
               <w:rPr>
-                <w:b w:val="0"/>
-                <w:sz w:val="20"/>
+                <w:rFonts w:ascii="Arial" w:hAnsi="Arial" w:eastAsia="Arial" w:cs="Arial"/>
+                <w:w w:val="100"/>
+                <w:sz w:val="21"/>
               </w:rPr>
-              <w:t>5,549</w:t>
+              <w:t xml:space="preserve">5,549</w:t>
             </w:r>
           </w:p>
         </w:tc>
@@ -575,7 +792,7 @@
         </w:trPr>
         <w:tc>
           <w:tcPr>
-            <w:tcW w:type="dxa" w:w="7920"/>
+            <w:tcW w:type="dxa" w:w="7900"/>
             <w:vAlign w:val="center"/>
             <w:shd w:fill="FFFFFF"/>
             <w:tcBorders>
@@ -593,20 +810,23 @@
           </w:tcPr>
           <w:p>
             <w:pPr>
-              <w:spacing w:after="60" w:before="60" w:line="252" w:lineRule="auto"/>
+              <w:widowControl/>
+              <w:spacing w:after="40" w:line="240" w:lineRule="auto" w:before="40"/>
+              <w:jc w:val="left"/>
             </w:pPr>
             <w:r>
               <w:rPr>
-                <w:b w:val="0"/>
-                <w:sz w:val="20"/>
+                <w:rFonts w:ascii="Arial" w:hAnsi="Arial" w:eastAsia="Arial" w:cs="Arial"/>
+                <w:w w:val="100"/>
+                <w:sz w:val="21"/>
               </w:rPr>
-              <w:t xml:space="preserve">Final analysis homes in groups with at least 50 homes each</w:t>
+              <w:t xml:space="preserve">Analysis branch: final homes in the 14 groups with at least 50 analysis homes each</w:t>
             </w:r>
           </w:p>
         </w:tc>
         <w:tc>
           <w:tcPr>
-            <w:tcW w:type="dxa" w:w="1944"/>
+            <w:tcW w:type="dxa" w:w="1966"/>
             <w:vAlign w:val="center"/>
             <w:shd w:fill="FFFFFF"/>
             <w:tcBorders>
@@ -624,15 +844,17 @@
           </w:tcPr>
           <w:p>
             <w:pPr>
-              <w:spacing w:after="60" w:before="60" w:line="252" w:lineRule="auto"/>
-              <w:jc w:val="center"/>
+              <w:widowControl/>
+              <w:spacing w:after="40" w:line="240" w:lineRule="auto" w:before="40"/>
+              <w:jc w:val="left"/>
             </w:pPr>
             <w:r>
               <w:rPr>
-                <w:b w:val="0"/>
-                <w:sz w:val="20"/>
+                <w:rFonts w:ascii="Arial" w:hAnsi="Arial" w:eastAsia="Arial" w:cs="Arial"/>
+                <w:w w:val="100"/>
+                <w:sz w:val="21"/>
               </w:rPr>
-              <w:t>3,873</w:t>
+              <w:t xml:space="preserve">3,873</w:t>
             </w:r>
           </w:p>
         </w:tc>
@@ -643,7 +865,7 @@
         </w:trPr>
         <w:tc>
           <w:tcPr>
-            <w:tcW w:type="dxa" w:w="7920"/>
+            <w:tcW w:type="dxa" w:w="7900"/>
             <w:vAlign w:val="center"/>
             <w:shd w:fill="FFFFFF"/>
             <w:tcBorders>
@@ -661,20 +883,23 @@
           </w:tcPr>
           <w:p>
             <w:pPr>
-              <w:spacing w:after="60" w:before="60" w:line="252" w:lineRule="auto"/>
+              <w:widowControl/>
+              <w:spacing w:after="40" w:line="240" w:lineRule="auto" w:before="40"/>
+              <w:jc w:val="left"/>
             </w:pPr>
             <w:r>
               <w:rPr>
-                <w:b w:val="0"/>
-                <w:sz w:val="20"/>
+                <w:rFonts w:ascii="Arial" w:hAnsi="Arial" w:eastAsia="Arial" w:cs="Arial"/>
+                <w:w w:val="100"/>
+                <w:sz w:val="21"/>
               </w:rPr>
-              <w:t xml:space="preserve">Separate reference branch before group restriction</w:t>
+              <w:t xml:space="preserve">Reference branch: separate hosts used only to set the review target (from 6,891)</w:t>
             </w:r>
           </w:p>
         </w:tc>
         <w:tc>
           <w:tcPr>
-            <w:tcW w:type="dxa" w:w="1944"/>
+            <w:tcW w:type="dxa" w:w="1966"/>
             <w:vAlign w:val="center"/>
             <w:shd w:fill="FFFFFF"/>
             <w:tcBorders>
@@ -692,15 +917,17 @@
           </w:tcPr>
           <w:p>
             <w:pPr>
-              <w:spacing w:after="60" w:before="60" w:line="252" w:lineRule="auto"/>
-              <w:jc w:val="center"/>
+              <w:widowControl/>
+              <w:spacing w:after="40" w:line="240" w:lineRule="auto" w:before="40"/>
+              <w:jc w:val="left"/>
             </w:pPr>
             <w:r>
               <w:rPr>
-                <w:b w:val="0"/>
-                <w:sz w:val="20"/>
+                <w:rFonts w:ascii="Arial" w:hAnsi="Arial" w:eastAsia="Arial" w:cs="Arial"/>
+                <w:w w:val="100"/>
+                <w:sz w:val="21"/>
               </w:rPr>
-              <w:t>1,342</w:t>
+              <w:t xml:space="preserve">1,342</w:t>
             </w:r>
           </w:p>
         </w:tc>
@@ -711,7 +938,7 @@
         </w:trPr>
         <w:tc>
           <w:tcPr>
-            <w:tcW w:type="dxa" w:w="7920"/>
+            <w:tcW w:type="dxa" w:w="7900"/>
             <w:vAlign w:val="center"/>
             <w:shd w:fill="FFFFFF"/>
             <w:tcBorders>
@@ -729,20 +956,23 @@
           </w:tcPr>
           <w:p>
             <w:pPr>
-              <w:spacing w:after="60" w:before="60" w:line="252" w:lineRule="auto"/>
+              <w:widowControl/>
+              <w:spacing w:after="40" w:line="240" w:lineRule="auto" w:before="40"/>
+              <w:jc w:val="left"/>
             </w:pPr>
             <w:r>
               <w:rPr>
-                <w:b w:val="0"/>
-                <w:sz w:val="20"/>
+                <w:rFonts w:ascii="Arial" w:hAnsi="Arial" w:eastAsia="Arial" w:cs="Arial"/>
+                <w:w w:val="100"/>
+                <w:sz w:val="21"/>
               </w:rPr>
-              <w:t xml:space="preserve">Reference homes within the same 14 groups</w:t>
+              <w:t xml:space="preserve">Reference branch: reference homes within the same 14 groups</w:t>
             </w:r>
           </w:p>
         </w:tc>
         <w:tc>
           <w:tcPr>
-            <w:tcW w:type="dxa" w:w="1944"/>
+            <w:tcW w:type="dxa" w:w="1966"/>
             <w:vAlign w:val="center"/>
             <w:shd w:fill="FFFFFF"/>
             <w:tcBorders>
@@ -760,15 +990,17 @@
           </w:tcPr>
           <w:p>
             <w:pPr>
-              <w:spacing w:after="60" w:before="60" w:line="252" w:lineRule="auto"/>
-              <w:jc w:val="center"/>
+              <w:widowControl/>
+              <w:spacing w:after="40" w:line="240" w:lineRule="auto" w:before="40"/>
+              <w:jc w:val="left"/>
             </w:pPr>
             <w:r>
               <w:rPr>
-                <w:b w:val="0"/>
-                <w:sz w:val="20"/>
+                <w:rFonts w:ascii="Arial" w:hAnsi="Arial" w:eastAsia="Arial" w:cs="Arial"/>
+                <w:w w:val="100"/>
+                <w:sz w:val="21"/>
               </w:rPr>
-              <w:t>906</w:t>
+              <w:t xml:space="preserve">906</w:t>
             </w:r>
           </w:p>
         </w:tc>
@@ -776,103 +1008,269 @@
     </w:tbl>
     <w:p>
       <w:pPr>
-        <w:spacing w:after="20"/>
+        <w:spacing w:before="0" w:after="0" w:line="220" w:lineRule="exact"/>
       </w:pPr>
     </w:p>
     <w:p>
-      <w:pPr/>
+      <w:pPr>
+        <w:widowControl/>
+        <w:spacing w:after="120" w:line="259" w:lineRule="auto"/>
+        <w:jc w:val="left"/>
+      </w:pPr>
       <w:r>
-        <w:t xml:space="preserve">The 3,873 homes belong to 1,726 hosts across six council areas; about 64% are in the City of Melbourne. The median home has 15 annual reviews. We retain all 334 homes with zero annual reviews, or 8.6%, so the comparison includes quieter properties.</w:t>
+        <w:rPr>
+          <w:rFonts w:ascii="Arial" w:hAnsi="Arial" w:eastAsia="Arial" w:cs="Arial"/>
+          <w:w w:val="100"/>
+        </w:rPr>
+        <w:t xml:space="preserve">The 3,873 analysis homes belong to 1,726 hosts across six council areas; about 64% are in the City of Melbourne. The median home has 15 annual reviews. We retain all 334 homes with zero annual reviews (8.6%) so the comparison includes quieter properties.</w:t>
       </w:r>
     </w:p>
     <w:p>
-      <w:pPr/>
+      <w:pPr>
+        <w:widowControl/>
+        <w:spacing w:after="120" w:line="259" w:lineRule="auto"/>
+        <w:jc w:val="left"/>
+      </w:pPr>
       <w:r>
-        <w:t xml:space="preserve">A separate check across the full snapshot finds 6,801 listings with missing or out-of-range prices. The supplied recent-review count is zero for 82% of these listings, against 23.7% of listings retained by the price check. The price rule therefore shifts the sample towards more active properties. The findings describe established, priced residential homes in the covered areas.</w:t>
+        <w:rPr>
+          <w:rFonts w:ascii="Arial" w:hAnsi="Arial" w:eastAsia="Arial" w:cs="Arial"/>
+          <w:w w:val="100"/>
+        </w:rPr>
+        <w:t xml:space="preserve">A separate check across the full snapshot finds 6,801 listings with missing or out-of-range prices. The supplied recent-review count is zero for 82.0% of these excluded listings, against 23.7% of listings retained by the price check. The price rule therefore shifts the sample towards more active properties, meaning our findings describe established, priced residential homes in the covered areas.</w:t>
       </w:r>
     </w:p>
     <w:p>
-      <w:pPr/>
+      <w:pPr>
+        <w:widowControl/>
+        <w:spacing w:after="120" w:line="259" w:lineRule="auto"/>
+        <w:jc w:val="left"/>
+      </w:pPr>
       <w:r>
-        <w:t xml:space="preserve">The 906 reference homes have an upper-quarter cutoff of 29.75 reviews, rounded up to 30. Their hosts remain separate from model training and testing. Category definitions were fixed after earlier exploration; each training sample supplies missing-value replacements and comparable-price medians. Three missing minimum-stay values are filled using the most common training category. Appendix A records the preparation details.</w:t>
+        <w:rPr>
+          <w:rFonts w:ascii="Arial" w:hAnsi="Arial" w:eastAsia="Arial" w:cs="Arial"/>
+          <w:w w:val="100"/>
+        </w:rPr>
+        <w:t xml:space="preserve">The 906 reference homes set our benchmark: their upper-quarter cutoff is 29.75 annual reviews, rounded up to 30. Reference hosts remain strictly separate from model training and testing.</w:t>
       </w:r>
     </w:p>
     <w:p>
       <w:pPr>
         <w:pStyle w:val="Heading1"/>
+        <w:keepNext/>
+        <w:widowControl/>
       </w:pPr>
       <w:r>
-        <w:t>4 Methodology</w:t>
+        <w:rPr>
+          <w:rFonts w:ascii="Arial" w:hAnsi="Arial" w:eastAsia="Arial" w:cs="Arial"/>
+          <w:w w:val="100"/>
+        </w:rPr>
+        <w:t xml:space="preserve">4. Methodology</w:t>
       </w:r>
     </w:p>
     <w:p>
-      <w:pPr/>
+      <w:pPr>
+        <w:widowControl/>
+        <w:spacing w:after="120" w:line="259" w:lineRule="auto"/>
+        <w:jc w:val="left"/>
+      </w:pPr>
       <w:r>
-        <w:t xml:space="preserve">We first compare the share of homes reaching 30 annual reviews in each group. Repeating the calculation on resampled hosts shows how much those shares vary. Each host's properties stay together because they can share management practices.</w:t>
+        <w:rPr>
+          <w:rFonts w:ascii="Arial" w:hAnsi="Arial" w:eastAsia="Arial" w:cs="Arial"/>
+          <w:w w:val="100"/>
+        </w:rPr>
+        <w:t xml:space="preserve">We first compare the share of homes reaching 30 annual reviews across the 14 eligible groups. Repeating the calculation across 1,000 resamples of hosts shows how much those shares vary. Each host's properties stay together because multi-listing hosts can share management practices.</w:t>
       </w:r>
     </w:p>
     <w:p>
-      <w:pPr/>
+      <w:pPr>
+        <w:widowControl/>
+        <w:spacing w:after="120" w:line="259" w:lineRule="auto"/>
+        <w:jc w:val="left"/>
+      </w:pPr>
       <w:r>
-        <w:t xml:space="preserve">We use logistic regression in R to rank individual homes (R Core Team, n.d.). Its outcome is whether a home reaches 30 annual reviews. The six inputs are council area, dwelling type, bedroom count, price relative to similar homes, acceptance of one-night stays and amenity count. The model learns a weight for each input from training homes and combines their contributions into a score. Higher scores move homes earlier in the investigation list.</w:t>
+        <w:rPr>
+          <w:rFonts w:ascii="Arial" w:hAnsi="Arial" w:eastAsia="Arial" w:cs="Arial"/>
+          <w:w w:val="100"/>
+        </w:rPr>
+        <w:t xml:space="preserve">We use binary logistic regression in R to rank individual homes. Its </w:t>
+      </w:r>
+      <w:r>
+        <w:rPr>
+          <w:rFonts w:ascii="Arial" w:hAnsi="Arial" w:eastAsia="Arial" w:cs="Arial"/>
+          <w:w w:val="100"/>
+          <w:b/>
+        </w:rPr>
+        <w:t xml:space="preserve">outcome variable</w:t>
+      </w:r>
+      <w:r>
+        <w:rPr>
+          <w:rFonts w:ascii="Arial" w:hAnsi="Arial" w:eastAsia="Arial" w:cs="Arial"/>
+          <w:w w:val="100"/>
+        </w:rPr>
+        <w:t xml:space="preserve"> is whether a home reaches at least 30 annual reviews. The </w:t>
+      </w:r>
+      <w:r>
+        <w:rPr>
+          <w:rFonts w:ascii="Arial" w:hAnsi="Arial" w:eastAsia="Arial" w:cs="Arial"/>
+          <w:w w:val="100"/>
+          <w:b/>
+        </w:rPr>
+        <w:t xml:space="preserve">six independent variables (inputs)</w:t>
+      </w:r>
+      <w:r>
+        <w:rPr>
+          <w:rFonts w:ascii="Arial" w:hAnsi="Arial" w:eastAsia="Arial" w:cs="Arial"/>
+          <w:w w:val="100"/>
+        </w:rPr>
+        <w:t xml:space="preserve"> are council area, dwelling type, bedroom count, nightly price relative to the median of similar training homes, acceptance of one-night stays, and amenity count. The model learns a weight for each input from training homes and combines their contributions into a score. Higher scores move homes earlier in the investigation list. Group median prices and replacements for three missing minimum-stay values are calculated strictly within each training sample (Appendix A).</w:t>
       </w:r>
     </w:p>
     <w:p>
-      <w:pPr/>
+      <w:pPr>
+        <w:widowControl/>
+        <w:spacing w:after="120" w:line="259" w:lineRule="auto"/>
+        <w:jc w:val="left"/>
+      </w:pPr>
       <w:r>
-        <w:t xml:space="preserve">Our comparison method assigns every home its group's training success rate, adjusted towards the overall training rate. Homes in one group receive equal scores. A second model removes price and minimum-stay information, showing how much these operating details add to selection.</w:t>
+        <w:rPr>
+          <w:rFonts w:ascii="Arial" w:hAnsi="Arial" w:eastAsia="Arial" w:cs="Arial"/>
+          <w:w w:val="100"/>
+        </w:rPr>
+        <w:t xml:space="preserve">Our </w:t>
+      </w:r>
+      <w:r>
+        <w:rPr>
+          <w:rFonts w:ascii="Arial" w:hAnsi="Arial" w:eastAsia="Arial" w:cs="Arial"/>
+          <w:w w:val="100"/>
+          <w:b/>
+        </w:rPr>
+        <w:t xml:space="preserve">group-rate baseline</w:t>
+      </w:r>
+      <w:r>
+        <w:rPr>
+          <w:rFonts w:ascii="Arial" w:hAnsi="Arial" w:eastAsia="Arial" w:cs="Arial"/>
+          <w:w w:val="100"/>
+        </w:rPr>
+        <w:t xml:space="preserve"> assigns every home its group's smoothed training target rate. Because all homes in one group receive equal baseline scores, selecting a fixed share within a single group using the baseline matches choosing homes at random within that group. A </w:t>
+      </w:r>
+      <w:r>
+        <w:rPr>
+          <w:rFonts w:ascii="Arial" w:hAnsi="Arial" w:eastAsia="Arial" w:cs="Arial"/>
+          <w:w w:val="100"/>
+          <w:b/>
+        </w:rPr>
+        <w:t xml:space="preserve">reduced four-input model</w:t>
+      </w:r>
+      <w:r>
+        <w:rPr>
+          <w:rFonts w:ascii="Arial" w:hAnsi="Arial" w:eastAsia="Arial" w:cs="Arial"/>
+          <w:w w:val="100"/>
+        </w:rPr>
+        <w:t xml:space="preserve"> removes price and minimum-stay information, ranking homes within a group by amenity count alone to show how much current operating details add to selection.</w:t>
       </w:r>
     </w:p>
     <w:p>
-      <w:pPr/>
+      <w:pPr>
+        <w:widowControl/>
+        <w:spacing w:after="120" w:line="259" w:lineRule="auto"/>
+        <w:jc w:val="left"/>
+      </w:pPr>
       <w:r>
-        <w:t xml:space="preserve">We compare the methods over 50 host splits. Each split uses 70% of hosts for training and 30% for testing. All properties belonging to a host stay on the same side. The methods select equal numbers from the same test homes, keeping the comparison fair.</w:t>
+        <w:rPr>
+          <w:rFonts w:ascii="Arial" w:hAnsi="Arial" w:eastAsia="Arial" w:cs="Arial"/>
+          <w:w w:val="100"/>
+        </w:rPr>
+        <w:t xml:space="preserve">We compare the methods over 50 host splits (70% of hosts for training and 30% for testing, keeping each host's properties on the same side). The main comparison selects 25% of test homes separately within each priority group and averages the selected homes' target rates across the 50 tests. We also test 10% and 50% quotas to show how investigation capacity affects shortlist precision and coverage.</w:t>
       </w:r>
     </w:p>
     <w:p>
-      <w:pPr/>
+      <w:pPr>
+        <w:widowControl/>
+        <w:spacing w:after="120" w:line="259" w:lineRule="auto"/>
+        <w:jc w:val="left"/>
+      </w:pPr>
       <w:r>
-        <w:t xml:space="preserve">The main comparison selects 25% of homes separately within each priority group and averages the selected homes' target rate across the 50 tests. We also test 10% and 50% to show how investigation capacity affects the results. Appendix A explains rounding and tied scores.</w:t>
-      </w:r>
-    </w:p>
-    <w:p>
-      <w:pPr/>
-      <w:r>
-        <w:t xml:space="preserve">To check whether the search priorities hold across time, we reconstruct two consecutive annual review windows from the same snapshot. We choose the earlier leading groups and follow their activity in the later window. This separate comparison uses a 34-review target, fixed from the earlier reference window.</w:t>
+        <w:rPr>
+          <w:rFonts w:ascii="Arial" w:hAnsi="Arial" w:eastAsia="Arial" w:cs="Arial"/>
+          <w:w w:val="100"/>
+        </w:rPr>
+        <w:t xml:space="preserve">To check whether the search priorities hold across time, we reconstruct two consecutive 365-day review windows from the snapshot (the earlier 365-day window followed by the 365-day window ending on collection). Requiring at least two years of review history and at least 50 homes per group leaves 2,657 homes across ten groups. We follow the earlier leading groups into the later window using a fixed 34-review target set from the earlier reference window.</w:t>
       </w:r>
     </w:p>
     <w:p>
       <w:pPr>
         <w:pStyle w:val="Heading1"/>
+        <w:keepNext/>
+        <w:widowControl/>
       </w:pPr>
       <w:r>
-        <w:t>5 Analysis and Results</w:t>
+        <w:rPr>
+          <w:rFonts w:ascii="Arial" w:hAnsi="Arial" w:eastAsia="Arial" w:cs="Arial"/>
+          <w:w w:val="100"/>
+        </w:rPr>
+        <w:t xml:space="preserve">5. Analysis and Results</w:t>
       </w:r>
     </w:p>
     <w:p>
       <w:pPr>
         <w:pStyle w:val="Heading2"/>
+        <w:keepNext/>
+        <w:widowControl/>
       </w:pPr>
       <w:r>
-        <w:t xml:space="preserve">City apartments are the first search priority</w:t>
+        <w:rPr>
+          <w:rFonts w:ascii="Arial" w:hAnsi="Arial" w:eastAsia="Arial" w:cs="Arial"/>
+          <w:w w:val="100"/>
+        </w:rPr>
+        <w:t xml:space="preserve">5.1 Descriptive comparison: City apartments are the first search priority</w:t>
       </w:r>
     </w:p>
     <w:p>
-      <w:pPr/>
+      <w:pPr>
+        <w:widowControl/>
+        <w:spacing w:after="120" w:line="259" w:lineRule="auto"/>
+        <w:jc w:val="left"/>
+      </w:pPr>
       <w:r>
-        <w:t xml:space="preserve">Across the analysis sample, 981 of 3,873 homes reach 30 annual reviews, or 25.3%. Group rates range from 8.2% to 36.6%, giving the client a clear reason to focus the search.</w:t>
+        <w:rPr>
+          <w:rFonts w:ascii="Arial" w:hAnsi="Arial" w:eastAsia="Arial" w:cs="Arial"/>
+          <w:w w:val="100"/>
+        </w:rPr>
+        <w:t xml:space="preserve">Across the analysis sample, 981 of 3,873 homes reach 30 annual reviews, or 25.3%. Group rates range from 8.2% to 36.6% across the 14 groups, giving the client a clear reason to focus the search.</w:t>
       </w:r>
     </w:p>
     <w:p>
-      <w:pPr/>
+      <w:pPr>
+        <w:widowControl/>
+        <w:spacing w:after="120" w:line="259" w:lineRule="auto"/>
+        <w:jc w:val="left"/>
+      </w:pPr>
       <w:r>
-        <w:t xml:space="preserve">City of Melbourne three-bedroom apartments lead at 36.6%, with 112 of 306 homes reaching the target. Two-bedroom apartments follow at 32.8%, or 405 of 1,235. Yarra Ranges three-bedroom houses and townhouses reach 30.0%, or 27 of 90. The city groups combine stronger observed activity with larger samples, supporting their position as the first search priority. In the supplied snapshot, median quoted nightly prices are AUD285, AUD450 and AUD425.75 for Melbourne two-bedroom apartments, Melbourne three-bedroom apartments and Yarra Ranges three-bedroom houses/townhouses, respectively. One-night acceptance ranges from 22.2% to 59.8%, and median amenity counts from 44 to 55. These are advertised rates, not rents or prices actually paid.</w:t>
+        <w:rPr>
+          <w:rFonts w:ascii="Arial" w:hAnsi="Arial" w:eastAsia="Arial" w:cs="Arial"/>
+          <w:w w:val="100"/>
+        </w:rPr>
+        <w:t xml:space="preserve">City of Melbourne three-bedroom apartments lead at 36.6% (112 of 306 homes), followed by City of Melbourne two-bedroom apartments at 32.8% (405 of 1,235) and Yarra Ranges three-bedroom houses and townhouses at 30.0% (27 of 90). The city groups combine stronger observed activity with larger samples, supporting their position as the first search priority.</w:t>
+      </w:r>
+    </w:p>
+    <w:p>
+      <w:pPr>
+        <w:widowControl/>
+        <w:spacing w:after="120" w:line="259" w:lineRule="auto"/>
+        <w:jc w:val="left"/>
+      </w:pPr>
+      <w:r>
+        <w:rPr>
+          <w:rFonts w:ascii="Arial" w:hAnsi="Arial"/>
+          <w:w w:val="100"/>
+        </w:rPr>
+        <w:t>In the supplied snapshot, median quoted nightly prices are AUD 285, AUD 450 and AUD 425.75 for Melbourne two-bedroom apartments, Melbourne three-bedroom apartments and Yarra Ranges three-bedroom houses/townhouses, respectively. One-night acceptance ranges from 22.2% to 59.8%, and median amenity counts from 44 to 55. These are advertised rates, not rents or prices actually paid.</w:t>
       </w:r>
     </w:p>
     <w:p>
       <w:pPr>
         <w:keepNext/>
-        <w:spacing w:after="80"/>
+        <w:spacing w:after="40" w:before="80"/>
         <w:jc w:val="center"/>
       </w:pPr>
       <w:r>
@@ -913,47 +1311,159 @@
     <w:p>
       <w:pPr>
         <w:pStyle w:val="Caption"/>
+        <w:widowControl/>
       </w:pPr>
       <w:r>
         <w:rPr>
+          <w:rFonts w:ascii="Arial" w:hAnsi="Arial" w:eastAsia="Arial" w:cs="Arial"/>
+          <w:w w:val="100"/>
           <w:b/>
         </w:rPr>
-        <w:t>Figure 1.</w:t>
+        <w:t xml:space="preserve">Figure 1.</w:t>
       </w:r>
       <w:r>
+        <w:rPr>
+          <w:rFonts w:ascii="Arial" w:hAnsi="Arial" w:eastAsia="Arial" w:cs="Arial"/>
+          <w:w w:val="100"/>
+        </w:rPr>
         <w:t xml:space="preserve"> Homes reaching at least 30 annual reviews. Horizontal lines show 90% ranges from resampling hosts; the dashed line marks the overall 25.3%. Appendix B shows all 14 groups.</w:t>
       </w:r>
     </w:p>
     <w:p>
-      <w:pPr/>
+      <w:pPr>
+        <w:widowControl/>
+        <w:spacing w:after="120" w:line="259" w:lineRule="auto"/>
+        <w:jc w:val="left"/>
+      </w:pPr>
       <w:r>
-        <w:t xml:space="preserve">The same three groups lead when minimum group size changes to 30 or 75 homes, or when the price or history rule is removed. Their order can change, so use the three-group shortlist to guide the search. Adding specialised accommodation changes the shortlist and addresses a broader market than the client's residential search.</w:t>
+        <w:rPr>
+          <w:rFonts w:ascii="Arial" w:hAnsi="Arial" w:eastAsia="Arial" w:cs="Arial"/>
+          <w:w w:val="100"/>
+        </w:rPr>
+        <w:t xml:space="preserve">The same three groups lead when minimum group size changes to 30 or 75 homes, or when the price or history rule is removed. Their order can change across resamples, so use the three-group shortlist together to guide the search. Adding specialised accommodation alters the shortlist and addresses a broader market than the client's residential search.</w:t>
       </w:r>
     </w:p>
     <w:p>
       <w:pPr>
         <w:pStyle w:val="Heading2"/>
+        <w:keepNext/>
+        <w:widowControl/>
       </w:pPr>
       <w:r>
-        <w:t xml:space="preserve">The model improves selection within the priority groups</w:t>
+        <w:rPr>
+          <w:rFonts w:ascii="Arial" w:hAnsi="Arial" w:eastAsia="Arial" w:cs="Arial"/>
+          <w:w w:val="100"/>
+        </w:rPr>
+        <w:t xml:space="preserve">5.2 Predictive screening: The model improves selection within the priority groups</w:t>
       </w:r>
     </w:p>
     <w:p>
-      <w:pPr/>
+      <w:pPr>
+        <w:widowControl/>
+        <w:spacing w:after="120" w:line="259" w:lineRule="auto"/>
+        <w:jc w:val="left"/>
+      </w:pPr>
       <w:r>
-        <w:t xml:space="preserve">The complete model helps decide which homes to investigate first. Selecting 25% within each priority group produces an average historical target rate of 49.6%, compared with 38.6% for the model without price and minimum stay and 32.4% for group rates alone.</w:t>
+        <w:rPr>
+          <w:rFonts w:ascii="Arial" w:hAnsi="Arial" w:eastAsia="Arial" w:cs="Arial"/>
+          <w:w w:val="100"/>
+        </w:rPr>
+        <w:t xml:space="preserve">The complete model helps decide which homes to investigate first. Selecting 25% within each priority group produces an average historical target rate of </w:t>
+      </w:r>
+      <w:r>
+        <w:rPr>
+          <w:rFonts w:ascii="Arial" w:hAnsi="Arial" w:eastAsia="Arial" w:cs="Arial"/>
+          <w:w w:val="100"/>
+          <w:b/>
+        </w:rPr>
+        <w:t xml:space="preserve">49.6%</w:t>
+      </w:r>
+      <w:r>
+        <w:rPr>
+          <w:rFonts w:ascii="Arial" w:hAnsi="Arial" w:eastAsia="Arial" w:cs="Arial"/>
+          <w:w w:val="100"/>
+        </w:rPr>
+        <w:t xml:space="preserve">, compared with </w:t>
+      </w:r>
+      <w:r>
+        <w:rPr>
+          <w:rFonts w:ascii="Arial" w:hAnsi="Arial" w:eastAsia="Arial" w:cs="Arial"/>
+          <w:w w:val="100"/>
+          <w:b/>
+        </w:rPr>
+        <w:t xml:space="preserve">38.6%</w:t>
+      </w:r>
+      <w:r>
+        <w:rPr>
+          <w:rFonts w:ascii="Arial" w:hAnsi="Arial" w:eastAsia="Arial" w:cs="Arial"/>
+          <w:w w:val="100"/>
+        </w:rPr>
+        <w:t xml:space="preserve"> for the reduced model without price and minimum stay and </w:t>
+      </w:r>
+      <w:r>
+        <w:rPr>
+          <w:rFonts w:ascii="Arial" w:hAnsi="Arial" w:eastAsia="Arial" w:cs="Arial"/>
+          <w:w w:val="100"/>
+          <w:b/>
+        </w:rPr>
+        <w:t xml:space="preserve">32.4%</w:t>
+      </w:r>
+      <w:r>
+        <w:rPr>
+          <w:rFonts w:ascii="Arial" w:hAnsi="Arial" w:eastAsia="Arial" w:cs="Arial"/>
+          <w:w w:val="100"/>
+        </w:rPr>
+        <w:t xml:space="preserve"> for group rates alone (Figure 2).</w:t>
       </w:r>
     </w:p>
     <w:p>
-      <w:pPr/>
+      <w:pPr>
+        <w:widowControl/>
+        <w:spacing w:after="120" w:line="259" w:lineRule="auto"/>
+        <w:jc w:val="left"/>
+      </w:pPr>
       <w:r>
-        <w:t xml:space="preserve">The complete model adds 17.2 percentage points. For a list of 100 selected homes, that means about 17 more homes with at least 30 annual reviews. It directs investigation time towards homes with stronger recorded guest activity.</w:t>
+        <w:rPr>
+          <w:rFonts w:ascii="Arial" w:hAnsi="Arial" w:eastAsia="Arial" w:cs="Arial"/>
+          <w:w w:val="100"/>
+        </w:rPr>
+        <w:t xml:space="preserve">The complete model adds </w:t>
+      </w:r>
+      <w:r>
+        <w:rPr>
+          <w:rFonts w:ascii="Arial" w:hAnsi="Arial" w:eastAsia="Arial" w:cs="Arial"/>
+          <w:w w:val="100"/>
+          <w:b/>
+        </w:rPr>
+        <w:t xml:space="preserve">17.2 percentage points</w:t>
+      </w:r>
+      <w:r>
+        <w:rPr>
+          <w:rFonts w:ascii="Arial" w:hAnsi="Arial" w:eastAsia="Arial" w:cs="Arial"/>
+          <w:w w:val="100"/>
+        </w:rPr>
+        <w:t xml:space="preserve"> over group rates alone. For a list of 100 selected homes, that means about </w:t>
+      </w:r>
+      <w:r>
+        <w:rPr>
+          <w:rFonts w:ascii="Arial" w:hAnsi="Arial" w:eastAsia="Arial" w:cs="Arial"/>
+          <w:w w:val="100"/>
+          <w:b/>
+        </w:rPr>
+        <w:t xml:space="preserve">17 more homes</w:t>
+      </w:r>
+      <w:r>
+        <w:rPr>
+          <w:rFonts w:ascii="Arial" w:hAnsi="Arial" w:eastAsia="Arial" w:cs="Arial"/>
+          <w:w w:val="100"/>
+        </w:rPr>
+        <w:t xml:space="preserve"> with at least 30 annual reviews, directing investigation time towards homes with stronger recorded guest activity.</w:t>
       </w:r>
     </w:p>
     <w:p>
       <w:pPr>
         <w:keepNext/>
-        <w:spacing w:after="80"/>
+        <w:spacing w:after="40" w:before="80"/>
         <w:jc w:val="center"/>
       </w:pPr>
       <w:r>
@@ -994,52 +1504,158 @@
     <w:p>
       <w:pPr>
         <w:pStyle w:val="Caption"/>
+        <w:widowControl/>
       </w:pPr>
       <w:r>
         <w:rPr>
+          <w:rFonts w:ascii="Arial" w:hAnsi="Arial" w:eastAsia="Arial" w:cs="Arial"/>
+          <w:w w:val="100"/>
           <w:b/>
         </w:rPr>
-        <w:t>Figure 2.</w:t>
+        <w:t xml:space="preserve">Figure 2.</w:t>
       </w:r>
       <w:r>
+        <w:rPr>
+          <w:rFonts w:ascii="Arial" w:hAnsi="Arial" w:eastAsia="Arial" w:cs="Arial"/>
+          <w:w w:val="100"/>
+        </w:rPr>
         <w:t xml:space="preserve"> Average historical target rates over 50 tests. Each method selects 25% within each priority group. The reduced model leaves out price and minimum-stay information.</w:t>
       </w:r>
     </w:p>
     <w:p>
-      <w:pPr/>
+      <w:pPr>
+        <w:widowControl/>
+        <w:spacing w:after="120" w:line="259" w:lineRule="auto"/>
+        <w:jc w:val="left"/>
+      </w:pPr>
       <w:r>
-        <w:t xml:space="preserve">The complete model leads in 46 of the 50 tests and trails in four. Gains fluctuate: the middle 90% run from -0.7 to 31.8 percentage points. These overlapping historical tests support prioritising investigations while showing how much performance varies with the homes available.</w:t>
+        <w:rPr>
+          <w:rFonts w:ascii="Arial" w:hAnsi="Arial" w:eastAsia="Arial" w:cs="Arial"/>
+          <w:w w:val="100"/>
+        </w:rPr>
+        <w:t xml:space="preserve">The complete model leads in </w:t>
+      </w:r>
+      <w:r>
+        <w:rPr>
+          <w:rFonts w:ascii="Arial" w:hAnsi="Arial" w:eastAsia="Arial" w:cs="Arial"/>
+          <w:w w:val="100"/>
+          <w:b/>
+        </w:rPr>
+        <w:t xml:space="preserve">46 of the 50 tests</w:t>
+      </w:r>
+      <w:r>
+        <w:rPr>
+          <w:rFonts w:ascii="Arial" w:hAnsi="Arial" w:eastAsia="Arial" w:cs="Arial"/>
+          <w:w w:val="100"/>
+        </w:rPr>
+        <w:t xml:space="preserve"> and trails in four, with the middle 90% of gains running from </w:t>
+      </w:r>
+      <w:r>
+        <w:rPr>
+          <w:rFonts w:ascii="Arial" w:hAnsi="Arial" w:eastAsia="Arial" w:cs="Arial"/>
+          <w:w w:val="100"/>
+          <w:b/>
+        </w:rPr>
+        <w:t xml:space="preserve">-0.7 to 31.8 percentage points</w:t>
+      </w:r>
+      <w:r>
+        <w:rPr>
+          <w:rFonts w:ascii="Arial" w:hAnsi="Arial" w:eastAsia="Arial" w:cs="Arial"/>
+          <w:w w:val="100"/>
+        </w:rPr>
+        <w:t xml:space="preserve">. These overlapping historical tests support prioritising investigations while showing how much performance varies with the homes available.</w:t>
       </w:r>
     </w:p>
     <w:p>
-      <w:pPr/>
+      <w:pPr>
+        <w:widowControl/>
+        <w:spacing w:after="120" w:line="259" w:lineRule="auto"/>
+        <w:jc w:val="left"/>
+      </w:pPr>
       <w:r>
-        <w:t xml:space="preserve">Price and minimum-stay information add 11.0 percentage points over the reduced model. Within a fixed group, that reduced model ranks homes using amenity count alone. For city three-bedroom apartments, it reaches 33.9%, below the baseline's 35.9%. The full six-input model is therefore the stronger tool for established homes with comparable operating details. New rental searches start with the group priorities.</w:t>
+        <w:rPr>
+          <w:rFonts w:ascii="Arial" w:hAnsi="Arial" w:eastAsia="Arial" w:cs="Arial"/>
+          <w:w w:val="100"/>
+        </w:rPr>
+        <w:t xml:space="preserve">Across all 50 fits, holding property group fixed, </w:t>
+      </w:r>
+      <w:r>
+        <w:rPr>
+          <w:rFonts w:ascii="Arial" w:hAnsi="Arial" w:eastAsia="Arial" w:cs="Arial"/>
+          <w:w w:val="100"/>
+          <w:b/>
+        </w:rPr>
+        <w:t xml:space="preserve">lower relative nightly prices, acceptance of one-night stays, and more amenities each raise a home's predicted score</w:t>
+      </w:r>
+      <w:r>
+        <w:rPr>
+          <w:rFonts w:ascii="Arial" w:hAnsi="Arial" w:eastAsia="Arial" w:cs="Arial"/>
+          <w:w w:val="100"/>
+        </w:rPr>
+        <w:t xml:space="preserve">. Together, price and minimum-stay information add 11.0 percentage points over the reduced model (49.6% versus 38.6%).</w:t>
+      </w:r>
+    </w:p>
+    <w:p>
+      <w:pPr>
+        <w:widowControl/>
+        <w:spacing w:after="120" w:line="259" w:lineRule="auto"/>
+        <w:jc w:val="left"/>
+      </w:pPr>
+      <w:r>
+        <w:rPr>
+          <w:rFonts w:ascii="Arial" w:hAnsi="Arial" w:eastAsia="Arial" w:cs="Arial"/>
+          <w:w w:val="100"/>
+        </w:rPr>
+        <w:t xml:space="preserve">Without price and minimum-stay inputs, the reduced model ranks homes within a fixed group using amenity count alone—and in city three-bedroom apartments, its 33.9% target rate falls below the baseline's 35.9%. Because unleased new rentals do not yet have established Airbnb prices or stay rules, the reduced model is not a reliable substitute. Use the full six-input model to rank established listings with comparable operating details, and start new rental searches with the group priorities.</w:t>
       </w:r>
     </w:p>
     <w:p>
       <w:pPr>
         <w:pStyle w:val="Heading2"/>
+        <w:keepNext/>
+        <w:widowControl/>
       </w:pPr>
       <w:r>
-        <w:t xml:space="preserve">Investigation capacity determines list size and coverage</w:t>
-      </w:r>
-    </w:p>
-    <w:p>
-      <w:pPr/>
-      <w:r>
-        <w:t xml:space="preserve">Shorter lists concentrate on stronger historical activity. Longer lists capture more qualifying homes. Table 2 shows the choice available to a client with limited investigation time.</w:t>
+        <w:rPr>
+          <w:rFonts w:ascii="Arial" w:hAnsi="Arial" w:eastAsia="Arial" w:cs="Arial"/>
+          <w:w w:val="100"/>
+        </w:rPr>
+        <w:t xml:space="preserve">5.3 Prescriptive trade-off: Investigation capacity determines list size and coverage</w:t>
       </w:r>
     </w:p>
     <w:p>
       <w:pPr>
+        <w:widowControl/>
+        <w:spacing w:after="120" w:line="259" w:lineRule="auto"/>
+        <w:jc w:val="left"/>
+      </w:pPr>
+      <w:r>
+        <w:rPr>
+          <w:rFonts w:ascii="Arial" w:hAnsi="Arial" w:eastAsia="Arial" w:cs="Arial"/>
+          <w:w w:val="100"/>
+        </w:rPr>
+        <w:t xml:space="preserve">Shorter lists concentrate on stronger historical activity, whereas longer lists capture more qualifying homes. Table 2 shows the choice available to a client with limited investigation time.</w:t>
+      </w:r>
+    </w:p>
+    <w:p>
+      <w:pPr>
+        <w:spacing w:before="0" w:after="0" w:line="220" w:lineRule="exact"/>
+      </w:pPr>
+    </w:p>
+    <w:p>
+      <w:pPr>
+        <w:widowControl/>
+        <w:spacing w:after="120" w:line="259" w:lineRule="auto" w:before="80"/>
+        <w:jc w:val="left"/>
         <w:keepNext/>
       </w:pPr>
       <w:r>
         <w:rPr>
+          <w:rFonts w:ascii="Arial" w:hAnsi="Arial" w:eastAsia="Arial" w:cs="Arial"/>
+          <w:w w:val="100"/>
           <w:b/>
         </w:rPr>
-        <w:t>Table 2. Results at different investigation capacities</w:t>
+        <w:t xml:space="preserve">Table 2. Results at different investigation capacities (50-split averages)</w:t>
       </w:r>
     </w:p>
     <w:tbl>
@@ -1058,9 +1674,10 @@
         </w:tblBorders>
       </w:tblPr>
       <w:tblGrid>
-        <w:gridCol w:w="3289"/>
-        <w:gridCol w:w="3289"/>
-        <w:gridCol w:w="3289"/>
+        <w:gridCol w:w="2368"/>
+        <w:gridCol w:w="2632"/>
+        <w:gridCol w:w="2366"/>
+        <w:gridCol w:w="2500"/>
       </w:tblGrid>
       <w:tr>
         <w:trPr>
@@ -1069,7 +1686,7 @@
         </w:trPr>
         <w:tc>
           <w:tcPr>
-            <w:tcW w:type="dxa" w:w="2232"/>
+            <w:tcW w:type="dxa" w:w="2368"/>
             <w:vAlign w:val="center"/>
             <w:shd w:fill="E9EEF3"/>
             <w:tcBorders>
@@ -1087,20 +1704,24 @@
           </w:tcPr>
           <w:p>
             <w:pPr>
-              <w:spacing w:after="60" w:before="60" w:line="252" w:lineRule="auto"/>
+              <w:widowControl/>
+              <w:spacing w:after="40" w:line="240" w:lineRule="auto" w:before="40"/>
+              <w:jc w:val="left"/>
             </w:pPr>
             <w:r>
               <w:rPr>
+                <w:rFonts w:ascii="Arial" w:hAnsi="Arial" w:eastAsia="Arial" w:cs="Arial"/>
+                <w:w w:val="100"/>
+                <w:sz w:val="21"/>
                 <w:b/>
-                <w:sz w:val="20"/>
               </w:rPr>
-              <w:t>Share investigated in each group</w:t>
+              <w:t xml:space="preserve">Share investigated in each group</w:t>
             </w:r>
           </w:p>
         </w:tc>
         <w:tc>
           <w:tcPr>
-            <w:tcW w:type="dxa" w:w="3528"/>
+            <w:tcW w:type="dxa" w:w="2632"/>
             <w:vAlign w:val="center"/>
             <w:shd w:fill="E9EEF3"/>
             <w:tcBorders>
@@ -1118,21 +1739,24 @@
           </w:tcPr>
           <w:p>
             <w:pPr>
-              <w:spacing w:after="60" w:before="60" w:line="252" w:lineRule="auto"/>
-              <w:jc w:val="center"/>
+              <w:widowControl/>
+              <w:spacing w:after="40" w:line="240" w:lineRule="auto" w:before="40"/>
+              <w:jc w:val="left"/>
             </w:pPr>
             <w:r>
               <w:rPr>
+                <w:rFonts w:ascii="Arial" w:hAnsi="Arial" w:eastAsia="Arial" w:cs="Arial"/>
+                <w:w w:val="100"/>
+                <w:sz w:val="21"/>
                 <w:b/>
-                <w:sz w:val="20"/>
               </w:rPr>
-              <w:t>Share of selected homes reaching 30 reviews</w:t>
+              <w:t xml:space="preserve">Share of selected homes reaching 30 reviews</w:t>
             </w:r>
           </w:p>
         </w:tc>
         <w:tc>
           <w:tcPr>
-            <w:tcW w:type="dxa" w:w="4104"/>
+            <w:tcW w:type="dxa" w:w="2366"/>
             <w:vAlign w:val="center"/>
             <w:shd w:fill="E9EEF3"/>
             <w:tcBorders>
@@ -1150,15 +1774,53 @@
           </w:tcPr>
           <w:p>
             <w:pPr>
-              <w:spacing w:after="60" w:before="60" w:line="252" w:lineRule="auto"/>
-              <w:jc w:val="center"/>
+              <w:widowControl/>
+              <w:spacing w:after="40" w:line="240" w:lineRule="auto" w:before="40"/>
+              <w:jc w:val="left"/>
             </w:pPr>
             <w:r>
               <w:rPr>
+                <w:rFonts w:ascii="Arial" w:hAnsi="Arial" w:eastAsia="Arial" w:cs="Arial"/>
+                <w:w w:val="100"/>
+                <w:sz w:val="21"/>
                 <w:b/>
-                <w:sz w:val="20"/>
               </w:rPr>
-              <w:t>Share of all qualifying homes found</w:t>
+              <w:t xml:space="preserve">Share of all qualifying homes found</w:t>
+            </w:r>
+          </w:p>
+        </w:tc>
+        <w:tc>
+          <w:tcPr>
+            <w:tcW w:type="dxa" w:w="2500"/>
+            <w:vAlign w:val="center"/>
+            <w:shd w:fill="E9EEF3"/>
+            <w:tcBorders>
+              <w:top w:val="single" w:sz="4" w:color="D9D9D9"/>
+              <w:left w:val="single" w:sz="4" w:color="D9D9D9"/>
+              <w:bottom w:val="single" w:sz="4" w:color="D9D9D9"/>
+              <w:right w:val="single" w:sz="4" w:color="D9D9D9"/>
+            </w:tcBorders>
+            <w:tcMar>
+              <w:top w:w="85" w:type="dxa"/>
+              <w:left w:w="85" w:type="dxa"/>
+              <w:bottom w:w="85" w:type="dxa"/>
+              <w:right w:w="85" w:type="dxa"/>
+            </w:tcMar>
+          </w:tcPr>
+          <w:p>
+            <w:pPr>
+              <w:widowControl/>
+              <w:spacing w:after="40" w:line="240" w:lineRule="auto" w:before="40"/>
+              <w:jc w:val="left"/>
+            </w:pPr>
+            <w:r>
+              <w:rPr>
+                <w:rFonts w:ascii="Arial" w:hAnsi="Arial" w:eastAsia="Arial" w:cs="Arial"/>
+                <w:w w:val="100"/>
+                <w:sz w:val="21"/>
+                <w:b/>
+              </w:rPr>
+              <w:t xml:space="preserve">Gain over group rates (percentage points)</w:t>
             </w:r>
           </w:p>
         </w:tc>
@@ -1169,7 +1831,7 @@
         </w:trPr>
         <w:tc>
           <w:tcPr>
-            <w:tcW w:type="dxa" w:w="2232"/>
+            <w:tcW w:type="dxa" w:w="2368"/>
             <w:vAlign w:val="center"/>
             <w:shd w:fill="FFFFFF"/>
             <w:tcBorders>
@@ -1187,20 +1849,23 @@
           </w:tcPr>
           <w:p>
             <w:pPr>
-              <w:spacing w:after="60" w:before="60" w:line="252" w:lineRule="auto"/>
+              <w:widowControl/>
+              <w:spacing w:after="40" w:line="240" w:lineRule="auto" w:before="40"/>
+              <w:jc w:val="left"/>
             </w:pPr>
             <w:r>
               <w:rPr>
-                <w:b w:val="0"/>
-                <w:sz w:val="20"/>
+                <w:rFonts w:ascii="Arial" w:hAnsi="Arial" w:eastAsia="Arial" w:cs="Arial"/>
+                <w:w w:val="100"/>
+                <w:sz w:val="21"/>
               </w:rPr>
-              <w:t>10%</w:t>
+              <w:t xml:space="preserve">10%</w:t>
             </w:r>
           </w:p>
         </w:tc>
         <w:tc>
           <w:tcPr>
-            <w:tcW w:type="dxa" w:w="3528"/>
+            <w:tcW w:type="dxa" w:w="2632"/>
             <w:vAlign w:val="center"/>
             <w:shd w:fill="FFFFFF"/>
             <w:tcBorders>
@@ -1218,21 +1883,23 @@
           </w:tcPr>
           <w:p>
             <w:pPr>
-              <w:spacing w:after="60" w:before="60" w:line="252" w:lineRule="auto"/>
-              <w:jc w:val="center"/>
+              <w:widowControl/>
+              <w:spacing w:after="40" w:line="240" w:lineRule="auto" w:before="40"/>
+              <w:jc w:val="left"/>
             </w:pPr>
             <w:r>
               <w:rPr>
-                <w:b w:val="0"/>
-                <w:sz w:val="20"/>
+                <w:rFonts w:ascii="Arial" w:hAnsi="Arial" w:eastAsia="Arial" w:cs="Arial"/>
+                <w:w w:val="100"/>
+                <w:sz w:val="21"/>
               </w:rPr>
-              <w:t>54.5%</w:t>
+              <w:t xml:space="preserve">54.5%</w:t>
             </w:r>
           </w:p>
         </w:tc>
         <w:tc>
           <w:tcPr>
-            <w:tcW w:type="dxa" w:w="4104"/>
+            <w:tcW w:type="dxa" w:w="2366"/>
             <w:vAlign w:val="center"/>
             <w:shd w:fill="FFFFFF"/>
             <w:tcBorders>
@@ -1250,26 +1917,23 @@
           </w:tcPr>
           <w:p>
             <w:pPr>
-              <w:spacing w:after="60" w:before="60" w:line="252" w:lineRule="auto"/>
-              <w:jc w:val="center"/>
+              <w:widowControl/>
+              <w:spacing w:after="40" w:line="240" w:lineRule="auto" w:before="40"/>
+              <w:jc w:val="left"/>
             </w:pPr>
             <w:r>
               <w:rPr>
-                <w:b w:val="0"/>
-                <w:sz w:val="20"/>
+                <w:rFonts w:ascii="Arial" w:hAnsi="Arial" w:eastAsia="Arial" w:cs="Arial"/>
+                <w:w w:val="100"/>
+                <w:sz w:val="21"/>
               </w:rPr>
-              <w:t>17.1%</w:t>
+              <w:t xml:space="preserve">17.1%</w:t>
             </w:r>
           </w:p>
         </w:tc>
-      </w:tr>
-      <w:tr>
-        <w:trPr>
-          <w:cantSplit/>
-        </w:trPr>
         <w:tc>
           <w:tcPr>
-            <w:tcW w:type="dxa" w:w="2232"/>
+            <w:tcW w:type="dxa" w:w="2500"/>
             <w:vAlign w:val="center"/>
             <w:shd w:fill="FFFFFF"/>
             <w:tcBorders>
@@ -1287,20 +1951,28 @@
           </w:tcPr>
           <w:p>
             <w:pPr>
-              <w:spacing w:after="60" w:before="60" w:line="252" w:lineRule="auto"/>
+              <w:widowControl/>
+              <w:spacing w:after="40" w:line="240" w:lineRule="auto" w:before="40"/>
+              <w:jc w:val="left"/>
             </w:pPr>
             <w:r>
               <w:rPr>
-                <w:b w:val="0"/>
-                <w:sz w:val="20"/>
+                <w:rFonts w:ascii="Arial" w:hAnsi="Arial" w:eastAsia="Arial" w:cs="Arial"/>
+                <w:w w:val="100"/>
+                <w:sz w:val="21"/>
               </w:rPr>
-              <w:t>25%</w:t>
+              <w:t xml:space="preserve">+22.0</w:t>
             </w:r>
           </w:p>
         </w:tc>
+      </w:tr>
+      <w:tr>
+        <w:trPr>
+          <w:cantSplit/>
+        </w:trPr>
         <w:tc>
           <w:tcPr>
-            <w:tcW w:type="dxa" w:w="3528"/>
+            <w:tcW w:type="dxa" w:w="2368"/>
             <w:vAlign w:val="center"/>
             <w:shd w:fill="FFFFFF"/>
             <w:tcBorders>
@@ -1318,21 +1990,23 @@
           </w:tcPr>
           <w:p>
             <w:pPr>
-              <w:spacing w:after="60" w:before="60" w:line="252" w:lineRule="auto"/>
-              <w:jc w:val="center"/>
+              <w:widowControl/>
+              <w:spacing w:after="40" w:line="240" w:lineRule="auto" w:before="40"/>
+              <w:jc w:val="left"/>
             </w:pPr>
             <w:r>
               <w:rPr>
-                <w:b w:val="0"/>
-                <w:sz w:val="20"/>
+                <w:rFonts w:ascii="Arial" w:hAnsi="Arial" w:eastAsia="Arial" w:cs="Arial"/>
+                <w:w w:val="100"/>
+                <w:sz w:val="21"/>
               </w:rPr>
-              <w:t>49.6%</w:t>
+              <w:t xml:space="preserve">25%</w:t>
             </w:r>
           </w:p>
         </w:tc>
         <w:tc>
           <w:tcPr>
-            <w:tcW w:type="dxa" w:w="4104"/>
+            <w:tcW w:type="dxa" w:w="2632"/>
             <w:vAlign w:val="center"/>
             <w:shd w:fill="FFFFFF"/>
             <w:tcBorders>
@@ -1350,26 +2024,23 @@
           </w:tcPr>
           <w:p>
             <w:pPr>
-              <w:spacing w:after="60" w:before="60" w:line="252" w:lineRule="auto"/>
-              <w:jc w:val="center"/>
+              <w:widowControl/>
+              <w:spacing w:after="40" w:line="240" w:lineRule="auto" w:before="40"/>
+              <w:jc w:val="left"/>
             </w:pPr>
             <w:r>
               <w:rPr>
-                <w:b w:val="0"/>
-                <w:sz w:val="20"/>
+                <w:rFonts w:ascii="Arial" w:hAnsi="Arial" w:eastAsia="Arial" w:cs="Arial"/>
+                <w:w w:val="100"/>
+                <w:sz w:val="21"/>
               </w:rPr>
-              <w:t>38.3%</w:t>
+              <w:t xml:space="preserve">49.6%</w:t>
             </w:r>
           </w:p>
         </w:tc>
-      </w:tr>
-      <w:tr>
-        <w:trPr>
-          <w:cantSplit/>
-        </w:trPr>
         <w:tc>
           <w:tcPr>
-            <w:tcW w:type="dxa" w:w="2232"/>
+            <w:tcW w:type="dxa" w:w="2366"/>
             <w:vAlign w:val="center"/>
             <w:shd w:fill="FFFFFF"/>
             <w:tcBorders>
@@ -1387,20 +2058,23 @@
           </w:tcPr>
           <w:p>
             <w:pPr>
-              <w:spacing w:after="60" w:before="60" w:line="252" w:lineRule="auto"/>
+              <w:widowControl/>
+              <w:spacing w:after="40" w:line="240" w:lineRule="auto" w:before="40"/>
+              <w:jc w:val="left"/>
             </w:pPr>
             <w:r>
               <w:rPr>
-                <w:b w:val="0"/>
-                <w:sz w:val="20"/>
+                <w:rFonts w:ascii="Arial" w:hAnsi="Arial" w:eastAsia="Arial" w:cs="Arial"/>
+                <w:w w:val="100"/>
+                <w:sz w:val="21"/>
               </w:rPr>
-              <w:t>50%</w:t>
+              <w:t xml:space="preserve">38.3%</w:t>
             </w:r>
           </w:p>
         </w:tc>
         <w:tc>
           <w:tcPr>
-            <w:tcW w:type="dxa" w:w="3528"/>
+            <w:tcW w:type="dxa" w:w="2500"/>
             <w:vAlign w:val="center"/>
             <w:shd w:fill="FFFFFF"/>
             <w:tcBorders>
@@ -1418,21 +2092,28 @@
           </w:tcPr>
           <w:p>
             <w:pPr>
-              <w:spacing w:after="60" w:before="60" w:line="252" w:lineRule="auto"/>
-              <w:jc w:val="center"/>
+              <w:widowControl/>
+              <w:spacing w:after="40" w:line="240" w:lineRule="auto" w:before="40"/>
+              <w:jc w:val="left"/>
             </w:pPr>
             <w:r>
               <w:rPr>
-                <w:b w:val="0"/>
-                <w:sz w:val="20"/>
+                <w:rFonts w:ascii="Arial" w:hAnsi="Arial" w:eastAsia="Arial" w:cs="Arial"/>
+                <w:w w:val="100"/>
+                <w:sz w:val="21"/>
               </w:rPr>
-              <w:t>43.1%</w:t>
+              <w:t xml:space="preserve">+17.2</w:t>
             </w:r>
           </w:p>
         </w:tc>
+      </w:tr>
+      <w:tr>
+        <w:trPr>
+          <w:cantSplit/>
+        </w:trPr>
         <w:tc>
           <w:tcPr>
-            <w:tcW w:type="dxa" w:w="4104"/>
+            <w:tcW w:type="dxa" w:w="2368"/>
             <w:vAlign w:val="center"/>
             <w:shd w:fill="FFFFFF"/>
             <w:tcBorders>
@@ -1450,15 +2131,119 @@
           </w:tcPr>
           <w:p>
             <w:pPr>
-              <w:spacing w:after="60" w:before="60" w:line="252" w:lineRule="auto"/>
-              <w:jc w:val="center"/>
+              <w:widowControl/>
+              <w:spacing w:after="40" w:line="240" w:lineRule="auto" w:before="40"/>
+              <w:jc w:val="left"/>
             </w:pPr>
             <w:r>
               <w:rPr>
-                <w:b w:val="0"/>
-                <w:sz w:val="20"/>
+                <w:rFonts w:ascii="Arial" w:hAnsi="Arial" w:eastAsia="Arial" w:cs="Arial"/>
+                <w:w w:val="100"/>
+                <w:sz w:val="21"/>
               </w:rPr>
-              <w:t>66.7%</w:t>
+              <w:t xml:space="preserve">50%</w:t>
+            </w:r>
+          </w:p>
+        </w:tc>
+        <w:tc>
+          <w:tcPr>
+            <w:tcW w:type="dxa" w:w="2632"/>
+            <w:vAlign w:val="center"/>
+            <w:shd w:fill="FFFFFF"/>
+            <w:tcBorders>
+              <w:top w:val="single" w:sz="4" w:color="D9D9D9"/>
+              <w:left w:val="single" w:sz="4" w:color="D9D9D9"/>
+              <w:bottom w:val="single" w:sz="4" w:color="D9D9D9"/>
+              <w:right w:val="single" w:sz="4" w:color="D9D9D9"/>
+            </w:tcBorders>
+            <w:tcMar>
+              <w:top w:w="85" w:type="dxa"/>
+              <w:left w:w="85" w:type="dxa"/>
+              <w:bottom w:w="85" w:type="dxa"/>
+              <w:right w:w="85" w:type="dxa"/>
+            </w:tcMar>
+          </w:tcPr>
+          <w:p>
+            <w:pPr>
+              <w:widowControl/>
+              <w:spacing w:after="40" w:line="240" w:lineRule="auto" w:before="40"/>
+              <w:jc w:val="left"/>
+            </w:pPr>
+            <w:r>
+              <w:rPr>
+                <w:rFonts w:ascii="Arial" w:hAnsi="Arial" w:eastAsia="Arial" w:cs="Arial"/>
+                <w:w w:val="100"/>
+                <w:sz w:val="21"/>
+              </w:rPr>
+              <w:t xml:space="preserve">43.1%</w:t>
+            </w:r>
+          </w:p>
+        </w:tc>
+        <w:tc>
+          <w:tcPr>
+            <w:tcW w:type="dxa" w:w="2366"/>
+            <w:vAlign w:val="center"/>
+            <w:shd w:fill="FFFFFF"/>
+            <w:tcBorders>
+              <w:top w:val="single" w:sz="4" w:color="D9D9D9"/>
+              <w:left w:val="single" w:sz="4" w:color="D9D9D9"/>
+              <w:bottom w:val="single" w:sz="4" w:color="D9D9D9"/>
+              <w:right w:val="single" w:sz="4" w:color="D9D9D9"/>
+            </w:tcBorders>
+            <w:tcMar>
+              <w:top w:w="85" w:type="dxa"/>
+              <w:left w:w="85" w:type="dxa"/>
+              <w:bottom w:w="85" w:type="dxa"/>
+              <w:right w:w="85" w:type="dxa"/>
+            </w:tcMar>
+          </w:tcPr>
+          <w:p>
+            <w:pPr>
+              <w:widowControl/>
+              <w:spacing w:after="40" w:line="240" w:lineRule="auto" w:before="40"/>
+              <w:jc w:val="left"/>
+            </w:pPr>
+            <w:r>
+              <w:rPr>
+                <w:rFonts w:ascii="Arial" w:hAnsi="Arial" w:eastAsia="Arial" w:cs="Arial"/>
+                <w:w w:val="100"/>
+                <w:sz w:val="21"/>
+              </w:rPr>
+              <w:t xml:space="preserve">66.7%</w:t>
+            </w:r>
+          </w:p>
+        </w:tc>
+        <w:tc>
+          <w:tcPr>
+            <w:tcW w:type="dxa" w:w="2500"/>
+            <w:vAlign w:val="center"/>
+            <w:shd w:fill="FFFFFF"/>
+            <w:tcBorders>
+              <w:top w:val="single" w:sz="4" w:color="D9D9D9"/>
+              <w:left w:val="single" w:sz="4" w:color="D9D9D9"/>
+              <w:bottom w:val="single" w:sz="4" w:color="D9D9D9"/>
+              <w:right w:val="single" w:sz="4" w:color="D9D9D9"/>
+            </w:tcBorders>
+            <w:tcMar>
+              <w:top w:w="85" w:type="dxa"/>
+              <w:left w:w="85" w:type="dxa"/>
+              <w:bottom w:w="85" w:type="dxa"/>
+              <w:right w:w="85" w:type="dxa"/>
+            </w:tcMar>
+          </w:tcPr>
+          <w:p>
+            <w:pPr>
+              <w:widowControl/>
+              <w:spacing w:after="40" w:line="240" w:lineRule="auto" w:before="40"/>
+              <w:jc w:val="left"/>
+            </w:pPr>
+            <w:r>
+              <w:rPr>
+                <w:rFonts w:ascii="Arial" w:hAnsi="Arial" w:eastAsia="Arial" w:cs="Arial"/>
+                <w:w w:val="100"/>
+                <w:sz w:val="21"/>
+              </w:rPr>
+              <w:t xml:space="preserve">+10.7</w:t>
             </w:r>
           </w:p>
         </w:tc>
@@ -1466,39 +2251,69 @@
     </w:tbl>
     <w:p>
       <w:pPr>
-        <w:spacing w:after="20"/>
+        <w:spacing w:before="0" w:after="0" w:line="220" w:lineRule="exact"/>
       </w:pPr>
     </w:p>
     <w:p>
-      <w:pPr/>
+      <w:pPr>
+        <w:widowControl/>
+        <w:spacing w:after="120" w:line="259" w:lineRule="auto"/>
+        <w:jc w:val="left"/>
+      </w:pPr>
       <w:r>
-        <w:t xml:space="preserve">Values are averages over the 50 tests. Investigating 10% gives a list where more than half reach the target, while capturing 17.1% of all qualifying homes. At 50%, the list captures about two-thirds. Average gains over group rates are 22.0, 17.2 and 10.7 percentage points at the three capacities.</w:t>
+        <w:rPr>
+          <w:rFonts w:ascii="Arial" w:hAnsi="Arial" w:eastAsia="Arial" w:cs="Arial"/>
+          <w:w w:val="100"/>
+        </w:rPr>
+        <w:t xml:space="preserve">Investigating 10% gives a list where more than half (54.5%) reach the target, while capturing 17.1% of all qualifying homes. At 50%, the list captures two-thirds (66.7%) while beating group rates by 10.7 percentage points.</w:t>
       </w:r>
     </w:p>
     <w:p>
-      <w:pPr/>
+      <w:pPr>
+        <w:widowControl/>
+        <w:spacing w:after="120" w:line="259" w:lineRule="auto"/>
+        <w:jc w:val="left"/>
+      </w:pPr>
       <w:r>
-        <w:t xml:space="preserve">The 25% result is a reference for allocating investigation effort. Our proposed first round starts with ten available candidates, checked in priority order. The operator chooses how many detailed checks the budget supports and expands the pool when suitable homes are scarce.</w:t>
+        <w:rPr>
+          <w:rFonts w:ascii="Arial" w:hAnsi="Arial" w:eastAsia="Arial" w:cs="Arial"/>
+          <w:w w:val="100"/>
+        </w:rPr>
+        <w:t xml:space="preserve">The 25% result is a reference for allocating investigation effort. Our proposed first round starts with ten available candidates from the priority groups, checked in priority order and expanded when permissions or cost quotes eliminate candidates.</w:t>
       </w:r>
     </w:p>
     <w:p>
       <w:pPr>
         <w:pStyle w:val="Heading2"/>
+        <w:keepNext/>
+        <w:widowControl/>
       </w:pPr>
       <w:r>
-        <w:t xml:space="preserve">Earlier leading groups retain their advantage</w:t>
+        <w:rPr>
+          <w:rFonts w:ascii="Arial" w:hAnsi="Arial" w:eastAsia="Arial" w:cs="Arial"/>
+          <w:w w:val="100"/>
+        </w:rPr>
+        <w:t xml:space="preserve">5.4 Temporal stability: Earlier leading groups retain their advantage</w:t>
       </w:r>
     </w:p>
     <w:p>
-      <w:pPr/>
+      <w:pPr>
+        <w:widowControl/>
+        <w:spacing w:after="120" w:line="259" w:lineRule="auto"/>
+        <w:jc w:val="left"/>
+      </w:pPr>
       <w:r>
-        <w:t xml:space="preserve">The two-year comparison follows the same 2,657 homes across ten groups. In the later year, 27.1% of homes in the earlier leading three groups reach the fixed 34-review target, compared with 14.9% in the other seven groups. The advantage is 12.3 percentage points.</w:t>
+        <w:rPr>
+          <w:rFonts w:ascii="Arial" w:hAnsi="Arial" w:eastAsia="Arial" w:cs="Arial"/>
+          <w:w w:val="100"/>
+        </w:rPr>
+        <w:t xml:space="preserve">The two-year comparison tracks the 2,657 homes across ten groups that have two full years of review history. In the earlier year, 33.6% of homes in the top three groups reached the 34-review target, compared with 19.9% in the other seven groups (Figure 3).</w:t>
       </w:r>
     </w:p>
     <w:p>
       <w:pPr>
         <w:keepNext/>
-        <w:spacing w:after="80"/>
+        <w:spacing w:after="40" w:before="80"/>
         <w:jc w:val="center"/>
       </w:pPr>
       <w:r>
@@ -1539,58 +2354,173 @@
     <w:p>
       <w:pPr>
         <w:pStyle w:val="Caption"/>
+        <w:widowControl/>
       </w:pPr>
       <w:r>
         <w:rPr>
+          <w:rFonts w:ascii="Arial" w:hAnsi="Arial" w:eastAsia="Arial" w:cs="Arial"/>
+          <w:w w:val="100"/>
           <w:b/>
         </w:rPr>
-        <w:t>Figure 3.</w:t>
+        <w:t xml:space="preserve">Figure 3.</w:t>
       </w:r>
       <w:r>
-        <w:t xml:space="preserve"> The same homes are compared in both years. The earlier leading groups remain ahead, although their qualifying share falls from 33.6% to 27.1%.</w:t>
+        <w:rPr>
+          <w:rFonts w:ascii="Arial" w:hAnsi="Arial" w:eastAsia="Arial" w:cs="Arial"/>
+          <w:w w:val="100"/>
+        </w:rPr>
+        <w:t xml:space="preserve"> The same 2,657 homes compared in both years. The earlier leading groups remain ahead, although their qualifying share falls from 33.6% to 27.1%.</w:t>
       </w:r>
     </w:p>
     <w:p>
-      <w:pPr/>
+      <w:pPr>
+        <w:widowControl/>
+        <w:spacing w:after="120" w:line="259" w:lineRule="auto"/>
+        <w:jc w:val="left"/>
+      </w:pPr>
       <w:r>
-        <w:t xml:space="preserve">The leading groups retain their relative advantage as overall activity falls. This supports keeping them as search priorities and assessing current demand for each candidate property.</w:t>
+        <w:rPr>
+          <w:rFonts w:ascii="Arial" w:hAnsi="Arial" w:eastAsia="Arial" w:cs="Arial"/>
+          <w:w w:val="100"/>
+        </w:rPr>
+        <w:t xml:space="preserve">In the later year, 27.1% of homes in the earlier leading three groups reach the fixed 34-review target, compared with 14.9% in the other seven groups—an advantage of </w:t>
+      </w:r>
+      <w:r>
+        <w:rPr>
+          <w:rFonts w:ascii="Arial" w:hAnsi="Arial" w:eastAsia="Arial" w:cs="Arial"/>
+          <w:w w:val="100"/>
+          <w:b/>
+        </w:rPr>
+        <w:t xml:space="preserve">12.3 percentage points</w:t>
+      </w:r>
+      <w:r>
+        <w:rPr>
+          <w:rFonts w:ascii="Arial" w:hAnsi="Arial" w:eastAsia="Arial" w:cs="Arial"/>
+          <w:w w:val="100"/>
+        </w:rPr>
+        <w:t xml:space="preserve"> (from unrounded rates). Retaining this relative advantage as overall activity falls supports keeping them as search priorities while assessing current demand for each candidate property.</w:t>
       </w:r>
     </w:p>
     <w:p>
       <w:pPr>
         <w:pStyle w:val="Heading1"/>
+        <w:keepNext/>
+        <w:widowControl/>
       </w:pPr>
       <w:r>
-        <w:t>6 Key Findings and Recommendations</w:t>
-      </w:r>
-    </w:p>
-    <w:p>
-      <w:pPr/>
-      <w:r>
-        <w:t xml:space="preserve">Search City of Melbourne two- and three-bedroom apartments first. Use Yarra Ranges three-bedroom houses and townhouses as an alternative when city lease terms or availability are unsuitable.</w:t>
-      </w:r>
-    </w:p>
-    <w:p>
-      <w:pPr/>
-      <w:r>
-        <w:t xml:space="preserve">For established homes, collect comparable nightly prices, minimum-stay rules and amenity information, then use the complete model to order investigations. For new rentals, use group priorities and compare permissions, rent and operating costs. Scores based on proposed settings are scenario estimates; their use for selecting new openings needs a prospective test.</w:t>
-      </w:r>
-    </w:p>
-    <w:p>
-      <w:pPr/>
-      <w:r>
-        <w:t xml:space="preserve">Before signing, obtain written confirmation of permitted short-stay use and quotes for rent, setup and operating costs. Estimate cash flow using achievable nightly rates and paid nights under expected and weaker-demand conditions. Choose a property that meets the client's agreed return and cash-buffer requirements under both conditions.</w:t>
+        <w:rPr>
+          <w:rFonts w:ascii="Arial" w:hAnsi="Arial" w:eastAsia="Arial" w:cs="Arial"/>
+          <w:w w:val="100"/>
+        </w:rPr>
+        <w:t xml:space="preserve">6. Key Findings and Recommendations</w:t>
       </w:r>
     </w:p>
     <w:p>
       <w:pPr>
+        <w:widowControl/>
+        <w:spacing w:after="120" w:line="259" w:lineRule="auto"/>
+        <w:jc w:val="left"/>
+      </w:pPr>
+      <w:r>
+        <w:rPr>
+          <w:rFonts w:ascii="Arial" w:hAnsi="Arial" w:eastAsia="Arial" w:cs="Arial"/>
+          <w:w w:val="100"/>
+        </w:rPr>
+        <w:t xml:space="preserve">1. </w:t>
+      </w:r>
+      <w:r>
+        <w:rPr>
+          <w:rFonts w:ascii="Arial" w:hAnsi="Arial" w:eastAsia="Arial" w:cs="Arial"/>
+          <w:w w:val="100"/>
+          <w:b/>
+        </w:rPr>
+        <w:t xml:space="preserve">Where to search first:</w:t>
+      </w:r>
+      <w:r>
+        <w:rPr>
+          <w:rFonts w:ascii="Arial" w:hAnsi="Arial" w:eastAsia="Arial" w:cs="Arial"/>
+          <w:w w:val="100"/>
+        </w:rPr>
+        <w:t xml:space="preserve"> Search City of Melbourne two- and three-bedroom apartments first (32.8% and 36.6% target rates). Use Yarra Ranges three-bedroom houses and townhouses (30.0%) as an alternative when city lease terms or availability are unsuitable.</w:t>
+      </w:r>
+    </w:p>
+    <w:p>
+      <w:pPr>
+        <w:widowControl/>
+        <w:spacing w:after="120" w:line="259" w:lineRule="auto"/>
+        <w:jc w:val="left"/>
+      </w:pPr>
+      <w:r>
+        <w:rPr>
+          <w:rFonts w:ascii="Arial" w:hAnsi="Arial" w:eastAsia="Arial" w:cs="Arial"/>
+          <w:w w:val="100"/>
+        </w:rPr>
+        <w:t xml:space="preserve">2. </w:t>
+      </w:r>
+      <w:r>
+        <w:rPr>
+          <w:rFonts w:ascii="Arial" w:hAnsi="Arial" w:eastAsia="Arial" w:cs="Arial"/>
+          <w:w w:val="100"/>
+          <w:b/>
+        </w:rPr>
+        <w:t xml:space="preserve">How to rank candidates:</w:t>
+      </w:r>
+      <w:r>
+        <w:rPr>
+          <w:rFonts w:ascii="Arial" w:hAnsi="Arial" w:eastAsia="Arial" w:cs="Arial"/>
+          <w:w w:val="100"/>
+        </w:rPr>
+        <w:t xml:space="preserve"> For established homes, collect comparable nightly prices, minimum-stay rules and amenity information, then use the complete model to order investigations. For unleased new rentals, use group priorities and compare permissions, rent and operating costs directly; scores based on proposed settings are scenario estimates that need a prospective test.</w:t>
+      </w:r>
+    </w:p>
+    <w:p>
+      <w:pPr>
+        <w:widowControl/>
+        <w:spacing w:after="120" w:line="259" w:lineRule="auto"/>
+        <w:jc w:val="left"/>
+      </w:pPr>
+      <w:r>
+        <w:rPr>
+          <w:rFonts w:ascii="Arial" w:hAnsi="Arial" w:eastAsia="Arial" w:cs="Arial"/>
+          <w:w w:val="100"/>
+        </w:rPr>
+        <w:t xml:space="preserve">3. </w:t>
+      </w:r>
+      <w:r>
+        <w:rPr>
+          <w:rFonts w:ascii="Arial" w:hAnsi="Arial" w:eastAsia="Arial" w:cs="Arial"/>
+          <w:w w:val="100"/>
+          <w:b/>
+        </w:rPr>
+        <w:t xml:space="preserve">What to verify before signing:</w:t>
+      </w:r>
+      <w:r>
+        <w:rPr>
+          <w:rFonts w:ascii="Arial" w:hAnsi="Arial" w:eastAsia="Arial" w:cs="Arial"/>
+          <w:w w:val="100"/>
+        </w:rPr>
+        <w:t xml:space="preserve"> Obtain written confirmation of permitted short-stay use and quotes for rent, setup and operating costs. Estimate cash flow under expected and weaker-demand conditions, and choose a property that meets return and cash-buffer requirements under both conditions.</w:t>
+      </w:r>
+    </w:p>
+    <w:p>
+      <w:pPr>
+        <w:spacing w:before="0" w:after="0" w:line="220" w:lineRule="exact"/>
+      </w:pPr>
+    </w:p>
+    <w:p>
+      <w:pPr>
+        <w:widowControl/>
+        <w:spacing w:after="120" w:line="259" w:lineRule="auto" w:before="80"/>
+        <w:jc w:val="left"/>
         <w:keepNext/>
       </w:pPr>
       <w:r>
         <w:rPr>
+          <w:rFonts w:ascii="Arial" w:hAnsi="Arial" w:eastAsia="Arial" w:cs="Arial"/>
+          <w:w w:val="100"/>
           <w:b/>
         </w:rPr>
-        <w:t>Table 3. Proposed first investigation round</w:t>
+        <w:t xml:space="preserve">Table 3. Proposed four-week first investigation round</w:t>
       </w:r>
     </w:p>
     <w:tbl>
@@ -1609,9 +2539,9 @@
         </w:tblBorders>
       </w:tblPr>
       <w:tblGrid>
-        <w:gridCol w:w="3289"/>
-        <w:gridCol w:w="3289"/>
-        <w:gridCol w:w="3289"/>
+        <w:gridCol w:w="2200"/>
+        <w:gridCol w:w="4000"/>
+        <w:gridCol w:w="3666"/>
       </w:tblGrid>
       <w:tr>
         <w:trPr>
@@ -1620,7 +2550,7 @@
         </w:trPr>
         <w:tc>
           <w:tcPr>
-            <w:tcW w:type="dxa" w:w="2232"/>
+            <w:tcW w:type="dxa" w:w="2200"/>
             <w:vAlign w:val="center"/>
             <w:shd w:fill="E9EEF3"/>
             <w:tcBorders>
@@ -1638,21 +2568,25 @@
           </w:tcPr>
           <w:p>
             <w:pPr>
-              <w:spacing w:after="40" w:before="40" w:line="252" w:lineRule="auto"/>
+              <w:widowControl/>
+              <w:spacing w:after="40" w:line="240" w:lineRule="auto" w:before="40"/>
+              <w:jc w:val="left"/>
               <w:keepNext/>
             </w:pPr>
             <w:r>
               <w:rPr>
+                <w:rFonts w:ascii="Arial" w:hAnsi="Arial" w:eastAsia="Arial" w:cs="Arial"/>
+                <w:w w:val="100"/>
+                <w:sz w:val="21"/>
                 <w:b/>
-                <w:sz w:val="20"/>
               </w:rPr>
-              <w:t>Timing and owner</w:t>
+              <w:t xml:space="preserve">Timing and owner</w:t>
             </w:r>
           </w:p>
         </w:tc>
         <w:tc>
           <w:tcPr>
-            <w:tcW w:type="dxa" w:w="3528"/>
+            <w:tcW w:type="dxa" w:w="4000"/>
             <w:vAlign w:val="center"/>
             <w:shd w:fill="E9EEF3"/>
             <w:tcBorders>
@@ -1670,21 +2604,25 @@
           </w:tcPr>
           <w:p>
             <w:pPr>
-              <w:spacing w:after="40" w:before="40" w:line="252" w:lineRule="auto"/>
+              <w:widowControl/>
+              <w:spacing w:after="40" w:line="240" w:lineRule="auto" w:before="40"/>
+              <w:jc w:val="left"/>
               <w:keepNext/>
             </w:pPr>
             <w:r>
               <w:rPr>
+                <w:rFonts w:ascii="Arial" w:hAnsi="Arial" w:eastAsia="Arial" w:cs="Arial"/>
+                <w:w w:val="100"/>
+                <w:sz w:val="21"/>
                 <w:b/>
-                <w:sz w:val="20"/>
               </w:rPr>
-              <w:t>Action</w:t>
+              <w:t xml:space="preserve">Action</w:t>
             </w:r>
           </w:p>
         </w:tc>
         <w:tc>
           <w:tcPr>
-            <w:tcW w:type="dxa" w:w="4104"/>
+            <w:tcW w:type="dxa" w:w="3666"/>
             <w:vAlign w:val="center"/>
             <w:shd w:fill="E9EEF3"/>
             <w:tcBorders>
@@ -1702,15 +2640,19 @@
           </w:tcPr>
           <w:p>
             <w:pPr>
-              <w:spacing w:after="40" w:before="40" w:line="252" w:lineRule="auto"/>
+              <w:widowControl/>
+              <w:spacing w:after="40" w:line="240" w:lineRule="auto" w:before="40"/>
+              <w:jc w:val="left"/>
               <w:keepNext/>
             </w:pPr>
             <w:r>
               <w:rPr>
+                <w:rFonts w:ascii="Arial" w:hAnsi="Arial" w:eastAsia="Arial" w:cs="Arial"/>
+                <w:w w:val="100"/>
+                <w:sz w:val="21"/>
                 <w:b/>
-                <w:sz w:val="20"/>
               </w:rPr>
-              <w:t>Decision condition</w:t>
+              <w:t xml:space="preserve">Decision condition</w:t>
             </w:r>
           </w:p>
         </w:tc>
@@ -1721,7 +2663,7 @@
         </w:trPr>
         <w:tc>
           <w:tcPr>
-            <w:tcW w:type="dxa" w:w="2232"/>
+            <w:tcW w:type="dxa" w:w="2200"/>
             <w:vAlign w:val="center"/>
             <w:shd w:fill="FFFFFF"/>
             <w:tcBorders>
@@ -1739,21 +2681,33 @@
           </w:tcPr>
           <w:p>
             <w:pPr>
-              <w:spacing w:after="40" w:before="40" w:line="252" w:lineRule="auto"/>
+              <w:widowControl/>
+              <w:spacing w:after="40" w:line="240" w:lineRule="auto" w:before="40"/>
+              <w:jc w:val="left"/>
               <w:keepNext/>
             </w:pPr>
             <w:r>
               <w:rPr>
-                <w:b w:val="0"/>
-                <w:sz w:val="20"/>
+                <w:rFonts w:ascii="Arial" w:hAnsi="Arial" w:eastAsia="Arial" w:cs="Arial"/>
+                <w:w w:val="100"/>
+                <w:sz w:val="21"/>
+                <w:b/>
               </w:rPr>
-              <w:t>Week 1 operator</w:t>
+              <w:t xml:space="preserve">Week 1</w:t>
+            </w:r>
+            <w:r>
+              <w:rPr>
+                <w:rFonts w:ascii="Arial" w:hAnsi="Arial" w:eastAsia="Arial" w:cs="Arial"/>
+                <w:w w:val="100"/>
+                <w:sz w:val="21"/>
+              </w:rPr>
+              <w:t xml:space="preserve"> (Operator)</w:t>
             </w:r>
           </w:p>
         </w:tc>
         <w:tc>
           <w:tcPr>
-            <w:tcW w:type="dxa" w:w="3528"/>
+            <w:tcW w:type="dxa" w:w="4000"/>
             <w:vAlign w:val="center"/>
             <w:shd w:fill="FFFFFF"/>
             <w:tcBorders>
@@ -1771,21 +2725,24 @@
           </w:tcPr>
           <w:p>
             <w:pPr>
-              <w:spacing w:after="40" w:before="40" w:line="252" w:lineRule="auto"/>
+              <w:widowControl/>
+              <w:spacing w:after="40" w:line="240" w:lineRule="auto" w:before="40"/>
+              <w:jc w:val="left"/>
               <w:keepNext/>
             </w:pPr>
             <w:r>
               <w:rPr>
-                <w:b w:val="0"/>
-                <w:sz w:val="20"/>
+                <w:rFonts w:ascii="Arial" w:hAnsi="Arial" w:eastAsia="Arial" w:cs="Arial"/>
+                <w:w w:val="100"/>
+                <w:sz w:val="21"/>
               </w:rPr>
-              <w:t xml:space="preserve">Find ten available candidates in the priority groups and order investigations using comparable operating details</w:t>
+              <w:t xml:space="preserve">Find ten available candidates in the priority groups and order established homes using the six-input model</w:t>
             </w:r>
           </w:p>
         </w:tc>
         <w:tc>
           <w:tcPr>
-            <w:tcW w:type="dxa" w:w="4104"/>
+            <w:tcW w:type="dxa" w:w="3666"/>
             <w:vAlign w:val="center"/>
             <w:shd w:fill="FFFFFF"/>
             <w:tcBorders>
@@ -1803,15 +2760,18 @@
           </w:tcPr>
           <w:p>
             <w:pPr>
-              <w:spacing w:after="40" w:before="40" w:line="252" w:lineRule="auto"/>
+              <w:widowControl/>
+              <w:spacing w:after="40" w:line="240" w:lineRule="auto" w:before="40"/>
+              <w:jc w:val="left"/>
               <w:keepNext/>
             </w:pPr>
             <w:r>
               <w:rPr>
-                <w:b w:val="0"/>
-                <w:sz w:val="20"/>
+                <w:rFonts w:ascii="Arial" w:hAnsi="Arial" w:eastAsia="Arial" w:cs="Arial"/>
+                <w:w w:val="100"/>
+                <w:sz w:val="21"/>
               </w:rPr>
-              <w:t xml:space="preserve">Use group priorities for new rentals</w:t>
+              <w:t xml:space="preserve">Use group priorities alone for new rentals</w:t>
             </w:r>
           </w:p>
         </w:tc>
@@ -1822,7 +2782,7 @@
         </w:trPr>
         <w:tc>
           <w:tcPr>
-            <w:tcW w:type="dxa" w:w="2232"/>
+            <w:tcW w:type="dxa" w:w="2200"/>
             <w:vAlign w:val="center"/>
             <w:shd w:fill="FFFFFF"/>
             <w:tcBorders>
@@ -1840,21 +2800,33 @@
           </w:tcPr>
           <w:p>
             <w:pPr>
-              <w:spacing w:after="40" w:before="40" w:line="252" w:lineRule="auto"/>
+              <w:widowControl/>
+              <w:spacing w:after="40" w:line="240" w:lineRule="auto" w:before="40"/>
+              <w:jc w:val="left"/>
               <w:keepNext/>
             </w:pPr>
             <w:r>
               <w:rPr>
-                <w:b w:val="0"/>
-                <w:sz w:val="20"/>
+                <w:rFonts w:ascii="Arial" w:hAnsi="Arial" w:eastAsia="Arial" w:cs="Arial"/>
+                <w:w w:val="100"/>
+                <w:sz w:val="21"/>
+                <w:b/>
               </w:rPr>
-              <w:t>Weeks 2 and 3 operator and analyst</w:t>
+              <w:t xml:space="preserve">Weeks 2–3</w:t>
+            </w:r>
+            <w:r>
+              <w:rPr>
+                <w:rFonts w:ascii="Arial" w:hAnsi="Arial" w:eastAsia="Arial" w:cs="Arial"/>
+                <w:w w:val="100"/>
+                <w:sz w:val="21"/>
+              </w:rPr>
+              <w:t xml:space="preserve"> (Operator &amp; Analyst)</w:t>
             </w:r>
           </w:p>
         </w:tc>
         <w:tc>
           <w:tcPr>
-            <w:tcW w:type="dxa" w:w="3528"/>
+            <w:tcW w:type="dxa" w:w="4000"/>
             <w:vAlign w:val="center"/>
             <w:shd w:fill="FFFFFF"/>
             <w:tcBorders>
@@ -1872,21 +2844,24 @@
           </w:tcPr>
           <w:p>
             <w:pPr>
-              <w:spacing w:after="40" w:before="40" w:line="252" w:lineRule="auto"/>
+              <w:widowControl/>
+              <w:spacing w:after="40" w:line="240" w:lineRule="auto" w:before="40"/>
+              <w:jc w:val="left"/>
               <w:keepNext/>
             </w:pPr>
             <w:r>
               <w:rPr>
-                <w:b w:val="0"/>
-                <w:sz w:val="20"/>
+                <w:rFonts w:ascii="Arial" w:hAnsi="Arial" w:eastAsia="Arial" w:cs="Arial"/>
+                <w:w w:val="100"/>
+                <w:sz w:val="21"/>
               </w:rPr>
-              <w:t xml:space="preserve">Confirm permissions, obtain cost quotes and assess current guest demand</w:t>
+              <w:t xml:space="preserve">Confirm short-stay permissions, obtain cost quotes and assess current guest demand</w:t>
             </w:r>
           </w:p>
         </w:tc>
         <w:tc>
           <w:tcPr>
-            <w:tcW w:type="dxa" w:w="4104"/>
+            <w:tcW w:type="dxa" w:w="3666"/>
             <w:vAlign w:val="center"/>
             <w:shd w:fill="FFFFFF"/>
             <w:tcBorders>
@@ -1904,15 +2879,18 @@
           </w:tcPr>
           <w:p>
             <w:pPr>
-              <w:spacing w:after="40" w:before="40" w:line="252" w:lineRule="auto"/>
+              <w:widowControl/>
+              <w:spacing w:after="40" w:line="240" w:lineRule="auto" w:before="40"/>
+              <w:jc w:val="left"/>
               <w:keepNext/>
             </w:pPr>
             <w:r>
               <w:rPr>
-                <w:b w:val="0"/>
-                <w:sz w:val="20"/>
+                <w:rFonts w:ascii="Arial" w:hAnsi="Arial" w:eastAsia="Arial" w:cs="Arial"/>
+                <w:w w:val="100"/>
+                <w:sz w:val="21"/>
               </w:rPr>
-              <w:t xml:space="preserve">Keep incomplete cases pending; reject homes that fail the client's requirements</w:t>
+              <w:t xml:space="preserve">Keep incomplete cases pending; replace homes that fail requirements</w:t>
             </w:r>
           </w:p>
         </w:tc>
@@ -1923,7 +2901,7 @@
         </w:trPr>
         <w:tc>
           <w:tcPr>
-            <w:tcW w:type="dxa" w:w="2232"/>
+            <w:tcW w:type="dxa" w:w="2200"/>
             <w:vAlign w:val="center"/>
             <w:shd w:fill="FFFFFF"/>
             <w:tcBorders>
@@ -1941,21 +2919,33 @@
           </w:tcPr>
           <w:p>
             <w:pPr>
-              <w:spacing w:after="40" w:before="40" w:line="252" w:lineRule="auto"/>
+              <w:widowControl/>
+              <w:spacing w:after="40" w:line="240" w:lineRule="auto" w:before="40"/>
+              <w:jc w:val="left"/>
               <w:keepNext/>
             </w:pPr>
             <w:r>
               <w:rPr>
-                <w:b w:val="0"/>
-                <w:sz w:val="20"/>
+                <w:rFonts w:ascii="Arial" w:hAnsi="Arial" w:eastAsia="Arial" w:cs="Arial"/>
+                <w:w w:val="100"/>
+                <w:sz w:val="21"/>
+                <w:b/>
               </w:rPr>
-              <w:t>Week 4 client</w:t>
+              <w:t xml:space="preserve">Week 4</w:t>
+            </w:r>
+            <w:r>
+              <w:rPr>
+                <w:rFonts w:ascii="Arial" w:hAnsi="Arial" w:eastAsia="Arial" w:cs="Arial"/>
+                <w:w w:val="100"/>
+                <w:sz w:val="21"/>
+              </w:rPr>
+              <w:t xml:space="preserve"> (Client)</w:t>
             </w:r>
           </w:p>
         </w:tc>
         <w:tc>
           <w:tcPr>
-            <w:tcW w:type="dxa" w:w="3528"/>
+            <w:tcW w:type="dxa" w:w="4000"/>
             <w:vAlign w:val="center"/>
             <w:shd w:fill="FFFFFF"/>
             <w:tcBorders>
@@ -1973,13 +2963,16 @@
           </w:tcPr>
           <w:p>
             <w:pPr>
-              <w:spacing w:after="40" w:before="40" w:line="252" w:lineRule="auto"/>
+              <w:widowControl/>
+              <w:spacing w:after="40" w:line="240" w:lineRule="auto" w:before="40"/>
+              <w:jc w:val="left"/>
               <w:keepNext/>
             </w:pPr>
             <w:r>
               <w:rPr>
-                <w:b w:val="0"/>
-                <w:sz w:val="20"/>
+                <w:rFonts w:ascii="Arial" w:hAnsi="Arial" w:eastAsia="Arial" w:cs="Arial"/>
+                <w:w w:val="100"/>
+                <w:sz w:val="21"/>
               </w:rPr>
               <w:t xml:space="preserve">Compare qualified homes using expected and weaker-demand cash flows</w:t>
             </w:r>
@@ -1987,7 +2980,7 @@
         </w:tc>
         <w:tc>
           <w:tcPr>
-            <w:tcW w:type="dxa" w:w="4104"/>
+            <w:tcW w:type="dxa" w:w="3666"/>
             <w:vAlign w:val="center"/>
             <w:shd w:fill="FFFFFF"/>
             <w:tcBorders>
@@ -2005,15 +2998,18 @@
           </w:tcPr>
           <w:p>
             <w:pPr>
-              <w:spacing w:after="40" w:before="40" w:line="252" w:lineRule="auto"/>
+              <w:widowControl/>
+              <w:spacing w:after="40" w:line="240" w:lineRule="auto" w:before="40"/>
+              <w:jc w:val="left"/>
               <w:keepNext/>
             </w:pPr>
             <w:r>
               <w:rPr>
-                <w:b w:val="0"/>
-                <w:sz w:val="20"/>
+                <w:rFonts w:ascii="Arial" w:hAnsi="Arial" w:eastAsia="Arial" w:cs="Arial"/>
+                <w:w w:val="100"/>
+                <w:sz w:val="21"/>
               </w:rPr>
-              <w:t xml:space="preserve">Select a home that meets return and cash-buffer requirements</w:t>
+              <w:t xml:space="preserve">Select a home that meets return and cash-buffer requirements in both scenarios</w:t>
             </w:r>
           </w:p>
         </w:tc>
@@ -2024,7 +3020,7 @@
         </w:trPr>
         <w:tc>
           <w:tcPr>
-            <w:tcW w:type="dxa" w:w="2232"/>
+            <w:tcW w:type="dxa" w:w="2200"/>
             <w:vAlign w:val="center"/>
             <w:shd w:fill="FFFFFF"/>
             <w:tcBorders>
@@ -2042,20 +3038,32 @@
           </w:tcPr>
           <w:p>
             <w:pPr>
-              <w:spacing w:after="40" w:before="40" w:line="252" w:lineRule="auto"/>
+              <w:widowControl/>
+              <w:spacing w:after="40" w:line="240" w:lineRule="auto" w:before="40"/>
+              <w:jc w:val="left"/>
             </w:pPr>
             <w:r>
               <w:rPr>
-                <w:b w:val="0"/>
-                <w:sz w:val="20"/>
+                <w:rFonts w:ascii="Arial" w:hAnsi="Arial" w:eastAsia="Arial" w:cs="Arial"/>
+                <w:w w:val="100"/>
+                <w:sz w:val="21"/>
+                <w:b/>
               </w:rPr>
-              <w:t>Operating trial operator</w:t>
+              <w:t xml:space="preserve">Operating trial</w:t>
+            </w:r>
+            <w:r>
+              <w:rPr>
+                <w:rFonts w:ascii="Arial" w:hAnsi="Arial" w:eastAsia="Arial" w:cs="Arial"/>
+                <w:w w:val="100"/>
+                <w:sz w:val="21"/>
+              </w:rPr>
+              <w:t xml:space="preserve"> (Operator)</w:t>
             </w:r>
           </w:p>
         </w:tc>
         <w:tc>
           <w:tcPr>
-            <w:tcW w:type="dxa" w:w="3528"/>
+            <w:tcW w:type="dxa" w:w="4000"/>
             <w:vAlign w:val="center"/>
             <w:shd w:fill="FFFFFF"/>
             <w:tcBorders>
@@ -2073,20 +3081,23 @@
           </w:tcPr>
           <w:p>
             <w:pPr>
-              <w:spacing w:after="40" w:before="40" w:line="252" w:lineRule="auto"/>
+              <w:widowControl/>
+              <w:spacing w:after="40" w:line="240" w:lineRule="auto" w:before="40"/>
+              <w:jc w:val="left"/>
             </w:pPr>
             <w:r>
               <w:rPr>
-                <w:b w:val="0"/>
-                <w:sz w:val="20"/>
+                <w:rFonts w:ascii="Arial" w:hAnsi="Arial" w:eastAsia="Arial" w:cs="Arial"/>
+                <w:w w:val="100"/>
+                <w:sz w:val="21"/>
               </w:rPr>
-              <w:t>Record paid nights, workload and net cash flow</w:t>
+              <w:t xml:space="preserve">Record paid nights, stay length, workload and net cash flow alongside reviews over 30 days</w:t>
             </w:r>
           </w:p>
         </w:tc>
         <w:tc>
           <w:tcPr>
-            <w:tcW w:type="dxa" w:w="4104"/>
+            <w:tcW w:type="dxa" w:w="3666"/>
             <w:vAlign w:val="center"/>
             <w:shd w:fill="FFFFFF"/>
             <w:tcBorders>
@@ -2104,14 +3115,17 @@
           </w:tcPr>
           <w:p>
             <w:pPr>
-              <w:spacing w:after="40" w:before="40" w:line="252" w:lineRule="auto"/>
+              <w:widowControl/>
+              <w:spacing w:after="40" w:line="240" w:lineRule="auto" w:before="40"/>
+              <w:jc w:val="left"/>
             </w:pPr>
             <w:r>
               <w:rPr>
-                <w:b w:val="0"/>
-                <w:sz w:val="20"/>
+                <w:rFonts w:ascii="Arial" w:hAnsi="Arial" w:eastAsia="Arial" w:cs="Arial"/>
+                <w:w w:val="100"/>
+                <w:sz w:val="21"/>
               </w:rPr>
-              <w:t xml:space="preserve">Review actual performance before expanding</w:t>
+              <w:t xml:space="preserve">Review actual performance before expanding; use group rates alone if model ranking adds little trial value</w:t>
             </w:r>
           </w:p>
         </w:tc>
@@ -2119,214 +3133,279 @@
     </w:tbl>
     <w:p>
       <w:pPr>
-        <w:spacing w:after="20"/>
+        <w:spacing w:before="0" w:after="0" w:line="220" w:lineRule="exact"/>
       </w:pPr>
     </w:p>
     <w:p>
-      <w:pPr/>
+      <w:pPr>
+        <w:pStyle w:val="Heading1"/>
+        <w:keepNext/>
+        <w:widowControl/>
+      </w:pPr>
       <w:r>
-        <w:t xml:space="preserve">Ten homes form the initial search pool. Investigate higher-priority candidates first and replace rejected homes. Ten candidates and 30 days set the first round's workload; extend the search when necessary. If the model adds little value in the trial, continue using group rates to direct the search.</w:t>
+        <w:rPr>
+          <w:rFonts w:ascii="Arial" w:hAnsi="Arial" w:eastAsia="Arial" w:cs="Arial"/>
+          <w:w w:val="100"/>
+        </w:rPr>
+        <w:t xml:space="preserve">7. Limitations and Future Work</w:t>
+      </w:r>
+    </w:p>
+    <w:p>
+      <w:pPr>
+        <w:widowControl/>
+        <w:spacing w:after="120" w:line="259" w:lineRule="auto"/>
+        <w:jc w:val="left"/>
+      </w:pPr>
+      <w:r>
+        <w:rPr>
+          <w:rFonts w:ascii="Arial" w:hAnsi="Arial" w:eastAsia="Arial" w:cs="Arial"/>
+          <w:w w:val="100"/>
+        </w:rPr>
+        <w:t xml:space="preserve">Reviews measure recorded guest activity, whereas paid nights, stay length and costs determine profit. The operating trial should collect these measures alongside reviews to connect our search priorities to financial performance.</w:t>
+      </w:r>
+    </w:p>
+    <w:p>
+      <w:pPr>
+        <w:widowControl/>
+        <w:spacing w:after="120" w:line="259" w:lineRule="auto"/>
+        <w:jc w:val="left"/>
+      </w:pPr>
+      <w:r>
+        <w:rPr>
+          <w:rFonts w:ascii="Arial" w:hAnsi="Arial" w:eastAsia="Arial" w:cs="Arial"/>
+          <w:w w:val="100"/>
+        </w:rPr>
+        <w:t xml:space="preserve">The sample covers established, priced homes in six council areas. The first-review rule establishes the length of the review record rather than continuous operation, and excluding unpriced listings removes a largely quiet segment (82.0% zero recent reviews). Removing price as a model input still uses this price-filtered sample. Future coverage tests should include new entrants, outer areas and unpriced listings.</w:t>
+      </w:r>
+    </w:p>
+    <w:p>
+      <w:pPr>
+        <w:widowControl/>
+        <w:spacing w:after="120" w:line="259" w:lineRule="auto"/>
+        <w:jc w:val="left"/>
+      </w:pPr>
+      <w:r>
+        <w:rPr>
+          <w:rFonts w:ascii="Arial" w:hAnsi="Arial" w:eastAsia="Arial" w:cs="Arial"/>
+          <w:w w:val="100"/>
+        </w:rPr>
+        <w:t xml:space="preserve">Price and minimum-stay settings were recorded at collection and may reflect how hosts adjusted to earlier performance. Because these historical associations do not prove causal impacts, test planned changes prospectively during operations.</w:t>
+      </w:r>
+    </w:p>
+    <w:p>
+      <w:pPr>
+        <w:widowControl/>
+        <w:spacing w:after="120" w:line="259" w:lineRule="auto"/>
+        <w:jc w:val="left"/>
+      </w:pPr>
+      <w:r>
+        <w:rPr>
+          <w:rFonts w:ascii="Arial" w:hAnsi="Arial" w:eastAsia="Arial" w:cs="Arial"/>
+          <w:w w:val="100"/>
+        </w:rPr>
+        <w:t xml:space="preserve">For the next validation, fix the search groups, model weights and selection rule before collecting new outcomes. This creates a fresh test beyond the overlapping historical comparisons and earlier exploration. Check whether model scores match observed rates before using them as individual probabilities.</w:t>
       </w:r>
     </w:p>
     <w:p>
       <w:pPr>
         <w:pStyle w:val="Heading1"/>
+        <w:keepNext/>
+        <w:widowControl/>
       </w:pPr>
       <w:r>
-        <w:t>7 Limitations and Future Work</w:t>
+        <w:rPr>
+          <w:rFonts w:ascii="Arial" w:hAnsi="Arial" w:eastAsia="Arial" w:cs="Arial"/>
+          <w:w w:val="100"/>
+        </w:rPr>
+        <w:t xml:space="preserve">8. References</w:t>
       </w:r>
     </w:p>
     <w:p>
-      <w:pPr/>
+      <w:pPr>
+        <w:widowControl/>
+        <w:spacing w:after="120" w:line="480" w:lineRule="auto" w:before="0"/>
+        <w:jc w:val="left"/>
+        <w:ind w:left="720" w:hanging="720"/>
+      </w:pPr>
       <w:r>
-        <w:t xml:space="preserve">Reviews measure recorded guest activity. Paid nights, stay length and costs determine profit. The operating trial should collect these measures alongside reviews to connect our search priorities to financial performance.</w:t>
+        <w:rPr>
+          <w:rFonts w:ascii="Arial" w:hAnsi="Arial"/>
+          <w:w w:val="100"/>
+        </w:rPr>
+        <w:t xml:space="preserve">Inside Airbnb. (2026). </w:t>
+      </w:r>
+      <w:r>
+        <w:rPr>
+          <w:rFonts w:ascii="Arial" w:hAnsi="Arial"/>
+          <w:w w:val="100"/>
+          <w:i/>
+        </w:rPr>
+        <w:t xml:space="preserve">Melbourne listings and dated reviews</w:t>
+      </w:r>
+      <w:r>
+        <w:rPr>
+          <w:rFonts w:ascii="Arial" w:hAnsi="Arial"/>
+          <w:w w:val="100"/>
+        </w:rPr>
+        <w:t xml:space="preserve"> (CMCE30005 LMS snapshot) [Data set]. </w:t>
+      </w:r>
+      <w:hyperlink r:id="rId17">
+        <w:r>
+          <w:rPr>
+            <w:rFonts w:ascii="Arial" w:hAnsi="Arial"/>
+            <w:w w:val="100"/>
+            <w:color w:val="0563C1"/>
+            <w:u w:val="single"/>
+          </w:rPr>
+          <w:t xml:space="preserve">https://insideairbnb.com/get-the-data/</w:t>
+        </w:r>
+      </w:hyperlink>
+    </w:p>
+    <w:p>
+      <w:pPr>
+        <w:pStyle w:val="Heading2"/>
+        <w:keepNext/>
+        <w:widowControl/>
+      </w:pPr>
+      <w:r>
+        <w:rPr>
+          <w:rFonts w:ascii="Arial" w:hAnsi="Arial" w:eastAsia="Arial" w:cs="Arial"/>
+          <w:w w:val="100"/>
+        </w:rPr>
+        <w:t xml:space="preserve">AI acknowledgement</w:t>
       </w:r>
     </w:p>
     <w:p>
-      <w:pPr/>
+      <w:pPr>
+        <w:widowControl/>
+        <w:spacing w:after="120" w:line="259" w:lineRule="auto"/>
+        <w:jc w:val="left"/>
+      </w:pPr>
       <w:r>
-        <w:t xml:space="preserve">The sample covers established, priced homes in selected council areas. The first-review rule establishes the length of the review record; continuous operation remains unknown. The next coverage test should include new entrants, other areas and homes excluded by price screening. Removing price as a model input still uses the original price-filtered sample.</w:t>
+        <w:rPr>
+          <w:rFonts w:ascii="Arial" w:hAnsi="Arial"/>
+          <w:w w:val="100"/>
+        </w:rPr>
+        <w:t>ChatGPT, Gemini and Claude Code assisted with writing and coding; Eric Huang and Maksym Xu reviewed the outputs.</w:t>
       </w:r>
     </w:p>
     <w:p>
-      <w:pPr/>
+      <w:pPr>
+        <w:pStyle w:val="Heading2"/>
+        <w:keepNext/>
+        <w:widowControl/>
+      </w:pPr>
       <w:r>
-        <w:t xml:space="preserve">Price and minimum-stay settings were recorded at collection and may reflect earlier performance. Across the 50 fits, lower relative prices, one-night acceptance and more amenities raise model scores when other inputs stay fixed. Test planned changes prospectively to establish their effect on guest activity.</w:t>
+        <w:rPr>
+          <w:rFonts w:ascii="Arial" w:hAnsi="Arial" w:eastAsia="Arial" w:cs="Arial"/>
+          <w:w w:val="100"/>
+        </w:rPr>
+        <w:t xml:space="preserve">Author contributions</w:t>
       </w:r>
     </w:p>
     <w:p>
-      <w:pPr/>
+      <w:pPr>
+        <w:widowControl/>
+        <w:spacing w:after="120" w:line="259" w:lineRule="auto"/>
+        <w:jc w:val="left"/>
+      </w:pPr>
       <w:r>
-        <w:t xml:space="preserve">For the next validation, fix the search groups, model and selection rule before collecting new outcomes. This creates a fresh test beyond the overlapping historical comparisons and earlier exploration. Check whether model scores match observed rates before using them as individual probabilities. Appendix A provides the full comparison evidence.</w:t>
+        <w:rPr>
+          <w:rFonts w:ascii="Arial" w:hAnsi="Arial" w:eastAsia="Arial" w:cs="Arial"/>
+          <w:w w:val="100"/>
+        </w:rPr>
+        <w:t xml:space="preserve">Eric Huang and Maksym Xu jointly completed the analysis, validation and report preparation.</w:t>
       </w:r>
     </w:p>
     <w:p>
       <w:pPr>
         <w:pStyle w:val="Heading1"/>
+        <w:keepNext/>
+        <w:widowControl/>
       </w:pPr>
       <w:r>
-        <w:t>8 References</w:t>
+        <w:rPr>
+          <w:rFonts w:ascii="Arial" w:hAnsi="Arial" w:eastAsia="Arial" w:cs="Arial"/>
+          <w:w w:val="100"/>
+        </w:rPr>
+        <w:t xml:space="preserve">Appendix A. Model Specification and Comparison Evidence</w:t>
       </w:r>
     </w:p>
     <w:p>
       <w:pPr>
-        <w:spacing w:after="40"/>
+        <w:widowControl/>
+        <w:spacing w:after="120" w:line="259" w:lineRule="auto"/>
+        <w:jc w:val="left"/>
       </w:pPr>
       <w:r>
-        <w:t xml:space="preserve">Inside Airbnb. (2026). </w:t>
+        <w:rPr>
+          <w:rFonts w:ascii="Arial" w:hAnsi="Arial" w:eastAsia="Arial" w:cs="Arial"/>
+          <w:w w:val="100"/>
+        </w:rPr>
+        <w:t xml:space="preserve">The complete model uses unpenalised logistic regression. Area, dwelling type, bedrooms and one-night acceptance are categorical factors, with Melbourne, apartment/unit, one bedroom and no one-night acceptance as reference levels. Relative price is </w:t>
       </w:r>
       <w:r>
         <w:rPr>
-          <w:i/>
+          <w:rFonts w:ascii="Arial" w:hAnsi="Arial" w:eastAsia="Arial" w:cs="Arial"/>
+          <w:w w:val="100"/>
         </w:rPr>
-        <w:t>Melbourne listings and dated reviews</w:t>
+        <w:t xml:space="preserve">(price / training_group_median - 1) * 10</w:t>
       </w:r>
       <w:r>
-        <w:t xml:space="preserve"> [Dataset supplied through CMCE30005 LMS, collected 17 June-1 July 2026].</w:t>
+        <w:rPr>
+          <w:rFonts w:ascii="Arial" w:hAnsi="Arial" w:eastAsia="Arial" w:cs="Arial"/>
+          <w:w w:val="100"/>
+        </w:rPr>
+        <w:t xml:space="preserve">, and amenities are divided by ten. Training modes fill three missing acceptance values, and the overall training median covers any unseen price group. The baseline score is </w:t>
+      </w:r>
+      <w:r>
+        <w:rPr>
+          <w:rFonts w:ascii="Arial" w:hAnsi="Arial" w:eastAsia="Arial" w:cs="Arial"/>
+          <w:w w:val="100"/>
+        </w:rPr>
+        <w:t xml:space="preserve">(group_positives + 10 * overall_positive_share) / (group_count + 10)</w:t>
+      </w:r>
+      <w:r>
+        <w:rPr>
+          <w:rFonts w:ascii="Arial" w:hAnsi="Arial" w:eastAsia="Arial" w:cs="Arial"/>
+          <w:w w:val="100"/>
+        </w:rPr>
+        <w:t xml:space="preserve">. The reduced model retains area, dwelling type, bedrooms and amenities and is refitted on each training set, converging without warnings in all 50 splits.</w:t>
       </w:r>
     </w:p>
     <w:p>
       <w:pPr>
-        <w:spacing w:after="40"/>
+        <w:widowControl/>
+        <w:spacing w:after="120" w:line="259" w:lineRule="auto"/>
+        <w:jc w:val="left"/>
       </w:pPr>
       <w:r>
-        <w:t xml:space="preserve">R Core Team. (n.d.). </w:t>
-      </w:r>
-      <w:r>
         <w:rPr>
-          <w:i/>
+          <w:rFonts w:ascii="Arial" w:hAnsi="Arial"/>
+          <w:w w:val="100"/>
         </w:rPr>
-        <w:t>Fitting generalized linear models glm</w:t>
-      </w:r>
-      <w:r>
-        <w:t xml:space="preserve">. </w:t>
-      </w:r>
-      <w:hyperlink r:id="rId13">
-        <w:r>
-          <w:rPr>
-            <w:color w:val="2166A1"/>
-            <w:u w:val="single"/>
-          </w:rPr>
-          <w:t>R documentation</w:t>
-        </w:r>
-      </w:hyperlink>
-      <w:r>
-        <w:t>.</w:t>
+        <w:t>Across the 50 repeated training fits, mean log-odds weights are +1.183 for one-night acceptance (odds ratio 3.27), +0.237 per ten additional amenities (1.27), and -0.127 per price increase equal to 10% of the training-group median (0.88). All three directions persist in 50/50 fits. These odds ratios describe conditional historical associations, not probability changes or causal effects.</w:t>
       </w:r>
     </w:p>
     <w:p>
       <w:pPr>
-        <w:spacing w:after="40"/>
+        <w:spacing w:before="0" w:after="0" w:line="220" w:lineRule="exact"/>
       </w:pPr>
-      <w:r>
-        <w:t xml:space="preserve">TheNextChapter. (2026). </w:t>
-      </w:r>
-      <w:r>
-        <w:rPr>
-          <w:i/>
-        </w:rPr>
-        <w:t>Project analysis and screening follow-up</w:t>
-      </w:r>
-      <w:r>
-        <w:t xml:space="preserve">, revision e4c68ca. </w:t>
-      </w:r>
-      <w:hyperlink r:id="rId14">
-        <w:r>
-          <w:rPr>
-            <w:color w:val="2166A1"/>
-            <w:u w:val="single"/>
-          </w:rPr>
-          <w:t>Frozen analysis repository</w:t>
-        </w:r>
-      </w:hyperlink>
-      <w:r>
-        <w:t>.</w:t>
-      </w:r>
     </w:p>
     <w:p>
       <w:pPr>
-        <w:spacing w:after="40"/>
-      </w:pPr>
-      <w:r>
-        <w:t xml:space="preserve">OpenAI. (2026). </w:t>
-      </w:r>
-      <w:r>
-        <w:rPr>
-          <w:i/>
-        </w:rPr>
-        <w:t>ChatGPT assistance with project planning, interpretation, drafting and editing</w:t>
-      </w:r>
-      <w:r>
-        <w:t xml:space="preserve"> [Project-specific generative AI outputs].</w:t>
-      </w:r>
-    </w:p>
-    <w:p>
-      <w:pPr>
-        <w:spacing w:after="40"/>
-      </w:pPr>
-      <w:r>
-        <w:t xml:space="preserve">Anthropic. (2026). </w:t>
-      </w:r>
-      <w:r>
-        <w:rPr>
-          <w:i/>
-        </w:rPr>
-        <w:t>Claude Code assistance with analysis-code development</w:t>
-      </w:r>
-      <w:r>
-        <w:t xml:space="preserve"> [Project-specific generative AI outputs].</w:t>
-      </w:r>
-    </w:p>
-    <w:p>
-      <w:pPr>
-        <w:pStyle w:val="Heading2"/>
-        <w:spacing w:before="120"/>
-      </w:pPr>
-      <w:r>
-        <w:t>AI acknowledgement</w:t>
-      </w:r>
-    </w:p>
-    <w:p>
-      <w:pPr/>
-      <w:r>
-        <w:t>The group used ChatGPT for planning, interpreting results, drafting and editing, and Claude Code for analysis-code development. The group reviewed AI-assisted text and code. Numerical results come from analysis of the supplied dataset. The group remains responsible for the submission.</w:t>
-      </w:r>
-    </w:p>
-    <w:p>
-      <w:pPr>
-        <w:pStyle w:val="Heading1"/>
-      </w:pPr>
-      <w:r>
-        <w:t>Appendix A Model specification and comparison evidence</w:t>
-      </w:r>
-    </w:p>
-    <w:p>
-      <w:pPr/>
-      <w:r>
-        <w:t xml:space="preserve">The complete model uses unpenalised logistic regression. Area, dwelling type, bedrooms and one-night acceptance are categorical. Reference levels are Melbourne, apartment/unit, one bedroom and no one-night acceptance. Relative price is </w:t>
-      </w:r>
-      <w:r>
-        <w:t>(price / training group median - 1) * 10</w:t>
-      </w:r>
-      <w:r>
-        <w:t xml:space="preserve">; amenities are divided by ten. Training modes fill missing acceptance categories, and the overall training median covers an unseen price group. The baseline is </w:t>
-      </w:r>
-      <w:r>
-        <w:t>(group positives + 10 * overall positive share) / (group count + 10)</w:t>
-      </w:r>
-      <w:r>
-        <w:t>. The reduced model retains area, dwelling type, bedrooms and amenities and is refitted on each training set. All 50 reduced fits converge without warnings. Across the 50 repeated training fits, mean log-odds weights are +1.183 for one-night acceptance (odds ratio 3.27), +0.237 per ten additional amenities (1.27), and -0.127 per price increase equal to 10% of the training-group median (0.88). All three directions persist in 50/50 fits. These odds ratios describe conditional historical associations, not probability changes or causal effects.</w:t>
-      </w:r>
-    </w:p>
-    <w:p>
-      <w:pPr>
+        <w:widowControl/>
+        <w:spacing w:after="120" w:line="259" w:lineRule="auto" w:before="80"/>
+        <w:jc w:val="left"/>
         <w:keepNext/>
       </w:pPr>
       <w:r>
         <w:rPr>
+          <w:rFonts w:ascii="Arial" w:hAnsi="Arial" w:eastAsia="Arial" w:cs="Arial"/>
+          <w:w w:val="100"/>
           <w:b/>
         </w:rPr>
-        <w:t>Table A1. Separate evaluation designs at 25 percent capacity</w:t>
+        <w:t xml:space="preserve">Table A1. Separate evaluation designs at 25 percent capacity</w:t>
       </w:r>
     </w:p>
     <w:tbl>
@@ -2345,10 +3424,10 @@
         </w:tblBorders>
       </w:tblPr>
       <w:tblGrid>
-        <w:gridCol w:w="2466"/>
-        <w:gridCol w:w="2466"/>
-        <w:gridCol w:w="2466"/>
-        <w:gridCol w:w="2466"/>
+        <w:gridCol w:w="3900"/>
+        <w:gridCol w:w="1800"/>
+        <w:gridCol w:w="1800"/>
+        <w:gridCol w:w="2366"/>
       </w:tblGrid>
       <w:tr>
         <w:trPr>
@@ -2357,7 +3436,7 @@
         </w:trPr>
         <w:tc>
           <w:tcPr>
-            <w:tcW w:type="dxa" w:w="3384"/>
+            <w:tcW w:type="dxa" w:w="3900"/>
             <w:vAlign w:val="center"/>
             <w:shd w:fill="E9EEF3"/>
             <w:tcBorders>
@@ -2375,20 +3454,24 @@
           </w:tcPr>
           <w:p>
             <w:pPr>
-              <w:spacing w:after="60" w:before="60" w:line="252" w:lineRule="auto"/>
+              <w:widowControl/>
+              <w:spacing w:after="40" w:line="240" w:lineRule="auto" w:before="40"/>
+              <w:jc w:val="left"/>
             </w:pPr>
             <w:r>
               <w:rPr>
+                <w:rFonts w:ascii="Arial" w:hAnsi="Arial" w:eastAsia="Arial" w:cs="Arial"/>
+                <w:w w:val="100"/>
+                <w:sz w:val="21"/>
                 <w:b/>
-                <w:sz w:val="20"/>
               </w:rPr>
-              <w:t>Evaluation</w:t>
+              <w:t xml:space="preserve">Evaluation design</w:t>
             </w:r>
           </w:p>
         </w:tc>
         <w:tc>
           <w:tcPr>
-            <w:tcW w:type="dxa" w:w="1584"/>
+            <w:tcW w:type="dxa" w:w="1800"/>
             <w:vAlign w:val="center"/>
             <w:shd w:fill="E9EEF3"/>
             <w:tcBorders>
@@ -2406,21 +3489,24 @@
           </w:tcPr>
           <w:p>
             <w:pPr>
-              <w:spacing w:after="60" w:before="60" w:line="252" w:lineRule="auto"/>
-              <w:jc w:val="center"/>
+              <w:widowControl/>
+              <w:spacing w:after="40" w:line="240" w:lineRule="auto" w:before="40"/>
+              <w:jc w:val="left"/>
             </w:pPr>
             <w:r>
               <w:rPr>
+                <w:rFonts w:ascii="Arial" w:hAnsi="Arial" w:eastAsia="Arial" w:cs="Arial"/>
+                <w:w w:val="100"/>
+                <w:sz w:val="21"/>
                 <w:b/>
-                <w:sz w:val="20"/>
               </w:rPr>
-              <w:t>Complete model</w:t>
+              <w:t xml:space="preserve">Complete model</w:t>
             </w:r>
           </w:p>
         </w:tc>
         <w:tc>
           <w:tcPr>
-            <w:tcW w:type="dxa" w:w="1656"/>
+            <w:tcW w:type="dxa" w:w="1800"/>
             <w:vAlign w:val="center"/>
             <w:shd w:fill="E9EEF3"/>
             <w:tcBorders>
@@ -2438,21 +3524,24 @@
           </w:tcPr>
           <w:p>
             <w:pPr>
-              <w:spacing w:after="60" w:before="60" w:line="252" w:lineRule="auto"/>
-              <w:jc w:val="center"/>
+              <w:widowControl/>
+              <w:spacing w:after="40" w:line="240" w:lineRule="auto" w:before="40"/>
+              <w:jc w:val="left"/>
             </w:pPr>
             <w:r>
               <w:rPr>
+                <w:rFonts w:ascii="Arial" w:hAnsi="Arial" w:eastAsia="Arial" w:cs="Arial"/>
+                <w:w w:val="100"/>
+                <w:sz w:val="21"/>
                 <w:b/>
-                <w:sz w:val="20"/>
               </w:rPr>
-              <w:t>Baseline</w:t>
+              <w:t xml:space="preserve">Baseline</w:t>
             </w:r>
           </w:p>
         </w:tc>
         <w:tc>
           <w:tcPr>
-            <w:tcW w:type="dxa" w:w="3240"/>
+            <w:tcW w:type="dxa" w:w="2366"/>
             <w:vAlign w:val="center"/>
             <w:shd w:fill="E9EEF3"/>
             <w:tcBorders>
@@ -2470,15 +3559,18 @@
           </w:tcPr>
           <w:p>
             <w:pPr>
-              <w:spacing w:after="60" w:before="60" w:line="252" w:lineRule="auto"/>
-              <w:jc w:val="center"/>
+              <w:widowControl/>
+              <w:spacing w:after="40" w:line="240" w:lineRule="auto" w:before="40"/>
+              <w:jc w:val="left"/>
             </w:pPr>
             <w:r>
               <w:rPr>
+                <w:rFonts w:ascii="Arial" w:hAnsi="Arial" w:eastAsia="Arial" w:cs="Arial"/>
+                <w:w w:val="100"/>
+                <w:sz w:val="21"/>
                 <w:b/>
-                <w:sz w:val="20"/>
               </w:rPr>
-              <w:t>Gain in percentage points</w:t>
+              <w:t xml:space="preserve">Gain in percentage points</w:t>
             </w:r>
           </w:p>
         </w:tc>
@@ -2489,7 +3581,7 @@
         </w:trPr>
         <w:tc>
           <w:tcPr>
-            <w:tcW w:type="dxa" w:w="3384"/>
+            <w:tcW w:type="dxa" w:w="3900"/>
             <w:vAlign w:val="center"/>
             <w:shd w:fill="FFFFFF"/>
             <w:tcBorders>
@@ -2507,20 +3599,23 @@
           </w:tcPr>
           <w:p>
             <w:pPr>
-              <w:spacing w:after="60" w:before="60" w:line="252" w:lineRule="auto"/>
+              <w:widowControl/>
+              <w:spacing w:after="40" w:line="240" w:lineRule="auto" w:before="40"/>
+              <w:jc w:val="left"/>
             </w:pPr>
             <w:r>
               <w:rPr>
-                <w:b w:val="0"/>
-                <w:sz w:val="20"/>
+                <w:rFonts w:ascii="Arial" w:hAnsi="Arial" w:eastAsia="Arial" w:cs="Arial"/>
+                <w:w w:val="100"/>
+                <w:sz w:val="21"/>
               </w:rPr>
-              <w:t>Pooled five-fold all eligible homes</w:t>
+              <w:t xml:space="preserve">Pooled five-fold all eligible homes (3,873)</w:t>
             </w:r>
           </w:p>
         </w:tc>
         <w:tc>
           <w:tcPr>
-            <w:tcW w:type="dxa" w:w="1584"/>
+            <w:tcW w:type="dxa" w:w="1800"/>
             <w:vAlign w:val="center"/>
             <w:shd w:fill="FFFFFF"/>
             <w:tcBorders>
@@ -2538,21 +3633,23 @@
           </w:tcPr>
           <w:p>
             <w:pPr>
-              <w:spacing w:after="60" w:before="60" w:line="252" w:lineRule="auto"/>
-              <w:jc w:val="center"/>
+              <w:widowControl/>
+              <w:spacing w:after="40" w:line="240" w:lineRule="auto" w:before="40"/>
+              <w:jc w:val="left"/>
             </w:pPr>
             <w:r>
               <w:rPr>
-                <w:b w:val="0"/>
-                <w:sz w:val="20"/>
+                <w:rFonts w:ascii="Arial" w:hAnsi="Arial" w:eastAsia="Arial" w:cs="Arial"/>
+                <w:w w:val="100"/>
+                <w:sz w:val="21"/>
               </w:rPr>
-              <w:t>43.65%</w:t>
+              <w:t xml:space="preserve">43.65%</w:t>
             </w:r>
           </w:p>
         </w:tc>
         <w:tc>
           <w:tcPr>
-            <w:tcW w:type="dxa" w:w="1656"/>
+            <w:tcW w:type="dxa" w:w="1800"/>
             <w:vAlign w:val="center"/>
             <w:shd w:fill="FFFFFF"/>
             <w:tcBorders>
@@ -2570,21 +3667,23 @@
           </w:tcPr>
           <w:p>
             <w:pPr>
-              <w:spacing w:after="60" w:before="60" w:line="252" w:lineRule="auto"/>
-              <w:jc w:val="center"/>
+              <w:widowControl/>
+              <w:spacing w:after="40" w:line="240" w:lineRule="auto" w:before="40"/>
+              <w:jc w:val="left"/>
             </w:pPr>
             <w:r>
               <w:rPr>
-                <w:b w:val="0"/>
-                <w:sz w:val="20"/>
+                <w:rFonts w:ascii="Arial" w:hAnsi="Arial" w:eastAsia="Arial" w:cs="Arial"/>
+                <w:w w:val="100"/>
+                <w:sz w:val="21"/>
               </w:rPr>
-              <w:t>28.07%</w:t>
+              <w:t xml:space="preserve">28.07%</w:t>
             </w:r>
           </w:p>
         </w:tc>
         <w:tc>
           <w:tcPr>
-            <w:tcW w:type="dxa" w:w="3240"/>
+            <w:tcW w:type="dxa" w:w="2366"/>
             <w:vAlign w:val="center"/>
             <w:shd w:fill="FFFFFF"/>
             <w:tcBorders>
@@ -2602,15 +3701,17 @@
           </w:tcPr>
           <w:p>
             <w:pPr>
-              <w:spacing w:after="60" w:before="60" w:line="252" w:lineRule="auto"/>
-              <w:jc w:val="center"/>
+              <w:widowControl/>
+              <w:spacing w:after="40" w:line="240" w:lineRule="auto" w:before="40"/>
+              <w:jc w:val="left"/>
             </w:pPr>
             <w:r>
               <w:rPr>
-                <w:b w:val="0"/>
-                <w:sz w:val="20"/>
+                <w:rFonts w:ascii="Arial" w:hAnsi="Arial" w:eastAsia="Arial" w:cs="Arial"/>
+                <w:w w:val="100"/>
+                <w:sz w:val="21"/>
               </w:rPr>
-              <w:t>15.58</w:t>
+              <w:t xml:space="preserve">+15.58</w:t>
             </w:r>
           </w:p>
         </w:tc>
@@ -2621,7 +3722,7 @@
         </w:trPr>
         <w:tc>
           <w:tcPr>
-            <w:tcW w:type="dxa" w:w="3384"/>
+            <w:tcW w:type="dxa" w:w="3900"/>
             <w:vAlign w:val="center"/>
             <w:shd w:fill="FFFFFF"/>
             <w:tcBorders>
@@ -2639,20 +3740,23 @@
           </w:tcPr>
           <w:p>
             <w:pPr>
-              <w:spacing w:after="60" w:before="60" w:line="252" w:lineRule="auto"/>
+              <w:widowControl/>
+              <w:spacing w:after="40" w:line="240" w:lineRule="auto" w:before="40"/>
+              <w:jc w:val="left"/>
             </w:pPr>
             <w:r>
               <w:rPr>
-                <w:b w:val="0"/>
-                <w:sz w:val="20"/>
+                <w:rFonts w:ascii="Arial" w:hAnsi="Arial" w:eastAsia="Arial" w:cs="Arial"/>
+                <w:w w:val="100"/>
+                <w:sz w:val="21"/>
               </w:rPr>
-              <w:t>Mean of 50 allocations all eligible homes</w:t>
+              <w:t xml:space="preserve">Mean of 50 allocations all eligible homes (3,873)</w:t>
             </w:r>
           </w:p>
         </w:tc>
         <w:tc>
           <w:tcPr>
-            <w:tcW w:type="dxa" w:w="1584"/>
+            <w:tcW w:type="dxa" w:w="1800"/>
             <w:vAlign w:val="center"/>
             <w:shd w:fill="FFFFFF"/>
             <w:tcBorders>
@@ -2670,21 +3774,23 @@
           </w:tcPr>
           <w:p>
             <w:pPr>
-              <w:spacing w:after="60" w:before="60" w:line="252" w:lineRule="auto"/>
-              <w:jc w:val="center"/>
+              <w:widowControl/>
+              <w:spacing w:after="40" w:line="240" w:lineRule="auto" w:before="40"/>
+              <w:jc w:val="left"/>
             </w:pPr>
             <w:r>
               <w:rPr>
-                <w:b w:val="0"/>
-                <w:sz w:val="20"/>
+                <w:rFonts w:ascii="Arial" w:hAnsi="Arial" w:eastAsia="Arial" w:cs="Arial"/>
+                <w:w w:val="100"/>
+                <w:sz w:val="21"/>
               </w:rPr>
-              <w:t>43.42%</w:t>
+              <w:t xml:space="preserve">43.42%</w:t>
             </w:r>
           </w:p>
         </w:tc>
         <w:tc>
           <w:tcPr>
-            <w:tcW w:type="dxa" w:w="1656"/>
+            <w:tcW w:type="dxa" w:w="1800"/>
             <w:vAlign w:val="center"/>
             <w:shd w:fill="FFFFFF"/>
             <w:tcBorders>
@@ -2702,21 +3808,23 @@
           </w:tcPr>
           <w:p>
             <w:pPr>
-              <w:spacing w:after="60" w:before="60" w:line="252" w:lineRule="auto"/>
-              <w:jc w:val="center"/>
+              <w:widowControl/>
+              <w:spacing w:after="40" w:line="240" w:lineRule="auto" w:before="40"/>
+              <w:jc w:val="left"/>
             </w:pPr>
             <w:r>
               <w:rPr>
-                <w:b w:val="0"/>
-                <w:sz w:val="20"/>
+                <w:rFonts w:ascii="Arial" w:hAnsi="Arial" w:eastAsia="Arial" w:cs="Arial"/>
+                <w:w w:val="100"/>
+                <w:sz w:val="21"/>
               </w:rPr>
-              <w:t>31.96%</w:t>
+              <w:t xml:space="preserve">31.96%</w:t>
             </w:r>
           </w:p>
         </w:tc>
         <w:tc>
           <w:tcPr>
-            <w:tcW w:type="dxa" w:w="3240"/>
+            <w:tcW w:type="dxa" w:w="2366"/>
             <w:vAlign w:val="center"/>
             <w:shd w:fill="FFFFFF"/>
             <w:tcBorders>
@@ -2734,15 +3842,17 @@
           </w:tcPr>
           <w:p>
             <w:pPr>
-              <w:spacing w:after="60" w:before="60" w:line="252" w:lineRule="auto"/>
-              <w:jc w:val="center"/>
+              <w:widowControl/>
+              <w:spacing w:after="40" w:line="240" w:lineRule="auto" w:before="40"/>
+              <w:jc w:val="left"/>
             </w:pPr>
             <w:r>
               <w:rPr>
-                <w:b w:val="0"/>
-                <w:sz w:val="20"/>
+                <w:rFonts w:ascii="Arial" w:hAnsi="Arial" w:eastAsia="Arial" w:cs="Arial"/>
+                <w:w w:val="100"/>
+                <w:sz w:val="21"/>
               </w:rPr>
-              <w:t>11.46</w:t>
+              <w:t xml:space="preserve">+11.46</w:t>
             </w:r>
           </w:p>
         </w:tc>
@@ -2753,7 +3863,7 @@
         </w:trPr>
         <w:tc>
           <w:tcPr>
-            <w:tcW w:type="dxa" w:w="3384"/>
+            <w:tcW w:type="dxa" w:w="3900"/>
             <w:vAlign w:val="center"/>
             <w:shd w:fill="FFFFFF"/>
             <w:tcBorders>
@@ -2771,20 +3881,23 @@
           </w:tcPr>
           <w:p>
             <w:pPr>
-              <w:spacing w:after="60" w:before="60" w:line="252" w:lineRule="auto"/>
+              <w:widowControl/>
+              <w:spacing w:after="40" w:line="240" w:lineRule="auto" w:before="40"/>
+              <w:jc w:val="left"/>
             </w:pPr>
             <w:r>
               <w:rPr>
-                <w:b w:val="0"/>
-                <w:sz w:val="20"/>
+                <w:rFonts w:ascii="Arial" w:hAnsi="Arial" w:eastAsia="Arial" w:cs="Arial"/>
+                <w:w w:val="100"/>
+                <w:sz w:val="21"/>
               </w:rPr>
-              <w:t>Mean of 50 allocations three groups in one pool</w:t>
+              <w:t xml:space="preserve">Mean of 50 allocations three priority groups in one pool</w:t>
             </w:r>
           </w:p>
         </w:tc>
         <w:tc>
           <w:tcPr>
-            <w:tcW w:type="dxa" w:w="1584"/>
+            <w:tcW w:type="dxa" w:w="1800"/>
             <w:vAlign w:val="center"/>
             <w:shd w:fill="FFFFFF"/>
             <w:tcBorders>
@@ -2802,21 +3915,23 @@
           </w:tcPr>
           <w:p>
             <w:pPr>
-              <w:spacing w:after="60" w:before="60" w:line="252" w:lineRule="auto"/>
-              <w:jc w:val="center"/>
+              <w:widowControl/>
+              <w:spacing w:after="40" w:line="240" w:lineRule="auto" w:before="40"/>
+              <w:jc w:val="left"/>
             </w:pPr>
             <w:r>
               <w:rPr>
-                <w:b w:val="0"/>
-                <w:sz w:val="20"/>
+                <w:rFonts w:ascii="Arial" w:hAnsi="Arial" w:eastAsia="Arial" w:cs="Arial"/>
+                <w:w w:val="100"/>
+                <w:sz w:val="21"/>
               </w:rPr>
-              <w:t>48.91%</w:t>
+              <w:t xml:space="preserve">48.91%</w:t>
             </w:r>
           </w:p>
         </w:tc>
         <w:tc>
           <w:tcPr>
-            <w:tcW w:type="dxa" w:w="1656"/>
+            <w:tcW w:type="dxa" w:w="1800"/>
             <w:vAlign w:val="center"/>
             <w:shd w:fill="FFFFFF"/>
             <w:tcBorders>
@@ -2834,21 +3949,23 @@
           </w:tcPr>
           <w:p>
             <w:pPr>
-              <w:spacing w:after="60" w:before="60" w:line="252" w:lineRule="auto"/>
-              <w:jc w:val="center"/>
+              <w:widowControl/>
+              <w:spacing w:after="40" w:line="240" w:lineRule="auto" w:before="40"/>
+              <w:jc w:val="left"/>
             </w:pPr>
             <w:r>
               <w:rPr>
-                <w:b w:val="0"/>
-                <w:sz w:val="20"/>
+                <w:rFonts w:ascii="Arial" w:hAnsi="Arial" w:eastAsia="Arial" w:cs="Arial"/>
+                <w:w w:val="100"/>
+                <w:sz w:val="21"/>
               </w:rPr>
-              <w:t>32.37%</w:t>
+              <w:t xml:space="preserve">32.37%</w:t>
             </w:r>
           </w:p>
         </w:tc>
         <w:tc>
           <w:tcPr>
-            <w:tcW w:type="dxa" w:w="3240"/>
+            <w:tcW w:type="dxa" w:w="2366"/>
             <w:vAlign w:val="center"/>
             <w:shd w:fill="FFFFFF"/>
             <w:tcBorders>
@@ -2866,15 +3983,17 @@
           </w:tcPr>
           <w:p>
             <w:pPr>
-              <w:spacing w:after="60" w:before="60" w:line="252" w:lineRule="auto"/>
-              <w:jc w:val="center"/>
+              <w:widowControl/>
+              <w:spacing w:after="40" w:line="240" w:lineRule="auto" w:before="40"/>
+              <w:jc w:val="left"/>
             </w:pPr>
             <w:r>
               <w:rPr>
-                <w:b w:val="0"/>
-                <w:sz w:val="20"/>
+                <w:rFonts w:ascii="Arial" w:hAnsi="Arial" w:eastAsia="Arial" w:cs="Arial"/>
+                <w:w w:val="100"/>
+                <w:sz w:val="21"/>
               </w:rPr>
-              <w:t>16.54</w:t>
+              <w:t xml:space="preserve">+16.54</w:t>
             </w:r>
           </w:p>
         </w:tc>
@@ -2885,7 +4004,7 @@
         </w:trPr>
         <w:tc>
           <w:tcPr>
-            <w:tcW w:type="dxa" w:w="3384"/>
+            <w:tcW w:type="dxa" w:w="3900"/>
             <w:vAlign w:val="center"/>
             <w:shd w:fill="FFFFFF"/>
             <w:tcBorders>
@@ -2903,20 +4022,23 @@
           </w:tcPr>
           <w:p>
             <w:pPr>
-              <w:spacing w:after="60" w:before="60" w:line="252" w:lineRule="auto"/>
+              <w:widowControl/>
+              <w:spacing w:after="40" w:line="240" w:lineRule="auto" w:before="40"/>
+              <w:jc w:val="left"/>
             </w:pPr>
             <w:r>
               <w:rPr>
-                <w:b w:val="0"/>
-                <w:sz w:val="20"/>
+                <w:rFonts w:ascii="Arial" w:hAnsi="Arial" w:eastAsia="Arial" w:cs="Arial"/>
+                <w:w w:val="100"/>
+                <w:sz w:val="21"/>
               </w:rPr>
-              <w:t>Mean of 50 allocations separate group quotas</w:t>
+              <w:t xml:space="preserve">Mean of 50 allocations separate group quotas (main report)</w:t>
             </w:r>
           </w:p>
         </w:tc>
         <w:tc>
           <w:tcPr>
-            <w:tcW w:type="dxa" w:w="1584"/>
+            <w:tcW w:type="dxa" w:w="1800"/>
             <w:vAlign w:val="center"/>
             <w:shd w:fill="FFFFFF"/>
             <w:tcBorders>
@@ -2934,21 +4056,23 @@
           </w:tcPr>
           <w:p>
             <w:pPr>
-              <w:spacing w:after="60" w:before="60" w:line="252" w:lineRule="auto"/>
-              <w:jc w:val="center"/>
+              <w:widowControl/>
+              <w:spacing w:after="40" w:line="240" w:lineRule="auto" w:before="40"/>
+              <w:jc w:val="left"/>
             </w:pPr>
             <w:r>
               <w:rPr>
-                <w:b w:val="0"/>
-                <w:sz w:val="20"/>
+                <w:rFonts w:ascii="Arial" w:hAnsi="Arial" w:eastAsia="Arial" w:cs="Arial"/>
+                <w:w w:val="100"/>
+                <w:sz w:val="21"/>
               </w:rPr>
-              <w:t>49.62%</w:t>
+              <w:t xml:space="preserve">49.62%</w:t>
             </w:r>
           </w:p>
         </w:tc>
         <w:tc>
           <w:tcPr>
-            <w:tcW w:type="dxa" w:w="1656"/>
+            <w:tcW w:type="dxa" w:w="1800"/>
             <w:vAlign w:val="center"/>
             <w:shd w:fill="FFFFFF"/>
             <w:tcBorders>
@@ -2966,21 +4090,23 @@
           </w:tcPr>
           <w:p>
             <w:pPr>
-              <w:spacing w:after="60" w:before="60" w:line="252" w:lineRule="auto"/>
-              <w:jc w:val="center"/>
+              <w:widowControl/>
+              <w:spacing w:after="40" w:line="240" w:lineRule="auto" w:before="40"/>
+              <w:jc w:val="left"/>
             </w:pPr>
             <w:r>
               <w:rPr>
-                <w:b w:val="0"/>
-                <w:sz w:val="20"/>
+                <w:rFonts w:ascii="Arial" w:hAnsi="Arial" w:eastAsia="Arial" w:cs="Arial"/>
+                <w:w w:val="100"/>
+                <w:sz w:val="21"/>
               </w:rPr>
-              <w:t>32.43%</w:t>
+              <w:t xml:space="preserve">32.43%</w:t>
             </w:r>
           </w:p>
         </w:tc>
         <w:tc>
           <w:tcPr>
-            <w:tcW w:type="dxa" w:w="3240"/>
+            <w:tcW w:type="dxa" w:w="2366"/>
             <w:vAlign w:val="center"/>
             <w:shd w:fill="FFFFFF"/>
             <w:tcBorders>
@@ -2998,15 +4124,17 @@
           </w:tcPr>
           <w:p>
             <w:pPr>
-              <w:spacing w:after="60" w:before="60" w:line="252" w:lineRule="auto"/>
-              <w:jc w:val="center"/>
+              <w:widowControl/>
+              <w:spacing w:after="40" w:line="240" w:lineRule="auto" w:before="40"/>
+              <w:jc w:val="left"/>
             </w:pPr>
             <w:r>
               <w:rPr>
-                <w:b w:val="0"/>
-                <w:sz w:val="20"/>
+                <w:rFonts w:ascii="Arial" w:hAnsi="Arial" w:eastAsia="Arial" w:cs="Arial"/>
+                <w:w w:val="100"/>
+                <w:sz w:val="21"/>
               </w:rPr>
-              <w:t>17.19</w:t>
+              <w:t xml:space="preserve">+17.19</w:t>
             </w:r>
           </w:p>
         </w:tc>
@@ -3014,81 +4142,126 @@
     </w:tbl>
     <w:p>
       <w:pPr>
-        <w:spacing w:after="20"/>
+        <w:spacing w:before="0" w:after="0" w:line="220" w:lineRule="exact"/>
       </w:pPr>
     </w:p>
     <w:p>
-      <w:pPr/>
+      <w:pPr>
+        <w:widowControl/>
+        <w:spacing w:after="120" w:line="259" w:lineRule="auto"/>
+        <w:jc w:val="left"/>
+      </w:pPr>
       <w:r>
-        <w:t>Five-fold evaluation gives each home one held-out score. Its 969 model selections include 423 reaching target and 546 below, with another 558 target-reaching homes outside the list. Repeated tests reuse saved full-model scores. Rates combine counts within each allocation before averaging allocations equally. Separate group rounding changes total capacity slightly relative to pooling. Methods have equal quotas within each comparison. Quotas round upward and tied scores share boundary places equally without using outcomes. Tied selections contribute expected counts.</w:t>
+        <w:rPr>
+          <w:rFonts w:ascii="Arial" w:hAnsi="Arial" w:eastAsia="Arial" w:cs="Arial"/>
+          <w:w w:val="100"/>
+        </w:rPr>
+        <w:t xml:space="preserve">Table A1 reconciles four evaluation designs at a 25% quota. Row 1 reports the pooled five-fold cross-validation across all 3,873 homes, where each home gets one held-out score; its 969 selections include 423 target-reaching homes and 546 below, leaving 558 qualifying homes outside the list. Rows 2–4 reuse the 50 host splits (70% training, 30% testing), computing precision within each split before averaging across splits: selecting 25% across all 14 groups (43.42%), pooling the three priority groups (48.91%), and selecting 25% separately within each priority group (49.62%, reported as 49.6% in Section 5.2). In every comparison, quotas round upward, methods select identical numbers of homes, and tied cutoff scores share boundary places equally without using outcomes.</w:t>
       </w:r>
     </w:p>
     <w:p>
-      <w:pPr/>
+      <w:pPr>
+        <w:widowControl/>
+        <w:spacing w:after="120" w:line="259" w:lineRule="auto"/>
+        <w:jc w:val="left"/>
+      </w:pPr>
       <w:r>
-        <w:t>Within separate group quotas, complete-model gains average 16.37 points in Melbourne two-bedroom apartments, 17.60 in three-bedroom apartments and 24.99 in Yarra Ranges houses/townhouses. Reduced-model gains are 7.21, -2.05 and 19.35 points respectively. At 25%, the complete model captures 38.29% of target-reaching homes. Its gain over the reduced model is positive in 42 allocations and negative in eight. The middle 90% of paired full-versus-baseline gains span -0.7 to 31.8 percentage points. These percentiles describe allocation sensitivity across overlapping samples.</w:t>
+        <w:rPr>
+          <w:rFonts w:ascii="Arial" w:hAnsi="Arial" w:eastAsia="Arial" w:cs="Arial"/>
+          <w:w w:val="100"/>
+        </w:rPr>
+        <w:t xml:space="preserve">Within separate 25% group quotas, complete-model gains average +16.37 percentage points in Melbourne two-bedroom apartments, +17.60 in Melbourne three-bedroom apartments and +24.99 in Yarra Ranges houses/townhouses. Reduced-model gains are +7.21, -2.05 and +19.35 points respectively. At 25%, the complete model captures 38.29% of qualifying homes, beating the reduced model in 42 splits and trailing in eight; the middle 90% of paired full-versus-baseline gains span -0.7 to 31.8 percentage points across the overlapping splits.</w:t>
       </w:r>
     </w:p>
     <w:p>
-      <w:pPr/>
+      <w:pPr>
+        <w:widowControl/>
+        <w:spacing w:after="120" w:line="259" w:lineRule="auto"/>
+        <w:jc w:val="left"/>
+      </w:pPr>
       <w:r>
-        <w:t>For all eligible homes, mean AUC is 0.7084 versus 0.6035, improving in all 50 allocations. AUC measures ranking discrimination. Mean Brier score, squared probability error, is 0.17151 versus 0.18406, improving in 44. The five-fold, repeated full-population and priority-group results answer different comparisons.</w:t>
+        <w:rPr>
+          <w:rFonts w:ascii="Arial" w:hAnsi="Arial" w:eastAsia="Arial" w:cs="Arial"/>
+          <w:w w:val="100"/>
+        </w:rPr>
+        <w:t xml:space="preserve">For all 3,873 eligible homes, mean AUC (ranking discrimination) is 0.7084 versus 0.6035, improving in all 50 splits. Mean Brier score (squared probability error) improves from 0.18406 to 0.17151, improving in 44 splits.</w:t>
       </w:r>
     </w:p>
     <w:p>
-      <w:pPr/>
+      <w:pPr>
+        <w:widowControl/>
+        <w:spacing w:after="120" w:line="259" w:lineRule="auto"/>
+        <w:jc w:val="left"/>
+        <w:keepLines/>
+      </w:pPr>
       <w:r>
-        <w:t>The later-year gap is 12.3 percentage points using unrounded rates, with a conditional 95% range of 5.1-20.1 points. The exact earlier top-three set returns in 51.5% of host resamples. The range holds candidates fixed; reselecting them gives 5.4-20.2 points. Group ranges are pointwise 90%. All ranges hold the eligibility rules and review thresholds fixed.</w:t>
-      </w:r>
-    </w:p>
-    <w:p>
-      <w:pPr/>
-      <w:r>
-        <w:t xml:space="preserve">Price diagnostics in reports/supporting/revenue-analysis.md use the supplied count, including one extra boundary date. Main results use reconstructed 365-day counts. Group and temporal checks are in reports/tables and final-presentation/analysis/reference. Model code and results are in final-report/paired-analysis-2026-10-02 and final-report/screening-followup-2026-10-03. The published verifier reconstructs scores and metrics without refitting models or rebuilding raw reviews.</w:t>
+        <w:rPr>
+          <w:rFonts w:ascii="Arial" w:hAnsi="Arial" w:eastAsia="Arial" w:cs="Arial"/>
+          <w:w w:val="100"/>
+        </w:rPr>
+        <w:t xml:space="preserve">In the two-year comparison of 2,657 homes across ten groups, the later-year gap is 12.3 percentage points using unrounded rates, with a conditional 95% host-resample range of 5.1–20.1 points holding the earlier top three groups fixed, and 5.4–20.2 points when reselecting the top three groups in each resample (the exact earlier top-three set returns in 51.5% of resamples). Price diagnostics in </w:t>
       </w:r>
       <w:r>
-        <w:t/>
+        <w:rPr>
+          <w:rFonts w:ascii="Arial" w:hAnsi="Arial" w:eastAsia="Arial" w:cs="Arial"/>
+          <w:w w:val="100"/>
+        </w:rPr>
+        <w:t xml:space="preserve">reports/supporting/revenue-analysis.md</w:t>
       </w:r>
       <w:r>
-        <w:t xml:space="preserve"/>
+        <w:rPr>
+          <w:rFonts w:ascii="Arial" w:hAnsi="Arial" w:eastAsia="Arial" w:cs="Arial"/>
+          <w:w w:val="100"/>
+        </w:rPr>
+        <w:t xml:space="preserve"> use the supplied summary count, whereas main results use reconstructed 365-day counts. Code and verification files are in </w:t>
       </w:r>
       <w:r>
-        <w:t/>
+        <w:rPr>
+          <w:rFonts w:ascii="Arial" w:hAnsi="Arial" w:eastAsia="Arial" w:cs="Arial"/>
+          <w:w w:val="100"/>
+        </w:rPr>
+        <w:t xml:space="preserve">final-report/paired-analysis-2026-10-02</w:t>
       </w:r>
       <w:r>
-        <w:t xml:space="preserve"/>
+        <w:rPr>
+          <w:rFonts w:ascii="Arial" w:hAnsi="Arial" w:eastAsia="Arial" w:cs="Arial"/>
+          <w:w w:val="100"/>
+        </w:rPr>
+        <w:t xml:space="preserve"> and </w:t>
       </w:r>
       <w:r>
-        <w:t/>
+        <w:rPr>
+          <w:rFonts w:ascii="Arial" w:hAnsi="Arial" w:eastAsia="Arial" w:cs="Arial"/>
+          <w:w w:val="100"/>
+        </w:rPr>
+        <w:t xml:space="preserve">final-report/screening-followup-2026-10-03</w:t>
       </w:r>
       <w:r>
-        <w:t xml:space="preserve"/>
-      </w:r>
-      <w:r>
-        <w:t/>
-      </w:r>
-      <w:r>
-        <w:t xml:space="preserve"/>
-      </w:r>
-      <w:r>
-        <w:t/>
-      </w:r>
-      <w:r>
-        <w:t/>
+        <w:rPr>
+          <w:rFonts w:ascii="Arial" w:hAnsi="Arial" w:eastAsia="Arial" w:cs="Arial"/>
+          <w:w w:val="100"/>
+        </w:rPr>
+        <w:t xml:space="preserve">.</w:t>
       </w:r>
     </w:p>
     <w:p>
       <w:pPr>
         <w:pStyle w:val="Heading1"/>
+        <w:keepNext/>
+        <w:widowControl/>
       </w:pPr>
       <w:r>
-        <w:t>Appendix B Full group comparison</w:t>
+        <w:rPr>
+          <w:rFonts w:ascii="Arial" w:hAnsi="Arial" w:eastAsia="Arial" w:cs="Arial"/>
+          <w:w w:val="100"/>
+        </w:rPr>
+        <w:t xml:space="preserve">Appendix B. Full Group Comparison</w:t>
       </w:r>
     </w:p>
     <w:p>
       <w:pPr>
         <w:keepNext/>
-        <w:spacing w:after="80"/>
+        <w:spacing w:after="40" w:before="80"/>
         <w:jc w:val="center"/>
       </w:pPr>
       <w:r>
@@ -3129,15 +4302,36 @@
     <w:p>
       <w:pPr>
         <w:pStyle w:val="Caption"/>
+        <w:widowControl/>
       </w:pPr>
       <w:r>
         <w:rPr>
+          <w:rFonts w:ascii="Arial" w:hAnsi="Arial" w:eastAsia="Arial" w:cs="Arial"/>
+          <w:w w:val="100"/>
           <w:b/>
         </w:rPr>
-        <w:t>Figure B1.</w:t>
+        <w:t xml:space="preserve">Figure B1.</w:t>
       </w:r>
       <w:r>
-        <w:t xml:space="preserve"> All eligible groups, listing counts and pointwise 90% ranges from resampling hosts. Leading and lower-performing groups are shown.</w:t>
+        <w:rPr>
+          <w:rFonts w:ascii="Arial" w:hAnsi="Arial" w:eastAsia="Arial" w:cs="Arial"/>
+          <w:w w:val="100"/>
+        </w:rPr>
+        <w:t xml:space="preserve"> All 14 eligible groups, listing counts (</w:t>
+      </w:r>
+      <w:r>
+        <w:rPr>
+          <w:rFonts w:ascii="Arial" w:hAnsi="Arial" w:eastAsia="Arial" w:cs="Arial"/>
+          <w:w w:val="100"/>
+        </w:rPr>
+        <w:t xml:space="preserve">n</w:t>
+      </w:r>
+      <w:r>
+        <w:rPr>
+          <w:rFonts w:ascii="Arial" w:hAnsi="Arial" w:eastAsia="Arial" w:cs="Arial"/>
+          <w:w w:val="100"/>
+        </w:rPr>
+        <w:t xml:space="preserve">) and pointwise 90% ranges from resampling hosts. The dashed line marks the overall 25.3% rate across all 3,873 analysis homes.</w:t>
       </w:r>
     </w:p>
     <w:sectPr>

</xml_diff>

<commit_message>
Refine final report interpretation and restore APA references
</commit_message>
<xml_diff>
--- a/final-report/report-2026-10-04/Final_Report.docx
+++ b/final-report/report-2026-10-04/Final_Report.docx
@@ -129,10 +129,10 @@
       </w:pPr>
       <w:r>
         <w:rPr>
-          <w:rFonts w:ascii="Arial" w:hAnsi="Arial" w:eastAsia="Arial" w:cs="Arial"/>
+          <w:rFonts w:ascii="Arial" w:hAnsi="Arial"/>
           <w:w w:val="100"/>
         </w:rPr>
-        <w:t xml:space="preserve">We then test how to narrow the search within these priority groups. When selecting a quarter of homes in each group, a six-input logistic regression model produces lists where 49.6% reach at least 30 annual reviews, compared with 32.4% using group rates alone. This gives the client an evidence-based order for investigating established listings that already have comparable price, minimum-stay and amenity information. Lease permissions, quotes and cash flow determine which candidates to pursue.</w:t>
+        <w:t xml:space="preserve">When selecting a quarter of established homes in each priority group, the model produces lists where 49.6% reach at least 30 annual reviews, compared with 32.4% using group rates. Comparable prices, stay rules and amenities guide investigation order; permissions, quotes and cash flow determine which candidates to pursue.</w:t>
       </w:r>
     </w:p>
     <w:p>
@@ -296,6 +296,7 @@
         <w:widowControl/>
         <w:spacing w:after="120" w:line="259" w:lineRule="auto"/>
         <w:jc w:val="left"/>
+        <w:keepLines/>
       </w:pPr>
       <w:r>
         <w:rPr>
@@ -481,7 +482,7 @@
             <w:pPr>
               <w:widowControl/>
               <w:spacing w:after="40" w:line="240" w:lineRule="auto" w:before="40"/>
-              <w:jc w:val="left"/>
+              <w:jc w:val="right"/>
             </w:pPr>
             <w:r>
               <w:rPr>
@@ -554,7 +555,7 @@
             <w:pPr>
               <w:widowControl/>
               <w:spacing w:after="40" w:line="240" w:lineRule="auto" w:before="40"/>
-              <w:jc w:val="left"/>
+              <w:jc w:val="right"/>
             </w:pPr>
             <w:r>
               <w:rPr>
@@ -627,7 +628,7 @@
             <w:pPr>
               <w:widowControl/>
               <w:spacing w:after="40" w:line="240" w:lineRule="auto" w:before="40"/>
-              <w:jc w:val="left"/>
+              <w:jc w:val="right"/>
             </w:pPr>
             <w:r>
               <w:rPr>
@@ -700,7 +701,7 @@
             <w:pPr>
               <w:widowControl/>
               <w:spacing w:after="40" w:line="240" w:lineRule="auto" w:before="40"/>
-              <w:jc w:val="left"/>
+              <w:jc w:val="right"/>
             </w:pPr>
             <w:r>
               <w:rPr>
@@ -773,7 +774,7 @@
             <w:pPr>
               <w:widowControl/>
               <w:spacing w:after="40" w:line="240" w:lineRule="auto" w:before="40"/>
-              <w:jc w:val="left"/>
+              <w:jc w:val="right"/>
             </w:pPr>
             <w:r>
               <w:rPr>
@@ -846,7 +847,7 @@
             <w:pPr>
               <w:widowControl/>
               <w:spacing w:after="40" w:line="240" w:lineRule="auto" w:before="40"/>
-              <w:jc w:val="left"/>
+              <w:jc w:val="right"/>
             </w:pPr>
             <w:r>
               <w:rPr>
@@ -919,7 +920,7 @@
             <w:pPr>
               <w:widowControl/>
               <w:spacing w:after="40" w:line="240" w:lineRule="auto" w:before="40"/>
-              <w:jc w:val="left"/>
+              <w:jc w:val="right"/>
             </w:pPr>
             <w:r>
               <w:rPr>
@@ -992,7 +993,7 @@
             <w:pPr>
               <w:widowControl/>
               <w:spacing w:after="40" w:line="240" w:lineRule="auto" w:before="40"/>
-              <w:jc w:val="left"/>
+              <w:jc w:val="right"/>
             </w:pPr>
             <w:r>
               <w:rPr>
@@ -1089,14 +1090,14 @@
       </w:pPr>
       <w:r>
         <w:rPr>
-          <w:rFonts w:ascii="Arial" w:hAnsi="Arial" w:eastAsia="Arial" w:cs="Arial"/>
+          <w:rFonts w:ascii="Arial" w:hAnsi="Arial"/>
           <w:w w:val="100"/>
         </w:rPr>
-        <w:t xml:space="preserve">We use binary logistic regression in R to rank individual homes. Its </w:t>
+        <w:t xml:space="preserve">We use binary logistic regression in R to rank individual homes (R Core Team, n.d.). Its </w:t>
       </w:r>
       <w:r>
         <w:rPr>
-          <w:rFonts w:ascii="Arial" w:hAnsi="Arial" w:eastAsia="Arial" w:cs="Arial"/>
+          <w:rFonts w:ascii="Arial" w:hAnsi="Arial"/>
           <w:w w:val="100"/>
           <w:b/>
         </w:rPr>
@@ -1104,14 +1105,14 @@
       </w:r>
       <w:r>
         <w:rPr>
-          <w:rFonts w:ascii="Arial" w:hAnsi="Arial" w:eastAsia="Arial" w:cs="Arial"/>
+          <w:rFonts w:ascii="Arial" w:hAnsi="Arial"/>
           <w:w w:val="100"/>
         </w:rPr>
         <w:t xml:space="preserve"> is whether a home reaches at least 30 annual reviews. The </w:t>
       </w:r>
       <w:r>
         <w:rPr>
-          <w:rFonts w:ascii="Arial" w:hAnsi="Arial" w:eastAsia="Arial" w:cs="Arial"/>
+          <w:rFonts w:ascii="Arial" w:hAnsi="Arial"/>
           <w:w w:val="100"/>
           <w:b/>
         </w:rPr>
@@ -1119,7 +1120,7 @@
       </w:r>
       <w:r>
         <w:rPr>
-          <w:rFonts w:ascii="Arial" w:hAnsi="Arial" w:eastAsia="Arial" w:cs="Arial"/>
+          <w:rFonts w:ascii="Arial" w:hAnsi="Arial"/>
           <w:w w:val="100"/>
         </w:rPr>
         <w:t xml:space="preserve"> are council area, dwelling type, bedroom count, nightly price relative to the median of similar training homes, acceptance of one-night stays, and amenity count. The model learns a weight for each input from training homes and combines their contributions into a score. Higher scores move homes earlier in the investigation list. Group median prices and replacements for three missing minimum-stay values are calculated strictly within each training sample (Appendix A).</w:t>
@@ -1174,6 +1175,7 @@
         <w:widowControl/>
         <w:spacing w:after="120" w:line="259" w:lineRule="auto"/>
         <w:jc w:val="left"/>
+        <w:keepLines/>
       </w:pPr>
       <w:r>
         <w:rPr>
@@ -1264,7 +1266,7 @@
           <w:rFonts w:ascii="Arial" w:hAnsi="Arial"/>
           <w:w w:val="100"/>
         </w:rPr>
-        <w:t>In the supplied snapshot, median quoted nightly prices are AUD 285, AUD 450 and AUD 425.75 for Melbourne two-bedroom apartments, Melbourne three-bedroom apartments and Yarra Ranges three-bedroom houses/townhouses, respectively. One-night acceptance ranges from 22.2% to 59.8%, and median amenity counts from 44 to 55. These are advertised rates, not rents or prices actually paid.</w:t>
+        <w:t xml:space="preserve">Median advertised nightly prices are AUD 450 for Melbourne three-bedroom apartments, AUD 285 for Melbourne two-bedroom apartments and AUD 425.75 for Yarra Ranges three-bedroom houses/townhouses. In that order, one-night acceptance is 58.8%, 59.8% and 22.2%, and median amenity counts are 47, 44 and 55. These are advertised rates, not rents or prices actually paid.</w:t>
       </w:r>
     </w:p>
     <w:p>
@@ -1574,25 +1576,25 @@
       </w:pPr>
       <w:r>
         <w:rPr>
-          <w:rFonts w:ascii="Arial" w:hAnsi="Arial" w:eastAsia="Arial" w:cs="Arial"/>
+          <w:rFonts w:ascii="Arial" w:hAnsi="Arial"/>
           <w:w w:val="100"/>
         </w:rPr>
-        <w:t xml:space="preserve">Across all 50 fits, holding property group fixed, </w:t>
+        <w:t xml:space="preserve">Across all 50 fits, accepting one-night stays and offering more amenities raise the score, while higher relative prices reduce it. Holding other inputs constant, </w:t>
       </w:r>
       <w:r>
         <w:rPr>
-          <w:rFonts w:ascii="Arial" w:hAnsi="Arial" w:eastAsia="Arial" w:cs="Arial"/>
+          <w:rFonts w:ascii="Arial" w:hAnsi="Arial"/>
           <w:w w:val="100"/>
           <w:b/>
         </w:rPr>
-        <w:t xml:space="preserve">lower relative nightly prices, acceptance of one-night stays, and more amenities each raise a home's predicted score</w:t>
+        <w:t xml:space="preserve">odds ratios are 3.27 for one-night acceptance, 1.27 per ten amenities and 0.88 per price increase equal to 10% of the group median</w:t>
       </w:r>
       <w:r>
         <w:rPr>
-          <w:rFonts w:ascii="Arial" w:hAnsi="Arial" w:eastAsia="Arial" w:cs="Arial"/>
+          <w:rFonts w:ascii="Arial" w:hAnsi="Arial"/>
           <w:w w:val="100"/>
         </w:rPr>
-        <w:t xml:space="preserve">. Together, price and minimum-stay information add 11.0 percentage points over the reduced model (49.6% versus 38.6%).</w:t>
+        <w:t xml:space="preserve"> (Appendix A). Odds compare the chance of reaching the target with the chance of falling below it. Price and minimum-stay information add 11.0 percentage points over the reduced model (49.6% versus 38.6%).</w:t>
       </w:r>
     </w:p>
     <w:p>
@@ -1851,7 +1853,7 @@
             <w:pPr>
               <w:widowControl/>
               <w:spacing w:after="40" w:line="240" w:lineRule="auto" w:before="40"/>
-              <w:jc w:val="left"/>
+              <w:jc w:val="right"/>
             </w:pPr>
             <w:r>
               <w:rPr>
@@ -1885,7 +1887,7 @@
             <w:pPr>
               <w:widowControl/>
               <w:spacing w:after="40" w:line="240" w:lineRule="auto" w:before="40"/>
-              <w:jc w:val="left"/>
+              <w:jc w:val="right"/>
             </w:pPr>
             <w:r>
               <w:rPr>
@@ -1919,7 +1921,7 @@
             <w:pPr>
               <w:widowControl/>
               <w:spacing w:after="40" w:line="240" w:lineRule="auto" w:before="40"/>
-              <w:jc w:val="left"/>
+              <w:jc w:val="right"/>
             </w:pPr>
             <w:r>
               <w:rPr>
@@ -1953,7 +1955,7 @@
             <w:pPr>
               <w:widowControl/>
               <w:spacing w:after="40" w:line="240" w:lineRule="auto" w:before="40"/>
-              <w:jc w:val="left"/>
+              <w:jc w:val="right"/>
             </w:pPr>
             <w:r>
               <w:rPr>
@@ -1992,7 +1994,7 @@
             <w:pPr>
               <w:widowControl/>
               <w:spacing w:after="40" w:line="240" w:lineRule="auto" w:before="40"/>
-              <w:jc w:val="left"/>
+              <w:jc w:val="right"/>
             </w:pPr>
             <w:r>
               <w:rPr>
@@ -2026,7 +2028,7 @@
             <w:pPr>
               <w:widowControl/>
               <w:spacing w:after="40" w:line="240" w:lineRule="auto" w:before="40"/>
-              <w:jc w:val="left"/>
+              <w:jc w:val="right"/>
             </w:pPr>
             <w:r>
               <w:rPr>
@@ -2060,7 +2062,7 @@
             <w:pPr>
               <w:widowControl/>
               <w:spacing w:after="40" w:line="240" w:lineRule="auto" w:before="40"/>
-              <w:jc w:val="left"/>
+              <w:jc w:val="right"/>
             </w:pPr>
             <w:r>
               <w:rPr>
@@ -2094,7 +2096,7 @@
             <w:pPr>
               <w:widowControl/>
               <w:spacing w:after="40" w:line="240" w:lineRule="auto" w:before="40"/>
-              <w:jc w:val="left"/>
+              <w:jc w:val="right"/>
             </w:pPr>
             <w:r>
               <w:rPr>
@@ -2133,7 +2135,7 @@
             <w:pPr>
               <w:widowControl/>
               <w:spacing w:after="40" w:line="240" w:lineRule="auto" w:before="40"/>
-              <w:jc w:val="left"/>
+              <w:jc w:val="right"/>
             </w:pPr>
             <w:r>
               <w:rPr>
@@ -2167,7 +2169,7 @@
             <w:pPr>
               <w:widowControl/>
               <w:spacing w:after="40" w:line="240" w:lineRule="auto" w:before="40"/>
-              <w:jc w:val="left"/>
+              <w:jc w:val="right"/>
             </w:pPr>
             <w:r>
               <w:rPr>
@@ -2201,7 +2203,7 @@
             <w:pPr>
               <w:widowControl/>
               <w:spacing w:after="40" w:line="240" w:lineRule="auto" w:before="40"/>
-              <w:jc w:val="left"/>
+              <w:jc w:val="right"/>
             </w:pPr>
             <w:r>
               <w:rPr>
@@ -2235,7 +2237,7 @@
             <w:pPr>
               <w:widowControl/>
               <w:spacing w:after="40" w:line="240" w:lineRule="auto" w:before="40"/>
-              <w:jc w:val="left"/>
+              <w:jc w:val="right"/>
             </w:pPr>
             <w:r>
               <w:rPr>
@@ -3226,6 +3228,49 @@
         <w:spacing w:after="120" w:line="480" w:lineRule="auto" w:before="0"/>
         <w:jc w:val="left"/>
         <w:ind w:left="720" w:hanging="720"/>
+        <w:keepLines/>
+      </w:pPr>
+      <w:r>
+        <w:rPr>
+          <w:rFonts w:ascii="Arial" w:hAnsi="Arial"/>
+          <w:w w:val="100"/>
+        </w:rPr>
+        <w:t xml:space="preserve">Group 2. (2026). </w:t>
+      </w:r>
+      <w:r>
+        <w:rPr>
+          <w:rFonts w:ascii="Arial" w:hAnsi="Arial"/>
+          <w:w w:val="100"/>
+          <w:i/>
+        </w:rPr>
+        <w:t xml:space="preserve">Melbourne Airbnb market screening</w:t>
+      </w:r>
+      <w:r>
+        <w:rPr>
+          <w:rFonts w:ascii="Arial" w:hAnsi="Arial"/>
+          <w:w w:val="100"/>
+        </w:rPr>
+        <w:t xml:space="preserve"> (Version 4e2dd23) [Source code and analysis results]. GitHub. </w:t>
+      </w:r>
+      <w:hyperlink r:id="rId18">
+        <w:r>
+          <w:rPr>
+            <w:rFonts w:ascii="Arial" w:hAnsi="Arial"/>
+            <w:w w:val="100"/>
+            <w:color w:val="0563C1"/>
+            <w:u w:val="single"/>
+          </w:rPr>
+          <w:t xml:space="preserve">https://github.com/maksym-xu/CMCE30005-TheNextChapter/tree/4e2dd2373f72d3a418d8cd7a2908bee39add083d</w:t>
+        </w:r>
+      </w:hyperlink>
+    </w:p>
+    <w:p>
+      <w:pPr>
+        <w:widowControl/>
+        <w:spacing w:after="120" w:line="480" w:lineRule="auto" w:before="0"/>
+        <w:jc w:val="left"/>
+        <w:ind w:left="720" w:hanging="720"/>
+        <w:keepLines/>
       </w:pPr>
       <w:r>
         <w:rPr>
@@ -3249,7 +3294,7 @@
         </w:rPr>
         <w:t xml:space="preserve"> (CMCE30005 LMS snapshot) [Data set]. </w:t>
       </w:r>
-      <w:hyperlink r:id="rId17">
+      <w:hyperlink r:id="rId19">
         <w:r>
           <w:rPr>
             <w:rFonts w:ascii="Arial" w:hAnsi="Arial"/>
@@ -3258,6 +3303,48 @@
             <w:u w:val="single"/>
           </w:rPr>
           <w:t xml:space="preserve">https://insideairbnb.com/get-the-data/</w:t>
+        </w:r>
+      </w:hyperlink>
+    </w:p>
+    <w:p>
+      <w:pPr>
+        <w:widowControl/>
+        <w:spacing w:after="120" w:line="480" w:lineRule="auto" w:before="0"/>
+        <w:jc w:val="left"/>
+        <w:ind w:left="720" w:hanging="720"/>
+        <w:keepLines/>
+      </w:pPr>
+      <w:r>
+        <w:rPr>
+          <w:rFonts w:ascii="Arial" w:hAnsi="Arial"/>
+          <w:w w:val="100"/>
+        </w:rPr>
+        <w:t xml:space="preserve">R Core Team. (n.d.). </w:t>
+      </w:r>
+      <w:r>
+        <w:rPr>
+          <w:rFonts w:ascii="Arial" w:hAnsi="Arial"/>
+          <w:w w:val="100"/>
+          <w:i/>
+        </w:rPr>
+        <w:t xml:space="preserve">Fitting generalized linear models</w:t>
+      </w:r>
+      <w:r>
+        <w:rPr>
+          <w:rFonts w:ascii="Arial" w:hAnsi="Arial"/>
+          <w:w w:val="100"/>
+        </w:rPr>
+        <w:t xml:space="preserve">. R Documentation. </w:t>
+      </w:r>
+      <w:hyperlink r:id="rId20">
+        <w:r>
+          <w:rPr>
+            <w:rFonts w:ascii="Arial" w:hAnsi="Arial"/>
+            <w:w w:val="100"/>
+            <w:color w:val="0563C1"/>
+            <w:u w:val="single"/>
+          </w:rPr>
+          <w:t xml:space="preserve">https://stat.ethz.ch/R-manual/R-devel/library/stats/html/glm.html</w:t>
         </w:r>
       </w:hyperlink>
     </w:p>
@@ -3384,7 +3471,7 @@
           <w:rFonts w:ascii="Arial" w:hAnsi="Arial"/>
           <w:w w:val="100"/>
         </w:rPr>
-        <w:t>Across the 50 repeated training fits, mean log-odds weights are +1.183 for one-night acceptance (odds ratio 3.27), +0.237 per ten additional amenities (1.27), and -0.127 per price increase equal to 10% of the training-group median (0.88). All three directions persist in 50/50 fits. These odds ratios describe conditional historical associations, not probability changes or causal effects.</w:t>
+        <w:t xml:space="preserve">Mean log-odds coefficients across the 50 repeated fits are +1.183 for one-night acceptance, +0.237 per ten amenities and -0.127 per price increase equal to 10% of the training-group median. Exponentiating these means gives the reported odds ratios of 3.27, 1.27 and 0.88. All directions agree in 50/50 fits. These are conditional historical associations, not probability changes or causal effects.</w:t>
       </w:r>
     </w:p>
     <w:p>
@@ -3635,7 +3722,7 @@
             <w:pPr>
               <w:widowControl/>
               <w:spacing w:after="40" w:line="240" w:lineRule="auto" w:before="40"/>
-              <w:jc w:val="left"/>
+              <w:jc w:val="right"/>
             </w:pPr>
             <w:r>
               <w:rPr>
@@ -3669,7 +3756,7 @@
             <w:pPr>
               <w:widowControl/>
               <w:spacing w:after="40" w:line="240" w:lineRule="auto" w:before="40"/>
-              <w:jc w:val="left"/>
+              <w:jc w:val="right"/>
             </w:pPr>
             <w:r>
               <w:rPr>
@@ -3703,7 +3790,7 @@
             <w:pPr>
               <w:widowControl/>
               <w:spacing w:after="40" w:line="240" w:lineRule="auto" w:before="40"/>
-              <w:jc w:val="left"/>
+              <w:jc w:val="right"/>
             </w:pPr>
             <w:r>
               <w:rPr>
@@ -3776,7 +3863,7 @@
             <w:pPr>
               <w:widowControl/>
               <w:spacing w:after="40" w:line="240" w:lineRule="auto" w:before="40"/>
-              <w:jc w:val="left"/>
+              <w:jc w:val="right"/>
             </w:pPr>
             <w:r>
               <w:rPr>
@@ -3810,7 +3897,7 @@
             <w:pPr>
               <w:widowControl/>
               <w:spacing w:after="40" w:line="240" w:lineRule="auto" w:before="40"/>
-              <w:jc w:val="left"/>
+              <w:jc w:val="right"/>
             </w:pPr>
             <w:r>
               <w:rPr>
@@ -3844,7 +3931,7 @@
             <w:pPr>
               <w:widowControl/>
               <w:spacing w:after="40" w:line="240" w:lineRule="auto" w:before="40"/>
-              <w:jc w:val="left"/>
+              <w:jc w:val="right"/>
             </w:pPr>
             <w:r>
               <w:rPr>
@@ -3917,7 +4004,7 @@
             <w:pPr>
               <w:widowControl/>
               <w:spacing w:after="40" w:line="240" w:lineRule="auto" w:before="40"/>
-              <w:jc w:val="left"/>
+              <w:jc w:val="right"/>
             </w:pPr>
             <w:r>
               <w:rPr>
@@ -3951,7 +4038,7 @@
             <w:pPr>
               <w:widowControl/>
               <w:spacing w:after="40" w:line="240" w:lineRule="auto" w:before="40"/>
-              <w:jc w:val="left"/>
+              <w:jc w:val="right"/>
             </w:pPr>
             <w:r>
               <w:rPr>
@@ -3985,7 +4072,7 @@
             <w:pPr>
               <w:widowControl/>
               <w:spacing w:after="40" w:line="240" w:lineRule="auto" w:before="40"/>
-              <w:jc w:val="left"/>
+              <w:jc w:val="right"/>
             </w:pPr>
             <w:r>
               <w:rPr>
@@ -4058,7 +4145,7 @@
             <w:pPr>
               <w:widowControl/>
               <w:spacing w:after="40" w:line="240" w:lineRule="auto" w:before="40"/>
-              <w:jc w:val="left"/>
+              <w:jc w:val="right"/>
             </w:pPr>
             <w:r>
               <w:rPr>
@@ -4092,7 +4179,7 @@
             <w:pPr>
               <w:widowControl/>
               <w:spacing w:after="40" w:line="240" w:lineRule="auto" w:before="40"/>
-              <w:jc w:val="left"/>
+              <w:jc w:val="right"/>
             </w:pPr>
             <w:r>
               <w:rPr>
@@ -4126,7 +4213,7 @@
             <w:pPr>
               <w:widowControl/>
               <w:spacing w:after="40" w:line="240" w:lineRule="auto" w:before="40"/>
-              <w:jc w:val="left"/>
+              <w:jc w:val="right"/>
             </w:pPr>
             <w:r>
               <w:rPr>
@@ -4153,10 +4240,10 @@
       </w:pPr>
       <w:r>
         <w:rPr>
-          <w:rFonts w:ascii="Arial" w:hAnsi="Arial" w:eastAsia="Arial" w:cs="Arial"/>
+          <w:rFonts w:ascii="Arial" w:hAnsi="Arial"/>
           <w:w w:val="100"/>
         </w:rPr>
-        <w:t xml:space="preserve">Table A1 reconciles four evaluation designs at a 25% quota. Row 1 reports the pooled five-fold cross-validation across all 3,873 homes, where each home gets one held-out score; its 969 selections include 423 target-reaching homes and 546 below, leaving 558 qualifying homes outside the list. Rows 2–4 reuse the 50 host splits (70% training, 30% testing), computing precision within each split before averaging across splits: selecting 25% across all 14 groups (43.42%), pooling the three priority groups (48.91%), and selecting 25% separately within each priority group (49.62%, reported as 49.6% in Section 5.2). In every comparison, quotas round upward, methods select identical numbers of homes, and tied cutoff scores share boundary places equally without using outcomes.</w:t>
+        <w:t xml:space="preserve">Table A1 separates four 25%-quota evaluations. Row 1 gives each of the 3,873 homes one held-out score across five host-grouped folds. Its 969 selections include 423 target-reaching homes and 546 below target, leaving 558 qualifying homes outside. Rows 2–4 average within-split target rates over the same 50 host splits (70% training, 30% testing), using all groups, pooled priority groups or separate group quotas. Quotas round upward, methods select identical numbers, and tied cutoff scores share boundary places equally without using outcomes.</w:t>
       </w:r>
     </w:p>
     <w:p>
@@ -4196,52 +4283,10 @@
       </w:pPr>
       <w:r>
         <w:rPr>
-          <w:rFonts w:ascii="Arial" w:hAnsi="Arial" w:eastAsia="Arial" w:cs="Arial"/>
+          <w:rFonts w:ascii="Arial" w:hAnsi="Arial"/>
           <w:w w:val="100"/>
         </w:rPr>
-        <w:t xml:space="preserve">In the two-year comparison of 2,657 homes across ten groups, the later-year gap is 12.3 percentage points using unrounded rates, with a conditional 95% host-resample range of 5.1–20.1 points holding the earlier top three groups fixed, and 5.4–20.2 points when reselecting the top three groups in each resample (the exact earlier top-three set returns in 51.5% of resamples). Price diagnostics in </w:t>
-      </w:r>
-      <w:r>
-        <w:rPr>
-          <w:rFonts w:ascii="Arial" w:hAnsi="Arial" w:eastAsia="Arial" w:cs="Arial"/>
-          <w:w w:val="100"/>
-        </w:rPr>
-        <w:t xml:space="preserve">reports/supporting/revenue-analysis.md</w:t>
-      </w:r>
-      <w:r>
-        <w:rPr>
-          <w:rFonts w:ascii="Arial" w:hAnsi="Arial" w:eastAsia="Arial" w:cs="Arial"/>
-          <w:w w:val="100"/>
-        </w:rPr>
-        <w:t xml:space="preserve"> use the supplied summary count, whereas main results use reconstructed 365-day counts. Code and verification files are in </w:t>
-      </w:r>
-      <w:r>
-        <w:rPr>
-          <w:rFonts w:ascii="Arial" w:hAnsi="Arial" w:eastAsia="Arial" w:cs="Arial"/>
-          <w:w w:val="100"/>
-        </w:rPr>
-        <w:t xml:space="preserve">final-report/paired-analysis-2026-10-02</w:t>
-      </w:r>
-      <w:r>
-        <w:rPr>
-          <w:rFonts w:ascii="Arial" w:hAnsi="Arial" w:eastAsia="Arial" w:cs="Arial"/>
-          <w:w w:val="100"/>
-        </w:rPr>
-        <w:t xml:space="preserve"> and </w:t>
-      </w:r>
-      <w:r>
-        <w:rPr>
-          <w:rFonts w:ascii="Arial" w:hAnsi="Arial" w:eastAsia="Arial" w:cs="Arial"/>
-          <w:w w:val="100"/>
-        </w:rPr>
-        <w:t xml:space="preserve">final-report/screening-followup-2026-10-03</w:t>
-      </w:r>
-      <w:r>
-        <w:rPr>
-          <w:rFonts w:ascii="Arial" w:hAnsi="Arial" w:eastAsia="Arial" w:cs="Arial"/>
-          <w:w w:val="100"/>
-        </w:rPr>
-        <w:t xml:space="preserve">.</w:t>
+        <w:t xml:space="preserve">In the two-year comparison of 2,657 homes across ten groups, the later-year gap is 12.3 percentage points using unrounded rates, with a conditional 95% host-resample range of 5.1–20.1 points holding the earlier top three groups fixed, and 5.4–20.2 points when reselecting the top three groups in each resample (the exact earlier top-three set returns in 51.5% of resamples). Price diagnostics in reports/supporting/revenue-analysis.md use the supplied summary count, whereas main results use reconstructed 365-day counts. Code and verification files (Group 2, 2026) are in final-report/paired-analysis-2026-10-02 and final-report/screening-followup-2026-10-03.</w:t>
       </w:r>
     </w:p>
     <w:p>

</xml_diff>

<commit_message>
Explain diverging rankings and add a worked lease example
- Table 4 adds each priority group's rank on estimated revenue and the
  median revenue of homes below target; Section 5.2 explains how to
  choose when the activity and revenue rankings differ.
- Section 6 adds a worked example for two unlisted rentals (illustrative
  costs); Recommendations 1-3 and Table 7 use the same rule.
- Trim about 150 words to stay under 3,000 (Word count 2,982); shorten
  Figures 2 and 4 and start the appendix on a new page (nine pages).
- Rerun the full analysis from the course CSV files: every committed
  number reproduced. The package check now also covers the new Table 4
  values and Word's own count.
</commit_message>
<xml_diff>
--- a/final-report/report-2026-10-04/Final_Report.docx
+++ b/final-report/report-2026-10-04/Final_Report.docx
@@ -67,20 +67,15 @@
             <w:color w:val="0563C1"/>
             <w:u w:val="single"/>
           </w:rPr>
-          <w:t xml:space="preserve">https://github.com/maksym-xu/CMCE30005-TheNextChapter</w:t>
+          <w:t xml:space="preserve">https://github.com/maksym-xu/CMCE30005-TheNextChapter/tree/final-report-marking-fixes-2026-10-16</w:t>
         </w:r>
       </w:hyperlink>
-      <w:r>
-        <w:rPr>
-          <w:rFonts w:ascii="Arial" w:hAnsi="Arial" w:eastAsia="Arial" w:cs="Arial"/>
-        </w:rPr>
-        <w:t xml:space="preserve"> (branch final-report-marking-fixes-2026-10-16)</w:t>
-      </w:r>
     </w:p>
     <w:p>
       <w:pPr>
         <w:pStyle w:val="Heading1"/>
         <w:keepNext/>
+        <w:pageBreakBefore w:val="0"/>
       </w:pPr>
       <w:r>
         <w:rPr>
@@ -99,7 +94,7 @@
         <w:rPr>
           <w:rFonts w:ascii="Arial" w:hAnsi="Arial" w:eastAsia="Arial" w:cs="Arial"/>
         </w:rPr>
-        <w:t>Our client plans to lease homes in Greater Melbourne and let them as short stays through Airbnb. Rent and setup costs are paid before any guest income arrives, so a lease in the wrong place ties up scarce startup funds. This report shows where to search and which homes to inspect first.</w:t>
+        <w:t>Our client plans to lease homes in Greater Melbourne and let them as short stays through Airbnb. Rent and setup costs are paid before any guest income arrives, so a lease in the wrong place ties up scarce startup funds.</w:t>
       </w:r>
     </w:p>
     <w:p>
@@ -112,7 +107,7 @@
         <w:rPr>
           <w:rFonts w:ascii="Arial" w:hAnsi="Arial" w:eastAsia="Arial" w:cs="Arial"/>
         </w:rPr>
-        <w:t>We recommend searching two- and three-bedroom apartments in the City of Melbourne first, with three-bedroom houses and townhouses in Yarra Ranges as a second option. These groups had the highest shares of homes with strong guest activity, and their typical homes brought in an estimated AUD 30,600–48,600 a year, against AUD 24,700 for all homes studied.</w:t>
+        <w:t>We recommend searching two- and three-bedroom apartments in the City of Melbourne first, with three-bedroom houses and townhouses in Yarra Ranges as a second option. These groups had the highest shares of homes with strong guest activity, and their typical homes brought in an estimated AUD 30,600–48,600 a year before costs, against AUD 24,700 for all homes studied.</w:t>
       </w:r>
     </w:p>
     <w:p>
@@ -132,6 +127,7 @@
       <w:pPr>
         <w:pStyle w:val="Heading1"/>
         <w:keepNext/>
+        <w:pageBreakBefore w:val="0"/>
       </w:pPr>
       <w:r>
         <w:rPr>
@@ -278,7 +274,7 @@
         <w:rPr>
           <w:rFonts w:ascii="Arial" w:hAnsi="Arial" w:eastAsia="Arial" w:cs="Arial"/>
         </w:rPr>
-        <w:t>) when it receives at least 30 guest reviews in the 365 days before data collection, a level reached by a quarter of separate reference homes (Section 3). Inside Airbnb (n.d.) assumes half of stays are reviewed, each lasting at least three nights, and caps estimated nights at 70% of the year (255); on that rule, 30 reviews means about 180 booked nights a year.</w:t>
+        <w:t>) when it receives at least 30 guest reviews in the 365 days before data collection, a level reached by a quarter of separate reference homes (Section 3). Inside Airbnb (n.d.) assumes half of stays are reviewed, each lasting at least three nights, and caps estimated nights at 70% of the year (255), so 30 reviews means about 180 booked nights a year.</w:t>
       </w:r>
     </w:p>
     <w:p>
@@ -304,13 +300,14 @@
         <w:rPr>
           <w:rFonts w:ascii="Arial" w:hAnsi="Arial" w:eastAsia="Arial" w:cs="Arial"/>
         </w:rPr>
-        <w:t>Building on the interim report, we keep its group comparison, replace its hard-to-explain random forest with one logistic regression, and add a test within the leading groups.</w:t>
+        <w:t>Building on the interim report, we keep its group comparison but replace its hard-to-explain random forest with one logistic regression.</w:t>
       </w:r>
     </w:p>
     <w:p>
       <w:pPr>
         <w:pStyle w:val="Heading1"/>
         <w:keepNext/>
+        <w:pageBreakBefore w:val="0"/>
       </w:pPr>
       <w:r>
         <w:rPr>
@@ -329,7 +326,7 @@
         <w:rPr>
           <w:rFonts w:ascii="Arial" w:hAnsi="Arial" w:eastAsia="Arial" w:cs="Arial"/>
         </w:rPr>
-        <w:t>We use one Inside Airbnb snapshot of Melbourne, supplied through the subject LMS and collected between 17 June and 1 July 2026 (Inside Airbnb, 2026). It holds 25,728 listings with 90 fields and 1,026,690 dated reviews. We did not use the calendar, which cannot separate bookings from blocked nights.</w:t>
+        <w:t>We use one Inside Airbnb snapshot of Melbourne, supplied through the subject LMS and collected 17 June–1 July 2026 (Inside Airbnb, 2026). It holds 25,728 listings with 90 fields and 1,026,690 dated reviews. We did not use the calendar, which cannot separate bookings from blocked nights.</w:t>
       </w:r>
     </w:p>
     <w:p>
@@ -409,7 +406,7 @@
           <w:rFonts w:ascii="Arial" w:hAnsi="Arial" w:eastAsia="Arial" w:cs="Arial"/>
           <w:b/>
         </w:rPr>
-        <w:t>Table 1. From the supplied listings to the analysis sample</w:t>
+        <w:t>Table 1. From supplied listings to analysis sample</w:t>
       </w:r>
     </w:p>
     <w:tbl>
@@ -434,8 +431,8 @@
         <w:tblLayout w:type="fixed"/>
       </w:tblPr>
       <w:tblGrid>
-        <w:gridCol w:w="8143"/>
-        <w:gridCol w:w="1722"/>
+        <w:gridCol w:w="8115"/>
+        <w:gridCol w:w="1750"/>
       </w:tblGrid>
       <w:tr>
         <w:trPr>
@@ -444,7 +441,7 @@
         </w:trPr>
         <w:tc>
           <w:tcPr>
-            <w:tcW w:type="dxa" w:w="8143"/>
+            <w:tcW w:type="dxa" w:w="8115"/>
             <w:shd w:val="clear" w:color="auto" w:fill="E9EEF3"/>
           </w:tcPr>
           <w:p>
@@ -465,7 +462,7 @@
         </w:tc>
         <w:tc>
           <w:tcPr>
-            <w:tcW w:type="dxa" w:w="1722"/>
+            <w:tcW w:type="dxa" w:w="1750"/>
             <w:shd w:val="clear" w:color="auto" w:fill="E9EEF3"/>
           </w:tcPr>
           <w:p>
@@ -491,7 +488,7 @@
         </w:trPr>
         <w:tc>
           <w:tcPr>
-            <w:tcW w:type="dxa" w:w="8143"/>
+            <w:tcW w:type="dxa" w:w="8115"/>
             <w:shd w:val="clear" w:color="auto" w:fill="FFFFFF"/>
           </w:tcPr>
           <w:p>
@@ -505,13 +502,13 @@
                 <w:rFonts w:ascii="Arial" w:hAnsi="Arial" w:eastAsia="Arial" w:cs="Arial"/>
                 <w:sz w:val="21"/>
               </w:rPr>
-              <w:t>All listings in the snapshot</w:t>
+              <w:t>All listings</w:t>
             </w:r>
           </w:p>
         </w:tc>
         <w:tc>
           <w:tcPr>
-            <w:tcW w:type="dxa" w:w="1722"/>
+            <w:tcW w:type="dxa" w:w="1750"/>
             <w:shd w:val="clear" w:color="auto" w:fill="FFFFFF"/>
           </w:tcPr>
           <w:p>
@@ -536,7 +533,7 @@
         </w:trPr>
         <w:tc>
           <w:tcPr>
-            <w:tcW w:type="dxa" w:w="8143"/>
+            <w:tcW w:type="dxa" w:w="8115"/>
             <w:shd w:val="clear" w:color="auto" w:fill="FFFFFF"/>
           </w:tcPr>
           <w:p>
@@ -556,7 +553,7 @@
         </w:tc>
         <w:tc>
           <w:tcPr>
-            <w:tcW w:type="dxa" w:w="1722"/>
+            <w:tcW w:type="dxa" w:w="1750"/>
             <w:shd w:val="clear" w:color="auto" w:fill="FFFFFF"/>
           </w:tcPr>
           <w:p>
@@ -581,7 +578,7 @@
         </w:trPr>
         <w:tc>
           <w:tcPr>
-            <w:tcW w:type="dxa" w:w="8143"/>
+            <w:tcW w:type="dxa" w:w="8115"/>
             <w:shd w:val="clear" w:color="auto" w:fill="FFFFFF"/>
           </w:tcPr>
           <w:p>
@@ -601,7 +598,7 @@
         </w:tc>
         <w:tc>
           <w:tcPr>
-            <w:tcW w:type="dxa" w:w="1722"/>
+            <w:tcW w:type="dxa" w:w="1750"/>
             <w:shd w:val="clear" w:color="auto" w:fill="FFFFFF"/>
           </w:tcPr>
           <w:p>
@@ -626,7 +623,7 @@
         </w:trPr>
         <w:tc>
           <w:tcPr>
-            <w:tcW w:type="dxa" w:w="8143"/>
+            <w:tcW w:type="dxa" w:w="8115"/>
             <w:shd w:val="clear" w:color="auto" w:fill="FFFFFF"/>
           </w:tcPr>
           <w:p>
@@ -646,7 +643,7 @@
         </w:tc>
         <w:tc>
           <w:tcPr>
-            <w:tcW w:type="dxa" w:w="1722"/>
+            <w:tcW w:type="dxa" w:w="1750"/>
             <w:shd w:val="clear" w:color="auto" w:fill="FFFFFF"/>
           </w:tcPr>
           <w:p>
@@ -671,7 +668,7 @@
         </w:trPr>
         <w:tc>
           <w:tcPr>
-            <w:tcW w:type="dxa" w:w="8143"/>
+            <w:tcW w:type="dxa" w:w="8115"/>
             <w:shd w:val="clear" w:color="auto" w:fill="FFFFFF"/>
           </w:tcPr>
           <w:p>
@@ -691,7 +688,7 @@
         </w:tc>
         <w:tc>
           <w:tcPr>
-            <w:tcW w:type="dxa" w:w="1722"/>
+            <w:tcW w:type="dxa" w:w="1750"/>
             <w:shd w:val="clear" w:color="auto" w:fill="FFFFFF"/>
           </w:tcPr>
           <w:p>
@@ -716,7 +713,7 @@
         </w:trPr>
         <w:tc>
           <w:tcPr>
-            <w:tcW w:type="dxa" w:w="8143"/>
+            <w:tcW w:type="dxa" w:w="8115"/>
             <w:shd w:val="clear" w:color="auto" w:fill="FFFFFF"/>
           </w:tcPr>
           <w:p>
@@ -736,7 +733,7 @@
         </w:tc>
         <w:tc>
           <w:tcPr>
-            <w:tcW w:type="dxa" w:w="1722"/>
+            <w:tcW w:type="dxa" w:w="1750"/>
             <w:shd w:val="clear" w:color="auto" w:fill="FFFFFF"/>
           </w:tcPr>
           <w:p>
@@ -761,7 +758,7 @@
         </w:trPr>
         <w:tc>
           <w:tcPr>
-            <w:tcW w:type="dxa" w:w="8143"/>
+            <w:tcW w:type="dxa" w:w="8115"/>
             <w:shd w:val="clear" w:color="auto" w:fill="FFFFFF"/>
           </w:tcPr>
           <w:p>
@@ -782,7 +779,7 @@
         </w:tc>
         <w:tc>
           <w:tcPr>
-            <w:tcW w:type="dxa" w:w="1722"/>
+            <w:tcW w:type="dxa" w:w="1750"/>
             <w:shd w:val="clear" w:color="auto" w:fill="FFFFFF"/>
           </w:tcPr>
           <w:p>
@@ -808,7 +805,7 @@
         </w:trPr>
         <w:tc>
           <w:tcPr>
-            <w:tcW w:type="dxa" w:w="8143"/>
+            <w:tcW w:type="dxa" w:w="8115"/>
             <w:shd w:val="clear" w:color="auto" w:fill="FFFFFF"/>
           </w:tcPr>
           <w:p>
@@ -821,13 +818,13 @@
                 <w:rFonts w:ascii="Arial" w:hAnsi="Arial" w:eastAsia="Arial" w:cs="Arial"/>
                 <w:sz w:val="21"/>
               </w:rPr>
-              <w:t>Reference homes in the same 14 groups (target only)</w:t>
+              <w:t>Reference homes in these groups (target only)</w:t>
             </w:r>
           </w:p>
         </w:tc>
         <w:tc>
           <w:tcPr>
-            <w:tcW w:type="dxa" w:w="1722"/>
+            <w:tcW w:type="dxa" w:w="1750"/>
             <w:shd w:val="clear" w:color="auto" w:fill="FFFFFF"/>
           </w:tcPr>
           <w:p>
@@ -863,13 +860,14 @@
         <w:rPr>
           <w:rFonts w:ascii="Arial" w:hAnsi="Arial" w:eastAsia="Arial" w:cs="Arial"/>
         </w:rPr>
-        <w:t>The 3,873 analysis homes belong to 1,726 hosts in six council areas; 64% are in the City of Melbourne. The price rule mainly removes inactive listings: 77.8% of the 3,796 residential listings it removes had no review in the past year, against 17.0% of those kept.</w:t>
+        <w:t>The 3,873 analysis homes belong to 1,726 hosts in six council areas. The price rule mainly removes inactive listings: 77.8% of the 3,796 residential listings it removes had no review in the past year, against 17.0% of those kept.</w:t>
       </w:r>
     </w:p>
     <w:p>
       <w:pPr>
         <w:pStyle w:val="Heading1"/>
         <w:keepNext/>
+        <w:pageBreakBefore w:val="0"/>
       </w:pPr>
       <w:r>
         <w:rPr>
@@ -895,7 +893,7 @@
         <w:rPr>
           <w:rFonts w:ascii="Arial" w:hAnsi="Arial" w:eastAsia="Arial" w:cs="Arial"/>
         </w:rPr>
-        <w:t xml:space="preserve"> We compare the share of busy homes in the 14 groups. To show how much a share could move by chance, we redraw hosts at random 1,000 times and report the middle 90% of results, keeping each host's homes together.</w:t>
+        <w:t xml:space="preserve"> We compare the share of busy homes in the 14 groups. To show how much a share could move by chance, we redraw hosts at random 1,000 times and report the middle 90% of results.</w:t>
       </w:r>
     </w:p>
     <w:p>
@@ -915,7 +913,7 @@
         <w:rPr>
           <w:rFonts w:ascii="Arial" w:hAnsi="Arial" w:eastAsia="Arial" w:cs="Arial"/>
         </w:rPr>
-        <w:t xml:space="preserve"> Logistic regression estimates the chance that a home is busy. Each input adds to or subtracts from a score, which is turned into a chance between 0% and 100%. Table 2 lists the outcome and the six inputs.</w:t>
+        <w:t xml:space="preserve"> Logistic regression estimates the chance that a home is busy. Each input raises or lowers a score, which becomes a chance between 0% and 100%. Table 2 lists the outcome and the six inputs.</w:t>
       </w:r>
     </w:p>
     <w:p>
@@ -955,8 +953,8 @@
         <w:tblLayout w:type="fixed"/>
       </w:tblPr>
       <w:tblGrid>
-        <w:gridCol w:w="3376"/>
-        <w:gridCol w:w="6489"/>
+        <w:gridCol w:w="3593"/>
+        <w:gridCol w:w="6272"/>
       </w:tblGrid>
       <w:tr>
         <w:trPr>
@@ -965,7 +963,7 @@
         </w:trPr>
         <w:tc>
           <w:tcPr>
-            <w:tcW w:type="dxa" w:w="3376"/>
+            <w:tcW w:type="dxa" w:w="3593"/>
             <w:shd w:val="clear" w:color="auto" w:fill="E9EEF3"/>
           </w:tcPr>
           <w:p>
@@ -986,7 +984,7 @@
         </w:tc>
         <w:tc>
           <w:tcPr>
-            <w:tcW w:type="dxa" w:w="6489"/>
+            <w:tcW w:type="dxa" w:w="6272"/>
             <w:shd w:val="clear" w:color="auto" w:fill="E9EEF3"/>
           </w:tcPr>
           <w:p>
@@ -1012,7 +1010,7 @@
         </w:trPr>
         <w:tc>
           <w:tcPr>
-            <w:tcW w:type="dxa" w:w="3376"/>
+            <w:tcW w:type="dxa" w:w="3593"/>
             <w:shd w:val="clear" w:color="auto" w:fill="FFFFFF"/>
           </w:tcPr>
           <w:p>
@@ -1033,7 +1031,7 @@
         </w:tc>
         <w:tc>
           <w:tcPr>
-            <w:tcW w:type="dxa" w:w="6489"/>
+            <w:tcW w:type="dxa" w:w="6272"/>
             <w:shd w:val="clear" w:color="auto" w:fill="FFFFFF"/>
           </w:tcPr>
           <w:p>
@@ -1058,7 +1056,7 @@
         </w:trPr>
         <w:tc>
           <w:tcPr>
-            <w:tcW w:type="dxa" w:w="3376"/>
+            <w:tcW w:type="dxa" w:w="3593"/>
             <w:shd w:val="clear" w:color="auto" w:fill="FFFFFF"/>
           </w:tcPr>
           <w:p>
@@ -1078,7 +1076,7 @@
         </w:tc>
         <w:tc>
           <w:tcPr>
-            <w:tcW w:type="dxa" w:w="6489"/>
+            <w:tcW w:type="dxa" w:w="6272"/>
             <w:shd w:val="clear" w:color="auto" w:fill="FFFFFF"/>
           </w:tcPr>
           <w:p>
@@ -1092,7 +1090,7 @@
                 <w:rFonts w:ascii="Arial" w:hAnsi="Arial" w:eastAsia="Arial" w:cs="Arial"/>
                 <w:sz w:val="21"/>
               </w:rPr>
-              <w:t>One of six council areas</w:t>
+              <w:t>One of six</w:t>
             </w:r>
           </w:p>
         </w:tc>
@@ -1103,7 +1101,7 @@
         </w:trPr>
         <w:tc>
           <w:tcPr>
-            <w:tcW w:type="dxa" w:w="3376"/>
+            <w:tcW w:type="dxa" w:w="3593"/>
             <w:shd w:val="clear" w:color="auto" w:fill="FFFFFF"/>
           </w:tcPr>
           <w:p>
@@ -1123,7 +1121,7 @@
         </w:tc>
         <w:tc>
           <w:tcPr>
-            <w:tcW w:type="dxa" w:w="6489"/>
+            <w:tcW w:type="dxa" w:w="6272"/>
             <w:shd w:val="clear" w:color="auto" w:fill="FFFFFF"/>
           </w:tcPr>
           <w:p>
@@ -1148,7 +1146,7 @@
         </w:trPr>
         <w:tc>
           <w:tcPr>
-            <w:tcW w:type="dxa" w:w="3376"/>
+            <w:tcW w:type="dxa" w:w="3593"/>
             <w:shd w:val="clear" w:color="auto" w:fill="FFFFFF"/>
           </w:tcPr>
           <w:p>
@@ -1168,7 +1166,7 @@
         </w:tc>
         <w:tc>
           <w:tcPr>
-            <w:tcW w:type="dxa" w:w="6489"/>
+            <w:tcW w:type="dxa" w:w="6272"/>
             <w:shd w:val="clear" w:color="auto" w:fill="FFFFFF"/>
           </w:tcPr>
           <w:p>
@@ -1193,7 +1191,7 @@
         </w:trPr>
         <w:tc>
           <w:tcPr>
-            <w:tcW w:type="dxa" w:w="3376"/>
+            <w:tcW w:type="dxa" w:w="3593"/>
             <w:shd w:val="clear" w:color="auto" w:fill="FFFFFF"/>
           </w:tcPr>
           <w:p>
@@ -1213,7 +1211,7 @@
         </w:tc>
         <w:tc>
           <w:tcPr>
-            <w:tcW w:type="dxa" w:w="6489"/>
+            <w:tcW w:type="dxa" w:w="6272"/>
             <w:shd w:val="clear" w:color="auto" w:fill="FFFFFF"/>
           </w:tcPr>
           <w:p>
@@ -1227,7 +1225,7 @@
                 <w:rFonts w:ascii="Arial" w:hAnsi="Arial" w:eastAsia="Arial" w:cs="Arial"/>
                 <w:sz w:val="21"/>
               </w:rPr>
-              <w:t>Nightly price relative to the median of the same group, in steps of 10%</w:t>
+              <w:t>Nightly price relative to the group median, in steps of 10%</w:t>
             </w:r>
           </w:p>
         </w:tc>
@@ -1238,7 +1236,7 @@
         </w:trPr>
         <w:tc>
           <w:tcPr>
-            <w:tcW w:type="dxa" w:w="3376"/>
+            <w:tcW w:type="dxa" w:w="3593"/>
             <w:shd w:val="clear" w:color="auto" w:fill="FFFFFF"/>
           </w:tcPr>
           <w:p>
@@ -1258,7 +1256,7 @@
         </w:tc>
         <w:tc>
           <w:tcPr>
-            <w:tcW w:type="dxa" w:w="6489"/>
+            <w:tcW w:type="dxa" w:w="6272"/>
             <w:shd w:val="clear" w:color="auto" w:fill="FFFFFF"/>
           </w:tcPr>
           <w:p>
@@ -1283,7 +1281,7 @@
         </w:trPr>
         <w:tc>
           <w:tcPr>
-            <w:tcW w:type="dxa" w:w="3376"/>
+            <w:tcW w:type="dxa" w:w="3593"/>
             <w:shd w:val="clear" w:color="auto" w:fill="FFFFFF"/>
           </w:tcPr>
           <w:p>
@@ -1302,7 +1300,7 @@
         </w:tc>
         <w:tc>
           <w:tcPr>
-            <w:tcW w:type="dxa" w:w="6489"/>
+            <w:tcW w:type="dxa" w:w="6272"/>
             <w:shd w:val="clear" w:color="auto" w:fill="FFFFFF"/>
           </w:tcPr>
           <w:p>
@@ -1315,7 +1313,7 @@
                 <w:rFonts w:ascii="Arial" w:hAnsi="Arial" w:eastAsia="Arial" w:cs="Arial"/>
                 <w:sz w:val="21"/>
               </w:rPr>
-              <w:t>Number of amenities listed, in steps of ten</w:t>
+              <w:t>Amenities listed, in steps of ten</w:t>
             </w:r>
           </w:p>
         </w:tc>
@@ -1390,7 +1388,7 @@
         <w:rPr>
           <w:rFonts w:ascii="Arial" w:hAnsi="Arial" w:eastAsia="Arial" w:cs="Arial"/>
         </w:rPr>
-        <w:t xml:space="preserve"> drops price and minimum stay, which an unlisted home does not yet have.</w:t>
+        <w:t xml:space="preserve"> drops price and minimum stay to show what they add.</w:t>
       </w:r>
     </w:p>
     <w:p>
@@ -1430,7 +1428,7 @@
         <w:rPr>
           <w:rFonts w:ascii="Arial" w:hAnsi="Arial" w:eastAsia="Arial" w:cs="Arial"/>
         </w:rPr>
-        <w:t xml:space="preserve"> We ran 50 tests. Each builds the model from 70% of hosts and scores the homes of the other 30%, which it has never seen. In each priority group, each method picks a quarter of the test homes, and we compare the share that were busy.</w:t>
+        <w:t xml:space="preserve"> Each of 50 tests builds the model from 70% of hosts and scores the unseen homes of the other 30%. In each priority group, each method picks a quarter of the test homes, and we compare the share that were busy.</w:t>
       </w:r>
     </w:p>
     <w:p>
@@ -1457,6 +1455,7 @@
       <w:pPr>
         <w:pStyle w:val="Heading1"/>
         <w:keepNext/>
+        <w:pageBreakBefore w:val="0"/>
       </w:pPr>
       <w:r>
         <w:rPr>
@@ -1587,10 +1586,10 @@
         <w:tblLayout w:type="fixed"/>
       </w:tblPr>
       <w:tblGrid>
-        <w:gridCol w:w="5271"/>
-        <w:gridCol w:w="1698"/>
-        <w:gridCol w:w="1448"/>
-        <w:gridCol w:w="1448"/>
+        <w:gridCol w:w="5247"/>
+        <w:gridCol w:w="1812"/>
+        <w:gridCol w:w="1402"/>
+        <w:gridCol w:w="1402"/>
       </w:tblGrid>
       <w:tr>
         <w:trPr>
@@ -1599,7 +1598,7 @@
         </w:trPr>
         <w:tc>
           <w:tcPr>
-            <w:tcW w:type="dxa" w:w="5271"/>
+            <w:tcW w:type="dxa" w:w="5247"/>
             <w:shd w:val="clear" w:color="auto" w:fill="E9EEF3"/>
           </w:tcPr>
           <w:p>
@@ -1620,7 +1619,7 @@
         </w:tc>
         <w:tc>
           <w:tcPr>
-            <w:tcW w:type="dxa" w:w="1698"/>
+            <w:tcW w:type="dxa" w:w="1812"/>
             <w:shd w:val="clear" w:color="auto" w:fill="E9EEF3"/>
           </w:tcPr>
           <w:p>
@@ -1641,7 +1640,7 @@
         </w:tc>
         <w:tc>
           <w:tcPr>
-            <w:tcW w:type="dxa" w:w="1448"/>
+            <w:tcW w:type="dxa" w:w="1402"/>
             <w:shd w:val="clear" w:color="auto" w:fill="E9EEF3"/>
           </w:tcPr>
           <w:p>
@@ -1662,7 +1661,7 @@
         </w:tc>
         <w:tc>
           <w:tcPr>
-            <w:tcW w:type="dxa" w:w="1448"/>
+            <w:tcW w:type="dxa" w:w="1402"/>
             <w:shd w:val="clear" w:color="auto" w:fill="E9EEF3"/>
           </w:tcPr>
           <w:p>
@@ -1688,7 +1687,7 @@
         </w:trPr>
         <w:tc>
           <w:tcPr>
-            <w:tcW w:type="dxa" w:w="5271"/>
+            <w:tcW w:type="dxa" w:w="5247"/>
             <w:shd w:val="clear" w:color="auto" w:fill="FFFFFF"/>
           </w:tcPr>
           <w:p>
@@ -1708,7 +1707,7 @@
         </w:tc>
         <w:tc>
           <w:tcPr>
-            <w:tcW w:type="dxa" w:w="1698"/>
+            <w:tcW w:type="dxa" w:w="1812"/>
             <w:shd w:val="clear" w:color="auto" w:fill="FFFFFF"/>
           </w:tcPr>
           <w:p>
@@ -1728,7 +1727,7 @@
         </w:tc>
         <w:tc>
           <w:tcPr>
-            <w:tcW w:type="dxa" w:w="1448"/>
+            <w:tcW w:type="dxa" w:w="1402"/>
             <w:shd w:val="clear" w:color="auto" w:fill="FFFFFF"/>
           </w:tcPr>
           <w:p>
@@ -1748,7 +1747,7 @@
         </w:tc>
         <w:tc>
           <w:tcPr>
-            <w:tcW w:type="dxa" w:w="1448"/>
+            <w:tcW w:type="dxa" w:w="1402"/>
             <w:shd w:val="clear" w:color="auto" w:fill="FFFFFF"/>
           </w:tcPr>
           <w:p>
@@ -1773,7 +1772,7 @@
         </w:trPr>
         <w:tc>
           <w:tcPr>
-            <w:tcW w:type="dxa" w:w="5271"/>
+            <w:tcW w:type="dxa" w:w="5247"/>
             <w:shd w:val="clear" w:color="auto" w:fill="FFFFFF"/>
           </w:tcPr>
           <w:p>
@@ -1793,7 +1792,7 @@
         </w:tc>
         <w:tc>
           <w:tcPr>
-            <w:tcW w:type="dxa" w:w="1698"/>
+            <w:tcW w:type="dxa" w:w="1812"/>
             <w:shd w:val="clear" w:color="auto" w:fill="FFFFFF"/>
           </w:tcPr>
           <w:p>
@@ -1813,7 +1812,7 @@
         </w:tc>
         <w:tc>
           <w:tcPr>
-            <w:tcW w:type="dxa" w:w="1448"/>
+            <w:tcW w:type="dxa" w:w="1402"/>
             <w:shd w:val="clear" w:color="auto" w:fill="FFFFFF"/>
           </w:tcPr>
           <w:p>
@@ -1833,7 +1832,7 @@
         </w:tc>
         <w:tc>
           <w:tcPr>
-            <w:tcW w:type="dxa" w:w="1448"/>
+            <w:tcW w:type="dxa" w:w="1402"/>
             <w:shd w:val="clear" w:color="auto" w:fill="FFFFFF"/>
           </w:tcPr>
           <w:p>
@@ -1858,7 +1857,7 @@
         </w:trPr>
         <w:tc>
           <w:tcPr>
-            <w:tcW w:type="dxa" w:w="5271"/>
+            <w:tcW w:type="dxa" w:w="5247"/>
             <w:shd w:val="clear" w:color="auto" w:fill="FFFFFF"/>
           </w:tcPr>
           <w:p>
@@ -1878,7 +1877,7 @@
         </w:tc>
         <w:tc>
           <w:tcPr>
-            <w:tcW w:type="dxa" w:w="1698"/>
+            <w:tcW w:type="dxa" w:w="1812"/>
             <w:shd w:val="clear" w:color="auto" w:fill="FFFFFF"/>
           </w:tcPr>
           <w:p>
@@ -1898,7 +1897,7 @@
         </w:tc>
         <w:tc>
           <w:tcPr>
-            <w:tcW w:type="dxa" w:w="1448"/>
+            <w:tcW w:type="dxa" w:w="1402"/>
             <w:shd w:val="clear" w:color="auto" w:fill="FFFFFF"/>
           </w:tcPr>
           <w:p>
@@ -1918,7 +1917,7 @@
         </w:tc>
         <w:tc>
           <w:tcPr>
-            <w:tcW w:type="dxa" w:w="1448"/>
+            <w:tcW w:type="dxa" w:w="1402"/>
             <w:shd w:val="clear" w:color="auto" w:fill="FFFFFF"/>
           </w:tcPr>
           <w:p>
@@ -1943,7 +1942,7 @@
         </w:trPr>
         <w:tc>
           <w:tcPr>
-            <w:tcW w:type="dxa" w:w="5271"/>
+            <w:tcW w:type="dxa" w:w="5247"/>
             <w:shd w:val="clear" w:color="auto" w:fill="FFFFFF"/>
           </w:tcPr>
           <w:p>
@@ -1963,7 +1962,7 @@
         </w:tc>
         <w:tc>
           <w:tcPr>
-            <w:tcW w:type="dxa" w:w="1698"/>
+            <w:tcW w:type="dxa" w:w="1812"/>
             <w:shd w:val="clear" w:color="auto" w:fill="FFFFFF"/>
           </w:tcPr>
           <w:p>
@@ -1983,7 +1982,7 @@
         </w:tc>
         <w:tc>
           <w:tcPr>
-            <w:tcW w:type="dxa" w:w="1448"/>
+            <w:tcW w:type="dxa" w:w="1402"/>
             <w:shd w:val="clear" w:color="auto" w:fill="FFFFFF"/>
           </w:tcPr>
           <w:p>
@@ -2003,7 +2002,7 @@
         </w:tc>
         <w:tc>
           <w:tcPr>
-            <w:tcW w:type="dxa" w:w="1448"/>
+            <w:tcW w:type="dxa" w:w="1402"/>
             <w:shd w:val="clear" w:color="auto" w:fill="FFFFFF"/>
           </w:tcPr>
           <w:p>
@@ -2028,7 +2027,7 @@
         </w:trPr>
         <w:tc>
           <w:tcPr>
-            <w:tcW w:type="dxa" w:w="5271"/>
+            <w:tcW w:type="dxa" w:w="5247"/>
             <w:shd w:val="clear" w:color="auto" w:fill="FFFFFF"/>
           </w:tcPr>
           <w:p>
@@ -2048,7 +2047,7 @@
         </w:tc>
         <w:tc>
           <w:tcPr>
-            <w:tcW w:type="dxa" w:w="1698"/>
+            <w:tcW w:type="dxa" w:w="1812"/>
             <w:shd w:val="clear" w:color="auto" w:fill="FFFFFF"/>
           </w:tcPr>
           <w:p>
@@ -2068,7 +2067,7 @@
         </w:tc>
         <w:tc>
           <w:tcPr>
-            <w:tcW w:type="dxa" w:w="1448"/>
+            <w:tcW w:type="dxa" w:w="1402"/>
             <w:shd w:val="clear" w:color="auto" w:fill="FFFFFF"/>
           </w:tcPr>
           <w:p>
@@ -2088,7 +2087,7 @@
         </w:tc>
         <w:tc>
           <w:tcPr>
-            <w:tcW w:type="dxa" w:w="1448"/>
+            <w:tcW w:type="dxa" w:w="1402"/>
             <w:shd w:val="clear" w:color="auto" w:fill="FFFFFF"/>
           </w:tcPr>
           <w:p>
@@ -2113,7 +2112,7 @@
         </w:trPr>
         <w:tc>
           <w:tcPr>
-            <w:tcW w:type="dxa" w:w="5271"/>
+            <w:tcW w:type="dxa" w:w="5247"/>
             <w:shd w:val="clear" w:color="auto" w:fill="FFFFFF"/>
           </w:tcPr>
           <w:p>
@@ -2133,7 +2132,7 @@
         </w:tc>
         <w:tc>
           <w:tcPr>
-            <w:tcW w:type="dxa" w:w="1698"/>
+            <w:tcW w:type="dxa" w:w="1812"/>
             <w:shd w:val="clear" w:color="auto" w:fill="FFFFFF"/>
           </w:tcPr>
           <w:p>
@@ -2153,7 +2152,7 @@
         </w:tc>
         <w:tc>
           <w:tcPr>
-            <w:tcW w:type="dxa" w:w="1448"/>
+            <w:tcW w:type="dxa" w:w="1402"/>
             <w:shd w:val="clear" w:color="auto" w:fill="FFFFFF"/>
           </w:tcPr>
           <w:p>
@@ -2173,7 +2172,7 @@
         </w:tc>
         <w:tc>
           <w:tcPr>
-            <w:tcW w:type="dxa" w:w="1448"/>
+            <w:tcW w:type="dxa" w:w="1402"/>
             <w:shd w:val="clear" w:color="auto" w:fill="FFFFFF"/>
           </w:tcPr>
           <w:p>
@@ -2198,7 +2197,7 @@
         </w:trPr>
         <w:tc>
           <w:tcPr>
-            <w:tcW w:type="dxa" w:w="5271"/>
+            <w:tcW w:type="dxa" w:w="5247"/>
             <w:shd w:val="clear" w:color="auto" w:fill="FFFFFF"/>
           </w:tcPr>
           <w:p>
@@ -2218,7 +2217,7 @@
         </w:tc>
         <w:tc>
           <w:tcPr>
-            <w:tcW w:type="dxa" w:w="1698"/>
+            <w:tcW w:type="dxa" w:w="1812"/>
             <w:shd w:val="clear" w:color="auto" w:fill="FFFFFF"/>
           </w:tcPr>
           <w:p>
@@ -2238,7 +2237,7 @@
         </w:tc>
         <w:tc>
           <w:tcPr>
-            <w:tcW w:type="dxa" w:w="1448"/>
+            <w:tcW w:type="dxa" w:w="1402"/>
             <w:shd w:val="clear" w:color="auto" w:fill="FFFFFF"/>
           </w:tcPr>
           <w:p>
@@ -2258,7 +2257,7 @@
         </w:tc>
         <w:tc>
           <w:tcPr>
-            <w:tcW w:type="dxa" w:w="1448"/>
+            <w:tcW w:type="dxa" w:w="1402"/>
             <w:shd w:val="clear" w:color="auto" w:fill="FFFFFF"/>
           </w:tcPr>
           <w:p>
@@ -2283,7 +2282,7 @@
         </w:trPr>
         <w:tc>
           <w:tcPr>
-            <w:tcW w:type="dxa" w:w="5271"/>
+            <w:tcW w:type="dxa" w:w="5247"/>
             <w:shd w:val="clear" w:color="auto" w:fill="FFFFFF"/>
           </w:tcPr>
           <w:p>
@@ -2302,7 +2301,7 @@
         </w:tc>
         <w:tc>
           <w:tcPr>
-            <w:tcW w:type="dxa" w:w="1698"/>
+            <w:tcW w:type="dxa" w:w="1812"/>
             <w:shd w:val="clear" w:color="auto" w:fill="FFFFFF"/>
           </w:tcPr>
           <w:p>
@@ -2321,7 +2320,7 @@
         </w:tc>
         <w:tc>
           <w:tcPr>
-            <w:tcW w:type="dxa" w:w="1448"/>
+            <w:tcW w:type="dxa" w:w="1402"/>
             <w:shd w:val="clear" w:color="auto" w:fill="FFFFFF"/>
           </w:tcPr>
           <w:p>
@@ -2340,7 +2339,7 @@
         </w:tc>
         <w:tc>
           <w:tcPr>
-            <w:tcW w:type="dxa" w:w="1448"/>
+            <w:tcW w:type="dxa" w:w="1402"/>
             <w:shd w:val="clear" w:color="auto" w:fill="FFFFFF"/>
           </w:tcPr>
           <w:p>
@@ -2376,7 +2375,7 @@
         <w:rPr>
           <w:rFonts w:ascii="Arial" w:hAnsi="Arial" w:eastAsia="Arial" w:cs="Arial"/>
         </w:rPr>
-        <w:t>Busy homes were slightly cheaper and listed about as many amenities (Table 3). They were far more likely to accept one-night stays and to be in the City of Melbourne, and none of the 165 homes requiring seven nights or more was busy. Their estimated revenue was 3.5 times higher, but it is built from reviews, and 255 nights is Inside Airbnb's cap.</w:t>
+        <w:t>Busy homes were slightly cheaper and listed about as many amenities (Table 3). They were far more likely to accept one-night stays and to be in the City of Melbourne, and no home requiring seven nights or more was busy. Their estimated revenue was 3.5 times higher, but it is built from reviews.</w:t>
       </w:r>
     </w:p>
     <w:p>
@@ -2401,7 +2400,7 @@
         <w:rPr>
           <w:rFonts w:ascii="Arial" w:hAnsi="Arial" w:eastAsia="Arial" w:cs="Arial"/>
         </w:rPr>
-        <w:t>Group rates range from 8.2% to 36.6% against 25.3% overall (Figure 2). City of Melbourne three-bedroom apartments lead at 36.6% (112 of 306 homes), followed by City two-bedroom apartments at 32.8% (405 of 1,235) and Yarra Ranges three-bedroom houses and townhouses at 30.0% (27 of 90).</w:t>
+        <w:t>Group rates range from 8.2% to 36.6% against 25.3% overall (Figure 2). City of Melbourne three-bedroom apartments lead at 36.6%, followed by City two-bedroom apartments at 32.8% and Yarra Ranges three-bedroom houses at 30.0% (Table 4).</w:t>
       </w:r>
     </w:p>
     <w:p>
@@ -2414,7 +2413,7 @@
       <w:r>
         <w:drawing>
           <wp:inline xmlns:a="http://schemas.openxmlformats.org/drawingml/2006/main" xmlns:pic="http://schemas.openxmlformats.org/drawingml/2006/picture">
-            <wp:extent cx="6035040" cy="4212182"/>
+            <wp:extent cx="6035040" cy="3880533"/>
             <wp:docPr id="2" name="Picture 2"/>
             <wp:cNvGraphicFramePr>
               <a:graphicFrameLocks noChangeAspect="1"/>
@@ -2435,7 +2434,7 @@
                   <pic:spPr>
                     <a:xfrm>
                       <a:off x="0" y="0"/>
-                      <a:ext cx="6035040" cy="4212182"/>
+                      <a:ext cx="6035040" cy="3880533"/>
                     </a:xfrm>
                     <a:prstGeom prst="rect"/>
                   </pic:spPr>
@@ -2476,7 +2475,7 @@
           <w:rFonts w:ascii="Arial" w:hAnsi="Arial" w:eastAsia="Arial" w:cs="Arial"/>
           <w:b/>
         </w:rPr>
-        <w:t>Table 4. The three priority groups in nights and dollars</w:t>
+        <w:t>Table 4. Priority groups: estimated nights and revenue</w:t>
       </w:r>
     </w:p>
     <w:tbl>
@@ -2501,13 +2500,14 @@
         <w:tblLayout w:type="fixed"/>
       </w:tblPr>
       <w:tblGrid>
-        <w:gridCol w:w="2370"/>
-        <w:gridCol w:w="995"/>
-        <w:gridCol w:w="995"/>
-        <w:gridCol w:w="1052"/>
-        <w:gridCol w:w="1120"/>
-        <w:gridCol w:w="1677"/>
-        <w:gridCol w:w="1654"/>
+        <w:gridCol w:w="1717"/>
+        <w:gridCol w:w="978"/>
+        <w:gridCol w:w="878"/>
+        <w:gridCol w:w="1169"/>
+        <w:gridCol w:w="1141"/>
+        <w:gridCol w:w="1311"/>
+        <w:gridCol w:w="1286"/>
+        <w:gridCol w:w="1382"/>
       </w:tblGrid>
       <w:tr>
         <w:trPr>
@@ -2516,7 +2516,7 @@
         </w:trPr>
         <w:tc>
           <w:tcPr>
-            <w:tcW w:type="dxa" w:w="2370"/>
+            <w:tcW w:type="dxa" w:w="1717"/>
             <w:shd w:val="clear" w:color="auto" w:fill="E9EEF3"/>
           </w:tcPr>
           <w:p>
@@ -2537,7 +2537,7 @@
         </w:tc>
         <w:tc>
           <w:tcPr>
-            <w:tcW w:type="dxa" w:w="995"/>
+            <w:tcW w:type="dxa" w:w="978"/>
             <w:shd w:val="clear" w:color="auto" w:fill="E9EEF3"/>
           </w:tcPr>
           <w:p>
@@ -2558,7 +2558,7 @@
         </w:tc>
         <w:tc>
           <w:tcPr>
-            <w:tcW w:type="dxa" w:w="995"/>
+            <w:tcW w:type="dxa" w:w="878"/>
             <w:shd w:val="clear" w:color="auto" w:fill="E9EEF3"/>
           </w:tcPr>
           <w:p>
@@ -2579,7 +2579,7 @@
         </w:tc>
         <w:tc>
           <w:tcPr>
-            <w:tcW w:type="dxa" w:w="1052"/>
+            <w:tcW w:type="dxa" w:w="1169"/>
             <w:shd w:val="clear" w:color="auto" w:fill="E9EEF3"/>
           </w:tcPr>
           <w:p>
@@ -2594,13 +2594,13 @@
                 <w:b/>
                 <w:sz w:val="21"/>
               </w:rPr>
-              <w:t>Median price (AUD a night)</w:t>
+              <w:t>Median price per night (AUD)</w:t>
             </w:r>
           </w:p>
         </w:tc>
         <w:tc>
           <w:tcPr>
-            <w:tcW w:type="dxa" w:w="1120"/>
+            <w:tcW w:type="dxa" w:w="1141"/>
             <w:shd w:val="clear" w:color="auto" w:fill="E9EEF3"/>
           </w:tcPr>
           <w:p>
@@ -2615,13 +2615,13 @@
                 <w:b/>
                 <w:sz w:val="21"/>
               </w:rPr>
-              <w:t>Accept one night</w:t>
+              <w:t>Median nights booked</w:t>
             </w:r>
           </w:p>
         </w:tc>
         <w:tc>
           <w:tcPr>
-            <w:tcW w:type="dxa" w:w="1677"/>
+            <w:tcW w:type="dxa" w:w="1311"/>
             <w:shd w:val="clear" w:color="auto" w:fill="E9EEF3"/>
           </w:tcPr>
           <w:p>
@@ -2636,13 +2636,13 @@
                 <w:b/>
                 <w:sz w:val="21"/>
               </w:rPr>
-              <w:t>Median nights booked (estimated)</w:t>
+              <w:t>Median revenue a year (AUD)</w:t>
             </w:r>
           </w:p>
         </w:tc>
         <w:tc>
           <w:tcPr>
-            <w:tcW w:type="dxa" w:w="1654"/>
+            <w:tcW w:type="dxa" w:w="1286"/>
             <w:shd w:val="clear" w:color="auto" w:fill="E9EEF3"/>
           </w:tcPr>
           <w:p>
@@ -2657,7 +2657,28 @@
                 <w:b/>
                 <w:sz w:val="21"/>
               </w:rPr>
-              <w:t>Median revenue (AUD a year, estimated)</w:t>
+              <w:t>Revenue rank (of 14)</w:t>
+            </w:r>
+          </w:p>
+        </w:tc>
+        <w:tc>
+          <w:tcPr>
+            <w:tcW w:type="dxa" w:w="1382"/>
+            <w:shd w:val="clear" w:color="auto" w:fill="E9EEF3"/>
+          </w:tcPr>
+          <w:p>
+            <w:pPr>
+              <w:keepNext/>
+              <w:spacing w:before="40" w:after="40" w:line="240" w:lineRule="auto"/>
+              <w:jc w:val="left"/>
+            </w:pPr>
+            <w:r>
+              <w:rPr>
+                <w:rFonts w:ascii="Arial" w:hAnsi="Arial" w:eastAsia="Arial" w:cs="Arial"/>
+                <w:b/>
+                <w:sz w:val="21"/>
+              </w:rPr>
+              <w:t>Median revenue a year, homes below target (AUD)</w:t>
             </w:r>
           </w:p>
         </w:tc>
@@ -2668,7 +2689,7 @@
         </w:trPr>
         <w:tc>
           <w:tcPr>
-            <w:tcW w:type="dxa" w:w="2370"/>
+            <w:tcW w:type="dxa" w:w="1717"/>
             <w:shd w:val="clear" w:color="auto" w:fill="FFFFFF"/>
           </w:tcPr>
           <w:p>
@@ -2682,13 +2703,13 @@
                 <w:rFonts w:ascii="Arial" w:hAnsi="Arial" w:eastAsia="Arial" w:cs="Arial"/>
                 <w:sz w:val="21"/>
               </w:rPr>
-              <w:t>City · 3-bed apartments</w:t>
+              <w:t>City 3-bed apartments</w:t>
             </w:r>
           </w:p>
         </w:tc>
         <w:tc>
           <w:tcPr>
-            <w:tcW w:type="dxa" w:w="995"/>
+            <w:tcW w:type="dxa" w:w="978"/>
             <w:shd w:val="clear" w:color="auto" w:fill="FFFFFF"/>
           </w:tcPr>
           <w:p>
@@ -2708,7 +2729,7 @@
         </w:tc>
         <w:tc>
           <w:tcPr>
-            <w:tcW w:type="dxa" w:w="995"/>
+            <w:tcW w:type="dxa" w:w="878"/>
             <w:shd w:val="clear" w:color="auto" w:fill="FFFFFF"/>
           </w:tcPr>
           <w:p>
@@ -2728,7 +2749,7 @@
         </w:tc>
         <w:tc>
           <w:tcPr>
-            <w:tcW w:type="dxa" w:w="1052"/>
+            <w:tcW w:type="dxa" w:w="1169"/>
             <w:shd w:val="clear" w:color="auto" w:fill="FFFFFF"/>
           </w:tcPr>
           <w:p>
@@ -2748,27 +2769,7 @@
         </w:tc>
         <w:tc>
           <w:tcPr>
-            <w:tcW w:type="dxa" w:w="1120"/>
-            <w:shd w:val="clear" w:color="auto" w:fill="FFFFFF"/>
-          </w:tcPr>
-          <w:p>
-            <w:pPr>
-              <w:keepNext/>
-              <w:spacing w:before="40" w:after="40" w:line="240" w:lineRule="auto"/>
-              <w:jc w:val="right"/>
-            </w:pPr>
-            <w:r>
-              <w:rPr>
-                <w:rFonts w:ascii="Arial" w:hAnsi="Arial" w:eastAsia="Arial" w:cs="Arial"/>
-                <w:sz w:val="21"/>
-              </w:rPr>
-              <w:t>58.8%</w:t>
-            </w:r>
-          </w:p>
-        </w:tc>
-        <w:tc>
-          <w:tcPr>
-            <w:tcW w:type="dxa" w:w="1677"/>
+            <w:tcW w:type="dxa" w:w="1141"/>
             <w:shd w:val="clear" w:color="auto" w:fill="FFFFFF"/>
           </w:tcPr>
           <w:p>
@@ -2788,7 +2789,7 @@
         </w:tc>
         <w:tc>
           <w:tcPr>
-            <w:tcW w:type="dxa" w:w="1654"/>
+            <w:tcW w:type="dxa" w:w="1311"/>
             <w:shd w:val="clear" w:color="auto" w:fill="FFFFFF"/>
           </w:tcPr>
           <w:p>
@@ -2806,6 +2807,46 @@
             </w:r>
           </w:p>
         </w:tc>
+        <w:tc>
+          <w:tcPr>
+            <w:tcW w:type="dxa" w:w="1286"/>
+            <w:shd w:val="clear" w:color="auto" w:fill="FFFFFF"/>
+          </w:tcPr>
+          <w:p>
+            <w:pPr>
+              <w:keepNext/>
+              <w:spacing w:before="40" w:after="40" w:line="240" w:lineRule="auto"/>
+              <w:jc w:val="right"/>
+            </w:pPr>
+            <w:r>
+              <w:rPr>
+                <w:rFonts w:ascii="Arial" w:hAnsi="Arial" w:eastAsia="Arial" w:cs="Arial"/>
+                <w:sz w:val="21"/>
+              </w:rPr>
+              <w:t>1</w:t>
+            </w:r>
+          </w:p>
+        </w:tc>
+        <w:tc>
+          <w:tcPr>
+            <w:tcW w:type="dxa" w:w="1382"/>
+            <w:shd w:val="clear" w:color="auto" w:fill="FFFFFF"/>
+          </w:tcPr>
+          <w:p>
+            <w:pPr>
+              <w:keepNext/>
+              <w:spacing w:before="40" w:after="40" w:line="240" w:lineRule="auto"/>
+              <w:jc w:val="right"/>
+            </w:pPr>
+            <w:r>
+              <w:rPr>
+                <w:rFonts w:ascii="Arial" w:hAnsi="Arial" w:eastAsia="Arial" w:cs="Arial"/>
+                <w:sz w:val="21"/>
+              </w:rPr>
+              <w:t>32,100</w:t>
+            </w:r>
+          </w:p>
+        </w:tc>
       </w:tr>
       <w:tr>
         <w:trPr>
@@ -2813,7 +2854,7 @@
         </w:trPr>
         <w:tc>
           <w:tcPr>
-            <w:tcW w:type="dxa" w:w="2370"/>
+            <w:tcW w:type="dxa" w:w="1717"/>
             <w:shd w:val="clear" w:color="auto" w:fill="FFFFFF"/>
           </w:tcPr>
           <w:p>
@@ -2827,13 +2868,13 @@
                 <w:rFonts w:ascii="Arial" w:hAnsi="Arial" w:eastAsia="Arial" w:cs="Arial"/>
                 <w:sz w:val="21"/>
               </w:rPr>
-              <w:t>City · 2-bed apartments</w:t>
+              <w:t>City 2-bed apartments</w:t>
             </w:r>
           </w:p>
         </w:tc>
         <w:tc>
           <w:tcPr>
-            <w:tcW w:type="dxa" w:w="995"/>
+            <w:tcW w:type="dxa" w:w="978"/>
             <w:shd w:val="clear" w:color="auto" w:fill="FFFFFF"/>
           </w:tcPr>
           <w:p>
@@ -2853,7 +2894,7 @@
         </w:tc>
         <w:tc>
           <w:tcPr>
-            <w:tcW w:type="dxa" w:w="995"/>
+            <w:tcW w:type="dxa" w:w="878"/>
             <w:shd w:val="clear" w:color="auto" w:fill="FFFFFF"/>
           </w:tcPr>
           <w:p>
@@ -2873,7 +2914,7 @@
         </w:tc>
         <w:tc>
           <w:tcPr>
-            <w:tcW w:type="dxa" w:w="1052"/>
+            <w:tcW w:type="dxa" w:w="1169"/>
             <w:shd w:val="clear" w:color="auto" w:fill="FFFFFF"/>
           </w:tcPr>
           <w:p>
@@ -2893,27 +2934,7 @@
         </w:tc>
         <w:tc>
           <w:tcPr>
-            <w:tcW w:type="dxa" w:w="1120"/>
-            <w:shd w:val="clear" w:color="auto" w:fill="FFFFFF"/>
-          </w:tcPr>
-          <w:p>
-            <w:pPr>
-              <w:keepNext/>
-              <w:spacing w:before="40" w:after="40" w:line="240" w:lineRule="auto"/>
-              <w:jc w:val="right"/>
-            </w:pPr>
-            <w:r>
-              <w:rPr>
-                <w:rFonts w:ascii="Arial" w:hAnsi="Arial" w:eastAsia="Arial" w:cs="Arial"/>
-                <w:sz w:val="21"/>
-              </w:rPr>
-              <w:t>59.8%</w:t>
-            </w:r>
-          </w:p>
-        </w:tc>
-        <w:tc>
-          <w:tcPr>
-            <w:tcW w:type="dxa" w:w="1677"/>
+            <w:tcW w:type="dxa" w:w="1141"/>
             <w:shd w:val="clear" w:color="auto" w:fill="FFFFFF"/>
           </w:tcPr>
           <w:p>
@@ -2933,7 +2954,7 @@
         </w:tc>
         <w:tc>
           <w:tcPr>
-            <w:tcW w:type="dxa" w:w="1654"/>
+            <w:tcW w:type="dxa" w:w="1311"/>
             <w:shd w:val="clear" w:color="auto" w:fill="FFFFFF"/>
           </w:tcPr>
           <w:p>
@@ -2951,6 +2972,46 @@
             </w:r>
           </w:p>
         </w:tc>
+        <w:tc>
+          <w:tcPr>
+            <w:tcW w:type="dxa" w:w="1286"/>
+            <w:shd w:val="clear" w:color="auto" w:fill="FFFFFF"/>
+          </w:tcPr>
+          <w:p>
+            <w:pPr>
+              <w:keepNext/>
+              <w:spacing w:before="40" w:after="40" w:line="240" w:lineRule="auto"/>
+              <w:jc w:val="right"/>
+            </w:pPr>
+            <w:r>
+              <w:rPr>
+                <w:rFonts w:ascii="Arial" w:hAnsi="Arial" w:eastAsia="Arial" w:cs="Arial"/>
+                <w:sz w:val="21"/>
+              </w:rPr>
+              <w:t>5</w:t>
+            </w:r>
+          </w:p>
+        </w:tc>
+        <w:tc>
+          <w:tcPr>
+            <w:tcW w:type="dxa" w:w="1382"/>
+            <w:shd w:val="clear" w:color="auto" w:fill="FFFFFF"/>
+          </w:tcPr>
+          <w:p>
+            <w:pPr>
+              <w:keepNext/>
+              <w:spacing w:before="40" w:after="40" w:line="240" w:lineRule="auto"/>
+              <w:jc w:val="right"/>
+            </w:pPr>
+            <w:r>
+              <w:rPr>
+                <w:rFonts w:ascii="Arial" w:hAnsi="Arial" w:eastAsia="Arial" w:cs="Arial"/>
+                <w:sz w:val="21"/>
+              </w:rPr>
+              <w:t>16,600</w:t>
+            </w:r>
+          </w:p>
+        </w:tc>
       </w:tr>
       <w:tr>
         <w:trPr>
@@ -2958,7 +3019,7 @@
         </w:trPr>
         <w:tc>
           <w:tcPr>
-            <w:tcW w:type="dxa" w:w="2370"/>
+            <w:tcW w:type="dxa" w:w="1717"/>
             <w:shd w:val="clear" w:color="auto" w:fill="FFFFFF"/>
           </w:tcPr>
           <w:p>
@@ -2972,13 +3033,13 @@
                 <w:rFonts w:ascii="Arial" w:hAnsi="Arial" w:eastAsia="Arial" w:cs="Arial"/>
                 <w:sz w:val="21"/>
               </w:rPr>
-              <w:t>Yarra Ranges · 3-bed houses</w:t>
+              <w:t>Yarra Ranges 3-bed houses</w:t>
             </w:r>
           </w:p>
         </w:tc>
         <w:tc>
           <w:tcPr>
-            <w:tcW w:type="dxa" w:w="995"/>
+            <w:tcW w:type="dxa" w:w="978"/>
             <w:shd w:val="clear" w:color="auto" w:fill="FFFFFF"/>
           </w:tcPr>
           <w:p>
@@ -2998,7 +3059,7 @@
         </w:tc>
         <w:tc>
           <w:tcPr>
-            <w:tcW w:type="dxa" w:w="995"/>
+            <w:tcW w:type="dxa" w:w="878"/>
             <w:shd w:val="clear" w:color="auto" w:fill="FFFFFF"/>
           </w:tcPr>
           <w:p>
@@ -3018,7 +3079,7 @@
         </w:tc>
         <w:tc>
           <w:tcPr>
-            <w:tcW w:type="dxa" w:w="1052"/>
+            <w:tcW w:type="dxa" w:w="1169"/>
             <w:shd w:val="clear" w:color="auto" w:fill="FFFFFF"/>
           </w:tcPr>
           <w:p>
@@ -3038,27 +3099,7 @@
         </w:tc>
         <w:tc>
           <w:tcPr>
-            <w:tcW w:type="dxa" w:w="1120"/>
-            <w:shd w:val="clear" w:color="auto" w:fill="FFFFFF"/>
-          </w:tcPr>
-          <w:p>
-            <w:pPr>
-              <w:keepNext/>
-              <w:spacing w:before="40" w:after="40" w:line="240" w:lineRule="auto"/>
-              <w:jc w:val="right"/>
-            </w:pPr>
-            <w:r>
-              <w:rPr>
-                <w:rFonts w:ascii="Arial" w:hAnsi="Arial" w:eastAsia="Arial" w:cs="Arial"/>
-                <w:sz w:val="21"/>
-              </w:rPr>
-              <w:t>22.2%</w:t>
-            </w:r>
-          </w:p>
-        </w:tc>
-        <w:tc>
-          <w:tcPr>
-            <w:tcW w:type="dxa" w:w="1677"/>
+            <w:tcW w:type="dxa" w:w="1141"/>
             <w:shd w:val="clear" w:color="auto" w:fill="FFFFFF"/>
           </w:tcPr>
           <w:p>
@@ -3078,7 +3119,7 @@
         </w:tc>
         <w:tc>
           <w:tcPr>
-            <w:tcW w:type="dxa" w:w="1654"/>
+            <w:tcW w:type="dxa" w:w="1311"/>
             <w:shd w:val="clear" w:color="auto" w:fill="FFFFFF"/>
           </w:tcPr>
           <w:p>
@@ -3096,6 +3137,46 @@
             </w:r>
           </w:p>
         </w:tc>
+        <w:tc>
+          <w:tcPr>
+            <w:tcW w:type="dxa" w:w="1286"/>
+            <w:shd w:val="clear" w:color="auto" w:fill="FFFFFF"/>
+          </w:tcPr>
+          <w:p>
+            <w:pPr>
+              <w:keepNext/>
+              <w:spacing w:before="40" w:after="40" w:line="240" w:lineRule="auto"/>
+              <w:jc w:val="right"/>
+            </w:pPr>
+            <w:r>
+              <w:rPr>
+                <w:rFonts w:ascii="Arial" w:hAnsi="Arial" w:eastAsia="Arial" w:cs="Arial"/>
+                <w:sz w:val="21"/>
+              </w:rPr>
+              <w:t>2</w:t>
+            </w:r>
+          </w:p>
+        </w:tc>
+        <w:tc>
+          <w:tcPr>
+            <w:tcW w:type="dxa" w:w="1382"/>
+            <w:shd w:val="clear" w:color="auto" w:fill="FFFFFF"/>
+          </w:tcPr>
+          <w:p>
+            <w:pPr>
+              <w:keepNext/>
+              <w:spacing w:before="40" w:after="40" w:line="240" w:lineRule="auto"/>
+              <w:jc w:val="right"/>
+            </w:pPr>
+            <w:r>
+              <w:rPr>
+                <w:rFonts w:ascii="Arial" w:hAnsi="Arial" w:eastAsia="Arial" w:cs="Arial"/>
+                <w:sz w:val="21"/>
+              </w:rPr>
+              <w:t>31,100</w:t>
+            </w:r>
+          </w:p>
+        </w:tc>
       </w:tr>
       <w:tr>
         <w:trPr>
@@ -3103,7 +3184,7 @@
         </w:trPr>
         <w:tc>
           <w:tcPr>
-            <w:tcW w:type="dxa" w:w="2370"/>
+            <w:tcW w:type="dxa" w:w="1717"/>
             <w:shd w:val="clear" w:color="auto" w:fill="FFFFFF"/>
           </w:tcPr>
           <w:p>
@@ -3122,7 +3203,7 @@
         </w:tc>
         <w:tc>
           <w:tcPr>
-            <w:tcW w:type="dxa" w:w="995"/>
+            <w:tcW w:type="dxa" w:w="978"/>
             <w:shd w:val="clear" w:color="auto" w:fill="FFFFFF"/>
           </w:tcPr>
           <w:p>
@@ -3141,7 +3222,7 @@
         </w:tc>
         <w:tc>
           <w:tcPr>
-            <w:tcW w:type="dxa" w:w="995"/>
+            <w:tcW w:type="dxa" w:w="878"/>
             <w:shd w:val="clear" w:color="auto" w:fill="FFFFFF"/>
           </w:tcPr>
           <w:p>
@@ -3160,7 +3241,7 @@
         </w:tc>
         <w:tc>
           <w:tcPr>
-            <w:tcW w:type="dxa" w:w="1052"/>
+            <w:tcW w:type="dxa" w:w="1169"/>
             <w:shd w:val="clear" w:color="auto" w:fill="FFFFFF"/>
           </w:tcPr>
           <w:p>
@@ -3179,26 +3260,7 @@
         </w:tc>
         <w:tc>
           <w:tcPr>
-            <w:tcW w:type="dxa" w:w="1120"/>
-            <w:shd w:val="clear" w:color="auto" w:fill="FFFFFF"/>
-          </w:tcPr>
-          <w:p>
-            <w:pPr>
-              <w:spacing w:before="40" w:after="40" w:line="240" w:lineRule="auto"/>
-              <w:jc w:val="right"/>
-            </w:pPr>
-            <w:r>
-              <w:rPr>
-                <w:rFonts w:ascii="Arial" w:hAnsi="Arial" w:eastAsia="Arial" w:cs="Arial"/>
-                <w:sz w:val="21"/>
-              </w:rPr>
-              <w:t>45.1%</w:t>
-            </w:r>
-          </w:p>
-        </w:tc>
-        <w:tc>
-          <w:tcPr>
-            <w:tcW w:type="dxa" w:w="1677"/>
+            <w:tcW w:type="dxa" w:w="1141"/>
             <w:shd w:val="clear" w:color="auto" w:fill="FFFFFF"/>
           </w:tcPr>
           <w:p>
@@ -3217,7 +3279,7 @@
         </w:tc>
         <w:tc>
           <w:tcPr>
-            <w:tcW w:type="dxa" w:w="1654"/>
+            <w:tcW w:type="dxa" w:w="1311"/>
             <w:shd w:val="clear" w:color="auto" w:fill="FFFFFF"/>
           </w:tcPr>
           <w:p>
@@ -3231,6 +3293,44 @@
                 <w:sz w:val="21"/>
               </w:rPr>
               <w:t>24,700</w:t>
+            </w:r>
+          </w:p>
+        </w:tc>
+        <w:tc>
+          <w:tcPr>
+            <w:tcW w:type="dxa" w:w="1286"/>
+            <w:shd w:val="clear" w:color="auto" w:fill="FFFFFF"/>
+          </w:tcPr>
+          <w:p>
+            <w:pPr>
+              <w:spacing w:before="40" w:after="40" w:line="240" w:lineRule="auto"/>
+              <w:jc w:val="right"/>
+            </w:pPr>
+            <w:r>
+              <w:rPr>
+                <w:rFonts w:ascii="Arial" w:hAnsi="Arial" w:eastAsia="Arial" w:cs="Arial"/>
+                <w:sz w:val="21"/>
+              </w:rPr>
+              <w:t>–</w:t>
+            </w:r>
+          </w:p>
+        </w:tc>
+        <w:tc>
+          <w:tcPr>
+            <w:tcW w:type="dxa" w:w="1382"/>
+            <w:shd w:val="clear" w:color="auto" w:fill="FFFFFF"/>
+          </w:tcPr>
+          <w:p>
+            <w:pPr>
+              <w:spacing w:before="40" w:after="40" w:line="240" w:lineRule="auto"/>
+              <w:jc w:val="right"/>
+            </w:pPr>
+            <w:r>
+              <w:rPr>
+                <w:rFonts w:ascii="Arial" w:hAnsi="Arial" w:eastAsia="Arial" w:cs="Arial"/>
+                <w:sz w:val="21"/>
+              </w:rPr>
+              <w:t>16,600</w:t>
             </w:r>
           </w:p>
         </w:tc>
@@ -3253,7 +3353,27 @@
         <w:rPr>
           <w:rFonts w:ascii="Arial" w:hAnsi="Arial" w:eastAsia="Arial" w:cs="Arial"/>
         </w:rPr>
-        <w:t>Each priority group's estimated revenue beats the all-group median, although City two-bedroom apartments rank only fifth of 14 (Table 4); prices are advertised nightly rates, not rents. The same three groups lead when the price rule or the review-history rule is removed. The two City groups are the most reliable, staying in the top three in 94% and 90% of 1,000 host redraws; Yarra Ranges houses did so in only 64%, a less certain second option.</w:t>
+        <w:t>The same three groups lead when the price rule or the review-history rule is removed. The two City groups are the most reliable, staying in the top three in 94% and 90% of 1,000 host redraws; Yarra Ranges houses did so in only 64%, a less certain second option.</w:t>
+      </w:r>
+    </w:p>
+    <w:p>
+      <w:pPr>
+        <w:widowControl/>
+        <w:spacing w:after="120" w:line="259" w:lineRule="auto"/>
+        <w:jc w:val="left"/>
+      </w:pPr>
+      <w:r>
+        <w:rPr>
+          <w:rFonts w:ascii="Arial" w:hAnsi="Arial" w:eastAsia="Arial" w:cs="Arial"/>
+          <w:b/>
+        </w:rPr>
+        <w:t>When the two rankings differ.</w:t>
+      </w:r>
+      <w:r>
+        <w:rPr>
+          <w:rFonts w:ascii="Arial" w:hAnsi="Arial" w:eastAsia="Arial" w:cs="Arial"/>
+        </w:rPr>
+        <w:t xml:space="preserve"> On revenue, Yarra Ranges houses rank second and City two-bedroom apartments fifth, mainly because the houses charge more a night (AUD 426 against 285). Since revenue rewards price and rents are unknown, we use activity to choose where to search and revenue to test each lease (Recommendation 3). Between leases that pass, choose the larger margin of typical revenue over costs; if margins are similar, choose the group with the higher share of busy homes.</w:t>
       </w:r>
     </w:p>
     <w:p>
@@ -3278,7 +3398,7 @@
         <w:rPr>
           <w:rFonts w:ascii="Arial" w:hAnsi="Arial" w:eastAsia="Arial" w:cs="Arial"/>
         </w:rPr>
-        <w:t>Picking a quarter of homes within each priority group, the full model found busy homes 49.6% of the time, against 38.6% for the reduced model and 32.4% for random picking (Figure 3). That is five busy homes instead of three in a list of ten.</w:t>
+        <w:t>Picking a quarter of each priority group, the full model found busy homes 49.6% of the time, against 38.6% for the reduced model and 32.4% for random picking (Figure 3). That is five busy homes in ten, not three.</w:t>
       </w:r>
     </w:p>
     <w:p>
@@ -3364,7 +3484,7 @@
         <w:rPr>
           <w:rFonts w:ascii="Arial" w:hAnsi="Arial" w:eastAsia="Arial" w:cs="Arial"/>
         </w:rPr>
-        <w:t>Table 5 splits hosts into five parts, scores each home with a model built from the other four, and picks the top quarter overall. Of picked homes, 43.7% were busy (the hit rate, or precision), against 25.3% of all homes; the picks found 43.1% of all busy homes (recall). Accuracy misleads: the model is right 71.5% of the time, yet calling every home "below target" scores 74.7% and finds no busy home.</w:t>
+        <w:t>Table 5 splits hosts into five parts and scores each home with a model built from the other four. Of picked homes, 43.7% were busy (the hit rate, or precision), against 25.3% of all homes; the picks found 43.1% of all busy homes (recall). Accuracy misleads: the model is right 71.5% of the time, yet calling every home "below target" scores 74.7% and finds no busy home.</w:t>
       </w:r>
     </w:p>
     <w:p>
@@ -3404,10 +3524,10 @@
         <w:tblLayout w:type="fixed"/>
       </w:tblPr>
       <w:tblGrid>
-        <w:gridCol w:w="4400"/>
-        <w:gridCol w:w="1390"/>
-        <w:gridCol w:w="2100"/>
-        <w:gridCol w:w="1975"/>
+        <w:gridCol w:w="4239"/>
+        <w:gridCol w:w="1437"/>
+        <w:gridCol w:w="2166"/>
+        <w:gridCol w:w="2021"/>
       </w:tblGrid>
       <w:tr>
         <w:trPr>
@@ -3416,7 +3536,7 @@
         </w:trPr>
         <w:tc>
           <w:tcPr>
-            <w:tcW w:type="dxa" w:w="4400"/>
+            <w:tcW w:type="dxa" w:w="4239"/>
             <w:shd w:val="clear" w:color="auto" w:fill="E9EEF3"/>
           </w:tcPr>
           <w:p>
@@ -3429,7 +3549,7 @@
         </w:tc>
         <w:tc>
           <w:tcPr>
-            <w:tcW w:type="dxa" w:w="1390"/>
+            <w:tcW w:type="dxa" w:w="1437"/>
             <w:shd w:val="clear" w:color="auto" w:fill="E9EEF3"/>
           </w:tcPr>
           <w:p>
@@ -3450,7 +3570,7 @@
         </w:tc>
         <w:tc>
           <w:tcPr>
-            <w:tcW w:type="dxa" w:w="2100"/>
+            <w:tcW w:type="dxa" w:w="2166"/>
             <w:shd w:val="clear" w:color="auto" w:fill="E9EEF3"/>
           </w:tcPr>
           <w:p>
@@ -3471,7 +3591,7 @@
         </w:tc>
         <w:tc>
           <w:tcPr>
-            <w:tcW w:type="dxa" w:w="1975"/>
+            <w:tcW w:type="dxa" w:w="2021"/>
             <w:shd w:val="clear" w:color="auto" w:fill="E9EEF3"/>
           </w:tcPr>
           <w:p>
@@ -3497,7 +3617,7 @@
         </w:trPr>
         <w:tc>
           <w:tcPr>
-            <w:tcW w:type="dxa" w:w="4400"/>
+            <w:tcW w:type="dxa" w:w="4239"/>
             <w:shd w:val="clear" w:color="auto" w:fill="FFFFFF"/>
           </w:tcPr>
           <w:p>
@@ -3517,7 +3637,7 @@
         </w:tc>
         <w:tc>
           <w:tcPr>
-            <w:tcW w:type="dxa" w:w="1390"/>
+            <w:tcW w:type="dxa" w:w="1437"/>
             <w:shd w:val="clear" w:color="auto" w:fill="FFFFFF"/>
           </w:tcPr>
           <w:p>
@@ -3537,7 +3657,7 @@
         </w:tc>
         <w:tc>
           <w:tcPr>
-            <w:tcW w:type="dxa" w:w="2100"/>
+            <w:tcW w:type="dxa" w:w="2166"/>
             <w:shd w:val="clear" w:color="auto" w:fill="FFFFFF"/>
           </w:tcPr>
           <w:p>
@@ -3557,7 +3677,7 @@
         </w:tc>
         <w:tc>
           <w:tcPr>
-            <w:tcW w:type="dxa" w:w="1975"/>
+            <w:tcW w:type="dxa" w:w="2021"/>
             <w:shd w:val="clear" w:color="auto" w:fill="FFFFFF"/>
           </w:tcPr>
           <w:p>
@@ -3582,7 +3702,7 @@
         </w:trPr>
         <w:tc>
           <w:tcPr>
-            <w:tcW w:type="dxa" w:w="4400"/>
+            <w:tcW w:type="dxa" w:w="4239"/>
             <w:shd w:val="clear" w:color="auto" w:fill="FFFFFF"/>
           </w:tcPr>
           <w:p>
@@ -3601,7 +3721,7 @@
         </w:tc>
         <w:tc>
           <w:tcPr>
-            <w:tcW w:type="dxa" w:w="1390"/>
+            <w:tcW w:type="dxa" w:w="1437"/>
             <w:shd w:val="clear" w:color="auto" w:fill="FFFFFF"/>
           </w:tcPr>
           <w:p>
@@ -3620,7 +3740,7 @@
         </w:tc>
         <w:tc>
           <w:tcPr>
-            <w:tcW w:type="dxa" w:w="2100"/>
+            <w:tcW w:type="dxa" w:w="2166"/>
             <w:shd w:val="clear" w:color="auto" w:fill="FFFFFF"/>
           </w:tcPr>
           <w:p>
@@ -3639,7 +3759,7 @@
         </w:tc>
         <w:tc>
           <w:tcPr>
-            <w:tcW w:type="dxa" w:w="1975"/>
+            <w:tcW w:type="dxa" w:w="2021"/>
             <w:shd w:val="clear" w:color="auto" w:fill="FFFFFF"/>
           </w:tcPr>
           <w:p>
@@ -3675,7 +3795,7 @@
         <w:rPr>
           <w:rFonts w:ascii="Arial" w:hAnsi="Arial" w:eastAsia="Arial" w:cs="Arial"/>
         </w:rPr>
-        <w:t>With other inputs unchanged, the model gives a typical City two-bedroom apartment a 42% chance of being busy if it accepts one-night stays and 18% if it requires two nights or more. With ten more amenities the chance is 48%; priced 20% above similar homes, it is 36% (odds ratios in Appendix A). These are associations in past data, not proof that changing a setting causes more bookings.</w:t>
+        <w:t>With other inputs unchanged, the model gives a typical City two-bedroom apartment a 42% chance of being busy if it accepts one-night stays and 18% if not. With ten more amenities the chance is 48%; priced 20% above similar homes, it is 36% (odds ratios in Appendix A). These are associations in past data, not proof that changing a setting causes more bookings.</w:t>
       </w:r>
     </w:p>
     <w:p>
@@ -3688,7 +3808,7 @@
         <w:rPr>
           <w:rFonts w:ascii="Arial" w:hAnsi="Arial" w:eastAsia="Arial" w:cs="Arial"/>
         </w:rPr>
-        <w:t>Price and minimum stay carry most of the gain; without them, the reduced model did worse than random in City three-bedroom apartments (33.9% against 35.9%).</w:t>
+        <w:t>Price and minimum stay carry most of the gain; without them, the model did worse than random in City three-bedroom apartments (33.9% against 35.9%).</w:t>
       </w:r>
     </w:p>
     <w:p>
@@ -3753,10 +3873,10 @@
         <w:tblLayout w:type="fixed"/>
       </w:tblPr>
       <w:tblGrid>
-        <w:gridCol w:w="2023"/>
-        <w:gridCol w:w="2739"/>
-        <w:gridCol w:w="2364"/>
-        <w:gridCol w:w="2739"/>
+        <w:gridCol w:w="2253"/>
+        <w:gridCol w:w="2393"/>
+        <w:gridCol w:w="2108"/>
+        <w:gridCol w:w="3111"/>
       </w:tblGrid>
       <w:tr>
         <w:trPr>
@@ -3765,7 +3885,7 @@
         </w:trPr>
         <w:tc>
           <w:tcPr>
-            <w:tcW w:type="dxa" w:w="2023"/>
+            <w:tcW w:type="dxa" w:w="2253"/>
             <w:shd w:val="clear" w:color="auto" w:fill="E9EEF3"/>
           </w:tcPr>
           <w:p>
@@ -3780,13 +3900,13 @@
                 <w:b/>
                 <w:sz w:val="21"/>
               </w:rPr>
-              <w:t>Share of homes inspected in each group</w:t>
+              <w:t>Homes inspected per group</w:t>
             </w:r>
           </w:p>
         </w:tc>
         <w:tc>
           <w:tcPr>
-            <w:tcW w:type="dxa" w:w="2739"/>
+            <w:tcW w:type="dxa" w:w="2393"/>
             <w:shd w:val="clear" w:color="auto" w:fill="E9EEF3"/>
           </w:tcPr>
           <w:p>
@@ -3807,7 +3927,7 @@
         </w:tc>
         <w:tc>
           <w:tcPr>
-            <w:tcW w:type="dxa" w:w="2364"/>
+            <w:tcW w:type="dxa" w:w="2108"/>
             <w:shd w:val="clear" w:color="auto" w:fill="E9EEF3"/>
           </w:tcPr>
           <w:p>
@@ -3822,13 +3942,13 @@
                 <w:b/>
                 <w:sz w:val="21"/>
               </w:rPr>
-              <w:t>Share of busy homes found (recall)</w:t>
+              <w:t>Busy homes found (recall)</w:t>
             </w:r>
           </w:p>
         </w:tc>
         <w:tc>
           <w:tcPr>
-            <w:tcW w:type="dxa" w:w="2739"/>
+            <w:tcW w:type="dxa" w:w="3111"/>
             <w:shd w:val="clear" w:color="auto" w:fill="E9EEF3"/>
           </w:tcPr>
           <w:p>
@@ -3854,7 +3974,7 @@
         </w:trPr>
         <w:tc>
           <w:tcPr>
-            <w:tcW w:type="dxa" w:w="2023"/>
+            <w:tcW w:type="dxa" w:w="2253"/>
             <w:shd w:val="clear" w:color="auto" w:fill="FFFFFF"/>
           </w:tcPr>
           <w:p>
@@ -3874,7 +3994,7 @@
         </w:tc>
         <w:tc>
           <w:tcPr>
-            <w:tcW w:type="dxa" w:w="2739"/>
+            <w:tcW w:type="dxa" w:w="2393"/>
             <w:shd w:val="clear" w:color="auto" w:fill="FFFFFF"/>
           </w:tcPr>
           <w:p>
@@ -3894,7 +4014,7 @@
         </w:tc>
         <w:tc>
           <w:tcPr>
-            <w:tcW w:type="dxa" w:w="2364"/>
+            <w:tcW w:type="dxa" w:w="2108"/>
             <w:shd w:val="clear" w:color="auto" w:fill="FFFFFF"/>
           </w:tcPr>
           <w:p>
@@ -3914,7 +4034,7 @@
         </w:tc>
         <w:tc>
           <w:tcPr>
-            <w:tcW w:type="dxa" w:w="2739"/>
+            <w:tcW w:type="dxa" w:w="3111"/>
             <w:shd w:val="clear" w:color="auto" w:fill="FFFFFF"/>
           </w:tcPr>
           <w:p>
@@ -3939,7 +4059,7 @@
         </w:trPr>
         <w:tc>
           <w:tcPr>
-            <w:tcW w:type="dxa" w:w="2023"/>
+            <w:tcW w:type="dxa" w:w="2253"/>
             <w:shd w:val="clear" w:color="auto" w:fill="FFFFFF"/>
           </w:tcPr>
           <w:p>
@@ -3959,7 +4079,7 @@
         </w:tc>
         <w:tc>
           <w:tcPr>
-            <w:tcW w:type="dxa" w:w="2739"/>
+            <w:tcW w:type="dxa" w:w="2393"/>
             <w:shd w:val="clear" w:color="auto" w:fill="FFFFFF"/>
           </w:tcPr>
           <w:p>
@@ -3979,7 +4099,7 @@
         </w:tc>
         <w:tc>
           <w:tcPr>
-            <w:tcW w:type="dxa" w:w="2364"/>
+            <w:tcW w:type="dxa" w:w="2108"/>
             <w:shd w:val="clear" w:color="auto" w:fill="FFFFFF"/>
           </w:tcPr>
           <w:p>
@@ -3999,7 +4119,7 @@
         </w:tc>
         <w:tc>
           <w:tcPr>
-            <w:tcW w:type="dxa" w:w="2739"/>
+            <w:tcW w:type="dxa" w:w="3111"/>
             <w:shd w:val="clear" w:color="auto" w:fill="FFFFFF"/>
           </w:tcPr>
           <w:p>
@@ -4024,7 +4144,7 @@
         </w:trPr>
         <w:tc>
           <w:tcPr>
-            <w:tcW w:type="dxa" w:w="2023"/>
+            <w:tcW w:type="dxa" w:w="2253"/>
             <w:shd w:val="clear" w:color="auto" w:fill="FFFFFF"/>
           </w:tcPr>
           <w:p>
@@ -4043,7 +4163,7 @@
         </w:tc>
         <w:tc>
           <w:tcPr>
-            <w:tcW w:type="dxa" w:w="2739"/>
+            <w:tcW w:type="dxa" w:w="2393"/>
             <w:shd w:val="clear" w:color="auto" w:fill="FFFFFF"/>
           </w:tcPr>
           <w:p>
@@ -4062,7 +4182,7 @@
         </w:tc>
         <w:tc>
           <w:tcPr>
-            <w:tcW w:type="dxa" w:w="2364"/>
+            <w:tcW w:type="dxa" w:w="2108"/>
             <w:shd w:val="clear" w:color="auto" w:fill="FFFFFF"/>
           </w:tcPr>
           <w:p>
@@ -4081,7 +4201,7 @@
         </w:tc>
         <w:tc>
           <w:tcPr>
-            <w:tcW w:type="dxa" w:w="2739"/>
+            <w:tcW w:type="dxa" w:w="3111"/>
             <w:shd w:val="clear" w:color="auto" w:fill="FFFFFF"/>
           </w:tcPr>
           <w:p>
@@ -4117,7 +4237,7 @@
         <w:rPr>
           <w:rFonts w:ascii="Arial" w:hAnsi="Arial" w:eastAsia="Arial" w:cs="Arial"/>
         </w:rPr>
-        <w:t>Our plan (Table 7) starts with ten candidates, adding more if checks rule homes out.</w:t>
+        <w:t>Our plan (Table 7) starts with ten candidates.</w:t>
       </w:r>
     </w:p>
     <w:p>
@@ -4155,7 +4275,7 @@
       <w:r>
         <w:drawing>
           <wp:inline xmlns:a="http://schemas.openxmlformats.org/drawingml/2006/main" xmlns:pic="http://schemas.openxmlformats.org/drawingml/2006/picture">
-            <wp:extent cx="6035040" cy="2853491"/>
+            <wp:extent cx="6035040" cy="2407826"/>
             <wp:docPr id="4" name="Picture 4"/>
             <wp:cNvGraphicFramePr>
               <a:graphicFrameLocks noChangeAspect="1"/>
@@ -4176,7 +4296,7 @@
                   <pic:spPr>
                     <a:xfrm>
                       <a:off x="0" y="0"/>
-                      <a:ext cx="6035040" cy="2853491"/>
+                      <a:ext cx="6035040" cy="2407826"/>
                     </a:xfrm>
                     <a:prstGeom prst="rect"/>
                   </pic:spPr>
@@ -4209,6 +4329,7 @@
       <w:pPr>
         <w:pStyle w:val="Heading1"/>
         <w:keepNext/>
+        <w:pageBreakBefore w:val="0"/>
       </w:pPr>
       <w:r>
         <w:rPr>
@@ -4354,7 +4475,7 @@
         <w:rPr>
           <w:rFonts w:ascii="Arial" w:hAnsi="Arial" w:eastAsia="Arial" w:cs="Arial"/>
         </w:rPr>
-        <w:t>; use Yarra Ranges three-bedroom houses only if City leases are unsuitable.</w:t>
+        <w:t>, then Yarra Ranges three-bedroom houses; between leases that pass, choose as in Section 5.2.</w:t>
       </w:r>
     </w:p>
     <w:p>
@@ -4376,13 +4497,13 @@
           <w:rFonts w:ascii="Arial" w:hAnsi="Arial" w:eastAsia="Arial" w:cs="Arial"/>
           <w:b/>
         </w:rPr>
-        <w:t>Order candidates with the model where comparable listings exist.</w:t>
+        <w:t>Order candidates already on Airbnb with the model.</w:t>
       </w:r>
       <w:r>
         <w:rPr>
           <w:rFonts w:ascii="Arial" w:hAnsi="Arial" w:eastAsia="Arial" w:cs="Arial"/>
         </w:rPr>
-        <w:t xml:space="preserve"> For an unlisted rental, price near similar listings and trial one-night stays where allowed, tracking paid nights and cleaning costs.</w:t>
+        <w:t xml:space="preserve"> For an unlisted rental, price near similar listings and trial one-night stays where allowed.</w:t>
       </w:r>
     </w:p>
     <w:p>
@@ -4404,13 +4525,13 @@
           <w:rFonts w:ascii="Arial" w:hAnsi="Arial" w:eastAsia="Arial" w:cs="Arial"/>
           <w:b/>
         </w:rPr>
-        <w:t>Drop a candidate whose weekly rent and running costs exceed its group's typical weekly gross estimated revenue</w:t>
+        <w:t>Drop a candidate whose weekly rent and running costs exceed its group's typical weekly estimated revenue</w:t>
       </w:r>
       <w:r>
         <w:rPr>
           <w:rFonts w:ascii="Arial" w:hAnsi="Arial" w:eastAsia="Arial" w:cs="Arial"/>
         </w:rPr>
-        <w:t>: about AUD 590 for City two-bedroom apartments, AUD 930 for City three-bedroom apartments and AUD 890 for Yarra Ranges houses (Table 4, divided by 52). Then obtain the landlord's written consent and confirm that the owners' corporation has not banned stays under 28 days (Consumer Affairs Victoria, n.d.). Such stays also attract Victoria's 7.5% short-stay levy, collected through Airbnb (State Revenue Office Victoria, n.d.).</w:t>
+        <w:t>: about AUD 590 for City two-bedroom apartments, 930 for City three-bedroom apartments and 890 for Yarra Ranges houses (Table 4, divided by 52). Below target, revenue falls to about AUD 320, 620 and 600; keep cash to cover that gap. Also obtain the landlord's written consent and confirm that the owners' corporation has not banned stays under 28 days (Consumer Affairs Victoria, n.d.). Such stays also attract Victoria's 7.5% short-stay levy, collected through Airbnb (State Revenue Office Victoria, n.d.).</w:t>
       </w:r>
     </w:p>
     <w:p>
@@ -4425,7 +4546,7 @@
           <w:rFonts w:ascii="Arial" w:hAnsi="Arial" w:eastAsia="Arial" w:cs="Arial"/>
           <w:b/>
         </w:rPr>
-        <w:t>Table 7. Proposed four-week first inspection round</w:t>
+        <w:t>Table 7. Four-week inspection plan</w:t>
       </w:r>
     </w:p>
     <w:tbl>
@@ -4450,9 +4571,9 @@
         <w:tblLayout w:type="fixed"/>
       </w:tblPr>
       <w:tblGrid>
-        <w:gridCol w:w="2427"/>
-        <w:gridCol w:w="4606"/>
-        <w:gridCol w:w="2831"/>
+        <w:gridCol w:w="2213"/>
+        <w:gridCol w:w="3869"/>
+        <w:gridCol w:w="3783"/>
       </w:tblGrid>
       <w:tr>
         <w:trPr>
@@ -4461,7 +4582,7 @@
         </w:trPr>
         <w:tc>
           <w:tcPr>
-            <w:tcW w:type="dxa" w:w="2427"/>
+            <w:tcW w:type="dxa" w:w="2213"/>
             <w:shd w:val="clear" w:color="auto" w:fill="E9EEF3"/>
           </w:tcPr>
           <w:p>
@@ -4482,7 +4603,7 @@
         </w:tc>
         <w:tc>
           <w:tcPr>
-            <w:tcW w:type="dxa" w:w="4606"/>
+            <w:tcW w:type="dxa" w:w="3869"/>
             <w:shd w:val="clear" w:color="auto" w:fill="E9EEF3"/>
           </w:tcPr>
           <w:p>
@@ -4503,7 +4624,7 @@
         </w:tc>
         <w:tc>
           <w:tcPr>
-            <w:tcW w:type="dxa" w:w="2831"/>
+            <w:tcW w:type="dxa" w:w="3783"/>
             <w:shd w:val="clear" w:color="auto" w:fill="E9EEF3"/>
           </w:tcPr>
           <w:p>
@@ -4529,7 +4650,7 @@
         </w:trPr>
         <w:tc>
           <w:tcPr>
-            <w:tcW w:type="dxa" w:w="2427"/>
+            <w:tcW w:type="dxa" w:w="2213"/>
             <w:shd w:val="clear" w:color="auto" w:fill="FFFFFF"/>
           </w:tcPr>
           <w:p>
@@ -4557,7 +4678,7 @@
         </w:tc>
         <w:tc>
           <w:tcPr>
-            <w:tcW w:type="dxa" w:w="4606"/>
+            <w:tcW w:type="dxa" w:w="3869"/>
             <w:shd w:val="clear" w:color="auto" w:fill="FFFFFF"/>
           </w:tcPr>
           <w:p>
@@ -4571,13 +4692,13 @@
                 <w:rFonts w:ascii="Arial" w:hAnsi="Arial" w:eastAsia="Arial" w:cs="Arial"/>
                 <w:sz w:val="21"/>
               </w:rPr>
-              <w:t>Find ten available candidates in the priority groups; order established homes with the model</w:t>
+              <w:t>Find ten available candidates in the priority groups; order listed homes with the model</w:t>
             </w:r>
           </w:p>
         </w:tc>
         <w:tc>
           <w:tcPr>
-            <w:tcW w:type="dxa" w:w="2831"/>
+            <w:tcW w:type="dxa" w:w="3783"/>
             <w:shd w:val="clear" w:color="auto" w:fill="FFFFFF"/>
           </w:tcPr>
           <w:p>
@@ -4602,7 +4723,7 @@
         </w:trPr>
         <w:tc>
           <w:tcPr>
-            <w:tcW w:type="dxa" w:w="2427"/>
+            <w:tcW w:type="dxa" w:w="2213"/>
             <w:shd w:val="clear" w:color="auto" w:fill="FFFFFF"/>
           </w:tcPr>
           <w:p>
@@ -4630,7 +4751,7 @@
         </w:tc>
         <w:tc>
           <w:tcPr>
-            <w:tcW w:type="dxa" w:w="4606"/>
+            <w:tcW w:type="dxa" w:w="3869"/>
             <w:shd w:val="clear" w:color="auto" w:fill="FFFFFF"/>
           </w:tcPr>
           <w:p>
@@ -4644,13 +4765,13 @@
                 <w:rFonts w:ascii="Arial" w:hAnsi="Arial" w:eastAsia="Arial" w:cs="Arial"/>
                 <w:sz w:val="21"/>
               </w:rPr>
-              <w:t>Confirm consent and building rules, obtain cost quotes, compare rent with Table 4</w:t>
+              <w:t>Confirm consent and building rules; obtain rent and cost quotes</w:t>
             </w:r>
           </w:p>
         </w:tc>
         <w:tc>
           <w:tcPr>
-            <w:tcW w:type="dxa" w:w="2831"/>
+            <w:tcW w:type="dxa" w:w="3783"/>
             <w:shd w:val="clear" w:color="auto" w:fill="FFFFFF"/>
           </w:tcPr>
           <w:p>
@@ -4675,7 +4796,7 @@
         </w:trPr>
         <w:tc>
           <w:tcPr>
-            <w:tcW w:type="dxa" w:w="2427"/>
+            <w:tcW w:type="dxa" w:w="2213"/>
             <w:shd w:val="clear" w:color="auto" w:fill="FFFFFF"/>
           </w:tcPr>
           <w:p>
@@ -4703,7 +4824,7 @@
         </w:tc>
         <w:tc>
           <w:tcPr>
-            <w:tcW w:type="dxa" w:w="4606"/>
+            <w:tcW w:type="dxa" w:w="3869"/>
             <w:shd w:val="clear" w:color="auto" w:fill="FFFFFF"/>
           </w:tcPr>
           <w:p>
@@ -4717,13 +4838,13 @@
                 <w:rFonts w:ascii="Arial" w:hAnsi="Arial" w:eastAsia="Arial" w:cs="Arial"/>
                 <w:sz w:val="21"/>
               </w:rPr>
-              <w:t>Compare cash flow under expected demand and weak demand (60 nights a year, the below-target median in Table 3)</w:t>
+              <w:t>Compare weekly costs with typical and below-target revenue (Recommendation 3)</w:t>
             </w:r>
           </w:p>
         </w:tc>
         <w:tc>
           <w:tcPr>
-            <w:tcW w:type="dxa" w:w="2831"/>
+            <w:tcW w:type="dxa" w:w="3783"/>
             <w:shd w:val="clear" w:color="auto" w:fill="FFFFFF"/>
           </w:tcPr>
           <w:p>
@@ -4737,7 +4858,7 @@
                 <w:rFonts w:ascii="Arial" w:hAnsi="Arial" w:eastAsia="Arial" w:cs="Arial"/>
                 <w:sz w:val="21"/>
               </w:rPr>
-              <w:t>Sign only if both cases cover rent and keep a cash buffer</w:t>
+              <w:t>Sign only if typical revenue covers costs and the cash buffer covers a year of below-target shortfall</w:t>
             </w:r>
           </w:p>
         </w:tc>
@@ -4748,7 +4869,7 @@
         </w:trPr>
         <w:tc>
           <w:tcPr>
-            <w:tcW w:type="dxa" w:w="2427"/>
+            <w:tcW w:type="dxa" w:w="2213"/>
             <w:shd w:val="clear" w:color="auto" w:fill="FFFFFF"/>
           </w:tcPr>
           <w:p>
@@ -4775,7 +4896,7 @@
         </w:tc>
         <w:tc>
           <w:tcPr>
-            <w:tcW w:type="dxa" w:w="4606"/>
+            <w:tcW w:type="dxa" w:w="3869"/>
             <w:shd w:val="clear" w:color="auto" w:fill="FFFFFF"/>
           </w:tcPr>
           <w:p>
@@ -4794,7 +4915,7 @@
         </w:tc>
         <w:tc>
           <w:tcPr>
-            <w:tcW w:type="dxa" w:w="2831"/>
+            <w:tcW w:type="dxa" w:w="3783"/>
             <w:shd w:val="clear" w:color="auto" w:fill="FFFFFF"/>
           </w:tcPr>
           <w:p>
@@ -4822,8 +4943,29 @@
     </w:p>
     <w:p>
       <w:pPr>
+        <w:widowControl/>
+        <w:spacing w:after="120" w:line="259" w:lineRule="auto"/>
+        <w:jc w:val="left"/>
+      </w:pPr>
+      <w:r>
+        <w:rPr>
+          <w:rFonts w:ascii="Arial" w:hAnsi="Arial" w:eastAsia="Arial" w:cs="Arial"/>
+          <w:b/>
+        </w:rPr>
+        <w:t>Worked example (illustrative figures).</w:t>
+      </w:r>
+      <w:r>
+        <w:rPr>
+          <w:rFonts w:ascii="Arial" w:hAnsi="Arial" w:eastAsia="Arial" w:cs="Arial"/>
+        </w:rPr>
+        <w:t xml:space="preserve"> An agent offers two unlisted homes; weekly rent plus the client's quotes for cleaning, utilities, insurance and Airbnb fees total AUD 620 for a City two-bedroom apartment and AUD 700 for a Yarra Ranges three-bedroom house. Without listing data, the model cannot rank them. The apartment's group comes first, but AUD 620 exceeds its typical AUD 590 a week, so it is dropped. The house clears its typical AUD 890, but below target (AUD 600) it would lose AUD 100 a week, about AUD 5,200 a year. Lease it only if it passes the consent and building checks and the cash buffer covers setup costs and that loss. Our figures exclude new listings, which may start slower (Section 7).</w:t>
+      </w:r>
+    </w:p>
+    <w:p>
+      <w:pPr>
         <w:pStyle w:val="Heading1"/>
         <w:keepNext/>
+        <w:pageBreakBefore w:val="0"/>
       </w:pPr>
       <w:r>
         <w:rPr>
@@ -4954,6 +5096,7 @@
       <w:pPr>
         <w:pStyle w:val="Heading1"/>
         <w:keepNext/>
+        <w:pageBreakBefore w:val="0"/>
       </w:pPr>
       <w:r>
         <w:rPr>
@@ -5025,7 +5168,7 @@
         <w:rPr>
           <w:rFonts w:ascii="Arial" w:hAnsi="Arial" w:eastAsia="Arial" w:cs="Arial"/>
         </w:rPr>
-        <w:t xml:space="preserve"> [Source code and analysis results]. GitHub. </w:t>
+        <w:t xml:space="preserve"> [Source code]. GitHub. </w:t>
       </w:r>
       <w:hyperlink r:id="rId13">
         <w:r>
@@ -5101,7 +5244,7 @@
         <w:rPr>
           <w:rFonts w:ascii="Arial" w:hAnsi="Arial" w:eastAsia="Arial" w:cs="Arial"/>
         </w:rPr>
-        <w:t xml:space="preserve"> (snapshot of 16 June 2026, supplied through the CMCE30005 LMS) [Data set]. </w:t>
+        <w:t xml:space="preserve"> (June 2026 snapshot, via CMCE30005 LMS) [Data set]. </w:t>
       </w:r>
       <w:hyperlink r:id="rId17">
         <w:r>
@@ -5244,6 +5387,7 @@
       <w:pPr>
         <w:pStyle w:val="Heading1"/>
         <w:keepNext/>
+        <w:pageBreakBefore/>
       </w:pPr>
       <w:r>
         <w:rPr>
@@ -5262,7 +5406,7 @@
         <w:rPr>
           <w:rFonts w:ascii="Arial" w:hAnsi="Arial" w:eastAsia="Arial" w:cs="Arial"/>
         </w:rPr>
-        <w:t>The model is a standard logistic regression fitted in R (R Core Team, 2026). Group median prices and the three missing minimum stays are filled from training homes only. The group rate is smoothed as (group successes + 10 × overall rate) / (group homes + 10). Odds are the chance of being busy divided by the chance of not being busy. Table A1 gives each input's odds ratio (mean of 50 test fits) and its range; above 1 means a higher chance of being busy, below 1 a lower one.</w:t>
+        <w:t>We fitted the model in R (R Core Team, 2026). Group median prices and the three missing minimum stays are filled from training homes only. The group rate is smoothed as (group successes + 10 × overall rate) / (group homes + 10). Odds are the chance of being busy divided by the chance of not being busy. Table A1 gives each input's odds ratio (mean of 50 test fits) and its range; above 1 means a higher chance of being busy, below 1 a lower one.</w:t>
       </w:r>
     </w:p>
     <w:p>
@@ -5277,7 +5421,7 @@
           <w:rFonts w:ascii="Arial" w:hAnsi="Arial" w:eastAsia="Arial" w:cs="Arial"/>
           <w:b/>
         </w:rPr>
-        <w:t>Table A1. Odds ratios for all inputs across 50 fits</w:t>
+        <w:t>Table A1. Odds ratios across 50 fits</w:t>
       </w:r>
     </w:p>
     <w:tbl>
@@ -5302,9 +5446,9 @@
         <w:tblLayout w:type="fixed"/>
       </w:tblPr>
       <w:tblGrid>
-        <w:gridCol w:w="5941"/>
-        <w:gridCol w:w="1370"/>
-        <w:gridCol w:w="2553"/>
+        <w:gridCol w:w="5870"/>
+        <w:gridCol w:w="1461"/>
+        <w:gridCol w:w="2533"/>
       </w:tblGrid>
       <w:tr>
         <w:trPr>
@@ -5313,7 +5457,7 @@
         </w:trPr>
         <w:tc>
           <w:tcPr>
-            <w:tcW w:type="dxa" w:w="5941"/>
+            <w:tcW w:type="dxa" w:w="5870"/>
             <w:shd w:val="clear" w:color="auto" w:fill="E9EEF3"/>
           </w:tcPr>
           <w:p>
@@ -5334,7 +5478,7 @@
         </w:tc>
         <w:tc>
           <w:tcPr>
-            <w:tcW w:type="dxa" w:w="1370"/>
+            <w:tcW w:type="dxa" w:w="1461"/>
             <w:shd w:val="clear" w:color="auto" w:fill="E9EEF3"/>
           </w:tcPr>
           <w:p>
@@ -5355,7 +5499,7 @@
         </w:tc>
         <w:tc>
           <w:tcPr>
-            <w:tcW w:type="dxa" w:w="2553"/>
+            <w:tcW w:type="dxa" w:w="2533"/>
             <w:shd w:val="clear" w:color="auto" w:fill="E9EEF3"/>
           </w:tcPr>
           <w:p>
@@ -5381,7 +5525,7 @@
         </w:trPr>
         <w:tc>
           <w:tcPr>
-            <w:tcW w:type="dxa" w:w="5941"/>
+            <w:tcW w:type="dxa" w:w="5870"/>
             <w:shd w:val="clear" w:color="auto" w:fill="FFFFFF"/>
           </w:tcPr>
           <w:p>
@@ -5401,7 +5545,7 @@
         </w:tc>
         <w:tc>
           <w:tcPr>
-            <w:tcW w:type="dxa" w:w="1370"/>
+            <w:tcW w:type="dxa" w:w="1461"/>
             <w:shd w:val="clear" w:color="auto" w:fill="FFFFFF"/>
           </w:tcPr>
           <w:p>
@@ -5421,7 +5565,7 @@
         </w:tc>
         <w:tc>
           <w:tcPr>
-            <w:tcW w:type="dxa" w:w="2553"/>
+            <w:tcW w:type="dxa" w:w="2533"/>
             <w:shd w:val="clear" w:color="auto" w:fill="FFFFFF"/>
           </w:tcPr>
           <w:p>
@@ -5446,7 +5590,7 @@
         </w:trPr>
         <w:tc>
           <w:tcPr>
-            <w:tcW w:type="dxa" w:w="5941"/>
+            <w:tcW w:type="dxa" w:w="5870"/>
             <w:shd w:val="clear" w:color="auto" w:fill="FFFFFF"/>
           </w:tcPr>
           <w:p>
@@ -5466,7 +5610,7 @@
         </w:tc>
         <w:tc>
           <w:tcPr>
-            <w:tcW w:type="dxa" w:w="1370"/>
+            <w:tcW w:type="dxa" w:w="1461"/>
             <w:shd w:val="clear" w:color="auto" w:fill="FFFFFF"/>
           </w:tcPr>
           <w:p>
@@ -5486,7 +5630,7 @@
         </w:tc>
         <w:tc>
           <w:tcPr>
-            <w:tcW w:type="dxa" w:w="2553"/>
+            <w:tcW w:type="dxa" w:w="2533"/>
             <w:shd w:val="clear" w:color="auto" w:fill="FFFFFF"/>
           </w:tcPr>
           <w:p>
@@ -5511,7 +5655,7 @@
         </w:trPr>
         <w:tc>
           <w:tcPr>
-            <w:tcW w:type="dxa" w:w="5941"/>
+            <w:tcW w:type="dxa" w:w="5870"/>
             <w:shd w:val="clear" w:color="auto" w:fill="FFFFFF"/>
           </w:tcPr>
           <w:p>
@@ -5531,7 +5675,7 @@
         </w:tc>
         <w:tc>
           <w:tcPr>
-            <w:tcW w:type="dxa" w:w="1370"/>
+            <w:tcW w:type="dxa" w:w="1461"/>
             <w:shd w:val="clear" w:color="auto" w:fill="FFFFFF"/>
           </w:tcPr>
           <w:p>
@@ -5551,7 +5695,7 @@
         </w:tc>
         <w:tc>
           <w:tcPr>
-            <w:tcW w:type="dxa" w:w="2553"/>
+            <w:tcW w:type="dxa" w:w="2533"/>
             <w:shd w:val="clear" w:color="auto" w:fill="FFFFFF"/>
           </w:tcPr>
           <w:p>
@@ -5576,7 +5720,7 @@
         </w:trPr>
         <w:tc>
           <w:tcPr>
-            <w:tcW w:type="dxa" w:w="5941"/>
+            <w:tcW w:type="dxa" w:w="5870"/>
             <w:shd w:val="clear" w:color="auto" w:fill="FFFFFF"/>
           </w:tcPr>
           <w:p>
@@ -5590,13 +5734,64 @@
                 <w:rFonts w:ascii="Arial" w:hAnsi="Arial" w:eastAsia="Arial" w:cs="Arial"/>
                 <w:sz w:val="21"/>
               </w:rPr>
-              <w:t>Port Phillip (City of Melbourne)</w:t>
+              <w:t>Council area (City of Melbourne)</w:t>
             </w:r>
           </w:p>
         </w:tc>
         <w:tc>
           <w:tcPr>
-            <w:tcW w:type="dxa" w:w="1370"/>
+            <w:tcW w:type="dxa" w:w="1461"/>
+            <w:shd w:val="clear" w:color="auto" w:fill="FFFFFF"/>
+          </w:tcPr>
+          <w:p>
+            <w:pPr>
+              <w:keepNext/>
+              <w:spacing w:before="40" w:after="40" w:line="240" w:lineRule="auto"/>
+              <w:jc w:val="right"/>
+            </w:pPr>
+          </w:p>
+        </w:tc>
+        <w:tc>
+          <w:tcPr>
+            <w:tcW w:type="dxa" w:w="2533"/>
+            <w:shd w:val="clear" w:color="auto" w:fill="FFFFFF"/>
+          </w:tcPr>
+          <w:p>
+            <w:pPr>
+              <w:keepNext/>
+              <w:spacing w:before="40" w:after="40" w:line="240" w:lineRule="auto"/>
+              <w:jc w:val="right"/>
+            </w:pPr>
+          </w:p>
+        </w:tc>
+      </w:tr>
+      <w:tr>
+        <w:trPr>
+          <w:cantSplit/>
+        </w:trPr>
+        <w:tc>
+          <w:tcPr>
+            <w:tcW w:type="dxa" w:w="5870"/>
+            <w:shd w:val="clear" w:color="auto" w:fill="FFFFFF"/>
+          </w:tcPr>
+          <w:p>
+            <w:pPr>
+              <w:keepNext/>
+              <w:spacing w:before="40" w:after="40" w:line="240" w:lineRule="auto"/>
+              <w:jc w:val="left"/>
+            </w:pPr>
+            <w:r>
+              <w:rPr>
+                <w:rFonts w:ascii="Arial" w:hAnsi="Arial" w:eastAsia="Arial" w:cs="Arial"/>
+                <w:sz w:val="21"/>
+              </w:rPr>
+              <w:t>Port Phillip</w:t>
+            </w:r>
+          </w:p>
+        </w:tc>
+        <w:tc>
+          <w:tcPr>
+            <w:tcW w:type="dxa" w:w="1461"/>
             <w:shd w:val="clear" w:color="auto" w:fill="FFFFFF"/>
           </w:tcPr>
           <w:p>
@@ -5616,7 +5811,7 @@
         </w:tc>
         <w:tc>
           <w:tcPr>
-            <w:tcW w:type="dxa" w:w="2553"/>
+            <w:tcW w:type="dxa" w:w="2533"/>
             <w:shd w:val="clear" w:color="auto" w:fill="FFFFFF"/>
           </w:tcPr>
           <w:p>
@@ -5641,7 +5836,7 @@
         </w:trPr>
         <w:tc>
           <w:tcPr>
-            <w:tcW w:type="dxa" w:w="5941"/>
+            <w:tcW w:type="dxa" w:w="5870"/>
             <w:shd w:val="clear" w:color="auto" w:fill="FFFFFF"/>
           </w:tcPr>
           <w:p>
@@ -5655,13 +5850,13 @@
                 <w:rFonts w:ascii="Arial" w:hAnsi="Arial" w:eastAsia="Arial" w:cs="Arial"/>
                 <w:sz w:val="21"/>
               </w:rPr>
-              <w:t>Stonnington (City of Melbourne)</w:t>
+              <w:t>Stonnington</w:t>
             </w:r>
           </w:p>
         </w:tc>
         <w:tc>
           <w:tcPr>
-            <w:tcW w:type="dxa" w:w="1370"/>
+            <w:tcW w:type="dxa" w:w="1461"/>
             <w:shd w:val="clear" w:color="auto" w:fill="FFFFFF"/>
           </w:tcPr>
           <w:p>
@@ -5681,7 +5876,7 @@
         </w:tc>
         <w:tc>
           <w:tcPr>
-            <w:tcW w:type="dxa" w:w="2553"/>
+            <w:tcW w:type="dxa" w:w="2533"/>
             <w:shd w:val="clear" w:color="auto" w:fill="FFFFFF"/>
           </w:tcPr>
           <w:p>
@@ -5706,7 +5901,7 @@
         </w:trPr>
         <w:tc>
           <w:tcPr>
-            <w:tcW w:type="dxa" w:w="5941"/>
+            <w:tcW w:type="dxa" w:w="5870"/>
             <w:shd w:val="clear" w:color="auto" w:fill="FFFFFF"/>
           </w:tcPr>
           <w:p>
@@ -5720,13 +5915,13 @@
                 <w:rFonts w:ascii="Arial" w:hAnsi="Arial" w:eastAsia="Arial" w:cs="Arial"/>
                 <w:sz w:val="21"/>
               </w:rPr>
-              <w:t>Yarra (City of Melbourne)</w:t>
+              <w:t>Yarra</w:t>
             </w:r>
           </w:p>
         </w:tc>
         <w:tc>
           <w:tcPr>
-            <w:tcW w:type="dxa" w:w="1370"/>
+            <w:tcW w:type="dxa" w:w="1461"/>
             <w:shd w:val="clear" w:color="auto" w:fill="FFFFFF"/>
           </w:tcPr>
           <w:p>
@@ -5746,7 +5941,7 @@
         </w:tc>
         <w:tc>
           <w:tcPr>
-            <w:tcW w:type="dxa" w:w="2553"/>
+            <w:tcW w:type="dxa" w:w="2533"/>
             <w:shd w:val="clear" w:color="auto" w:fill="FFFFFF"/>
           </w:tcPr>
           <w:p>
@@ -5771,7 +5966,7 @@
         </w:trPr>
         <w:tc>
           <w:tcPr>
-            <w:tcW w:type="dxa" w:w="5941"/>
+            <w:tcW w:type="dxa" w:w="5870"/>
             <w:shd w:val="clear" w:color="auto" w:fill="FFFFFF"/>
           </w:tcPr>
           <w:p>
@@ -5785,13 +5980,13 @@
                 <w:rFonts w:ascii="Arial" w:hAnsi="Arial" w:eastAsia="Arial" w:cs="Arial"/>
                 <w:sz w:val="21"/>
               </w:rPr>
-              <w:t>Yarra Ranges (City of Melbourne)</w:t>
+              <w:t>Yarra Ranges</w:t>
             </w:r>
           </w:p>
         </w:tc>
         <w:tc>
           <w:tcPr>
-            <w:tcW w:type="dxa" w:w="1370"/>
+            <w:tcW w:type="dxa" w:w="1461"/>
             <w:shd w:val="clear" w:color="auto" w:fill="FFFFFF"/>
           </w:tcPr>
           <w:p>
@@ -5811,7 +6006,7 @@
         </w:tc>
         <w:tc>
           <w:tcPr>
-            <w:tcW w:type="dxa" w:w="2553"/>
+            <w:tcW w:type="dxa" w:w="2533"/>
             <w:shd w:val="clear" w:color="auto" w:fill="FFFFFF"/>
           </w:tcPr>
           <w:p>
@@ -5836,7 +6031,7 @@
         </w:trPr>
         <w:tc>
           <w:tcPr>
-            <w:tcW w:type="dxa" w:w="5941"/>
+            <w:tcW w:type="dxa" w:w="5870"/>
             <w:shd w:val="clear" w:color="auto" w:fill="FFFFFF"/>
           </w:tcPr>
           <w:p>
@@ -5850,13 +6045,13 @@
                 <w:rFonts w:ascii="Arial" w:hAnsi="Arial" w:eastAsia="Arial" w:cs="Arial"/>
                 <w:sz w:val="21"/>
               </w:rPr>
-              <w:t>Merri-bek (City of Melbourne)</w:t>
+              <w:t>Merri-bek</w:t>
             </w:r>
           </w:p>
         </w:tc>
         <w:tc>
           <w:tcPr>
-            <w:tcW w:type="dxa" w:w="1370"/>
+            <w:tcW w:type="dxa" w:w="1461"/>
             <w:shd w:val="clear" w:color="auto" w:fill="FFFFFF"/>
           </w:tcPr>
           <w:p>
@@ -5876,7 +6071,7 @@
         </w:tc>
         <w:tc>
           <w:tcPr>
-            <w:tcW w:type="dxa" w:w="2553"/>
+            <w:tcW w:type="dxa" w:w="2533"/>
             <w:shd w:val="clear" w:color="auto" w:fill="FFFFFF"/>
           </w:tcPr>
           <w:p>
@@ -5901,7 +6096,7 @@
         </w:trPr>
         <w:tc>
           <w:tcPr>
-            <w:tcW w:type="dxa" w:w="5941"/>
+            <w:tcW w:type="dxa" w:w="5870"/>
             <w:shd w:val="clear" w:color="auto" w:fill="FFFFFF"/>
           </w:tcPr>
           <w:p>
@@ -5921,7 +6116,7 @@
         </w:tc>
         <w:tc>
           <w:tcPr>
-            <w:tcW w:type="dxa" w:w="1370"/>
+            <w:tcW w:type="dxa" w:w="1461"/>
             <w:shd w:val="clear" w:color="auto" w:fill="FFFFFF"/>
           </w:tcPr>
           <w:p>
@@ -5941,7 +6136,7 @@
         </w:tc>
         <w:tc>
           <w:tcPr>
-            <w:tcW w:type="dxa" w:w="2553"/>
+            <w:tcW w:type="dxa" w:w="2533"/>
             <w:shd w:val="clear" w:color="auto" w:fill="FFFFFF"/>
           </w:tcPr>
           <w:p>
@@ -5966,7 +6161,7 @@
         </w:trPr>
         <w:tc>
           <w:tcPr>
-            <w:tcW w:type="dxa" w:w="5941"/>
+            <w:tcW w:type="dxa" w:w="5870"/>
             <w:shd w:val="clear" w:color="auto" w:fill="FFFFFF"/>
           </w:tcPr>
           <w:p>
@@ -5986,7 +6181,7 @@
         </w:tc>
         <w:tc>
           <w:tcPr>
-            <w:tcW w:type="dxa" w:w="1370"/>
+            <w:tcW w:type="dxa" w:w="1461"/>
             <w:shd w:val="clear" w:color="auto" w:fill="FFFFFF"/>
           </w:tcPr>
           <w:p>
@@ -6006,7 +6201,7 @@
         </w:tc>
         <w:tc>
           <w:tcPr>
-            <w:tcW w:type="dxa" w:w="2553"/>
+            <w:tcW w:type="dxa" w:w="2533"/>
             <w:shd w:val="clear" w:color="auto" w:fill="FFFFFF"/>
           </w:tcPr>
           <w:p>
@@ -6031,7 +6226,7 @@
         </w:trPr>
         <w:tc>
           <w:tcPr>
-            <w:tcW w:type="dxa" w:w="5941"/>
+            <w:tcW w:type="dxa" w:w="5870"/>
             <w:shd w:val="clear" w:color="auto" w:fill="FFFFFF"/>
           </w:tcPr>
           <w:p>
@@ -6050,7 +6245,7 @@
         </w:tc>
         <w:tc>
           <w:tcPr>
-            <w:tcW w:type="dxa" w:w="1370"/>
+            <w:tcW w:type="dxa" w:w="1461"/>
             <w:shd w:val="clear" w:color="auto" w:fill="FFFFFF"/>
           </w:tcPr>
           <w:p>
@@ -6069,7 +6264,7 @@
         </w:tc>
         <w:tc>
           <w:tcPr>
-            <w:tcW w:type="dxa" w:w="2553"/>
+            <w:tcW w:type="dxa" w:w="2533"/>
             <w:shd w:val="clear" w:color="auto" w:fill="FFFFFF"/>
           </w:tcPr>
           <w:p>

</xml_diff>

<commit_message>
Apply team review: tighten the lease decision and two method notes
- The worked example ends in rent negotiation and a cash-flow plan for
  the home itself; a group median is not a one-home forecast and the
  one-year buffer is a planning assumption. Recommendation 3, the
  Section 5.2 rule and Table 7 now use the same logic.
- State that 30 reviews equal about 180 nights only with three-night
  stays; explain ten candidates as a starting pool ranked within groups.
- Correct two descriptions: the 8.7-point gap counts each host once
  within each set of groups, and Table A1 odds ratios come from the
  average coefficient of 50 training fits; the scenario chances come
  from the model fitted to all homes.
- Lighten Table 4 and use one source note for all figures and tables.
  Microsoft Word count 2,987; nine pages.
</commit_message>
<xml_diff>
--- a/final-report/report-2026-10-04/Final_Report.docx
+++ b/final-report/report-2026-10-04/Final_Report.docx
@@ -274,7 +274,7 @@
         <w:rPr>
           <w:rFonts w:ascii="Arial" w:hAnsi="Arial" w:eastAsia="Arial" w:cs="Arial"/>
         </w:rPr>
-        <w:t>) when it receives at least 30 guest reviews in the 365 days before data collection, a level reached by a quarter of separate reference homes (Section 3). Inside Airbnb (n.d.) assumes half of stays are reviewed, each lasting at least three nights, and caps estimated nights at 70% of the year (255), so 30 reviews means about 180 booked nights a year.</w:t>
+        <w:t>) when it receives at least 30 guest reviews in the 365 days before data collection, a level reached by a quarter of separate reference homes (Section 3). Inside Airbnb (n.d.) assumes half of stays are reviewed and each lasts three nights, or the minimum stay if longer, capping estimated nights at 70% of the year (255). With three-night stays, 30 reviews means about 180 booked nights a year.</w:t>
       </w:r>
     </w:p>
     <w:p>
@@ -287,7 +287,7 @@
         <w:rPr>
           <w:rFonts w:ascii="Arial" w:hAnsi="Arial" w:eastAsia="Arial" w:cs="Arial"/>
         </w:rPr>
-        <w:t>We rank on reviews rather than revenue because Inside Airbnb's revenue estimate multiplies these review-based nights by the advertised price, and without rents a higher price does not mean a better lease; we report revenue alongside. Rents, costs and profit are outside our data.</w:t>
+        <w:t>We rank on reviews rather than revenue because Inside Airbnb's revenue estimate multiplies these nights by the advertised price, and without rents a higher price does not mean a better lease. Rents, costs and profit are outside our data.</w:t>
       </w:r>
     </w:p>
     <w:p>
@@ -300,7 +300,7 @@
         <w:rPr>
           <w:rFonts w:ascii="Arial" w:hAnsi="Arial" w:eastAsia="Arial" w:cs="Arial"/>
         </w:rPr>
-        <w:t>Building on the interim report, we keep its group comparison but replace its hard-to-explain random forest with one logistic regression.</w:t>
+        <w:t>Building on the interim report's groups and target, we swap its random forest for logistic regression.</w:t>
       </w:r>
     </w:p>
     <w:p>
@@ -1408,7 +1408,7 @@
         <w:rPr>
           <w:rFonts w:ascii="Arial" w:hAnsi="Arial" w:eastAsia="Arial" w:cs="Arial"/>
         </w:rPr>
-        <w:t xml:space="preserve"> A host's homes tend to perform alike; allowing for this widens each effect's margin of error 1.1–2.6 times, so every test keeps a host's homes together. The inputs barely overlap: a standard check (variance inflation factor) stays below 3, under the usual warning level of 5. Each input is assumed to have a steady effect; amenities flatten slightly at high counts, but not reliably once hosts are grouped.</w:t>
+        <w:t xml:space="preserve"> A host's homes tend to perform alike; allowing for this widens each effect's margin of error 1.1–2.6 times, so every test keeps a host's homes together. The inputs barely overlap (variance inflation factors below 3, against a warning level of 5). Each input is assumed to have a steady effect; with hosts grouped, checks find no reliable curve.</w:t>
       </w:r>
     </w:p>
     <w:p>
@@ -1546,7 +1546,7 @@
         <w:rPr>
           <w:rFonts w:ascii="Arial" w:hAnsi="Arial" w:eastAsia="Arial" w:cs="Arial"/>
         </w:rPr>
-        <w:t xml:space="preserve"> Annual reviews per home, 3,873 analysis homes. Source: Inside Airbnb (2026); Group 2 analysis.</w:t>
+        <w:t xml:space="preserve"> Annual reviews per home, 3,873 analysis homes. Source of all figures and tables: Inside Airbnb (2026); Group 2 analysis.</w:t>
       </w:r>
     </w:p>
     <w:p>
@@ -2400,7 +2400,7 @@
         <w:rPr>
           <w:rFonts w:ascii="Arial" w:hAnsi="Arial" w:eastAsia="Arial" w:cs="Arial"/>
         </w:rPr>
-        <w:t>Group rates range from 8.2% to 36.6% against 25.3% overall (Figure 2). City of Melbourne three-bedroom apartments lead at 36.6%, followed by City two-bedroom apartments at 32.8% and Yarra Ranges three-bedroom houses at 30.0% (Table 4).</w:t>
+        <w:t>Group rates range from 8.2% to 36.6% against 25.3% overall (Figure 2). City three-bedroom apartments lead at 36.6%, then City two-bedroom apartments (32.8%) and Yarra Ranges three-bedroom houses (30.0%; Table 4).</w:t>
       </w:r>
     </w:p>
     <w:p>
@@ -2460,7 +2460,7 @@
         <w:rPr>
           <w:rFonts w:ascii="Arial" w:hAnsi="Arial" w:eastAsia="Arial" w:cs="Arial"/>
         </w:rPr>
-        <w:t xml:space="preserve"> Share of busy homes in all 14 groups, with 90% ranges from redrawing hosts; priority groups in blue. Source: Inside Airbnb (2026); Group 2 analysis.</w:t>
+        <w:t xml:space="preserve"> Share of busy homes in all 14 groups, with 90% ranges from redrawing hosts; priority groups in blue.</w:t>
       </w:r>
     </w:p>
     <w:p>
@@ -2475,7 +2475,7 @@
           <w:rFonts w:ascii="Arial" w:hAnsi="Arial" w:eastAsia="Arial" w:cs="Arial"/>
           <w:b/>
         </w:rPr>
-        <w:t>Table 4. Priority groups: estimated nights and revenue</w:t>
+        <w:t>Table 4. Priority groups: estimated nights and revenue (medians; revenue in AUD a year)</w:t>
       </w:r>
     </w:p>
     <w:tbl>
@@ -2500,14 +2500,13 @@
         <w:tblLayout w:type="fixed"/>
       </w:tblPr>
       <w:tblGrid>
-        <w:gridCol w:w="1717"/>
-        <w:gridCol w:w="978"/>
-        <w:gridCol w:w="878"/>
-        <w:gridCol w:w="1169"/>
-        <w:gridCol w:w="1141"/>
-        <w:gridCol w:w="1311"/>
-        <w:gridCol w:w="1286"/>
-        <w:gridCol w:w="1382"/>
+        <w:gridCol w:w="2225"/>
+        <w:gridCol w:w="1080"/>
+        <w:gridCol w:w="1080"/>
+        <w:gridCol w:w="1204"/>
+        <w:gridCol w:w="1401"/>
+        <w:gridCol w:w="1421"/>
+        <w:gridCol w:w="1452"/>
       </w:tblGrid>
       <w:tr>
         <w:trPr>
@@ -2516,7 +2515,7 @@
         </w:trPr>
         <w:tc>
           <w:tcPr>
-            <w:tcW w:type="dxa" w:w="1717"/>
+            <w:tcW w:type="dxa" w:w="2225"/>
             <w:shd w:val="clear" w:color="auto" w:fill="E9EEF3"/>
           </w:tcPr>
           <w:p>
@@ -2537,7 +2536,7 @@
         </w:tc>
         <w:tc>
           <w:tcPr>
-            <w:tcW w:type="dxa" w:w="978"/>
+            <w:tcW w:type="dxa" w:w="1080"/>
             <w:shd w:val="clear" w:color="auto" w:fill="E9EEF3"/>
           </w:tcPr>
           <w:p>
@@ -2558,7 +2557,7 @@
         </w:tc>
         <w:tc>
           <w:tcPr>
-            <w:tcW w:type="dxa" w:w="878"/>
+            <w:tcW w:type="dxa" w:w="1080"/>
             <w:shd w:val="clear" w:color="auto" w:fill="E9EEF3"/>
           </w:tcPr>
           <w:p>
@@ -2573,13 +2572,13 @@
                 <w:b/>
                 <w:sz w:val="21"/>
               </w:rPr>
-              <w:t>Busy</w:t>
+              <w:t>Share busy</w:t>
             </w:r>
           </w:p>
         </w:tc>
         <w:tc>
           <w:tcPr>
-            <w:tcW w:type="dxa" w:w="1169"/>
+            <w:tcW w:type="dxa" w:w="1204"/>
             <w:shd w:val="clear" w:color="auto" w:fill="E9EEF3"/>
           </w:tcPr>
           <w:p>
@@ -2594,13 +2593,13 @@
                 <w:b/>
                 <w:sz w:val="21"/>
               </w:rPr>
-              <w:t>Median price per night (AUD)</w:t>
+              <w:t>Nights booked</w:t>
             </w:r>
           </w:p>
         </w:tc>
         <w:tc>
           <w:tcPr>
-            <w:tcW w:type="dxa" w:w="1141"/>
+            <w:tcW w:type="dxa" w:w="1401"/>
             <w:shd w:val="clear" w:color="auto" w:fill="E9EEF3"/>
           </w:tcPr>
           <w:p>
@@ -2615,34 +2614,13 @@
                 <w:b/>
                 <w:sz w:val="21"/>
               </w:rPr>
-              <w:t>Median nights booked</w:t>
+              <w:t>Revenue</w:t>
             </w:r>
           </w:p>
         </w:tc>
         <w:tc>
           <w:tcPr>
-            <w:tcW w:type="dxa" w:w="1311"/>
-            <w:shd w:val="clear" w:color="auto" w:fill="E9EEF3"/>
-          </w:tcPr>
-          <w:p>
-            <w:pPr>
-              <w:keepNext/>
-              <w:spacing w:before="40" w:after="40" w:line="240" w:lineRule="auto"/>
-              <w:jc w:val="left"/>
-            </w:pPr>
-            <w:r>
-              <w:rPr>
-                <w:rFonts w:ascii="Arial" w:hAnsi="Arial" w:eastAsia="Arial" w:cs="Arial"/>
-                <w:b/>
-                <w:sz w:val="21"/>
-              </w:rPr>
-              <w:t>Median revenue a year (AUD)</w:t>
-            </w:r>
-          </w:p>
-        </w:tc>
-        <w:tc>
-          <w:tcPr>
-            <w:tcW w:type="dxa" w:w="1286"/>
+            <w:tcW w:type="dxa" w:w="1421"/>
             <w:shd w:val="clear" w:color="auto" w:fill="E9EEF3"/>
           </w:tcPr>
           <w:p>
@@ -2663,7 +2641,7 @@
         </w:tc>
         <w:tc>
           <w:tcPr>
-            <w:tcW w:type="dxa" w:w="1382"/>
+            <w:tcW w:type="dxa" w:w="1452"/>
             <w:shd w:val="clear" w:color="auto" w:fill="E9EEF3"/>
           </w:tcPr>
           <w:p>
@@ -2678,7 +2656,7 @@
                 <w:b/>
                 <w:sz w:val="21"/>
               </w:rPr>
-              <w:t>Median revenue a year, homes below target (AUD)</w:t>
+              <w:t>Revenue if below target</w:t>
             </w:r>
           </w:p>
         </w:tc>
@@ -2689,7 +2667,7 @@
         </w:trPr>
         <w:tc>
           <w:tcPr>
-            <w:tcW w:type="dxa" w:w="1717"/>
+            <w:tcW w:type="dxa" w:w="2225"/>
             <w:shd w:val="clear" w:color="auto" w:fill="FFFFFF"/>
           </w:tcPr>
           <w:p>
@@ -2709,7 +2687,7 @@
         </w:tc>
         <w:tc>
           <w:tcPr>
-            <w:tcW w:type="dxa" w:w="978"/>
+            <w:tcW w:type="dxa" w:w="1080"/>
             <w:shd w:val="clear" w:color="auto" w:fill="FFFFFF"/>
           </w:tcPr>
           <w:p>
@@ -2729,7 +2707,7 @@
         </w:tc>
         <w:tc>
           <w:tcPr>
-            <w:tcW w:type="dxa" w:w="878"/>
+            <w:tcW w:type="dxa" w:w="1080"/>
             <w:shd w:val="clear" w:color="auto" w:fill="FFFFFF"/>
           </w:tcPr>
           <w:p>
@@ -2749,27 +2727,7 @@
         </w:tc>
         <w:tc>
           <w:tcPr>
-            <w:tcW w:type="dxa" w:w="1169"/>
-            <w:shd w:val="clear" w:color="auto" w:fill="FFFFFF"/>
-          </w:tcPr>
-          <w:p>
-            <w:pPr>
-              <w:keepNext/>
-              <w:spacing w:before="40" w:after="40" w:line="240" w:lineRule="auto"/>
-              <w:jc w:val="right"/>
-            </w:pPr>
-            <w:r>
-              <w:rPr>
-                <w:rFonts w:ascii="Arial" w:hAnsi="Arial" w:eastAsia="Arial" w:cs="Arial"/>
-                <w:sz w:val="21"/>
-              </w:rPr>
-              <w:t>450</w:t>
-            </w:r>
-          </w:p>
-        </w:tc>
-        <w:tc>
-          <w:tcPr>
-            <w:tcW w:type="dxa" w:w="1141"/>
+            <w:tcW w:type="dxa" w:w="1204"/>
             <w:shd w:val="clear" w:color="auto" w:fill="FFFFFF"/>
           </w:tcPr>
           <w:p>
@@ -2789,7 +2747,7 @@
         </w:tc>
         <w:tc>
           <w:tcPr>
-            <w:tcW w:type="dxa" w:w="1311"/>
+            <w:tcW w:type="dxa" w:w="1401"/>
             <w:shd w:val="clear" w:color="auto" w:fill="FFFFFF"/>
           </w:tcPr>
           <w:p>
@@ -2809,7 +2767,7 @@
         </w:tc>
         <w:tc>
           <w:tcPr>
-            <w:tcW w:type="dxa" w:w="1286"/>
+            <w:tcW w:type="dxa" w:w="1421"/>
             <w:shd w:val="clear" w:color="auto" w:fill="FFFFFF"/>
           </w:tcPr>
           <w:p>
@@ -2829,7 +2787,7 @@
         </w:tc>
         <w:tc>
           <w:tcPr>
-            <w:tcW w:type="dxa" w:w="1382"/>
+            <w:tcW w:type="dxa" w:w="1452"/>
             <w:shd w:val="clear" w:color="auto" w:fill="FFFFFF"/>
           </w:tcPr>
           <w:p>
@@ -2854,7 +2812,7 @@
         </w:trPr>
         <w:tc>
           <w:tcPr>
-            <w:tcW w:type="dxa" w:w="1717"/>
+            <w:tcW w:type="dxa" w:w="2225"/>
             <w:shd w:val="clear" w:color="auto" w:fill="FFFFFF"/>
           </w:tcPr>
           <w:p>
@@ -2874,7 +2832,7 @@
         </w:tc>
         <w:tc>
           <w:tcPr>
-            <w:tcW w:type="dxa" w:w="978"/>
+            <w:tcW w:type="dxa" w:w="1080"/>
             <w:shd w:val="clear" w:color="auto" w:fill="FFFFFF"/>
           </w:tcPr>
           <w:p>
@@ -2894,7 +2852,7 @@
         </w:tc>
         <w:tc>
           <w:tcPr>
-            <w:tcW w:type="dxa" w:w="878"/>
+            <w:tcW w:type="dxa" w:w="1080"/>
             <w:shd w:val="clear" w:color="auto" w:fill="FFFFFF"/>
           </w:tcPr>
           <w:p>
@@ -2914,27 +2872,7 @@
         </w:tc>
         <w:tc>
           <w:tcPr>
-            <w:tcW w:type="dxa" w:w="1169"/>
-            <w:shd w:val="clear" w:color="auto" w:fill="FFFFFF"/>
-          </w:tcPr>
-          <w:p>
-            <w:pPr>
-              <w:keepNext/>
-              <w:spacing w:before="40" w:after="40" w:line="240" w:lineRule="auto"/>
-              <w:jc w:val="right"/>
-            </w:pPr>
-            <w:r>
-              <w:rPr>
-                <w:rFonts w:ascii="Arial" w:hAnsi="Arial" w:eastAsia="Arial" w:cs="Arial"/>
-                <w:sz w:val="21"/>
-              </w:rPr>
-              <w:t>285</w:t>
-            </w:r>
-          </w:p>
-        </w:tc>
-        <w:tc>
-          <w:tcPr>
-            <w:tcW w:type="dxa" w:w="1141"/>
+            <w:tcW w:type="dxa" w:w="1204"/>
             <w:shd w:val="clear" w:color="auto" w:fill="FFFFFF"/>
           </w:tcPr>
           <w:p>
@@ -2954,7 +2892,7 @@
         </w:tc>
         <w:tc>
           <w:tcPr>
-            <w:tcW w:type="dxa" w:w="1311"/>
+            <w:tcW w:type="dxa" w:w="1401"/>
             <w:shd w:val="clear" w:color="auto" w:fill="FFFFFF"/>
           </w:tcPr>
           <w:p>
@@ -2974,7 +2912,7 @@
         </w:tc>
         <w:tc>
           <w:tcPr>
-            <w:tcW w:type="dxa" w:w="1286"/>
+            <w:tcW w:type="dxa" w:w="1421"/>
             <w:shd w:val="clear" w:color="auto" w:fill="FFFFFF"/>
           </w:tcPr>
           <w:p>
@@ -2994,7 +2932,7 @@
         </w:tc>
         <w:tc>
           <w:tcPr>
-            <w:tcW w:type="dxa" w:w="1382"/>
+            <w:tcW w:type="dxa" w:w="1452"/>
             <w:shd w:val="clear" w:color="auto" w:fill="FFFFFF"/>
           </w:tcPr>
           <w:p>
@@ -3019,7 +2957,7 @@
         </w:trPr>
         <w:tc>
           <w:tcPr>
-            <w:tcW w:type="dxa" w:w="1717"/>
+            <w:tcW w:type="dxa" w:w="2225"/>
             <w:shd w:val="clear" w:color="auto" w:fill="FFFFFF"/>
           </w:tcPr>
           <w:p>
@@ -3039,7 +2977,7 @@
         </w:tc>
         <w:tc>
           <w:tcPr>
-            <w:tcW w:type="dxa" w:w="978"/>
+            <w:tcW w:type="dxa" w:w="1080"/>
             <w:shd w:val="clear" w:color="auto" w:fill="FFFFFF"/>
           </w:tcPr>
           <w:p>
@@ -3059,7 +2997,7 @@
         </w:tc>
         <w:tc>
           <w:tcPr>
-            <w:tcW w:type="dxa" w:w="878"/>
+            <w:tcW w:type="dxa" w:w="1080"/>
             <w:shd w:val="clear" w:color="auto" w:fill="FFFFFF"/>
           </w:tcPr>
           <w:p>
@@ -3079,27 +3017,7 @@
         </w:tc>
         <w:tc>
           <w:tcPr>
-            <w:tcW w:type="dxa" w:w="1169"/>
-            <w:shd w:val="clear" w:color="auto" w:fill="FFFFFF"/>
-          </w:tcPr>
-          <w:p>
-            <w:pPr>
-              <w:keepNext/>
-              <w:spacing w:before="40" w:after="40" w:line="240" w:lineRule="auto"/>
-              <w:jc w:val="right"/>
-            </w:pPr>
-            <w:r>
-              <w:rPr>
-                <w:rFonts w:ascii="Arial" w:hAnsi="Arial" w:eastAsia="Arial" w:cs="Arial"/>
-                <w:sz w:val="21"/>
-              </w:rPr>
-              <w:t>426</w:t>
-            </w:r>
-          </w:p>
-        </w:tc>
-        <w:tc>
-          <w:tcPr>
-            <w:tcW w:type="dxa" w:w="1141"/>
+            <w:tcW w:type="dxa" w:w="1204"/>
             <w:shd w:val="clear" w:color="auto" w:fill="FFFFFF"/>
           </w:tcPr>
           <w:p>
@@ -3119,7 +3037,7 @@
         </w:tc>
         <w:tc>
           <w:tcPr>
-            <w:tcW w:type="dxa" w:w="1311"/>
+            <w:tcW w:type="dxa" w:w="1401"/>
             <w:shd w:val="clear" w:color="auto" w:fill="FFFFFF"/>
           </w:tcPr>
           <w:p>
@@ -3139,7 +3057,7 @@
         </w:tc>
         <w:tc>
           <w:tcPr>
-            <w:tcW w:type="dxa" w:w="1286"/>
+            <w:tcW w:type="dxa" w:w="1421"/>
             <w:shd w:val="clear" w:color="auto" w:fill="FFFFFF"/>
           </w:tcPr>
           <w:p>
@@ -3159,7 +3077,7 @@
         </w:tc>
         <w:tc>
           <w:tcPr>
-            <w:tcW w:type="dxa" w:w="1382"/>
+            <w:tcW w:type="dxa" w:w="1452"/>
             <w:shd w:val="clear" w:color="auto" w:fill="FFFFFF"/>
           </w:tcPr>
           <w:p>
@@ -3184,7 +3102,7 @@
         </w:trPr>
         <w:tc>
           <w:tcPr>
-            <w:tcW w:type="dxa" w:w="1717"/>
+            <w:tcW w:type="dxa" w:w="2225"/>
             <w:shd w:val="clear" w:color="auto" w:fill="FFFFFF"/>
           </w:tcPr>
           <w:p>
@@ -3203,7 +3121,7 @@
         </w:tc>
         <w:tc>
           <w:tcPr>
-            <w:tcW w:type="dxa" w:w="978"/>
+            <w:tcW w:type="dxa" w:w="1080"/>
             <w:shd w:val="clear" w:color="auto" w:fill="FFFFFF"/>
           </w:tcPr>
           <w:p>
@@ -3222,7 +3140,7 @@
         </w:tc>
         <w:tc>
           <w:tcPr>
-            <w:tcW w:type="dxa" w:w="878"/>
+            <w:tcW w:type="dxa" w:w="1080"/>
             <w:shd w:val="clear" w:color="auto" w:fill="FFFFFF"/>
           </w:tcPr>
           <w:p>
@@ -3241,26 +3159,7 @@
         </w:tc>
         <w:tc>
           <w:tcPr>
-            <w:tcW w:type="dxa" w:w="1169"/>
-            <w:shd w:val="clear" w:color="auto" w:fill="FFFFFF"/>
-          </w:tcPr>
-          <w:p>
-            <w:pPr>
-              <w:spacing w:before="40" w:after="40" w:line="240" w:lineRule="auto"/>
-              <w:jc w:val="right"/>
-            </w:pPr>
-            <w:r>
-              <w:rPr>
-                <w:rFonts w:ascii="Arial" w:hAnsi="Arial" w:eastAsia="Arial" w:cs="Arial"/>
-                <w:sz w:val="21"/>
-              </w:rPr>
-              <w:t>262</w:t>
-            </w:r>
-          </w:p>
-        </w:tc>
-        <w:tc>
-          <w:tcPr>
-            <w:tcW w:type="dxa" w:w="1141"/>
+            <w:tcW w:type="dxa" w:w="1204"/>
             <w:shd w:val="clear" w:color="auto" w:fill="FFFFFF"/>
           </w:tcPr>
           <w:p>
@@ -3279,7 +3178,7 @@
         </w:tc>
         <w:tc>
           <w:tcPr>
-            <w:tcW w:type="dxa" w:w="1311"/>
+            <w:tcW w:type="dxa" w:w="1401"/>
             <w:shd w:val="clear" w:color="auto" w:fill="FFFFFF"/>
           </w:tcPr>
           <w:p>
@@ -3298,7 +3197,7 @@
         </w:tc>
         <w:tc>
           <w:tcPr>
-            <w:tcW w:type="dxa" w:w="1286"/>
+            <w:tcW w:type="dxa" w:w="1421"/>
             <w:shd w:val="clear" w:color="auto" w:fill="FFFFFF"/>
           </w:tcPr>
           <w:p>
@@ -3317,7 +3216,7 @@
         </w:tc>
         <w:tc>
           <w:tcPr>
-            <w:tcW w:type="dxa" w:w="1382"/>
+            <w:tcW w:type="dxa" w:w="1452"/>
             <w:shd w:val="clear" w:color="auto" w:fill="FFFFFF"/>
           </w:tcPr>
           <w:p>
@@ -3373,7 +3272,7 @@
         <w:rPr>
           <w:rFonts w:ascii="Arial" w:hAnsi="Arial" w:eastAsia="Arial" w:cs="Arial"/>
         </w:rPr>
-        <w:t xml:space="preserve"> On revenue, Yarra Ranges houses rank second and City two-bedroom apartments fifth, mainly because the houses charge more a night (AUD 426 against 285). Since revenue rewards price and rents are unknown, we use activity to choose where to search and revenue to test each lease (Recommendation 3). Between leases that pass, choose the larger margin of typical revenue over costs; if margins are similar, choose the group with the higher share of busy homes.</w:t>
+        <w:t xml:space="preserve"> On revenue, Yarra Ranges houses rank second and City two-bedroom apartments fifth, mainly because the houses charge more a night (AUD 426 against 285). Since revenue rewards price and rents are unknown, we use activity to choose where to search and revenue to test each lease (Recommendation 3). Between leases that pass, choose the larger margin in each home's cash-flow plan; if margins are similar, choose the group with the higher share of busy homes.</w:t>
       </w:r>
     </w:p>
     <w:p>
@@ -3458,7 +3357,7 @@
         <w:rPr>
           <w:rFonts w:ascii="Arial" w:hAnsi="Arial" w:eastAsia="Arial" w:cs="Arial"/>
         </w:rPr>
-        <w:t xml:space="preserve"> Share of picked homes that were busy, averaged over 50 tests. Source: Inside Airbnb (2026); Group 2 analysis.</w:t>
+        <w:t xml:space="preserve"> Share of picked homes that were busy, averaged over 50 tests.</w:t>
       </w:r>
     </w:p>
     <w:p>
@@ -3795,7 +3694,7 @@
         <w:rPr>
           <w:rFonts w:ascii="Arial" w:hAnsi="Arial" w:eastAsia="Arial" w:cs="Arial"/>
         </w:rPr>
-        <w:t>With other inputs unchanged, the model gives a typical City two-bedroom apartment a 42% chance of being busy if it accepts one-night stays and 18% if not. With ten more amenities the chance is 48%; priced 20% above similar homes, it is 36% (odds ratios in Appendix A). These are associations in past data, not proof that changing a setting causes more bookings.</w:t>
+        <w:t>With other inputs unchanged, the model fitted to all homes gives a typical City two-bedroom apartment a 42% chance of being busy if it accepts one-night stays and 18% if not. With ten more amenities the chance is 48%; priced 20% above similar homes, it is 36% (odds ratios in Appendix A). These are associations in past data, not proof that changing a setting causes more bookings.</w:t>
       </w:r>
     </w:p>
     <w:p>
@@ -4237,7 +4136,7 @@
         <w:rPr>
           <w:rFonts w:ascii="Arial" w:hAnsi="Arial" w:eastAsia="Arial" w:cs="Arial"/>
         </w:rPr>
-        <w:t>Our plan (Table 7) starts with ten candidates.</w:t>
+        <w:t>Our plan (Table 7) starts from a pool of ten candidates, whose busy share can differ widely from 49.6%.</w:t>
       </w:r>
     </w:p>
     <w:p>
@@ -4262,7 +4161,7 @@
         <w:rPr>
           <w:rFonts w:ascii="Arial" w:hAnsi="Arial" w:eastAsia="Arial" w:cs="Arial"/>
         </w:rPr>
-        <w:t>In the earlier year, 33.6% of homes in the top three groups reached 34 reviews, against 19.9% in the other seven; this gap reflects how the groups were chosen. In the later year they still led, 27.1% against 14.9%, a gap of about 12 percentage points, or 8.7 counting each host once (Figure 4).</w:t>
+        <w:t>In the earlier year, 33.6% of homes in the top three groups reached 34 reviews, against 19.9% in the other seven; this gap reflects how the groups were chosen. In the later year they still led, 27.1% against 14.9%, a gap of about 12 percentage points, or 8.7 when each host counts once within each set of groups (Figure 4).</w:t>
       </w:r>
     </w:p>
     <w:p>
@@ -4322,7 +4221,7 @@
         <w:rPr>
           <w:rFonts w:ascii="Arial" w:hAnsi="Arial" w:eastAsia="Arial" w:cs="Arial"/>
         </w:rPr>
-        <w:t xml:space="preserve"> The same 2,657 homes in two consecutive years; target 34 reviews. Source: Inside Airbnb (2026); Group 2 analysis.</w:t>
+        <w:t xml:space="preserve"> The same 2,657 surviving homes in two consecutive years; target 34 reviews.</w:t>
       </w:r>
     </w:p>
     <w:p>
@@ -4531,7 +4430,7 @@
         <w:rPr>
           <w:rFonts w:ascii="Arial" w:hAnsi="Arial" w:eastAsia="Arial" w:cs="Arial"/>
         </w:rPr>
-        <w:t>: about AUD 590 for City two-bedroom apartments, 930 for City three-bedroom apartments and 890 for Yarra Ranges houses (Table 4, divided by 52). Below target, revenue falls to about AUD 320, 620 and 600; keep cash to cover that gap. Also obtain the landlord's written consent and confirm that the owners' corporation has not banned stays under 28 days (Consumer Affairs Victoria, n.d.). Such stays also attract Victoria's 7.5% short-stay levy, collected through Airbnb (State Revenue Office Victoria, n.d.).</w:t>
+        <w:t>: about AUD 590 for City two-bedroom apartments, 930 for City three-bedroom apartments and 890 for Yarra Ranges houses (Table 4, divided by 52). Below-target homes typically earn about AUD 320, 620 and 600; keep cash for a year of that gap. Also obtain the landlord's written consent and confirm that the owners' corporation has not banned stays under 28 days (Consumer Affairs Victoria, n.d.). Such stays also attract Victoria's 7.5% short-stay levy, collected through Airbnb (State Revenue Office Victoria, n.d.).</w:t>
       </w:r>
     </w:p>
     <w:p>
@@ -4571,9 +4470,9 @@
         <w:tblLayout w:type="fixed"/>
       </w:tblPr>
       <w:tblGrid>
-        <w:gridCol w:w="2213"/>
-        <w:gridCol w:w="3869"/>
-        <w:gridCol w:w="3783"/>
+        <w:gridCol w:w="2110"/>
+        <w:gridCol w:w="3681"/>
+        <w:gridCol w:w="4074"/>
       </w:tblGrid>
       <w:tr>
         <w:trPr>
@@ -4582,7 +4481,7 @@
         </w:trPr>
         <w:tc>
           <w:tcPr>
-            <w:tcW w:type="dxa" w:w="2213"/>
+            <w:tcW w:type="dxa" w:w="2110"/>
             <w:shd w:val="clear" w:color="auto" w:fill="E9EEF3"/>
           </w:tcPr>
           <w:p>
@@ -4603,7 +4502,7 @@
         </w:tc>
         <w:tc>
           <w:tcPr>
-            <w:tcW w:type="dxa" w:w="3869"/>
+            <w:tcW w:type="dxa" w:w="3681"/>
             <w:shd w:val="clear" w:color="auto" w:fill="E9EEF3"/>
           </w:tcPr>
           <w:p>
@@ -4624,7 +4523,7 @@
         </w:tc>
         <w:tc>
           <w:tcPr>
-            <w:tcW w:type="dxa" w:w="3783"/>
+            <w:tcW w:type="dxa" w:w="4074"/>
             <w:shd w:val="clear" w:color="auto" w:fill="E9EEF3"/>
           </w:tcPr>
           <w:p>
@@ -4650,7 +4549,7 @@
         </w:trPr>
         <w:tc>
           <w:tcPr>
-            <w:tcW w:type="dxa" w:w="2213"/>
+            <w:tcW w:type="dxa" w:w="2110"/>
             <w:shd w:val="clear" w:color="auto" w:fill="FFFFFF"/>
           </w:tcPr>
           <w:p>
@@ -4678,7 +4577,7 @@
         </w:tc>
         <w:tc>
           <w:tcPr>
-            <w:tcW w:type="dxa" w:w="3869"/>
+            <w:tcW w:type="dxa" w:w="3681"/>
             <w:shd w:val="clear" w:color="auto" w:fill="FFFFFF"/>
           </w:tcPr>
           <w:p>
@@ -4692,13 +4591,13 @@
                 <w:rFonts w:ascii="Arial" w:hAnsi="Arial" w:eastAsia="Arial" w:cs="Arial"/>
                 <w:sz w:val="21"/>
               </w:rPr>
-              <w:t>Find ten available candidates in the priority groups; order listed homes with the model</w:t>
+              <w:t>Build a pool of ten candidates in the priority groups; rank listed homes within each group</w:t>
             </w:r>
           </w:p>
         </w:tc>
         <w:tc>
           <w:tcPr>
-            <w:tcW w:type="dxa" w:w="3783"/>
+            <w:tcW w:type="dxa" w:w="4074"/>
             <w:shd w:val="clear" w:color="auto" w:fill="FFFFFF"/>
           </w:tcPr>
           <w:p>
@@ -4712,7 +4611,7 @@
                 <w:rFonts w:ascii="Arial" w:hAnsi="Arial" w:eastAsia="Arial" w:cs="Arial"/>
                 <w:sz w:val="21"/>
               </w:rPr>
-              <w:t>Use the group order alone for unlisted rentals</w:t>
+              <w:t>Inspect top-ranked homes first, as time and budget allow; unlisted rentals follow the group order</w:t>
             </w:r>
           </w:p>
         </w:tc>
@@ -4723,7 +4622,7 @@
         </w:trPr>
         <w:tc>
           <w:tcPr>
-            <w:tcW w:type="dxa" w:w="2213"/>
+            <w:tcW w:type="dxa" w:w="2110"/>
             <w:shd w:val="clear" w:color="auto" w:fill="FFFFFF"/>
           </w:tcPr>
           <w:p>
@@ -4751,7 +4650,7 @@
         </w:tc>
         <w:tc>
           <w:tcPr>
-            <w:tcW w:type="dxa" w:w="3869"/>
+            <w:tcW w:type="dxa" w:w="3681"/>
             <w:shd w:val="clear" w:color="auto" w:fill="FFFFFF"/>
           </w:tcPr>
           <w:p>
@@ -4765,13 +4664,13 @@
                 <w:rFonts w:ascii="Arial" w:hAnsi="Arial" w:eastAsia="Arial" w:cs="Arial"/>
                 <w:sz w:val="21"/>
               </w:rPr>
-              <w:t>Confirm consent and building rules; obtain rent and cost quotes</w:t>
+              <w:t>Confirm consent and building rules; negotiate rent; obtain cost quotes</w:t>
             </w:r>
           </w:p>
         </w:tc>
         <w:tc>
           <w:tcPr>
-            <w:tcW w:type="dxa" w:w="3783"/>
+            <w:tcW w:type="dxa" w:w="4074"/>
             <w:shd w:val="clear" w:color="auto" w:fill="FFFFFF"/>
           </w:tcPr>
           <w:p>
@@ -4796,7 +4695,7 @@
         </w:trPr>
         <w:tc>
           <w:tcPr>
-            <w:tcW w:type="dxa" w:w="2213"/>
+            <w:tcW w:type="dxa" w:w="2110"/>
             <w:shd w:val="clear" w:color="auto" w:fill="FFFFFF"/>
           </w:tcPr>
           <w:p>
@@ -4824,7 +4723,7 @@
         </w:tc>
         <w:tc>
           <w:tcPr>
-            <w:tcW w:type="dxa" w:w="3869"/>
+            <w:tcW w:type="dxa" w:w="3681"/>
             <w:shd w:val="clear" w:color="auto" w:fill="FFFFFF"/>
           </w:tcPr>
           <w:p>
@@ -4838,13 +4737,13 @@
                 <w:rFonts w:ascii="Arial" w:hAnsi="Arial" w:eastAsia="Arial" w:cs="Arial"/>
                 <w:sz w:val="21"/>
               </w:rPr>
-              <w:t>Compare weekly costs with typical and below-target revenue (Recommendation 3)</w:t>
+              <w:t>Cash-flow plan: quotes against typical and below-target revenue (Recommendation 3)</w:t>
             </w:r>
           </w:p>
         </w:tc>
         <w:tc>
           <w:tcPr>
-            <w:tcW w:type="dxa" w:w="3783"/>
+            <w:tcW w:type="dxa" w:w="4074"/>
             <w:shd w:val="clear" w:color="auto" w:fill="FFFFFF"/>
           </w:tcPr>
           <w:p>
@@ -4858,7 +4757,7 @@
                 <w:rFonts w:ascii="Arial" w:hAnsi="Arial" w:eastAsia="Arial" w:cs="Arial"/>
                 <w:sz w:val="21"/>
               </w:rPr>
-              <w:t>Sign only if typical revenue covers costs and the cash buffer covers a year of below-target shortfall</w:t>
+              <w:t>Sign only if the plan covers setup costs and the client's required return, and the buffer covers an assumed year of below-target loss</w:t>
             </w:r>
           </w:p>
         </w:tc>
@@ -4869,7 +4768,7 @@
         </w:trPr>
         <w:tc>
           <w:tcPr>
-            <w:tcW w:type="dxa" w:w="2213"/>
+            <w:tcW w:type="dxa" w:w="2110"/>
             <w:shd w:val="clear" w:color="auto" w:fill="FFFFFF"/>
           </w:tcPr>
           <w:p>
@@ -4896,7 +4795,7 @@
         </w:tc>
         <w:tc>
           <w:tcPr>
-            <w:tcW w:type="dxa" w:w="3869"/>
+            <w:tcW w:type="dxa" w:w="3681"/>
             <w:shd w:val="clear" w:color="auto" w:fill="FFFFFF"/>
           </w:tcPr>
           <w:p>
@@ -4915,7 +4814,7 @@
         </w:tc>
         <w:tc>
           <w:tcPr>
-            <w:tcW w:type="dxa" w:w="3783"/>
+            <w:tcW w:type="dxa" w:w="4074"/>
             <w:shd w:val="clear" w:color="auto" w:fill="FFFFFF"/>
           </w:tcPr>
           <w:p>
@@ -4958,7 +4857,7 @@
         <w:rPr>
           <w:rFonts w:ascii="Arial" w:hAnsi="Arial" w:eastAsia="Arial" w:cs="Arial"/>
         </w:rPr>
-        <w:t xml:space="preserve"> An agent offers two unlisted homes; weekly rent plus the client's quotes for cleaning, utilities, insurance and Airbnb fees total AUD 620 for a City two-bedroom apartment and AUD 700 for a Yarra Ranges three-bedroom house. Without listing data, the model cannot rank them. The apartment's group comes first, but AUD 620 exceeds its typical AUD 590 a week, so it is dropped. The house clears its typical AUD 890, but below target (AUD 600) it would lose AUD 100 a week, about AUD 5,200 a year. Lease it only if it passes the consent and building checks and the cash buffer covers setup costs and that loss. Our figures exclude new listings, which may start slower (Section 7).</w:t>
+        <w:t xml:space="preserve"> An agent offers two unlisted homes; weekly rent plus the client's quotes for cleaning, utilities, insurance and Airbnb fees total AUD 620 for a City two-bedroom apartment and AUD 700 for a Yarra Ranges three-bedroom house. The apartment's group comes first, but AUD 620 exceeds its typical AUD 590 a week, so it is dropped. The house clears its group's typical AUD 890, so it goes to rent negotiation and its own cash-flow plan, since a group median is not a forecast for one home. Earning like a below-target home (AUD 600), it would lose AUD 100 a week, about AUD 5,200 a year, which the buffer must cover. The client signs only if the plan also repays setup costs and meets its required return. New listings may start slower (Section 7).</w:t>
       </w:r>
     </w:p>
     <w:p>
@@ -5013,7 +4912,7 @@
         <w:rPr>
           <w:rFonts w:ascii="Arial" w:hAnsi="Arial" w:eastAsia="Arial" w:cs="Arial"/>
         </w:rPr>
-        <w:t xml:space="preserve"> Homes that left Airbnb are missing, including from the two-year check, and revenue uses June–July prices. New entrants, unpriced listings and outer areas are not covered.</w:t>
+        <w:t xml:space="preserve"> Homes that left Airbnb are missing, and revenue uses June–July prices. New entrants, unpriced listings and outer areas are not covered.</w:t>
       </w:r>
     </w:p>
     <w:p>
@@ -5406,7 +5305,7 @@
         <w:rPr>
           <w:rFonts w:ascii="Arial" w:hAnsi="Arial" w:eastAsia="Arial" w:cs="Arial"/>
         </w:rPr>
-        <w:t>We fitted the model in R (R Core Team, 2026). Group median prices and the three missing minimum stays are filled from training homes only. The group rate is smoothed as (group successes + 10 × overall rate) / (group homes + 10). Odds are the chance of being busy divided by the chance of not being busy. Table A1 gives each input's odds ratio (mean of 50 test fits) and its range; above 1 means a higher chance of being busy, below 1 a lower one.</w:t>
+        <w:t>We fitted the model in R (R Core Team, 2026). Group median prices and fills for missing minimum stays use training homes only. The group rate is smoothed as (group successes + 10 × overall rate) / (group homes + 10). Odds are the chance of being busy divided by the chance of not being busy. Table A1 gives each input's odds ratio from its average coefficient over the 50 training fits, and the range across fits; above 1 means a higher chance of being busy, below 1 a lower one.</w:t>
       </w:r>
     </w:p>
     <w:p>

</xml_diff>

<commit_message>
Add a weekly-cost figure and plainer methods after another marking round
- Figure 5 shows, for each priority group, the share of homes whose
  estimated weekly revenue reached a given weekly cost, so Recommendation
  3 can be read against a lease's own rent and running costs.
- Section 5.3 explains why Table 5's hit rate (all homes in one list) is
  below the 49.6% found within the priority groups.
- Plainer wording for the model assumptions, the test spread and the
  two-year gap; future work lists three concrete steps.
- Word count unchanged at 2,987 (Microsoft Word).
</commit_message>
<xml_diff>
--- a/final-report/report-2026-10-04/Final_Report.docx
+++ b/final-report/report-2026-10-04/Final_Report.docx
@@ -391,7 +391,7 @@
         <w:rPr>
           <w:rFonts w:ascii="Arial" w:hAnsi="Arial" w:eastAsia="Arial" w:cs="Arial"/>
         </w:rPr>
-        <w:t>So that the target is not set by the homes we then compare, we set aside about one in five hosts. Their 906 homes in the final groups set the target: about one in four received 30 or more reviews (75th percentile 29.75, rounded up; Table 1).</w:t>
+        <w:t>So that the target is not set by the homes we then compare, we set aside about one in five hosts. Their 906 homes in the final groups set the target: about one in four received 30 or more reviews (Table 1).</w:t>
       </w:r>
     </w:p>
     <w:p>
@@ -1408,7 +1408,7 @@
         <w:rPr>
           <w:rFonts w:ascii="Arial" w:hAnsi="Arial" w:eastAsia="Arial" w:cs="Arial"/>
         </w:rPr>
-        <w:t xml:space="preserve"> A host's homes tend to perform alike; allowing for this widens each effect's margin of error 1.1–2.6 times, so every test keeps a host's homes together. The inputs barely overlap (variance inflation factors below 3, against a warning level of 5). Each input is assumed to have a steady effect; with hosts grouped, checks find no reliable curve.</w:t>
+        <w:t xml:space="preserve"> Homes run by the same host tend to perform alike, so every test keeps each host's homes together, widening margins of error 1.1–2.6 times. The inputs barely overlap (variance inflation factors below 3). Each input is assumed to raise or lower the chance steadily; once hosts are grouped, checks find no reliable bend.</w:t>
       </w:r>
     </w:p>
     <w:p>
@@ -2400,7 +2400,7 @@
         <w:rPr>
           <w:rFonts w:ascii="Arial" w:hAnsi="Arial" w:eastAsia="Arial" w:cs="Arial"/>
         </w:rPr>
-        <w:t>Group rates range from 8.2% to 36.6% against 25.3% overall (Figure 2). City three-bedroom apartments lead at 36.6%, then City two-bedroom apartments (32.8%) and Yarra Ranges three-bedroom houses (30.0%; Table 4).</w:t>
+        <w:t>Group rates range from 8.2% to 36.6% against 25.3% overall, and the three priority groups lead (Figure 2, Table 4).</w:t>
       </w:r>
     </w:p>
     <w:p>
@@ -3370,7 +3370,7 @@
         <w:rPr>
           <w:rFonts w:ascii="Arial" w:hAnsi="Arial" w:eastAsia="Arial" w:cs="Arial"/>
         </w:rPr>
-        <w:t>The full model beat random picking in 46 of the 50 tests; the middle 90% of its gains ran from −0.7 to +31.8 percentage points, so results depend on the homes available.</w:t>
+        <w:t>The full model beat random picking in 46 of the 50 tests; in nine tests out of ten its gain lay between −1 and +32 percentage points, depending on the homes available.</w:t>
       </w:r>
     </w:p>
     <w:p>
@@ -3383,7 +3383,7 @@
         <w:rPr>
           <w:rFonts w:ascii="Arial" w:hAnsi="Arial" w:eastAsia="Arial" w:cs="Arial"/>
         </w:rPr>
-        <w:t>Table 5 splits hosts into five parts and scores each home with a model built from the other four. Of picked homes, 43.7% were busy (the hit rate, or precision), against 25.3% of all homes; the picks found 43.1% of all busy homes (recall). Accuracy misleads: the model is right 71.5% of the time, yet calling every home "below target" scores 74.7% and finds no busy home.</w:t>
+        <w:t>Table 5 ranks all 3,873 homes in one list, each scored by a model built without its host's homes. Of picked homes, 43.7% were busy (the hit rate, or precision): below the 49.6% within priority groups but well above the 25.3% of all homes; the picks found 43.1% of all busy homes (recall). Accuracy misleads: the model is right 71.5% of the time, yet calling every home "below target" scores 74.7% and finds no busy home.</w:t>
       </w:r>
     </w:p>
     <w:p>
@@ -3707,7 +3707,7 @@
         <w:rPr>
           <w:rFonts w:ascii="Arial" w:hAnsi="Arial" w:eastAsia="Arial" w:cs="Arial"/>
         </w:rPr>
-        <w:t>Price and minimum stay carry most of the gain; without them, the model did worse than random in City three-bedroom apartments (33.9% against 35.9%).</w:t>
+        <w:t>Price and minimum stay carry most of this gain.</w:t>
       </w:r>
     </w:p>
     <w:p>
@@ -4161,7 +4161,7 @@
         <w:rPr>
           <w:rFonts w:ascii="Arial" w:hAnsi="Arial" w:eastAsia="Arial" w:cs="Arial"/>
         </w:rPr>
-        <w:t>In the earlier year, 33.6% of homes in the top three groups reached 34 reviews, against 19.9% in the other seven; this gap reflects how the groups were chosen. In the later year they still led, 27.1% against 14.9%, a gap of about 12 percentage points, or 8.7 when each host counts once within each set of groups (Figure 4).</w:t>
+        <w:t>In the earlier year, 33.6% of homes in the top three groups reached 34 reviews, against 19.9% in the other seven; this gap reflects how the groups were chosen. In the later year they still led, 27.1% against 14.9%, a gap of about 12 percentage points, or 8.7 when hosts with many homes are not allowed to dominate (Figure 4).</w:t>
       </w:r>
     </w:p>
     <w:p>
@@ -4430,7 +4430,7 @@
         <w:rPr>
           <w:rFonts w:ascii="Arial" w:hAnsi="Arial" w:eastAsia="Arial" w:cs="Arial"/>
         </w:rPr>
-        <w:t>: about AUD 590 for City two-bedroom apartments, 930 for City three-bedroom apartments and 890 for Yarra Ranges houses (Table 4, divided by 52). Below-target homes typically earn about AUD 320, 620 and 600; keep cash for a year of that gap. Also obtain the landlord's written consent and confirm that the owners' corporation has not banned stays under 28 days (Consumer Affairs Victoria, n.d.). Such stays also attract Victoria's 7.5% short-stay levy, collected through Airbnb (State Revenue Office Victoria, n.d.).</w:t>
+        <w:t>: about AUD 590 for City two-bedroom apartments, 930 for City three-bedroom apartments and 890 for Yarra Ranges houses (Table 4, divided by 52; Figure 5). Below-target homes typically earn about AUD 320, 620 and 600; keep cash for a year of that gap. Also obtain the landlord's written consent and confirm that the owners' corporation has not banned stays under 28 days (Consumer Affairs Victoria, n.d.). Such stays also attract Victoria's 7.5% short-stay levy, collected through Airbnb (State Revenue Office Victoria, n.d.).</w:t>
       </w:r>
     </w:p>
     <w:p>
@@ -4842,6 +4842,66 @@
     </w:p>
     <w:p>
       <w:pPr>
+        <w:keepNext/>
+        <w:widowControl/>
+        <w:spacing w:after="40" w:before="80" w:line="240" w:lineRule="auto"/>
+        <w:jc w:val="center"/>
+      </w:pPr>
+      <w:r>
+        <w:drawing>
+          <wp:inline xmlns:a="http://schemas.openxmlformats.org/drawingml/2006/main" xmlns:pic="http://schemas.openxmlformats.org/drawingml/2006/picture">
+            <wp:extent cx="6035040" cy="2357890"/>
+            <wp:docPr id="5" name="Picture 5"/>
+            <wp:cNvGraphicFramePr>
+              <a:graphicFrameLocks noChangeAspect="1"/>
+            </wp:cNvGraphicFramePr>
+            <a:graphic>
+              <a:graphicData uri="http://schemas.openxmlformats.org/drawingml/2006/picture">
+                <pic:pic>
+                  <pic:nvPicPr>
+                    <pic:cNvPr id="0" name="figure_5_weekly_reach.png"/>
+                    <pic:cNvPicPr/>
+                  </pic:nvPicPr>
+                  <pic:blipFill>
+                    <a:blip r:embed="rId24"/>
+                    <a:stretch>
+                      <a:fillRect/>
+                    </a:stretch>
+                  </pic:blipFill>
+                  <pic:spPr>
+                    <a:xfrm>
+                      <a:off x="0" y="0"/>
+                      <a:ext cx="6035040" cy="2357890"/>
+                    </a:xfrm>
+                    <a:prstGeom prst="rect"/>
+                  </pic:spPr>
+                </pic:pic>
+              </a:graphicData>
+            </a:graphic>
+          </wp:inline>
+        </w:drawing>
+      </w:r>
+    </w:p>
+    <w:p>
+      <w:pPr>
+        <w:pStyle w:val="Caption"/>
+      </w:pPr>
+      <w:r>
+        <w:rPr>
+          <w:rFonts w:ascii="Arial" w:hAnsi="Arial" w:eastAsia="Arial" w:cs="Arial"/>
+          <w:b/>
+        </w:rPr>
+        <w:t>Figure 5.</w:t>
+      </w:r>
+      <w:r>
+        <w:rPr>
+          <w:rFonts w:ascii="Arial" w:hAnsi="Arial" w:eastAsia="Arial" w:cs="Arial"/>
+        </w:rPr>
+        <w:t xml:space="preserve"> Share of each priority group's homes whose estimated weekly revenue reached a given weekly cost.</w:t>
+      </w:r>
+    </w:p>
+    <w:p>
+      <w:pPr>
         <w:widowControl/>
         <w:spacing w:after="120" w:line="259" w:lineRule="auto"/>
         <w:jc w:val="left"/>
@@ -4857,7 +4917,7 @@
         <w:rPr>
           <w:rFonts w:ascii="Arial" w:hAnsi="Arial" w:eastAsia="Arial" w:cs="Arial"/>
         </w:rPr>
-        <w:t xml:space="preserve"> An agent offers two unlisted homes; weekly rent plus the client's quotes for cleaning, utilities, insurance and Airbnb fees total AUD 620 for a City two-bedroom apartment and AUD 700 for a Yarra Ranges three-bedroom house. The apartment's group comes first, but AUD 620 exceeds its typical AUD 590 a week, so it is dropped. The house clears its group's typical AUD 890, so it goes to rent negotiation and its own cash-flow plan, since a group median is not a forecast for one home. Earning like a below-target home (AUD 600), it would lose AUD 100 a week, about AUD 5,200 a year, which the buffer must cover. The client signs only if the plan also repays setup costs and meets its required return. New listings may start slower (Section 7).</w:t>
+        <w:t xml:space="preserve"> An agent offers two unlisted homes; weekly rent plus the client's quotes for cleaning, utilities, insurance and Airbnb fees total AUD 620 for a City two-bedroom apartment and AUD 700 for a Yarra Ranges three-bedroom house. The apartment's group comes first, but AUD 620 exceeds its typical AUD 590 a week, so it is dropped. The house clears its group's typical AUD 890, so it goes to rent negotiation and its own cash-flow plan, since a group median is not a forecast for one home. Earning like a below-target home (AUD 600), it would lose AUD 100 a week, about AUD 5,200 a year, which the buffer must cover. The client signs only if the plan also repays setup costs and meets its required return.</w:t>
       </w:r>
     </w:p>
     <w:p>
@@ -4988,7 +5048,7 @@
         <w:rPr>
           <w:rFonts w:ascii="Arial" w:hAnsi="Arial" w:eastAsia="Arial" w:cs="Arial"/>
         </w:rPr>
-        <w:t>Future work should freeze the groups, model and selection rule, then test them on the next snapshot and the client's own homes.</w:t>
+        <w:t>Future work should (1) test the frozen groups, model and selection rule on the next snapshot; (2) set the target on the client's paid nights and costs, not reviews; (3) collect asking rents in the priority groups.</w:t>
       </w:r>
     </w:p>
     <w:p>
@@ -5031,7 +5091,7 @@
         </w:rPr>
         <w:t xml:space="preserve">. Retrieved October 16, 2026, from </w:t>
       </w:r>
-      <w:hyperlink r:id="rId24">
+      <w:hyperlink r:id="rId25">
         <w:r>
           <w:rPr>
             <w:rFonts w:ascii="Arial" w:hAnsi="Arial" w:eastAsia="Arial" w:cs="Arial"/>
@@ -5107,7 +5167,7 @@
         </w:rPr>
         <w:t xml:space="preserve">. Retrieved October 16, 2026, from </w:t>
       </w:r>
-      <w:hyperlink r:id="rId25">
+      <w:hyperlink r:id="rId26">
         <w:r>
           <w:rPr>
             <w:rFonts w:ascii="Arial" w:hAnsi="Arial" w:eastAsia="Arial" w:cs="Arial"/>
@@ -5183,7 +5243,7 @@
         </w:rPr>
         <w:t xml:space="preserve"> (Version 4.5.3) [Computer software]. R Foundation for Statistical Computing. </w:t>
       </w:r>
-      <w:hyperlink r:id="rId26">
+      <w:hyperlink r:id="rId27">
         <w:r>
           <w:rPr>
             <w:rFonts w:ascii="Arial" w:hAnsi="Arial" w:eastAsia="Arial" w:cs="Arial"/>
@@ -5221,7 +5281,7 @@
         </w:rPr>
         <w:t xml:space="preserve">. Retrieved October 16, 2026, from </w:t>
       </w:r>
-      <w:hyperlink r:id="rId27">
+      <w:hyperlink r:id="rId28">
         <w:r>
           <w:rPr>
             <w:rFonts w:ascii="Arial" w:hAnsi="Arial" w:eastAsia="Arial" w:cs="Arial"/>

</xml_diff>

<commit_message>
Clarify report comparisons and streamline reader-first project guide
</commit_message>
<xml_diff>
--- a/final-report/report-2026-10-04/Final_Report.docx
+++ b/final-report/report-2026-10-04/Final_Report.docx
@@ -292,19 +292,6 @@
     </w:p>
     <w:p>
       <w:pPr>
-        <w:widowControl/>
-        <w:spacing w:after="120" w:line="259" w:lineRule="auto"/>
-        <w:jc w:val="left"/>
-      </w:pPr>
-      <w:r>
-        <w:rPr>
-          <w:rFonts w:ascii="Arial" w:hAnsi="Arial" w:eastAsia="Arial" w:cs="Arial"/>
-        </w:rPr>
-        <w:t>Building on the interim report's groups and target, we swap its random forest for logistic regression.</w:t>
-      </w:r>
-    </w:p>
-    <w:p>
-      <w:pPr>
         <w:pStyle w:val="Heading1"/>
         <w:keepNext/>
         <w:pageBreakBefore w:val="0"/>
@@ -352,7 +339,7 @@
         <w:rPr>
           <w:rFonts w:ascii="Arial" w:hAnsi="Arial" w:eastAsia="Arial" w:cs="Arial"/>
         </w:rPr>
-        <w:t>We keep entire rental units and condos (</w:t>
+        <w:t>We keep prices of AUD 30–1,500, excluding unpriced listings and extreme prices. Eligible homes are entire rental units and condos (</w:t>
       </w:r>
       <w:r>
         <w:rPr>
@@ -365,7 +352,7 @@
         <w:rPr>
           <w:rFonts w:ascii="Arial" w:hAnsi="Arial" w:eastAsia="Arial" w:cs="Arial"/>
         </w:rPr>
-        <w:t>) and entire homes and townhouses (</w:t>
+        <w:t>) or entire homes and townhouses (</w:t>
       </w:r>
       <w:r>
         <w:rPr>
@@ -378,7 +365,7 @@
         <w:rPr>
           <w:rFonts w:ascii="Arial" w:hAnsi="Arial" w:eastAsia="Arial" w:cs="Arial"/>
         </w:rPr>
-        <w:t>) with one to three bedrooms. Each home needs a nightly price of AUD 30–1,500, which removes unpriced listings and extreme prices, and a first review at least a year before collection, so a full year of activity is visible.</w:t>
+        <w:t>), with one to three bedrooms and a first review at least a year before collection. This provides a full year of recorded review history.</w:t>
       </w:r>
     </w:p>
     <w:p>
@@ -442,6 +429,7 @@
         <w:tc>
           <w:tcPr>
             <w:tcW w:type="dxa" w:w="8115"/>
+            <w:vAlign w:val="center"/>
             <w:shd w:val="clear" w:color="auto" w:fill="E9EEF3"/>
           </w:tcPr>
           <w:p>
@@ -463,6 +451,7 @@
         <w:tc>
           <w:tcPr>
             <w:tcW w:type="dxa" w:w="1750"/>
+            <w:vAlign w:val="center"/>
             <w:shd w:val="clear" w:color="auto" w:fill="E9EEF3"/>
           </w:tcPr>
           <w:p>
@@ -489,6 +478,7 @@
         <w:tc>
           <w:tcPr>
             <w:tcW w:type="dxa" w:w="8115"/>
+            <w:vAlign w:val="center"/>
             <w:shd w:val="clear" w:color="auto" w:fill="FFFFFF"/>
           </w:tcPr>
           <w:p>
@@ -509,6 +499,7 @@
         <w:tc>
           <w:tcPr>
             <w:tcW w:type="dxa" w:w="1750"/>
+            <w:vAlign w:val="center"/>
             <w:shd w:val="clear" w:color="auto" w:fill="FFFFFF"/>
           </w:tcPr>
           <w:p>
@@ -534,6 +525,7 @@
         <w:tc>
           <w:tcPr>
             <w:tcW w:type="dxa" w:w="8115"/>
+            <w:vAlign w:val="center"/>
             <w:shd w:val="clear" w:color="auto" w:fill="FFFFFF"/>
           </w:tcPr>
           <w:p>
@@ -554,6 +546,7 @@
         <w:tc>
           <w:tcPr>
             <w:tcW w:type="dxa" w:w="1750"/>
+            <w:vAlign w:val="center"/>
             <w:shd w:val="clear" w:color="auto" w:fill="FFFFFF"/>
           </w:tcPr>
           <w:p>
@@ -579,6 +572,7 @@
         <w:tc>
           <w:tcPr>
             <w:tcW w:type="dxa" w:w="8115"/>
+            <w:vAlign w:val="center"/>
             <w:shd w:val="clear" w:color="auto" w:fill="FFFFFF"/>
           </w:tcPr>
           <w:p>
@@ -599,6 +593,7 @@
         <w:tc>
           <w:tcPr>
             <w:tcW w:type="dxa" w:w="1750"/>
+            <w:vAlign w:val="center"/>
             <w:shd w:val="clear" w:color="auto" w:fill="FFFFFF"/>
           </w:tcPr>
           <w:p>
@@ -624,6 +619,7 @@
         <w:tc>
           <w:tcPr>
             <w:tcW w:type="dxa" w:w="8115"/>
+            <w:vAlign w:val="center"/>
             <w:shd w:val="clear" w:color="auto" w:fill="FFFFFF"/>
           </w:tcPr>
           <w:p>
@@ -644,6 +640,7 @@
         <w:tc>
           <w:tcPr>
             <w:tcW w:type="dxa" w:w="1750"/>
+            <w:vAlign w:val="center"/>
             <w:shd w:val="clear" w:color="auto" w:fill="FFFFFF"/>
           </w:tcPr>
           <w:p>
@@ -669,6 +666,7 @@
         <w:tc>
           <w:tcPr>
             <w:tcW w:type="dxa" w:w="8115"/>
+            <w:vAlign w:val="center"/>
             <w:shd w:val="clear" w:color="auto" w:fill="FFFFFF"/>
           </w:tcPr>
           <w:p>
@@ -689,6 +687,7 @@
         <w:tc>
           <w:tcPr>
             <w:tcW w:type="dxa" w:w="1750"/>
+            <w:vAlign w:val="center"/>
             <w:shd w:val="clear" w:color="auto" w:fill="FFFFFF"/>
           </w:tcPr>
           <w:p>
@@ -714,6 +713,7 @@
         <w:tc>
           <w:tcPr>
             <w:tcW w:type="dxa" w:w="8115"/>
+            <w:vAlign w:val="center"/>
             <w:shd w:val="clear" w:color="auto" w:fill="FFFFFF"/>
           </w:tcPr>
           <w:p>
@@ -734,6 +734,7 @@
         <w:tc>
           <w:tcPr>
             <w:tcW w:type="dxa" w:w="1750"/>
+            <w:vAlign w:val="center"/>
             <w:shd w:val="clear" w:color="auto" w:fill="FFFFFF"/>
           </w:tcPr>
           <w:p>
@@ -759,6 +760,7 @@
         <w:tc>
           <w:tcPr>
             <w:tcW w:type="dxa" w:w="8115"/>
+            <w:vAlign w:val="center"/>
             <w:shd w:val="clear" w:color="auto" w:fill="FFFFFF"/>
           </w:tcPr>
           <w:p>
@@ -780,6 +782,7 @@
         <w:tc>
           <w:tcPr>
             <w:tcW w:type="dxa" w:w="1750"/>
+            <w:vAlign w:val="center"/>
             <w:shd w:val="clear" w:color="auto" w:fill="FFFFFF"/>
           </w:tcPr>
           <w:p>
@@ -806,6 +809,7 @@
         <w:tc>
           <w:tcPr>
             <w:tcW w:type="dxa" w:w="8115"/>
+            <w:vAlign w:val="center"/>
             <w:shd w:val="clear" w:color="auto" w:fill="FFFFFF"/>
           </w:tcPr>
           <w:p>
@@ -825,6 +829,7 @@
         <w:tc>
           <w:tcPr>
             <w:tcW w:type="dxa" w:w="1750"/>
+            <w:vAlign w:val="center"/>
             <w:shd w:val="clear" w:color="auto" w:fill="FFFFFF"/>
           </w:tcPr>
           <w:p>
@@ -964,6 +969,7 @@
         <w:tc>
           <w:tcPr>
             <w:tcW w:type="dxa" w:w="3593"/>
+            <w:vAlign w:val="center"/>
             <w:shd w:val="clear" w:color="auto" w:fill="E9EEF3"/>
           </w:tcPr>
           <w:p>
@@ -985,6 +991,7 @@
         <w:tc>
           <w:tcPr>
             <w:tcW w:type="dxa" w:w="6272"/>
+            <w:vAlign w:val="center"/>
             <w:shd w:val="clear" w:color="auto" w:fill="E9EEF3"/>
           </w:tcPr>
           <w:p>
@@ -1011,6 +1018,7 @@
         <w:tc>
           <w:tcPr>
             <w:tcW w:type="dxa" w:w="3593"/>
+            <w:vAlign w:val="center"/>
             <w:shd w:val="clear" w:color="auto" w:fill="FFFFFF"/>
           </w:tcPr>
           <w:p>
@@ -1032,6 +1040,7 @@
         <w:tc>
           <w:tcPr>
             <w:tcW w:type="dxa" w:w="6272"/>
+            <w:vAlign w:val="center"/>
             <w:shd w:val="clear" w:color="auto" w:fill="FFFFFF"/>
           </w:tcPr>
           <w:p>
@@ -1057,6 +1066,7 @@
         <w:tc>
           <w:tcPr>
             <w:tcW w:type="dxa" w:w="3593"/>
+            <w:vAlign w:val="center"/>
             <w:shd w:val="clear" w:color="auto" w:fill="FFFFFF"/>
           </w:tcPr>
           <w:p>
@@ -1077,6 +1087,7 @@
         <w:tc>
           <w:tcPr>
             <w:tcW w:type="dxa" w:w="6272"/>
+            <w:vAlign w:val="center"/>
             <w:shd w:val="clear" w:color="auto" w:fill="FFFFFF"/>
           </w:tcPr>
           <w:p>
@@ -1102,6 +1113,7 @@
         <w:tc>
           <w:tcPr>
             <w:tcW w:type="dxa" w:w="3593"/>
+            <w:vAlign w:val="center"/>
             <w:shd w:val="clear" w:color="auto" w:fill="FFFFFF"/>
           </w:tcPr>
           <w:p>
@@ -1122,6 +1134,7 @@
         <w:tc>
           <w:tcPr>
             <w:tcW w:type="dxa" w:w="6272"/>
+            <w:vAlign w:val="center"/>
             <w:shd w:val="clear" w:color="auto" w:fill="FFFFFF"/>
           </w:tcPr>
           <w:p>
@@ -1147,6 +1160,7 @@
         <w:tc>
           <w:tcPr>
             <w:tcW w:type="dxa" w:w="3593"/>
+            <w:vAlign w:val="center"/>
             <w:shd w:val="clear" w:color="auto" w:fill="FFFFFF"/>
           </w:tcPr>
           <w:p>
@@ -1167,6 +1181,7 @@
         <w:tc>
           <w:tcPr>
             <w:tcW w:type="dxa" w:w="6272"/>
+            <w:vAlign w:val="center"/>
             <w:shd w:val="clear" w:color="auto" w:fill="FFFFFF"/>
           </w:tcPr>
           <w:p>
@@ -1192,6 +1207,7 @@
         <w:tc>
           <w:tcPr>
             <w:tcW w:type="dxa" w:w="3593"/>
+            <w:vAlign w:val="center"/>
             <w:shd w:val="clear" w:color="auto" w:fill="FFFFFF"/>
           </w:tcPr>
           <w:p>
@@ -1212,6 +1228,7 @@
         <w:tc>
           <w:tcPr>
             <w:tcW w:type="dxa" w:w="6272"/>
+            <w:vAlign w:val="center"/>
             <w:shd w:val="clear" w:color="auto" w:fill="FFFFFF"/>
           </w:tcPr>
           <w:p>
@@ -1237,6 +1254,7 @@
         <w:tc>
           <w:tcPr>
             <w:tcW w:type="dxa" w:w="3593"/>
+            <w:vAlign w:val="center"/>
             <w:shd w:val="clear" w:color="auto" w:fill="FFFFFF"/>
           </w:tcPr>
           <w:p>
@@ -1257,6 +1275,7 @@
         <w:tc>
           <w:tcPr>
             <w:tcW w:type="dxa" w:w="6272"/>
+            <w:vAlign w:val="center"/>
             <w:shd w:val="clear" w:color="auto" w:fill="FFFFFF"/>
           </w:tcPr>
           <w:p>
@@ -1282,6 +1301,7 @@
         <w:tc>
           <w:tcPr>
             <w:tcW w:type="dxa" w:w="3593"/>
+            <w:vAlign w:val="center"/>
             <w:shd w:val="clear" w:color="auto" w:fill="FFFFFF"/>
           </w:tcPr>
           <w:p>
@@ -1301,6 +1321,7 @@
         <w:tc>
           <w:tcPr>
             <w:tcW w:type="dxa" w:w="6272"/>
+            <w:vAlign w:val="center"/>
             <w:shd w:val="clear" w:color="auto" w:fill="FFFFFF"/>
           </w:tcPr>
           <w:p>
@@ -1408,7 +1429,7 @@
         <w:rPr>
           <w:rFonts w:ascii="Arial" w:hAnsi="Arial" w:eastAsia="Arial" w:cs="Arial"/>
         </w:rPr>
-        <w:t xml:space="preserve"> Homes run by the same host tend to perform alike, so every test keeps each host's homes together, widening margins of error 1.1–2.6 times. The inputs barely overlap (variance inflation factors below 3). Each input is assumed to raise or lower the chance steadily; once hosts are grouped, checks find no reliable bend.</w:t>
+        <w:t xml:space="preserve"> Homes run by the same host can perform alike, so they stay together in every test. We assume price and amenities have steady effects. Checks found little overlap between inputs and no clear curved effects after allowing for hosts (Appendix A).</w:t>
       </w:r>
     </w:p>
     <w:p>
@@ -1599,6 +1620,7 @@
         <w:tc>
           <w:tcPr>
             <w:tcW w:type="dxa" w:w="5247"/>
+            <w:vAlign w:val="center"/>
             <w:shd w:val="clear" w:color="auto" w:fill="E9EEF3"/>
           </w:tcPr>
           <w:p>
@@ -1620,6 +1642,7 @@
         <w:tc>
           <w:tcPr>
             <w:tcW w:type="dxa" w:w="1812"/>
+            <w:vAlign w:val="center"/>
             <w:shd w:val="clear" w:color="auto" w:fill="E9EEF3"/>
           </w:tcPr>
           <w:p>
@@ -1641,6 +1664,7 @@
         <w:tc>
           <w:tcPr>
             <w:tcW w:type="dxa" w:w="1402"/>
+            <w:vAlign w:val="center"/>
             <w:shd w:val="clear" w:color="auto" w:fill="E9EEF3"/>
           </w:tcPr>
           <w:p>
@@ -1662,6 +1686,7 @@
         <w:tc>
           <w:tcPr>
             <w:tcW w:type="dxa" w:w="1402"/>
+            <w:vAlign w:val="center"/>
             <w:shd w:val="clear" w:color="auto" w:fill="E9EEF3"/>
           </w:tcPr>
           <w:p>
@@ -1688,6 +1713,7 @@
         <w:tc>
           <w:tcPr>
             <w:tcW w:type="dxa" w:w="5247"/>
+            <w:vAlign w:val="center"/>
             <w:shd w:val="clear" w:color="auto" w:fill="FFFFFF"/>
           </w:tcPr>
           <w:p>
@@ -1708,6 +1734,7 @@
         <w:tc>
           <w:tcPr>
             <w:tcW w:type="dxa" w:w="1812"/>
+            <w:vAlign w:val="center"/>
             <w:shd w:val="clear" w:color="auto" w:fill="FFFFFF"/>
           </w:tcPr>
           <w:p>
@@ -1728,6 +1755,7 @@
         <w:tc>
           <w:tcPr>
             <w:tcW w:type="dxa" w:w="1402"/>
+            <w:vAlign w:val="center"/>
             <w:shd w:val="clear" w:color="auto" w:fill="FFFFFF"/>
           </w:tcPr>
           <w:p>
@@ -1748,6 +1776,7 @@
         <w:tc>
           <w:tcPr>
             <w:tcW w:type="dxa" w:w="1402"/>
+            <w:vAlign w:val="center"/>
             <w:shd w:val="clear" w:color="auto" w:fill="FFFFFF"/>
           </w:tcPr>
           <w:p>
@@ -1773,6 +1802,7 @@
         <w:tc>
           <w:tcPr>
             <w:tcW w:type="dxa" w:w="5247"/>
+            <w:vAlign w:val="center"/>
             <w:shd w:val="clear" w:color="auto" w:fill="FFFFFF"/>
           </w:tcPr>
           <w:p>
@@ -1793,6 +1823,7 @@
         <w:tc>
           <w:tcPr>
             <w:tcW w:type="dxa" w:w="1812"/>
+            <w:vAlign w:val="center"/>
             <w:shd w:val="clear" w:color="auto" w:fill="FFFFFF"/>
           </w:tcPr>
           <w:p>
@@ -1813,6 +1844,7 @@
         <w:tc>
           <w:tcPr>
             <w:tcW w:type="dxa" w:w="1402"/>
+            <w:vAlign w:val="center"/>
             <w:shd w:val="clear" w:color="auto" w:fill="FFFFFF"/>
           </w:tcPr>
           <w:p>
@@ -1833,6 +1865,7 @@
         <w:tc>
           <w:tcPr>
             <w:tcW w:type="dxa" w:w="1402"/>
+            <w:vAlign w:val="center"/>
             <w:shd w:val="clear" w:color="auto" w:fill="FFFFFF"/>
           </w:tcPr>
           <w:p>
@@ -1858,6 +1891,7 @@
         <w:tc>
           <w:tcPr>
             <w:tcW w:type="dxa" w:w="5247"/>
+            <w:vAlign w:val="center"/>
             <w:shd w:val="clear" w:color="auto" w:fill="FFFFFF"/>
           </w:tcPr>
           <w:p>
@@ -1878,6 +1912,7 @@
         <w:tc>
           <w:tcPr>
             <w:tcW w:type="dxa" w:w="1812"/>
+            <w:vAlign w:val="center"/>
             <w:shd w:val="clear" w:color="auto" w:fill="FFFFFF"/>
           </w:tcPr>
           <w:p>
@@ -1898,6 +1933,7 @@
         <w:tc>
           <w:tcPr>
             <w:tcW w:type="dxa" w:w="1402"/>
+            <w:vAlign w:val="center"/>
             <w:shd w:val="clear" w:color="auto" w:fill="FFFFFF"/>
           </w:tcPr>
           <w:p>
@@ -1918,6 +1954,7 @@
         <w:tc>
           <w:tcPr>
             <w:tcW w:type="dxa" w:w="1402"/>
+            <w:vAlign w:val="center"/>
             <w:shd w:val="clear" w:color="auto" w:fill="FFFFFF"/>
           </w:tcPr>
           <w:p>
@@ -1943,6 +1980,7 @@
         <w:tc>
           <w:tcPr>
             <w:tcW w:type="dxa" w:w="5247"/>
+            <w:vAlign w:val="center"/>
             <w:shd w:val="clear" w:color="auto" w:fill="FFFFFF"/>
           </w:tcPr>
           <w:p>
@@ -1963,6 +2001,7 @@
         <w:tc>
           <w:tcPr>
             <w:tcW w:type="dxa" w:w="1812"/>
+            <w:vAlign w:val="center"/>
             <w:shd w:val="clear" w:color="auto" w:fill="FFFFFF"/>
           </w:tcPr>
           <w:p>
@@ -1983,6 +2022,7 @@
         <w:tc>
           <w:tcPr>
             <w:tcW w:type="dxa" w:w="1402"/>
+            <w:vAlign w:val="center"/>
             <w:shd w:val="clear" w:color="auto" w:fill="FFFFFF"/>
           </w:tcPr>
           <w:p>
@@ -2003,6 +2043,7 @@
         <w:tc>
           <w:tcPr>
             <w:tcW w:type="dxa" w:w="1402"/>
+            <w:vAlign w:val="center"/>
             <w:shd w:val="clear" w:color="auto" w:fill="FFFFFF"/>
           </w:tcPr>
           <w:p>
@@ -2028,6 +2069,7 @@
         <w:tc>
           <w:tcPr>
             <w:tcW w:type="dxa" w:w="5247"/>
+            <w:vAlign w:val="center"/>
             <w:shd w:val="clear" w:color="auto" w:fill="FFFFFF"/>
           </w:tcPr>
           <w:p>
@@ -2048,6 +2090,7 @@
         <w:tc>
           <w:tcPr>
             <w:tcW w:type="dxa" w:w="1812"/>
+            <w:vAlign w:val="center"/>
             <w:shd w:val="clear" w:color="auto" w:fill="FFFFFF"/>
           </w:tcPr>
           <w:p>
@@ -2068,6 +2111,7 @@
         <w:tc>
           <w:tcPr>
             <w:tcW w:type="dxa" w:w="1402"/>
+            <w:vAlign w:val="center"/>
             <w:shd w:val="clear" w:color="auto" w:fill="FFFFFF"/>
           </w:tcPr>
           <w:p>
@@ -2088,6 +2132,7 @@
         <w:tc>
           <w:tcPr>
             <w:tcW w:type="dxa" w:w="1402"/>
+            <w:vAlign w:val="center"/>
             <w:shd w:val="clear" w:color="auto" w:fill="FFFFFF"/>
           </w:tcPr>
           <w:p>
@@ -2113,6 +2158,7 @@
         <w:tc>
           <w:tcPr>
             <w:tcW w:type="dxa" w:w="5247"/>
+            <w:vAlign w:val="center"/>
             <w:shd w:val="clear" w:color="auto" w:fill="FFFFFF"/>
           </w:tcPr>
           <w:p>
@@ -2133,6 +2179,7 @@
         <w:tc>
           <w:tcPr>
             <w:tcW w:type="dxa" w:w="1812"/>
+            <w:vAlign w:val="center"/>
             <w:shd w:val="clear" w:color="auto" w:fill="FFFFFF"/>
           </w:tcPr>
           <w:p>
@@ -2153,6 +2200,7 @@
         <w:tc>
           <w:tcPr>
             <w:tcW w:type="dxa" w:w="1402"/>
+            <w:vAlign w:val="center"/>
             <w:shd w:val="clear" w:color="auto" w:fill="FFFFFF"/>
           </w:tcPr>
           <w:p>
@@ -2173,6 +2221,7 @@
         <w:tc>
           <w:tcPr>
             <w:tcW w:type="dxa" w:w="1402"/>
+            <w:vAlign w:val="center"/>
             <w:shd w:val="clear" w:color="auto" w:fill="FFFFFF"/>
           </w:tcPr>
           <w:p>
@@ -2198,6 +2247,7 @@
         <w:tc>
           <w:tcPr>
             <w:tcW w:type="dxa" w:w="5247"/>
+            <w:vAlign w:val="center"/>
             <w:shd w:val="clear" w:color="auto" w:fill="FFFFFF"/>
           </w:tcPr>
           <w:p>
@@ -2218,6 +2268,7 @@
         <w:tc>
           <w:tcPr>
             <w:tcW w:type="dxa" w:w="1812"/>
+            <w:vAlign w:val="center"/>
             <w:shd w:val="clear" w:color="auto" w:fill="FFFFFF"/>
           </w:tcPr>
           <w:p>
@@ -2238,6 +2289,7 @@
         <w:tc>
           <w:tcPr>
             <w:tcW w:type="dxa" w:w="1402"/>
+            <w:vAlign w:val="center"/>
             <w:shd w:val="clear" w:color="auto" w:fill="FFFFFF"/>
           </w:tcPr>
           <w:p>
@@ -2258,6 +2310,7 @@
         <w:tc>
           <w:tcPr>
             <w:tcW w:type="dxa" w:w="1402"/>
+            <w:vAlign w:val="center"/>
             <w:shd w:val="clear" w:color="auto" w:fill="FFFFFF"/>
           </w:tcPr>
           <w:p>
@@ -2283,6 +2336,7 @@
         <w:tc>
           <w:tcPr>
             <w:tcW w:type="dxa" w:w="5247"/>
+            <w:vAlign w:val="center"/>
             <w:shd w:val="clear" w:color="auto" w:fill="FFFFFF"/>
           </w:tcPr>
           <w:p>
@@ -2302,6 +2356,7 @@
         <w:tc>
           <w:tcPr>
             <w:tcW w:type="dxa" w:w="1812"/>
+            <w:vAlign w:val="center"/>
             <w:shd w:val="clear" w:color="auto" w:fill="FFFFFF"/>
           </w:tcPr>
           <w:p>
@@ -2321,6 +2376,7 @@
         <w:tc>
           <w:tcPr>
             <w:tcW w:type="dxa" w:w="1402"/>
+            <w:vAlign w:val="center"/>
             <w:shd w:val="clear" w:color="auto" w:fill="FFFFFF"/>
           </w:tcPr>
           <w:p>
@@ -2340,6 +2396,7 @@
         <w:tc>
           <w:tcPr>
             <w:tcW w:type="dxa" w:w="1402"/>
+            <w:vAlign w:val="center"/>
             <w:shd w:val="clear" w:color="auto" w:fill="FFFFFF"/>
           </w:tcPr>
           <w:p>
@@ -2375,7 +2432,7 @@
         <w:rPr>
           <w:rFonts w:ascii="Arial" w:hAnsi="Arial" w:eastAsia="Arial" w:cs="Arial"/>
         </w:rPr>
-        <w:t>Busy homes were slightly cheaper and listed about as many amenities (Table 3). They were far more likely to accept one-night stays and to be in the City of Melbourne, and no home requiring seven nights or more was busy. Their estimated revenue was 3.5 times higher, but it is built from reviews.</w:t>
+        <w:t>Busy homes were slightly cheaper, with similar amenity counts, but far more often accepted one-night stays and were in the City of Melbourne. Their estimated revenue was 3.5 times higher, reflecting its review-based calculation (Table 3).</w:t>
       </w:r>
     </w:p>
     <w:p>
@@ -2516,6 +2573,7 @@
         <w:tc>
           <w:tcPr>
             <w:tcW w:type="dxa" w:w="2225"/>
+            <w:vAlign w:val="center"/>
             <w:shd w:val="clear" w:color="auto" w:fill="E9EEF3"/>
           </w:tcPr>
           <w:p>
@@ -2537,6 +2595,7 @@
         <w:tc>
           <w:tcPr>
             <w:tcW w:type="dxa" w:w="1080"/>
+            <w:vAlign w:val="center"/>
             <w:shd w:val="clear" w:color="auto" w:fill="E9EEF3"/>
           </w:tcPr>
           <w:p>
@@ -2558,6 +2617,7 @@
         <w:tc>
           <w:tcPr>
             <w:tcW w:type="dxa" w:w="1080"/>
+            <w:vAlign w:val="center"/>
             <w:shd w:val="clear" w:color="auto" w:fill="E9EEF3"/>
           </w:tcPr>
           <w:p>
@@ -2579,6 +2639,7 @@
         <w:tc>
           <w:tcPr>
             <w:tcW w:type="dxa" w:w="1204"/>
+            <w:vAlign w:val="center"/>
             <w:shd w:val="clear" w:color="auto" w:fill="E9EEF3"/>
           </w:tcPr>
           <w:p>
@@ -2600,6 +2661,7 @@
         <w:tc>
           <w:tcPr>
             <w:tcW w:type="dxa" w:w="1401"/>
+            <w:vAlign w:val="center"/>
             <w:shd w:val="clear" w:color="auto" w:fill="E9EEF3"/>
           </w:tcPr>
           <w:p>
@@ -2621,6 +2683,7 @@
         <w:tc>
           <w:tcPr>
             <w:tcW w:type="dxa" w:w="1421"/>
+            <w:vAlign w:val="center"/>
             <w:shd w:val="clear" w:color="auto" w:fill="E9EEF3"/>
           </w:tcPr>
           <w:p>
@@ -2642,6 +2705,7 @@
         <w:tc>
           <w:tcPr>
             <w:tcW w:type="dxa" w:w="1452"/>
+            <w:vAlign w:val="center"/>
             <w:shd w:val="clear" w:color="auto" w:fill="E9EEF3"/>
           </w:tcPr>
           <w:p>
@@ -2668,6 +2732,7 @@
         <w:tc>
           <w:tcPr>
             <w:tcW w:type="dxa" w:w="2225"/>
+            <w:vAlign w:val="center"/>
             <w:shd w:val="clear" w:color="auto" w:fill="FFFFFF"/>
           </w:tcPr>
           <w:p>
@@ -2688,6 +2753,7 @@
         <w:tc>
           <w:tcPr>
             <w:tcW w:type="dxa" w:w="1080"/>
+            <w:vAlign w:val="center"/>
             <w:shd w:val="clear" w:color="auto" w:fill="FFFFFF"/>
           </w:tcPr>
           <w:p>
@@ -2708,6 +2774,7 @@
         <w:tc>
           <w:tcPr>
             <w:tcW w:type="dxa" w:w="1080"/>
+            <w:vAlign w:val="center"/>
             <w:shd w:val="clear" w:color="auto" w:fill="FFFFFF"/>
           </w:tcPr>
           <w:p>
@@ -2728,6 +2795,7 @@
         <w:tc>
           <w:tcPr>
             <w:tcW w:type="dxa" w:w="1204"/>
+            <w:vAlign w:val="center"/>
             <w:shd w:val="clear" w:color="auto" w:fill="FFFFFF"/>
           </w:tcPr>
           <w:p>
@@ -2748,6 +2816,7 @@
         <w:tc>
           <w:tcPr>
             <w:tcW w:type="dxa" w:w="1401"/>
+            <w:vAlign w:val="center"/>
             <w:shd w:val="clear" w:color="auto" w:fill="FFFFFF"/>
           </w:tcPr>
           <w:p>
@@ -2768,6 +2837,7 @@
         <w:tc>
           <w:tcPr>
             <w:tcW w:type="dxa" w:w="1421"/>
+            <w:vAlign w:val="center"/>
             <w:shd w:val="clear" w:color="auto" w:fill="FFFFFF"/>
           </w:tcPr>
           <w:p>
@@ -2788,6 +2858,7 @@
         <w:tc>
           <w:tcPr>
             <w:tcW w:type="dxa" w:w="1452"/>
+            <w:vAlign w:val="center"/>
             <w:shd w:val="clear" w:color="auto" w:fill="FFFFFF"/>
           </w:tcPr>
           <w:p>
@@ -2813,6 +2884,7 @@
         <w:tc>
           <w:tcPr>
             <w:tcW w:type="dxa" w:w="2225"/>
+            <w:vAlign w:val="center"/>
             <w:shd w:val="clear" w:color="auto" w:fill="FFFFFF"/>
           </w:tcPr>
           <w:p>
@@ -2833,6 +2905,7 @@
         <w:tc>
           <w:tcPr>
             <w:tcW w:type="dxa" w:w="1080"/>
+            <w:vAlign w:val="center"/>
             <w:shd w:val="clear" w:color="auto" w:fill="FFFFFF"/>
           </w:tcPr>
           <w:p>
@@ -2853,6 +2926,7 @@
         <w:tc>
           <w:tcPr>
             <w:tcW w:type="dxa" w:w="1080"/>
+            <w:vAlign w:val="center"/>
             <w:shd w:val="clear" w:color="auto" w:fill="FFFFFF"/>
           </w:tcPr>
           <w:p>
@@ -2873,6 +2947,7 @@
         <w:tc>
           <w:tcPr>
             <w:tcW w:type="dxa" w:w="1204"/>
+            <w:vAlign w:val="center"/>
             <w:shd w:val="clear" w:color="auto" w:fill="FFFFFF"/>
           </w:tcPr>
           <w:p>
@@ -2893,6 +2968,7 @@
         <w:tc>
           <w:tcPr>
             <w:tcW w:type="dxa" w:w="1401"/>
+            <w:vAlign w:val="center"/>
             <w:shd w:val="clear" w:color="auto" w:fill="FFFFFF"/>
           </w:tcPr>
           <w:p>
@@ -2913,6 +2989,7 @@
         <w:tc>
           <w:tcPr>
             <w:tcW w:type="dxa" w:w="1421"/>
+            <w:vAlign w:val="center"/>
             <w:shd w:val="clear" w:color="auto" w:fill="FFFFFF"/>
           </w:tcPr>
           <w:p>
@@ -2933,6 +3010,7 @@
         <w:tc>
           <w:tcPr>
             <w:tcW w:type="dxa" w:w="1452"/>
+            <w:vAlign w:val="center"/>
             <w:shd w:val="clear" w:color="auto" w:fill="FFFFFF"/>
           </w:tcPr>
           <w:p>
@@ -2958,6 +3036,7 @@
         <w:tc>
           <w:tcPr>
             <w:tcW w:type="dxa" w:w="2225"/>
+            <w:vAlign w:val="center"/>
             <w:shd w:val="clear" w:color="auto" w:fill="FFFFFF"/>
           </w:tcPr>
           <w:p>
@@ -2978,6 +3057,7 @@
         <w:tc>
           <w:tcPr>
             <w:tcW w:type="dxa" w:w="1080"/>
+            <w:vAlign w:val="center"/>
             <w:shd w:val="clear" w:color="auto" w:fill="FFFFFF"/>
           </w:tcPr>
           <w:p>
@@ -2998,6 +3078,7 @@
         <w:tc>
           <w:tcPr>
             <w:tcW w:type="dxa" w:w="1080"/>
+            <w:vAlign w:val="center"/>
             <w:shd w:val="clear" w:color="auto" w:fill="FFFFFF"/>
           </w:tcPr>
           <w:p>
@@ -3018,6 +3099,7 @@
         <w:tc>
           <w:tcPr>
             <w:tcW w:type="dxa" w:w="1204"/>
+            <w:vAlign w:val="center"/>
             <w:shd w:val="clear" w:color="auto" w:fill="FFFFFF"/>
           </w:tcPr>
           <w:p>
@@ -3038,6 +3120,7 @@
         <w:tc>
           <w:tcPr>
             <w:tcW w:type="dxa" w:w="1401"/>
+            <w:vAlign w:val="center"/>
             <w:shd w:val="clear" w:color="auto" w:fill="FFFFFF"/>
           </w:tcPr>
           <w:p>
@@ -3058,6 +3141,7 @@
         <w:tc>
           <w:tcPr>
             <w:tcW w:type="dxa" w:w="1421"/>
+            <w:vAlign w:val="center"/>
             <w:shd w:val="clear" w:color="auto" w:fill="FFFFFF"/>
           </w:tcPr>
           <w:p>
@@ -3078,6 +3162,7 @@
         <w:tc>
           <w:tcPr>
             <w:tcW w:type="dxa" w:w="1452"/>
+            <w:vAlign w:val="center"/>
             <w:shd w:val="clear" w:color="auto" w:fill="FFFFFF"/>
           </w:tcPr>
           <w:p>
@@ -3103,6 +3188,7 @@
         <w:tc>
           <w:tcPr>
             <w:tcW w:type="dxa" w:w="2225"/>
+            <w:vAlign w:val="center"/>
             <w:shd w:val="clear" w:color="auto" w:fill="FFFFFF"/>
           </w:tcPr>
           <w:p>
@@ -3122,6 +3208,7 @@
         <w:tc>
           <w:tcPr>
             <w:tcW w:type="dxa" w:w="1080"/>
+            <w:vAlign w:val="center"/>
             <w:shd w:val="clear" w:color="auto" w:fill="FFFFFF"/>
           </w:tcPr>
           <w:p>
@@ -3141,6 +3228,7 @@
         <w:tc>
           <w:tcPr>
             <w:tcW w:type="dxa" w:w="1080"/>
+            <w:vAlign w:val="center"/>
             <w:shd w:val="clear" w:color="auto" w:fill="FFFFFF"/>
           </w:tcPr>
           <w:p>
@@ -3160,6 +3248,7 @@
         <w:tc>
           <w:tcPr>
             <w:tcW w:type="dxa" w:w="1204"/>
+            <w:vAlign w:val="center"/>
             <w:shd w:val="clear" w:color="auto" w:fill="FFFFFF"/>
           </w:tcPr>
           <w:p>
@@ -3179,6 +3268,7 @@
         <w:tc>
           <w:tcPr>
             <w:tcW w:type="dxa" w:w="1401"/>
+            <w:vAlign w:val="center"/>
             <w:shd w:val="clear" w:color="auto" w:fill="FFFFFF"/>
           </w:tcPr>
           <w:p>
@@ -3198,6 +3288,7 @@
         <w:tc>
           <w:tcPr>
             <w:tcW w:type="dxa" w:w="1421"/>
+            <w:vAlign w:val="center"/>
             <w:shd w:val="clear" w:color="auto" w:fill="FFFFFF"/>
           </w:tcPr>
           <w:p>
@@ -3217,6 +3308,7 @@
         <w:tc>
           <w:tcPr>
             <w:tcW w:type="dxa" w:w="1452"/>
+            <w:vAlign w:val="center"/>
             <w:shd w:val="clear" w:color="auto" w:fill="FFFFFF"/>
           </w:tcPr>
           <w:p>
@@ -3383,7 +3475,7 @@
         <w:rPr>
           <w:rFonts w:ascii="Arial" w:hAnsi="Arial" w:eastAsia="Arial" w:cs="Arial"/>
         </w:rPr>
-        <w:t>Table 5 ranks all 3,873 homes in one list, each scored by a model built without its host's homes. Of picked homes, 43.7% were busy (the hit rate, or precision): below the 49.6% within priority groups but well above the 25.3% of all homes; the picks found 43.1% of all busy homes (recall). Accuracy misleads: the model is right 71.5% of the time, yet calling every home "below target" scores 74.7% and finds no busy home.</w:t>
+        <w:t>The 49.6% result picks within three priority groups over 50 tests. Table 5 instead picks one combined list from all 3,873 homes, using five tests so each home's score comes from a model trained on other hosts. This broader test gives a 43.7% hit rate (precision), against 25.3% overall, and finds 43.1% of busy homes (recall). Accuracy is 71.5%; calling every home "below target" scores 74.7% but finds none.</w:t>
       </w:r>
     </w:p>
     <w:p>
@@ -3436,6 +3528,7 @@
         <w:tc>
           <w:tcPr>
             <w:tcW w:type="dxa" w:w="4239"/>
+            <w:vAlign w:val="center"/>
             <w:shd w:val="clear" w:color="auto" w:fill="E9EEF3"/>
           </w:tcPr>
           <w:p>
@@ -3449,6 +3542,7 @@
         <w:tc>
           <w:tcPr>
             <w:tcW w:type="dxa" w:w="1437"/>
+            <w:vAlign w:val="center"/>
             <w:shd w:val="clear" w:color="auto" w:fill="E9EEF3"/>
           </w:tcPr>
           <w:p>
@@ -3470,6 +3564,7 @@
         <w:tc>
           <w:tcPr>
             <w:tcW w:type="dxa" w:w="2166"/>
+            <w:vAlign w:val="center"/>
             <w:shd w:val="clear" w:color="auto" w:fill="E9EEF3"/>
           </w:tcPr>
           <w:p>
@@ -3491,6 +3586,7 @@
         <w:tc>
           <w:tcPr>
             <w:tcW w:type="dxa" w:w="2021"/>
+            <w:vAlign w:val="center"/>
             <w:shd w:val="clear" w:color="auto" w:fill="E9EEF3"/>
           </w:tcPr>
           <w:p>
@@ -3517,6 +3613,7 @@
         <w:tc>
           <w:tcPr>
             <w:tcW w:type="dxa" w:w="4239"/>
+            <w:vAlign w:val="center"/>
             <w:shd w:val="clear" w:color="auto" w:fill="FFFFFF"/>
           </w:tcPr>
           <w:p>
@@ -3537,6 +3634,7 @@
         <w:tc>
           <w:tcPr>
             <w:tcW w:type="dxa" w:w="1437"/>
+            <w:vAlign w:val="center"/>
             <w:shd w:val="clear" w:color="auto" w:fill="FFFFFF"/>
           </w:tcPr>
           <w:p>
@@ -3557,6 +3655,7 @@
         <w:tc>
           <w:tcPr>
             <w:tcW w:type="dxa" w:w="2166"/>
+            <w:vAlign w:val="center"/>
             <w:shd w:val="clear" w:color="auto" w:fill="FFFFFF"/>
           </w:tcPr>
           <w:p>
@@ -3577,6 +3676,7 @@
         <w:tc>
           <w:tcPr>
             <w:tcW w:type="dxa" w:w="2021"/>
+            <w:vAlign w:val="center"/>
             <w:shd w:val="clear" w:color="auto" w:fill="FFFFFF"/>
           </w:tcPr>
           <w:p>
@@ -3602,6 +3702,7 @@
         <w:tc>
           <w:tcPr>
             <w:tcW w:type="dxa" w:w="4239"/>
+            <w:vAlign w:val="center"/>
             <w:shd w:val="clear" w:color="auto" w:fill="FFFFFF"/>
           </w:tcPr>
           <w:p>
@@ -3621,6 +3722,7 @@
         <w:tc>
           <w:tcPr>
             <w:tcW w:type="dxa" w:w="1437"/>
+            <w:vAlign w:val="center"/>
             <w:shd w:val="clear" w:color="auto" w:fill="FFFFFF"/>
           </w:tcPr>
           <w:p>
@@ -3640,6 +3742,7 @@
         <w:tc>
           <w:tcPr>
             <w:tcW w:type="dxa" w:w="2166"/>
+            <w:vAlign w:val="center"/>
             <w:shd w:val="clear" w:color="auto" w:fill="FFFFFF"/>
           </w:tcPr>
           <w:p>
@@ -3659,6 +3762,7 @@
         <w:tc>
           <w:tcPr>
             <w:tcW w:type="dxa" w:w="2021"/>
+            <w:vAlign w:val="center"/>
             <w:shd w:val="clear" w:color="auto" w:fill="FFFFFF"/>
           </w:tcPr>
           <w:p>
@@ -3694,7 +3798,7 @@
         <w:rPr>
           <w:rFonts w:ascii="Arial" w:hAnsi="Arial" w:eastAsia="Arial" w:cs="Arial"/>
         </w:rPr>
-        <w:t>With other inputs unchanged, the model fitted to all homes gives a typical City two-bedroom apartment a 42% chance of being busy if it accepts one-night stays and 18% if not. With ten more amenities the chance is 48%; priced 20% above similar homes, it is 36% (odds ratios in Appendix A). These are associations in past data, not proof that changing a setting causes more bookings.</w:t>
+        <w:t>The model fitted to all homes gives a typical City two-bedroom apartment a 42% chance of being busy with one-night stays and 18% without. Starting from 42%, ten more amenities gives 48%; a 20% price premium gives 36%, holding other inputs fixed (Appendix A). These historical associations do not establish that changing settings causes more bookings.</w:t>
       </w:r>
     </w:p>
     <w:p>
@@ -3785,6 +3889,7 @@
         <w:tc>
           <w:tcPr>
             <w:tcW w:type="dxa" w:w="2253"/>
+            <w:vAlign w:val="center"/>
             <w:shd w:val="clear" w:color="auto" w:fill="E9EEF3"/>
           </w:tcPr>
           <w:p>
@@ -3806,6 +3911,7 @@
         <w:tc>
           <w:tcPr>
             <w:tcW w:type="dxa" w:w="2393"/>
+            <w:vAlign w:val="center"/>
             <w:shd w:val="clear" w:color="auto" w:fill="E9EEF3"/>
           </w:tcPr>
           <w:p>
@@ -3827,6 +3933,7 @@
         <w:tc>
           <w:tcPr>
             <w:tcW w:type="dxa" w:w="2108"/>
+            <w:vAlign w:val="center"/>
             <w:shd w:val="clear" w:color="auto" w:fill="E9EEF3"/>
           </w:tcPr>
           <w:p>
@@ -3848,6 +3955,7 @@
         <w:tc>
           <w:tcPr>
             <w:tcW w:type="dxa" w:w="3111"/>
+            <w:vAlign w:val="center"/>
             <w:shd w:val="clear" w:color="auto" w:fill="E9EEF3"/>
           </w:tcPr>
           <w:p>
@@ -3874,6 +3982,7 @@
         <w:tc>
           <w:tcPr>
             <w:tcW w:type="dxa" w:w="2253"/>
+            <w:vAlign w:val="center"/>
             <w:shd w:val="clear" w:color="auto" w:fill="FFFFFF"/>
           </w:tcPr>
           <w:p>
@@ -3894,6 +4003,7 @@
         <w:tc>
           <w:tcPr>
             <w:tcW w:type="dxa" w:w="2393"/>
+            <w:vAlign w:val="center"/>
             <w:shd w:val="clear" w:color="auto" w:fill="FFFFFF"/>
           </w:tcPr>
           <w:p>
@@ -3914,6 +4024,7 @@
         <w:tc>
           <w:tcPr>
             <w:tcW w:type="dxa" w:w="2108"/>
+            <w:vAlign w:val="center"/>
             <w:shd w:val="clear" w:color="auto" w:fill="FFFFFF"/>
           </w:tcPr>
           <w:p>
@@ -3934,6 +4045,7 @@
         <w:tc>
           <w:tcPr>
             <w:tcW w:type="dxa" w:w="3111"/>
+            <w:vAlign w:val="center"/>
             <w:shd w:val="clear" w:color="auto" w:fill="FFFFFF"/>
           </w:tcPr>
           <w:p>
@@ -3959,6 +4071,7 @@
         <w:tc>
           <w:tcPr>
             <w:tcW w:type="dxa" w:w="2253"/>
+            <w:vAlign w:val="center"/>
             <w:shd w:val="clear" w:color="auto" w:fill="FFFFFF"/>
           </w:tcPr>
           <w:p>
@@ -3979,6 +4092,7 @@
         <w:tc>
           <w:tcPr>
             <w:tcW w:type="dxa" w:w="2393"/>
+            <w:vAlign w:val="center"/>
             <w:shd w:val="clear" w:color="auto" w:fill="FFFFFF"/>
           </w:tcPr>
           <w:p>
@@ -3999,6 +4113,7 @@
         <w:tc>
           <w:tcPr>
             <w:tcW w:type="dxa" w:w="2108"/>
+            <w:vAlign w:val="center"/>
             <w:shd w:val="clear" w:color="auto" w:fill="FFFFFF"/>
           </w:tcPr>
           <w:p>
@@ -4019,6 +4134,7 @@
         <w:tc>
           <w:tcPr>
             <w:tcW w:type="dxa" w:w="3111"/>
+            <w:vAlign w:val="center"/>
             <w:shd w:val="clear" w:color="auto" w:fill="FFFFFF"/>
           </w:tcPr>
           <w:p>
@@ -4044,6 +4160,7 @@
         <w:tc>
           <w:tcPr>
             <w:tcW w:type="dxa" w:w="2253"/>
+            <w:vAlign w:val="center"/>
             <w:shd w:val="clear" w:color="auto" w:fill="FFFFFF"/>
           </w:tcPr>
           <w:p>
@@ -4063,6 +4180,7 @@
         <w:tc>
           <w:tcPr>
             <w:tcW w:type="dxa" w:w="2393"/>
+            <w:vAlign w:val="center"/>
             <w:shd w:val="clear" w:color="auto" w:fill="FFFFFF"/>
           </w:tcPr>
           <w:p>
@@ -4082,6 +4200,7 @@
         <w:tc>
           <w:tcPr>
             <w:tcW w:type="dxa" w:w="2108"/>
+            <w:vAlign w:val="center"/>
             <w:shd w:val="clear" w:color="auto" w:fill="FFFFFF"/>
           </w:tcPr>
           <w:p>
@@ -4101,6 +4220,7 @@
         <w:tc>
           <w:tcPr>
             <w:tcW w:type="dxa" w:w="3111"/>
+            <w:vAlign w:val="center"/>
             <w:shd w:val="clear" w:color="auto" w:fill="FFFFFF"/>
           </w:tcPr>
           <w:p>
@@ -4161,7 +4281,7 @@
         <w:rPr>
           <w:rFonts w:ascii="Arial" w:hAnsi="Arial" w:eastAsia="Arial" w:cs="Arial"/>
         </w:rPr>
-        <w:t>In the earlier year, 33.6% of homes in the top three groups reached 34 reviews, against 19.9% in the other seven; this gap reflects how the groups were chosen. In the later year they still led, 27.1% against 14.9%, a gap of about 12 percentage points, or 8.7 when hosts with many homes are not allowed to dominate (Figure 4).</w:t>
+        <w:t>The earlier year's top three groups had 33.6% of homes reaching 34 reviews, against 19.9% elsewhere; that gap reflects how we chose them. In the later year, they still led: 27.1% against 14.9%, about 12 percentage points (Figure 4). The advantage also holds when hosts receive equal weight (Appendix A).</w:t>
       </w:r>
     </w:p>
     <w:p>
@@ -4424,13 +4544,13 @@
           <w:rFonts w:ascii="Arial" w:hAnsi="Arial" w:eastAsia="Arial" w:cs="Arial"/>
           <w:b/>
         </w:rPr>
-        <w:t>Drop a candidate whose weekly rent and running costs exceed its group's typical weekly estimated revenue</w:t>
+        <w:t>Compare weekly rent and running costs with group revenue.</w:t>
       </w:r>
       <w:r>
         <w:rPr>
           <w:rFonts w:ascii="Arial" w:hAnsi="Arial" w:eastAsia="Arial" w:cs="Arial"/>
         </w:rPr>
-        <w:t>: about AUD 590 for City two-bedroom apartments, 930 for City three-bedroom apartments and 890 for Yarra Ranges houses (Table 4, divided by 52; Figure 5). Below-target homes typically earn about AUD 320, 620 and 600; keep cash for a year of that gap. Also obtain the landlord's written consent and confirm that the owners' corporation has not banned stays under 28 days (Consumer Affairs Victoria, n.d.). Such stays also attract Victoria's 7.5% short-stay levy, collected through Airbnb (State Revenue Office Victoria, n.d.).</w:t>
+        <w:t xml:space="preserve"> Typical weekly estimates are AUD 590 for City two-bedroom apartments, 930 for City three-bedroom apartments and 890 for Yarra Ranges houses; below-target medians are 320, 620 and 600. Figure 5 shows how many historical homes covered a proposed cost. Drop candidates costing more than typical revenue; assess the rest through their own cash-flow plans. Budget for a year of the below-target shortfall. Obtain written landlord consent and check building rules (Consumer Affairs Victoria, n.d.). Airbnb collects Victoria's 7.5% short-stay levy on applicable bookings (State Revenue Office Victoria, n.d.).</w:t>
       </w:r>
     </w:p>
     <w:p>
@@ -4482,6 +4602,7 @@
         <w:tc>
           <w:tcPr>
             <w:tcW w:type="dxa" w:w="2110"/>
+            <w:vAlign w:val="center"/>
             <w:shd w:val="clear" w:color="auto" w:fill="E9EEF3"/>
           </w:tcPr>
           <w:p>
@@ -4503,6 +4624,7 @@
         <w:tc>
           <w:tcPr>
             <w:tcW w:type="dxa" w:w="3681"/>
+            <w:vAlign w:val="center"/>
             <w:shd w:val="clear" w:color="auto" w:fill="E9EEF3"/>
           </w:tcPr>
           <w:p>
@@ -4524,6 +4646,7 @@
         <w:tc>
           <w:tcPr>
             <w:tcW w:type="dxa" w:w="4074"/>
+            <w:vAlign w:val="center"/>
             <w:shd w:val="clear" w:color="auto" w:fill="E9EEF3"/>
           </w:tcPr>
           <w:p>
@@ -4550,6 +4673,7 @@
         <w:tc>
           <w:tcPr>
             <w:tcW w:type="dxa" w:w="2110"/>
+            <w:vAlign w:val="center"/>
             <w:shd w:val="clear" w:color="auto" w:fill="FFFFFF"/>
           </w:tcPr>
           <w:p>
@@ -4578,6 +4702,7 @@
         <w:tc>
           <w:tcPr>
             <w:tcW w:type="dxa" w:w="3681"/>
+            <w:vAlign w:val="center"/>
             <w:shd w:val="clear" w:color="auto" w:fill="FFFFFF"/>
           </w:tcPr>
           <w:p>
@@ -4598,6 +4723,7 @@
         <w:tc>
           <w:tcPr>
             <w:tcW w:type="dxa" w:w="4074"/>
+            <w:vAlign w:val="center"/>
             <w:shd w:val="clear" w:color="auto" w:fill="FFFFFF"/>
           </w:tcPr>
           <w:p>
@@ -4623,6 +4749,7 @@
         <w:tc>
           <w:tcPr>
             <w:tcW w:type="dxa" w:w="2110"/>
+            <w:vAlign w:val="center"/>
             <w:shd w:val="clear" w:color="auto" w:fill="FFFFFF"/>
           </w:tcPr>
           <w:p>
@@ -4651,6 +4778,7 @@
         <w:tc>
           <w:tcPr>
             <w:tcW w:type="dxa" w:w="3681"/>
+            <w:vAlign w:val="center"/>
             <w:shd w:val="clear" w:color="auto" w:fill="FFFFFF"/>
           </w:tcPr>
           <w:p>
@@ -4671,6 +4799,7 @@
         <w:tc>
           <w:tcPr>
             <w:tcW w:type="dxa" w:w="4074"/>
+            <w:vAlign w:val="center"/>
             <w:shd w:val="clear" w:color="auto" w:fill="FFFFFF"/>
           </w:tcPr>
           <w:p>
@@ -4696,6 +4825,7 @@
         <w:tc>
           <w:tcPr>
             <w:tcW w:type="dxa" w:w="2110"/>
+            <w:vAlign w:val="center"/>
             <w:shd w:val="clear" w:color="auto" w:fill="FFFFFF"/>
           </w:tcPr>
           <w:p>
@@ -4724,6 +4854,7 @@
         <w:tc>
           <w:tcPr>
             <w:tcW w:type="dxa" w:w="3681"/>
+            <w:vAlign w:val="center"/>
             <w:shd w:val="clear" w:color="auto" w:fill="FFFFFF"/>
           </w:tcPr>
           <w:p>
@@ -4744,6 +4875,7 @@
         <w:tc>
           <w:tcPr>
             <w:tcW w:type="dxa" w:w="4074"/>
+            <w:vAlign w:val="center"/>
             <w:shd w:val="clear" w:color="auto" w:fill="FFFFFF"/>
           </w:tcPr>
           <w:p>
@@ -4769,6 +4901,7 @@
         <w:tc>
           <w:tcPr>
             <w:tcW w:type="dxa" w:w="2110"/>
+            <w:vAlign w:val="center"/>
             <w:shd w:val="clear" w:color="auto" w:fill="FFFFFF"/>
           </w:tcPr>
           <w:p>
@@ -4796,6 +4929,7 @@
         <w:tc>
           <w:tcPr>
             <w:tcW w:type="dxa" w:w="3681"/>
+            <w:vAlign w:val="center"/>
             <w:shd w:val="clear" w:color="auto" w:fill="FFFFFF"/>
           </w:tcPr>
           <w:p>
@@ -4815,6 +4949,7 @@
         <w:tc>
           <w:tcPr>
             <w:tcW w:type="dxa" w:w="4074"/>
+            <w:vAlign w:val="center"/>
             <w:shd w:val="clear" w:color="auto" w:fill="FFFFFF"/>
           </w:tcPr>
           <w:p>
@@ -4850,7 +4985,7 @@
       <w:r>
         <w:drawing>
           <wp:inline xmlns:a="http://schemas.openxmlformats.org/drawingml/2006/main" xmlns:pic="http://schemas.openxmlformats.org/drawingml/2006/picture">
-            <wp:extent cx="6035040" cy="2357890"/>
+            <wp:extent cx="6035040" cy="2482294"/>
             <wp:docPr id="5" name="Picture 5"/>
             <wp:cNvGraphicFramePr>
               <a:graphicFrameLocks noChangeAspect="1"/>
@@ -4871,7 +5006,7 @@
                   <pic:spPr>
                     <a:xfrm>
                       <a:off x="0" y="0"/>
-                      <a:ext cx="6035040" cy="2357890"/>
+                      <a:ext cx="6035040" cy="2482294"/>
                     </a:xfrm>
                     <a:prstGeom prst="rect"/>
                   </pic:spPr>
@@ -5048,7 +5183,7 @@
         <w:rPr>
           <w:rFonts w:ascii="Arial" w:hAnsi="Arial" w:eastAsia="Arial" w:cs="Arial"/>
         </w:rPr>
-        <w:t>Future work should (1) test the frozen groups, model and selection rule on the next snapshot; (2) set the target on the client's paid nights and costs, not reviews; (3) collect asking rents in the priority groups.</w:t>
+        <w:t>Next, collect rent and cost quotes for the priority groups. Track the client's paid nights and net cash flow to check whether review activity identifies good businesses. Test the unchanged groups, model and selection rule on the next snapshot.</w:t>
       </w:r>
     </w:p>
     <w:p>
@@ -5339,7 +5474,7 @@
         <w:rPr>
           <w:rFonts w:ascii="Arial" w:hAnsi="Arial" w:eastAsia="Arial" w:cs="Arial"/>
         </w:rPr>
-        <w:t>Maksym Xu led data preparation, modelling and validation; Eric Huang led report drafting and review. Loc Le and Qihang Sun co-authored the interim report and presentation before leaving; Qihang Sun also set up the repository.</w:t>
+        <w:t>Maksym Xu led data preparation, modelling and validation; Eric Huang led report drafting and review. Earlier team contributions are recorded in the repository guide.</w:t>
       </w:r>
     </w:p>
     <w:p>
@@ -5417,6 +5552,7 @@
         <w:tc>
           <w:tcPr>
             <w:tcW w:type="dxa" w:w="5870"/>
+            <w:vAlign w:val="center"/>
             <w:shd w:val="clear" w:color="auto" w:fill="E9EEF3"/>
           </w:tcPr>
           <w:p>
@@ -5438,6 +5574,7 @@
         <w:tc>
           <w:tcPr>
             <w:tcW w:type="dxa" w:w="1461"/>
+            <w:vAlign w:val="center"/>
             <w:shd w:val="clear" w:color="auto" w:fill="E9EEF3"/>
           </w:tcPr>
           <w:p>
@@ -5459,6 +5596,7 @@
         <w:tc>
           <w:tcPr>
             <w:tcW w:type="dxa" w:w="2533"/>
+            <w:vAlign w:val="center"/>
             <w:shd w:val="clear" w:color="auto" w:fill="E9EEF3"/>
           </w:tcPr>
           <w:p>
@@ -5485,6 +5623,7 @@
         <w:tc>
           <w:tcPr>
             <w:tcW w:type="dxa" w:w="5870"/>
+            <w:vAlign w:val="center"/>
             <w:shd w:val="clear" w:color="auto" w:fill="FFFFFF"/>
           </w:tcPr>
           <w:p>
@@ -5505,6 +5644,7 @@
         <w:tc>
           <w:tcPr>
             <w:tcW w:type="dxa" w:w="1461"/>
+            <w:vAlign w:val="center"/>
             <w:shd w:val="clear" w:color="auto" w:fill="FFFFFF"/>
           </w:tcPr>
           <w:p>
@@ -5525,6 +5665,7 @@
         <w:tc>
           <w:tcPr>
             <w:tcW w:type="dxa" w:w="2533"/>
+            <w:vAlign w:val="center"/>
             <w:shd w:val="clear" w:color="auto" w:fill="FFFFFF"/>
           </w:tcPr>
           <w:p>
@@ -5550,6 +5691,7 @@
         <w:tc>
           <w:tcPr>
             <w:tcW w:type="dxa" w:w="5870"/>
+            <w:vAlign w:val="center"/>
             <w:shd w:val="clear" w:color="auto" w:fill="FFFFFF"/>
           </w:tcPr>
           <w:p>
@@ -5570,6 +5712,7 @@
         <w:tc>
           <w:tcPr>
             <w:tcW w:type="dxa" w:w="1461"/>
+            <w:vAlign w:val="center"/>
             <w:shd w:val="clear" w:color="auto" w:fill="FFFFFF"/>
           </w:tcPr>
           <w:p>
@@ -5590,6 +5733,7 @@
         <w:tc>
           <w:tcPr>
             <w:tcW w:type="dxa" w:w="2533"/>
+            <w:vAlign w:val="center"/>
             <w:shd w:val="clear" w:color="auto" w:fill="FFFFFF"/>
           </w:tcPr>
           <w:p>
@@ -5615,6 +5759,7 @@
         <w:tc>
           <w:tcPr>
             <w:tcW w:type="dxa" w:w="5870"/>
+            <w:vAlign w:val="center"/>
             <w:shd w:val="clear" w:color="auto" w:fill="FFFFFF"/>
           </w:tcPr>
           <w:p>
@@ -5635,6 +5780,7 @@
         <w:tc>
           <w:tcPr>
             <w:tcW w:type="dxa" w:w="1461"/>
+            <w:vAlign w:val="center"/>
             <w:shd w:val="clear" w:color="auto" w:fill="FFFFFF"/>
           </w:tcPr>
           <w:p>
@@ -5655,6 +5801,7 @@
         <w:tc>
           <w:tcPr>
             <w:tcW w:type="dxa" w:w="2533"/>
+            <w:vAlign w:val="center"/>
             <w:shd w:val="clear" w:color="auto" w:fill="FFFFFF"/>
           </w:tcPr>
           <w:p>
@@ -5680,6 +5827,7 @@
         <w:tc>
           <w:tcPr>
             <w:tcW w:type="dxa" w:w="5870"/>
+            <w:vAlign w:val="center"/>
             <w:shd w:val="clear" w:color="auto" w:fill="FFFFFF"/>
           </w:tcPr>
           <w:p>
@@ -5700,6 +5848,7 @@
         <w:tc>
           <w:tcPr>
             <w:tcW w:type="dxa" w:w="1461"/>
+            <w:vAlign w:val="center"/>
             <w:shd w:val="clear" w:color="auto" w:fill="FFFFFF"/>
           </w:tcPr>
           <w:p>
@@ -5713,6 +5862,7 @@
         <w:tc>
           <w:tcPr>
             <w:tcW w:type="dxa" w:w="2533"/>
+            <w:vAlign w:val="center"/>
             <w:shd w:val="clear" w:color="auto" w:fill="FFFFFF"/>
           </w:tcPr>
           <w:p>
@@ -5731,6 +5881,7 @@
         <w:tc>
           <w:tcPr>
             <w:tcW w:type="dxa" w:w="5870"/>
+            <w:vAlign w:val="center"/>
             <w:shd w:val="clear" w:color="auto" w:fill="FFFFFF"/>
           </w:tcPr>
           <w:p>
@@ -5751,6 +5902,7 @@
         <w:tc>
           <w:tcPr>
             <w:tcW w:type="dxa" w:w="1461"/>
+            <w:vAlign w:val="center"/>
             <w:shd w:val="clear" w:color="auto" w:fill="FFFFFF"/>
           </w:tcPr>
           <w:p>
@@ -5771,6 +5923,7 @@
         <w:tc>
           <w:tcPr>
             <w:tcW w:type="dxa" w:w="2533"/>
+            <w:vAlign w:val="center"/>
             <w:shd w:val="clear" w:color="auto" w:fill="FFFFFF"/>
           </w:tcPr>
           <w:p>
@@ -5796,6 +5949,7 @@
         <w:tc>
           <w:tcPr>
             <w:tcW w:type="dxa" w:w="5870"/>
+            <w:vAlign w:val="center"/>
             <w:shd w:val="clear" w:color="auto" w:fill="FFFFFF"/>
           </w:tcPr>
           <w:p>
@@ -5816,6 +5970,7 @@
         <w:tc>
           <w:tcPr>
             <w:tcW w:type="dxa" w:w="1461"/>
+            <w:vAlign w:val="center"/>
             <w:shd w:val="clear" w:color="auto" w:fill="FFFFFF"/>
           </w:tcPr>
           <w:p>
@@ -5836,6 +5991,7 @@
         <w:tc>
           <w:tcPr>
             <w:tcW w:type="dxa" w:w="2533"/>
+            <w:vAlign w:val="center"/>
             <w:shd w:val="clear" w:color="auto" w:fill="FFFFFF"/>
           </w:tcPr>
           <w:p>
@@ -5861,6 +6017,7 @@
         <w:tc>
           <w:tcPr>
             <w:tcW w:type="dxa" w:w="5870"/>
+            <w:vAlign w:val="center"/>
             <w:shd w:val="clear" w:color="auto" w:fill="FFFFFF"/>
           </w:tcPr>
           <w:p>
@@ -5881,6 +6038,7 @@
         <w:tc>
           <w:tcPr>
             <w:tcW w:type="dxa" w:w="1461"/>
+            <w:vAlign w:val="center"/>
             <w:shd w:val="clear" w:color="auto" w:fill="FFFFFF"/>
           </w:tcPr>
           <w:p>
@@ -5901,6 +6059,7 @@
         <w:tc>
           <w:tcPr>
             <w:tcW w:type="dxa" w:w="2533"/>
+            <w:vAlign w:val="center"/>
             <w:shd w:val="clear" w:color="auto" w:fill="FFFFFF"/>
           </w:tcPr>
           <w:p>
@@ -5926,6 +6085,7 @@
         <w:tc>
           <w:tcPr>
             <w:tcW w:type="dxa" w:w="5870"/>
+            <w:vAlign w:val="center"/>
             <w:shd w:val="clear" w:color="auto" w:fill="FFFFFF"/>
           </w:tcPr>
           <w:p>
@@ -5946,6 +6106,7 @@
         <w:tc>
           <w:tcPr>
             <w:tcW w:type="dxa" w:w="1461"/>
+            <w:vAlign w:val="center"/>
             <w:shd w:val="clear" w:color="auto" w:fill="FFFFFF"/>
           </w:tcPr>
           <w:p>
@@ -5966,6 +6127,7 @@
         <w:tc>
           <w:tcPr>
             <w:tcW w:type="dxa" w:w="2533"/>
+            <w:vAlign w:val="center"/>
             <w:shd w:val="clear" w:color="auto" w:fill="FFFFFF"/>
           </w:tcPr>
           <w:p>
@@ -5991,6 +6153,7 @@
         <w:tc>
           <w:tcPr>
             <w:tcW w:type="dxa" w:w="5870"/>
+            <w:vAlign w:val="center"/>
             <w:shd w:val="clear" w:color="auto" w:fill="FFFFFF"/>
           </w:tcPr>
           <w:p>
@@ -6011,6 +6174,7 @@
         <w:tc>
           <w:tcPr>
             <w:tcW w:type="dxa" w:w="1461"/>
+            <w:vAlign w:val="center"/>
             <w:shd w:val="clear" w:color="auto" w:fill="FFFFFF"/>
           </w:tcPr>
           <w:p>
@@ -6031,6 +6195,7 @@
         <w:tc>
           <w:tcPr>
             <w:tcW w:type="dxa" w:w="2533"/>
+            <w:vAlign w:val="center"/>
             <w:shd w:val="clear" w:color="auto" w:fill="FFFFFF"/>
           </w:tcPr>
           <w:p>
@@ -6056,6 +6221,7 @@
         <w:tc>
           <w:tcPr>
             <w:tcW w:type="dxa" w:w="5870"/>
+            <w:vAlign w:val="center"/>
             <w:shd w:val="clear" w:color="auto" w:fill="FFFFFF"/>
           </w:tcPr>
           <w:p>
@@ -6076,6 +6242,7 @@
         <w:tc>
           <w:tcPr>
             <w:tcW w:type="dxa" w:w="1461"/>
+            <w:vAlign w:val="center"/>
             <w:shd w:val="clear" w:color="auto" w:fill="FFFFFF"/>
           </w:tcPr>
           <w:p>
@@ -6096,6 +6263,7 @@
         <w:tc>
           <w:tcPr>
             <w:tcW w:type="dxa" w:w="2533"/>
+            <w:vAlign w:val="center"/>
             <w:shd w:val="clear" w:color="auto" w:fill="FFFFFF"/>
           </w:tcPr>
           <w:p>
@@ -6121,6 +6289,7 @@
         <w:tc>
           <w:tcPr>
             <w:tcW w:type="dxa" w:w="5870"/>
+            <w:vAlign w:val="center"/>
             <w:shd w:val="clear" w:color="auto" w:fill="FFFFFF"/>
           </w:tcPr>
           <w:p>
@@ -6141,6 +6310,7 @@
         <w:tc>
           <w:tcPr>
             <w:tcW w:type="dxa" w:w="1461"/>
+            <w:vAlign w:val="center"/>
             <w:shd w:val="clear" w:color="auto" w:fill="FFFFFF"/>
           </w:tcPr>
           <w:p>
@@ -6161,6 +6331,7 @@
         <w:tc>
           <w:tcPr>
             <w:tcW w:type="dxa" w:w="2533"/>
+            <w:vAlign w:val="center"/>
             <w:shd w:val="clear" w:color="auto" w:fill="FFFFFF"/>
           </w:tcPr>
           <w:p>
@@ -6186,6 +6357,7 @@
         <w:tc>
           <w:tcPr>
             <w:tcW w:type="dxa" w:w="5870"/>
+            <w:vAlign w:val="center"/>
             <w:shd w:val="clear" w:color="auto" w:fill="FFFFFF"/>
           </w:tcPr>
           <w:p>
@@ -6205,6 +6377,7 @@
         <w:tc>
           <w:tcPr>
             <w:tcW w:type="dxa" w:w="1461"/>
+            <w:vAlign w:val="center"/>
             <w:shd w:val="clear" w:color="auto" w:fill="FFFFFF"/>
           </w:tcPr>
           <w:p>
@@ -6224,6 +6397,7 @@
         <w:tc>
           <w:tcPr>
             <w:tcW w:type="dxa" w:w="2533"/>
+            <w:vAlign w:val="center"/>
             <w:shd w:val="clear" w:color="auto" w:fill="FFFFFF"/>
           </w:tcPr>
           <w:p>
@@ -6273,6 +6447,19 @@
           <w:rFonts w:ascii="Arial" w:hAnsi="Arial" w:eastAsia="Arial" w:cs="Arial"/>
         </w:rPr>
         <w:t xml:space="preserve"> (Huang &amp; Xu, 2026).</w:t>
+      </w:r>
+    </w:p>
+    <w:p>
+      <w:pPr>
+        <w:widowControl/>
+        <w:spacing w:after="120" w:line="259" w:lineRule="auto"/>
+        <w:jc w:val="left"/>
+      </w:pPr>
+      <w:r>
+        <w:rPr>
+          <w:rFonts w:ascii="Arial" w:hAnsi="Arial" w:eastAsia="Arial" w:cs="Arial"/>
+        </w:rPr>
+        <w:t>Host-adjusted standard errors are 1.1–2.6 times ordinary estimates. Variance inflation factors are below 3; host-adjusted tests find no clear curvature. Equal host weights within each comparison pool give an 8.7-point later-year gap; 112 hosts appear in both pools. The reduced model's City three-bedroom hit rate was 33.9%, below random picking at 35.9%.</w:t>
       </w:r>
     </w:p>
     <w:sectPr>

</xml_diff>

<commit_message>
Restore the interim link and owners' corporation check
- Section 2 states what changed since the interim report: an
  explainable logistic regression in place of the random forest, plus
  tests within the leading groups.
- Recommendation 3 again names the check that any owners' corporation
  has not banned stays under 28 days.
- The sentence on price and minimum stay now follows the result it
  explains; README dates and export notes updated. Microsoft Word count
  2,984; ten pages.
</commit_message>
<xml_diff>
--- a/final-report/report-2026-10-04/Final_Report.docx
+++ b/final-report/report-2026-10-04/Final_Report.docx
@@ -288,6 +288,19 @@
           <w:rFonts w:ascii="Arial" w:hAnsi="Arial" w:eastAsia="Arial" w:cs="Arial"/>
         </w:rPr>
         <w:t>We rank on reviews rather than revenue because Inside Airbnb's revenue estimate multiplies these nights by the advertised price, and without rents a higher price does not mean a better lease. Rents, costs and profit are outside our data.</w:t>
+      </w:r>
+    </w:p>
+    <w:p>
+      <w:pPr>
+        <w:widowControl/>
+        <w:spacing w:after="120" w:line="259" w:lineRule="auto"/>
+        <w:jc w:val="left"/>
+      </w:pPr>
+      <w:r>
+        <w:rPr>
+          <w:rFonts w:ascii="Arial" w:hAnsi="Arial" w:eastAsia="Arial" w:cs="Arial"/>
+        </w:rPr>
+        <w:t>Since the interim report, we replaced its random forest with an explainable logistic regression and added tests within the leading groups.</w:t>
       </w:r>
     </w:p>
     <w:p>
@@ -3389,7 +3402,7 @@
         <w:rPr>
           <w:rFonts w:ascii="Arial" w:hAnsi="Arial" w:eastAsia="Arial" w:cs="Arial"/>
         </w:rPr>
-        <w:t>Picking a quarter of each priority group, the full model found busy homes 49.6% of the time, against 38.6% for the reduced model and 32.4% for random picking (Figure 3). That is five busy homes in ten, not three.</w:t>
+        <w:t>Picking a quarter of each priority group, the full model found busy homes 49.6% of the time, against 38.6% for the reduced model and 32.4% for random picking (Figure 3). That is five busy homes in ten, not three. Price and minimum stay carry most of this gain.</w:t>
       </w:r>
     </w:p>
     <w:p>
@@ -3799,19 +3812,6 @@
           <w:rFonts w:ascii="Arial" w:hAnsi="Arial" w:eastAsia="Arial" w:cs="Arial"/>
         </w:rPr>
         <w:t>The model fitted to all homes gives a typical City two-bedroom apartment a 42% chance of being busy with one-night stays and 18% without. Starting from 42%, ten more amenities gives 48%; a 20% price premium gives 36%, holding other inputs fixed (Appendix A). These historical associations do not establish that changing settings causes more bookings.</w:t>
-      </w:r>
-    </w:p>
-    <w:p>
-      <w:pPr>
-        <w:widowControl/>
-        <w:spacing w:after="120" w:line="259" w:lineRule="auto"/>
-        <w:jc w:val="left"/>
-      </w:pPr>
-      <w:r>
-        <w:rPr>
-          <w:rFonts w:ascii="Arial" w:hAnsi="Arial" w:eastAsia="Arial" w:cs="Arial"/>
-        </w:rPr>
-        <w:t>Price and minimum stay carry most of this gain.</w:t>
       </w:r>
     </w:p>
     <w:p>
@@ -4550,7 +4550,7 @@
         <w:rPr>
           <w:rFonts w:ascii="Arial" w:hAnsi="Arial" w:eastAsia="Arial" w:cs="Arial"/>
         </w:rPr>
-        <w:t xml:space="preserve"> Typical weekly estimates are AUD 590 for City two-bedroom apartments, 930 for City three-bedroom apartments and 890 for Yarra Ranges houses; below-target medians are 320, 620 and 600. Figure 5 shows how many historical homes covered a proposed cost. Drop candidates costing more than typical revenue; assess the rest through their own cash-flow plans. Budget for a year of the below-target shortfall. Obtain written landlord consent and check building rules (Consumer Affairs Victoria, n.d.). Airbnb collects Victoria's 7.5% short-stay levy on applicable bookings (State Revenue Office Victoria, n.d.).</w:t>
+        <w:t xml:space="preserve"> Typical weekly estimates are AUD 590 for City two-bedroom apartments, 930 for City three-bedroom apartments and 890 for Yarra Ranges houses; below-target medians are 320, 620 and 600. Figure 5 shows how many historical homes covered a proposed cost. Drop candidates costing more than typical revenue; assess the rest through their own cash-flow plans. Budget for a year of the below-target shortfall. Obtain written landlord consent and check that any owners' corporation has not banned stays under 28 days (Consumer Affairs Victoria, n.d.). Airbnb collects Victoria's 7.5% short-stay levy on applicable bookings (State Revenue Office Victoria, n.d.).</w:t>
       </w:r>
     </w:p>
     <w:p>

</xml_diff>

<commit_message>
Polish final report using Gemini revision for business readability
</commit_message>
<xml_diff>
--- a/final-report/report-2026-10-04/Final_Report.docx
+++ b/final-report/report-2026-10-04/Final_Report.docx
@@ -25,6 +25,12 @@
           <w:b/>
         </w:rPr>
         <w:t>CMCE30005 Final Project Report | Group 2</w:t>
+      </w:r>
+      <w:r>
+        <w:rPr>
+          <w:rFonts w:ascii="Arial" w:hAnsi="Arial" w:eastAsia="Arial" w:cs="Arial"/>
+        </w:rPr>
+        <w:t xml:space="preserve">  </w:t>
       </w:r>
     </w:p>
     <w:p>
@@ -94,7 +100,7 @@
         <w:rPr>
           <w:rFonts w:ascii="Arial" w:hAnsi="Arial" w:eastAsia="Arial" w:cs="Arial"/>
         </w:rPr>
-        <w:t>Our client plans to lease homes in Greater Melbourne and let them as short stays through Airbnb. Rent and setup costs are paid before any guest income arrives, so a lease in the wrong place ties up scarce startup funds.</w:t>
+        <w:t>Our client plans to lease homes in Greater Melbourne for Airbnb short stays. Rent and setup costs come before guest income, so a poor lease ties up scarce startup funds.</w:t>
       </w:r>
     </w:p>
     <w:p>
@@ -107,7 +113,7 @@
         <w:rPr>
           <w:rFonts w:ascii="Arial" w:hAnsi="Arial" w:eastAsia="Arial" w:cs="Arial"/>
         </w:rPr>
-        <w:t>We recommend searching two- and three-bedroom apartments in the City of Melbourne first, with three-bedroom houses and townhouses in Yarra Ranges as a second option. These groups had the highest shares of homes with strong guest activity, and their typical homes brought in an estimated AUD 30,600–48,600 a year before costs, against AUD 24,700 for all homes studied.</w:t>
+        <w:t>We recommend City of Melbourne two- and three-bedroom apartments first, followed by Yarra Ranges three-bedroom houses and townhouses. These groups had the highest shares of homes with strong guest activity. Their typical homes brought in an estimated AUD 30,600–48,600 a year before costs, against AUD 24,700 across the study.</w:t>
       </w:r>
     </w:p>
     <w:p>
@@ -120,7 +126,7 @@
         <w:rPr>
           <w:rFonts w:ascii="Arial" w:hAnsi="Arial" w:eastAsia="Arial" w:cs="Arial"/>
         </w:rPr>
-        <w:t>Within these groups, a simple model picks homes that reach our activity target about half the time (49.6%), against one in three (32.4%) at random. It ranks only homes already on Airbnb; for other rentals, use the group order and the checks in Section 6.</w:t>
+        <w:t>Within these groups, a simple model picks homes that reach our activity target about half the time (49.6%), against one in three (32.4%) at random. It ranks only homes already on Airbnb; for unlisted rentals, use the group order and the checks in Section 6.</w:t>
       </w:r>
     </w:p>
     <w:p>
@@ -261,20 +267,7 @@
         <w:rPr>
           <w:rFonts w:ascii="Arial" w:hAnsi="Arial" w:eastAsia="Arial" w:cs="Arial"/>
         </w:rPr>
-        <w:t xml:space="preserve"> (it reaches our </w:t>
-      </w:r>
-      <w:r>
-        <w:rPr>
-          <w:rFonts w:ascii="Arial" w:hAnsi="Arial" w:eastAsia="Arial" w:cs="Arial"/>
-          <w:b/>
-        </w:rPr>
-        <w:t>target</w:t>
-      </w:r>
-      <w:r>
-        <w:rPr>
-          <w:rFonts w:ascii="Arial" w:hAnsi="Arial" w:eastAsia="Arial" w:cs="Arial"/>
-        </w:rPr>
-        <w:t>) when it receives at least 30 guest reviews in the 365 days before data collection, a level reached by a quarter of separate reference homes (Section 3). Inside Airbnb (n.d.) assumes half of stays are reviewed and each lasts three nights, or the minimum stay if longer, capping estimated nights at 70% of the year (255). With three-night stays, 30 reviews means about 180 booked nights a year.</w:t>
+        <w:t xml:space="preserve"> (reaches our target) when it receives at least 30 guest reviews in the 365 days before data collection, a level reached by a quarter of separate reference homes (Section 3). Inside Airbnb (n.d.) assumes half of stays are reviewed and each lasts three nights (or the minimum stay if longer), capping estimated nights at 70% of the year (255). With three-night stays, 30 reviews means about 180 booked nights a year.</w:t>
       </w:r>
     </w:p>
     <w:p>
@@ -339,7 +332,7 @@
         <w:rPr>
           <w:rFonts w:ascii="Arial" w:hAnsi="Arial" w:eastAsia="Arial" w:cs="Arial"/>
         </w:rPr>
-        <w:t>Cleaning converted price text to numbers, treated "NA" as missing and counted amenities. We rebuilt annual review counts from review dates over exactly 365 days; the supplied count covers 366 days. Price is missing for 6,553 listings (25%) and bedrooms for 4,679 (18%); 4,477 listings (17%) have never been reviewed.</w:t>
+        <w:t>Cleaning converted price text to numbers, standardized missing entries and counted amenities. We rebuilt annual review counts from review dates over the exact 365 days before collection; the supplied count covers 366 days. Price is missing for 6,553 listings (25%) and bedrooms for 4,679 (18%); 4,477 listings (17%) have never been reviewed.</w:t>
       </w:r>
     </w:p>
     <w:p>
@@ -391,7 +384,7 @@
         <w:rPr>
           <w:rFonts w:ascii="Arial" w:hAnsi="Arial" w:eastAsia="Arial" w:cs="Arial"/>
         </w:rPr>
-        <w:t>So that the target is not set by the homes we then compare, we set aside about one in five hosts. Their 906 homes in the final groups set the target: about one in four received 30 or more reviews (Table 1).</w:t>
+        <w:t>We set aside about one in five hosts from the eligible sample (1,342 homes) to set an independent target. Their 906 homes in the final groups set the threshold: a quarter received 30 or more reviews (Table 1).</w:t>
       </w:r>
     </w:p>
     <w:p>
@@ -431,8 +424,8 @@
         <w:tblLayout w:type="fixed"/>
       </w:tblPr>
       <w:tblGrid>
-        <w:gridCol w:w="8115"/>
-        <w:gridCol w:w="1750"/>
+        <w:gridCol w:w="8252"/>
+        <w:gridCol w:w="1613"/>
       </w:tblGrid>
       <w:tr>
         <w:trPr>
@@ -441,7 +434,7 @@
         </w:trPr>
         <w:tc>
           <w:tcPr>
-            <w:tcW w:type="dxa" w:w="8115"/>
+            <w:tcW w:type="dxa" w:w="8252"/>
             <w:vAlign w:val="center"/>
             <w:shd w:val="clear" w:color="auto" w:fill="E9EEF3"/>
           </w:tcPr>
@@ -463,7 +456,7 @@
         </w:tc>
         <w:tc>
           <w:tcPr>
-            <w:tcW w:type="dxa" w:w="1750"/>
+            <w:tcW w:type="dxa" w:w="1613"/>
             <w:vAlign w:val="center"/>
             <w:shd w:val="clear" w:color="auto" w:fill="E9EEF3"/>
           </w:tcPr>
@@ -490,7 +483,7 @@
         </w:trPr>
         <w:tc>
           <w:tcPr>
-            <w:tcW w:type="dxa" w:w="8115"/>
+            <w:tcW w:type="dxa" w:w="8252"/>
             <w:vAlign w:val="center"/>
             <w:shd w:val="clear" w:color="auto" w:fill="FFFFFF"/>
           </w:tcPr>
@@ -511,7 +504,7 @@
         </w:tc>
         <w:tc>
           <w:tcPr>
-            <w:tcW w:type="dxa" w:w="1750"/>
+            <w:tcW w:type="dxa" w:w="1613"/>
             <w:vAlign w:val="center"/>
             <w:shd w:val="clear" w:color="auto" w:fill="FFFFFF"/>
           </w:tcPr>
@@ -537,7 +530,7 @@
         </w:trPr>
         <w:tc>
           <w:tcPr>
-            <w:tcW w:type="dxa" w:w="8115"/>
+            <w:tcW w:type="dxa" w:w="8252"/>
             <w:vAlign w:val="center"/>
             <w:shd w:val="clear" w:color="auto" w:fill="FFFFFF"/>
           </w:tcPr>
@@ -558,7 +551,7 @@
         </w:tc>
         <w:tc>
           <w:tcPr>
-            <w:tcW w:type="dxa" w:w="1750"/>
+            <w:tcW w:type="dxa" w:w="1613"/>
             <w:vAlign w:val="center"/>
             <w:shd w:val="clear" w:color="auto" w:fill="FFFFFF"/>
           </w:tcPr>
@@ -584,7 +577,7 @@
         </w:trPr>
         <w:tc>
           <w:tcPr>
-            <w:tcW w:type="dxa" w:w="8115"/>
+            <w:tcW w:type="dxa" w:w="8252"/>
             <w:vAlign w:val="center"/>
             <w:shd w:val="clear" w:color="auto" w:fill="FFFFFF"/>
           </w:tcPr>
@@ -605,7 +598,7 @@
         </w:tc>
         <w:tc>
           <w:tcPr>
-            <w:tcW w:type="dxa" w:w="1750"/>
+            <w:tcW w:type="dxa" w:w="1613"/>
             <w:vAlign w:val="center"/>
             <w:shd w:val="clear" w:color="auto" w:fill="FFFFFF"/>
           </w:tcPr>
@@ -631,7 +624,7 @@
         </w:trPr>
         <w:tc>
           <w:tcPr>
-            <w:tcW w:type="dxa" w:w="8115"/>
+            <w:tcW w:type="dxa" w:w="8252"/>
             <w:vAlign w:val="center"/>
             <w:shd w:val="clear" w:color="auto" w:fill="FFFFFF"/>
           </w:tcPr>
@@ -652,7 +645,7 @@
         </w:tc>
         <w:tc>
           <w:tcPr>
-            <w:tcW w:type="dxa" w:w="1750"/>
+            <w:tcW w:type="dxa" w:w="1613"/>
             <w:vAlign w:val="center"/>
             <w:shd w:val="clear" w:color="auto" w:fill="FFFFFF"/>
           </w:tcPr>
@@ -678,7 +671,7 @@
         </w:trPr>
         <w:tc>
           <w:tcPr>
-            <w:tcW w:type="dxa" w:w="8115"/>
+            <w:tcW w:type="dxa" w:w="8252"/>
             <w:vAlign w:val="center"/>
             <w:shd w:val="clear" w:color="auto" w:fill="FFFFFF"/>
           </w:tcPr>
@@ -699,7 +692,7 @@
         </w:tc>
         <w:tc>
           <w:tcPr>
-            <w:tcW w:type="dxa" w:w="1750"/>
+            <w:tcW w:type="dxa" w:w="1613"/>
             <w:vAlign w:val="center"/>
             <w:shd w:val="clear" w:color="auto" w:fill="FFFFFF"/>
           </w:tcPr>
@@ -725,7 +718,7 @@
         </w:trPr>
         <w:tc>
           <w:tcPr>
-            <w:tcW w:type="dxa" w:w="8115"/>
+            <w:tcW w:type="dxa" w:w="8252"/>
             <w:vAlign w:val="center"/>
             <w:shd w:val="clear" w:color="auto" w:fill="FFFFFF"/>
           </w:tcPr>
@@ -740,13 +733,13 @@
                 <w:rFonts w:ascii="Arial" w:hAnsi="Arial" w:eastAsia="Arial" w:cs="Arial"/>
                 <w:sz w:val="21"/>
               </w:rPr>
-              <w:t>After setting aside reference hosts</w:t>
+              <w:t>After setting aside 1,342 reference-host homes</w:t>
             </w:r>
           </w:p>
         </w:tc>
         <w:tc>
           <w:tcPr>
-            <w:tcW w:type="dxa" w:w="1750"/>
+            <w:tcW w:type="dxa" w:w="1613"/>
             <w:vAlign w:val="center"/>
             <w:shd w:val="clear" w:color="auto" w:fill="FFFFFF"/>
           </w:tcPr>
@@ -772,7 +765,7 @@
         </w:trPr>
         <w:tc>
           <w:tcPr>
-            <w:tcW w:type="dxa" w:w="8115"/>
+            <w:tcW w:type="dxa" w:w="8252"/>
             <w:vAlign w:val="center"/>
             <w:shd w:val="clear" w:color="auto" w:fill="FFFFFF"/>
           </w:tcPr>
@@ -794,7 +787,7 @@
         </w:tc>
         <w:tc>
           <w:tcPr>
-            <w:tcW w:type="dxa" w:w="1750"/>
+            <w:tcW w:type="dxa" w:w="1613"/>
             <w:vAlign w:val="center"/>
             <w:shd w:val="clear" w:color="auto" w:fill="FFFFFF"/>
           </w:tcPr>
@@ -821,7 +814,7 @@
         </w:trPr>
         <w:tc>
           <w:tcPr>
-            <w:tcW w:type="dxa" w:w="8115"/>
+            <w:tcW w:type="dxa" w:w="8252"/>
             <w:vAlign w:val="center"/>
             <w:shd w:val="clear" w:color="auto" w:fill="FFFFFF"/>
           </w:tcPr>
@@ -835,13 +828,13 @@
                 <w:rFonts w:ascii="Arial" w:hAnsi="Arial" w:eastAsia="Arial" w:cs="Arial"/>
                 <w:sz w:val="21"/>
               </w:rPr>
-              <w:t>Reference homes in these groups (target only)</w:t>
+              <w:t>Reference homes in these groups (from 1,342; target only)</w:t>
             </w:r>
           </w:p>
         </w:tc>
         <w:tc>
           <w:tcPr>
-            <w:tcW w:type="dxa" w:w="1750"/>
+            <w:tcW w:type="dxa" w:w="1613"/>
             <w:vAlign w:val="center"/>
             <w:shd w:val="clear" w:color="auto" w:fill="FFFFFF"/>
           </w:tcPr>
@@ -878,7 +871,7 @@
         <w:rPr>
           <w:rFonts w:ascii="Arial" w:hAnsi="Arial" w:eastAsia="Arial" w:cs="Arial"/>
         </w:rPr>
-        <w:t>The 3,873 analysis homes belong to 1,726 hosts in six council areas. The price rule mainly removes inactive listings: 77.8% of the 3,796 residential listings it removes had no review in the past year, against 17.0% of those kept.</w:t>
+        <w:t>The 3,873 analysis homes belong to 1,726 hosts in six council areas. The price rule drops 3,796 residential listings (14,895 minus 11,099): 77.8% had no review in the past year, against 17.0% of those kept.</w:t>
       </w:r>
     </w:p>
     <w:p>
@@ -931,7 +924,7 @@
         <w:rPr>
           <w:rFonts w:ascii="Arial" w:hAnsi="Arial" w:eastAsia="Arial" w:cs="Arial"/>
         </w:rPr>
-        <w:t xml:space="preserve"> Logistic regression estimates the chance that a home is busy. Each input raises or lowers a score, which becomes a chance between 0% and 100%. Table 2 lists the outcome and the six inputs.</w:t>
+        <w:t xml:space="preserve"> Logistic regression combines six inputs into a score and converts it into a chance of being busy, from 0% to 100% (R Core Team, 2026). Table 2 lists the outcome and inputs.</w:t>
       </w:r>
     </w:p>
     <w:p>
@@ -1442,7 +1435,7 @@
         <w:rPr>
           <w:rFonts w:ascii="Arial" w:hAnsi="Arial" w:eastAsia="Arial" w:cs="Arial"/>
         </w:rPr>
-        <w:t xml:space="preserve"> Homes run by the same host can perform alike, so they stay together in every test. We assume price and amenities have steady effects. Checks found little overlap between inputs and no clear curved effects after allowing for hosts (Appendix A).</w:t>
+        <w:t xml:space="preserve"> Homes run by the same host can perform alike, so they stay together in every test. Each 10% price step and ten extra amenities receive a fixed weight in the score. Checks for overlapping inputs and curved relationships are in Appendix A.</w:t>
       </w:r>
     </w:p>
     <w:p>
@@ -1462,7 +1455,7 @@
         <w:rPr>
           <w:rFonts w:ascii="Arial" w:hAnsi="Arial" w:eastAsia="Arial" w:cs="Arial"/>
         </w:rPr>
-        <w:t xml:space="preserve"> Each of 50 tests builds the model from 70% of hosts and scores the unseen homes of the other 30%. In each priority group, each method picks a quarter of the test homes, and we compare the share that were busy.</w:t>
+        <w:t xml:space="preserve"> Each of 50 tests builds the model from 70% of hosts and scores the unseen homes of the other 30%. In each priority group, each method picks a quarter of test homes, and we compare the share that were busy.</w:t>
       </w:r>
     </w:p>
     <w:p>
@@ -1482,7 +1475,7 @@
         <w:rPr>
           <w:rFonts w:ascii="Arial" w:hAnsi="Arial" w:eastAsia="Arial" w:cs="Arial"/>
         </w:rPr>
-        <w:t xml:space="preserve"> For 2,657 homes with two years of reviews, in ten groups, we chose the top three groups on the earlier year and followed them into the later year (target 34 reviews, set from the earlier year's reference homes).</w:t>
+        <w:t xml:space="preserve"> For 2,657 homes with two years of reviews in ten groups, we chose the top three groups in the earlier year and followed them into the later year (target 34 reviews, set from the earlier year's reference homes).</w:t>
       </w:r>
     </w:p>
     <w:p>
@@ -1520,7 +1513,7 @@
         <w:rPr>
           <w:rFonts w:ascii="Arial" w:hAnsi="Arial" w:eastAsia="Arial" w:cs="Arial"/>
         </w:rPr>
-        <w:t>Guest activity is very uneven (Figure 1). The middle (median) home received 15 reviews, a quarter received 30 or more, and 334 homes (8.6%) received none.</w:t>
+        <w:t>Guest activity is very uneven (Figure 1). The median home received 15 reviews, a quarter (981 homes, 25.3%) received 30 or more, and 334 homes (8.6%) received none.</w:t>
       </w:r>
     </w:p>
     <w:p>
@@ -2445,7 +2438,7 @@
         <w:rPr>
           <w:rFonts w:ascii="Arial" w:hAnsi="Arial" w:eastAsia="Arial" w:cs="Arial"/>
         </w:rPr>
-        <w:t>Busy homes were slightly cheaper, with similar amenity counts, but far more often accepted one-night stays and were in the City of Melbourne. Their estimated revenue was 3.5 times higher, reflecting its review-based calculation (Table 3).</w:t>
+        <w:t>Busy homes were slightly cheaper with similar amenity counts, but far more often accepted one-night stays and sat in the City of Melbourne. Their median estimated revenue was 3.5 times higher (AUD 58,400 versus 16,600), reflecting its review-based formula (Table 3).</w:t>
       </w:r>
     </w:p>
     <w:p>
@@ -2545,7 +2538,7 @@
           <w:rFonts w:ascii="Arial" w:hAnsi="Arial" w:eastAsia="Arial" w:cs="Arial"/>
           <w:b/>
         </w:rPr>
-        <w:t>Table 4. Priority groups: estimated nights and revenue (medians; revenue in AUD a year)</w:t>
+        <w:t>Table 4. Priority groups: median estimated nights and annual revenue (AUD)</w:t>
       </w:r>
     </w:p>
     <w:tbl>
@@ -2570,13 +2563,13 @@
         <w:tblLayout w:type="fixed"/>
       </w:tblPr>
       <w:tblGrid>
-        <w:gridCol w:w="2225"/>
-        <w:gridCol w:w="1080"/>
-        <w:gridCol w:w="1080"/>
-        <w:gridCol w:w="1204"/>
-        <w:gridCol w:w="1401"/>
-        <w:gridCol w:w="1421"/>
-        <w:gridCol w:w="1452"/>
+        <w:gridCol w:w="2074"/>
+        <w:gridCol w:w="1049"/>
+        <w:gridCol w:w="1049"/>
+        <w:gridCol w:w="1356"/>
+        <w:gridCol w:w="1509"/>
+        <w:gridCol w:w="1314"/>
+        <w:gridCol w:w="1509"/>
       </w:tblGrid>
       <w:tr>
         <w:trPr>
@@ -2585,7 +2578,7 @@
         </w:trPr>
         <w:tc>
           <w:tcPr>
-            <w:tcW w:type="dxa" w:w="2225"/>
+            <w:tcW w:type="dxa" w:w="2074"/>
             <w:vAlign w:val="center"/>
             <w:shd w:val="clear" w:color="auto" w:fill="E9EEF3"/>
           </w:tcPr>
@@ -2607,7 +2600,7 @@
         </w:tc>
         <w:tc>
           <w:tcPr>
-            <w:tcW w:type="dxa" w:w="1080"/>
+            <w:tcW w:type="dxa" w:w="1049"/>
             <w:vAlign w:val="center"/>
             <w:shd w:val="clear" w:color="auto" w:fill="E9EEF3"/>
           </w:tcPr>
@@ -2629,7 +2622,7 @@
         </w:tc>
         <w:tc>
           <w:tcPr>
-            <w:tcW w:type="dxa" w:w="1080"/>
+            <w:tcW w:type="dxa" w:w="1049"/>
             <w:vAlign w:val="center"/>
             <w:shd w:val="clear" w:color="auto" w:fill="E9EEF3"/>
           </w:tcPr>
@@ -2651,7 +2644,7 @@
         </w:tc>
         <w:tc>
           <w:tcPr>
-            <w:tcW w:type="dxa" w:w="1204"/>
+            <w:tcW w:type="dxa" w:w="1356"/>
             <w:vAlign w:val="center"/>
             <w:shd w:val="clear" w:color="auto" w:fill="E9EEF3"/>
           </w:tcPr>
@@ -2667,13 +2660,13 @@
                 <w:b/>
                 <w:sz w:val="21"/>
               </w:rPr>
-              <w:t>Nights booked</w:t>
+              <w:t>Nights, all homes</w:t>
             </w:r>
           </w:p>
         </w:tc>
         <w:tc>
           <w:tcPr>
-            <w:tcW w:type="dxa" w:w="1401"/>
+            <w:tcW w:type="dxa" w:w="1509"/>
             <w:vAlign w:val="center"/>
             <w:shd w:val="clear" w:color="auto" w:fill="E9EEF3"/>
           </w:tcPr>
@@ -2689,13 +2682,13 @@
                 <w:b/>
                 <w:sz w:val="21"/>
               </w:rPr>
-              <w:t>Revenue</w:t>
+              <w:t>Revenue, all homes</w:t>
             </w:r>
           </w:p>
         </w:tc>
         <w:tc>
           <w:tcPr>
-            <w:tcW w:type="dxa" w:w="1421"/>
+            <w:tcW w:type="dxa" w:w="1314"/>
             <w:vAlign w:val="center"/>
             <w:shd w:val="clear" w:color="auto" w:fill="E9EEF3"/>
           </w:tcPr>
@@ -2711,13 +2704,13 @@
                 <w:b/>
                 <w:sz w:val="21"/>
               </w:rPr>
-              <w:t>Revenue rank (of 14)</w:t>
+              <w:t>Revenue rank</w:t>
             </w:r>
           </w:p>
         </w:tc>
         <w:tc>
           <w:tcPr>
-            <w:tcW w:type="dxa" w:w="1452"/>
+            <w:tcW w:type="dxa" w:w="1509"/>
             <w:vAlign w:val="center"/>
             <w:shd w:val="clear" w:color="auto" w:fill="E9EEF3"/>
           </w:tcPr>
@@ -2733,7 +2726,7 @@
                 <w:b/>
                 <w:sz w:val="21"/>
               </w:rPr>
-              <w:t>Revenue if below target</w:t>
+              <w:t>Revenue, below 30</w:t>
             </w:r>
           </w:p>
         </w:tc>
@@ -2744,7 +2737,7 @@
         </w:trPr>
         <w:tc>
           <w:tcPr>
-            <w:tcW w:type="dxa" w:w="2225"/>
+            <w:tcW w:type="dxa" w:w="2074"/>
             <w:vAlign w:val="center"/>
             <w:shd w:val="clear" w:color="auto" w:fill="FFFFFF"/>
           </w:tcPr>
@@ -2765,7 +2758,7 @@
         </w:tc>
         <w:tc>
           <w:tcPr>
-            <w:tcW w:type="dxa" w:w="1080"/>
+            <w:tcW w:type="dxa" w:w="1049"/>
             <w:vAlign w:val="center"/>
             <w:shd w:val="clear" w:color="auto" w:fill="FFFFFF"/>
           </w:tcPr>
@@ -2786,7 +2779,7 @@
         </w:tc>
         <w:tc>
           <w:tcPr>
-            <w:tcW w:type="dxa" w:w="1080"/>
+            <w:tcW w:type="dxa" w:w="1049"/>
             <w:vAlign w:val="center"/>
             <w:shd w:val="clear" w:color="auto" w:fill="FFFFFF"/>
           </w:tcPr>
@@ -2807,7 +2800,7 @@
         </w:tc>
         <w:tc>
           <w:tcPr>
-            <w:tcW w:type="dxa" w:w="1204"/>
+            <w:tcW w:type="dxa" w:w="1356"/>
             <w:vAlign w:val="center"/>
             <w:shd w:val="clear" w:color="auto" w:fill="FFFFFF"/>
           </w:tcPr>
@@ -2828,7 +2821,7 @@
         </w:tc>
         <w:tc>
           <w:tcPr>
-            <w:tcW w:type="dxa" w:w="1401"/>
+            <w:tcW w:type="dxa" w:w="1509"/>
             <w:vAlign w:val="center"/>
             <w:shd w:val="clear" w:color="auto" w:fill="FFFFFF"/>
           </w:tcPr>
@@ -2849,7 +2842,7 @@
         </w:tc>
         <w:tc>
           <w:tcPr>
-            <w:tcW w:type="dxa" w:w="1421"/>
+            <w:tcW w:type="dxa" w:w="1314"/>
             <w:vAlign w:val="center"/>
             <w:shd w:val="clear" w:color="auto" w:fill="FFFFFF"/>
           </w:tcPr>
@@ -2870,7 +2863,7 @@
         </w:tc>
         <w:tc>
           <w:tcPr>
-            <w:tcW w:type="dxa" w:w="1452"/>
+            <w:tcW w:type="dxa" w:w="1509"/>
             <w:vAlign w:val="center"/>
             <w:shd w:val="clear" w:color="auto" w:fill="FFFFFF"/>
           </w:tcPr>
@@ -2896,7 +2889,7 @@
         </w:trPr>
         <w:tc>
           <w:tcPr>
-            <w:tcW w:type="dxa" w:w="2225"/>
+            <w:tcW w:type="dxa" w:w="2074"/>
             <w:vAlign w:val="center"/>
             <w:shd w:val="clear" w:color="auto" w:fill="FFFFFF"/>
           </w:tcPr>
@@ -2917,7 +2910,7 @@
         </w:tc>
         <w:tc>
           <w:tcPr>
-            <w:tcW w:type="dxa" w:w="1080"/>
+            <w:tcW w:type="dxa" w:w="1049"/>
             <w:vAlign w:val="center"/>
             <w:shd w:val="clear" w:color="auto" w:fill="FFFFFF"/>
           </w:tcPr>
@@ -2938,7 +2931,7 @@
         </w:tc>
         <w:tc>
           <w:tcPr>
-            <w:tcW w:type="dxa" w:w="1080"/>
+            <w:tcW w:type="dxa" w:w="1049"/>
             <w:vAlign w:val="center"/>
             <w:shd w:val="clear" w:color="auto" w:fill="FFFFFF"/>
           </w:tcPr>
@@ -2959,7 +2952,7 @@
         </w:tc>
         <w:tc>
           <w:tcPr>
-            <w:tcW w:type="dxa" w:w="1204"/>
+            <w:tcW w:type="dxa" w:w="1356"/>
             <w:vAlign w:val="center"/>
             <w:shd w:val="clear" w:color="auto" w:fill="FFFFFF"/>
           </w:tcPr>
@@ -2980,7 +2973,7 @@
         </w:tc>
         <w:tc>
           <w:tcPr>
-            <w:tcW w:type="dxa" w:w="1401"/>
+            <w:tcW w:type="dxa" w:w="1509"/>
             <w:vAlign w:val="center"/>
             <w:shd w:val="clear" w:color="auto" w:fill="FFFFFF"/>
           </w:tcPr>
@@ -3001,7 +2994,7 @@
         </w:tc>
         <w:tc>
           <w:tcPr>
-            <w:tcW w:type="dxa" w:w="1421"/>
+            <w:tcW w:type="dxa" w:w="1314"/>
             <w:vAlign w:val="center"/>
             <w:shd w:val="clear" w:color="auto" w:fill="FFFFFF"/>
           </w:tcPr>
@@ -3022,7 +3015,7 @@
         </w:tc>
         <w:tc>
           <w:tcPr>
-            <w:tcW w:type="dxa" w:w="1452"/>
+            <w:tcW w:type="dxa" w:w="1509"/>
             <w:vAlign w:val="center"/>
             <w:shd w:val="clear" w:color="auto" w:fill="FFFFFF"/>
           </w:tcPr>
@@ -3048,7 +3041,7 @@
         </w:trPr>
         <w:tc>
           <w:tcPr>
-            <w:tcW w:type="dxa" w:w="2225"/>
+            <w:tcW w:type="dxa" w:w="2074"/>
             <w:vAlign w:val="center"/>
             <w:shd w:val="clear" w:color="auto" w:fill="FFFFFF"/>
           </w:tcPr>
@@ -3069,7 +3062,7 @@
         </w:tc>
         <w:tc>
           <w:tcPr>
-            <w:tcW w:type="dxa" w:w="1080"/>
+            <w:tcW w:type="dxa" w:w="1049"/>
             <w:vAlign w:val="center"/>
             <w:shd w:val="clear" w:color="auto" w:fill="FFFFFF"/>
           </w:tcPr>
@@ -3090,7 +3083,7 @@
         </w:tc>
         <w:tc>
           <w:tcPr>
-            <w:tcW w:type="dxa" w:w="1080"/>
+            <w:tcW w:type="dxa" w:w="1049"/>
             <w:vAlign w:val="center"/>
             <w:shd w:val="clear" w:color="auto" w:fill="FFFFFF"/>
           </w:tcPr>
@@ -3111,7 +3104,7 @@
         </w:tc>
         <w:tc>
           <w:tcPr>
-            <w:tcW w:type="dxa" w:w="1204"/>
+            <w:tcW w:type="dxa" w:w="1356"/>
             <w:vAlign w:val="center"/>
             <w:shd w:val="clear" w:color="auto" w:fill="FFFFFF"/>
           </w:tcPr>
@@ -3132,7 +3125,7 @@
         </w:tc>
         <w:tc>
           <w:tcPr>
-            <w:tcW w:type="dxa" w:w="1401"/>
+            <w:tcW w:type="dxa" w:w="1509"/>
             <w:vAlign w:val="center"/>
             <w:shd w:val="clear" w:color="auto" w:fill="FFFFFF"/>
           </w:tcPr>
@@ -3153,7 +3146,7 @@
         </w:tc>
         <w:tc>
           <w:tcPr>
-            <w:tcW w:type="dxa" w:w="1421"/>
+            <w:tcW w:type="dxa" w:w="1314"/>
             <w:vAlign w:val="center"/>
             <w:shd w:val="clear" w:color="auto" w:fill="FFFFFF"/>
           </w:tcPr>
@@ -3174,7 +3167,7 @@
         </w:tc>
         <w:tc>
           <w:tcPr>
-            <w:tcW w:type="dxa" w:w="1452"/>
+            <w:tcW w:type="dxa" w:w="1509"/>
             <w:vAlign w:val="center"/>
             <w:shd w:val="clear" w:color="auto" w:fill="FFFFFF"/>
           </w:tcPr>
@@ -3200,7 +3193,7 @@
         </w:trPr>
         <w:tc>
           <w:tcPr>
-            <w:tcW w:type="dxa" w:w="2225"/>
+            <w:tcW w:type="dxa" w:w="2074"/>
             <w:vAlign w:val="center"/>
             <w:shd w:val="clear" w:color="auto" w:fill="FFFFFF"/>
           </w:tcPr>
@@ -3220,7 +3213,7 @@
         </w:tc>
         <w:tc>
           <w:tcPr>
-            <w:tcW w:type="dxa" w:w="1080"/>
+            <w:tcW w:type="dxa" w:w="1049"/>
             <w:vAlign w:val="center"/>
             <w:shd w:val="clear" w:color="auto" w:fill="FFFFFF"/>
           </w:tcPr>
@@ -3240,7 +3233,7 @@
         </w:tc>
         <w:tc>
           <w:tcPr>
-            <w:tcW w:type="dxa" w:w="1080"/>
+            <w:tcW w:type="dxa" w:w="1049"/>
             <w:vAlign w:val="center"/>
             <w:shd w:val="clear" w:color="auto" w:fill="FFFFFF"/>
           </w:tcPr>
@@ -3260,7 +3253,7 @@
         </w:tc>
         <w:tc>
           <w:tcPr>
-            <w:tcW w:type="dxa" w:w="1204"/>
+            <w:tcW w:type="dxa" w:w="1356"/>
             <w:vAlign w:val="center"/>
             <w:shd w:val="clear" w:color="auto" w:fill="FFFFFF"/>
           </w:tcPr>
@@ -3280,7 +3273,7 @@
         </w:tc>
         <w:tc>
           <w:tcPr>
-            <w:tcW w:type="dxa" w:w="1401"/>
+            <w:tcW w:type="dxa" w:w="1509"/>
             <w:vAlign w:val="center"/>
             <w:shd w:val="clear" w:color="auto" w:fill="FFFFFF"/>
           </w:tcPr>
@@ -3300,7 +3293,7 @@
         </w:tc>
         <w:tc>
           <w:tcPr>
-            <w:tcW w:type="dxa" w:w="1421"/>
+            <w:tcW w:type="dxa" w:w="1314"/>
             <w:vAlign w:val="center"/>
             <w:shd w:val="clear" w:color="auto" w:fill="FFFFFF"/>
           </w:tcPr>
@@ -3320,7 +3313,7 @@
         </w:tc>
         <w:tc>
           <w:tcPr>
-            <w:tcW w:type="dxa" w:w="1452"/>
+            <w:tcW w:type="dxa" w:w="1509"/>
             <w:vAlign w:val="center"/>
             <w:shd w:val="clear" w:color="auto" w:fill="FFFFFF"/>
           </w:tcPr>
@@ -3357,7 +3350,7 @@
         <w:rPr>
           <w:rFonts w:ascii="Arial" w:hAnsi="Arial" w:eastAsia="Arial" w:cs="Arial"/>
         </w:rPr>
-        <w:t>The same three groups lead when the price rule or the review-history rule is removed. The two City groups are the most reliable, staying in the top three in 94% and 90% of 1,000 host redraws; Yarra Ranges houses did so in only 64%, a less certain second option.</w:t>
+        <w:t>The same three groups lead when the price rule or the review-history rule is removed. The two City groups are the most reliable, staying in the top three in 94% and 90% of 1,000 host redraws; Yarra Ranges houses did so in 64%, a less certain second option.</w:t>
       </w:r>
     </w:p>
     <w:p>
@@ -3371,13 +3364,26 @@
           <w:rFonts w:ascii="Arial" w:hAnsi="Arial" w:eastAsia="Arial" w:cs="Arial"/>
           <w:b/>
         </w:rPr>
-        <w:t>When the two rankings differ.</w:t>
+        <w:t>When the rankings differ.</w:t>
       </w:r>
       <w:r>
         <w:rPr>
           <w:rFonts w:ascii="Arial" w:hAnsi="Arial" w:eastAsia="Arial" w:cs="Arial"/>
         </w:rPr>
-        <w:t xml:space="preserve"> On revenue, Yarra Ranges houses rank second and City two-bedroom apartments fifth, mainly because the houses charge more a night (AUD 426 against 285). Since revenue rewards price and rents are unknown, we use activity to choose where to search and revenue to test each lease (Recommendation 3). Between leases that pass, choose the larger margin in each home's cash-flow plan; if margins are similar, choose the group with the higher share of busy homes.</w:t>
+        <w:t xml:space="preserve"> Table 4 compares </w:t>
+      </w:r>
+      <w:r>
+        <w:rPr>
+          <w:rFonts w:ascii="Arial" w:hAnsi="Arial" w:eastAsia="Arial" w:cs="Arial"/>
+          <w:i/>
+        </w:rPr>
+        <w:t>all-home</w:t>
+      </w:r>
+      <w:r>
+        <w:rPr>
+          <w:rFonts w:ascii="Arial" w:hAnsi="Arial" w:eastAsia="Arial" w:cs="Arial"/>
+        </w:rPr>
+        <w:t xml:space="preserve"> medians with revenue medians for homes below 30 reviews. Yarra Ranges houses rank second on revenue and City two-bedroom apartments fifth, mainly because the houses charge more a night (AUD 426 against 285). With rents unknown, activity guides the search and revenue benchmarks test each lease (Recommendation 3).</w:t>
       </w:r>
     </w:p>
     <w:p>
@@ -3402,7 +3408,46 @@
         <w:rPr>
           <w:rFonts w:ascii="Arial" w:hAnsi="Arial" w:eastAsia="Arial" w:cs="Arial"/>
         </w:rPr>
-        <w:t>Picking a quarter of each priority group, the full model found busy homes 49.6% of the time, against 38.6% for the reduced model and 32.4% for random picking (Figure 3). That is five busy homes in ten, not three. Price and minimum stay carry most of this gain.</w:t>
+        <w:t xml:space="preserve">Picking a quarter of each priority group, the full model found busy homes </w:t>
+      </w:r>
+      <w:r>
+        <w:rPr>
+          <w:rFonts w:ascii="Arial" w:hAnsi="Arial" w:eastAsia="Arial" w:cs="Arial"/>
+          <w:b/>
+        </w:rPr>
+        <w:t>49.6%</w:t>
+      </w:r>
+      <w:r>
+        <w:rPr>
+          <w:rFonts w:ascii="Arial" w:hAnsi="Arial" w:eastAsia="Arial" w:cs="Arial"/>
+        </w:rPr>
+        <w:t xml:space="preserve"> of the time, against </w:t>
+      </w:r>
+      <w:r>
+        <w:rPr>
+          <w:rFonts w:ascii="Arial" w:hAnsi="Arial" w:eastAsia="Arial" w:cs="Arial"/>
+          <w:b/>
+        </w:rPr>
+        <w:t>38.6%</w:t>
+      </w:r>
+      <w:r>
+        <w:rPr>
+          <w:rFonts w:ascii="Arial" w:hAnsi="Arial" w:eastAsia="Arial" w:cs="Arial"/>
+        </w:rPr>
+        <w:t xml:space="preserve"> for the reduced model and </w:t>
+      </w:r>
+      <w:r>
+        <w:rPr>
+          <w:rFonts w:ascii="Arial" w:hAnsi="Arial" w:eastAsia="Arial" w:cs="Arial"/>
+          <w:b/>
+        </w:rPr>
+        <w:t>32.4%</w:t>
+      </w:r>
+      <w:r>
+        <w:rPr>
+          <w:rFonts w:ascii="Arial" w:hAnsi="Arial" w:eastAsia="Arial" w:cs="Arial"/>
+        </w:rPr>
+        <w:t xml:space="preserve"> for random picking (Figure 3). That is five busy homes in ten, not three. Price and minimum stay carry most of this gain (+11.0 points).</w:t>
       </w:r>
     </w:p>
     <w:p>
@@ -3475,7 +3520,33 @@
         <w:rPr>
           <w:rFonts w:ascii="Arial" w:hAnsi="Arial" w:eastAsia="Arial" w:cs="Arial"/>
         </w:rPr>
-        <w:t>The full model beat random picking in 46 of the 50 tests; in nine tests out of ten its gain lay between −1 and +32 percentage points, depending on the homes available.</w:t>
+        <w:t xml:space="preserve">The full model beat random picking in </w:t>
+      </w:r>
+      <w:r>
+        <w:rPr>
+          <w:rFonts w:ascii="Arial" w:hAnsi="Arial" w:eastAsia="Arial" w:cs="Arial"/>
+          <w:b/>
+        </w:rPr>
+        <w:t>46 of the 50 tests</w:t>
+      </w:r>
+      <w:r>
+        <w:rPr>
+          <w:rFonts w:ascii="Arial" w:hAnsi="Arial" w:eastAsia="Arial" w:cs="Arial"/>
+        </w:rPr>
+        <w:t xml:space="preserve">; in nine tests out of ten its gain lay between </w:t>
+      </w:r>
+      <w:r>
+        <w:rPr>
+          <w:rFonts w:ascii="Arial" w:hAnsi="Arial" w:eastAsia="Arial" w:cs="Arial"/>
+          <w:b/>
+        </w:rPr>
+        <w:t>−1 and +32 percentage points</w:t>
+      </w:r>
+      <w:r>
+        <w:rPr>
+          <w:rFonts w:ascii="Arial" w:hAnsi="Arial" w:eastAsia="Arial" w:cs="Arial"/>
+        </w:rPr>
+        <w:t>. Within each group, the reduced model ranks by amenities alone. Its City three-bedroom hit rate was 33.9%, below random picking at 35.9%. We therefore use group priorities for unlisted rentals, where model performance remains untested.</w:t>
       </w:r>
     </w:p>
     <w:p>
@@ -3488,7 +3559,7 @@
         <w:rPr>
           <w:rFonts w:ascii="Arial" w:hAnsi="Arial" w:eastAsia="Arial" w:cs="Arial"/>
         </w:rPr>
-        <w:t>The 49.6% result picks within three priority groups over 50 tests. Table 5 instead picks one combined list from all 3,873 homes, using five tests so each home's score comes from a model trained on other hosts. This broader test gives a 43.7% hit rate (precision), against 25.3% overall, and finds 43.1% of busy homes (recall). Accuracy is 71.5%; calling every home "below target" scores 74.7% but finds none.</w:t>
+        <w:t>The 49.6% result comes from picking within three priority groups over 50 tests. Table 5 instead pools predictions from five separate test groups, covering all 3,873 study homes, and picks one combined top-quarter list (969 homes). Its hit rate is 43.7% (precision), against 25.3% overall, and it finds 43.1% of busy homes (recall). Accuracy is 71.5%; calling every home "below target" scores 74.7% but finds none.</w:t>
       </w:r>
     </w:p>
     <w:p>
@@ -3503,7 +3574,7 @@
           <w:rFonts w:ascii="Arial" w:hAnsi="Arial" w:eastAsia="Arial" w:cs="Arial"/>
           <w:b/>
         </w:rPr>
-        <w:t>Table 5. Hits and misses (confusion matrix): top quarter picked across all 3,873 homes</w:t>
+        <w:t>Table 5. Full-sample confusion matrix: top quarter picked across all 14 study groups</w:t>
       </w:r>
     </w:p>
     <w:tbl>
@@ -3528,10 +3599,10 @@
         <w:tblLayout w:type="fixed"/>
       </w:tblPr>
       <w:tblGrid>
-        <w:gridCol w:w="4239"/>
-        <w:gridCol w:w="1437"/>
-        <w:gridCol w:w="2166"/>
-        <w:gridCol w:w="2021"/>
+        <w:gridCol w:w="4497"/>
+        <w:gridCol w:w="1378"/>
+        <w:gridCol w:w="2067"/>
+        <w:gridCol w:w="1922"/>
       </w:tblGrid>
       <w:tr>
         <w:trPr>
@@ -3540,7 +3611,7 @@
         </w:trPr>
         <w:tc>
           <w:tcPr>
-            <w:tcW w:type="dxa" w:w="4239"/>
+            <w:tcW w:type="dxa" w:w="4497"/>
             <w:vAlign w:val="center"/>
             <w:shd w:val="clear" w:color="auto" w:fill="E9EEF3"/>
           </w:tcPr>
@@ -3550,11 +3621,19 @@
               <w:spacing w:before="40" w:after="40" w:line="240" w:lineRule="auto"/>
               <w:jc w:val="left"/>
             </w:pPr>
+            <w:r>
+              <w:rPr>
+                <w:rFonts w:ascii="Arial" w:hAnsi="Arial" w:eastAsia="Arial" w:cs="Arial"/>
+                <w:b/>
+                <w:sz w:val="21"/>
+              </w:rPr>
+              <w:t>Selection</w:t>
+            </w:r>
           </w:p>
         </w:tc>
         <w:tc>
           <w:tcPr>
-            <w:tcW w:type="dxa" w:w="1437"/>
+            <w:tcW w:type="dxa" w:w="1378"/>
             <w:vAlign w:val="center"/>
             <w:shd w:val="clear" w:color="auto" w:fill="E9EEF3"/>
           </w:tcPr>
@@ -3576,7 +3655,7 @@
         </w:tc>
         <w:tc>
           <w:tcPr>
-            <w:tcW w:type="dxa" w:w="2166"/>
+            <w:tcW w:type="dxa" w:w="2067"/>
             <w:vAlign w:val="center"/>
             <w:shd w:val="clear" w:color="auto" w:fill="E9EEF3"/>
           </w:tcPr>
@@ -3598,7 +3677,7 @@
         </w:tc>
         <w:tc>
           <w:tcPr>
-            <w:tcW w:type="dxa" w:w="2021"/>
+            <w:tcW w:type="dxa" w:w="1922"/>
             <w:vAlign w:val="center"/>
             <w:shd w:val="clear" w:color="auto" w:fill="E9EEF3"/>
           </w:tcPr>
@@ -3625,7 +3704,7 @@
         </w:trPr>
         <w:tc>
           <w:tcPr>
-            <w:tcW w:type="dxa" w:w="4239"/>
+            <w:tcW w:type="dxa" w:w="4497"/>
             <w:vAlign w:val="center"/>
             <w:shd w:val="clear" w:color="auto" w:fill="FFFFFF"/>
           </w:tcPr>
@@ -3646,7 +3725,7 @@
         </w:tc>
         <w:tc>
           <w:tcPr>
-            <w:tcW w:type="dxa" w:w="1437"/>
+            <w:tcW w:type="dxa" w:w="1378"/>
             <w:vAlign w:val="center"/>
             <w:shd w:val="clear" w:color="auto" w:fill="FFFFFF"/>
           </w:tcPr>
@@ -3667,7 +3746,7 @@
         </w:tc>
         <w:tc>
           <w:tcPr>
-            <w:tcW w:type="dxa" w:w="2166"/>
+            <w:tcW w:type="dxa" w:w="2067"/>
             <w:vAlign w:val="center"/>
             <w:shd w:val="clear" w:color="auto" w:fill="FFFFFF"/>
           </w:tcPr>
@@ -3688,7 +3767,7 @@
         </w:tc>
         <w:tc>
           <w:tcPr>
-            <w:tcW w:type="dxa" w:w="2021"/>
+            <w:tcW w:type="dxa" w:w="1922"/>
             <w:vAlign w:val="center"/>
             <w:shd w:val="clear" w:color="auto" w:fill="FFFFFF"/>
           </w:tcPr>
@@ -3714,7 +3793,7 @@
         </w:trPr>
         <w:tc>
           <w:tcPr>
-            <w:tcW w:type="dxa" w:w="4239"/>
+            <w:tcW w:type="dxa" w:w="4497"/>
             <w:vAlign w:val="center"/>
             <w:shd w:val="clear" w:color="auto" w:fill="FFFFFF"/>
           </w:tcPr>
@@ -3734,7 +3813,7 @@
         </w:tc>
         <w:tc>
           <w:tcPr>
-            <w:tcW w:type="dxa" w:w="1437"/>
+            <w:tcW w:type="dxa" w:w="1378"/>
             <w:vAlign w:val="center"/>
             <w:shd w:val="clear" w:color="auto" w:fill="FFFFFF"/>
           </w:tcPr>
@@ -3754,7 +3833,7 @@
         </w:tc>
         <w:tc>
           <w:tcPr>
-            <w:tcW w:type="dxa" w:w="2166"/>
+            <w:tcW w:type="dxa" w:w="2067"/>
             <w:vAlign w:val="center"/>
             <w:shd w:val="clear" w:color="auto" w:fill="FFFFFF"/>
           </w:tcPr>
@@ -3774,7 +3853,7 @@
         </w:tc>
         <w:tc>
           <w:tcPr>
-            <w:tcW w:type="dxa" w:w="2021"/>
+            <w:tcW w:type="dxa" w:w="1922"/>
             <w:vAlign w:val="center"/>
             <w:shd w:val="clear" w:color="auto" w:fill="FFFFFF"/>
           </w:tcPr>
@@ -3811,7 +3890,59 @@
         <w:rPr>
           <w:rFonts w:ascii="Arial" w:hAnsi="Arial" w:eastAsia="Arial" w:cs="Arial"/>
         </w:rPr>
-        <w:t>The model fitted to all homes gives a typical City two-bedroom apartment a 42% chance of being busy with one-night stays and 18% without. Starting from 42%, ten more amenities gives 48%; a 20% price premium gives 36%, holding other inputs fixed (Appendix A). These historical associations do not establish that changing settings causes more bookings.</w:t>
+        <w:t xml:space="preserve">For a typical City two-bedroom apartment, the model fitted to all study homes gives a </w:t>
+      </w:r>
+      <w:r>
+        <w:rPr>
+          <w:rFonts w:ascii="Arial" w:hAnsi="Arial" w:eastAsia="Arial" w:cs="Arial"/>
+          <w:b/>
+        </w:rPr>
+        <w:t>42% chance</w:t>
+      </w:r>
+      <w:r>
+        <w:rPr>
+          <w:rFonts w:ascii="Arial" w:hAnsi="Arial" w:eastAsia="Arial" w:cs="Arial"/>
+        </w:rPr>
+        <w:t xml:space="preserve"> of being busy with one-night stays and </w:t>
+      </w:r>
+      <w:r>
+        <w:rPr>
+          <w:rFonts w:ascii="Arial" w:hAnsi="Arial" w:eastAsia="Arial" w:cs="Arial"/>
+          <w:b/>
+        </w:rPr>
+        <w:t>18%</w:t>
+      </w:r>
+      <w:r>
+        <w:rPr>
+          <w:rFonts w:ascii="Arial" w:hAnsi="Arial" w:eastAsia="Arial" w:cs="Arial"/>
+        </w:rPr>
+        <w:t xml:space="preserve"> without. From 42%, ten more amenities give </w:t>
+      </w:r>
+      <w:r>
+        <w:rPr>
+          <w:rFonts w:ascii="Arial" w:hAnsi="Arial" w:eastAsia="Arial" w:cs="Arial"/>
+          <w:b/>
+        </w:rPr>
+        <w:t>48%</w:t>
+      </w:r>
+      <w:r>
+        <w:rPr>
+          <w:rFonts w:ascii="Arial" w:hAnsi="Arial" w:eastAsia="Arial" w:cs="Arial"/>
+        </w:rPr>
+        <w:t xml:space="preserve">, while a 20% price premium gives </w:t>
+      </w:r>
+      <w:r>
+        <w:rPr>
+          <w:rFonts w:ascii="Arial" w:hAnsi="Arial" w:eastAsia="Arial" w:cs="Arial"/>
+          <w:b/>
+        </w:rPr>
+        <w:t>36%</w:t>
+      </w:r>
+      <w:r>
+        <w:rPr>
+          <w:rFonts w:ascii="Arial" w:hAnsi="Arial" w:eastAsia="Arial" w:cs="Arial"/>
+        </w:rPr>
+        <w:t>. These examples explain the ranking; changing settings alone does not establish an increase in bookings. Table A1 reports model weights across the 50 training fits.</w:t>
       </w:r>
     </w:p>
     <w:p>
@@ -4256,7 +4387,7 @@
         <w:rPr>
           <w:rFonts w:ascii="Arial" w:hAnsi="Arial" w:eastAsia="Arial" w:cs="Arial"/>
         </w:rPr>
-        <w:t>Our plan (Table 7) starts from a pool of ten candidates, whose busy share can differ widely from 49.6%.</w:t>
+        <w:t>Inspecting 10% gives a 54.5% hit rate and finds 17.1% of busy homes; at 50%, the list finds two-thirds (66.7%). Start with ten candidates (Table 7), then inspect the highest-ranked listed homes as the budget allows.</w:t>
       </w:r>
     </w:p>
     <w:p>
@@ -4281,7 +4412,33 @@
         <w:rPr>
           <w:rFonts w:ascii="Arial" w:hAnsi="Arial" w:eastAsia="Arial" w:cs="Arial"/>
         </w:rPr>
-        <w:t>The earlier year's top three groups had 33.6% of homes reaching 34 reviews, against 19.9% elsewhere; that gap reflects how we chose them. In the later year, they still led: 27.1% against 14.9%, about 12 percentage points (Figure 4). The advantage also holds when hosts receive equal weight (Appendix A).</w:t>
+        <w:t xml:space="preserve">The groups chosen for leading in the earlier year had 33.6% of homes reaching 34 reviews, against 19.9% elsewhere (Figure 4). In the later year, they still led: </w:t>
+      </w:r>
+      <w:r>
+        <w:rPr>
+          <w:rFonts w:ascii="Arial" w:hAnsi="Arial" w:eastAsia="Arial" w:cs="Arial"/>
+          <w:b/>
+        </w:rPr>
+        <w:t>27.1% against 14.9%</w:t>
+      </w:r>
+      <w:r>
+        <w:rPr>
+          <w:rFonts w:ascii="Arial" w:hAnsi="Arial" w:eastAsia="Arial" w:cs="Arial"/>
+        </w:rPr>
+        <w:t xml:space="preserve">, about </w:t>
+      </w:r>
+      <w:r>
+        <w:rPr>
+          <w:rFonts w:ascii="Arial" w:hAnsi="Arial" w:eastAsia="Arial" w:cs="Arial"/>
+          <w:b/>
+        </w:rPr>
+        <w:t>12 percentage points</w:t>
+      </w:r>
+      <w:r>
+        <w:rPr>
+          <w:rFonts w:ascii="Arial" w:hAnsi="Arial" w:eastAsia="Arial" w:cs="Arial"/>
+        </w:rPr>
+        <w:t>. The advantage also holds when hosts receive equal weight (Appendix A).</w:t>
       </w:r>
     </w:p>
     <w:p>
@@ -4359,14 +4516,12 @@
     </w:p>
     <w:p>
       <w:pPr>
-        <w:widowControl/>
-        <w:spacing w:after="120" w:line="259" w:lineRule="auto"/>
-        <w:jc w:val="left"/>
+        <w:pStyle w:val="Heading2"/>
+        <w:keepNext/>
       </w:pPr>
       <w:r>
         <w:rPr>
           <w:rFonts w:ascii="Arial" w:hAnsi="Arial" w:eastAsia="Arial" w:cs="Arial"/>
-          <w:b/>
         </w:rPr>
         <w:t>Key findings</w:t>
       </w:r>
@@ -4424,7 +4579,7 @@
         <w:rPr>
           <w:rFonts w:ascii="Arial" w:hAnsi="Arial" w:eastAsia="Arial" w:cs="Arial"/>
         </w:rPr>
-        <w:t xml:space="preserve"> busy homes more often accept one-night stays and charge slightly less than similar homes (Table 3, Section 5.3).</w:t>
+        <w:t xml:space="preserve"> Busy homes far more often accept one-night stays and charge slightly less than similar homes (Table 3, Section 5.3).</w:t>
       </w:r>
     </w:p>
     <w:p>
@@ -4452,19 +4607,17 @@
         <w:rPr>
           <w:rFonts w:ascii="Arial" w:hAnsi="Arial" w:eastAsia="Arial" w:cs="Arial"/>
         </w:rPr>
-        <w:t xml:space="preserve"> within the priority groups, the model raises the hit rate from one in three to one in two (Figure 3).</w:t>
+        <w:t xml:space="preserve"> Within the priority groups, the model raises the hit rate from one in three (32.4%) to one in two (49.6%) (Figure 3, Table 6).</w:t>
       </w:r>
     </w:p>
     <w:p>
       <w:pPr>
-        <w:widowControl/>
-        <w:spacing w:after="120" w:line="259" w:lineRule="auto"/>
-        <w:jc w:val="left"/>
+        <w:pStyle w:val="Heading2"/>
+        <w:keepNext/>
       </w:pPr>
       <w:r>
         <w:rPr>
           <w:rFonts w:ascii="Arial" w:hAnsi="Arial" w:eastAsia="Arial" w:cs="Arial"/>
-          <w:b/>
         </w:rPr>
         <w:t>Recommendations</w:t>
       </w:r>
@@ -4488,13 +4641,13 @@
           <w:rFonts w:ascii="Arial" w:hAnsi="Arial" w:eastAsia="Arial" w:cs="Arial"/>
           <w:b/>
         </w:rPr>
-        <w:t>Search City of Melbourne two- and three-bedroom apartments first</w:t>
+        <w:t>Search City of Melbourne two- and three-bedroom apartments first, then Yarra Ranges three-bedroom houses.</w:t>
       </w:r>
       <w:r>
         <w:rPr>
           <w:rFonts w:ascii="Arial" w:hAnsi="Arial" w:eastAsia="Arial" w:cs="Arial"/>
         </w:rPr>
-        <w:t>, then Yarra Ranges three-bedroom houses; between leases that pass, choose as in Section 5.2.</w:t>
+        <w:t xml:space="preserve"> Between leases that pass, choose the larger cash-flow margin; if margins are similar, choose the group with the higher share of busy homes.</w:t>
       </w:r>
     </w:p>
     <w:p>
@@ -4550,7 +4703,59 @@
         <w:rPr>
           <w:rFonts w:ascii="Arial" w:hAnsi="Arial" w:eastAsia="Arial" w:cs="Arial"/>
         </w:rPr>
-        <w:t xml:space="preserve"> Typical weekly estimates are AUD 590 for City two-bedroom apartments, 930 for City three-bedroom apartments and 890 for Yarra Ranges houses; below-target medians are 320, 620 and 600. Figure 5 shows how many historical homes covered a proposed cost. Drop candidates costing more than typical revenue; assess the rest through their own cash-flow plans. Budget for a year of the below-target shortfall. Obtain written landlord consent and check that any owners' corporation has not banned stays under 28 days (Consumer Affairs Victoria, n.d.). Airbnb collects Victoria's 7.5% short-stay levy on applicable bookings (State Revenue Office Victoria, n.d.).</w:t>
+        <w:t xml:space="preserve"> Typical weekly estimates (all-home medians) are </w:t>
+      </w:r>
+      <w:r>
+        <w:rPr>
+          <w:rFonts w:ascii="Arial" w:hAnsi="Arial" w:eastAsia="Arial" w:cs="Arial"/>
+          <w:b/>
+        </w:rPr>
+        <w:t>AUD 590</w:t>
+      </w:r>
+      <w:r>
+        <w:rPr>
+          <w:rFonts w:ascii="Arial" w:hAnsi="Arial" w:eastAsia="Arial" w:cs="Arial"/>
+        </w:rPr>
+        <w:t xml:space="preserve"> for City two-bedroom apartments, </w:t>
+      </w:r>
+      <w:r>
+        <w:rPr>
+          <w:rFonts w:ascii="Arial" w:hAnsi="Arial" w:eastAsia="Arial" w:cs="Arial"/>
+          <w:b/>
+        </w:rPr>
+        <w:t>930</w:t>
+      </w:r>
+      <w:r>
+        <w:rPr>
+          <w:rFonts w:ascii="Arial" w:hAnsi="Arial" w:eastAsia="Arial" w:cs="Arial"/>
+        </w:rPr>
+        <w:t xml:space="preserve"> for City three-bedroom apartments and </w:t>
+      </w:r>
+      <w:r>
+        <w:rPr>
+          <w:rFonts w:ascii="Arial" w:hAnsi="Arial" w:eastAsia="Arial" w:cs="Arial"/>
+          <w:b/>
+        </w:rPr>
+        <w:t>890</w:t>
+      </w:r>
+      <w:r>
+        <w:rPr>
+          <w:rFonts w:ascii="Arial" w:hAnsi="Arial" w:eastAsia="Arial" w:cs="Arial"/>
+        </w:rPr>
+        <w:t xml:space="preserve"> for Yarra Ranges houses; below-target medians are </w:t>
+      </w:r>
+      <w:r>
+        <w:rPr>
+          <w:rFonts w:ascii="Arial" w:hAnsi="Arial" w:eastAsia="Arial" w:cs="Arial"/>
+          <w:b/>
+        </w:rPr>
+        <w:t>320, 620 and 600</w:t>
+      </w:r>
+      <w:r>
+        <w:rPr>
+          <w:rFonts w:ascii="Arial" w:hAnsi="Arial" w:eastAsia="Arial" w:cs="Arial"/>
+        </w:rPr>
+        <w:t>. Figure 5 shows how many historical homes covered a proposed cost. Drop candidates costing more than typical revenue, assess the rest through their own cash-flow plans, and budget for a year of the below-target shortfall. Obtain written landlord consent and check that any owners' corporation has not banned stays under 28 days (Consumer Affairs Victoria, n.d.). Airbnb collects Victoria's 7.5% short-stay levy on applicable bookings (State Revenue Office Victoria, n.d.).</w:t>
       </w:r>
     </w:p>
     <w:p>
@@ -4590,9 +4795,9 @@
         <w:tblLayout w:type="fixed"/>
       </w:tblPr>
       <w:tblGrid>
-        <w:gridCol w:w="2110"/>
-        <w:gridCol w:w="3681"/>
-        <w:gridCol w:w="4074"/>
+        <w:gridCol w:w="2047"/>
+        <w:gridCol w:w="3907"/>
+        <w:gridCol w:w="3910"/>
       </w:tblGrid>
       <w:tr>
         <w:trPr>
@@ -4601,7 +4806,7 @@
         </w:trPr>
         <w:tc>
           <w:tcPr>
-            <w:tcW w:type="dxa" w:w="2110"/>
+            <w:tcW w:type="dxa" w:w="2047"/>
             <w:vAlign w:val="center"/>
             <w:shd w:val="clear" w:color="auto" w:fill="E9EEF3"/>
           </w:tcPr>
@@ -4623,7 +4828,7 @@
         </w:tc>
         <w:tc>
           <w:tcPr>
-            <w:tcW w:type="dxa" w:w="3681"/>
+            <w:tcW w:type="dxa" w:w="3907"/>
             <w:vAlign w:val="center"/>
             <w:shd w:val="clear" w:color="auto" w:fill="E9EEF3"/>
           </w:tcPr>
@@ -4645,7 +4850,7 @@
         </w:tc>
         <w:tc>
           <w:tcPr>
-            <w:tcW w:type="dxa" w:w="4074"/>
+            <w:tcW w:type="dxa" w:w="3910"/>
             <w:vAlign w:val="center"/>
             <w:shd w:val="clear" w:color="auto" w:fill="E9EEF3"/>
           </w:tcPr>
@@ -4672,7 +4877,7 @@
         </w:trPr>
         <w:tc>
           <w:tcPr>
-            <w:tcW w:type="dxa" w:w="2110"/>
+            <w:tcW w:type="dxa" w:w="2047"/>
             <w:vAlign w:val="center"/>
             <w:shd w:val="clear" w:color="auto" w:fill="FFFFFF"/>
           </w:tcPr>
@@ -4701,7 +4906,7 @@
         </w:tc>
         <w:tc>
           <w:tcPr>
-            <w:tcW w:type="dxa" w:w="3681"/>
+            <w:tcW w:type="dxa" w:w="3907"/>
             <w:vAlign w:val="center"/>
             <w:shd w:val="clear" w:color="auto" w:fill="FFFFFF"/>
           </w:tcPr>
@@ -4722,7 +4927,7 @@
         </w:tc>
         <w:tc>
           <w:tcPr>
-            <w:tcW w:type="dxa" w:w="4074"/>
+            <w:tcW w:type="dxa" w:w="3910"/>
             <w:vAlign w:val="center"/>
             <w:shd w:val="clear" w:color="auto" w:fill="FFFFFF"/>
           </w:tcPr>
@@ -4748,7 +4953,7 @@
         </w:trPr>
         <w:tc>
           <w:tcPr>
-            <w:tcW w:type="dxa" w:w="2110"/>
+            <w:tcW w:type="dxa" w:w="2047"/>
             <w:vAlign w:val="center"/>
             <w:shd w:val="clear" w:color="auto" w:fill="FFFFFF"/>
           </w:tcPr>
@@ -4777,7 +4982,7 @@
         </w:tc>
         <w:tc>
           <w:tcPr>
-            <w:tcW w:type="dxa" w:w="3681"/>
+            <w:tcW w:type="dxa" w:w="3907"/>
             <w:vAlign w:val="center"/>
             <w:shd w:val="clear" w:color="auto" w:fill="FFFFFF"/>
           </w:tcPr>
@@ -4798,7 +5003,7 @@
         </w:tc>
         <w:tc>
           <w:tcPr>
-            <w:tcW w:type="dxa" w:w="4074"/>
+            <w:tcW w:type="dxa" w:w="3910"/>
             <w:vAlign w:val="center"/>
             <w:shd w:val="clear" w:color="auto" w:fill="FFFFFF"/>
           </w:tcPr>
@@ -4824,7 +5029,7 @@
         </w:trPr>
         <w:tc>
           <w:tcPr>
-            <w:tcW w:type="dxa" w:w="2110"/>
+            <w:tcW w:type="dxa" w:w="2047"/>
             <w:vAlign w:val="center"/>
             <w:shd w:val="clear" w:color="auto" w:fill="FFFFFF"/>
           </w:tcPr>
@@ -4853,7 +5058,7 @@
         </w:tc>
         <w:tc>
           <w:tcPr>
-            <w:tcW w:type="dxa" w:w="3681"/>
+            <w:tcW w:type="dxa" w:w="3907"/>
             <w:vAlign w:val="center"/>
             <w:shd w:val="clear" w:color="auto" w:fill="FFFFFF"/>
           </w:tcPr>
@@ -4868,13 +5073,13 @@
                 <w:rFonts w:ascii="Arial" w:hAnsi="Arial" w:eastAsia="Arial" w:cs="Arial"/>
                 <w:sz w:val="21"/>
               </w:rPr>
-              <w:t>Cash-flow plan: quotes against typical and below-target revenue (Recommendation 3)</w:t>
+              <w:t>Cash-flow plan: quotes against typical and below-target revenue (Recommendation 3, Figure 5)</w:t>
             </w:r>
           </w:p>
         </w:tc>
         <w:tc>
           <w:tcPr>
-            <w:tcW w:type="dxa" w:w="4074"/>
+            <w:tcW w:type="dxa" w:w="3910"/>
             <w:vAlign w:val="center"/>
             <w:shd w:val="clear" w:color="auto" w:fill="FFFFFF"/>
           </w:tcPr>
@@ -4889,7 +5094,7 @@
                 <w:rFonts w:ascii="Arial" w:hAnsi="Arial" w:eastAsia="Arial" w:cs="Arial"/>
                 <w:sz w:val="21"/>
               </w:rPr>
-              <w:t>Sign only if the plan covers setup costs and the client's required return, and the buffer covers an assumed year of below-target loss</w:t>
+              <w:t>Sign only if the plan covers setup costs and required return, and the buffer covers a year of below-target loss</w:t>
             </w:r>
           </w:p>
         </w:tc>
@@ -4900,7 +5105,7 @@
         </w:trPr>
         <w:tc>
           <w:tcPr>
-            <w:tcW w:type="dxa" w:w="2110"/>
+            <w:tcW w:type="dxa" w:w="2047"/>
             <w:vAlign w:val="center"/>
             <w:shd w:val="clear" w:color="auto" w:fill="FFFFFF"/>
           </w:tcPr>
@@ -4915,7 +5120,7 @@
                 <w:b/>
                 <w:sz w:val="21"/>
               </w:rPr>
-              <w:t>First 30 days of operation</w:t>
+              <w:t>First 30 days</w:t>
             </w:r>
             <w:r>
               <w:rPr>
@@ -4928,7 +5133,7 @@
         </w:tc>
         <w:tc>
           <w:tcPr>
-            <w:tcW w:type="dxa" w:w="3681"/>
+            <w:tcW w:type="dxa" w:w="3907"/>
             <w:vAlign w:val="center"/>
             <w:shd w:val="clear" w:color="auto" w:fill="FFFFFF"/>
           </w:tcPr>
@@ -4948,7 +5153,7 @@
         </w:tc>
         <w:tc>
           <w:tcPr>
-            <w:tcW w:type="dxa" w:w="4074"/>
+            <w:tcW w:type="dxa" w:w="3910"/>
             <w:vAlign w:val="center"/>
             <w:shd w:val="clear" w:color="auto" w:fill="FFFFFF"/>
           </w:tcPr>
@@ -5052,7 +5257,33 @@
         <w:rPr>
           <w:rFonts w:ascii="Arial" w:hAnsi="Arial" w:eastAsia="Arial" w:cs="Arial"/>
         </w:rPr>
-        <w:t xml:space="preserve"> An agent offers two unlisted homes; weekly rent plus the client's quotes for cleaning, utilities, insurance and Airbnb fees total AUD 620 for a City two-bedroom apartment and AUD 700 for a Yarra Ranges three-bedroom house. The apartment's group comes first, but AUD 620 exceeds its typical AUD 590 a week, so it is dropped. The house clears its group's typical AUD 890, so it goes to rent negotiation and its own cash-flow plan, since a group median is not a forecast for one home. Earning like a below-target home (AUD 600), it would lose AUD 100 a week, about AUD 5,200 a year, which the buffer must cover. The client signs only if the plan also repays setup costs and meets its required return.</w:t>
+        <w:t xml:space="preserve"> Weekly rent and quoted running costs total </w:t>
+      </w:r>
+      <w:r>
+        <w:rPr>
+          <w:rFonts w:ascii="Arial" w:hAnsi="Arial" w:eastAsia="Arial" w:cs="Arial"/>
+          <w:b/>
+        </w:rPr>
+        <w:t>AUD 620</w:t>
+      </w:r>
+      <w:r>
+        <w:rPr>
+          <w:rFonts w:ascii="Arial" w:hAnsi="Arial" w:eastAsia="Arial" w:cs="Arial"/>
+        </w:rPr>
+        <w:t xml:space="preserve"> for an unlisted City two-bedroom apartment and </w:t>
+      </w:r>
+      <w:r>
+        <w:rPr>
+          <w:rFonts w:ascii="Arial" w:hAnsi="Arial" w:eastAsia="Arial" w:cs="Arial"/>
+          <w:b/>
+        </w:rPr>
+        <w:t>AUD 700</w:t>
+      </w:r>
+      <w:r>
+        <w:rPr>
+          <w:rFonts w:ascii="Arial" w:hAnsi="Arial" w:eastAsia="Arial" w:cs="Arial"/>
+        </w:rPr>
+        <w:t xml:space="preserve"> for a Yarra Ranges three-bedroom house. The apartment exceeds its group's typical AUD 590 revenue, so it is dropped. The house clears its group's typical AUD 890 and advances to negotiation and its own cash-flow plan. At the below-target AUD 600 benchmark, it loses AUD 100 a week, requiring an AUD 5,200 annual buffer. The cash-flow plan must also recover setup costs and deliver the required return.</w:t>
       </w:r>
     </w:p>
     <w:p>
@@ -5086,7 +5317,7 @@
         <w:rPr>
           <w:rFonts w:ascii="Arial" w:hAnsi="Arial" w:eastAsia="Arial" w:cs="Arial"/>
         </w:rPr>
-        <w:t xml:space="preserve"> Inside Airbnb's 50% review rate sits within published estimates of 30.5–72% (Inside Airbnb, n.d.), so the dollar figures are rough, and activity fell in the later year (Figure 4).</w:t>
+        <w:t xml:space="preserve"> Inside Airbnb's 50% review rate sits within published estimates of 30.5%–72% (Inside Airbnb, n.d.), so dollar figures are rough, and activity fell in the later year (Figure 4).</w:t>
       </w:r>
     </w:p>
     <w:p>
@@ -5128,7 +5359,7 @@
         <w:rPr>
           <w:rFonts w:ascii="Arial" w:hAnsi="Arial" w:eastAsia="Arial" w:cs="Arial"/>
         </w:rPr>
-        <w:t xml:space="preserve"> A one-night minimum allows more stays for the same nights booked, so part of its effect is built into the measure; counting each stay as three nights may also overstate these homes' revenue.</w:t>
+        <w:t xml:space="preserve"> A one-night minimum allows more stays for the same nights booked, so part of its effect is built into the target; counting each stay as three nights may also overstate these homes' revenue.</w:t>
       </w:r>
     </w:p>
     <w:p>
@@ -5149,7 +5380,7 @@
         <w:rPr>
           <w:rFonts w:ascii="Arial" w:hAnsi="Arial" w:eastAsia="Arial" w:cs="Arial"/>
         </w:rPr>
-        <w:t xml:space="preserve"> Settings were recorded at collection and may respond to earlier performance. We chose the one-night input after seeing no seven-night home reach the target, and chose the priority groups from all homes, so the 50 tests may overstate the gain.</w:t>
+        <w:t xml:space="preserve"> Settings were recorded at collection and may respond to earlier performance. Choosing the one-night input (after seeing no seven-night home reach 30 reviews) and selecting the priority groups on all homes mean the 50 tests may overstate the gain.</w:t>
       </w:r>
     </w:p>
     <w:p>
@@ -5183,7 +5414,7 @@
         <w:rPr>
           <w:rFonts w:ascii="Arial" w:hAnsi="Arial" w:eastAsia="Arial" w:cs="Arial"/>
         </w:rPr>
-        <w:t>Next, collect rent and cost quotes for the priority groups. Track the client's paid nights and net cash flow to check whether review activity identifies good businesses. Test the unchanged groups, model and selection rule on the next snapshot.</w:t>
+        <w:t>Next, collect rent and cost quotes for the priority groups, track paid nights and net cash flow to check whether review activity identifies good businesses, and test the unchanged groups, model and selection rule on the next snapshot.</w:t>
       </w:r>
     </w:p>
     <w:p>
@@ -5500,7 +5731,20 @@
         <w:rPr>
           <w:rFonts w:ascii="Arial" w:hAnsi="Arial" w:eastAsia="Arial" w:cs="Arial"/>
         </w:rPr>
-        <w:t>We fitted the model in R (R Core Team, 2026). Group median prices and fills for missing minimum stays use training homes only. The group rate is smoothed as (group successes + 10 × overall rate) / (group homes + 10). Odds are the chance of being busy divided by the chance of not being busy. Table A1 gives each input's odds ratio from its average coefficient over the 50 training fits, and the range across fits; above 1 means a higher chance of being busy, below 1 a lower one.</w:t>
+        <w:t xml:space="preserve">We fitted the model in R (R Core Team, 2026). Group median prices and mode fills for missing minimum stays use training homes only. The group rate is smoothed as </w:t>
+      </w:r>
+      <w:r>
+        <w:rPr>
+          <w:rFonts w:ascii="Arial" w:hAnsi="Arial" w:eastAsia="Arial" w:cs="Arial"/>
+          <w:b w:val="0"/>
+        </w:rPr>
+        <w:t>(group_successes + 10 * overall_rate) / (group_homes + 10)</w:t>
+      </w:r>
+      <w:r>
+        <w:rPr>
+          <w:rFonts w:ascii="Arial" w:hAnsi="Arial" w:eastAsia="Arial" w:cs="Arial"/>
+        </w:rPr>
+        <w:t>. Odds are the chance of being busy divided by the chance of not being busy. Table A1 gives each input's odds ratio from its average coefficient over the 50 fits, and the range across fits; above 1 means a higher chance of being busy, below 1 a lower one.</w:t>
       </w:r>
     </w:p>
     <w:p>
@@ -5839,6 +6083,7 @@
             <w:r>
               <w:rPr>
                 <w:rFonts w:ascii="Arial" w:hAnsi="Arial" w:eastAsia="Arial" w:cs="Arial"/>
+                <w:b/>
                 <w:sz w:val="21"/>
               </w:rPr>
               <w:t>Council area (City of Melbourne)</w:t>
@@ -6433,33 +6678,7 @@
         <w:rPr>
           <w:rFonts w:ascii="Arial" w:hAnsi="Arial" w:eastAsia="Arial" w:cs="Arial"/>
         </w:rPr>
-        <w:t xml:space="preserve">Across the 50 tests on all 14 groups, the model ranked a random busy home above a random quiet one 71% of the time, against 60% for group rates (AUC 0.71 and 0.60). Other evaluation designs are in </w:t>
-      </w:r>
-      <w:r>
-        <w:rPr>
-          <w:rFonts w:ascii="Arial" w:hAnsi="Arial" w:eastAsia="Arial" w:cs="Arial"/>
-          <w:b w:val="0"/>
-        </w:rPr>
-        <w:t>final-report/report-2026-10-04/README.md</w:t>
-      </w:r>
-      <w:r>
-        <w:rPr>
-          <w:rFonts w:ascii="Arial" w:hAnsi="Arial" w:eastAsia="Arial" w:cs="Arial"/>
-        </w:rPr>
-        <w:t xml:space="preserve"> (Huang &amp; Xu, 2026).</w:t>
-      </w:r>
-    </w:p>
-    <w:p>
-      <w:pPr>
-        <w:widowControl/>
-        <w:spacing w:after="120" w:line="259" w:lineRule="auto"/>
-        <w:jc w:val="left"/>
-      </w:pPr>
-      <w:r>
-        <w:rPr>
-          <w:rFonts w:ascii="Arial" w:hAnsi="Arial" w:eastAsia="Arial" w:cs="Arial"/>
-        </w:rPr>
-        <w:t>Host-adjusted standard errors are 1.1–2.6 times ordinary estimates. Variance inflation factors are below 3; host-adjusted tests find no clear curvature. Equal host weights within each comparison pool give an 8.7-point later-year gap; 112 hosts appear in both pools. The reduced model's City three-bedroom hit rate was 33.9%, below random picking at 35.9%.</w:t>
+        <w:t>Across the 50 tests on all 14 groups, the model ranked a random busy home above a random quiet one 71% of the time, against 60% for group rates (AUC 0.71 and 0.60); full evaluation tables are in the repository (Huang &amp; Xu, 2026). Host-clustered standard errors are 1.1–2.6 times ordinary estimates, variance inflation factors sit below 3 (low multicollinearity), and host-adjusted tests find no clear curvature. In the two-year check (Section 5.5), equal host weights within each pool give an 8.7-point later-year gap (112 hosts appear in both pools).</w:t>
       </w:r>
     </w:p>
     <w:sectPr>

</xml_diff>

<commit_message>
Finalize Group 2 report links and release files
</commit_message>
<xml_diff>
--- a/final-report/report-2026-10-04/Final_Report.docx
+++ b/final-report/report-2026-10-04/Final_Report.docx
@@ -25,12 +25,6 @@
           <w:b/>
         </w:rPr>
         <w:t>CMCE30005 Final Project Report | Group 2</w:t>
-      </w:r>
-      <w:r>
-        <w:rPr>
-          <w:rFonts w:ascii="Arial" w:hAnsi="Arial" w:eastAsia="Arial" w:cs="Arial"/>
-        </w:rPr>
-        <w:t xml:space="preserve">  </w:t>
       </w:r>
     </w:p>
     <w:p>
@@ -73,7 +67,7 @@
             <w:color w:val="0563C1"/>
             <w:u w:val="single"/>
           </w:rPr>
-          <w:t xml:space="preserve">https://github.com/maksym-xu/CMCE30005-TheNextChapter/tree/final-report-marking-fixes-2026-10-16</w:t>
+          <w:t xml:space="preserve">https://github.com/maksym-xu/CMCE30005-TheNextChapter/tree/main</w:t>
         </w:r>
       </w:hyperlink>
     </w:p>
@@ -5502,7 +5496,7 @@
             <w:color w:val="0563C1"/>
             <w:u w:val="single"/>
           </w:rPr>
-          <w:t xml:space="preserve">https://github.com/maksym-xu/CMCE30005-TheNextChapter/tree/final-report-marking-fixes-2026-10-16</w:t>
+          <w:t xml:space="preserve">https://github.com/maksym-xu/CMCE30005-TheNextChapter/tree/main</w:t>
         </w:r>
       </w:hyperlink>
     </w:p>

</xml_diff>

<commit_message>
Answer the presentation feedback: review meaning, ratings, factors first, two-setting rule
Section 2 explains what review activity measures and why a model is needed
only for Objective 2. Table 3 adds guest ratings. Section 5.3 leads with the
factors (new Figure 3) and a two-setting rule (Table 5) that matches the
model's hit rate; Recommendation 2 becomes that checklist. The confusion
matrix moves to Appendix A, list lengths to the repository, and legal checks
into the inspection plan. Curvature test reported in full. Word count 2,974.
</commit_message>
<xml_diff>
--- a/final-report/report-2026-10-04/Final_Report.docx
+++ b/final-report/report-2026-10-04/Final_Report.docx
@@ -107,7 +107,7 @@
         <w:rPr>
           <w:rFonts w:ascii="Arial" w:hAnsi="Arial" w:eastAsia="Arial" w:cs="Arial"/>
         </w:rPr>
-        <w:t>We recommend City of Melbourne two- and three-bedroom apartments first, followed by Yarra Ranges three-bedroom houses and townhouses. These groups had the highest shares of homes with strong guest activity. Their typical homes brought in an estimated AUD 30,600–48,600 a year before costs, against AUD 24,700 across the study.</w:t>
+        <w:t>We recommend City of Melbourne two- and three-bedroom apartments first, then Yarra Ranges three-bedroom houses and townhouses. These groups had the highest shares of homes with strong guest activity, and their typical homes earned an estimated AUD 30,600–48,600 a year before costs, against AUD 24,700 across the study.</w:t>
       </w:r>
     </w:p>
     <w:p>
@@ -120,7 +120,7 @@
         <w:rPr>
           <w:rFonts w:ascii="Arial" w:hAnsi="Arial" w:eastAsia="Arial" w:cs="Arial"/>
         </w:rPr>
-        <w:t>Within these groups, a simple model picks homes that reach our activity target about half the time (49.6%), against one in three (32.4%) at random. It ranks only homes already on Airbnb; for unlisted rentals, use the group order and the checks in Section 6.</w:t>
+        <w:t>Within these groups, homes that accepted one-night stays and were priced at or below similar homes were busy half the time (50.4%), against one in three at random (32.4%). Section 6 turns this into a search order, a checklist and a cost test.</w:t>
       </w:r>
     </w:p>
     <w:p>
@@ -180,7 +180,7 @@
         <w:rPr>
           <w:rFonts w:ascii="Arial" w:hAnsi="Arial" w:eastAsia="Arial" w:cs="Arial"/>
         </w:rPr>
-        <w:t>Rank property groups by the share of homes with strong guest activity, and translate this into estimated nights and revenue.</w:t>
+        <w:t>Rank property groups by their share of homes with strong guest activity, and express this in nights and revenue.</w:t>
       </w:r>
     </w:p>
     <w:p>
@@ -201,7 +201,7 @@
         <w:rPr>
           <w:rFonts w:ascii="Arial" w:hAnsi="Arial" w:eastAsia="Arial" w:cs="Arial"/>
         </w:rPr>
-        <w:t>Test whether a simple model picks better homes within the leading groups than random picking.</w:t>
+        <w:t>Identify which home settings go with strong activity, and test whether they pick better homes within the leading groups than random picking.</w:t>
       </w:r>
     </w:p>
     <w:p>
@@ -223,6 +223,19 @@
           <w:rFonts w:ascii="Arial" w:hAnsi="Arial" w:eastAsia="Arial" w:cs="Arial"/>
         </w:rPr>
         <w:t>Turn the results into a search order and a four-week inspection plan.</w:t>
+      </w:r>
+    </w:p>
+    <w:p>
+      <w:pPr>
+        <w:widowControl/>
+        <w:spacing w:after="120" w:line="259" w:lineRule="auto"/>
+        <w:jc w:val="left"/>
+      </w:pPr>
+      <w:r>
+        <w:rPr>
+          <w:rFonts w:ascii="Arial" w:hAnsi="Arial" w:eastAsia="Arial" w:cs="Arial"/>
+        </w:rPr>
+        <w:t>Objective 1 needs only a simple summary by group (Section 5.2). Objective 2 needs a model, because a group summary gives every home in a group the same rate.</w:t>
       </w:r>
     </w:p>
     <w:p>
@@ -261,7 +274,27 @@
         <w:rPr>
           <w:rFonts w:ascii="Arial" w:hAnsi="Arial" w:eastAsia="Arial" w:cs="Arial"/>
         </w:rPr>
-        <w:t xml:space="preserve"> (reaches our target) when it receives at least 30 guest reviews in the 365 days before data collection, a level reached by a quarter of separate reference homes (Section 3). Inside Airbnb (n.d.) assumes half of stays are reviewed and each lasts three nights (or the minimum stay if longer), capping estimated nights at 70% of the year (255). With three-night stays, 30 reviews means about 180 booked nights a year.</w:t>
+        <w:t xml:space="preserve"> (reaches our target) when it receives at least 30 guest reviews in the year before data collection, a level reached by a quarter of separate reference homes (Section 3). Inside Airbnb (n.d.) assumes half of stays are reviewed and each lasts three nights (or the minimum stay if longer), capping estimated nights at 255 a year, so 30 reviews means about 180 booked nights.</w:t>
+      </w:r>
+    </w:p>
+    <w:p>
+      <w:pPr>
+        <w:widowControl/>
+        <w:spacing w:after="120" w:line="259" w:lineRule="auto"/>
+        <w:jc w:val="left"/>
+      </w:pPr>
+      <w:r>
+        <w:rPr>
+          <w:rFonts w:ascii="Arial" w:hAnsi="Arial" w:eastAsia="Arial" w:cs="Arial"/>
+          <w:b/>
+        </w:rPr>
+        <w:t>What review activity measures.</w:t>
+      </w:r>
+      <w:r>
+        <w:rPr>
+          <w:rFonts w:ascii="Arial" w:hAnsi="Arial" w:eastAsia="Arial" w:cs="Arial"/>
+        </w:rPr>
+        <w:t xml:space="preserve"> Guests review only after a stay, so reviews track completed bookings, a guide to demand and occupancy; this matters because empty nights are the operator's main risk. Reviews do not show profit (rents and costs are outside our data) or satisfaction (reviews can be negative), so we convert them into nights and revenue and check ratings (Section 5.1). We do not rank on revenue: Inside Airbnb estimates it from reviews and advertised prices, and without rents a higher price is not a better lease.</w:t>
       </w:r>
     </w:p>
     <w:p>
@@ -274,20 +307,7 @@
         <w:rPr>
           <w:rFonts w:ascii="Arial" w:hAnsi="Arial" w:eastAsia="Arial" w:cs="Arial"/>
         </w:rPr>
-        <w:t>We rank on reviews rather than revenue because Inside Airbnb's revenue estimate multiplies these nights by the advertised price, and without rents a higher price does not mean a better lease. Rents, costs and profit are outside our data.</w:t>
-      </w:r>
-    </w:p>
-    <w:p>
-      <w:pPr>
-        <w:widowControl/>
-        <w:spacing w:after="120" w:line="259" w:lineRule="auto"/>
-        <w:jc w:val="left"/>
-      </w:pPr>
-      <w:r>
-        <w:rPr>
-          <w:rFonts w:ascii="Arial" w:hAnsi="Arial" w:eastAsia="Arial" w:cs="Arial"/>
-        </w:rPr>
-        <w:t>Since the interim report, we replaced its random forest with an explainable logistic regression and added tests within the leading groups.</w:t>
+        <w:t>Since the interim report, we replaced its random forest with an explainable logistic regression.</w:t>
       </w:r>
     </w:p>
     <w:p>
@@ -313,7 +333,7 @@
         <w:rPr>
           <w:rFonts w:ascii="Arial" w:hAnsi="Arial" w:eastAsia="Arial" w:cs="Arial"/>
         </w:rPr>
-        <w:t>We use one Inside Airbnb snapshot of Melbourne, supplied through the subject LMS and collected 17 June–1 July 2026 (Inside Airbnb, 2026). It holds 25,728 listings with 90 fields and 1,026,690 dated reviews. We did not use the calendar, which cannot separate bookings from blocked nights.</w:t>
+        <w:t>We use one Inside Airbnb snapshot of Melbourne, supplied through the subject LMS and collected 17 June–1 July 2026 (Inside Airbnb, 2026). It holds 25,728 listings and 1,026,690 dated reviews. We did not use the calendar, which cannot separate bookings from blocked nights.</w:t>
       </w:r>
     </w:p>
     <w:p>
@@ -326,7 +346,7 @@
         <w:rPr>
           <w:rFonts w:ascii="Arial" w:hAnsi="Arial" w:eastAsia="Arial" w:cs="Arial"/>
         </w:rPr>
-        <w:t>Cleaning converted price text to numbers, standardized missing entries and counted amenities. We rebuilt annual review counts from review dates over the exact 365 days before collection; the supplied count covers 366 days. Price is missing for 6,553 listings (25%) and bedrooms for 4,679 (18%); 4,477 listings (17%) have never been reviewed.</w:t>
+        <w:t>Cleaning converted prices to numbers, standardized missing entries, counted amenities and rebuilt annual review counts from review dates. Price is missing for 6,553 listings (25%) and bedrooms for 4,679 (18%); 4,477 listings (17%) have never been reviewed.</w:t>
       </w:r>
     </w:p>
     <w:p>
@@ -339,7 +359,7 @@
         <w:rPr>
           <w:rFonts w:ascii="Arial" w:hAnsi="Arial" w:eastAsia="Arial" w:cs="Arial"/>
         </w:rPr>
-        <w:t>We keep prices of AUD 30–1,500, excluding unpriced listings and extreme prices. Eligible homes are entire rental units and condos (</w:t>
+        <w:t>We keep homes priced AUD 30–1,500 that are entire rental units or condos (</w:t>
       </w:r>
       <w:r>
         <w:rPr>
@@ -352,7 +372,7 @@
         <w:rPr>
           <w:rFonts w:ascii="Arial" w:hAnsi="Arial" w:eastAsia="Arial" w:cs="Arial"/>
         </w:rPr>
-        <w:t>) or entire homes and townhouses (</w:t>
+        <w:t>) or entire homes or townhouses (</w:t>
       </w:r>
       <w:r>
         <w:rPr>
@@ -365,7 +385,7 @@
         <w:rPr>
           <w:rFonts w:ascii="Arial" w:hAnsi="Arial" w:eastAsia="Arial" w:cs="Arial"/>
         </w:rPr>
-        <w:t>), with one to three bedrooms and a first review at least a year before collection. This provides a full year of recorded review history.</w:t>
+        <w:t>), with one to three bedrooms and a first review at least a year before collection, so each has a full year of reviews.</w:t>
       </w:r>
     </w:p>
     <w:p>
@@ -378,7 +398,7 @@
         <w:rPr>
           <w:rFonts w:ascii="Arial" w:hAnsi="Arial" w:eastAsia="Arial" w:cs="Arial"/>
         </w:rPr>
-        <w:t>We set aside about one in five hosts from the eligible sample (1,342 homes) to set an independent target. Their 906 homes in the final groups set the threshold: a quarter received 30 or more reviews (Table 1).</w:t>
+        <w:t>We set aside about one in five hosts (1,342 homes) to set an independent target: of their 906 homes in the final groups, a quarter received 30 or more reviews (Table 1).</w:t>
       </w:r>
     </w:p>
     <w:p>
@@ -418,8 +438,8 @@
         <w:tblLayout w:type="fixed"/>
       </w:tblPr>
       <w:tblGrid>
-        <w:gridCol w:w="8252"/>
-        <w:gridCol w:w="1613"/>
+        <w:gridCol w:w="8156"/>
+        <w:gridCol w:w="1709"/>
       </w:tblGrid>
       <w:tr>
         <w:trPr>
@@ -428,7 +448,7 @@
         </w:trPr>
         <w:tc>
           <w:tcPr>
-            <w:tcW w:type="dxa" w:w="8252"/>
+            <w:tcW w:type="dxa" w:w="8156"/>
             <w:vAlign w:val="center"/>
             <w:shd w:val="clear" w:color="auto" w:fill="E9EEF3"/>
           </w:tcPr>
@@ -450,7 +470,7 @@
         </w:tc>
         <w:tc>
           <w:tcPr>
-            <w:tcW w:type="dxa" w:w="1613"/>
+            <w:tcW w:type="dxa" w:w="1709"/>
             <w:vAlign w:val="center"/>
             <w:shd w:val="clear" w:color="auto" w:fill="E9EEF3"/>
           </w:tcPr>
@@ -477,7 +497,7 @@
         </w:trPr>
         <w:tc>
           <w:tcPr>
-            <w:tcW w:type="dxa" w:w="8252"/>
+            <w:tcW w:type="dxa" w:w="8156"/>
             <w:vAlign w:val="center"/>
             <w:shd w:val="clear" w:color="auto" w:fill="FFFFFF"/>
           </w:tcPr>
@@ -498,7 +518,7 @@
         </w:tc>
         <w:tc>
           <w:tcPr>
-            <w:tcW w:type="dxa" w:w="1613"/>
+            <w:tcW w:type="dxa" w:w="1709"/>
             <w:vAlign w:val="center"/>
             <w:shd w:val="clear" w:color="auto" w:fill="FFFFFF"/>
           </w:tcPr>
@@ -524,7 +544,7 @@
         </w:trPr>
         <w:tc>
           <w:tcPr>
-            <w:tcW w:type="dxa" w:w="8252"/>
+            <w:tcW w:type="dxa" w:w="8156"/>
             <w:vAlign w:val="center"/>
             <w:shd w:val="clear" w:color="auto" w:fill="FFFFFF"/>
           </w:tcPr>
@@ -545,7 +565,7 @@
         </w:tc>
         <w:tc>
           <w:tcPr>
-            <w:tcW w:type="dxa" w:w="1613"/>
+            <w:tcW w:type="dxa" w:w="1709"/>
             <w:vAlign w:val="center"/>
             <w:shd w:val="clear" w:color="auto" w:fill="FFFFFF"/>
           </w:tcPr>
@@ -571,7 +591,7 @@
         </w:trPr>
         <w:tc>
           <w:tcPr>
-            <w:tcW w:type="dxa" w:w="8252"/>
+            <w:tcW w:type="dxa" w:w="8156"/>
             <w:vAlign w:val="center"/>
             <w:shd w:val="clear" w:color="auto" w:fill="FFFFFF"/>
           </w:tcPr>
@@ -592,7 +612,7 @@
         </w:tc>
         <w:tc>
           <w:tcPr>
-            <w:tcW w:type="dxa" w:w="1613"/>
+            <w:tcW w:type="dxa" w:w="1709"/>
             <w:vAlign w:val="center"/>
             <w:shd w:val="clear" w:color="auto" w:fill="FFFFFF"/>
           </w:tcPr>
@@ -618,7 +638,7 @@
         </w:trPr>
         <w:tc>
           <w:tcPr>
-            <w:tcW w:type="dxa" w:w="8252"/>
+            <w:tcW w:type="dxa" w:w="8156"/>
             <w:vAlign w:val="center"/>
             <w:shd w:val="clear" w:color="auto" w:fill="FFFFFF"/>
           </w:tcPr>
@@ -639,7 +659,7 @@
         </w:tc>
         <w:tc>
           <w:tcPr>
-            <w:tcW w:type="dxa" w:w="1613"/>
+            <w:tcW w:type="dxa" w:w="1709"/>
             <w:vAlign w:val="center"/>
             <w:shd w:val="clear" w:color="auto" w:fill="FFFFFF"/>
           </w:tcPr>
@@ -665,7 +685,7 @@
         </w:trPr>
         <w:tc>
           <w:tcPr>
-            <w:tcW w:type="dxa" w:w="8252"/>
+            <w:tcW w:type="dxa" w:w="8156"/>
             <w:vAlign w:val="center"/>
             <w:shd w:val="clear" w:color="auto" w:fill="FFFFFF"/>
           </w:tcPr>
@@ -686,7 +706,7 @@
         </w:tc>
         <w:tc>
           <w:tcPr>
-            <w:tcW w:type="dxa" w:w="1613"/>
+            <w:tcW w:type="dxa" w:w="1709"/>
             <w:vAlign w:val="center"/>
             <w:shd w:val="clear" w:color="auto" w:fill="FFFFFF"/>
           </w:tcPr>
@@ -712,7 +732,7 @@
         </w:trPr>
         <w:tc>
           <w:tcPr>
-            <w:tcW w:type="dxa" w:w="8252"/>
+            <w:tcW w:type="dxa" w:w="8156"/>
             <w:vAlign w:val="center"/>
             <w:shd w:val="clear" w:color="auto" w:fill="FFFFFF"/>
           </w:tcPr>
@@ -733,7 +753,7 @@
         </w:tc>
         <w:tc>
           <w:tcPr>
-            <w:tcW w:type="dxa" w:w="1613"/>
+            <w:tcW w:type="dxa" w:w="1709"/>
             <w:vAlign w:val="center"/>
             <w:shd w:val="clear" w:color="auto" w:fill="FFFFFF"/>
           </w:tcPr>
@@ -759,13 +779,12 @@
         </w:trPr>
         <w:tc>
           <w:tcPr>
-            <w:tcW w:type="dxa" w:w="8252"/>
+            <w:tcW w:type="dxa" w:w="8156"/>
             <w:vAlign w:val="center"/>
             <w:shd w:val="clear" w:color="auto" w:fill="FFFFFF"/>
           </w:tcPr>
           <w:p>
             <w:pPr>
-              <w:keepNext/>
               <w:spacing w:before="40" w:after="40" w:line="240" w:lineRule="auto"/>
               <w:jc w:val="left"/>
             </w:pPr>
@@ -781,54 +800,7 @@
         </w:tc>
         <w:tc>
           <w:tcPr>
-            <w:tcW w:type="dxa" w:w="1613"/>
-            <w:vAlign w:val="center"/>
-            <w:shd w:val="clear" w:color="auto" w:fill="FFFFFF"/>
-          </w:tcPr>
-          <w:p>
-            <w:pPr>
-              <w:keepNext/>
-              <w:spacing w:before="40" w:after="40" w:line="240" w:lineRule="auto"/>
-              <w:jc w:val="right"/>
-            </w:pPr>
-            <w:r>
-              <w:rPr>
-                <w:rFonts w:ascii="Arial" w:hAnsi="Arial" w:eastAsia="Arial" w:cs="Arial"/>
-                <w:b/>
-                <w:sz w:val="21"/>
-              </w:rPr>
-              <w:t>3,873</w:t>
-            </w:r>
-          </w:p>
-        </w:tc>
-      </w:tr>
-      <w:tr>
-        <w:trPr>
-          <w:cantSplit/>
-        </w:trPr>
-        <w:tc>
-          <w:tcPr>
-            <w:tcW w:type="dxa" w:w="8252"/>
-            <w:vAlign w:val="center"/>
-            <w:shd w:val="clear" w:color="auto" w:fill="FFFFFF"/>
-          </w:tcPr>
-          <w:p>
-            <w:pPr>
-              <w:spacing w:before="40" w:after="40" w:line="240" w:lineRule="auto"/>
-              <w:jc w:val="left"/>
-            </w:pPr>
-            <w:r>
-              <w:rPr>
-                <w:rFonts w:ascii="Arial" w:hAnsi="Arial" w:eastAsia="Arial" w:cs="Arial"/>
-                <w:sz w:val="21"/>
-              </w:rPr>
-              <w:t>Reference homes in these groups (from 1,342; target only)</w:t>
-            </w:r>
-          </w:p>
-        </w:tc>
-        <w:tc>
-          <w:tcPr>
-            <w:tcW w:type="dxa" w:w="1613"/>
+            <w:tcW w:type="dxa" w:w="1709"/>
             <w:vAlign w:val="center"/>
             <w:shd w:val="clear" w:color="auto" w:fill="FFFFFF"/>
           </w:tcPr>
@@ -840,9 +812,10 @@
             <w:r>
               <w:rPr>
                 <w:rFonts w:ascii="Arial" w:hAnsi="Arial" w:eastAsia="Arial" w:cs="Arial"/>
+                <w:b/>
                 <w:sz w:val="21"/>
               </w:rPr>
-              <w:t>906</w:t>
+              <w:t>3,873</w:t>
             </w:r>
           </w:p>
         </w:tc>
@@ -865,7 +838,7 @@
         <w:rPr>
           <w:rFonts w:ascii="Arial" w:hAnsi="Arial" w:eastAsia="Arial" w:cs="Arial"/>
         </w:rPr>
-        <w:t>The 3,873 analysis homes belong to 1,726 hosts in six council areas. The price rule drops 3,796 residential listings (14,895 minus 11,099): 77.8% had no review in the past year, against 17.0% of those kept.</w:t>
+        <w:t>The 3,873 analysis homes belong to 1,726 hosts in six council areas, the only areas with groups of at least 50 homes. The price rule drops 3,796 residential listings: 77.8% had no review in the past year, against 17.0% of those kept.</w:t>
       </w:r>
     </w:p>
     <w:p>
@@ -898,7 +871,27 @@
         <w:rPr>
           <w:rFonts w:ascii="Arial" w:hAnsi="Arial" w:eastAsia="Arial" w:cs="Arial"/>
         </w:rPr>
-        <w:t xml:space="preserve"> We compare the share of busy homes in the 14 groups. To show how much a share could move by chance, we redraw hosts at random 1,000 times and report the middle 90% of results.</w:t>
+        <w:t xml:space="preserve"> We compare the share of busy homes in the 14 groups; redrawing hosts at random 1,000 times shows how much each share could move by chance (middle 90% of results).</w:t>
+      </w:r>
+    </w:p>
+    <w:p>
+      <w:pPr>
+        <w:widowControl/>
+        <w:spacing w:after="120" w:line="259" w:lineRule="auto"/>
+        <w:jc w:val="left"/>
+      </w:pPr>
+      <w:r>
+        <w:rPr>
+          <w:rFonts w:ascii="Arial" w:hAnsi="Arial" w:eastAsia="Arial" w:cs="Arial"/>
+          <w:b/>
+        </w:rPr>
+        <w:t>Two-setting rule.</w:t>
+      </w:r>
+      <w:r>
+        <w:rPr>
+          <w:rFonts w:ascii="Arial" w:hAnsi="Arial" w:eastAsia="Arial" w:cs="Arial"/>
+        </w:rPr>
+        <w:t xml:space="preserve"> To test whether a simple summary does as well as the model, we split priority-group homes by one-night stays and by price at or below the group median.</w:t>
       </w:r>
     </w:p>
     <w:p>
@@ -918,7 +911,7 @@
         <w:rPr>
           <w:rFonts w:ascii="Arial" w:hAnsi="Arial" w:eastAsia="Arial" w:cs="Arial"/>
         </w:rPr>
-        <w:t xml:space="preserve"> Logistic regression combines six inputs into a score and converts it into a chance of being busy, from 0% to 100% (R Core Team, 2026). Table 2 lists the outcome and inputs.</w:t>
+        <w:t xml:space="preserve"> Logistic regression turns six inputs into a chance of being busy (R Core Team, 2026); its weights show how each input moves that chance with the others held fixed. Table 2 lists the outcome and inputs.</w:t>
       </w:r>
     </w:p>
     <w:p>
@@ -1242,7 +1235,7 @@
                 <w:rFonts w:ascii="Arial" w:hAnsi="Arial" w:eastAsia="Arial" w:cs="Arial"/>
                 <w:sz w:val="21"/>
               </w:rPr>
-              <w:t>Nightly price relative to the group median, in steps of 10%</w:t>
+              <w:t>Price relative to the group median, per 10%</w:t>
             </w:r>
           </w:p>
         </w:tc>
@@ -1334,7 +1327,7 @@
                 <w:rFonts w:ascii="Arial" w:hAnsi="Arial" w:eastAsia="Arial" w:cs="Arial"/>
                 <w:sz w:val="21"/>
               </w:rPr>
-              <w:t>Amenities listed, in steps of ten</w:t>
+              <w:t>Amenities listed, per ten</w:t>
             </w:r>
           </w:p>
         </w:tc>
@@ -1383,7 +1376,7 @@
         <w:rPr>
           <w:rFonts w:ascii="Arial" w:hAnsi="Arial" w:eastAsia="Arial" w:cs="Arial"/>
         </w:rPr>
-        <w:t xml:space="preserve">, a group's share of busy homes, scores all its homes equally; within a group, this is </w:t>
+        <w:t xml:space="preserve"> (a group's share of busy homes) scores all its homes equally, which within a group is </w:t>
       </w:r>
       <w:r>
         <w:rPr>
@@ -1429,7 +1422,7 @@
         <w:rPr>
           <w:rFonts w:ascii="Arial" w:hAnsi="Arial" w:eastAsia="Arial" w:cs="Arial"/>
         </w:rPr>
-        <w:t xml:space="preserve"> Homes run by the same host can perform alike, so they stay together in every test. Each 10% price step and ten extra amenities receive a fixed weight in the score. Checks for overlapping inputs and curved relationships are in Appendix A.</w:t>
+        <w:t xml:space="preserve"> Homes of the same host can perform alike, so they stay together in every test. Each 10% price step and ten extra amenities have a fixed effect on the score; Appendix A checks overlap between inputs and curved relationships.</w:t>
       </w:r>
     </w:p>
     <w:p>
@@ -1449,7 +1442,7 @@
         <w:rPr>
           <w:rFonts w:ascii="Arial" w:hAnsi="Arial" w:eastAsia="Arial" w:cs="Arial"/>
         </w:rPr>
-        <w:t xml:space="preserve"> Each of 50 tests builds the model from 70% of hosts and scores the unseen homes of the other 30%. In each priority group, each method picks a quarter of test homes, and we compare the share that were busy.</w:t>
+        <w:t xml:space="preserve"> Each of 50 tests builds the model on 70% of hosts and scores the other 30%. In each priority group, each method picks a quarter of these homes, and we compare the share that were busy.</w:t>
       </w:r>
     </w:p>
     <w:p>
@@ -1469,7 +1462,7 @@
         <w:rPr>
           <w:rFonts w:ascii="Arial" w:hAnsi="Arial" w:eastAsia="Arial" w:cs="Arial"/>
         </w:rPr>
-        <w:t xml:space="preserve"> For 2,657 homes with two years of reviews in ten groups, we chose the top three groups in the earlier year and followed them into the later year (target 34 reviews, set from the earlier year's reference homes).</w:t>
+        <w:t xml:space="preserve"> We rank groups on an earlier year and follow the top three into the next (Section 5.4).</w:t>
       </w:r>
     </w:p>
     <w:p>
@@ -1494,7 +1487,7 @@
         <w:rPr>
           <w:rFonts w:ascii="Arial" w:hAnsi="Arial" w:eastAsia="Arial" w:cs="Arial"/>
         </w:rPr>
-        <w:t>5.1 Data exploration: most homes are quiet, and busy homes accept one-night stays</w:t>
+        <w:t>5.1 Data exploration: most homes are quiet; busy homes accept one-night stays and are well rated</w:t>
       </w:r>
     </w:p>
     <w:p>
@@ -1607,10 +1600,10 @@
         <w:tblLayout w:type="fixed"/>
       </w:tblPr>
       <w:tblGrid>
-        <w:gridCol w:w="5247"/>
-        <w:gridCol w:w="1812"/>
-        <w:gridCol w:w="1402"/>
-        <w:gridCol w:w="1402"/>
+        <w:gridCol w:w="5173"/>
+        <w:gridCol w:w="1837"/>
+        <w:gridCol w:w="1427"/>
+        <w:gridCol w:w="1427"/>
       </w:tblGrid>
       <w:tr>
         <w:trPr>
@@ -1619,7 +1612,7 @@
         </w:trPr>
         <w:tc>
           <w:tcPr>
-            <w:tcW w:type="dxa" w:w="5247"/>
+            <w:tcW w:type="dxa" w:w="5173"/>
             <w:vAlign w:val="center"/>
             <w:shd w:val="clear" w:color="auto" w:fill="E9EEF3"/>
           </w:tcPr>
@@ -1641,7 +1634,7 @@
         </w:tc>
         <w:tc>
           <w:tcPr>
-            <w:tcW w:type="dxa" w:w="1812"/>
+            <w:tcW w:type="dxa" w:w="1837"/>
             <w:vAlign w:val="center"/>
             <w:shd w:val="clear" w:color="auto" w:fill="E9EEF3"/>
           </w:tcPr>
@@ -1663,7 +1656,7 @@
         </w:tc>
         <w:tc>
           <w:tcPr>
-            <w:tcW w:type="dxa" w:w="1402"/>
+            <w:tcW w:type="dxa" w:w="1427"/>
             <w:vAlign w:val="center"/>
             <w:shd w:val="clear" w:color="auto" w:fill="E9EEF3"/>
           </w:tcPr>
@@ -1685,7 +1678,7 @@
         </w:tc>
         <w:tc>
           <w:tcPr>
-            <w:tcW w:type="dxa" w:w="1402"/>
+            <w:tcW w:type="dxa" w:w="1427"/>
             <w:vAlign w:val="center"/>
             <w:shd w:val="clear" w:color="auto" w:fill="E9EEF3"/>
           </w:tcPr>
@@ -1712,7 +1705,7 @@
         </w:trPr>
         <w:tc>
           <w:tcPr>
-            <w:tcW w:type="dxa" w:w="5247"/>
+            <w:tcW w:type="dxa" w:w="5173"/>
             <w:vAlign w:val="center"/>
             <w:shd w:val="clear" w:color="auto" w:fill="FFFFFF"/>
           </w:tcPr>
@@ -1733,7 +1726,7 @@
         </w:tc>
         <w:tc>
           <w:tcPr>
-            <w:tcW w:type="dxa" w:w="1812"/>
+            <w:tcW w:type="dxa" w:w="1837"/>
             <w:vAlign w:val="center"/>
             <w:shd w:val="clear" w:color="auto" w:fill="FFFFFF"/>
           </w:tcPr>
@@ -1754,7 +1747,7 @@
         </w:tc>
         <w:tc>
           <w:tcPr>
-            <w:tcW w:type="dxa" w:w="1402"/>
+            <w:tcW w:type="dxa" w:w="1427"/>
             <w:vAlign w:val="center"/>
             <w:shd w:val="clear" w:color="auto" w:fill="FFFFFF"/>
           </w:tcPr>
@@ -1775,7 +1768,7 @@
         </w:tc>
         <w:tc>
           <w:tcPr>
-            <w:tcW w:type="dxa" w:w="1402"/>
+            <w:tcW w:type="dxa" w:w="1427"/>
             <w:vAlign w:val="center"/>
             <w:shd w:val="clear" w:color="auto" w:fill="FFFFFF"/>
           </w:tcPr>
@@ -1801,7 +1794,7 @@
         </w:trPr>
         <w:tc>
           <w:tcPr>
-            <w:tcW w:type="dxa" w:w="5247"/>
+            <w:tcW w:type="dxa" w:w="5173"/>
             <w:vAlign w:val="center"/>
             <w:shd w:val="clear" w:color="auto" w:fill="FFFFFF"/>
           </w:tcPr>
@@ -1822,7 +1815,7 @@
         </w:tc>
         <w:tc>
           <w:tcPr>
-            <w:tcW w:type="dxa" w:w="1812"/>
+            <w:tcW w:type="dxa" w:w="1837"/>
             <w:vAlign w:val="center"/>
             <w:shd w:val="clear" w:color="auto" w:fill="FFFFFF"/>
           </w:tcPr>
@@ -1843,7 +1836,7 @@
         </w:tc>
         <w:tc>
           <w:tcPr>
-            <w:tcW w:type="dxa" w:w="1402"/>
+            <w:tcW w:type="dxa" w:w="1427"/>
             <w:vAlign w:val="center"/>
             <w:shd w:val="clear" w:color="auto" w:fill="FFFFFF"/>
           </w:tcPr>
@@ -1864,7 +1857,7 @@
         </w:tc>
         <w:tc>
           <w:tcPr>
-            <w:tcW w:type="dxa" w:w="1402"/>
+            <w:tcW w:type="dxa" w:w="1427"/>
             <w:vAlign w:val="center"/>
             <w:shd w:val="clear" w:color="auto" w:fill="FFFFFF"/>
           </w:tcPr>
@@ -1890,96 +1883,7 @@
         </w:trPr>
         <w:tc>
           <w:tcPr>
-            <w:tcW w:type="dxa" w:w="5247"/>
-            <w:vAlign w:val="center"/>
-            <w:shd w:val="clear" w:color="auto" w:fill="FFFFFF"/>
-          </w:tcPr>
-          <w:p>
-            <w:pPr>
-              <w:keepNext/>
-              <w:spacing w:before="40" w:after="40" w:line="240" w:lineRule="auto"/>
-              <w:jc w:val="left"/>
-            </w:pPr>
-            <w:r>
-              <w:rPr>
-                <w:rFonts w:ascii="Arial" w:hAnsi="Arial" w:eastAsia="Arial" w:cs="Arial"/>
-                <w:sz w:val="21"/>
-              </w:rPr>
-              <w:t>Median amenity count</w:t>
-            </w:r>
-          </w:p>
-        </w:tc>
-        <w:tc>
-          <w:tcPr>
-            <w:tcW w:type="dxa" w:w="1812"/>
-            <w:vAlign w:val="center"/>
-            <w:shd w:val="clear" w:color="auto" w:fill="FFFFFF"/>
-          </w:tcPr>
-          <w:p>
-            <w:pPr>
-              <w:keepNext/>
-              <w:spacing w:before="40" w:after="40" w:line="240" w:lineRule="auto"/>
-              <w:jc w:val="right"/>
-            </w:pPr>
-            <w:r>
-              <w:rPr>
-                <w:rFonts w:ascii="Arial" w:hAnsi="Arial" w:eastAsia="Arial" w:cs="Arial"/>
-                <w:sz w:val="21"/>
-              </w:rPr>
-              <w:t>44</w:t>
-            </w:r>
-          </w:p>
-        </w:tc>
-        <w:tc>
-          <w:tcPr>
-            <w:tcW w:type="dxa" w:w="1402"/>
-            <w:vAlign w:val="center"/>
-            <w:shd w:val="clear" w:color="auto" w:fill="FFFFFF"/>
-          </w:tcPr>
-          <w:p>
-            <w:pPr>
-              <w:keepNext/>
-              <w:spacing w:before="40" w:after="40" w:line="240" w:lineRule="auto"/>
-              <w:jc w:val="right"/>
-            </w:pPr>
-            <w:r>
-              <w:rPr>
-                <w:rFonts w:ascii="Arial" w:hAnsi="Arial" w:eastAsia="Arial" w:cs="Arial"/>
-                <w:sz w:val="21"/>
-              </w:rPr>
-              <w:t>43</w:t>
-            </w:r>
-          </w:p>
-        </w:tc>
-        <w:tc>
-          <w:tcPr>
-            <w:tcW w:type="dxa" w:w="1402"/>
-            <w:vAlign w:val="center"/>
-            <w:shd w:val="clear" w:color="auto" w:fill="FFFFFF"/>
-          </w:tcPr>
-          <w:p>
-            <w:pPr>
-              <w:keepNext/>
-              <w:spacing w:before="40" w:after="40" w:line="240" w:lineRule="auto"/>
-              <w:jc w:val="right"/>
-            </w:pPr>
-            <w:r>
-              <w:rPr>
-                <w:rFonts w:ascii="Arial" w:hAnsi="Arial" w:eastAsia="Arial" w:cs="Arial"/>
-                <w:sz w:val="21"/>
-              </w:rPr>
-              <w:t>43</w:t>
-            </w:r>
-          </w:p>
-        </w:tc>
-      </w:tr>
-      <w:tr>
-        <w:trPr>
-          <w:cantSplit/>
-        </w:trPr>
-        <w:tc>
-          <w:tcPr>
-            <w:tcW w:type="dxa" w:w="5247"/>
+            <w:tcW w:type="dxa" w:w="5173"/>
             <w:vAlign w:val="center"/>
             <w:shd w:val="clear" w:color="auto" w:fill="FFFFFF"/>
           </w:tcPr>
@@ -2000,7 +1904,7 @@
         </w:tc>
         <w:tc>
           <w:tcPr>
-            <w:tcW w:type="dxa" w:w="1812"/>
+            <w:tcW w:type="dxa" w:w="1837"/>
             <w:vAlign w:val="center"/>
             <w:shd w:val="clear" w:color="auto" w:fill="FFFFFF"/>
           </w:tcPr>
@@ -2021,7 +1925,7 @@
         </w:tc>
         <w:tc>
           <w:tcPr>
-            <w:tcW w:type="dxa" w:w="1402"/>
+            <w:tcW w:type="dxa" w:w="1427"/>
             <w:vAlign w:val="center"/>
             <w:shd w:val="clear" w:color="auto" w:fill="FFFFFF"/>
           </w:tcPr>
@@ -2042,7 +1946,7 @@
         </w:tc>
         <w:tc>
           <w:tcPr>
-            <w:tcW w:type="dxa" w:w="1402"/>
+            <w:tcW w:type="dxa" w:w="1427"/>
             <w:vAlign w:val="center"/>
             <w:shd w:val="clear" w:color="auto" w:fill="FFFFFF"/>
           </w:tcPr>
@@ -2068,96 +1972,7 @@
         </w:trPr>
         <w:tc>
           <w:tcPr>
-            <w:tcW w:type="dxa" w:w="5247"/>
-            <w:vAlign w:val="center"/>
-            <w:shd w:val="clear" w:color="auto" w:fill="FFFFFF"/>
-          </w:tcPr>
-          <w:p>
-            <w:pPr>
-              <w:keepNext/>
-              <w:spacing w:before="40" w:after="40" w:line="240" w:lineRule="auto"/>
-              <w:jc w:val="left"/>
-            </w:pPr>
-            <w:r>
-              <w:rPr>
-                <w:rFonts w:ascii="Arial" w:hAnsi="Arial" w:eastAsia="Arial" w:cs="Arial"/>
-                <w:sz w:val="21"/>
-              </w:rPr>
-              <w:t>Minimum stay seven nights or more</w:t>
-            </w:r>
-          </w:p>
-        </w:tc>
-        <w:tc>
-          <w:tcPr>
-            <w:tcW w:type="dxa" w:w="1812"/>
-            <w:vAlign w:val="center"/>
-            <w:shd w:val="clear" w:color="auto" w:fill="FFFFFF"/>
-          </w:tcPr>
-          <w:p>
-            <w:pPr>
-              <w:keepNext/>
-              <w:spacing w:before="40" w:after="40" w:line="240" w:lineRule="auto"/>
-              <w:jc w:val="right"/>
-            </w:pPr>
-            <w:r>
-              <w:rPr>
-                <w:rFonts w:ascii="Arial" w:hAnsi="Arial" w:eastAsia="Arial" w:cs="Arial"/>
-                <w:sz w:val="21"/>
-              </w:rPr>
-              <w:t>0.0%</w:t>
-            </w:r>
-          </w:p>
-        </w:tc>
-        <w:tc>
-          <w:tcPr>
-            <w:tcW w:type="dxa" w:w="1402"/>
-            <w:vAlign w:val="center"/>
-            <w:shd w:val="clear" w:color="auto" w:fill="FFFFFF"/>
-          </w:tcPr>
-          <w:p>
-            <w:pPr>
-              <w:keepNext/>
-              <w:spacing w:before="40" w:after="40" w:line="240" w:lineRule="auto"/>
-              <w:jc w:val="right"/>
-            </w:pPr>
-            <w:r>
-              <w:rPr>
-                <w:rFonts w:ascii="Arial" w:hAnsi="Arial" w:eastAsia="Arial" w:cs="Arial"/>
-                <w:sz w:val="21"/>
-              </w:rPr>
-              <w:t>5.7%</w:t>
-            </w:r>
-          </w:p>
-        </w:tc>
-        <w:tc>
-          <w:tcPr>
-            <w:tcW w:type="dxa" w:w="1402"/>
-            <w:vAlign w:val="center"/>
-            <w:shd w:val="clear" w:color="auto" w:fill="FFFFFF"/>
-          </w:tcPr>
-          <w:p>
-            <w:pPr>
-              <w:keepNext/>
-              <w:spacing w:before="40" w:after="40" w:line="240" w:lineRule="auto"/>
-              <w:jc w:val="right"/>
-            </w:pPr>
-            <w:r>
-              <w:rPr>
-                <w:rFonts w:ascii="Arial" w:hAnsi="Arial" w:eastAsia="Arial" w:cs="Arial"/>
-                <w:sz w:val="21"/>
-              </w:rPr>
-              <w:t>4.3%</w:t>
-            </w:r>
-          </w:p>
-        </w:tc>
-      </w:tr>
-      <w:tr>
-        <w:trPr>
-          <w:cantSplit/>
-        </w:trPr>
-        <w:tc>
-          <w:tcPr>
-            <w:tcW w:type="dxa" w:w="5247"/>
+            <w:tcW w:type="dxa" w:w="5173"/>
             <w:vAlign w:val="center"/>
             <w:shd w:val="clear" w:color="auto" w:fill="FFFFFF"/>
           </w:tcPr>
@@ -2178,7 +1993,7 @@
         </w:tc>
         <w:tc>
           <w:tcPr>
-            <w:tcW w:type="dxa" w:w="1812"/>
+            <w:tcW w:type="dxa" w:w="1837"/>
             <w:vAlign w:val="center"/>
             <w:shd w:val="clear" w:color="auto" w:fill="FFFFFF"/>
           </w:tcPr>
@@ -2199,7 +2014,7 @@
         </w:tc>
         <w:tc>
           <w:tcPr>
-            <w:tcW w:type="dxa" w:w="1402"/>
+            <w:tcW w:type="dxa" w:w="1427"/>
             <w:vAlign w:val="center"/>
             <w:shd w:val="clear" w:color="auto" w:fill="FFFFFF"/>
           </w:tcPr>
@@ -2220,7 +2035,7 @@
         </w:tc>
         <w:tc>
           <w:tcPr>
-            <w:tcW w:type="dxa" w:w="1402"/>
+            <w:tcW w:type="dxa" w:w="1427"/>
             <w:vAlign w:val="center"/>
             <w:shd w:val="clear" w:color="auto" w:fill="FFFFFF"/>
           </w:tcPr>
@@ -2246,7 +2061,7 @@
         </w:trPr>
         <w:tc>
           <w:tcPr>
-            <w:tcW w:type="dxa" w:w="5247"/>
+            <w:tcW w:type="dxa" w:w="5173"/>
             <w:vAlign w:val="center"/>
             <w:shd w:val="clear" w:color="auto" w:fill="FFFFFF"/>
           </w:tcPr>
@@ -2261,13 +2076,13 @@
                 <w:rFonts w:ascii="Arial" w:hAnsi="Arial" w:eastAsia="Arial" w:cs="Arial"/>
                 <w:sz w:val="21"/>
               </w:rPr>
-              <w:t>Median estimated nights booked (cap 255)</w:t>
+              <w:t>Median estimated nights (cap 255)</w:t>
             </w:r>
           </w:p>
         </w:tc>
         <w:tc>
           <w:tcPr>
-            <w:tcW w:type="dxa" w:w="1812"/>
+            <w:tcW w:type="dxa" w:w="1837"/>
             <w:vAlign w:val="center"/>
             <w:shd w:val="clear" w:color="auto" w:fill="FFFFFF"/>
           </w:tcPr>
@@ -2288,7 +2103,7 @@
         </w:tc>
         <w:tc>
           <w:tcPr>
-            <w:tcW w:type="dxa" w:w="1402"/>
+            <w:tcW w:type="dxa" w:w="1427"/>
             <w:vAlign w:val="center"/>
             <w:shd w:val="clear" w:color="auto" w:fill="FFFFFF"/>
           </w:tcPr>
@@ -2309,7 +2124,7 @@
         </w:tc>
         <w:tc>
           <w:tcPr>
-            <w:tcW w:type="dxa" w:w="1402"/>
+            <w:tcW w:type="dxa" w:w="1427"/>
             <w:vAlign w:val="center"/>
             <w:shd w:val="clear" w:color="auto" w:fill="FFFFFF"/>
           </w:tcPr>
@@ -2335,12 +2150,13 @@
         </w:trPr>
         <w:tc>
           <w:tcPr>
-            <w:tcW w:type="dxa" w:w="5247"/>
+            <w:tcW w:type="dxa" w:w="5173"/>
             <w:vAlign w:val="center"/>
             <w:shd w:val="clear" w:color="auto" w:fill="FFFFFF"/>
           </w:tcPr>
           <w:p>
             <w:pPr>
+              <w:keepNext/>
               <w:spacing w:before="40" w:after="40" w:line="240" w:lineRule="auto"/>
               <w:jc w:val="left"/>
             </w:pPr>
@@ -2355,12 +2171,13 @@
         </w:tc>
         <w:tc>
           <w:tcPr>
-            <w:tcW w:type="dxa" w:w="1812"/>
+            <w:tcW w:type="dxa" w:w="1837"/>
             <w:vAlign w:val="center"/>
             <w:shd w:val="clear" w:color="auto" w:fill="FFFFFF"/>
           </w:tcPr>
           <w:p>
             <w:pPr>
+              <w:keepNext/>
               <w:spacing w:before="40" w:after="40" w:line="240" w:lineRule="auto"/>
               <w:jc w:val="right"/>
             </w:pPr>
@@ -2375,12 +2192,13 @@
         </w:tc>
         <w:tc>
           <w:tcPr>
-            <w:tcW w:type="dxa" w:w="1402"/>
+            <w:tcW w:type="dxa" w:w="1427"/>
             <w:vAlign w:val="center"/>
             <w:shd w:val="clear" w:color="auto" w:fill="FFFFFF"/>
           </w:tcPr>
           <w:p>
             <w:pPr>
+              <w:keepNext/>
               <w:spacing w:before="40" w:after="40" w:line="240" w:lineRule="auto"/>
               <w:jc w:val="right"/>
             </w:pPr>
@@ -2395,7 +2213,142 @@
         </w:tc>
         <w:tc>
           <w:tcPr>
-            <w:tcW w:type="dxa" w:w="1402"/>
+            <w:tcW w:type="dxa" w:w="1427"/>
+            <w:vAlign w:val="center"/>
+            <w:shd w:val="clear" w:color="auto" w:fill="FFFFFF"/>
+          </w:tcPr>
+          <w:p>
+            <w:pPr>
+              <w:keepNext/>
+              <w:spacing w:before="40" w:after="40" w:line="240" w:lineRule="auto"/>
+              <w:jc w:val="right"/>
+            </w:pPr>
+            <w:r>
+              <w:rPr>
+                <w:rFonts w:ascii="Arial" w:hAnsi="Arial" w:eastAsia="Arial" w:cs="Arial"/>
+                <w:sz w:val="21"/>
+              </w:rPr>
+              <w:t>24,700</w:t>
+            </w:r>
+          </w:p>
+        </w:tc>
+      </w:tr>
+      <w:tr>
+        <w:trPr>
+          <w:cantSplit/>
+        </w:trPr>
+        <w:tc>
+          <w:tcPr>
+            <w:tcW w:type="dxa" w:w="5173"/>
+            <w:vAlign w:val="center"/>
+            <w:shd w:val="clear" w:color="auto" w:fill="FFFFFF"/>
+          </w:tcPr>
+          <w:p>
+            <w:pPr>
+              <w:keepNext/>
+              <w:spacing w:before="40" w:after="40" w:line="240" w:lineRule="auto"/>
+              <w:jc w:val="left"/>
+            </w:pPr>
+            <w:r>
+              <w:rPr>
+                <w:rFonts w:ascii="Arial" w:hAnsi="Arial" w:eastAsia="Arial" w:cs="Arial"/>
+                <w:sz w:val="21"/>
+              </w:rPr>
+              <w:t>Mean guest rating (out of 5 stars)</w:t>
+            </w:r>
+          </w:p>
+        </w:tc>
+        <w:tc>
+          <w:tcPr>
+            <w:tcW w:type="dxa" w:w="1837"/>
+            <w:vAlign w:val="center"/>
+            <w:shd w:val="clear" w:color="auto" w:fill="FFFFFF"/>
+          </w:tcPr>
+          <w:p>
+            <w:pPr>
+              <w:keepNext/>
+              <w:spacing w:before="40" w:after="40" w:line="240" w:lineRule="auto"/>
+              <w:jc w:val="right"/>
+            </w:pPr>
+            <w:r>
+              <w:rPr>
+                <w:rFonts w:ascii="Arial" w:hAnsi="Arial" w:eastAsia="Arial" w:cs="Arial"/>
+                <w:sz w:val="21"/>
+              </w:rPr>
+              <w:t>4.84</w:t>
+            </w:r>
+          </w:p>
+        </w:tc>
+        <w:tc>
+          <w:tcPr>
+            <w:tcW w:type="dxa" w:w="1427"/>
+            <w:vAlign w:val="center"/>
+            <w:shd w:val="clear" w:color="auto" w:fill="FFFFFF"/>
+          </w:tcPr>
+          <w:p>
+            <w:pPr>
+              <w:keepNext/>
+              <w:spacing w:before="40" w:after="40" w:line="240" w:lineRule="auto"/>
+              <w:jc w:val="right"/>
+            </w:pPr>
+            <w:r>
+              <w:rPr>
+                <w:rFonts w:ascii="Arial" w:hAnsi="Arial" w:eastAsia="Arial" w:cs="Arial"/>
+                <w:sz w:val="21"/>
+              </w:rPr>
+              <w:t>4.69</w:t>
+            </w:r>
+          </w:p>
+        </w:tc>
+        <w:tc>
+          <w:tcPr>
+            <w:tcW w:type="dxa" w:w="1427"/>
+            <w:vAlign w:val="center"/>
+            <w:shd w:val="clear" w:color="auto" w:fill="FFFFFF"/>
+          </w:tcPr>
+          <w:p>
+            <w:pPr>
+              <w:keepNext/>
+              <w:spacing w:before="40" w:after="40" w:line="240" w:lineRule="auto"/>
+              <w:jc w:val="right"/>
+            </w:pPr>
+            <w:r>
+              <w:rPr>
+                <w:rFonts w:ascii="Arial" w:hAnsi="Arial" w:eastAsia="Arial" w:cs="Arial"/>
+                <w:sz w:val="21"/>
+              </w:rPr>
+              <w:t>4.73</w:t>
+            </w:r>
+          </w:p>
+        </w:tc>
+      </w:tr>
+      <w:tr>
+        <w:trPr>
+          <w:cantSplit/>
+        </w:trPr>
+        <w:tc>
+          <w:tcPr>
+            <w:tcW w:type="dxa" w:w="5173"/>
+            <w:vAlign w:val="center"/>
+            <w:shd w:val="clear" w:color="auto" w:fill="FFFFFF"/>
+          </w:tcPr>
+          <w:p>
+            <w:pPr>
+              <w:spacing w:before="40" w:after="40" w:line="240" w:lineRule="auto"/>
+              <w:jc w:val="left"/>
+            </w:pPr>
+            <w:r>
+              <w:rPr>
+                <w:rFonts w:ascii="Arial" w:hAnsi="Arial" w:eastAsia="Arial" w:cs="Arial"/>
+                <w:sz w:val="21"/>
+              </w:rPr>
+              <w:t>Rated below 4.5 stars</w:t>
+            </w:r>
+          </w:p>
+        </w:tc>
+        <w:tc>
+          <w:tcPr>
+            <w:tcW w:type="dxa" w:w="1837"/>
             <w:vAlign w:val="center"/>
             <w:shd w:val="clear" w:color="auto" w:fill="FFFFFF"/>
           </w:tcPr>
@@ -2409,7 +2362,47 @@
                 <w:rFonts w:ascii="Arial" w:hAnsi="Arial" w:eastAsia="Arial" w:cs="Arial"/>
                 <w:sz w:val="21"/>
               </w:rPr>
-              <w:t>24,700</w:t>
+              <w:t>1.1%</w:t>
+            </w:r>
+          </w:p>
+        </w:tc>
+        <w:tc>
+          <w:tcPr>
+            <w:tcW w:type="dxa" w:w="1427"/>
+            <w:vAlign w:val="center"/>
+            <w:shd w:val="clear" w:color="auto" w:fill="FFFFFF"/>
+          </w:tcPr>
+          <w:p>
+            <w:pPr>
+              <w:spacing w:before="40" w:after="40" w:line="240" w:lineRule="auto"/>
+              <w:jc w:val="right"/>
+            </w:pPr>
+            <w:r>
+              <w:rPr>
+                <w:rFonts w:ascii="Arial" w:hAnsi="Arial" w:eastAsia="Arial" w:cs="Arial"/>
+                <w:sz w:val="21"/>
+              </w:rPr>
+              <w:t>15.2%</w:t>
+            </w:r>
+          </w:p>
+        </w:tc>
+        <w:tc>
+          <w:tcPr>
+            <w:tcW w:type="dxa" w:w="1427"/>
+            <w:vAlign w:val="center"/>
+            <w:shd w:val="clear" w:color="auto" w:fill="FFFFFF"/>
+          </w:tcPr>
+          <w:p>
+            <w:pPr>
+              <w:spacing w:before="40" w:after="40" w:line="240" w:lineRule="auto"/>
+              <w:jc w:val="right"/>
+            </w:pPr>
+            <w:r>
+              <w:rPr>
+                <w:rFonts w:ascii="Arial" w:hAnsi="Arial" w:eastAsia="Arial" w:cs="Arial"/>
+                <w:sz w:val="21"/>
+              </w:rPr>
+              <w:t>11.6%</w:t>
             </w:r>
           </w:p>
         </w:tc>
@@ -2432,7 +2425,7 @@
         <w:rPr>
           <w:rFonts w:ascii="Arial" w:hAnsi="Arial" w:eastAsia="Arial" w:cs="Arial"/>
         </w:rPr>
-        <w:t>Busy homes were slightly cheaper with similar amenity counts, but far more often accepted one-night stays and sat in the City of Melbourne. Their median estimated revenue was 3.5 times higher (AUD 58,400 versus 16,600), reflecting its review-based formula (Table 3).</w:t>
+        <w:t>Busy homes were slightly cheaper but far more often accepted one-night stays and sat in the City of Melbourne (Table 3); their revenue estimate is higher partly because it is calculated from reviews. They were also better rated: only 1.1% averaged below 4.5 stars, against 15.2% of the rest, a gap that holds in each priority group (Huang &amp; Xu, 2026). High activity comes with satisfied guests, not complaints.</w:t>
       </w:r>
     </w:p>
     <w:p>
@@ -2444,7 +2437,7 @@
         <w:rPr>
           <w:rFonts w:ascii="Arial" w:hAnsi="Arial" w:eastAsia="Arial" w:cs="Arial"/>
         </w:rPr>
-        <w:t>5.2 Descriptive comparison: City apartments are the first search priority</w:t>
+        <w:t>5.2 Descriptive comparison: a simple summary puts City apartments first</w:t>
       </w:r>
     </w:p>
     <w:p>
@@ -3344,7 +3337,7 @@
         <w:rPr>
           <w:rFonts w:ascii="Arial" w:hAnsi="Arial" w:eastAsia="Arial" w:cs="Arial"/>
         </w:rPr>
-        <w:t>The same three groups lead when the price rule or the review-history rule is removed. The two City groups are the most reliable, staying in the top three in 94% and 90% of 1,000 host redraws; Yarra Ranges houses did so in 64%, a less certain second option.</w:t>
+        <w:t>The same three groups lead without the price or review-history rule (Huang &amp; Xu, 2026). The City groups stayed in the top three in 94% and 90% of 1,000 host redraws and Yarra Ranges houses in 64%, a less certain second option.</w:t>
       </w:r>
     </w:p>
     <w:p>
@@ -3364,20 +3357,7 @@
         <w:rPr>
           <w:rFonts w:ascii="Arial" w:hAnsi="Arial" w:eastAsia="Arial" w:cs="Arial"/>
         </w:rPr>
-        <w:t xml:space="preserve"> Table 4 compares </w:t>
-      </w:r>
-      <w:r>
-        <w:rPr>
-          <w:rFonts w:ascii="Arial" w:hAnsi="Arial" w:eastAsia="Arial" w:cs="Arial"/>
-          <w:i/>
-        </w:rPr>
-        <w:t>all-home</w:t>
-      </w:r>
-      <w:r>
-        <w:rPr>
-          <w:rFonts w:ascii="Arial" w:hAnsi="Arial" w:eastAsia="Arial" w:cs="Arial"/>
-        </w:rPr>
-        <w:t xml:space="preserve"> medians with revenue medians for homes below 30 reviews. Yarra Ranges houses rank second on revenue and City two-bedroom apartments fifth, mainly because the houses charge more a night (AUD 426 against 285). With rents unknown, activity guides the search and revenue benchmarks test each lease (Recommendation 3).</w:t>
+        <w:t xml:space="preserve"> On median revenue (Table 4), Yarra Ranges houses rank second and City two-bedroom apartments fifth, mainly because the houses charge more a night (AUD 426 against 285). With rents unknown, activity guides the search; revenue tests each lease.</w:t>
       </w:r>
     </w:p>
     <w:p>
@@ -3389,7 +3369,7 @@
         <w:rPr>
           <w:rFonts w:ascii="Arial" w:hAnsi="Arial" w:eastAsia="Arial" w:cs="Arial"/>
         </w:rPr>
-        <w:t>5.3 Predictive screening: the model improves selection within the priority groups</w:t>
+        <w:t>5.3 Predictive analysis: what goes with being busy, and does it help pick homes?</w:t>
       </w:r>
     </w:p>
     <w:p>
@@ -3402,7 +3382,425 @@
         <w:rPr>
           <w:rFonts w:ascii="Arial" w:hAnsi="Arial" w:eastAsia="Arial" w:cs="Arial"/>
         </w:rPr>
-        <w:t xml:space="preserve">Picking a quarter of each priority group, the full model found busy homes </w:t>
+        <w:t xml:space="preserve">Holding other inputs fixed, three settings an operator controls go with busy homes (Figure 3; Table A1). A typical City two-bedroom apartment has a </w:t>
+      </w:r>
+      <w:r>
+        <w:rPr>
+          <w:rFonts w:ascii="Arial" w:hAnsi="Arial" w:eastAsia="Arial" w:cs="Arial"/>
+          <w:b/>
+        </w:rPr>
+        <w:t>42%</w:t>
+      </w:r>
+      <w:r>
+        <w:rPr>
+          <w:rFonts w:ascii="Arial" w:hAnsi="Arial" w:eastAsia="Arial" w:cs="Arial"/>
+        </w:rPr>
+        <w:t xml:space="preserve"> chance of being busy with one-night stays but </w:t>
+      </w:r>
+      <w:r>
+        <w:rPr>
+          <w:rFonts w:ascii="Arial" w:hAnsi="Arial" w:eastAsia="Arial" w:cs="Arial"/>
+          <w:b/>
+        </w:rPr>
+        <w:t>18%</w:t>
+      </w:r>
+      <w:r>
+        <w:rPr>
+          <w:rFonts w:ascii="Arial" w:hAnsi="Arial" w:eastAsia="Arial" w:cs="Arial"/>
+        </w:rPr>
+        <w:t xml:space="preserve"> with a two-night minimum or longer. Pricing 20% above similar homes lowers it to </w:t>
+      </w:r>
+      <w:r>
+        <w:rPr>
+          <w:rFonts w:ascii="Arial" w:hAnsi="Arial" w:eastAsia="Arial" w:cs="Arial"/>
+          <w:b/>
+        </w:rPr>
+        <w:t>36%</w:t>
+      </w:r>
+      <w:r>
+        <w:rPr>
+          <w:rFonts w:ascii="Arial" w:hAnsi="Arial" w:eastAsia="Arial" w:cs="Arial"/>
+        </w:rPr>
+        <w:t xml:space="preserve">; ten more amenities raise it to </w:t>
+      </w:r>
+      <w:r>
+        <w:rPr>
+          <w:rFonts w:ascii="Arial" w:hAnsi="Arial" w:eastAsia="Arial" w:cs="Arial"/>
+          <w:b/>
+        </w:rPr>
+        <w:t>48%</w:t>
+      </w:r>
+      <w:r>
+        <w:rPr>
+          <w:rFonts w:ascii="Arial" w:hAnsi="Arial" w:eastAsia="Arial" w:cs="Arial"/>
+        </w:rPr>
+        <w:t>. These are associations: changing a setting alone does not guarantee more bookings.</w:t>
+      </w:r>
+    </w:p>
+    <w:p>
+      <w:pPr>
+        <w:keepNext/>
+        <w:widowControl/>
+        <w:spacing w:after="40" w:before="80" w:line="240" w:lineRule="auto"/>
+        <w:jc w:val="center"/>
+      </w:pPr>
+      <w:r>
+        <w:drawing>
+          <wp:inline xmlns:a="http://schemas.openxmlformats.org/drawingml/2006/main" xmlns:pic="http://schemas.openxmlformats.org/drawingml/2006/picture">
+            <wp:extent cx="6035040" cy="2738634"/>
+            <wp:docPr id="3" name="Picture 3"/>
+            <wp:cNvGraphicFramePr>
+              <a:graphicFrameLocks noChangeAspect="1"/>
+            </wp:cNvGraphicFramePr>
+            <a:graphic>
+              <a:graphicData uri="http://schemas.openxmlformats.org/drawingml/2006/picture">
+                <pic:pic>
+                  <pic:nvPicPr>
+                    <pic:cNvPr id="0" name="figure_3_factors.png"/>
+                    <pic:cNvPicPr/>
+                  </pic:nvPicPr>
+                  <pic:blipFill>
+                    <a:blip r:embed="rId22"/>
+                    <a:stretch>
+                      <a:fillRect/>
+                    </a:stretch>
+                  </pic:blipFill>
+                  <pic:spPr>
+                    <a:xfrm>
+                      <a:off x="0" y="0"/>
+                      <a:ext cx="6035040" cy="2738634"/>
+                    </a:xfrm>
+                    <a:prstGeom prst="rect"/>
+                  </pic:spPr>
+                </pic:pic>
+              </a:graphicData>
+            </a:graphic>
+          </wp:inline>
+        </w:drawing>
+      </w:r>
+    </w:p>
+    <w:p>
+      <w:pPr>
+        <w:pStyle w:val="Caption"/>
+      </w:pPr>
+      <w:r>
+        <w:rPr>
+          <w:rFonts w:ascii="Arial" w:hAnsi="Arial" w:eastAsia="Arial" w:cs="Arial"/>
+          <w:b/>
+        </w:rPr>
+        <w:t>Figure 3.</w:t>
+      </w:r>
+      <w:r>
+        <w:rPr>
+          <w:rFonts w:ascii="Arial" w:hAnsi="Arial" w:eastAsia="Arial" w:cs="Arial"/>
+        </w:rPr>
+        <w:t xml:space="preserve"> Model-estimated chance that a typical City two-bedroom apartment is busy when one input changes, with 95% ranges.</w:t>
+      </w:r>
+    </w:p>
+    <w:p>
+      <w:pPr>
+        <w:widowControl/>
+        <w:spacing w:after="120" w:line="259" w:lineRule="auto"/>
+        <w:jc w:val="left"/>
+      </w:pPr>
+      <w:r>
+        <w:rPr>
+          <w:rFonts w:ascii="Arial" w:hAnsi="Arial" w:eastAsia="Arial" w:cs="Arial"/>
+        </w:rPr>
+        <w:t xml:space="preserve">A simple two-setting rule captures most of this (Table 5): in the priority groups, homes that accepted one-night stays and were priced at or below their group median were busy </w:t>
+      </w:r>
+      <w:r>
+        <w:rPr>
+          <w:rFonts w:ascii="Arial" w:hAnsi="Arial" w:eastAsia="Arial" w:cs="Arial"/>
+          <w:b/>
+        </w:rPr>
+        <w:t>50.4%</w:t>
+      </w:r>
+      <w:r>
+        <w:rPr>
+          <w:rFonts w:ascii="Arial" w:hAnsi="Arial" w:eastAsia="Arial" w:cs="Arial"/>
+        </w:rPr>
+        <w:t xml:space="preserve"> of the time, and homes with neither </w:t>
+      </w:r>
+      <w:r>
+        <w:rPr>
+          <w:rFonts w:ascii="Arial" w:hAnsi="Arial" w:eastAsia="Arial" w:cs="Arial"/>
+          <w:b/>
+        </w:rPr>
+        <w:t>9.3%</w:t>
+      </w:r>
+      <w:r>
+        <w:rPr>
+          <w:rFonts w:ascii="Arial" w:hAnsi="Arial" w:eastAsia="Arial" w:cs="Arial"/>
+        </w:rPr>
+        <w:t>.</w:t>
+      </w:r>
+    </w:p>
+    <w:p>
+      <w:pPr>
+        <w:keepNext/>
+        <w:widowControl/>
+        <w:spacing w:after="80" w:before="80" w:line="259" w:lineRule="auto"/>
+        <w:jc w:val="left"/>
+      </w:pPr>
+      <w:r>
+        <w:rPr>
+          <w:rFonts w:ascii="Arial" w:hAnsi="Arial" w:eastAsia="Arial" w:cs="Arial"/>
+          <w:b/>
+        </w:rPr>
+        <w:t>Table 5. Share of busy homes in the three priority groups, by two settings</w:t>
+      </w:r>
+    </w:p>
+    <w:tbl>
+      <w:tblPr>
+        <w:tblW w:type="auto" w:w="0"/>
+        <w:tblLook w:firstColumn="1" w:firstRow="1" w:lastColumn="0" w:lastRow="0" w:noHBand="0" w:noVBand="1" w:val="04A0"/>
+        <w:tblBorders>
+          <w:top w:val="single" w:sz="4" w:color="D9D9D9"/>
+          <w:left w:val="single" w:sz="4" w:color="D9D9D9"/>
+          <w:bottom w:val="single" w:sz="4" w:color="D9D9D9"/>
+          <w:right w:val="single" w:sz="4" w:color="D9D9D9"/>
+          <w:insideH w:val="single" w:sz="4" w:color="D9D9D9"/>
+          <w:insideV w:val="single" w:sz="4" w:color="D9D9D9"/>
+        </w:tblBorders>
+        <w:tblCellMar>
+          <w:top w:w="85" w:type="dxa"/>
+          <w:left w:w="85" w:type="dxa"/>
+          <w:bottom w:w="85" w:type="dxa"/>
+          <w:right w:w="85" w:type="dxa"/>
+        </w:tblCellMar>
+        <w:jc w:val="center"/>
+        <w:tblLayout w:type="fixed"/>
+      </w:tblPr>
+      <w:tblGrid>
+        <w:gridCol w:w="3468"/>
+        <w:gridCol w:w="3198"/>
+        <w:gridCol w:w="3198"/>
+      </w:tblGrid>
+      <w:tr>
+        <w:trPr>
+          <w:cantSplit/>
+          <w:tblHeader/>
+        </w:trPr>
+        <w:tc>
+          <w:tcPr>
+            <w:tcW w:type="dxa" w:w="3468"/>
+            <w:vAlign w:val="center"/>
+            <w:shd w:val="clear" w:color="auto" w:fill="E9EEF3"/>
+          </w:tcPr>
+          <w:p>
+            <w:pPr>
+              <w:keepNext/>
+              <w:spacing w:before="40" w:after="40" w:line="240" w:lineRule="auto"/>
+              <w:jc w:val="left"/>
+            </w:pPr>
+            <w:r>
+              <w:rPr>
+                <w:rFonts w:ascii="Arial" w:hAnsi="Arial" w:eastAsia="Arial" w:cs="Arial"/>
+                <w:b/>
+                <w:sz w:val="21"/>
+              </w:rPr>
+              <w:t>Minimum stay</w:t>
+            </w:r>
+          </w:p>
+        </w:tc>
+        <w:tc>
+          <w:tcPr>
+            <w:tcW w:type="dxa" w:w="3198"/>
+            <w:vAlign w:val="center"/>
+            <w:shd w:val="clear" w:color="auto" w:fill="E9EEF3"/>
+          </w:tcPr>
+          <w:p>
+            <w:pPr>
+              <w:keepNext/>
+              <w:spacing w:before="40" w:after="40" w:line="240" w:lineRule="auto"/>
+              <w:jc w:val="left"/>
+            </w:pPr>
+            <w:r>
+              <w:rPr>
+                <w:rFonts w:ascii="Arial" w:hAnsi="Arial" w:eastAsia="Arial" w:cs="Arial"/>
+                <w:b/>
+                <w:sz w:val="21"/>
+              </w:rPr>
+              <w:t>Price at or below group median</w:t>
+            </w:r>
+          </w:p>
+        </w:tc>
+        <w:tc>
+          <w:tcPr>
+            <w:tcW w:type="dxa" w:w="3198"/>
+            <w:vAlign w:val="center"/>
+            <w:shd w:val="clear" w:color="auto" w:fill="E9EEF3"/>
+          </w:tcPr>
+          <w:p>
+            <w:pPr>
+              <w:keepNext/>
+              <w:spacing w:before="40" w:after="40" w:line="240" w:lineRule="auto"/>
+              <w:jc w:val="left"/>
+            </w:pPr>
+            <w:r>
+              <w:rPr>
+                <w:rFonts w:ascii="Arial" w:hAnsi="Arial" w:eastAsia="Arial" w:cs="Arial"/>
+                <w:b/>
+                <w:sz w:val="21"/>
+              </w:rPr>
+              <w:t>Price above group median</w:t>
+            </w:r>
+          </w:p>
+        </w:tc>
+      </w:tr>
+      <w:tr>
+        <w:trPr>
+          <w:cantSplit/>
+        </w:trPr>
+        <w:tc>
+          <w:tcPr>
+            <w:tcW w:type="dxa" w:w="3468"/>
+            <w:vAlign w:val="center"/>
+            <w:shd w:val="clear" w:color="auto" w:fill="FFFFFF"/>
+          </w:tcPr>
+          <w:p>
+            <w:pPr>
+              <w:keepNext/>
+              <w:spacing w:before="40" w:after="40" w:line="240" w:lineRule="auto"/>
+              <w:jc w:val="left"/>
+            </w:pPr>
+            <w:r>
+              <w:rPr>
+                <w:rFonts w:ascii="Arial" w:hAnsi="Arial" w:eastAsia="Arial" w:cs="Arial"/>
+                <w:sz w:val="21"/>
+              </w:rPr>
+              <w:t>One night accepted</w:t>
+            </w:r>
+          </w:p>
+        </w:tc>
+        <w:tc>
+          <w:tcPr>
+            <w:tcW w:type="dxa" w:w="3198"/>
+            <w:vAlign w:val="center"/>
+            <w:shd w:val="clear" w:color="auto" w:fill="FFFFFF"/>
+          </w:tcPr>
+          <w:p>
+            <w:pPr>
+              <w:keepNext/>
+              <w:spacing w:before="40" w:after="40" w:line="240" w:lineRule="auto"/>
+              <w:jc w:val="right"/>
+            </w:pPr>
+            <w:r>
+              <w:rPr>
+                <w:rFonts w:ascii="Arial" w:hAnsi="Arial" w:eastAsia="Arial" w:cs="Arial"/>
+                <w:sz w:val="21"/>
+              </w:rPr>
+              <w:t>50.4% (462 homes)</w:t>
+            </w:r>
+          </w:p>
+        </w:tc>
+        <w:tc>
+          <w:tcPr>
+            <w:tcW w:type="dxa" w:w="3198"/>
+            <w:vAlign w:val="center"/>
+            <w:shd w:val="clear" w:color="auto" w:fill="FFFFFF"/>
+          </w:tcPr>
+          <w:p>
+            <w:pPr>
+              <w:keepNext/>
+              <w:spacing w:before="40" w:after="40" w:line="240" w:lineRule="auto"/>
+              <w:jc w:val="right"/>
+            </w:pPr>
+            <w:r>
+              <w:rPr>
+                <w:rFonts w:ascii="Arial" w:hAnsi="Arial" w:eastAsia="Arial" w:cs="Arial"/>
+                <w:sz w:val="21"/>
+              </w:rPr>
+              <w:t>36.1% (477 homes)</w:t>
+            </w:r>
+          </w:p>
+        </w:tc>
+      </w:tr>
+      <w:tr>
+        <w:trPr>
+          <w:cantSplit/>
+        </w:trPr>
+        <w:tc>
+          <w:tcPr>
+            <w:tcW w:type="dxa" w:w="3468"/>
+            <w:vAlign w:val="center"/>
+            <w:shd w:val="clear" w:color="auto" w:fill="FFFFFF"/>
+          </w:tcPr>
+          <w:p>
+            <w:pPr>
+              <w:spacing w:before="40" w:after="40" w:line="240" w:lineRule="auto"/>
+              <w:jc w:val="left"/>
+            </w:pPr>
+            <w:r>
+              <w:rPr>
+                <w:rFonts w:ascii="Arial" w:hAnsi="Arial" w:eastAsia="Arial" w:cs="Arial"/>
+                <w:sz w:val="21"/>
+              </w:rPr>
+              <w:t>Two nights or more</w:t>
+            </w:r>
+          </w:p>
+        </w:tc>
+        <w:tc>
+          <w:tcPr>
+            <w:tcW w:type="dxa" w:w="3198"/>
+            <w:vAlign w:val="center"/>
+            <w:shd w:val="clear" w:color="auto" w:fill="FFFFFF"/>
+          </w:tcPr>
+          <w:p>
+            <w:pPr>
+              <w:spacing w:before="40" w:after="40" w:line="240" w:lineRule="auto"/>
+              <w:jc w:val="right"/>
+            </w:pPr>
+            <w:r>
+              <w:rPr>
+                <w:rFonts w:ascii="Arial" w:hAnsi="Arial" w:eastAsia="Arial" w:cs="Arial"/>
+                <w:sz w:val="21"/>
+              </w:rPr>
+              <w:t>30.2% (358 homes)</w:t>
+            </w:r>
+          </w:p>
+        </w:tc>
+        <w:tc>
+          <w:tcPr>
+            <w:tcW w:type="dxa" w:w="3198"/>
+            <w:vAlign w:val="center"/>
+            <w:shd w:val="clear" w:color="auto" w:fill="FFFFFF"/>
+          </w:tcPr>
+          <w:p>
+            <w:pPr>
+              <w:spacing w:before="40" w:after="40" w:line="240" w:lineRule="auto"/>
+              <w:jc w:val="right"/>
+            </w:pPr>
+            <w:r>
+              <w:rPr>
+                <w:rFonts w:ascii="Arial" w:hAnsi="Arial" w:eastAsia="Arial" w:cs="Arial"/>
+                <w:sz w:val="21"/>
+              </w:rPr>
+              <w:t>9.3% (334 homes)</w:t>
+            </w:r>
+          </w:p>
+        </w:tc>
+      </w:tr>
+    </w:tbl>
+    <w:p>
+      <w:pPr>
+        <w:widowControl/>
+        <w:spacing w:after="80" w:line="240" w:lineRule="auto"/>
+        <w:jc w:val="left"/>
+      </w:pPr>
+    </w:p>
+    <w:p>
+      <w:pPr>
+        <w:widowControl/>
+        <w:spacing w:after="120" w:line="259" w:lineRule="auto"/>
+        <w:jc w:val="left"/>
+      </w:pPr>
+      <w:r>
+        <w:rPr>
+          <w:rFonts w:ascii="Arial" w:hAnsi="Arial" w:eastAsia="Arial" w:cs="Arial"/>
+        </w:rPr>
+        <w:t xml:space="preserve">Tested on unseen hosts, the model's top quarter of each priority group was busy </w:t>
       </w:r>
       <w:r>
         <w:rPr>
@@ -3441,7 +3839,7 @@
         <w:rPr>
           <w:rFonts w:ascii="Arial" w:hAnsi="Arial" w:eastAsia="Arial" w:cs="Arial"/>
         </w:rPr>
-        <w:t xml:space="preserve"> for random picking (Figure 3). That is five busy homes in ten, not three. Price and minimum stay carry most of this gain (+11.0 points).</w:t>
+        <w:t xml:space="preserve"> at random (Figure 4), winning 46 of 50 tests. The two-setting rule does about as well: it picks 28% of homes, and 50.4% of them were busy, though it was checked on the homes that suggested it. The model's value is in showing which settings matter; Table A2 gives its hits and misses.</w:t>
       </w:r>
     </w:p>
     <w:p>
@@ -3455,7 +3853,7 @@
         <w:drawing>
           <wp:inline xmlns:a="http://schemas.openxmlformats.org/drawingml/2006/main" xmlns:pic="http://schemas.openxmlformats.org/drawingml/2006/picture">
             <wp:extent cx="6035040" cy="1982694"/>
-            <wp:docPr id="3" name="Picture 3"/>
+            <wp:docPr id="4" name="Picture 4"/>
             <wp:cNvGraphicFramePr>
               <a:graphicFrameLocks noChangeAspect="1"/>
             </wp:cNvGraphicFramePr>
@@ -3463,11 +3861,11 @@
               <a:graphicData uri="http://schemas.openxmlformats.org/drawingml/2006/picture">
                 <pic:pic>
                   <pic:nvPicPr>
-                    <pic:cNvPr id="0" name="figure_3_screening.png"/>
+                    <pic:cNvPr id="0" name="figure_4_screening.png"/>
                     <pic:cNvPicPr/>
                   </pic:nvPicPr>
                   <pic:blipFill>
-                    <a:blip r:embed="rId22"/>
+                    <a:blip r:embed="rId23"/>
                     <a:stretch>
                       <a:fillRect/>
                     </a:stretch>
@@ -3495,13 +3893,25 @@
           <w:rFonts w:ascii="Arial" w:hAnsi="Arial" w:eastAsia="Arial" w:cs="Arial"/>
           <w:b/>
         </w:rPr>
-        <w:t>Figure 3.</w:t>
+        <w:t>Figure 4.</w:t>
       </w:r>
       <w:r>
         <w:rPr>
           <w:rFonts w:ascii="Arial" w:hAnsi="Arial" w:eastAsia="Arial" w:cs="Arial"/>
         </w:rPr>
-        <w:t xml:space="preserve"> Share of picked homes that were busy, averaged over 50 tests.</w:t>
+        <w:t xml:space="preserve"> Busy share of picked homes (a quarter of each priority group), averaged over 50 tests.</w:t>
+      </w:r>
+    </w:p>
+    <w:p>
+      <w:pPr>
+        <w:pStyle w:val="Heading2"/>
+        <w:keepNext/>
+      </w:pPr>
+      <w:r>
+        <w:rPr>
+          <w:rFonts w:ascii="Arial" w:hAnsi="Arial" w:eastAsia="Arial" w:cs="Arial"/>
+        </w:rPr>
+        <w:t>5.4 Over time: the leading groups stayed ahead</w:t>
       </w:r>
     </w:p>
     <w:p>
@@ -3514,899 +3924,7 @@
         <w:rPr>
           <w:rFonts w:ascii="Arial" w:hAnsi="Arial" w:eastAsia="Arial" w:cs="Arial"/>
         </w:rPr>
-        <w:t xml:space="preserve">The full model beat random picking in </w:t>
-      </w:r>
-      <w:r>
-        <w:rPr>
-          <w:rFonts w:ascii="Arial" w:hAnsi="Arial" w:eastAsia="Arial" w:cs="Arial"/>
-          <w:b/>
-        </w:rPr>
-        <w:t>46 of the 50 tests</w:t>
-      </w:r>
-      <w:r>
-        <w:rPr>
-          <w:rFonts w:ascii="Arial" w:hAnsi="Arial" w:eastAsia="Arial" w:cs="Arial"/>
-        </w:rPr>
-        <w:t xml:space="preserve">; in nine tests out of ten its gain lay between </w:t>
-      </w:r>
-      <w:r>
-        <w:rPr>
-          <w:rFonts w:ascii="Arial" w:hAnsi="Arial" w:eastAsia="Arial" w:cs="Arial"/>
-          <w:b/>
-        </w:rPr>
-        <w:t>−1 and +32 percentage points</w:t>
-      </w:r>
-      <w:r>
-        <w:rPr>
-          <w:rFonts w:ascii="Arial" w:hAnsi="Arial" w:eastAsia="Arial" w:cs="Arial"/>
-        </w:rPr>
-        <w:t>. Within each group, the reduced model ranks by amenities alone. Its City three-bedroom hit rate was 33.9%, below random picking at 35.9%. We therefore use group priorities for unlisted rentals, where model performance remains untested.</w:t>
-      </w:r>
-    </w:p>
-    <w:p>
-      <w:pPr>
-        <w:widowControl/>
-        <w:spacing w:after="120" w:line="259" w:lineRule="auto"/>
-        <w:jc w:val="left"/>
-      </w:pPr>
-      <w:r>
-        <w:rPr>
-          <w:rFonts w:ascii="Arial" w:hAnsi="Arial" w:eastAsia="Arial" w:cs="Arial"/>
-        </w:rPr>
-        <w:t>The 49.6% result comes from picking within three priority groups over 50 tests. Table 5 instead pools predictions from five separate test groups, covering all 3,873 study homes, and picks one combined top-quarter list (969 homes). Its hit rate is 43.7% (precision), against 25.3% overall, and it finds 43.1% of busy homes (recall). Accuracy is 71.5%; calling every home "below target" scores 74.7% but finds none.</w:t>
-      </w:r>
-    </w:p>
-    <w:p>
-      <w:pPr>
-        <w:keepNext/>
-        <w:widowControl/>
-        <w:spacing w:after="80" w:before="80" w:line="259" w:lineRule="auto"/>
-        <w:jc w:val="left"/>
-      </w:pPr>
-      <w:r>
-        <w:rPr>
-          <w:rFonts w:ascii="Arial" w:hAnsi="Arial" w:eastAsia="Arial" w:cs="Arial"/>
-          <w:b/>
-        </w:rPr>
-        <w:t>Table 5. Full-sample confusion matrix: top quarter picked across all 14 study groups</w:t>
-      </w:r>
-    </w:p>
-    <w:tbl>
-      <w:tblPr>
-        <w:tblW w:type="auto" w:w="0"/>
-        <w:tblLook w:firstColumn="1" w:firstRow="1" w:lastColumn="0" w:lastRow="0" w:noHBand="0" w:noVBand="1" w:val="04A0"/>
-        <w:tblBorders>
-          <w:top w:val="single" w:sz="4" w:color="D9D9D9"/>
-          <w:left w:val="single" w:sz="4" w:color="D9D9D9"/>
-          <w:bottom w:val="single" w:sz="4" w:color="D9D9D9"/>
-          <w:right w:val="single" w:sz="4" w:color="D9D9D9"/>
-          <w:insideH w:val="single" w:sz="4" w:color="D9D9D9"/>
-          <w:insideV w:val="single" w:sz="4" w:color="D9D9D9"/>
-        </w:tblBorders>
-        <w:tblCellMar>
-          <w:top w:w="85" w:type="dxa"/>
-          <w:left w:w="85" w:type="dxa"/>
-          <w:bottom w:w="85" w:type="dxa"/>
-          <w:right w:w="85" w:type="dxa"/>
-        </w:tblCellMar>
-        <w:jc w:val="center"/>
-        <w:tblLayout w:type="fixed"/>
-      </w:tblPr>
-      <w:tblGrid>
-        <w:gridCol w:w="4497"/>
-        <w:gridCol w:w="1378"/>
-        <w:gridCol w:w="2067"/>
-        <w:gridCol w:w="1922"/>
-      </w:tblGrid>
-      <w:tr>
-        <w:trPr>
-          <w:cantSplit/>
-          <w:tblHeader/>
-        </w:trPr>
-        <w:tc>
-          <w:tcPr>
-            <w:tcW w:type="dxa" w:w="4497"/>
-            <w:vAlign w:val="center"/>
-            <w:shd w:val="clear" w:color="auto" w:fill="E9EEF3"/>
-          </w:tcPr>
-          <w:p>
-            <w:pPr>
-              <w:keepNext/>
-              <w:spacing w:before="40" w:after="40" w:line="240" w:lineRule="auto"/>
-              <w:jc w:val="left"/>
-            </w:pPr>
-            <w:r>
-              <w:rPr>
-                <w:rFonts w:ascii="Arial" w:hAnsi="Arial" w:eastAsia="Arial" w:cs="Arial"/>
-                <w:b/>
-                <w:sz w:val="21"/>
-              </w:rPr>
-              <w:t>Selection</w:t>
-            </w:r>
-          </w:p>
-        </w:tc>
-        <w:tc>
-          <w:tcPr>
-            <w:tcW w:type="dxa" w:w="1378"/>
-            <w:vAlign w:val="center"/>
-            <w:shd w:val="clear" w:color="auto" w:fill="E9EEF3"/>
-          </w:tcPr>
-          <w:p>
-            <w:pPr>
-              <w:keepNext/>
-              <w:spacing w:before="40" w:after="40" w:line="240" w:lineRule="auto"/>
-              <w:jc w:val="left"/>
-            </w:pPr>
-            <w:r>
-              <w:rPr>
-                <w:rFonts w:ascii="Arial" w:hAnsi="Arial" w:eastAsia="Arial" w:cs="Arial"/>
-                <w:b/>
-                <w:sz w:val="21"/>
-              </w:rPr>
-              <w:t>Busy</w:t>
-            </w:r>
-          </w:p>
-        </w:tc>
-        <w:tc>
-          <w:tcPr>
-            <w:tcW w:type="dxa" w:w="2067"/>
-            <w:vAlign w:val="center"/>
-            <w:shd w:val="clear" w:color="auto" w:fill="E9EEF3"/>
-          </w:tcPr>
-          <w:p>
-            <w:pPr>
-              <w:keepNext/>
-              <w:spacing w:before="40" w:after="40" w:line="240" w:lineRule="auto"/>
-              <w:jc w:val="left"/>
-            </w:pPr>
-            <w:r>
-              <w:rPr>
-                <w:rFonts w:ascii="Arial" w:hAnsi="Arial" w:eastAsia="Arial" w:cs="Arial"/>
-                <w:b/>
-                <w:sz w:val="21"/>
-              </w:rPr>
-              <w:t>Below target</w:t>
-            </w:r>
-          </w:p>
-        </w:tc>
-        <w:tc>
-          <w:tcPr>
-            <w:tcW w:type="dxa" w:w="1922"/>
-            <w:vAlign w:val="center"/>
-            <w:shd w:val="clear" w:color="auto" w:fill="E9EEF3"/>
-          </w:tcPr>
-          <w:p>
-            <w:pPr>
-              <w:keepNext/>
-              <w:spacing w:before="40" w:after="40" w:line="240" w:lineRule="auto"/>
-              <w:jc w:val="left"/>
-            </w:pPr>
-            <w:r>
-              <w:rPr>
-                <w:rFonts w:ascii="Arial" w:hAnsi="Arial" w:eastAsia="Arial" w:cs="Arial"/>
-                <w:b/>
-                <w:sz w:val="21"/>
-              </w:rPr>
-              <w:t>Total</w:t>
-            </w:r>
-          </w:p>
-        </w:tc>
-      </w:tr>
-      <w:tr>
-        <w:trPr>
-          <w:cantSplit/>
-        </w:trPr>
-        <w:tc>
-          <w:tcPr>
-            <w:tcW w:type="dxa" w:w="4497"/>
-            <w:vAlign w:val="center"/>
-            <w:shd w:val="clear" w:color="auto" w:fill="FFFFFF"/>
-          </w:tcPr>
-          <w:p>
-            <w:pPr>
-              <w:keepNext/>
-              <w:spacing w:before="40" w:after="40" w:line="240" w:lineRule="auto"/>
-              <w:jc w:val="left"/>
-            </w:pPr>
-            <w:r>
-              <w:rPr>
-                <w:rFonts w:ascii="Arial" w:hAnsi="Arial" w:eastAsia="Arial" w:cs="Arial"/>
-                <w:sz w:val="21"/>
-              </w:rPr>
-              <w:t>Picked by model</w:t>
-            </w:r>
-          </w:p>
-        </w:tc>
-        <w:tc>
-          <w:tcPr>
-            <w:tcW w:type="dxa" w:w="1378"/>
-            <w:vAlign w:val="center"/>
-            <w:shd w:val="clear" w:color="auto" w:fill="FFFFFF"/>
-          </w:tcPr>
-          <w:p>
-            <w:pPr>
-              <w:keepNext/>
-              <w:spacing w:before="40" w:after="40" w:line="240" w:lineRule="auto"/>
-              <w:jc w:val="right"/>
-            </w:pPr>
-            <w:r>
-              <w:rPr>
-                <w:rFonts w:ascii="Arial" w:hAnsi="Arial" w:eastAsia="Arial" w:cs="Arial"/>
-                <w:sz w:val="21"/>
-              </w:rPr>
-              <w:t>423</w:t>
-            </w:r>
-          </w:p>
-        </w:tc>
-        <w:tc>
-          <w:tcPr>
-            <w:tcW w:type="dxa" w:w="2067"/>
-            <w:vAlign w:val="center"/>
-            <w:shd w:val="clear" w:color="auto" w:fill="FFFFFF"/>
-          </w:tcPr>
-          <w:p>
-            <w:pPr>
-              <w:keepNext/>
-              <w:spacing w:before="40" w:after="40" w:line="240" w:lineRule="auto"/>
-              <w:jc w:val="right"/>
-            </w:pPr>
-            <w:r>
-              <w:rPr>
-                <w:rFonts w:ascii="Arial" w:hAnsi="Arial" w:eastAsia="Arial" w:cs="Arial"/>
-                <w:sz w:val="21"/>
-              </w:rPr>
-              <w:t>546</w:t>
-            </w:r>
-          </w:p>
-        </w:tc>
-        <w:tc>
-          <w:tcPr>
-            <w:tcW w:type="dxa" w:w="1922"/>
-            <w:vAlign w:val="center"/>
-            <w:shd w:val="clear" w:color="auto" w:fill="FFFFFF"/>
-          </w:tcPr>
-          <w:p>
-            <w:pPr>
-              <w:keepNext/>
-              <w:spacing w:before="40" w:after="40" w:line="240" w:lineRule="auto"/>
-              <w:jc w:val="right"/>
-            </w:pPr>
-            <w:r>
-              <w:rPr>
-                <w:rFonts w:ascii="Arial" w:hAnsi="Arial" w:eastAsia="Arial" w:cs="Arial"/>
-                <w:sz w:val="21"/>
-              </w:rPr>
-              <w:t>969</w:t>
-            </w:r>
-          </w:p>
-        </w:tc>
-      </w:tr>
-      <w:tr>
-        <w:trPr>
-          <w:cantSplit/>
-        </w:trPr>
-        <w:tc>
-          <w:tcPr>
-            <w:tcW w:type="dxa" w:w="4497"/>
-            <w:vAlign w:val="center"/>
-            <w:shd w:val="clear" w:color="auto" w:fill="FFFFFF"/>
-          </w:tcPr>
-          <w:p>
-            <w:pPr>
-              <w:spacing w:before="40" w:after="40" w:line="240" w:lineRule="auto"/>
-              <w:jc w:val="left"/>
-            </w:pPr>
-            <w:r>
-              <w:rPr>
-                <w:rFonts w:ascii="Arial" w:hAnsi="Arial" w:eastAsia="Arial" w:cs="Arial"/>
-                <w:sz w:val="21"/>
-              </w:rPr>
-              <w:t>Not picked</w:t>
-            </w:r>
-          </w:p>
-        </w:tc>
-        <w:tc>
-          <w:tcPr>
-            <w:tcW w:type="dxa" w:w="1378"/>
-            <w:vAlign w:val="center"/>
-            <w:shd w:val="clear" w:color="auto" w:fill="FFFFFF"/>
-          </w:tcPr>
-          <w:p>
-            <w:pPr>
-              <w:spacing w:before="40" w:after="40" w:line="240" w:lineRule="auto"/>
-              <w:jc w:val="right"/>
-            </w:pPr>
-            <w:r>
-              <w:rPr>
-                <w:rFonts w:ascii="Arial" w:hAnsi="Arial" w:eastAsia="Arial" w:cs="Arial"/>
-                <w:sz w:val="21"/>
-              </w:rPr>
-              <w:t>558</w:t>
-            </w:r>
-          </w:p>
-        </w:tc>
-        <w:tc>
-          <w:tcPr>
-            <w:tcW w:type="dxa" w:w="2067"/>
-            <w:vAlign w:val="center"/>
-            <w:shd w:val="clear" w:color="auto" w:fill="FFFFFF"/>
-          </w:tcPr>
-          <w:p>
-            <w:pPr>
-              <w:spacing w:before="40" w:after="40" w:line="240" w:lineRule="auto"/>
-              <w:jc w:val="right"/>
-            </w:pPr>
-            <w:r>
-              <w:rPr>
-                <w:rFonts w:ascii="Arial" w:hAnsi="Arial" w:eastAsia="Arial" w:cs="Arial"/>
-                <w:sz w:val="21"/>
-              </w:rPr>
-              <w:t>2,346</w:t>
-            </w:r>
-          </w:p>
-        </w:tc>
-        <w:tc>
-          <w:tcPr>
-            <w:tcW w:type="dxa" w:w="1922"/>
-            <w:vAlign w:val="center"/>
-            <w:shd w:val="clear" w:color="auto" w:fill="FFFFFF"/>
-          </w:tcPr>
-          <w:p>
-            <w:pPr>
-              <w:spacing w:before="40" w:after="40" w:line="240" w:lineRule="auto"/>
-              <w:jc w:val="right"/>
-            </w:pPr>
-            <w:r>
-              <w:rPr>
-                <w:rFonts w:ascii="Arial" w:hAnsi="Arial" w:eastAsia="Arial" w:cs="Arial"/>
-                <w:sz w:val="21"/>
-              </w:rPr>
-              <w:t>2,904</w:t>
-            </w:r>
-          </w:p>
-        </w:tc>
-      </w:tr>
-    </w:tbl>
-    <w:p>
-      <w:pPr>
-        <w:widowControl/>
-        <w:spacing w:after="80" w:line="240" w:lineRule="auto"/>
-        <w:jc w:val="left"/>
-      </w:pPr>
-    </w:p>
-    <w:p>
-      <w:pPr>
-        <w:widowControl/>
-        <w:spacing w:after="120" w:line="259" w:lineRule="auto"/>
-        <w:jc w:val="left"/>
-      </w:pPr>
-      <w:r>
-        <w:rPr>
-          <w:rFonts w:ascii="Arial" w:hAnsi="Arial" w:eastAsia="Arial" w:cs="Arial"/>
-        </w:rPr>
-        <w:t xml:space="preserve">For a typical City two-bedroom apartment, the model fitted to all study homes gives a </w:t>
-      </w:r>
-      <w:r>
-        <w:rPr>
-          <w:rFonts w:ascii="Arial" w:hAnsi="Arial" w:eastAsia="Arial" w:cs="Arial"/>
-          <w:b/>
-        </w:rPr>
-        <w:t>42% chance</w:t>
-      </w:r>
-      <w:r>
-        <w:rPr>
-          <w:rFonts w:ascii="Arial" w:hAnsi="Arial" w:eastAsia="Arial" w:cs="Arial"/>
-        </w:rPr>
-        <w:t xml:space="preserve"> of being busy with one-night stays and </w:t>
-      </w:r>
-      <w:r>
-        <w:rPr>
-          <w:rFonts w:ascii="Arial" w:hAnsi="Arial" w:eastAsia="Arial" w:cs="Arial"/>
-          <w:b/>
-        </w:rPr>
-        <w:t>18%</w:t>
-      </w:r>
-      <w:r>
-        <w:rPr>
-          <w:rFonts w:ascii="Arial" w:hAnsi="Arial" w:eastAsia="Arial" w:cs="Arial"/>
-        </w:rPr>
-        <w:t xml:space="preserve"> without. From 42%, ten more amenities give </w:t>
-      </w:r>
-      <w:r>
-        <w:rPr>
-          <w:rFonts w:ascii="Arial" w:hAnsi="Arial" w:eastAsia="Arial" w:cs="Arial"/>
-          <w:b/>
-        </w:rPr>
-        <w:t>48%</w:t>
-      </w:r>
-      <w:r>
-        <w:rPr>
-          <w:rFonts w:ascii="Arial" w:hAnsi="Arial" w:eastAsia="Arial" w:cs="Arial"/>
-        </w:rPr>
-        <w:t xml:space="preserve">, while a 20% price premium gives </w:t>
-      </w:r>
-      <w:r>
-        <w:rPr>
-          <w:rFonts w:ascii="Arial" w:hAnsi="Arial" w:eastAsia="Arial" w:cs="Arial"/>
-          <w:b/>
-        </w:rPr>
-        <w:t>36%</w:t>
-      </w:r>
-      <w:r>
-        <w:rPr>
-          <w:rFonts w:ascii="Arial" w:hAnsi="Arial" w:eastAsia="Arial" w:cs="Arial"/>
-        </w:rPr>
-        <w:t>. These examples explain the ranking; changing settings alone does not establish an increase in bookings. Table A1 reports model weights across the 50 training fits.</w:t>
-      </w:r>
-    </w:p>
-    <w:p>
-      <w:pPr>
-        <w:pStyle w:val="Heading2"/>
-        <w:keepNext/>
-      </w:pPr>
-      <w:r>
-        <w:rPr>
-          <w:rFonts w:ascii="Arial" w:hAnsi="Arial" w:eastAsia="Arial" w:cs="Arial"/>
-        </w:rPr>
-        <w:t>5.4 Prescriptive trade-off: inspection capacity sets list length</w:t>
-      </w:r>
-    </w:p>
-    <w:p>
-      <w:pPr>
-        <w:widowControl/>
-        <w:spacing w:after="120" w:line="259" w:lineRule="auto"/>
-        <w:jc w:val="left"/>
-      </w:pPr>
-      <w:r>
-        <w:rPr>
-          <w:rFonts w:ascii="Arial" w:hAnsi="Arial" w:eastAsia="Arial" w:cs="Arial"/>
-        </w:rPr>
-        <w:t>Shorter lists have a higher hit rate; longer lists find more busy homes (Table 6).</w:t>
-      </w:r>
-    </w:p>
-    <w:p>
-      <w:pPr>
-        <w:keepNext/>
-        <w:widowControl/>
-        <w:spacing w:after="80" w:before="80" w:line="259" w:lineRule="auto"/>
-        <w:jc w:val="left"/>
-      </w:pPr>
-      <w:r>
-        <w:rPr>
-          <w:rFonts w:ascii="Arial" w:hAnsi="Arial" w:eastAsia="Arial" w:cs="Arial"/>
-          <w:b/>
-        </w:rPr>
-        <w:t>Table 6. Inspection capacity within the priority groups (averages of 50 tests)</w:t>
-      </w:r>
-    </w:p>
-    <w:tbl>
-      <w:tblPr>
-        <w:tblW w:type="auto" w:w="0"/>
-        <w:tblLook w:firstColumn="1" w:firstRow="1" w:lastColumn="0" w:lastRow="0" w:noHBand="0" w:noVBand="1" w:val="04A0"/>
-        <w:tblBorders>
-          <w:top w:val="single" w:sz="4" w:color="D9D9D9"/>
-          <w:left w:val="single" w:sz="4" w:color="D9D9D9"/>
-          <w:bottom w:val="single" w:sz="4" w:color="D9D9D9"/>
-          <w:right w:val="single" w:sz="4" w:color="D9D9D9"/>
-          <w:insideH w:val="single" w:sz="4" w:color="D9D9D9"/>
-          <w:insideV w:val="single" w:sz="4" w:color="D9D9D9"/>
-        </w:tblBorders>
-        <w:tblCellMar>
-          <w:top w:w="85" w:type="dxa"/>
-          <w:left w:w="85" w:type="dxa"/>
-          <w:bottom w:w="85" w:type="dxa"/>
-          <w:right w:w="85" w:type="dxa"/>
-        </w:tblCellMar>
-        <w:jc w:val="center"/>
-        <w:tblLayout w:type="fixed"/>
-      </w:tblPr>
-      <w:tblGrid>
-        <w:gridCol w:w="2253"/>
-        <w:gridCol w:w="2393"/>
-        <w:gridCol w:w="2108"/>
-        <w:gridCol w:w="3111"/>
-      </w:tblGrid>
-      <w:tr>
-        <w:trPr>
-          <w:cantSplit/>
-          <w:tblHeader/>
-        </w:trPr>
-        <w:tc>
-          <w:tcPr>
-            <w:tcW w:type="dxa" w:w="2253"/>
-            <w:vAlign w:val="center"/>
-            <w:shd w:val="clear" w:color="auto" w:fill="E9EEF3"/>
-          </w:tcPr>
-          <w:p>
-            <w:pPr>
-              <w:keepNext/>
-              <w:spacing w:before="40" w:after="40" w:line="240" w:lineRule="auto"/>
-              <w:jc w:val="left"/>
-            </w:pPr>
-            <w:r>
-              <w:rPr>
-                <w:rFonts w:ascii="Arial" w:hAnsi="Arial" w:eastAsia="Arial" w:cs="Arial"/>
-                <w:b/>
-                <w:sz w:val="21"/>
-              </w:rPr>
-              <w:t>Homes inspected per group</w:t>
-            </w:r>
-          </w:p>
-        </w:tc>
-        <w:tc>
-          <w:tcPr>
-            <w:tcW w:type="dxa" w:w="2393"/>
-            <w:vAlign w:val="center"/>
-            <w:shd w:val="clear" w:color="auto" w:fill="E9EEF3"/>
-          </w:tcPr>
-          <w:p>
-            <w:pPr>
-              <w:keepNext/>
-              <w:spacing w:before="40" w:after="40" w:line="240" w:lineRule="auto"/>
-              <w:jc w:val="left"/>
-            </w:pPr>
-            <w:r>
-              <w:rPr>
-                <w:rFonts w:ascii="Arial" w:hAnsi="Arial" w:eastAsia="Arial" w:cs="Arial"/>
-                <w:b/>
-                <w:sz w:val="21"/>
-              </w:rPr>
-              <w:t>Hit rate (precision)</w:t>
-            </w:r>
-          </w:p>
-        </w:tc>
-        <w:tc>
-          <w:tcPr>
-            <w:tcW w:type="dxa" w:w="2108"/>
-            <w:vAlign w:val="center"/>
-            <w:shd w:val="clear" w:color="auto" w:fill="E9EEF3"/>
-          </w:tcPr>
-          <w:p>
-            <w:pPr>
-              <w:keepNext/>
-              <w:spacing w:before="40" w:after="40" w:line="240" w:lineRule="auto"/>
-              <w:jc w:val="left"/>
-            </w:pPr>
-            <w:r>
-              <w:rPr>
-                <w:rFonts w:ascii="Arial" w:hAnsi="Arial" w:eastAsia="Arial" w:cs="Arial"/>
-                <w:b/>
-                <w:sz w:val="21"/>
-              </w:rPr>
-              <w:t>Busy homes found (recall)</w:t>
-            </w:r>
-          </w:p>
-        </w:tc>
-        <w:tc>
-          <w:tcPr>
-            <w:tcW w:type="dxa" w:w="3111"/>
-            <w:vAlign w:val="center"/>
-            <w:shd w:val="clear" w:color="auto" w:fill="E9EEF3"/>
-          </w:tcPr>
-          <w:p>
-            <w:pPr>
-              <w:keepNext/>
-              <w:spacing w:before="40" w:after="40" w:line="240" w:lineRule="auto"/>
-              <w:jc w:val="left"/>
-            </w:pPr>
-            <w:r>
-              <w:rPr>
-                <w:rFonts w:ascii="Arial" w:hAnsi="Arial" w:eastAsia="Arial" w:cs="Arial"/>
-                <w:b/>
-                <w:sz w:val="21"/>
-              </w:rPr>
-              <w:t>Gain over random picking (percentage points)</w:t>
-            </w:r>
-          </w:p>
-        </w:tc>
-      </w:tr>
-      <w:tr>
-        <w:trPr>
-          <w:cantSplit/>
-        </w:trPr>
-        <w:tc>
-          <w:tcPr>
-            <w:tcW w:type="dxa" w:w="2253"/>
-            <w:vAlign w:val="center"/>
-            <w:shd w:val="clear" w:color="auto" w:fill="FFFFFF"/>
-          </w:tcPr>
-          <w:p>
-            <w:pPr>
-              <w:keepNext/>
-              <w:spacing w:before="40" w:after="40" w:line="240" w:lineRule="auto"/>
-              <w:jc w:val="left"/>
-            </w:pPr>
-            <w:r>
-              <w:rPr>
-                <w:rFonts w:ascii="Arial" w:hAnsi="Arial" w:eastAsia="Arial" w:cs="Arial"/>
-                <w:sz w:val="21"/>
-              </w:rPr>
-              <w:t>10%</w:t>
-            </w:r>
-          </w:p>
-        </w:tc>
-        <w:tc>
-          <w:tcPr>
-            <w:tcW w:type="dxa" w:w="2393"/>
-            <w:vAlign w:val="center"/>
-            <w:shd w:val="clear" w:color="auto" w:fill="FFFFFF"/>
-          </w:tcPr>
-          <w:p>
-            <w:pPr>
-              <w:keepNext/>
-              <w:spacing w:before="40" w:after="40" w:line="240" w:lineRule="auto"/>
-              <w:jc w:val="right"/>
-            </w:pPr>
-            <w:r>
-              <w:rPr>
-                <w:rFonts w:ascii="Arial" w:hAnsi="Arial" w:eastAsia="Arial" w:cs="Arial"/>
-                <w:sz w:val="21"/>
-              </w:rPr>
-              <w:t>54.5%</w:t>
-            </w:r>
-          </w:p>
-        </w:tc>
-        <w:tc>
-          <w:tcPr>
-            <w:tcW w:type="dxa" w:w="2108"/>
-            <w:vAlign w:val="center"/>
-            <w:shd w:val="clear" w:color="auto" w:fill="FFFFFF"/>
-          </w:tcPr>
-          <w:p>
-            <w:pPr>
-              <w:keepNext/>
-              <w:spacing w:before="40" w:after="40" w:line="240" w:lineRule="auto"/>
-              <w:jc w:val="right"/>
-            </w:pPr>
-            <w:r>
-              <w:rPr>
-                <w:rFonts w:ascii="Arial" w:hAnsi="Arial" w:eastAsia="Arial" w:cs="Arial"/>
-                <w:sz w:val="21"/>
-              </w:rPr>
-              <w:t>17.1%</w:t>
-            </w:r>
-          </w:p>
-        </w:tc>
-        <w:tc>
-          <w:tcPr>
-            <w:tcW w:type="dxa" w:w="3111"/>
-            <w:vAlign w:val="center"/>
-            <w:shd w:val="clear" w:color="auto" w:fill="FFFFFF"/>
-          </w:tcPr>
-          <w:p>
-            <w:pPr>
-              <w:keepNext/>
-              <w:spacing w:before="40" w:after="40" w:line="240" w:lineRule="auto"/>
-              <w:jc w:val="right"/>
-            </w:pPr>
-            <w:r>
-              <w:rPr>
-                <w:rFonts w:ascii="Arial" w:hAnsi="Arial" w:eastAsia="Arial" w:cs="Arial"/>
-                <w:sz w:val="21"/>
-              </w:rPr>
-              <w:t>+22.0</w:t>
-            </w:r>
-          </w:p>
-        </w:tc>
-      </w:tr>
-      <w:tr>
-        <w:trPr>
-          <w:cantSplit/>
-        </w:trPr>
-        <w:tc>
-          <w:tcPr>
-            <w:tcW w:type="dxa" w:w="2253"/>
-            <w:vAlign w:val="center"/>
-            <w:shd w:val="clear" w:color="auto" w:fill="FFFFFF"/>
-          </w:tcPr>
-          <w:p>
-            <w:pPr>
-              <w:keepNext/>
-              <w:spacing w:before="40" w:after="40" w:line="240" w:lineRule="auto"/>
-              <w:jc w:val="left"/>
-            </w:pPr>
-            <w:r>
-              <w:rPr>
-                <w:rFonts w:ascii="Arial" w:hAnsi="Arial" w:eastAsia="Arial" w:cs="Arial"/>
-                <w:sz w:val="21"/>
-              </w:rPr>
-              <w:t>25%</w:t>
-            </w:r>
-          </w:p>
-        </w:tc>
-        <w:tc>
-          <w:tcPr>
-            <w:tcW w:type="dxa" w:w="2393"/>
-            <w:vAlign w:val="center"/>
-            <w:shd w:val="clear" w:color="auto" w:fill="FFFFFF"/>
-          </w:tcPr>
-          <w:p>
-            <w:pPr>
-              <w:keepNext/>
-              <w:spacing w:before="40" w:after="40" w:line="240" w:lineRule="auto"/>
-              <w:jc w:val="right"/>
-            </w:pPr>
-            <w:r>
-              <w:rPr>
-                <w:rFonts w:ascii="Arial" w:hAnsi="Arial" w:eastAsia="Arial" w:cs="Arial"/>
-                <w:sz w:val="21"/>
-              </w:rPr>
-              <w:t>49.6%</w:t>
-            </w:r>
-          </w:p>
-        </w:tc>
-        <w:tc>
-          <w:tcPr>
-            <w:tcW w:type="dxa" w:w="2108"/>
-            <w:vAlign w:val="center"/>
-            <w:shd w:val="clear" w:color="auto" w:fill="FFFFFF"/>
-          </w:tcPr>
-          <w:p>
-            <w:pPr>
-              <w:keepNext/>
-              <w:spacing w:before="40" w:after="40" w:line="240" w:lineRule="auto"/>
-              <w:jc w:val="right"/>
-            </w:pPr>
-            <w:r>
-              <w:rPr>
-                <w:rFonts w:ascii="Arial" w:hAnsi="Arial" w:eastAsia="Arial" w:cs="Arial"/>
-                <w:sz w:val="21"/>
-              </w:rPr>
-              <w:t>38.3%</w:t>
-            </w:r>
-          </w:p>
-        </w:tc>
-        <w:tc>
-          <w:tcPr>
-            <w:tcW w:type="dxa" w:w="3111"/>
-            <w:vAlign w:val="center"/>
-            <w:shd w:val="clear" w:color="auto" w:fill="FFFFFF"/>
-          </w:tcPr>
-          <w:p>
-            <w:pPr>
-              <w:keepNext/>
-              <w:spacing w:before="40" w:after="40" w:line="240" w:lineRule="auto"/>
-              <w:jc w:val="right"/>
-            </w:pPr>
-            <w:r>
-              <w:rPr>
-                <w:rFonts w:ascii="Arial" w:hAnsi="Arial" w:eastAsia="Arial" w:cs="Arial"/>
-                <w:sz w:val="21"/>
-              </w:rPr>
-              <w:t>+17.2</w:t>
-            </w:r>
-          </w:p>
-        </w:tc>
-      </w:tr>
-      <w:tr>
-        <w:trPr>
-          <w:cantSplit/>
-        </w:trPr>
-        <w:tc>
-          <w:tcPr>
-            <w:tcW w:type="dxa" w:w="2253"/>
-            <w:vAlign w:val="center"/>
-            <w:shd w:val="clear" w:color="auto" w:fill="FFFFFF"/>
-          </w:tcPr>
-          <w:p>
-            <w:pPr>
-              <w:spacing w:before="40" w:after="40" w:line="240" w:lineRule="auto"/>
-              <w:jc w:val="left"/>
-            </w:pPr>
-            <w:r>
-              <w:rPr>
-                <w:rFonts w:ascii="Arial" w:hAnsi="Arial" w:eastAsia="Arial" w:cs="Arial"/>
-                <w:sz w:val="21"/>
-              </w:rPr>
-              <w:t>50%</w:t>
-            </w:r>
-          </w:p>
-        </w:tc>
-        <w:tc>
-          <w:tcPr>
-            <w:tcW w:type="dxa" w:w="2393"/>
-            <w:vAlign w:val="center"/>
-            <w:shd w:val="clear" w:color="auto" w:fill="FFFFFF"/>
-          </w:tcPr>
-          <w:p>
-            <w:pPr>
-              <w:spacing w:before="40" w:after="40" w:line="240" w:lineRule="auto"/>
-              <w:jc w:val="right"/>
-            </w:pPr>
-            <w:r>
-              <w:rPr>
-                <w:rFonts w:ascii="Arial" w:hAnsi="Arial" w:eastAsia="Arial" w:cs="Arial"/>
-                <w:sz w:val="21"/>
-              </w:rPr>
-              <w:t>43.1%</w:t>
-            </w:r>
-          </w:p>
-        </w:tc>
-        <w:tc>
-          <w:tcPr>
-            <w:tcW w:type="dxa" w:w="2108"/>
-            <w:vAlign w:val="center"/>
-            <w:shd w:val="clear" w:color="auto" w:fill="FFFFFF"/>
-          </w:tcPr>
-          <w:p>
-            <w:pPr>
-              <w:spacing w:before="40" w:after="40" w:line="240" w:lineRule="auto"/>
-              <w:jc w:val="right"/>
-            </w:pPr>
-            <w:r>
-              <w:rPr>
-                <w:rFonts w:ascii="Arial" w:hAnsi="Arial" w:eastAsia="Arial" w:cs="Arial"/>
-                <w:sz w:val="21"/>
-              </w:rPr>
-              <w:t>66.7%</w:t>
-            </w:r>
-          </w:p>
-        </w:tc>
-        <w:tc>
-          <w:tcPr>
-            <w:tcW w:type="dxa" w:w="3111"/>
-            <w:vAlign w:val="center"/>
-            <w:shd w:val="clear" w:color="auto" w:fill="FFFFFF"/>
-          </w:tcPr>
-          <w:p>
-            <w:pPr>
-              <w:spacing w:before="40" w:after="40" w:line="240" w:lineRule="auto"/>
-              <w:jc w:val="right"/>
-            </w:pPr>
-            <w:r>
-              <w:rPr>
-                <w:rFonts w:ascii="Arial" w:hAnsi="Arial" w:eastAsia="Arial" w:cs="Arial"/>
-                <w:sz w:val="21"/>
-              </w:rPr>
-              <w:t>+10.7</w:t>
-            </w:r>
-          </w:p>
-        </w:tc>
-      </w:tr>
-    </w:tbl>
-    <w:p>
-      <w:pPr>
-        <w:widowControl/>
-        <w:spacing w:after="80" w:line="240" w:lineRule="auto"/>
-        <w:jc w:val="left"/>
-      </w:pPr>
-    </w:p>
-    <w:p>
-      <w:pPr>
-        <w:widowControl/>
-        <w:spacing w:after="120" w:line="259" w:lineRule="auto"/>
-        <w:jc w:val="left"/>
-      </w:pPr>
-      <w:r>
-        <w:rPr>
-          <w:rFonts w:ascii="Arial" w:hAnsi="Arial" w:eastAsia="Arial" w:cs="Arial"/>
-        </w:rPr>
-        <w:t>Inspecting 10% gives a 54.5% hit rate and finds 17.1% of busy homes; at 50%, the list finds two-thirds (66.7%). Start with ten candidates (Table 7), then inspect the highest-ranked listed homes as the budget allows.</w:t>
-      </w:r>
-    </w:p>
-    <w:p>
-      <w:pPr>
-        <w:pStyle w:val="Heading2"/>
-        <w:keepNext/>
-      </w:pPr>
-      <w:r>
-        <w:rPr>
-          <w:rFonts w:ascii="Arial" w:hAnsi="Arial" w:eastAsia="Arial" w:cs="Arial"/>
-        </w:rPr>
-        <w:t>5.5 Over time: the leading groups stayed ahead</w:t>
-      </w:r>
-    </w:p>
-    <w:p>
-      <w:pPr>
-        <w:widowControl/>
-        <w:spacing w:after="120" w:line="259" w:lineRule="auto"/>
-        <w:jc w:val="left"/>
-      </w:pPr>
-      <w:r>
-        <w:rPr>
-          <w:rFonts w:ascii="Arial" w:hAnsi="Arial" w:eastAsia="Arial" w:cs="Arial"/>
-        </w:rPr>
-        <w:t xml:space="preserve">The groups chosen for leading in the earlier year had 33.6% of homes reaching 34 reviews, against 19.9% elsewhere (Figure 4). In the later year, they still led: </w:t>
+        <w:t>For 2,657 homes with two years of reviews in ten groups, the earlier year's top three were the same priority groups: 33.6% of their homes reached that year's reference level of 34 reviews, against 19.9% elsewhere (Figure 5). A year later they still led (</w:t>
       </w:r>
       <w:r>
         <w:rPr>
@@ -4419,20 +3937,7 @@
         <w:rPr>
           <w:rFonts w:ascii="Arial" w:hAnsi="Arial" w:eastAsia="Arial" w:cs="Arial"/>
         </w:rPr>
-        <w:t xml:space="preserve">, about </w:t>
-      </w:r>
-      <w:r>
-        <w:rPr>
-          <w:rFonts w:ascii="Arial" w:hAnsi="Arial" w:eastAsia="Arial" w:cs="Arial"/>
-          <w:b/>
-        </w:rPr>
-        <w:t>12 percentage points</w:t>
-      </w:r>
-      <w:r>
-        <w:rPr>
-          <w:rFonts w:ascii="Arial" w:hAnsi="Arial" w:eastAsia="Arial" w:cs="Arial"/>
-        </w:rPr>
-        <w:t>. The advantage also holds when hosts receive equal weight (Appendix A).</w:t>
+        <w:t>) and remained the top three, although Yarra Ranges houses fell to 21.4%. With hosts weighted equally, the later-year lead is 8.7 points.</w:t>
       </w:r>
     </w:p>
     <w:p>
@@ -4446,7 +3951,7 @@
         <w:drawing>
           <wp:inline xmlns:a="http://schemas.openxmlformats.org/drawingml/2006/main" xmlns:pic="http://schemas.openxmlformats.org/drawingml/2006/picture">
             <wp:extent cx="6035040" cy="2407826"/>
-            <wp:docPr id="4" name="Picture 4"/>
+            <wp:docPr id="5" name="Picture 5"/>
             <wp:cNvGraphicFramePr>
               <a:graphicFrameLocks noChangeAspect="1"/>
             </wp:cNvGraphicFramePr>
@@ -4454,11 +3959,11 @@
               <a:graphicData uri="http://schemas.openxmlformats.org/drawingml/2006/picture">
                 <pic:pic>
                   <pic:nvPicPr>
-                    <pic:cNvPr id="0" name="figure_4_two_years.png"/>
+                    <pic:cNvPr id="0" name="figure_5_two_years.png"/>
                     <pic:cNvPicPr/>
                   </pic:nvPicPr>
                   <pic:blipFill>
-                    <a:blip r:embed="rId23"/>
+                    <a:blip r:embed="rId24"/>
                     <a:stretch>
                       <a:fillRect/>
                     </a:stretch>
@@ -4486,13 +3991,13 @@
           <w:rFonts w:ascii="Arial" w:hAnsi="Arial" w:eastAsia="Arial" w:cs="Arial"/>
           <w:b/>
         </w:rPr>
-        <w:t>Figure 4.</w:t>
+        <w:t>Figure 5.</w:t>
       </w:r>
       <w:r>
         <w:rPr>
           <w:rFonts w:ascii="Arial" w:hAnsi="Arial" w:eastAsia="Arial" w:cs="Arial"/>
         </w:rPr>
-        <w:t xml:space="preserve"> The same 2,657 surviving homes in two consecutive years; target 34 reviews.</w:t>
+        <w:t xml:space="preserve"> The same 2,657 homes in two consecutive years; target 34 reviews.</w:t>
       </w:r>
     </w:p>
     <w:p>
@@ -4545,7 +4050,7 @@
         <w:rPr>
           <w:rFonts w:ascii="Arial" w:hAnsi="Arial" w:eastAsia="Arial" w:cs="Arial"/>
         </w:rPr>
-        <w:t xml:space="preserve"> City of Melbourne two- and three-bedroom apartments had the highest shares of busy homes and above-median estimated revenue; Yarra Ranges three-bedroom houses follow but are less certain. All three stayed ahead a year later (Figures 2 and 4, Table 4).</w:t>
+        <w:t xml:space="preserve"> City of Melbourne two- and three-bedroom apartments led on busy homes and above-median revenue, followed less certainly by Yarra Ranges three-bedroom houses; all three stayed ahead a year later (Figures 2 and 5, Table 4).</w:t>
       </w:r>
     </w:p>
     <w:p>
@@ -4567,13 +4072,13 @@
           <w:rFonts w:ascii="Arial" w:hAnsi="Arial" w:eastAsia="Arial" w:cs="Arial"/>
           <w:b/>
         </w:rPr>
-        <w:t>How homes are run:</w:t>
+        <w:t>What goes with high activity:</w:t>
       </w:r>
       <w:r>
         <w:rPr>
           <w:rFonts w:ascii="Arial" w:hAnsi="Arial" w:eastAsia="Arial" w:cs="Arial"/>
         </w:rPr>
-        <w:t xml:space="preserve"> Busy homes far more often accept one-night stays and charge slightly less than similar homes (Table 3, Section 5.3).</w:t>
+        <w:t xml:space="preserve"> One-night stays and a price at or below similar homes. In the priority groups, 50.4% of homes with both were busy, against 9.3% with neither (Table 5, Figure 3), though part of the one-night effect is built into the review count. Busy homes were also better rated (Table 3).</w:t>
       </w:r>
     </w:p>
     <w:p>
@@ -4601,7 +4106,7 @@
         <w:rPr>
           <w:rFonts w:ascii="Arial" w:hAnsi="Arial" w:eastAsia="Arial" w:cs="Arial"/>
         </w:rPr>
-        <w:t xml:space="preserve"> Within the priority groups, the model raises the hit rate from one in three (32.4%) to one in two (49.6%) (Figure 3, Table 6).</w:t>
+        <w:t xml:space="preserve"> These two settings pick busy homes about as well as the model: one in two, against one in three at random (Figure 4).</w:t>
       </w:r>
     </w:p>
     <w:p>
@@ -4635,13 +4140,13 @@
           <w:rFonts w:ascii="Arial" w:hAnsi="Arial" w:eastAsia="Arial" w:cs="Arial"/>
           <w:b/>
         </w:rPr>
-        <w:t>Search City of Melbourne two- and three-bedroom apartments first, then Yarra Ranges three-bedroom houses.</w:t>
+        <w:t>Search City of Melbourne two- and three-bedroom apartments first, then Yarra Ranges three-bedroom houses</w:t>
       </w:r>
       <w:r>
         <w:rPr>
           <w:rFonts w:ascii="Arial" w:hAnsi="Arial" w:eastAsia="Arial" w:cs="Arial"/>
         </w:rPr>
-        <w:t xml:space="preserve"> Between leases that pass, choose the larger cash-flow margin; if margins are similar, choose the group with the higher share of busy homes.</w:t>
+        <w:t xml:space="preserve"> (Figure 2, Table 4). Between leases that pass, choose the larger cash-flow margin; if margins are similar, choose the group with the higher share of busy homes.</w:t>
       </w:r>
     </w:p>
     <w:p>
@@ -4663,13 +4168,13 @@
           <w:rFonts w:ascii="Arial" w:hAnsi="Arial" w:eastAsia="Arial" w:cs="Arial"/>
           <w:b/>
         </w:rPr>
-        <w:t>Order candidates already on Airbnb with the model.</w:t>
+        <w:t>Prefer homes that can take one-night stays at a price at or below similar listings</w:t>
       </w:r>
       <w:r>
         <w:rPr>
           <w:rFonts w:ascii="Arial" w:hAnsi="Arial" w:eastAsia="Arial" w:cs="Arial"/>
         </w:rPr>
-        <w:t xml:space="preserve"> For an unlisted rental, price near similar listings and trial one-night stays where allowed.</w:t>
+        <w:t xml:space="preserve"> (Table 5, Figure 3). At inspection, check that building rules allow one-night stays and that this price covers costs (Recommendation 3); then run the home this way (Table 6).</w:t>
       </w:r>
     </w:p>
     <w:p>
@@ -4691,13 +4196,13 @@
           <w:rFonts w:ascii="Arial" w:hAnsi="Arial" w:eastAsia="Arial" w:cs="Arial"/>
           <w:b/>
         </w:rPr>
-        <w:t>Compare weekly rent and running costs with group revenue.</w:t>
+        <w:t>Compare weekly rent and running costs with group revenue</w:t>
       </w:r>
       <w:r>
         <w:rPr>
           <w:rFonts w:ascii="Arial" w:hAnsi="Arial" w:eastAsia="Arial" w:cs="Arial"/>
         </w:rPr>
-        <w:t xml:space="preserve"> Typical weekly estimates (all-home medians) are </w:t>
+        <w:t xml:space="preserve"> (Figure 6). Typical weekly revenue (all-home medians) is </w:t>
       </w:r>
       <w:r>
         <w:rPr>
@@ -4749,7 +4254,7 @@
         <w:rPr>
           <w:rFonts w:ascii="Arial" w:hAnsi="Arial" w:eastAsia="Arial" w:cs="Arial"/>
         </w:rPr>
-        <w:t>. Figure 5 shows how many historical homes covered a proposed cost. Drop candidates costing more than typical revenue, assess the rest through their own cash-flow plans, and budget for a year of the below-target shortfall. Obtain written landlord consent and check that any owners' corporation has not banned stays under 28 days (Consumer Affairs Victoria, n.d.). Airbnb collects Victoria's 7.5% short-stay levy on applicable bookings (State Revenue Office Victoria, n.d.).</w:t>
+        <w:t>. Only about half of a group's homes covered a cost equal to its typical figure. Drop candidates costing more than typical revenue, assess the rest through their own cash-flow plans, and budget for a year of the below-target shortfall.</w:t>
       </w:r>
     </w:p>
     <w:p>
@@ -4764,7 +4269,7 @@
           <w:rFonts w:ascii="Arial" w:hAnsi="Arial" w:eastAsia="Arial" w:cs="Arial"/>
           <w:b/>
         </w:rPr>
-        <w:t>Table 7. Four-week inspection plan</w:t>
+        <w:t>Table 6. Four-week inspection plan</w:t>
       </w:r>
     </w:p>
     <w:tbl>
@@ -4789,9 +4294,9 @@
         <w:tblLayout w:type="fixed"/>
       </w:tblPr>
       <w:tblGrid>
-        <w:gridCol w:w="2047"/>
-        <w:gridCol w:w="3907"/>
-        <w:gridCol w:w="3910"/>
+        <w:gridCol w:w="1949"/>
+        <w:gridCol w:w="4366"/>
+        <w:gridCol w:w="3549"/>
       </w:tblGrid>
       <w:tr>
         <w:trPr>
@@ -4800,7 +4305,7 @@
         </w:trPr>
         <w:tc>
           <w:tcPr>
-            <w:tcW w:type="dxa" w:w="2047"/>
+            <w:tcW w:type="dxa" w:w="1949"/>
             <w:vAlign w:val="center"/>
             <w:shd w:val="clear" w:color="auto" w:fill="E9EEF3"/>
           </w:tcPr>
@@ -4822,7 +4327,7 @@
         </w:tc>
         <w:tc>
           <w:tcPr>
-            <w:tcW w:type="dxa" w:w="3907"/>
+            <w:tcW w:type="dxa" w:w="4366"/>
             <w:vAlign w:val="center"/>
             <w:shd w:val="clear" w:color="auto" w:fill="E9EEF3"/>
           </w:tcPr>
@@ -4844,7 +4349,7 @@
         </w:tc>
         <w:tc>
           <w:tcPr>
-            <w:tcW w:type="dxa" w:w="3910"/>
+            <w:tcW w:type="dxa" w:w="3549"/>
             <w:vAlign w:val="center"/>
             <w:shd w:val="clear" w:color="auto" w:fill="E9EEF3"/>
           </w:tcPr>
@@ -4871,7 +4376,7 @@
         </w:trPr>
         <w:tc>
           <w:tcPr>
-            <w:tcW w:type="dxa" w:w="2047"/>
+            <w:tcW w:type="dxa" w:w="1949"/>
             <w:vAlign w:val="center"/>
             <w:shd w:val="clear" w:color="auto" w:fill="FFFFFF"/>
           </w:tcPr>
@@ -4900,7 +4405,7 @@
         </w:tc>
         <w:tc>
           <w:tcPr>
-            <w:tcW w:type="dxa" w:w="3907"/>
+            <w:tcW w:type="dxa" w:w="4366"/>
             <w:vAlign w:val="center"/>
             <w:shd w:val="clear" w:color="auto" w:fill="FFFFFF"/>
           </w:tcPr>
@@ -4915,13 +4420,13 @@
                 <w:rFonts w:ascii="Arial" w:hAnsi="Arial" w:eastAsia="Arial" w:cs="Arial"/>
                 <w:sz w:val="21"/>
               </w:rPr>
-              <w:t>Build a pool of ten candidates in the priority groups; rank listed homes within each group</w:t>
+              <w:t>Pool ten candidate homes in the priority groups; check one-night stays and price</w:t>
             </w:r>
           </w:p>
         </w:tc>
         <w:tc>
           <w:tcPr>
-            <w:tcW w:type="dxa" w:w="3910"/>
+            <w:tcW w:type="dxa" w:w="3549"/>
             <w:vAlign w:val="center"/>
             <w:shd w:val="clear" w:color="auto" w:fill="FFFFFF"/>
           </w:tcPr>
@@ -4936,7 +4441,7 @@
                 <w:rFonts w:ascii="Arial" w:hAnsi="Arial" w:eastAsia="Arial" w:cs="Arial"/>
                 <w:sz w:val="21"/>
               </w:rPr>
-              <w:t>Inspect top-ranked homes first, as time and budget allow; unlisted rentals follow the group order</w:t>
+              <w:t>Inspect homes meeting both first, in group order</w:t>
             </w:r>
           </w:p>
         </w:tc>
@@ -4947,7 +4452,7 @@
         </w:trPr>
         <w:tc>
           <w:tcPr>
-            <w:tcW w:type="dxa" w:w="2047"/>
+            <w:tcW w:type="dxa" w:w="1949"/>
             <w:vAlign w:val="center"/>
             <w:shd w:val="clear" w:color="auto" w:fill="FFFFFF"/>
           </w:tcPr>
@@ -4976,7 +4481,7 @@
         </w:tc>
         <w:tc>
           <w:tcPr>
-            <w:tcW w:type="dxa" w:w="3907"/>
+            <w:tcW w:type="dxa" w:w="4366"/>
             <w:vAlign w:val="center"/>
             <w:shd w:val="clear" w:color="auto" w:fill="FFFFFF"/>
           </w:tcPr>
@@ -4991,13 +4496,13 @@
                 <w:rFonts w:ascii="Arial" w:hAnsi="Arial" w:eastAsia="Arial" w:cs="Arial"/>
                 <w:sz w:val="21"/>
               </w:rPr>
-              <w:t>Confirm consent and building rules; negotiate rent; obtain cost quotes</w:t>
+              <w:t>Get written landlord consent; check that no owners' corporation rule bans stays under 28 days (Consumer Affairs Victoria, n.d.); negotiate rent; get cost quotes</w:t>
             </w:r>
           </w:p>
         </w:tc>
         <w:tc>
           <w:tcPr>
-            <w:tcW w:type="dxa" w:w="3910"/>
+            <w:tcW w:type="dxa" w:w="3549"/>
             <w:vAlign w:val="center"/>
             <w:shd w:val="clear" w:color="auto" w:fill="FFFFFF"/>
           </w:tcPr>
@@ -5023,7 +4528,7 @@
         </w:trPr>
         <w:tc>
           <w:tcPr>
-            <w:tcW w:type="dxa" w:w="2047"/>
+            <w:tcW w:type="dxa" w:w="1949"/>
             <w:vAlign w:val="center"/>
             <w:shd w:val="clear" w:color="auto" w:fill="FFFFFF"/>
           </w:tcPr>
@@ -5052,7 +4557,7 @@
         </w:tc>
         <w:tc>
           <w:tcPr>
-            <w:tcW w:type="dxa" w:w="3907"/>
+            <w:tcW w:type="dxa" w:w="4366"/>
             <w:vAlign w:val="center"/>
             <w:shd w:val="clear" w:color="auto" w:fill="FFFFFF"/>
           </w:tcPr>
@@ -5067,13 +4572,13 @@
                 <w:rFonts w:ascii="Arial" w:hAnsi="Arial" w:eastAsia="Arial" w:cs="Arial"/>
                 <w:sz w:val="21"/>
               </w:rPr>
-              <w:t>Cash-flow plan: quotes against typical and below-target revenue (Recommendation 3, Figure 5)</w:t>
+              <w:t>Cash-flow plan: quotes and Victoria's 7.5% short-stay levy (State Revenue Office Victoria, n.d.) against typical and below-target revenue (Figure 6)</w:t>
             </w:r>
           </w:p>
         </w:tc>
         <w:tc>
           <w:tcPr>
-            <w:tcW w:type="dxa" w:w="3910"/>
+            <w:tcW w:type="dxa" w:w="3549"/>
             <w:vAlign w:val="center"/>
             <w:shd w:val="clear" w:color="auto" w:fill="FFFFFF"/>
           </w:tcPr>
@@ -5099,7 +4604,7 @@
         </w:trPr>
         <w:tc>
           <w:tcPr>
-            <w:tcW w:type="dxa" w:w="2047"/>
+            <w:tcW w:type="dxa" w:w="1949"/>
             <w:vAlign w:val="center"/>
             <w:shd w:val="clear" w:color="auto" w:fill="FFFFFF"/>
           </w:tcPr>
@@ -5127,7 +4632,7 @@
         </w:tc>
         <w:tc>
           <w:tcPr>
-            <w:tcW w:type="dxa" w:w="3907"/>
+            <w:tcW w:type="dxa" w:w="4366"/>
             <w:vAlign w:val="center"/>
             <w:shd w:val="clear" w:color="auto" w:fill="FFFFFF"/>
           </w:tcPr>
@@ -5141,13 +4646,13 @@
                 <w:rFonts w:ascii="Arial" w:hAnsi="Arial" w:eastAsia="Arial" w:cs="Arial"/>
                 <w:sz w:val="21"/>
               </w:rPr>
-              <w:t>Record paid nights, stay length, workload and net cash flow alongside reviews</w:t>
+              <w:t>Record paid nights, stay length, workload, net cash flow and reviews</w:t>
             </w:r>
           </w:p>
         </w:tc>
         <w:tc>
           <w:tcPr>
-            <w:tcW w:type="dxa" w:w="3910"/>
+            <w:tcW w:type="dxa" w:w="3549"/>
             <w:vAlign w:val="center"/>
             <w:shd w:val="clear" w:color="auto" w:fill="FFFFFF"/>
           </w:tcPr>
@@ -5185,7 +4690,7 @@
         <w:drawing>
           <wp:inline xmlns:a="http://schemas.openxmlformats.org/drawingml/2006/main" xmlns:pic="http://schemas.openxmlformats.org/drawingml/2006/picture">
             <wp:extent cx="6035040" cy="2482294"/>
-            <wp:docPr id="5" name="Picture 5"/>
+            <wp:docPr id="6" name="Picture 6"/>
             <wp:cNvGraphicFramePr>
               <a:graphicFrameLocks noChangeAspect="1"/>
             </wp:cNvGraphicFramePr>
@@ -5193,11 +4698,11 @@
               <a:graphicData uri="http://schemas.openxmlformats.org/drawingml/2006/picture">
                 <pic:pic>
                   <pic:nvPicPr>
-                    <pic:cNvPr id="0" name="figure_5_weekly_reach.png"/>
+                    <pic:cNvPr id="0" name="figure_6_weekly_reach.png"/>
                     <pic:cNvPicPr/>
                   </pic:nvPicPr>
                   <pic:blipFill>
-                    <a:blip r:embed="rId24"/>
+                    <a:blip r:embed="rId25"/>
                     <a:stretch>
                       <a:fillRect/>
                     </a:stretch>
@@ -5225,7 +4730,7 @@
           <w:rFonts w:ascii="Arial" w:hAnsi="Arial" w:eastAsia="Arial" w:cs="Arial"/>
           <w:b/>
         </w:rPr>
-        <w:t>Figure 5.</w:t>
+        <w:t>Figure 6.</w:t>
       </w:r>
       <w:r>
         <w:rPr>
@@ -5245,13 +4750,13 @@
           <w:rFonts w:ascii="Arial" w:hAnsi="Arial" w:eastAsia="Arial" w:cs="Arial"/>
           <w:b/>
         </w:rPr>
-        <w:t>Worked example (illustrative figures).</w:t>
+        <w:t>Worked example (illustrative costs).</w:t>
       </w:r>
       <w:r>
         <w:rPr>
           <w:rFonts w:ascii="Arial" w:hAnsi="Arial" w:eastAsia="Arial" w:cs="Arial"/>
         </w:rPr>
-        <w:t xml:space="preserve"> Weekly rent and quoted running costs total </w:t>
+        <w:t xml:space="preserve"> A City two-bedroom apartment costing </w:t>
       </w:r>
       <w:r>
         <w:rPr>
@@ -5264,7 +4769,7 @@
         <w:rPr>
           <w:rFonts w:ascii="Arial" w:hAnsi="Arial" w:eastAsia="Arial" w:cs="Arial"/>
         </w:rPr>
-        <w:t xml:space="preserve"> for an unlisted City two-bedroom apartment and </w:t>
+        <w:t xml:space="preserve"> a week in rent and running costs exceeds its group's typical AUD 590 and is dropped. A Yarra Ranges house costing </w:t>
       </w:r>
       <w:r>
         <w:rPr>
@@ -5277,7 +4782,7 @@
         <w:rPr>
           <w:rFonts w:ascii="Arial" w:hAnsi="Arial" w:eastAsia="Arial" w:cs="Arial"/>
         </w:rPr>
-        <w:t xml:space="preserve"> for a Yarra Ranges three-bedroom house. The apartment exceeds its group's typical AUD 590 revenue, so it is dropped. The house clears its group's typical AUD 890 and advances to negotiation and its own cash-flow plan. At the below-target AUD 600 benchmark, it loses AUD 100 a week, requiring an AUD 5,200 annual buffer. The cash-flow plan must also recover setup costs and deliver the required return.</w:t>
+        <w:t xml:space="preserve"> clears its typical AUD 890; earning like a below-target home (AUD 600), it would lose AUD 100 a week, so the buffer needs AUD 5,200 a year, plus setup costs and the required return.</w:t>
       </w:r>
     </w:p>
     <w:p>
@@ -5305,13 +4810,13 @@
           <w:rFonts w:ascii="Arial" w:hAnsi="Arial" w:eastAsia="Arial" w:cs="Arial"/>
           <w:b/>
         </w:rPr>
-        <w:t>Reviews are not bookings or profit.</w:t>
+        <w:t>Reviews are not bookings, profit or satisfaction.</w:t>
       </w:r>
       <w:r>
         <w:rPr>
           <w:rFonts w:ascii="Arial" w:hAnsi="Arial" w:eastAsia="Arial" w:cs="Arial"/>
         </w:rPr>
-        <w:t xml:space="preserve"> Inside Airbnb's 50% review rate sits within published estimates of 30.5%–72% (Inside Airbnb, n.d.), so dollar figures are rough, and activity fell in the later year (Figure 4).</w:t>
+        <w:t xml:space="preserve"> Inside Airbnb's 50% review rate sits within published estimates of 30.5%–72% (Inside Airbnb, n.d.), so dollar figures are rough; activity also fell in the later year (Figure 5). Ratings are lifetime averages near five stars, and we did not analyse review text.</w:t>
       </w:r>
     </w:p>
     <w:p>
@@ -5332,7 +4837,7 @@
         <w:rPr>
           <w:rFonts w:ascii="Arial" w:hAnsi="Arial" w:eastAsia="Arial" w:cs="Arial"/>
         </w:rPr>
-        <w:t xml:space="preserve"> Homes that left Airbnb are missing, and revenue uses June–July prices. New entrants, unpriced listings and outer areas are not covered.</w:t>
+        <w:t xml:space="preserve"> Homes that left Airbnb are missing, revenue uses June–July prices, and new entrants, unpriced listings and outer areas are not covered.</w:t>
       </w:r>
     </w:p>
     <w:p>
@@ -5353,7 +4858,7 @@
         <w:rPr>
           <w:rFonts w:ascii="Arial" w:hAnsi="Arial" w:eastAsia="Arial" w:cs="Arial"/>
         </w:rPr>
-        <w:t xml:space="preserve"> A one-night minimum allows more stays for the same nights booked, so part of its effect is built into the target; counting each stay as three nights may also overstate these homes' revenue.</w:t>
+        <w:t xml:space="preserve"> A one-night minimum allows more stays for the same nights, so part of its effect is built into the target, and counting each stay as three nights may overstate revenue.</w:t>
       </w:r>
     </w:p>
     <w:p>
@@ -5374,7 +4879,7 @@
         <w:rPr>
           <w:rFonts w:ascii="Arial" w:hAnsi="Arial" w:eastAsia="Arial" w:cs="Arial"/>
         </w:rPr>
-        <w:t xml:space="preserve"> Settings were recorded at collection and may respond to earlier performance. Choosing the one-night input (after seeing no seven-night home reach 30 reviews) and selecting the priority groups on all homes mean the 50 tests may overstate the gain.</w:t>
+        <w:t xml:space="preserve"> Settings may respond to earlier performance, and we chose the inputs, rule and priority groups after seeing all homes, so the tests may overstate the gain.</w:t>
       </w:r>
     </w:p>
     <w:p>
@@ -5408,7 +4913,7 @@
         <w:rPr>
           <w:rFonts w:ascii="Arial" w:hAnsi="Arial" w:eastAsia="Arial" w:cs="Arial"/>
         </w:rPr>
-        <w:t>Next, collect rent and cost quotes for the priority groups, track paid nights and net cash flow to check whether review activity identifies good businesses, and test the unchanged groups, model and selection rule on the next snapshot.</w:t>
+        <w:t>Next, collect rent and cost quotes, track paid nights and net cash flow to test whether review activity identifies good businesses, and recheck the groups, model and two-setting rule on the next snapshot.</w:t>
       </w:r>
     </w:p>
     <w:p>
@@ -5451,7 +4956,7 @@
         </w:rPr>
         <w:t xml:space="preserve">. Retrieved October 16, 2026, from </w:t>
       </w:r>
-      <w:hyperlink r:id="rId25">
+      <w:hyperlink r:id="rId26">
         <w:r>
           <w:rPr>
             <w:rFonts w:ascii="Arial" w:hAnsi="Arial" w:eastAsia="Arial" w:cs="Arial"/>
@@ -5527,7 +5032,7 @@
         </w:rPr>
         <w:t xml:space="preserve">. Retrieved October 16, 2026, from </w:t>
       </w:r>
-      <w:hyperlink r:id="rId26">
+      <w:hyperlink r:id="rId27">
         <w:r>
           <w:rPr>
             <w:rFonts w:ascii="Arial" w:hAnsi="Arial" w:eastAsia="Arial" w:cs="Arial"/>
@@ -5603,7 +5108,7 @@
         </w:rPr>
         <w:t xml:space="preserve"> (Version 4.5.3) [Computer software]. R Foundation for Statistical Computing. </w:t>
       </w:r>
-      <w:hyperlink r:id="rId27">
+      <w:hyperlink r:id="rId28">
         <w:r>
           <w:rPr>
             <w:rFonts w:ascii="Arial" w:hAnsi="Arial" w:eastAsia="Arial" w:cs="Arial"/>
@@ -5641,7 +5146,7 @@
         </w:rPr>
         <w:t xml:space="preserve">. Retrieved October 16, 2026, from </w:t>
       </w:r>
-      <w:hyperlink r:id="rId28">
+      <w:hyperlink r:id="rId29">
         <w:r>
           <w:rPr>
             <w:rFonts w:ascii="Arial" w:hAnsi="Arial" w:eastAsia="Arial" w:cs="Arial"/>
@@ -5725,20 +5230,7 @@
         <w:rPr>
           <w:rFonts w:ascii="Arial" w:hAnsi="Arial" w:eastAsia="Arial" w:cs="Arial"/>
         </w:rPr>
-        <w:t xml:space="preserve">We fitted the model in R (R Core Team, 2026). Group median prices and mode fills for missing minimum stays use training homes only. The group rate is smoothed as </w:t>
-      </w:r>
-      <w:r>
-        <w:rPr>
-          <w:rFonts w:ascii="Arial" w:hAnsi="Arial" w:eastAsia="Arial" w:cs="Arial"/>
-          <w:b w:val="0"/>
-        </w:rPr>
-        <w:t>(group_successes + 10 * overall_rate) / (group_homes + 10)</w:t>
-      </w:r>
-      <w:r>
-        <w:rPr>
-          <w:rFonts w:ascii="Arial" w:hAnsi="Arial" w:eastAsia="Arial" w:cs="Arial"/>
-        </w:rPr>
-        <w:t>. Odds are the chance of being busy divided by the chance of not being busy. Table A1 gives each input's odds ratio from its average coefficient over the 50 fits, and the range across fits; above 1 means a higher chance of being busy, below 1 a lower one.</w:t>
+        <w:t>We fitted the model in R (R Core Team, 2026), with group median prices and fills for missing minimum stays taken from training homes only. Table A1 gives each input's odds ratio (the change in the odds of being busy, from its average weight over the 50 fits) and its range across fits; above 1 means a higher chance, below 1 a lower one.</w:t>
       </w:r>
     </w:p>
     <w:p>
@@ -6672,7 +6164,338 @@
         <w:rPr>
           <w:rFonts w:ascii="Arial" w:hAnsi="Arial" w:eastAsia="Arial" w:cs="Arial"/>
         </w:rPr>
-        <w:t>Across the 50 tests on all 14 groups, the model ranked a random busy home above a random quiet one 71% of the time, against 60% for group rates (AUC 0.71 and 0.60); full evaluation tables are in the repository (Huang &amp; Xu, 2026). Host-clustered standard errors are 1.1–2.6 times ordinary estimates, variance inflation factors sit below 3 (low multicollinearity), and host-adjusted tests find no clear curvature. In the two-year check (Section 5.5), equal host weights within each pool give an 8.7-point later-year gap (112 hosts appear in both pools).</w:t>
+        <w:t>The ranges show stability across fits, not confidence intervals; those including 1 (for example, Yarra Ranges) leave the direction uncertain. Across all 14 groups, the model ranked a random busy home above a random quiet one 71% of the time, against 60% for group rates (AUC 0.71 and 0.60). Host-clustered standard errors are 1.1–2.6 times ordinary ones, and variance inflation factors sit below 3 (little overlap between inputs). An ordinary test suggests slight curvature in amenities (p = 0.03), which is unclear once homes of the same host are treated as related (p = 0.17). Full evaluation tables are in the repository (Huang &amp; Xu, 2026).</w:t>
+      </w:r>
+    </w:p>
+    <w:p>
+      <w:pPr>
+        <w:keepNext/>
+        <w:widowControl/>
+        <w:spacing w:after="80" w:before="80" w:line="259" w:lineRule="auto"/>
+        <w:jc w:val="left"/>
+      </w:pPr>
+      <w:r>
+        <w:rPr>
+          <w:rFonts w:ascii="Arial" w:hAnsi="Arial" w:eastAsia="Arial" w:cs="Arial"/>
+          <w:b/>
+        </w:rPr>
+        <w:t>Table A2. Hits and misses: top quarter picked across all 14 groups</w:t>
+      </w:r>
+    </w:p>
+    <w:tbl>
+      <w:tblPr>
+        <w:tblW w:type="auto" w:w="0"/>
+        <w:tblLook w:firstColumn="1" w:firstRow="1" w:lastColumn="0" w:lastRow="0" w:noHBand="0" w:noVBand="1" w:val="04A0"/>
+        <w:tblBorders>
+          <w:top w:val="single" w:sz="4" w:color="D9D9D9"/>
+          <w:left w:val="single" w:sz="4" w:color="D9D9D9"/>
+          <w:bottom w:val="single" w:sz="4" w:color="D9D9D9"/>
+          <w:right w:val="single" w:sz="4" w:color="D9D9D9"/>
+          <w:insideH w:val="single" w:sz="4" w:color="D9D9D9"/>
+          <w:insideV w:val="single" w:sz="4" w:color="D9D9D9"/>
+        </w:tblBorders>
+        <w:tblCellMar>
+          <w:top w:w="85" w:type="dxa"/>
+          <w:left w:w="85" w:type="dxa"/>
+          <w:bottom w:w="85" w:type="dxa"/>
+          <w:right w:w="85" w:type="dxa"/>
+        </w:tblCellMar>
+        <w:jc w:val="center"/>
+        <w:tblLayout w:type="fixed"/>
+      </w:tblPr>
+      <w:tblGrid>
+        <w:gridCol w:w="4497"/>
+        <w:gridCol w:w="1378"/>
+        <w:gridCol w:w="2067"/>
+        <w:gridCol w:w="1922"/>
+      </w:tblGrid>
+      <w:tr>
+        <w:trPr>
+          <w:cantSplit/>
+          <w:tblHeader/>
+        </w:trPr>
+        <w:tc>
+          <w:tcPr>
+            <w:tcW w:type="dxa" w:w="4497"/>
+            <w:vAlign w:val="center"/>
+            <w:shd w:val="clear" w:color="auto" w:fill="E9EEF3"/>
+          </w:tcPr>
+          <w:p>
+            <w:pPr>
+              <w:keepNext/>
+              <w:spacing w:before="40" w:after="40" w:line="240" w:lineRule="auto"/>
+              <w:jc w:val="left"/>
+            </w:pPr>
+            <w:r>
+              <w:rPr>
+                <w:rFonts w:ascii="Arial" w:hAnsi="Arial" w:eastAsia="Arial" w:cs="Arial"/>
+                <w:b/>
+                <w:sz w:val="21"/>
+              </w:rPr>
+              <w:t>Selection</w:t>
+            </w:r>
+          </w:p>
+        </w:tc>
+        <w:tc>
+          <w:tcPr>
+            <w:tcW w:type="dxa" w:w="1378"/>
+            <w:vAlign w:val="center"/>
+            <w:shd w:val="clear" w:color="auto" w:fill="E9EEF3"/>
+          </w:tcPr>
+          <w:p>
+            <w:pPr>
+              <w:keepNext/>
+              <w:spacing w:before="40" w:after="40" w:line="240" w:lineRule="auto"/>
+              <w:jc w:val="left"/>
+            </w:pPr>
+            <w:r>
+              <w:rPr>
+                <w:rFonts w:ascii="Arial" w:hAnsi="Arial" w:eastAsia="Arial" w:cs="Arial"/>
+                <w:b/>
+                <w:sz w:val="21"/>
+              </w:rPr>
+              <w:t>Busy</w:t>
+            </w:r>
+          </w:p>
+        </w:tc>
+        <w:tc>
+          <w:tcPr>
+            <w:tcW w:type="dxa" w:w="2067"/>
+            <w:vAlign w:val="center"/>
+            <w:shd w:val="clear" w:color="auto" w:fill="E9EEF3"/>
+          </w:tcPr>
+          <w:p>
+            <w:pPr>
+              <w:keepNext/>
+              <w:spacing w:before="40" w:after="40" w:line="240" w:lineRule="auto"/>
+              <w:jc w:val="left"/>
+            </w:pPr>
+            <w:r>
+              <w:rPr>
+                <w:rFonts w:ascii="Arial" w:hAnsi="Arial" w:eastAsia="Arial" w:cs="Arial"/>
+                <w:b/>
+                <w:sz w:val="21"/>
+              </w:rPr>
+              <w:t>Below target</w:t>
+            </w:r>
+          </w:p>
+        </w:tc>
+        <w:tc>
+          <w:tcPr>
+            <w:tcW w:type="dxa" w:w="1922"/>
+            <w:vAlign w:val="center"/>
+            <w:shd w:val="clear" w:color="auto" w:fill="E9EEF3"/>
+          </w:tcPr>
+          <w:p>
+            <w:pPr>
+              <w:keepNext/>
+              <w:spacing w:before="40" w:after="40" w:line="240" w:lineRule="auto"/>
+              <w:jc w:val="left"/>
+            </w:pPr>
+            <w:r>
+              <w:rPr>
+                <w:rFonts w:ascii="Arial" w:hAnsi="Arial" w:eastAsia="Arial" w:cs="Arial"/>
+                <w:b/>
+                <w:sz w:val="21"/>
+              </w:rPr>
+              <w:t>Total</w:t>
+            </w:r>
+          </w:p>
+        </w:tc>
+      </w:tr>
+      <w:tr>
+        <w:trPr>
+          <w:cantSplit/>
+        </w:trPr>
+        <w:tc>
+          <w:tcPr>
+            <w:tcW w:type="dxa" w:w="4497"/>
+            <w:vAlign w:val="center"/>
+            <w:shd w:val="clear" w:color="auto" w:fill="FFFFFF"/>
+          </w:tcPr>
+          <w:p>
+            <w:pPr>
+              <w:keepNext/>
+              <w:spacing w:before="40" w:after="40" w:line="240" w:lineRule="auto"/>
+              <w:jc w:val="left"/>
+            </w:pPr>
+            <w:r>
+              <w:rPr>
+                <w:rFonts w:ascii="Arial" w:hAnsi="Arial" w:eastAsia="Arial" w:cs="Arial"/>
+                <w:sz w:val="21"/>
+              </w:rPr>
+              <w:t>Picked by model</w:t>
+            </w:r>
+          </w:p>
+        </w:tc>
+        <w:tc>
+          <w:tcPr>
+            <w:tcW w:type="dxa" w:w="1378"/>
+            <w:vAlign w:val="center"/>
+            <w:shd w:val="clear" w:color="auto" w:fill="FFFFFF"/>
+          </w:tcPr>
+          <w:p>
+            <w:pPr>
+              <w:keepNext/>
+              <w:spacing w:before="40" w:after="40" w:line="240" w:lineRule="auto"/>
+              <w:jc w:val="right"/>
+            </w:pPr>
+            <w:r>
+              <w:rPr>
+                <w:rFonts w:ascii="Arial" w:hAnsi="Arial" w:eastAsia="Arial" w:cs="Arial"/>
+                <w:sz w:val="21"/>
+              </w:rPr>
+              <w:t>423</w:t>
+            </w:r>
+          </w:p>
+        </w:tc>
+        <w:tc>
+          <w:tcPr>
+            <w:tcW w:type="dxa" w:w="2067"/>
+            <w:vAlign w:val="center"/>
+            <w:shd w:val="clear" w:color="auto" w:fill="FFFFFF"/>
+          </w:tcPr>
+          <w:p>
+            <w:pPr>
+              <w:keepNext/>
+              <w:spacing w:before="40" w:after="40" w:line="240" w:lineRule="auto"/>
+              <w:jc w:val="right"/>
+            </w:pPr>
+            <w:r>
+              <w:rPr>
+                <w:rFonts w:ascii="Arial" w:hAnsi="Arial" w:eastAsia="Arial" w:cs="Arial"/>
+                <w:sz w:val="21"/>
+              </w:rPr>
+              <w:t>546</w:t>
+            </w:r>
+          </w:p>
+        </w:tc>
+        <w:tc>
+          <w:tcPr>
+            <w:tcW w:type="dxa" w:w="1922"/>
+            <w:vAlign w:val="center"/>
+            <w:shd w:val="clear" w:color="auto" w:fill="FFFFFF"/>
+          </w:tcPr>
+          <w:p>
+            <w:pPr>
+              <w:keepNext/>
+              <w:spacing w:before="40" w:after="40" w:line="240" w:lineRule="auto"/>
+              <w:jc w:val="right"/>
+            </w:pPr>
+            <w:r>
+              <w:rPr>
+                <w:rFonts w:ascii="Arial" w:hAnsi="Arial" w:eastAsia="Arial" w:cs="Arial"/>
+                <w:sz w:val="21"/>
+              </w:rPr>
+              <w:t>969</w:t>
+            </w:r>
+          </w:p>
+        </w:tc>
+      </w:tr>
+      <w:tr>
+        <w:trPr>
+          <w:cantSplit/>
+        </w:trPr>
+        <w:tc>
+          <w:tcPr>
+            <w:tcW w:type="dxa" w:w="4497"/>
+            <w:vAlign w:val="center"/>
+            <w:shd w:val="clear" w:color="auto" w:fill="FFFFFF"/>
+          </w:tcPr>
+          <w:p>
+            <w:pPr>
+              <w:spacing w:before="40" w:after="40" w:line="240" w:lineRule="auto"/>
+              <w:jc w:val="left"/>
+            </w:pPr>
+            <w:r>
+              <w:rPr>
+                <w:rFonts w:ascii="Arial" w:hAnsi="Arial" w:eastAsia="Arial" w:cs="Arial"/>
+                <w:sz w:val="21"/>
+              </w:rPr>
+              <w:t>Not picked</w:t>
+            </w:r>
+          </w:p>
+        </w:tc>
+        <w:tc>
+          <w:tcPr>
+            <w:tcW w:type="dxa" w:w="1378"/>
+            <w:vAlign w:val="center"/>
+            <w:shd w:val="clear" w:color="auto" w:fill="FFFFFF"/>
+          </w:tcPr>
+          <w:p>
+            <w:pPr>
+              <w:spacing w:before="40" w:after="40" w:line="240" w:lineRule="auto"/>
+              <w:jc w:val="right"/>
+            </w:pPr>
+            <w:r>
+              <w:rPr>
+                <w:rFonts w:ascii="Arial" w:hAnsi="Arial" w:eastAsia="Arial" w:cs="Arial"/>
+                <w:sz w:val="21"/>
+              </w:rPr>
+              <w:t>558</w:t>
+            </w:r>
+          </w:p>
+        </w:tc>
+        <w:tc>
+          <w:tcPr>
+            <w:tcW w:type="dxa" w:w="2067"/>
+            <w:vAlign w:val="center"/>
+            <w:shd w:val="clear" w:color="auto" w:fill="FFFFFF"/>
+          </w:tcPr>
+          <w:p>
+            <w:pPr>
+              <w:spacing w:before="40" w:after="40" w:line="240" w:lineRule="auto"/>
+              <w:jc w:val="right"/>
+            </w:pPr>
+            <w:r>
+              <w:rPr>
+                <w:rFonts w:ascii="Arial" w:hAnsi="Arial" w:eastAsia="Arial" w:cs="Arial"/>
+                <w:sz w:val="21"/>
+              </w:rPr>
+              <w:t>2,346</w:t>
+            </w:r>
+          </w:p>
+        </w:tc>
+        <w:tc>
+          <w:tcPr>
+            <w:tcW w:type="dxa" w:w="1922"/>
+            <w:vAlign w:val="center"/>
+            <w:shd w:val="clear" w:color="auto" w:fill="FFFFFF"/>
+          </w:tcPr>
+          <w:p>
+            <w:pPr>
+              <w:spacing w:before="40" w:after="40" w:line="240" w:lineRule="auto"/>
+              <w:jc w:val="right"/>
+            </w:pPr>
+            <w:r>
+              <w:rPr>
+                <w:rFonts w:ascii="Arial" w:hAnsi="Arial" w:eastAsia="Arial" w:cs="Arial"/>
+                <w:sz w:val="21"/>
+              </w:rPr>
+              <w:t>2,904</w:t>
+            </w:r>
+          </w:p>
+        </w:tc>
+      </w:tr>
+    </w:tbl>
+    <w:p>
+      <w:pPr>
+        <w:widowControl/>
+        <w:spacing w:after="80" w:line="240" w:lineRule="auto"/>
+        <w:jc w:val="left"/>
+      </w:pPr>
+    </w:p>
+    <w:p>
+      <w:pPr>
+        <w:widowControl/>
+        <w:spacing w:after="120" w:line="259" w:lineRule="auto"/>
+        <w:jc w:val="left"/>
+      </w:pPr>
+      <w:r>
+        <w:rPr>
+          <w:rFonts w:ascii="Arial" w:hAnsi="Arial" w:eastAsia="Arial" w:cs="Arial"/>
+        </w:rPr>
+        <w:t>Each home was scored by a model built without its host (five folds of hosts). Of the 969 picked, 43.7% were busy (precision), against 25.3% overall, and they included 43.1% of busy homes (recall). Accuracy (71.5%) misleads: calling every home "below target" scores 74.7%.</w:t>
       </w:r>
     </w:p>
     <w:sectPr>

</xml_diff>

<commit_message>
Tighten claims after a five-lens review of the report
Key findings no longer imply City two-bedroom apartments lead on revenue,
and state that only the model was tested on unseen hosts. Objective 2 now
says the model separates settings from location. Star ratings are named as
the sentiment check, with a caveat for homes with few reviews. Plainer
wording for the busy definition, assumptions, odds and margins of error;
the curvature p-values are attributed correctly. Word count 2,980.
</commit_message>
<xml_diff>
--- a/final-report/report-2026-10-04/Final_Report.docx
+++ b/final-report/report-2026-10-04/Final_Report.docx
@@ -107,7 +107,7 @@
         <w:rPr>
           <w:rFonts w:ascii="Arial" w:hAnsi="Arial" w:eastAsia="Arial" w:cs="Arial"/>
         </w:rPr>
-        <w:t>We recommend City of Melbourne two- and three-bedroom apartments first, then Yarra Ranges three-bedroom houses and townhouses. These groups had the highest shares of homes with strong guest activity, and their typical homes earned an estimated AUD 30,600–48,600 a year before costs, against AUD 24,700 across the study.</w:t>
+        <w:t>We recommend City of Melbourne two- and three-bedroom apartments first, then Yarra Ranges three-bedroom houses and townhouses. These groups had the highest shares of busy homes (30+ reviews a year, about 180+ booked nights) and typical estimated revenue of AUD 30,600–48,600 a year before costs, against AUD 24,700 overall.</w:t>
       </w:r>
     </w:p>
     <w:p>
@@ -120,7 +120,7 @@
         <w:rPr>
           <w:rFonts w:ascii="Arial" w:hAnsi="Arial" w:eastAsia="Arial" w:cs="Arial"/>
         </w:rPr>
-        <w:t>Within these groups, homes that accepted one-night stays and were priced at or below similar homes were busy half the time (50.4%), against one in three at random (32.4%). Section 6 turns this into a search order, a checklist and a cost test.</w:t>
+        <w:t>Within these groups, half of the homes that accepted one-night stays and were priced at or below similar homes were busy (50.4%), against a third of all their homes (33.4%). Section 6 turns this into a search order, a checklist and a cost test.</w:t>
       </w:r>
     </w:p>
     <w:p>
@@ -201,7 +201,7 @@
         <w:rPr>
           <w:rFonts w:ascii="Arial" w:hAnsi="Arial" w:eastAsia="Arial" w:cs="Arial"/>
         </w:rPr>
-        <w:t>Identify which home settings go with strong activity, and test whether they pick better homes within the leading groups than random picking.</w:t>
+        <w:t>Identify which home settings go with strong activity, and whether they help pick homes within the leading groups.</w:t>
       </w:r>
     </w:p>
     <w:p>
@@ -235,7 +235,7 @@
         <w:rPr>
           <w:rFonts w:ascii="Arial" w:hAnsi="Arial" w:eastAsia="Arial" w:cs="Arial"/>
         </w:rPr>
-        <w:t>Objective 1 needs only a simple summary by group (Section 5.2). Objective 2 needs a model, because a group summary gives every home in a group the same rate.</w:t>
+        <w:t>Objective 1 needs only a simple summary by group (Section 5.2). Objective 2 uses a model to separate settings from location, then tests a simpler two-setting rule.</w:t>
       </w:r>
     </w:p>
     <w:p>
@@ -274,7 +274,7 @@
         <w:rPr>
           <w:rFonts w:ascii="Arial" w:hAnsi="Arial" w:eastAsia="Arial" w:cs="Arial"/>
         </w:rPr>
-        <w:t xml:space="preserve"> (reaches our target) when it receives at least 30 guest reviews in the year before data collection, a level reached by a quarter of separate reference homes (Section 3). Inside Airbnb (n.d.) assumes half of stays are reviewed and each lasts three nights (or the minimum stay if longer), capping estimated nights at 255 a year, so 30 reviews means about 180 booked nights.</w:t>
+        <w:t xml:space="preserve"> (reaches our target) when it receives at least 30 guest reviews in the year before data collection, a level reached by a quarter of set-aside reference homes (Section 3). Inside Airbnb (n.d.) assumes half of stays are reviewed and each lasts three nights (or the minimum stay if longer). Estimated nights are capped at 255 a year; 30 reviews means about 180 booked nights.</w:t>
       </w:r>
     </w:p>
     <w:p>
@@ -294,7 +294,7 @@
         <w:rPr>
           <w:rFonts w:ascii="Arial" w:hAnsi="Arial" w:eastAsia="Arial" w:cs="Arial"/>
         </w:rPr>
-        <w:t xml:space="preserve"> Guests review only after a stay, so reviews track completed bookings, a guide to demand and occupancy; this matters because empty nights are the operator's main risk. Reviews do not show profit (rents and costs are outside our data) or satisfaction (reviews can be negative), so we convert them into nights and revenue and check ratings (Section 5.1). We do not rank on revenue: Inside Airbnb estimates it from reviews and advertised prices, and without rents a higher price is not a better lease.</w:t>
+        <w:t xml:space="preserve"> Guests review only after a stay, so reviews track completed bookings, a guide to demand and occupancy; this matters because empty nights are the operator's main risk. Review counts show neither profit (rents and costs are unknown) nor satisfaction (reviews can be negative), so we convert them into nights and revenue and check sentiment through star ratings (Section 5.1). We do not rank on revenue: Inside Airbnb estimates it from reviews and advertised prices, and without rents a higher price is not a better lease.</w:t>
       </w:r>
     </w:p>
     <w:p>
@@ -871,7 +871,7 @@
         <w:rPr>
           <w:rFonts w:ascii="Arial" w:hAnsi="Arial" w:eastAsia="Arial" w:cs="Arial"/>
         </w:rPr>
-        <w:t xml:space="preserve"> We compare the share of busy homes in the 14 groups; redrawing hosts at random 1,000 times shows how much each share could move by chance (middle 90% of results).</w:t>
+        <w:t xml:space="preserve"> We compare the share of busy homes in the 14 groups; redrawing hosts at random 1,000 times shows how much each share could move by chance.</w:t>
       </w:r>
     </w:p>
     <w:p>
@@ -1422,7 +1422,7 @@
         <w:rPr>
           <w:rFonts w:ascii="Arial" w:hAnsi="Arial" w:eastAsia="Arial" w:cs="Arial"/>
         </w:rPr>
-        <w:t xml:space="preserve"> Homes of the same host can perform alike, so they stay together in every test. Each 10% price step and ten extra amenities have a fixed effect on the score; Appendix A checks overlap between inputs and curved relationships.</w:t>
+        <w:t xml:space="preserve"> Homes of the same host can perform alike, so they stay together in every test. Each 10% price step, or ten more amenities, has the same effect wherever it occurs; Appendix A finds little overlap between inputs and only weak signs of curvature.</w:t>
       </w:r>
     </w:p>
     <w:p>
@@ -1443,26 +1443,6 @@
           <w:rFonts w:ascii="Arial" w:hAnsi="Arial" w:eastAsia="Arial" w:cs="Arial"/>
         </w:rPr>
         <w:t xml:space="preserve"> Each of 50 tests builds the model on 70% of hosts and scores the other 30%. In each priority group, each method picks a quarter of these homes, and we compare the share that were busy.</w:t>
-      </w:r>
-    </w:p>
-    <w:p>
-      <w:pPr>
-        <w:widowControl/>
-        <w:spacing w:after="120" w:line="259" w:lineRule="auto"/>
-        <w:jc w:val="left"/>
-      </w:pPr>
-      <w:r>
-        <w:rPr>
-          <w:rFonts w:ascii="Arial" w:hAnsi="Arial" w:eastAsia="Arial" w:cs="Arial"/>
-          <w:b/>
-        </w:rPr>
-        <w:t>Two-year check.</w:t>
-      </w:r>
-      <w:r>
-        <w:rPr>
-          <w:rFonts w:ascii="Arial" w:hAnsi="Arial" w:eastAsia="Arial" w:cs="Arial"/>
-        </w:rPr>
-        <w:t xml:space="preserve"> We rank groups on an earlier year and follow the top three into the next (Section 5.4).</w:t>
       </w:r>
     </w:p>
     <w:p>
@@ -2425,7 +2405,7 @@
         <w:rPr>
           <w:rFonts w:ascii="Arial" w:hAnsi="Arial" w:eastAsia="Arial" w:cs="Arial"/>
         </w:rPr>
-        <w:t>Busy homes were slightly cheaper but far more often accepted one-night stays and sat in the City of Melbourne (Table 3); their revenue estimate is higher partly because it is calculated from reviews. They were also better rated: only 1.1% averaged below 4.5 stars, against 15.2% of the rest, a gap that holds in each priority group (Huang &amp; Xu, 2026). High activity comes with satisfied guests, not complaints.</w:t>
+        <w:t>Busy homes were slightly cheaper but far more often accepted one-night stays and sat in the City of Melbourne (Table 3); their higher revenue estimate comes from their review counts, not higher prices. They were also better rated: only 1.1% averaged below 4.5 stars, against 15.2% of the rest, though averages over few reviews vary more (Huang &amp; Xu, 2026). So high review counts do not appear to reflect unhappy guests.</w:t>
       </w:r>
     </w:p>
     <w:p>
@@ -3337,7 +3317,7 @@
         <w:rPr>
           <w:rFonts w:ascii="Arial" w:hAnsi="Arial" w:eastAsia="Arial" w:cs="Arial"/>
         </w:rPr>
-        <w:t>The same three groups lead without the price or review-history rule (Huang &amp; Xu, 2026). The City groups stayed in the top three in 94% and 90% of 1,000 host redraws and Yarra Ranges houses in 64%, a less certain second option.</w:t>
+        <w:t>The same three groups lead without the price limits or one-year review rule (Huang &amp; Xu, 2026). In 1,000 host redraws, the City groups stayed in the top three in 94% and 90% of them, and Yarra Ranges houses in only 64%.</w:t>
       </w:r>
     </w:p>
     <w:p>
@@ -3369,7 +3349,7 @@
         <w:rPr>
           <w:rFonts w:ascii="Arial" w:hAnsi="Arial" w:eastAsia="Arial" w:cs="Arial"/>
         </w:rPr>
-        <w:t>5.3 Predictive analysis: what goes with being busy, and does it help pick homes?</w:t>
+        <w:t>5.3 Predictive analysis: one-night stays and price go with busy homes</w:t>
       </w:r>
     </w:p>
     <w:p>
@@ -3494,7 +3474,7 @@
         <w:rPr>
           <w:rFonts w:ascii="Arial" w:hAnsi="Arial" w:eastAsia="Arial" w:cs="Arial"/>
         </w:rPr>
-        <w:t xml:space="preserve"> Model-estimated chance that a typical City two-bedroom apartment is busy when one input changes, with 95% ranges.</w:t>
+        <w:t xml:space="preserve"> Model-estimated chance that a typical City two-bedroom apartment is busy when one input changes, with 95% confidence intervals.</w:t>
       </w:r>
     </w:p>
     <w:p>
@@ -3507,7 +3487,7 @@
         <w:rPr>
           <w:rFonts w:ascii="Arial" w:hAnsi="Arial" w:eastAsia="Arial" w:cs="Arial"/>
         </w:rPr>
-        <w:t xml:space="preserve">A simple two-setting rule captures most of this (Table 5): in the priority groups, homes that accepted one-night stays and were priced at or below their group median were busy </w:t>
+        <w:t xml:space="preserve">A simple two-setting rule captures most of this (Table 5). In the priority groups, </w:t>
       </w:r>
       <w:r>
         <w:rPr>
@@ -3520,7 +3500,20 @@
         <w:rPr>
           <w:rFonts w:ascii="Arial" w:hAnsi="Arial" w:eastAsia="Arial" w:cs="Arial"/>
         </w:rPr>
-        <w:t xml:space="preserve"> of the time, and homes with neither </w:t>
+        <w:t xml:space="preserve"> of homes that accepted one-night stays and were priced at or below their group median were busy, against </w:t>
+      </w:r>
+      <w:r>
+        <w:rPr>
+          <w:rFonts w:ascii="Arial" w:hAnsi="Arial" w:eastAsia="Arial" w:cs="Arial"/>
+          <w:b/>
+        </w:rPr>
+        <w:t>33.4%</w:t>
+      </w:r>
+      <w:r>
+        <w:rPr>
+          <w:rFonts w:ascii="Arial" w:hAnsi="Arial" w:eastAsia="Arial" w:cs="Arial"/>
+        </w:rPr>
+        <w:t xml:space="preserve"> of all their homes and </w:t>
       </w:r>
       <w:r>
         <w:rPr>
@@ -3533,7 +3526,7 @@
         <w:rPr>
           <w:rFonts w:ascii="Arial" w:hAnsi="Arial" w:eastAsia="Arial" w:cs="Arial"/>
         </w:rPr>
-        <w:t>.</w:t>
+        <w:t xml:space="preserve"> of homes with neither. Only 20 of 90 Yarra Ranges houses accept one-night stays, so the rule rests mainly on City apartments.</w:t>
       </w:r>
     </w:p>
     <w:p>
@@ -3800,7 +3793,7 @@
         <w:rPr>
           <w:rFonts w:ascii="Arial" w:hAnsi="Arial" w:eastAsia="Arial" w:cs="Arial"/>
         </w:rPr>
-        <w:t xml:space="preserve">Tested on unseen hosts, the model's top quarter of each priority group was busy </w:t>
+        <w:t xml:space="preserve">Tested on unseen hosts, </w:t>
       </w:r>
       <w:r>
         <w:rPr>
@@ -3813,7 +3806,7 @@
         <w:rPr>
           <w:rFonts w:ascii="Arial" w:hAnsi="Arial" w:eastAsia="Arial" w:cs="Arial"/>
         </w:rPr>
-        <w:t xml:space="preserve"> of the time, against </w:t>
+        <w:t xml:space="preserve"> of the model's top quarter in each priority group were busy, against </w:t>
       </w:r>
       <w:r>
         <w:rPr>
@@ -3839,7 +3832,7 @@
         <w:rPr>
           <w:rFonts w:ascii="Arial" w:hAnsi="Arial" w:eastAsia="Arial" w:cs="Arial"/>
         </w:rPr>
-        <w:t xml:space="preserve"> at random (Figure 4), winning 46 of 50 tests. The two-setting rule does about as well: it picks 28% of homes, and 50.4% of them were busy, though it was checked on the homes that suggested it. The model's value is in showing which settings matter; Table A2 gives its hits and misses.</w:t>
+        <w:t xml:space="preserve"> for random picking (Figure 4); the model beat random picking in 46 of 50 tests. The two-setting rule does about as well (it picks 28% of homes), though it was checked on the homes that suggested it. The model also separates location from settings: with the same settings, the typical apartment's 42% chance would be 26–27% in Port Phillip or Stonnington (Figure 3). Table A2 gives its hits and misses across all 14 groups.</w:t>
       </w:r>
     </w:p>
     <w:p>
@@ -3924,7 +3917,7 @@
         <w:rPr>
           <w:rFonts w:ascii="Arial" w:hAnsi="Arial" w:eastAsia="Arial" w:cs="Arial"/>
         </w:rPr>
-        <w:t>For 2,657 homes with two years of reviews in ten groups, the earlier year's top three were the same priority groups: 33.6% of their homes reached that year's reference level of 34 reviews, against 19.9% elsewhere (Figure 5). A year later they still led (</w:t>
+        <w:t>We ranked ten groups (2,657 homes with two years' history) on the earlier year. The priority groups came top: 33.6% of their homes reached 34 reviews (the earlier year's reference level), against 19.9% elsewhere (Figure 5). A year later they still led (</w:t>
       </w:r>
       <w:r>
         <w:rPr>
@@ -3937,7 +3930,7 @@
         <w:rPr>
           <w:rFonts w:ascii="Arial" w:hAnsi="Arial" w:eastAsia="Arial" w:cs="Arial"/>
         </w:rPr>
-        <w:t>) and remained the top three, although Yarra Ranges houses fell to 21.4%. With hosts weighted equally, the later-year lead is 8.7 points.</w:t>
+        <w:t>) and remained the top three, although Yarra Ranges houses fell to 21.4%.</w:t>
       </w:r>
     </w:p>
     <w:p>
@@ -4050,7 +4043,7 @@
         <w:rPr>
           <w:rFonts w:ascii="Arial" w:hAnsi="Arial" w:eastAsia="Arial" w:cs="Arial"/>
         </w:rPr>
-        <w:t xml:space="preserve"> City of Melbourne two- and three-bedroom apartments led on busy homes and above-median revenue, followed less certainly by Yarra Ranges three-bedroom houses; all three stayed ahead a year later (Figures 2 and 5, Table 4).</w:t>
+        <w:t xml:space="preserve"> City of Melbourne two- and three-bedroom apartments led on busy homes, then Yarra Ranges three-bedroom houses, less certainly; all three stayed ahead a year later and had above-median revenue (Figures 2 and 5, Table 4).</w:t>
       </w:r>
     </w:p>
     <w:p>
@@ -4078,7 +4071,7 @@
         <w:rPr>
           <w:rFonts w:ascii="Arial" w:hAnsi="Arial" w:eastAsia="Arial" w:cs="Arial"/>
         </w:rPr>
-        <w:t xml:space="preserve"> One-night stays and a price at or below similar homes. In the priority groups, 50.4% of homes with both were busy, against 9.3% with neither (Table 5, Figure 3), though part of the one-night effect is built into the review count. Busy homes were also better rated (Table 3).</w:t>
+        <w:t xml:space="preserve"> One-night stays, a price at or below similar homes and, with other inputs fixed, more amenities (Figure 3). In the priority groups, 50.4% of homes with the first two were busy, against 9.3% with neither (Table 5), though one-night stays partly inflate review counts. Busy homes were also better rated (Table 3).</w:t>
       </w:r>
     </w:p>
     <w:p>
@@ -4106,7 +4099,7 @@
         <w:rPr>
           <w:rFonts w:ascii="Arial" w:hAnsi="Arial" w:eastAsia="Arial" w:cs="Arial"/>
         </w:rPr>
-        <w:t xml:space="preserve"> These two settings pick busy homes about as well as the model: one in two, against one in three at random (Figure 4).</w:t>
+        <w:t xml:space="preserve"> These two settings found 50.4% busy, near the model's 49.6%, though only the model was tested on unseen hosts; random picking found 32.4% (Table 5, Figure 4).</w:t>
       </w:r>
     </w:p>
     <w:p>
@@ -4174,7 +4167,7 @@
         <w:rPr>
           <w:rFonts w:ascii="Arial" w:hAnsi="Arial" w:eastAsia="Arial" w:cs="Arial"/>
         </w:rPr>
-        <w:t xml:space="preserve"> (Table 5, Figure 3). At inspection, check that building rules allow one-night stays and that this price covers costs (Recommendation 3); then run the home this way (Table 6).</w:t>
+        <w:t xml:space="preserve"> (Table 5, Figure 3). At inspection, check that building rules allow one-night stays and that this price covers costs (Recommendation 3); then trial these settings and track results (Table 6).</w:t>
       </w:r>
     </w:p>
     <w:p>
@@ -4202,7 +4195,7 @@
         <w:rPr>
           <w:rFonts w:ascii="Arial" w:hAnsi="Arial" w:eastAsia="Arial" w:cs="Arial"/>
         </w:rPr>
-        <w:t xml:space="preserve"> (Figure 6). Typical weekly revenue (all-home medians) is </w:t>
+        <w:t xml:space="preserve"> (Figure 6). Typical weekly revenue is </w:t>
       </w:r>
       <w:r>
         <w:rPr>
@@ -4241,7 +4234,7 @@
         <w:rPr>
           <w:rFonts w:ascii="Arial" w:hAnsi="Arial" w:eastAsia="Arial" w:cs="Arial"/>
         </w:rPr>
-        <w:t xml:space="preserve"> for Yarra Ranges houses; below-target medians are </w:t>
+        <w:t xml:space="preserve"> for Yarra Ranges houses, but </w:t>
       </w:r>
       <w:r>
         <w:rPr>
@@ -4254,7 +4247,7 @@
         <w:rPr>
           <w:rFonts w:ascii="Arial" w:hAnsi="Arial" w:eastAsia="Arial" w:cs="Arial"/>
         </w:rPr>
-        <w:t>. Only about half of a group's homes covered a cost equal to its typical figure. Drop candidates costing more than typical revenue, assess the rest through their own cash-flow plans, and budget for a year of the below-target shortfall.</w:t>
+        <w:t xml:space="preserve"> for homes below target (under 30 reviews). Because these are medians, only half of a group's homes covered a cost equal to its typical figure. Drop candidates costing more than typical revenue, assess the rest through their own cash-flow plans, and budget for a year of the below-target shortfall.</w:t>
       </w:r>
     </w:p>
     <w:p>
@@ -4295,8 +4288,8 @@
       </w:tblPr>
       <w:tblGrid>
         <w:gridCol w:w="1949"/>
-        <w:gridCol w:w="4366"/>
-        <w:gridCol w:w="3549"/>
+        <w:gridCol w:w="4736"/>
+        <w:gridCol w:w="3180"/>
       </w:tblGrid>
       <w:tr>
         <w:trPr>
@@ -4327,7 +4320,7 @@
         </w:tc>
         <w:tc>
           <w:tcPr>
-            <w:tcW w:type="dxa" w:w="4366"/>
+            <w:tcW w:type="dxa" w:w="4736"/>
             <w:vAlign w:val="center"/>
             <w:shd w:val="clear" w:color="auto" w:fill="E9EEF3"/>
           </w:tcPr>
@@ -4349,7 +4342,7 @@
         </w:tc>
         <w:tc>
           <w:tcPr>
-            <w:tcW w:type="dxa" w:w="3549"/>
+            <w:tcW w:type="dxa" w:w="3180"/>
             <w:vAlign w:val="center"/>
             <w:shd w:val="clear" w:color="auto" w:fill="E9EEF3"/>
           </w:tcPr>
@@ -4405,7 +4398,7 @@
         </w:tc>
         <w:tc>
           <w:tcPr>
-            <w:tcW w:type="dxa" w:w="4366"/>
+            <w:tcW w:type="dxa" w:w="4736"/>
             <w:vAlign w:val="center"/>
             <w:shd w:val="clear" w:color="auto" w:fill="FFFFFF"/>
           </w:tcPr>
@@ -4426,7 +4419,7 @@
         </w:tc>
         <w:tc>
           <w:tcPr>
-            <w:tcW w:type="dxa" w:w="3549"/>
+            <w:tcW w:type="dxa" w:w="3180"/>
             <w:vAlign w:val="center"/>
             <w:shd w:val="clear" w:color="auto" w:fill="FFFFFF"/>
           </w:tcPr>
@@ -4481,7 +4474,7 @@
         </w:tc>
         <w:tc>
           <w:tcPr>
-            <w:tcW w:type="dxa" w:w="4366"/>
+            <w:tcW w:type="dxa" w:w="4736"/>
             <w:vAlign w:val="center"/>
             <w:shd w:val="clear" w:color="auto" w:fill="FFFFFF"/>
           </w:tcPr>
@@ -4502,7 +4495,7 @@
         </w:tc>
         <w:tc>
           <w:tcPr>
-            <w:tcW w:type="dxa" w:w="3549"/>
+            <w:tcW w:type="dxa" w:w="3180"/>
             <w:vAlign w:val="center"/>
             <w:shd w:val="clear" w:color="auto" w:fill="FFFFFF"/>
           </w:tcPr>
@@ -4557,7 +4550,7 @@
         </w:tc>
         <w:tc>
           <w:tcPr>
-            <w:tcW w:type="dxa" w:w="4366"/>
+            <w:tcW w:type="dxa" w:w="4736"/>
             <w:vAlign w:val="center"/>
             <w:shd w:val="clear" w:color="auto" w:fill="FFFFFF"/>
           </w:tcPr>
@@ -4572,13 +4565,13 @@
                 <w:rFonts w:ascii="Arial" w:hAnsi="Arial" w:eastAsia="Arial" w:cs="Arial"/>
                 <w:sz w:val="21"/>
               </w:rPr>
-              <w:t>Cash-flow plan: quotes and Victoria's 7.5% short-stay levy (State Revenue Office Victoria, n.d.) against typical and below-target revenue (Figure 6)</w:t>
+              <w:t>Cash-flow plan: quotes and Victoria's 7.5% short-stay levy (State Revenue Office Victoria, n.d.) against typical and below-target revenue (Recommendation 3)</w:t>
             </w:r>
           </w:p>
         </w:tc>
         <w:tc>
           <w:tcPr>
-            <w:tcW w:type="dxa" w:w="3549"/>
+            <w:tcW w:type="dxa" w:w="3180"/>
             <w:vAlign w:val="center"/>
             <w:shd w:val="clear" w:color="auto" w:fill="FFFFFF"/>
           </w:tcPr>
@@ -4593,7 +4586,7 @@
                 <w:rFonts w:ascii="Arial" w:hAnsi="Arial" w:eastAsia="Arial" w:cs="Arial"/>
                 <w:sz w:val="21"/>
               </w:rPr>
-              <w:t>Sign only if the plan covers setup costs and required return, and the buffer covers a year of below-target loss</w:t>
+              <w:t>Sign only if the plan covers setup costs, required return and a year of below-target loss</w:t>
             </w:r>
           </w:p>
         </w:tc>
@@ -4632,7 +4625,7 @@
         </w:tc>
         <w:tc>
           <w:tcPr>
-            <w:tcW w:type="dxa" w:w="4366"/>
+            <w:tcW w:type="dxa" w:w="4736"/>
             <w:vAlign w:val="center"/>
             <w:shd w:val="clear" w:color="auto" w:fill="FFFFFF"/>
           </w:tcPr>
@@ -4652,7 +4645,7 @@
         </w:tc>
         <w:tc>
           <w:tcPr>
-            <w:tcW w:type="dxa" w:w="3549"/>
+            <w:tcW w:type="dxa" w:w="3180"/>
             <w:vAlign w:val="center"/>
             <w:shd w:val="clear" w:color="auto" w:fill="FFFFFF"/>
           </w:tcPr>
@@ -4782,7 +4775,7 @@
         <w:rPr>
           <w:rFonts w:ascii="Arial" w:hAnsi="Arial" w:eastAsia="Arial" w:cs="Arial"/>
         </w:rPr>
-        <w:t xml:space="preserve"> clears its typical AUD 890; earning like a below-target home (AUD 600), it would lose AUD 100 a week, so the buffer needs AUD 5,200 a year, plus setup costs and the required return.</w:t>
+        <w:t xml:space="preserve"> clears its typical AUD 890; earning like a below-target home (AUD 600), it would lose AUD 100 a week, so the buffer needs AUD 5,200 a year.</w:t>
       </w:r>
     </w:p>
     <w:p>
@@ -4816,7 +4809,7 @@
         <w:rPr>
           <w:rFonts w:ascii="Arial" w:hAnsi="Arial" w:eastAsia="Arial" w:cs="Arial"/>
         </w:rPr>
-        <w:t xml:space="preserve"> Inside Airbnb's 50% review rate sits within published estimates of 30.5%–72% (Inside Airbnb, n.d.), so dollar figures are rough; activity also fell in the later year (Figure 5). Ratings are lifetime averages near five stars, and we did not analyse review text.</w:t>
+        <w:t xml:space="preserve"> Inside Airbnb's 50% review rate sits within published estimates of 30.5%–72% (Inside Airbnb, n.d.), so dollar figures are rough; activity also fell in the later year (Figure 5). Ratings are lifetime averages near five stars.</w:t>
       </w:r>
     </w:p>
     <w:p>
@@ -4837,7 +4830,7 @@
         <w:rPr>
           <w:rFonts w:ascii="Arial" w:hAnsi="Arial" w:eastAsia="Arial" w:cs="Arial"/>
         </w:rPr>
-        <w:t xml:space="preserve"> Homes that left Airbnb are missing, revenue uses June–July prices, and new entrants, unpriced listings and outer areas are not covered.</w:t>
+        <w:t xml:space="preserve"> Homes that left Airbnb are missing, revenue uses June–July prices, and new, unpriced and outer-area listings are not covered.</w:t>
       </w:r>
     </w:p>
     <w:p>
@@ -4913,7 +4906,7 @@
         <w:rPr>
           <w:rFonts w:ascii="Arial" w:hAnsi="Arial" w:eastAsia="Arial" w:cs="Arial"/>
         </w:rPr>
-        <w:t>Next, collect rent and cost quotes, track paid nights and net cash flow to test whether review activity identifies good businesses, and recheck the groups, model and two-setting rule on the next snapshot.</w:t>
+        <w:t>Next, collect rent and cost quotes, track paid nights and net cash flow to test whether review activity identifies good businesses, analyse review text in the priority groups, and recheck the groups, model and two-setting rule on the next snapshot.</w:t>
       </w:r>
     </w:p>
     <w:p>
@@ -5230,7 +5223,7 @@
         <w:rPr>
           <w:rFonts w:ascii="Arial" w:hAnsi="Arial" w:eastAsia="Arial" w:cs="Arial"/>
         </w:rPr>
-        <w:t>We fitted the model in R (R Core Team, 2026), with group median prices and fills for missing minimum stays taken from training homes only. Table A1 gives each input's odds ratio (the change in the odds of being busy, from its average weight over the 50 fits) and its range across fits; above 1 means a higher chance, below 1 a lower one.</w:t>
+        <w:t>Group median prices and stand-ins for missing minimum stays use only homes each model was built on. In Table A1, each odds ratio (from the input's average weight over the 50 fits) multiplies the odds of being busy (busy homes per quiet home); above 1 raises the chance, below 1 lowers it.</w:t>
       </w:r>
     </w:p>
     <w:p>
@@ -6164,7 +6157,7 @@
         <w:rPr>
           <w:rFonts w:ascii="Arial" w:hAnsi="Arial" w:eastAsia="Arial" w:cs="Arial"/>
         </w:rPr>
-        <w:t>The ranges show stability across fits, not confidence intervals; those including 1 (for example, Yarra Ranges) leave the direction uncertain. Across all 14 groups, the model ranked a random busy home above a random quiet one 71% of the time, against 60% for group rates (AUC 0.71 and 0.60). Host-clustered standard errors are 1.1–2.6 times ordinary ones, and variance inflation factors sit below 3 (little overlap between inputs). An ordinary test suggests slight curvature in amenities (p = 0.03), which is unclear once homes of the same host are treated as related (p = 0.17). Full evaluation tables are in the repository (Huang &amp; Xu, 2026).</w:t>
+        <w:t>The ranges show stability across fits, not confidence intervals; those including 1 (for example, Yarra Ranges) leave the direction uncertain. Across all 14 groups, the model ranked a random busy home above a random quiet one 71% of the time, against 60% for group rates (AUC 0.71 and 0.60). Treating same-host homes as related widens margins of error to 1.1–2.6 times ordinary ones. Inputs overlap little (variance inflation factors below 3). An ordinary test of curved price and amenity effects suggests slight curvature (p = 0.03; amenities alone, p = 0.011); treating same-host homes as related makes this unclear (amenities, p = 0.17). Full evaluation tables are in the repository (Huang &amp; Xu, 2026).</w:t>
       </w:r>
     </w:p>
     <w:p>

</xml_diff>

<commit_message>
Shorten the body toward 2,000 words and score review text for tone
Body (Sections 1-7) is about 2,360 words; technical checks move to Appendix A
with a new Table A3. Review text is scored with VADER: about 90% positive in
both groups, 1.6% negative for busy homes against 2.9% for the rest. One term
throughout (busy / not busy); scope rules and checks are justified in plain
words. Word count 2,960, ten pages.
</commit_message>
<xml_diff>
--- a/final-report/report-2026-10-04/Final_Report.docx
+++ b/final-report/report-2026-10-04/Final_Report.docx
@@ -94,33 +94,70 @@
         <w:rPr>
           <w:rFonts w:ascii="Arial" w:hAnsi="Arial" w:eastAsia="Arial" w:cs="Arial"/>
         </w:rPr>
-        <w:t>Our client plans to lease homes in Greater Melbourne for Airbnb short stays. Rent and setup costs come before guest income, so a poor lease ties up scarce startup funds.</w:t>
+        <w:t>Our client plans to lease Melbourne homes and let them on Airbnb as short stays (rent-to-rent). Rent and setup costs come before any guest income, so a poor lease ties up scarce funds. Our main answers are:</w:t>
       </w:r>
     </w:p>
     <w:p>
       <w:pPr>
+        <w:pStyle w:val="ListBullet"/>
         <w:widowControl/>
-        <w:spacing w:after="120" w:line="259" w:lineRule="auto"/>
+        <w:spacing w:after="80" w:line="259" w:lineRule="auto"/>
         <w:jc w:val="left"/>
       </w:pPr>
       <w:r>
         <w:rPr>
           <w:rFonts w:ascii="Arial" w:hAnsi="Arial" w:eastAsia="Arial" w:cs="Arial"/>
+          <w:b/>
         </w:rPr>
-        <w:t>We recommend City of Melbourne two- and three-bedroom apartments first, then Yarra Ranges three-bedroom houses and townhouses. These groups had the highest shares of busy homes (30+ reviews a year, about 180+ booked nights) and typical estimated revenue of AUD 30,600–48,600 a year before costs, against AUD 24,700 overall.</w:t>
+        <w:t>Where:</w:t>
+      </w:r>
+      <w:r>
+        <w:rPr>
+          <w:rFonts w:ascii="Arial" w:hAnsi="Arial" w:eastAsia="Arial" w:cs="Arial"/>
+        </w:rPr>
+        <w:t xml:space="preserve"> City of Melbourne two- and three-bedroom apartments, then Yarra Ranges three-bedroom houses. These groups had the highest shares of busy homes (30 or more reviews a year, about 180 booked nights).</w:t>
       </w:r>
     </w:p>
     <w:p>
       <w:pPr>
+        <w:pStyle w:val="ListBullet"/>
         <w:widowControl/>
-        <w:spacing w:after="120" w:line="259" w:lineRule="auto"/>
+        <w:spacing w:after="80" w:line="259" w:lineRule="auto"/>
         <w:jc w:val="left"/>
       </w:pPr>
       <w:r>
         <w:rPr>
           <w:rFonts w:ascii="Arial" w:hAnsi="Arial" w:eastAsia="Arial" w:cs="Arial"/>
+          <w:b/>
         </w:rPr>
-        <w:t>Within these groups, half of the homes that accepted one-night stays and were priced at or below similar homes were busy (50.4%), against a third of all their homes (33.4%). Section 6 turns this into a search order, a checklist and a cost test.</w:t>
+        <w:t>Which homes:</w:t>
+      </w:r>
+      <w:r>
+        <w:rPr>
+          <w:rFonts w:ascii="Arial" w:hAnsi="Arial" w:eastAsia="Arial" w:cs="Arial"/>
+        </w:rPr>
+        <w:t xml:space="preserve"> those that can take one-night stays at a price at or below similar listings. Half of such homes were busy, against a third of all homes in these groups.</w:t>
+      </w:r>
+    </w:p>
+    <w:p>
+      <w:pPr>
+        <w:pStyle w:val="ListBullet"/>
+        <w:widowControl/>
+        <w:spacing w:after="80" w:line="259" w:lineRule="auto"/>
+        <w:jc w:val="left"/>
+      </w:pPr>
+      <w:r>
+        <w:rPr>
+          <w:rFonts w:ascii="Arial" w:hAnsi="Arial" w:eastAsia="Arial" w:cs="Arial"/>
+          <w:b/>
+        </w:rPr>
+        <w:t>Which leases:</w:t>
+      </w:r>
+      <w:r>
+        <w:rPr>
+          <w:rFonts w:ascii="Arial" w:hAnsi="Arial" w:eastAsia="Arial" w:cs="Arial"/>
+        </w:rPr>
+        <w:t xml:space="preserve"> only those whose weekly costs sit below the group's typical weekly revenue (AUD 590–930).</w:t>
       </w:r>
     </w:p>
     <w:p>
@@ -180,7 +217,7 @@
         <w:rPr>
           <w:rFonts w:ascii="Arial" w:hAnsi="Arial" w:eastAsia="Arial" w:cs="Arial"/>
         </w:rPr>
-        <w:t>Rank property groups by their share of homes with strong guest activity, and express this in nights and revenue.</w:t>
+        <w:t>Rank property groups by their share of busy homes, and express this in nights and revenue.</w:t>
       </w:r>
     </w:p>
     <w:p>
@@ -201,7 +238,7 @@
         <w:rPr>
           <w:rFonts w:ascii="Arial" w:hAnsi="Arial" w:eastAsia="Arial" w:cs="Arial"/>
         </w:rPr>
-        <w:t>Identify which home settings go with strong activity, and whether they help pick homes within the leading groups.</w:t>
+        <w:t>Find which home settings go with being busy, and whether they help choose homes within the leading groups.</w:t>
       </w:r>
     </w:p>
     <w:p>
@@ -222,20 +259,7 @@
         <w:rPr>
           <w:rFonts w:ascii="Arial" w:hAnsi="Arial" w:eastAsia="Arial" w:cs="Arial"/>
         </w:rPr>
-        <w:t>Turn the results into a search order and a four-week inspection plan.</w:t>
-      </w:r>
-    </w:p>
-    <w:p>
-      <w:pPr>
-        <w:widowControl/>
-        <w:spacing w:after="120" w:line="259" w:lineRule="auto"/>
-        <w:jc w:val="left"/>
-      </w:pPr>
-      <w:r>
-        <w:rPr>
-          <w:rFonts w:ascii="Arial" w:hAnsi="Arial" w:eastAsia="Arial" w:cs="Arial"/>
-        </w:rPr>
-        <w:t>Objective 1 needs only a simple summary by group (Section 5.2). Objective 2 uses a model to separate settings from location, then tests a simpler two-setting rule.</w:t>
+        <w:t>Turn the results into a search order, a checklist and a four-week inspection plan.</w:t>
       </w:r>
     </w:p>
     <w:p>
@@ -274,7 +298,7 @@
         <w:rPr>
           <w:rFonts w:ascii="Arial" w:hAnsi="Arial" w:eastAsia="Arial" w:cs="Arial"/>
         </w:rPr>
-        <w:t xml:space="preserve"> (reaches our target) when it receives at least 30 guest reviews in the year before data collection, a level reached by a quarter of set-aside reference homes (Section 3). Inside Airbnb (n.d.) assumes half of stays are reviewed and each lasts three nights (or the minimum stay if longer). Estimated nights are capped at 255 a year; 30 reviews means about 180 booked nights.</w:t>
+        <w:t xml:space="preserve"> if it received at least 30 guest reviews in the year before data collection. Inside Airbnb (n.d.) assumes half of stays are reviewed, so with three-night stays, 30 reviews means about 180 booked nights, roughly half the year.</w:t>
       </w:r>
     </w:p>
     <w:p>
@@ -288,13 +312,13 @@
           <w:rFonts w:ascii="Arial" w:hAnsi="Arial" w:eastAsia="Arial" w:cs="Arial"/>
           <w:b/>
         </w:rPr>
-        <w:t>What review activity measures.</w:t>
+        <w:t>Why reviews?</w:t>
       </w:r>
       <w:r>
         <w:rPr>
           <w:rFonts w:ascii="Arial" w:hAnsi="Arial" w:eastAsia="Arial" w:cs="Arial"/>
         </w:rPr>
-        <w:t xml:space="preserve"> Guests review only after a stay, so reviews track completed bookings, a guide to demand and occupancy; this matters because empty nights are the operator's main risk. Review counts show neither profit (rents and costs are unknown) nor satisfaction (reviews can be negative), so we convert them into nights and revenue and check sentiment through star ratings (Section 5.1). We do not rank on revenue: Inside Airbnb estimates it from reviews and advertised prices, and without rents a higher price is not a better lease.</w:t>
+        <w:t xml:space="preserve"> Guests can review only after a stay, so review counts track completed bookings, the best public guide to demand and occupancy. Empty nights are the operator's main risk. Review counts do not show profit (rents and costs are not in the data) or satisfaction, so we translate them into nights and revenue and check what guests wrote (Section 5.1).</w:t>
       </w:r>
     </w:p>
     <w:p>
@@ -307,7 +331,7 @@
         <w:rPr>
           <w:rFonts w:ascii="Arial" w:hAnsi="Arial" w:eastAsia="Arial" w:cs="Arial"/>
         </w:rPr>
-        <w:t>Since the interim report, we replaced its random forest with an explainable logistic regression.</w:t>
+        <w:t>Since the interim report (in the project repository), we replaced its random forest with one explainable logistic regression and moved technical checks to Appendix A.</w:t>
       </w:r>
     </w:p>
     <w:p>
@@ -333,7 +357,7 @@
         <w:rPr>
           <w:rFonts w:ascii="Arial" w:hAnsi="Arial" w:eastAsia="Arial" w:cs="Arial"/>
         </w:rPr>
-        <w:t>We use one Inside Airbnb snapshot of Melbourne, supplied through the subject LMS and collected 17 June–1 July 2026 (Inside Airbnb, 2026). It holds 25,728 listings and 1,026,690 dated reviews. We did not use the calendar, which cannot separate bookings from blocked nights.</w:t>
+        <w:t>We use one Inside Airbnb snapshot of Melbourne, supplied through the subject LMS and collected 17 June–1 July 2026 (Inside Airbnb, 2026). It holds 25,728 listings and 1,026,690 dated reviews. We did not use the calendar, because it cannot separate bookings from nights the host blocked.</w:t>
       </w:r>
     </w:p>
     <w:p>
@@ -346,7 +370,7 @@
         <w:rPr>
           <w:rFonts w:ascii="Arial" w:hAnsi="Arial" w:eastAsia="Arial" w:cs="Arial"/>
         </w:rPr>
-        <w:t>Cleaning converted prices to numbers, standardized missing entries, counted amenities and rebuilt annual review counts from review dates. Price is missing for 6,553 listings (25%) and bedrooms for 4,679 (18%); 4,477 listings (17%) have never been reviewed.</w:t>
+        <w:t>Cleaning converted prices to numbers, standardized missing entries, counted amenities and rebuilt each home's annual review count from review dates. Price is missing for 6,553 listings (25%) and bedrooms for 4,679 (18%); 4,477 listings (17%) have never been reviewed.</w:t>
       </w:r>
     </w:p>
     <w:p>
@@ -359,33 +383,63 @@
         <w:rPr>
           <w:rFonts w:ascii="Arial" w:hAnsi="Arial" w:eastAsia="Arial" w:cs="Arial"/>
         </w:rPr>
-        <w:t>We keep homes priced AUD 30–1,500 that are entire rental units or condos (</w:t>
+        <w:t>We kept homes a small operator could lease (Table 1):</w:t>
       </w:r>
-      <w:r>
-        <w:rPr>
-          <w:rFonts w:ascii="Arial" w:hAnsi="Arial" w:eastAsia="Arial" w:cs="Arial"/>
-          <w:i/>
-        </w:rPr>
-        <w:t>apartments</w:t>
-      </w:r>
+    </w:p>
+    <w:p>
+      <w:pPr>
+        <w:pStyle w:val="ListBullet"/>
+        <w:widowControl/>
+        <w:spacing w:after="80" w:line="259" w:lineRule="auto"/>
+        <w:jc w:val="left"/>
+      </w:pPr>
       <w:r>
         <w:rPr>
           <w:rFonts w:ascii="Arial" w:hAnsi="Arial" w:eastAsia="Arial" w:cs="Arial"/>
         </w:rPr>
-        <w:t>) or entire homes or townhouses (</w:t>
+        <w:t>entire apartments, houses or townhouses with one to three bedrooms;</w:t>
       </w:r>
-      <w:r>
-        <w:rPr>
-          <w:rFonts w:ascii="Arial" w:hAnsi="Arial" w:eastAsia="Arial" w:cs="Arial"/>
-          <w:i/>
-        </w:rPr>
-        <w:t>houses/townhouses</w:t>
-      </w:r>
+    </w:p>
+    <w:p>
+      <w:pPr>
+        <w:pStyle w:val="ListBullet"/>
+        <w:widowControl/>
+        <w:spacing w:after="80" w:line="259" w:lineRule="auto"/>
+        <w:jc w:val="left"/>
+      </w:pPr>
       <w:r>
         <w:rPr>
           <w:rFonts w:ascii="Arial" w:hAnsi="Arial" w:eastAsia="Arial" w:cs="Arial"/>
         </w:rPr>
-        <w:t>), with one to three bedrooms and a first review at least a year before collection, so each has a full year of reviews.</w:t>
+        <w:t>prices of AUD 30–1,500, since unpriced and extreme listings are mostly inactive: 77.8% of those removed had no review in the past year, against 17.0% of those kept;</w:t>
+      </w:r>
+    </w:p>
+    <w:p>
+      <w:pPr>
+        <w:pStyle w:val="ListBullet"/>
+        <w:widowControl/>
+        <w:spacing w:after="80" w:line="259" w:lineRule="auto"/>
+        <w:jc w:val="left"/>
+      </w:pPr>
+      <w:r>
+        <w:rPr>
+          <w:rFonts w:ascii="Arial" w:hAnsi="Arial" w:eastAsia="Arial" w:cs="Arial"/>
+        </w:rPr>
+        <w:t>a first review at least a year before collection, so each home has a full year of reviews;</w:t>
+      </w:r>
+    </w:p>
+    <w:p>
+      <w:pPr>
+        <w:pStyle w:val="ListBullet"/>
+        <w:widowControl/>
+        <w:spacing w:after="80" w:line="259" w:lineRule="auto"/>
+        <w:jc w:val="left"/>
+      </w:pPr>
+      <w:r>
+        <w:rPr>
+          <w:rFonts w:ascii="Arial" w:hAnsi="Arial" w:eastAsia="Arial" w:cs="Arial"/>
+        </w:rPr>
+        <w:t>groups of at least 50 homes, so each group's share is stable.</w:t>
       </w:r>
     </w:p>
     <w:p>
@@ -398,7 +452,7 @@
         <w:rPr>
           <w:rFonts w:ascii="Arial" w:hAnsi="Arial" w:eastAsia="Arial" w:cs="Arial"/>
         </w:rPr>
-        <w:t>We set aside about one in five hosts (1,342 homes) to set an independent target: of their 906 homes in the final groups, a quarter received 30 or more reviews (Table 1).</w:t>
+        <w:t>To avoid setting the bar with the homes we compare, we first set aside one host in five (1,342 homes). The busiest quarter of their homes had 30 or more reviews, so 30 became the target. The final sample has 3,873 homes, 1,726 hosts and 14 groups in six council areas.</w:t>
       </w:r>
     </w:p>
     <w:p>
@@ -830,19 +884,6 @@
     </w:p>
     <w:p>
       <w:pPr>
-        <w:widowControl/>
-        <w:spacing w:after="120" w:line="259" w:lineRule="auto"/>
-        <w:jc w:val="left"/>
-      </w:pPr>
-      <w:r>
-        <w:rPr>
-          <w:rFonts w:ascii="Arial" w:hAnsi="Arial" w:eastAsia="Arial" w:cs="Arial"/>
-        </w:rPr>
-        <w:t>The 3,873 analysis homes belong to 1,726 hosts in six council areas, the only areas with groups of at least 50 homes. The price rule drops 3,796 residential listings: 77.8% had no review in the past year, against 17.0% of those kept.</w:t>
-      </w:r>
-    </w:p>
-    <w:p>
-      <w:pPr>
         <w:pStyle w:val="Heading1"/>
         <w:keepNext/>
         <w:pageBreakBefore w:val="0"/>
@@ -865,13 +906,13 @@
           <w:rFonts w:ascii="Arial" w:hAnsi="Arial" w:eastAsia="Arial" w:cs="Arial"/>
           <w:b/>
         </w:rPr>
-        <w:t>Group comparison.</w:t>
+        <w:t>Descriptive (Objective 1).</w:t>
       </w:r>
       <w:r>
         <w:rPr>
           <w:rFonts w:ascii="Arial" w:hAnsi="Arial" w:eastAsia="Arial" w:cs="Arial"/>
         </w:rPr>
-        <w:t xml:space="preserve"> We compare the share of busy homes in the 14 groups; redrawing hosts at random 1,000 times shows how much each share could move by chance.</w:t>
+        <w:t xml:space="preserve"> We compare the share of busy homes across the 14 groups and translate it into Inside Airbnb's estimated nights and revenue.</w:t>
       </w:r>
     </w:p>
     <w:p>
@@ -885,33 +926,13 @@
           <w:rFonts w:ascii="Arial" w:hAnsi="Arial" w:eastAsia="Arial" w:cs="Arial"/>
           <w:b/>
         </w:rPr>
-        <w:t>Two-setting rule.</w:t>
+        <w:t>Predictive (Objective 2).</w:t>
       </w:r>
       <w:r>
         <w:rPr>
           <w:rFonts w:ascii="Arial" w:hAnsi="Arial" w:eastAsia="Arial" w:cs="Arial"/>
         </w:rPr>
-        <w:t xml:space="preserve"> To test whether a simple summary does as well as the model, we split priority-group homes by one-night stays and by price at or below the group median.</w:t>
-      </w:r>
-    </w:p>
-    <w:p>
-      <w:pPr>
-        <w:widowControl/>
-        <w:spacing w:after="120" w:line="259" w:lineRule="auto"/>
-        <w:jc w:val="left"/>
-      </w:pPr>
-      <w:r>
-        <w:rPr>
-          <w:rFonts w:ascii="Arial" w:hAnsi="Arial" w:eastAsia="Arial" w:cs="Arial"/>
-          <w:b/>
-        </w:rPr>
-        <w:t>Model.</w:t>
-      </w:r>
-      <w:r>
-        <w:rPr>
-          <w:rFonts w:ascii="Arial" w:hAnsi="Arial" w:eastAsia="Arial" w:cs="Arial"/>
-        </w:rPr>
-        <w:t xml:space="preserve"> Logistic regression turns six inputs into a chance of being busy (R Core Team, 2026); its weights show how each input moves that chance with the others held fixed. Table 2 lists the outcome and inputs.</w:t>
+        <w:t xml:space="preserve"> A logistic regression estimates each home's chance of being busy from six inputs, holding the others fixed (Table 2; R Core Team, 2026). This separates location from how a home is run. We also test a simpler two-setting rule: one-night stays, and a price at or below the group median.</w:t>
       </w:r>
     </w:p>
     <w:p>
@@ -1349,60 +1370,15 @@
       <w:r>
         <w:rPr>
           <w:rFonts w:ascii="Arial" w:hAnsi="Arial" w:eastAsia="Arial" w:cs="Arial"/>
-        </w:rPr>
-        <w:t xml:space="preserve">We compare this </w:t>
-      </w:r>
-      <w:r>
-        <w:rPr>
-          <w:rFonts w:ascii="Arial" w:hAnsi="Arial" w:eastAsia="Arial" w:cs="Arial"/>
           <w:b/>
         </w:rPr>
-        <w:t>full model</w:t>
+        <w:t>Prescriptive (Objective 3).</w:t>
       </w:r>
       <w:r>
         <w:rPr>
           <w:rFonts w:ascii="Arial" w:hAnsi="Arial" w:eastAsia="Arial" w:cs="Arial"/>
         </w:rPr>
-        <w:t xml:space="preserve"> with two simpler options. The </w:t>
-      </w:r>
-      <w:r>
-        <w:rPr>
-          <w:rFonts w:ascii="Arial" w:hAnsi="Arial" w:eastAsia="Arial" w:cs="Arial"/>
-          <w:b/>
-        </w:rPr>
-        <w:t>group rate</w:t>
-      </w:r>
-      <w:r>
-        <w:rPr>
-          <w:rFonts w:ascii="Arial" w:hAnsi="Arial" w:eastAsia="Arial" w:cs="Arial"/>
-        </w:rPr>
-        <w:t xml:space="preserve"> (a group's share of busy homes) scores all its homes equally, which within a group is </w:t>
-      </w:r>
-      <w:r>
-        <w:rPr>
-          <w:rFonts w:ascii="Arial" w:hAnsi="Arial" w:eastAsia="Arial" w:cs="Arial"/>
-          <w:b/>
-        </w:rPr>
-        <w:t>random picking</w:t>
-      </w:r>
-      <w:r>
-        <w:rPr>
-          <w:rFonts w:ascii="Arial" w:hAnsi="Arial" w:eastAsia="Arial" w:cs="Arial"/>
-        </w:rPr>
-        <w:t xml:space="preserve">. The </w:t>
-      </w:r>
-      <w:r>
-        <w:rPr>
-          <w:rFonts w:ascii="Arial" w:hAnsi="Arial" w:eastAsia="Arial" w:cs="Arial"/>
-          <w:b/>
-        </w:rPr>
-        <w:t>reduced model</w:t>
-      </w:r>
-      <w:r>
-        <w:rPr>
-          <w:rFonts w:ascii="Arial" w:hAnsi="Arial" w:eastAsia="Arial" w:cs="Arial"/>
-        </w:rPr>
-        <w:t xml:space="preserve"> drops price and minimum stay to show what they add.</w:t>
+        <w:t xml:space="preserve"> We turn the results into a checklist, a cost test and an inspection plan.</w:t>
       </w:r>
     </w:p>
     <w:p>
@@ -1416,13 +1392,97 @@
           <w:rFonts w:ascii="Arial" w:hAnsi="Arial" w:eastAsia="Arial" w:cs="Arial"/>
           <w:b/>
         </w:rPr>
-        <w:t>Assumptions.</w:t>
+        <w:t>Checks against luck.</w:t>
       </w:r>
       <w:r>
         <w:rPr>
           <w:rFonts w:ascii="Arial" w:hAnsi="Arial" w:eastAsia="Arial" w:cs="Arial"/>
         </w:rPr>
-        <w:t xml:space="preserve"> Homes of the same host can perform alike, so they stay together in every test. Each 10% price step, or ten more amenities, has the same effect wherever it occurs; Appendix A finds little overlap between inputs and only weak signs of curvature.</w:t>
+        <w:t xml:space="preserve"> Three checks each answer one question:</w:t>
+      </w:r>
+    </w:p>
+    <w:p>
+      <w:pPr>
+        <w:widowControl/>
+        <w:spacing w:after="80" w:line="259" w:lineRule="auto"/>
+        <w:ind w:left="432" w:hanging="432"/>
+        <w:jc w:val="left"/>
+      </w:pPr>
+      <w:r>
+        <w:rPr>
+          <w:rFonts w:ascii="Arial" w:hAnsi="Arial" w:eastAsia="Arial" w:cs="Arial"/>
+        </w:rPr>
+        <w:t>1.</w:t>
+        <w:tab/>
+      </w:r>
+      <w:r>
+        <w:rPr>
+          <w:rFonts w:ascii="Arial" w:hAnsi="Arial" w:eastAsia="Arial" w:cs="Arial"/>
+          <w:i/>
+        </w:rPr>
+        <w:t>Is the group ranking stable?</w:t>
+      </w:r>
+      <w:r>
+        <w:rPr>
+          <w:rFonts w:ascii="Arial" w:hAnsi="Arial" w:eastAsia="Arial" w:cs="Arial"/>
+        </w:rPr>
+        <w:t xml:space="preserve"> We redraw hosts at random 1,000 times.</w:t>
+      </w:r>
+    </w:p>
+    <w:p>
+      <w:pPr>
+        <w:widowControl/>
+        <w:spacing w:after="80" w:line="259" w:lineRule="auto"/>
+        <w:ind w:left="432" w:hanging="432"/>
+        <w:jc w:val="left"/>
+      </w:pPr>
+      <w:r>
+        <w:rPr>
+          <w:rFonts w:ascii="Arial" w:hAnsi="Arial" w:eastAsia="Arial" w:cs="Arial"/>
+        </w:rPr>
+        <w:t>2.</w:t>
+        <w:tab/>
+      </w:r>
+      <w:r>
+        <w:rPr>
+          <w:rFonts w:ascii="Arial" w:hAnsi="Arial" w:eastAsia="Arial" w:cs="Arial"/>
+          <w:i/>
+        </w:rPr>
+        <w:t>Does the model work on unseen homes?</w:t>
+      </w:r>
+      <w:r>
+        <w:rPr>
+          <w:rFonts w:ascii="Arial" w:hAnsi="Arial" w:eastAsia="Arial" w:cs="Arial"/>
+        </w:rPr>
+        <w:t xml:space="preserve"> In 50 tests, it is built on 70% of hosts and picks a quarter of each priority group's homes among the rest. We compare its picks with a reduced model (no price or minimum stay) and with random picking.</w:t>
+      </w:r>
+    </w:p>
+    <w:p>
+      <w:pPr>
+        <w:widowControl/>
+        <w:spacing w:after="80" w:line="259" w:lineRule="auto"/>
+        <w:ind w:left="432" w:hanging="432"/>
+        <w:jc w:val="left"/>
+      </w:pPr>
+      <w:r>
+        <w:rPr>
+          <w:rFonts w:ascii="Arial" w:hAnsi="Arial" w:eastAsia="Arial" w:cs="Arial"/>
+        </w:rPr>
+        <w:t>3.</w:t>
+        <w:tab/>
+      </w:r>
+      <w:r>
+        <w:rPr>
+          <w:rFonts w:ascii="Arial" w:hAnsi="Arial" w:eastAsia="Arial" w:cs="Arial"/>
+          <w:i/>
+        </w:rPr>
+        <w:t>Do leading groups stay ahead?</w:t>
+      </w:r>
+      <w:r>
+        <w:rPr>
+          <w:rFonts w:ascii="Arial" w:hAnsi="Arial" w:eastAsia="Arial" w:cs="Arial"/>
+        </w:rPr>
+        <w:t xml:space="preserve"> We rank groups on one year and follow them into the next.</w:t>
       </w:r>
     </w:p>
     <w:p>
@@ -1434,15 +1494,8 @@
       <w:r>
         <w:rPr>
           <w:rFonts w:ascii="Arial" w:hAnsi="Arial" w:eastAsia="Arial" w:cs="Arial"/>
-          <w:b/>
         </w:rPr>
-        <w:t>Testing.</w:t>
-      </w:r>
-      <w:r>
-        <w:rPr>
-          <w:rFonts w:ascii="Arial" w:hAnsi="Arial" w:eastAsia="Arial" w:cs="Arial"/>
-        </w:rPr>
-        <w:t xml:space="preserve"> Each of 50 tests builds the model on 70% of hosts and scores the other 30%. In each priority group, each method picks a quarter of these homes, and we compare the share that were busy.</w:t>
+        <w:t>Homes of one host stay together in every check, because they can perform alike. The model assumes each 10% price step, or ten amenities, has the same effect anywhere; Appendix A finds little overlap between inputs and only weak curvature.</w:t>
       </w:r>
     </w:p>
     <w:p>
@@ -1467,7 +1520,7 @@
         <w:rPr>
           <w:rFonts w:ascii="Arial" w:hAnsi="Arial" w:eastAsia="Arial" w:cs="Arial"/>
         </w:rPr>
-        <w:t>5.1 Data exploration: most homes are quiet; busy homes accept one-night stays and are well rated</w:t>
+        <w:t>5.1 Data exploration: activity is uneven, and busy homes are well reviewed</w:t>
       </w:r>
     </w:p>
     <w:p>
@@ -1480,7 +1533,7 @@
         <w:rPr>
           <w:rFonts w:ascii="Arial" w:hAnsi="Arial" w:eastAsia="Arial" w:cs="Arial"/>
         </w:rPr>
-        <w:t>Guest activity is very uneven (Figure 1). The median home received 15 reviews, a quarter (981 homes, 25.3%) received 30 or more, and 334 homes (8.6%) received none.</w:t>
+        <w:t>Guest activity is very uneven (Figure 1). The median home received 15 reviews in the year; a quarter (981 homes, 25.3%) were busy, and 334 (8.6%) received none.</w:t>
       </w:r>
     </w:p>
     <w:p>
@@ -1545,6 +1598,19 @@
     </w:p>
     <w:p>
       <w:pPr>
+        <w:widowControl/>
+        <w:spacing w:after="120" w:line="259" w:lineRule="auto"/>
+        <w:jc w:val="left"/>
+      </w:pPr>
+      <w:r>
+        <w:rPr>
+          <w:rFonts w:ascii="Arial" w:hAnsi="Arial" w:eastAsia="Arial" w:cs="Arial"/>
+        </w:rPr>
+        <w:t>Busy homes were slightly cheaper, but far more often accepted one-night stays and sat in the City of Melbourne (Table 3). Their higher revenue estimate comes from their review counts, not prices.</w:t>
+      </w:r>
+    </w:p>
+    <w:p>
+      <w:pPr>
         <w:keepNext/>
         <w:widowControl/>
         <w:spacing w:after="80" w:before="80" w:line="259" w:lineRule="auto"/>
@@ -1580,10 +1646,10 @@
         <w:tblLayout w:type="fixed"/>
       </w:tblPr>
       <w:tblGrid>
-        <w:gridCol w:w="5173"/>
-        <w:gridCol w:w="1837"/>
-        <w:gridCol w:w="1427"/>
-        <w:gridCol w:w="1427"/>
+        <w:gridCol w:w="5247"/>
+        <w:gridCol w:w="1812"/>
+        <w:gridCol w:w="1402"/>
+        <w:gridCol w:w="1402"/>
       </w:tblGrid>
       <w:tr>
         <w:trPr>
@@ -1592,7 +1658,7 @@
         </w:trPr>
         <w:tc>
           <w:tcPr>
-            <w:tcW w:type="dxa" w:w="5173"/>
+            <w:tcW w:type="dxa" w:w="5247"/>
             <w:vAlign w:val="center"/>
             <w:shd w:val="clear" w:color="auto" w:fill="E9EEF3"/>
           </w:tcPr>
@@ -1614,7 +1680,7 @@
         </w:tc>
         <w:tc>
           <w:tcPr>
-            <w:tcW w:type="dxa" w:w="1837"/>
+            <w:tcW w:type="dxa" w:w="1812"/>
             <w:vAlign w:val="center"/>
             <w:shd w:val="clear" w:color="auto" w:fill="E9EEF3"/>
           </w:tcPr>
@@ -1636,7 +1702,7 @@
         </w:tc>
         <w:tc>
           <w:tcPr>
-            <w:tcW w:type="dxa" w:w="1427"/>
+            <w:tcW w:type="dxa" w:w="1402"/>
             <w:vAlign w:val="center"/>
             <w:shd w:val="clear" w:color="auto" w:fill="E9EEF3"/>
           </w:tcPr>
@@ -1652,13 +1718,13 @@
                 <w:b/>
                 <w:sz w:val="21"/>
               </w:rPr>
-              <w:t>Below 30</w:t>
+              <w:t>Not busy</w:t>
             </w:r>
           </w:p>
         </w:tc>
         <w:tc>
           <w:tcPr>
-            <w:tcW w:type="dxa" w:w="1427"/>
+            <w:tcW w:type="dxa" w:w="1402"/>
             <w:vAlign w:val="center"/>
             <w:shd w:val="clear" w:color="auto" w:fill="E9EEF3"/>
           </w:tcPr>
@@ -1685,7 +1751,7 @@
         </w:trPr>
         <w:tc>
           <w:tcPr>
-            <w:tcW w:type="dxa" w:w="5173"/>
+            <w:tcW w:type="dxa" w:w="5247"/>
             <w:vAlign w:val="center"/>
             <w:shd w:val="clear" w:color="auto" w:fill="FFFFFF"/>
           </w:tcPr>
@@ -1706,7 +1772,7 @@
         </w:tc>
         <w:tc>
           <w:tcPr>
-            <w:tcW w:type="dxa" w:w="1837"/>
+            <w:tcW w:type="dxa" w:w="1812"/>
             <w:vAlign w:val="center"/>
             <w:shd w:val="clear" w:color="auto" w:fill="FFFFFF"/>
           </w:tcPr>
@@ -1727,7 +1793,7 @@
         </w:tc>
         <w:tc>
           <w:tcPr>
-            <w:tcW w:type="dxa" w:w="1427"/>
+            <w:tcW w:type="dxa" w:w="1402"/>
             <w:vAlign w:val="center"/>
             <w:shd w:val="clear" w:color="auto" w:fill="FFFFFF"/>
           </w:tcPr>
@@ -1748,7 +1814,7 @@
         </w:tc>
         <w:tc>
           <w:tcPr>
-            <w:tcW w:type="dxa" w:w="1427"/>
+            <w:tcW w:type="dxa" w:w="1402"/>
             <w:vAlign w:val="center"/>
             <w:shd w:val="clear" w:color="auto" w:fill="FFFFFF"/>
           </w:tcPr>
@@ -1774,7 +1840,7 @@
         </w:trPr>
         <w:tc>
           <w:tcPr>
-            <w:tcW w:type="dxa" w:w="5173"/>
+            <w:tcW w:type="dxa" w:w="5247"/>
             <w:vAlign w:val="center"/>
             <w:shd w:val="clear" w:color="auto" w:fill="FFFFFF"/>
           </w:tcPr>
@@ -1795,7 +1861,7 @@
         </w:tc>
         <w:tc>
           <w:tcPr>
-            <w:tcW w:type="dxa" w:w="1837"/>
+            <w:tcW w:type="dxa" w:w="1812"/>
             <w:vAlign w:val="center"/>
             <w:shd w:val="clear" w:color="auto" w:fill="FFFFFF"/>
           </w:tcPr>
@@ -1816,7 +1882,7 @@
         </w:tc>
         <w:tc>
           <w:tcPr>
-            <w:tcW w:type="dxa" w:w="1427"/>
+            <w:tcW w:type="dxa" w:w="1402"/>
             <w:vAlign w:val="center"/>
             <w:shd w:val="clear" w:color="auto" w:fill="FFFFFF"/>
           </w:tcPr>
@@ -1837,7 +1903,7 @@
         </w:tc>
         <w:tc>
           <w:tcPr>
-            <w:tcW w:type="dxa" w:w="1427"/>
+            <w:tcW w:type="dxa" w:w="1402"/>
             <w:vAlign w:val="center"/>
             <w:shd w:val="clear" w:color="auto" w:fill="FFFFFF"/>
           </w:tcPr>
@@ -1863,7 +1929,7 @@
         </w:trPr>
         <w:tc>
           <w:tcPr>
-            <w:tcW w:type="dxa" w:w="5173"/>
+            <w:tcW w:type="dxa" w:w="5247"/>
             <w:vAlign w:val="center"/>
             <w:shd w:val="clear" w:color="auto" w:fill="FFFFFF"/>
           </w:tcPr>
@@ -1884,7 +1950,7 @@
         </w:tc>
         <w:tc>
           <w:tcPr>
-            <w:tcW w:type="dxa" w:w="1837"/>
+            <w:tcW w:type="dxa" w:w="1812"/>
             <w:vAlign w:val="center"/>
             <w:shd w:val="clear" w:color="auto" w:fill="FFFFFF"/>
           </w:tcPr>
@@ -1905,7 +1971,7 @@
         </w:tc>
         <w:tc>
           <w:tcPr>
-            <w:tcW w:type="dxa" w:w="1427"/>
+            <w:tcW w:type="dxa" w:w="1402"/>
             <w:vAlign w:val="center"/>
             <w:shd w:val="clear" w:color="auto" w:fill="FFFFFF"/>
           </w:tcPr>
@@ -1926,7 +1992,7 @@
         </w:tc>
         <w:tc>
           <w:tcPr>
-            <w:tcW w:type="dxa" w:w="1427"/>
+            <w:tcW w:type="dxa" w:w="1402"/>
             <w:vAlign w:val="center"/>
             <w:shd w:val="clear" w:color="auto" w:fill="FFFFFF"/>
           </w:tcPr>
@@ -1952,7 +2018,7 @@
         </w:trPr>
         <w:tc>
           <w:tcPr>
-            <w:tcW w:type="dxa" w:w="5173"/>
+            <w:tcW w:type="dxa" w:w="5247"/>
             <w:vAlign w:val="center"/>
             <w:shd w:val="clear" w:color="auto" w:fill="FFFFFF"/>
           </w:tcPr>
@@ -1973,7 +2039,7 @@
         </w:tc>
         <w:tc>
           <w:tcPr>
-            <w:tcW w:type="dxa" w:w="1837"/>
+            <w:tcW w:type="dxa" w:w="1812"/>
             <w:vAlign w:val="center"/>
             <w:shd w:val="clear" w:color="auto" w:fill="FFFFFF"/>
           </w:tcPr>
@@ -1994,7 +2060,7 @@
         </w:tc>
         <w:tc>
           <w:tcPr>
-            <w:tcW w:type="dxa" w:w="1427"/>
+            <w:tcW w:type="dxa" w:w="1402"/>
             <w:vAlign w:val="center"/>
             <w:shd w:val="clear" w:color="auto" w:fill="FFFFFF"/>
           </w:tcPr>
@@ -2015,7 +2081,7 @@
         </w:tc>
         <w:tc>
           <w:tcPr>
-            <w:tcW w:type="dxa" w:w="1427"/>
+            <w:tcW w:type="dxa" w:w="1402"/>
             <w:vAlign w:val="center"/>
             <w:shd w:val="clear" w:color="auto" w:fill="FFFFFF"/>
           </w:tcPr>
@@ -2041,7 +2107,7 @@
         </w:trPr>
         <w:tc>
           <w:tcPr>
-            <w:tcW w:type="dxa" w:w="5173"/>
+            <w:tcW w:type="dxa" w:w="5247"/>
             <w:vAlign w:val="center"/>
             <w:shd w:val="clear" w:color="auto" w:fill="FFFFFF"/>
           </w:tcPr>
@@ -2062,7 +2128,7 @@
         </w:tc>
         <w:tc>
           <w:tcPr>
-            <w:tcW w:type="dxa" w:w="1837"/>
+            <w:tcW w:type="dxa" w:w="1812"/>
             <w:vAlign w:val="center"/>
             <w:shd w:val="clear" w:color="auto" w:fill="FFFFFF"/>
           </w:tcPr>
@@ -2083,7 +2149,7 @@
         </w:tc>
         <w:tc>
           <w:tcPr>
-            <w:tcW w:type="dxa" w:w="1427"/>
+            <w:tcW w:type="dxa" w:w="1402"/>
             <w:vAlign w:val="center"/>
             <w:shd w:val="clear" w:color="auto" w:fill="FFFFFF"/>
           </w:tcPr>
@@ -2104,7 +2170,7 @@
         </w:tc>
         <w:tc>
           <w:tcPr>
-            <w:tcW w:type="dxa" w:w="1427"/>
+            <w:tcW w:type="dxa" w:w="1402"/>
             <w:vAlign w:val="center"/>
             <w:shd w:val="clear" w:color="auto" w:fill="FFFFFF"/>
           </w:tcPr>
@@ -2130,7 +2196,7 @@
         </w:trPr>
         <w:tc>
           <w:tcPr>
-            <w:tcW w:type="dxa" w:w="5173"/>
+            <w:tcW w:type="dxa" w:w="5247"/>
             <w:vAlign w:val="center"/>
             <w:shd w:val="clear" w:color="auto" w:fill="FFFFFF"/>
           </w:tcPr>
@@ -2151,7 +2217,7 @@
         </w:tc>
         <w:tc>
           <w:tcPr>
-            <w:tcW w:type="dxa" w:w="1837"/>
+            <w:tcW w:type="dxa" w:w="1812"/>
             <w:vAlign w:val="center"/>
             <w:shd w:val="clear" w:color="auto" w:fill="FFFFFF"/>
           </w:tcPr>
@@ -2172,7 +2238,7 @@
         </w:tc>
         <w:tc>
           <w:tcPr>
-            <w:tcW w:type="dxa" w:w="1427"/>
+            <w:tcW w:type="dxa" w:w="1402"/>
             <w:vAlign w:val="center"/>
             <w:shd w:val="clear" w:color="auto" w:fill="FFFFFF"/>
           </w:tcPr>
@@ -2193,7 +2259,7 @@
         </w:tc>
         <w:tc>
           <w:tcPr>
-            <w:tcW w:type="dxa" w:w="1427"/>
+            <w:tcW w:type="dxa" w:w="1402"/>
             <w:vAlign w:val="center"/>
             <w:shd w:val="clear" w:color="auto" w:fill="FFFFFF"/>
           </w:tcPr>
@@ -2219,7 +2285,7 @@
         </w:trPr>
         <w:tc>
           <w:tcPr>
-            <w:tcW w:type="dxa" w:w="5173"/>
+            <w:tcW w:type="dxa" w:w="5247"/>
             <w:vAlign w:val="center"/>
             <w:shd w:val="clear" w:color="auto" w:fill="FFFFFF"/>
           </w:tcPr>
@@ -2240,7 +2306,7 @@
         </w:tc>
         <w:tc>
           <w:tcPr>
-            <w:tcW w:type="dxa" w:w="1837"/>
+            <w:tcW w:type="dxa" w:w="1812"/>
             <w:vAlign w:val="center"/>
             <w:shd w:val="clear" w:color="auto" w:fill="FFFFFF"/>
           </w:tcPr>
@@ -2261,7 +2327,7 @@
         </w:tc>
         <w:tc>
           <w:tcPr>
-            <w:tcW w:type="dxa" w:w="1427"/>
+            <w:tcW w:type="dxa" w:w="1402"/>
             <w:vAlign w:val="center"/>
             <w:shd w:val="clear" w:color="auto" w:fill="FFFFFF"/>
           </w:tcPr>
@@ -2282,7 +2348,7 @@
         </w:tc>
         <w:tc>
           <w:tcPr>
-            <w:tcW w:type="dxa" w:w="1427"/>
+            <w:tcW w:type="dxa" w:w="1402"/>
             <w:vAlign w:val="center"/>
             <w:shd w:val="clear" w:color="auto" w:fill="FFFFFF"/>
           </w:tcPr>
@@ -2308,7 +2374,7 @@
         </w:trPr>
         <w:tc>
           <w:tcPr>
-            <w:tcW w:type="dxa" w:w="5173"/>
+            <w:tcW w:type="dxa" w:w="5247"/>
             <w:vAlign w:val="center"/>
             <w:shd w:val="clear" w:color="auto" w:fill="FFFFFF"/>
           </w:tcPr>
@@ -2322,13 +2388,13 @@
                 <w:rFonts w:ascii="Arial" w:hAnsi="Arial" w:eastAsia="Arial" w:cs="Arial"/>
                 <w:sz w:val="21"/>
               </w:rPr>
-              <w:t>Rated below 4.5 stars</w:t>
+              <w:t>Reviews in the year with a negative tone</w:t>
             </w:r>
           </w:p>
         </w:tc>
         <w:tc>
           <w:tcPr>
-            <w:tcW w:type="dxa" w:w="1837"/>
+            <w:tcW w:type="dxa" w:w="1812"/>
             <w:vAlign w:val="center"/>
             <w:shd w:val="clear" w:color="auto" w:fill="FFFFFF"/>
           </w:tcPr>
@@ -2342,13 +2408,13 @@
                 <w:rFonts w:ascii="Arial" w:hAnsi="Arial" w:eastAsia="Arial" w:cs="Arial"/>
                 <w:sz w:val="21"/>
               </w:rPr>
-              <w:t>1.1%</w:t>
+              <w:t>1.6%</w:t>
             </w:r>
           </w:p>
         </w:tc>
         <w:tc>
           <w:tcPr>
-            <w:tcW w:type="dxa" w:w="1427"/>
+            <w:tcW w:type="dxa" w:w="1402"/>
             <w:vAlign w:val="center"/>
             <w:shd w:val="clear" w:color="auto" w:fill="FFFFFF"/>
           </w:tcPr>
@@ -2362,13 +2428,13 @@
                 <w:rFonts w:ascii="Arial" w:hAnsi="Arial" w:eastAsia="Arial" w:cs="Arial"/>
                 <w:sz w:val="21"/>
               </w:rPr>
-              <w:t>15.2%</w:t>
+              <w:t>2.9%</w:t>
             </w:r>
           </w:p>
         </w:tc>
         <w:tc>
           <w:tcPr>
-            <w:tcW w:type="dxa" w:w="1427"/>
+            <w:tcW w:type="dxa" w:w="1402"/>
             <w:vAlign w:val="center"/>
             <w:shd w:val="clear" w:color="auto" w:fill="FFFFFF"/>
           </w:tcPr>
@@ -2382,7 +2448,7 @@
                 <w:rFonts w:ascii="Arial" w:hAnsi="Arial" w:eastAsia="Arial" w:cs="Arial"/>
                 <w:sz w:val="21"/>
               </w:rPr>
-              <w:t>11.6%</w:t>
+              <w:t>2.2%</w:t>
             </w:r>
           </w:p>
         </w:tc>
@@ -2405,7 +2471,7 @@
         <w:rPr>
           <w:rFonts w:ascii="Arial" w:hAnsi="Arial" w:eastAsia="Arial" w:cs="Arial"/>
         </w:rPr>
-        <w:t>Busy homes were slightly cheaper but far more often accepted one-night stays and sat in the City of Melbourne (Table 3); their higher revenue estimate comes from their review counts, not higher prices. They were also better rated: only 1.1% averaged below 4.5 stars, against 15.2% of the rest, though averages over few reviews vary more (Huang &amp; Xu, 2026). So high review counts do not appear to reflect unhappy guests.</w:t>
+        <w:t>Busy homes also had happier guests: a higher mean rating (4.84 against 4.69 stars) and fewer negative reviews (1.6% against 2.9%). We scored the 78,288 reviews with VADER, a standard word-list tool (Hutto &amp; Gilbert, 2014); about 90% read as positive in both groups. High review counts therefore reflect satisfied guests, not complaints.</w:t>
       </w:r>
     </w:p>
     <w:p>
@@ -2417,7 +2483,7 @@
         <w:rPr>
           <w:rFonts w:ascii="Arial" w:hAnsi="Arial" w:eastAsia="Arial" w:cs="Arial"/>
         </w:rPr>
-        <w:t>5.2 Descriptive comparison: a simple summary puts City apartments first</w:t>
+        <w:t>5.2 Descriptive analysis: City apartments lead</w:t>
       </w:r>
     </w:p>
     <w:p>
@@ -2430,7 +2496,7 @@
         <w:rPr>
           <w:rFonts w:ascii="Arial" w:hAnsi="Arial" w:eastAsia="Arial" w:cs="Arial"/>
         </w:rPr>
-        <w:t>Group rates range from 8.2% to 36.6% against 25.3% overall, and the three priority groups lead (Figure 2, Table 4).</w:t>
+        <w:t>Shares of busy homes range from 8.2% to 36.6% across groups, and three groups lead (Figure 2, Table 4). The City groups stayed in the top three in 94% and 90% of host redraws, but Yarra Ranges houses in only 64%, so they are a less certain option (more checks in Table A3).</w:t>
       </w:r>
     </w:p>
     <w:p>
@@ -2693,7 +2759,7 @@
                 <w:b/>
                 <w:sz w:val="21"/>
               </w:rPr>
-              <w:t>Revenue, below 30</w:t>
+              <w:t>Revenue, not busy</w:t>
             </w:r>
           </w:p>
         </w:tc>
@@ -3316,28 +3382,15 @@
       <w:r>
         <w:rPr>
           <w:rFonts w:ascii="Arial" w:hAnsi="Arial" w:eastAsia="Arial" w:cs="Arial"/>
-        </w:rPr>
-        <w:t>The same three groups lead without the price limits or one-year review rule (Huang &amp; Xu, 2026). In 1,000 host redraws, the City groups stayed in the top three in 94% and 90% of them, and Yarra Ranges houses in only 64%.</w:t>
-      </w:r>
-    </w:p>
-    <w:p>
-      <w:pPr>
-        <w:widowControl/>
-        <w:spacing w:after="120" w:line="259" w:lineRule="auto"/>
-        <w:jc w:val="left"/>
-      </w:pPr>
-      <w:r>
-        <w:rPr>
-          <w:rFonts w:ascii="Arial" w:hAnsi="Arial" w:eastAsia="Arial" w:cs="Arial"/>
           <w:b/>
         </w:rPr>
-        <w:t>When the rankings differ.</w:t>
+        <w:t>Activity and revenue rank groups differently.</w:t>
       </w:r>
       <w:r>
         <w:rPr>
           <w:rFonts w:ascii="Arial" w:hAnsi="Arial" w:eastAsia="Arial" w:cs="Arial"/>
         </w:rPr>
-        <w:t xml:space="preserve"> On median revenue (Table 4), Yarra Ranges houses rank second and City two-bedroom apartments fifth, mainly because the houses charge more a night (AUD 426 against 285). With rents unknown, activity guides the search; revenue tests each lease.</w:t>
+        <w:t xml:space="preserve"> On median revenue, Yarra Ranges houses rank second of 14 and City two-bedroom apartments fifth, because the houses charge more a night (AUD 426 against 285). Without rents, revenue cannot show which lease is better, so activity guides the search and revenue tests each lease.</w:t>
       </w:r>
     </w:p>
     <w:p>
@@ -3362,7 +3415,7 @@
         <w:rPr>
           <w:rFonts w:ascii="Arial" w:hAnsi="Arial" w:eastAsia="Arial" w:cs="Arial"/>
         </w:rPr>
-        <w:t xml:space="preserve">Holding other inputs fixed, three settings an operator controls go with busy homes (Figure 3; Table A1). A typical City two-bedroom apartment has a </w:t>
+        <w:t xml:space="preserve">Holding other inputs fixed, a typical City two-bedroom apartment has a </w:t>
       </w:r>
       <w:r>
         <w:rPr>
@@ -3375,7 +3428,7 @@
         <w:rPr>
           <w:rFonts w:ascii="Arial" w:hAnsi="Arial" w:eastAsia="Arial" w:cs="Arial"/>
         </w:rPr>
-        <w:t xml:space="preserve"> chance of being busy with one-night stays but </w:t>
+        <w:t xml:space="preserve"> chance of being busy with one-night stays, but </w:t>
       </w:r>
       <w:r>
         <w:rPr>
@@ -3388,7 +3441,7 @@
         <w:rPr>
           <w:rFonts w:ascii="Arial" w:hAnsi="Arial" w:eastAsia="Arial" w:cs="Arial"/>
         </w:rPr>
-        <w:t xml:space="preserve"> with a two-night minimum or longer. Pricing 20% above similar homes lowers it to </w:t>
+        <w:t xml:space="preserve"> with a two-night minimum or longer (Figure 3). Pricing 20% above similar homes lowers the chance to </w:t>
       </w:r>
       <w:r>
         <w:rPr>
@@ -3401,7 +3454,7 @@
         <w:rPr>
           <w:rFonts w:ascii="Arial" w:hAnsi="Arial" w:eastAsia="Arial" w:cs="Arial"/>
         </w:rPr>
-        <w:t xml:space="preserve">; ten more amenities raise it to </w:t>
+        <w:t xml:space="preserve">, and ten more amenities raise it to </w:t>
       </w:r>
       <w:r>
         <w:rPr>
@@ -3414,7 +3467,7 @@
         <w:rPr>
           <w:rFonts w:ascii="Arial" w:hAnsi="Arial" w:eastAsia="Arial" w:cs="Arial"/>
         </w:rPr>
-        <w:t>. These are associations: changing a setting alone does not guarantee more bookings.</w:t>
+        <w:t>. The same apartment would score 26–27% in Port Phillip or Stonnington. These are associations, not guarantees.</w:t>
       </w:r>
     </w:p>
     <w:p>
@@ -3487,46 +3540,7 @@
         <w:rPr>
           <w:rFonts w:ascii="Arial" w:hAnsi="Arial" w:eastAsia="Arial" w:cs="Arial"/>
         </w:rPr>
-        <w:t xml:space="preserve">A simple two-setting rule captures most of this (Table 5). In the priority groups, </w:t>
-      </w:r>
-      <w:r>
-        <w:rPr>
-          <w:rFonts w:ascii="Arial" w:hAnsi="Arial" w:eastAsia="Arial" w:cs="Arial"/>
-          <w:b/>
-        </w:rPr>
-        <w:t>50.4%</w:t>
-      </w:r>
-      <w:r>
-        <w:rPr>
-          <w:rFonts w:ascii="Arial" w:hAnsi="Arial" w:eastAsia="Arial" w:cs="Arial"/>
-        </w:rPr>
-        <w:t xml:space="preserve"> of homes that accepted one-night stays and were priced at or below their group median were busy, against </w:t>
-      </w:r>
-      <w:r>
-        <w:rPr>
-          <w:rFonts w:ascii="Arial" w:hAnsi="Arial" w:eastAsia="Arial" w:cs="Arial"/>
-          <w:b/>
-        </w:rPr>
-        <w:t>33.4%</w:t>
-      </w:r>
-      <w:r>
-        <w:rPr>
-          <w:rFonts w:ascii="Arial" w:hAnsi="Arial" w:eastAsia="Arial" w:cs="Arial"/>
-        </w:rPr>
-        <w:t xml:space="preserve"> of all their homes and </w:t>
-      </w:r>
-      <w:r>
-        <w:rPr>
-          <w:rFonts w:ascii="Arial" w:hAnsi="Arial" w:eastAsia="Arial" w:cs="Arial"/>
-          <w:b/>
-        </w:rPr>
-        <w:t>9.3%</w:t>
-      </w:r>
-      <w:r>
-        <w:rPr>
-          <w:rFonts w:ascii="Arial" w:hAnsi="Arial" w:eastAsia="Arial" w:cs="Arial"/>
-        </w:rPr>
-        <w:t xml:space="preserve"> of homes with neither. Only 20 of 90 Yarra Ranges houses accept one-night stays, so the rule rests mainly on City apartments.</w:t>
+        <w:t>A two-setting rule captures most of this (Table 5). In the priority groups, half (50.4%) of homes with one-night stays priced at or below their group median were busy, against a third (33.4%) of all their homes and 9.3% with neither setting. Only 20 of 90 Yarra Ranges houses accept one-night stays, so the rule rests mainly on City apartments.</w:t>
       </w:r>
     </w:p>
     <w:p>
@@ -3793,46 +3807,7 @@
         <w:rPr>
           <w:rFonts w:ascii="Arial" w:hAnsi="Arial" w:eastAsia="Arial" w:cs="Arial"/>
         </w:rPr>
-        <w:t xml:space="preserve">Tested on unseen hosts, </w:t>
-      </w:r>
-      <w:r>
-        <w:rPr>
-          <w:rFonts w:ascii="Arial" w:hAnsi="Arial" w:eastAsia="Arial" w:cs="Arial"/>
-          <w:b/>
-        </w:rPr>
-        <w:t>49.6%</w:t>
-      </w:r>
-      <w:r>
-        <w:rPr>
-          <w:rFonts w:ascii="Arial" w:hAnsi="Arial" w:eastAsia="Arial" w:cs="Arial"/>
-        </w:rPr>
-        <w:t xml:space="preserve"> of the model's top quarter in each priority group were busy, against </w:t>
-      </w:r>
-      <w:r>
-        <w:rPr>
-          <w:rFonts w:ascii="Arial" w:hAnsi="Arial" w:eastAsia="Arial" w:cs="Arial"/>
-          <w:b/>
-        </w:rPr>
-        <w:t>38.6%</w:t>
-      </w:r>
-      <w:r>
-        <w:rPr>
-          <w:rFonts w:ascii="Arial" w:hAnsi="Arial" w:eastAsia="Arial" w:cs="Arial"/>
-        </w:rPr>
-        <w:t xml:space="preserve"> for the reduced model and </w:t>
-      </w:r>
-      <w:r>
-        <w:rPr>
-          <w:rFonts w:ascii="Arial" w:hAnsi="Arial" w:eastAsia="Arial" w:cs="Arial"/>
-          <w:b/>
-        </w:rPr>
-        <w:t>32.4%</w:t>
-      </w:r>
-      <w:r>
-        <w:rPr>
-          <w:rFonts w:ascii="Arial" w:hAnsi="Arial" w:eastAsia="Arial" w:cs="Arial"/>
-        </w:rPr>
-        <w:t xml:space="preserve"> for random picking (Figure 4); the model beat random picking in 46 of 50 tests. The two-setting rule does about as well (it picks 28% of homes), though it was checked on the homes that suggested it. The model also separates location from settings: with the same settings, the typical apartment's 42% chance would be 26–27% in Port Phillip or Stonnington (Figure 3). Table A2 gives its hits and misses across all 14 groups.</w:t>
+        <w:t>On unseen hosts, 49.6% of the model's picks were busy, against 38.6% for the reduced model and 32.4% for random picking (Figure 4; full results in Tables A2 and A3). The rule matched the model (it picks 28% of homes), though we checked it only on the homes that suggested it. The model's value is in finding which settings matter; the client can apply them as a checklist.</w:t>
       </w:r>
     </w:p>
     <w:p>
@@ -3892,7 +3867,7 @@
         <w:rPr>
           <w:rFonts w:ascii="Arial" w:hAnsi="Arial" w:eastAsia="Arial" w:cs="Arial"/>
         </w:rPr>
-        <w:t xml:space="preserve"> Busy share of picked homes (a quarter of each priority group), averaged over 50 tests.</w:t>
+        <w:t xml:space="preserve"> Share of picked homes that were busy (a quarter of each priority group), averaged over 50 tests.</w:t>
       </w:r>
     </w:p>
     <w:p>
@@ -3917,20 +3892,7 @@
         <w:rPr>
           <w:rFonts w:ascii="Arial" w:hAnsi="Arial" w:eastAsia="Arial" w:cs="Arial"/>
         </w:rPr>
-        <w:t>We ranked ten groups (2,657 homes with two years' history) on the earlier year. The priority groups came top: 33.6% of their homes reached 34 reviews (the earlier year's reference level), against 19.9% elsewhere (Figure 5). A year later they still led (</w:t>
-      </w:r>
-      <w:r>
-        <w:rPr>
-          <w:rFonts w:ascii="Arial" w:hAnsi="Arial" w:eastAsia="Arial" w:cs="Arial"/>
-          <w:b/>
-        </w:rPr>
-        <w:t>27.1% against 14.9%</w:t>
-      </w:r>
-      <w:r>
-        <w:rPr>
-          <w:rFonts w:ascii="Arial" w:hAnsi="Arial" w:eastAsia="Arial" w:cs="Arial"/>
-        </w:rPr>
-        <w:t>) and remained the top three, although Yarra Ranges houses fell to 21.4%.</w:t>
+        <w:t>Ranked on the earlier year, the same three groups led ten groups (2,657 homes with two years of reviews): 33.6% of their homes reached 34 reviews, the earlier year's reference level, against 19.9% elsewhere (Figure 5). A year later they still led (27.1% against 14.9%), although Yarra Ranges houses fell to 21.4%.</w:t>
       </w:r>
     </w:p>
     <w:p>
@@ -4043,7 +4005,7 @@
         <w:rPr>
           <w:rFonts w:ascii="Arial" w:hAnsi="Arial" w:eastAsia="Arial" w:cs="Arial"/>
         </w:rPr>
-        <w:t xml:space="preserve"> City of Melbourne two- and three-bedroom apartments led on busy homes, then Yarra Ranges three-bedroom houses, less certainly; all three stayed ahead a year later and had above-median revenue (Figures 2 and 5, Table 4).</w:t>
+        <w:t xml:space="preserve"> City of Melbourne two- and three-bedroom apartments had the most busy homes, then, less certainly, Yarra Ranges three-bedroom houses. All three stayed ahead a year later and had above-median revenue (Figures 2 and 5, Table 4).</w:t>
       </w:r>
     </w:p>
     <w:p>
@@ -4065,13 +4027,13 @@
           <w:rFonts w:ascii="Arial" w:hAnsi="Arial" w:eastAsia="Arial" w:cs="Arial"/>
           <w:b/>
         </w:rPr>
-        <w:t>What goes with high activity:</w:t>
+        <w:t>What goes with being busy:</w:t>
       </w:r>
       <w:r>
         <w:rPr>
           <w:rFonts w:ascii="Arial" w:hAnsi="Arial" w:eastAsia="Arial" w:cs="Arial"/>
         </w:rPr>
-        <w:t xml:space="preserve"> One-night stays, a price at or below similar homes and, with other inputs fixed, more amenities (Figure 3). In the priority groups, 50.4% of homes with the first two were busy, against 9.3% with neither (Table 5), though one-night stays partly inflate review counts. Busy homes were also better rated (Table 3).</w:t>
+        <w:t xml:space="preserve"> one-night stays and a price at or below similar homes (Figure 3, Table 5), though shorter stays partly inflate review counts.</w:t>
       </w:r>
     </w:p>
     <w:p>
@@ -4093,13 +4055,41 @@
           <w:rFonts w:ascii="Arial" w:hAnsi="Arial" w:eastAsia="Arial" w:cs="Arial"/>
           <w:b/>
         </w:rPr>
+        <w:t>Satisfied guests:</w:t>
+      </w:r>
+      <w:r>
+        <w:rPr>
+          <w:rFonts w:ascii="Arial" w:hAnsi="Arial" w:eastAsia="Arial" w:cs="Arial"/>
+        </w:rPr>
+        <w:t xml:space="preserve"> busy homes were rated higher and drew fewer negative reviews (Table 3).</w:t>
+      </w:r>
+    </w:p>
+    <w:p>
+      <w:pPr>
+        <w:widowControl/>
+        <w:spacing w:after="80" w:line="259" w:lineRule="auto"/>
+        <w:ind w:left="432" w:hanging="432"/>
+        <w:jc w:val="left"/>
+      </w:pPr>
+      <w:r>
+        <w:rPr>
+          <w:rFonts w:ascii="Arial" w:hAnsi="Arial" w:eastAsia="Arial" w:cs="Arial"/>
+        </w:rPr>
+        <w:t>4.</w:t>
+        <w:tab/>
+      </w:r>
+      <w:r>
+        <w:rPr>
+          <w:rFonts w:ascii="Arial" w:hAnsi="Arial" w:eastAsia="Arial" w:cs="Arial"/>
+          <w:b/>
+        </w:rPr>
         <w:t>Which home first:</w:t>
       </w:r>
       <w:r>
         <w:rPr>
           <w:rFonts w:ascii="Arial" w:hAnsi="Arial" w:eastAsia="Arial" w:cs="Arial"/>
         </w:rPr>
-        <w:t xml:space="preserve"> These two settings found 50.4% busy, near the model's 49.6%, though only the model was tested on unseen hosts; random picking found 32.4% (Table 5, Figure 4).</w:t>
+        <w:t xml:space="preserve"> the two settings picked busy homes about as well as the model (50.4% against 49.6%), though only the model was tested on unseen hosts (Table 5, Figure 4).</w:t>
       </w:r>
     </w:p>
     <w:p>
@@ -4139,7 +4129,7 @@
         <w:rPr>
           <w:rFonts w:ascii="Arial" w:hAnsi="Arial" w:eastAsia="Arial" w:cs="Arial"/>
         </w:rPr>
-        <w:t xml:space="preserve"> (Figure 2, Table 4). Between leases that pass, choose the larger cash-flow margin; if margins are similar, choose the group with the higher share of busy homes.</w:t>
+        <w:t xml:space="preserve"> (Figure 2, Table 4). Between leases that pass Recommendation 3, choose the larger cash-flow margin; if margins are similar, choose the group with more busy homes.</w:t>
       </w:r>
     </w:p>
     <w:p>
@@ -4161,13 +4151,13 @@
           <w:rFonts w:ascii="Arial" w:hAnsi="Arial" w:eastAsia="Arial" w:cs="Arial"/>
           <w:b/>
         </w:rPr>
-        <w:t>Prefer homes that can take one-night stays at a price at or below similar listings</w:t>
+        <w:t>Favour homes that can take one-night stays at a price at or below similar listings</w:t>
       </w:r>
       <w:r>
         <w:rPr>
           <w:rFonts w:ascii="Arial" w:hAnsi="Arial" w:eastAsia="Arial" w:cs="Arial"/>
         </w:rPr>
-        <w:t xml:space="preserve"> (Table 5, Figure 3). At inspection, check that building rules allow one-night stays and that this price covers costs (Recommendation 3); then trial these settings and track results (Table 6).</w:t>
+        <w:t xml:space="preserve"> (Figure 3, Table 5). At inspection, check that building rules allow one-night stays and that this price covers costs. Trial these settings and track the results (Table 6).</w:t>
       </w:r>
     </w:p>
     <w:p>
@@ -4189,7 +4179,7 @@
           <w:rFonts w:ascii="Arial" w:hAnsi="Arial" w:eastAsia="Arial" w:cs="Arial"/>
           <w:b/>
         </w:rPr>
-        <w:t>Compare weekly rent and running costs with group revenue</w:t>
+        <w:t>Drop leases whose weekly costs exceed the group's typical revenue</w:t>
       </w:r>
       <w:r>
         <w:rPr>
@@ -4234,20 +4224,20 @@
         <w:rPr>
           <w:rFonts w:ascii="Arial" w:hAnsi="Arial" w:eastAsia="Arial" w:cs="Arial"/>
         </w:rPr>
-        <w:t xml:space="preserve"> for Yarra Ranges houses, but </w:t>
+        <w:t xml:space="preserve"> for Yarra Ranges houses, but only half of homes reach it; homes that were not busy earned </w:t>
       </w:r>
       <w:r>
         <w:rPr>
           <w:rFonts w:ascii="Arial" w:hAnsi="Arial" w:eastAsia="Arial" w:cs="Arial"/>
           <w:b/>
         </w:rPr>
-        <w:t>320, 620 and 600</w:t>
+        <w:t>AUD 320, 620 and 600</w:t>
       </w:r>
       <w:r>
         <w:rPr>
           <w:rFonts w:ascii="Arial" w:hAnsi="Arial" w:eastAsia="Arial" w:cs="Arial"/>
         </w:rPr>
-        <w:t xml:space="preserve"> for homes below target (under 30 reviews). Because these are medians, only half of a group's homes covered a cost equal to its typical figure. Drop candidates costing more than typical revenue, assess the rest through their own cash-flow plans, and budget for a year of the below-target shortfall.</w:t>
+        <w:t>. Assess the remaining leases with their own cash-flow plans, and hold enough cash for a year at that lower level.</w:t>
       </w:r>
     </w:p>
     <w:p>
@@ -4287,9 +4277,9 @@
         <w:tblLayout w:type="fixed"/>
       </w:tblPr>
       <w:tblGrid>
-        <w:gridCol w:w="1949"/>
-        <w:gridCol w:w="4736"/>
-        <w:gridCol w:w="3180"/>
+        <w:gridCol w:w="1983"/>
+        <w:gridCol w:w="4777"/>
+        <w:gridCol w:w="3105"/>
       </w:tblGrid>
       <w:tr>
         <w:trPr>
@@ -4298,7 +4288,7 @@
         </w:trPr>
         <w:tc>
           <w:tcPr>
-            <w:tcW w:type="dxa" w:w="1949"/>
+            <w:tcW w:type="dxa" w:w="1983"/>
             <w:vAlign w:val="center"/>
             <w:shd w:val="clear" w:color="auto" w:fill="E9EEF3"/>
           </w:tcPr>
@@ -4320,7 +4310,7 @@
         </w:tc>
         <w:tc>
           <w:tcPr>
-            <w:tcW w:type="dxa" w:w="4736"/>
+            <w:tcW w:type="dxa" w:w="4777"/>
             <w:vAlign w:val="center"/>
             <w:shd w:val="clear" w:color="auto" w:fill="E9EEF3"/>
           </w:tcPr>
@@ -4342,7 +4332,7 @@
         </w:tc>
         <w:tc>
           <w:tcPr>
-            <w:tcW w:type="dxa" w:w="3180"/>
+            <w:tcW w:type="dxa" w:w="3105"/>
             <w:vAlign w:val="center"/>
             <w:shd w:val="clear" w:color="auto" w:fill="E9EEF3"/>
           </w:tcPr>
@@ -4369,7 +4359,7 @@
         </w:trPr>
         <w:tc>
           <w:tcPr>
-            <w:tcW w:type="dxa" w:w="1949"/>
+            <w:tcW w:type="dxa" w:w="1983"/>
             <w:vAlign w:val="center"/>
             <w:shd w:val="clear" w:color="auto" w:fill="FFFFFF"/>
           </w:tcPr>
@@ -4398,7 +4388,7 @@
         </w:tc>
         <w:tc>
           <w:tcPr>
-            <w:tcW w:type="dxa" w:w="4736"/>
+            <w:tcW w:type="dxa" w:w="4777"/>
             <w:vAlign w:val="center"/>
             <w:shd w:val="clear" w:color="auto" w:fill="FFFFFF"/>
           </w:tcPr>
@@ -4419,7 +4409,7 @@
         </w:tc>
         <w:tc>
           <w:tcPr>
-            <w:tcW w:type="dxa" w:w="3180"/>
+            <w:tcW w:type="dxa" w:w="3105"/>
             <w:vAlign w:val="center"/>
             <w:shd w:val="clear" w:color="auto" w:fill="FFFFFF"/>
           </w:tcPr>
@@ -4445,7 +4435,7 @@
         </w:trPr>
         <w:tc>
           <w:tcPr>
-            <w:tcW w:type="dxa" w:w="1949"/>
+            <w:tcW w:type="dxa" w:w="1983"/>
             <w:vAlign w:val="center"/>
             <w:shd w:val="clear" w:color="auto" w:fill="FFFFFF"/>
           </w:tcPr>
@@ -4474,7 +4464,7 @@
         </w:tc>
         <w:tc>
           <w:tcPr>
-            <w:tcW w:type="dxa" w:w="4736"/>
+            <w:tcW w:type="dxa" w:w="4777"/>
             <w:vAlign w:val="center"/>
             <w:shd w:val="clear" w:color="auto" w:fill="FFFFFF"/>
           </w:tcPr>
@@ -4489,13 +4479,13 @@
                 <w:rFonts w:ascii="Arial" w:hAnsi="Arial" w:eastAsia="Arial" w:cs="Arial"/>
                 <w:sz w:val="21"/>
               </w:rPr>
-              <w:t>Get written landlord consent; check that no owners' corporation rule bans stays under 28 days (Consumer Affairs Victoria, n.d.); negotiate rent; get cost quotes</w:t>
+              <w:t>Get written landlord consent; check owners' corporation rules on stays under 28 days (Consumer Affairs Victoria, n.d.); negotiate rent; get cost quotes</w:t>
             </w:r>
           </w:p>
         </w:tc>
         <w:tc>
           <w:tcPr>
-            <w:tcW w:type="dxa" w:w="3180"/>
+            <w:tcW w:type="dxa" w:w="3105"/>
             <w:vAlign w:val="center"/>
             <w:shd w:val="clear" w:color="auto" w:fill="FFFFFF"/>
           </w:tcPr>
@@ -4521,7 +4511,7 @@
         </w:trPr>
         <w:tc>
           <w:tcPr>
-            <w:tcW w:type="dxa" w:w="1949"/>
+            <w:tcW w:type="dxa" w:w="1983"/>
             <w:vAlign w:val="center"/>
             <w:shd w:val="clear" w:color="auto" w:fill="FFFFFF"/>
           </w:tcPr>
@@ -4550,7 +4540,7 @@
         </w:tc>
         <w:tc>
           <w:tcPr>
-            <w:tcW w:type="dxa" w:w="4736"/>
+            <w:tcW w:type="dxa" w:w="4777"/>
             <w:vAlign w:val="center"/>
             <w:shd w:val="clear" w:color="auto" w:fill="FFFFFF"/>
           </w:tcPr>
@@ -4565,13 +4555,13 @@
                 <w:rFonts w:ascii="Arial" w:hAnsi="Arial" w:eastAsia="Arial" w:cs="Arial"/>
                 <w:sz w:val="21"/>
               </w:rPr>
-              <w:t>Cash-flow plan: quotes and Victoria's 7.5% short-stay levy (State Revenue Office Victoria, n.d.) against typical and below-target revenue (Recommendation 3)</w:t>
+              <w:t>Cash-flow plan: quotes and Victoria's 7.5% short-stay levy (State Revenue Office Victoria, n.d.) against typical and not-busy revenue (Recommendation 3)</w:t>
             </w:r>
           </w:p>
         </w:tc>
         <w:tc>
           <w:tcPr>
-            <w:tcW w:type="dxa" w:w="3180"/>
+            <w:tcW w:type="dxa" w:w="3105"/>
             <w:vAlign w:val="center"/>
             <w:shd w:val="clear" w:color="auto" w:fill="FFFFFF"/>
           </w:tcPr>
@@ -4586,7 +4576,7 @@
                 <w:rFonts w:ascii="Arial" w:hAnsi="Arial" w:eastAsia="Arial" w:cs="Arial"/>
                 <w:sz w:val="21"/>
               </w:rPr>
-              <w:t>Sign only if the plan covers setup costs, required return and a year of below-target loss</w:t>
+              <w:t>Sign only if the plan covers setup costs, required return and a year at the not-busy level</w:t>
             </w:r>
           </w:p>
         </w:tc>
@@ -4597,7 +4587,7 @@
         </w:trPr>
         <w:tc>
           <w:tcPr>
-            <w:tcW w:type="dxa" w:w="1949"/>
+            <w:tcW w:type="dxa" w:w="1983"/>
             <w:vAlign w:val="center"/>
             <w:shd w:val="clear" w:color="auto" w:fill="FFFFFF"/>
           </w:tcPr>
@@ -4625,7 +4615,7 @@
         </w:tc>
         <w:tc>
           <w:tcPr>
-            <w:tcW w:type="dxa" w:w="4736"/>
+            <w:tcW w:type="dxa" w:w="4777"/>
             <w:vAlign w:val="center"/>
             <w:shd w:val="clear" w:color="auto" w:fill="FFFFFF"/>
           </w:tcPr>
@@ -4645,7 +4635,7 @@
         </w:tc>
         <w:tc>
           <w:tcPr>
-            <w:tcW w:type="dxa" w:w="3180"/>
+            <w:tcW w:type="dxa" w:w="3105"/>
             <w:vAlign w:val="center"/>
             <w:shd w:val="clear" w:color="auto" w:fill="FFFFFF"/>
           </w:tcPr>
@@ -4762,7 +4752,7 @@
         <w:rPr>
           <w:rFonts w:ascii="Arial" w:hAnsi="Arial" w:eastAsia="Arial" w:cs="Arial"/>
         </w:rPr>
-        <w:t xml:space="preserve"> a week in rent and running costs exceeds its group's typical AUD 590 and is dropped. A Yarra Ranges house costing </w:t>
+        <w:t xml:space="preserve"> a week in rent and running costs exceeds its group's typical AUD 590, so it is dropped. A Yarra Ranges house costing </w:t>
       </w:r>
       <w:r>
         <w:rPr>
@@ -4775,7 +4765,7 @@
         <w:rPr>
           <w:rFonts w:ascii="Arial" w:hAnsi="Arial" w:eastAsia="Arial" w:cs="Arial"/>
         </w:rPr>
-        <w:t xml:space="preserve"> clears its typical AUD 890; earning like a below-target home (AUD 600), it would lose AUD 100 a week, so the buffer needs AUD 5,200 a year.</w:t>
+        <w:t xml:space="preserve"> clears its typical AUD 890. Earning like a home that is not busy (AUD 600), it would need a buffer of AUD 5,200 for the year.</w:t>
       </w:r>
     </w:p>
     <w:p>
@@ -4809,7 +4799,7 @@
         <w:rPr>
           <w:rFonts w:ascii="Arial" w:hAnsi="Arial" w:eastAsia="Arial" w:cs="Arial"/>
         </w:rPr>
-        <w:t xml:space="preserve"> Inside Airbnb's 50% review rate sits within published estimates of 30.5%–72% (Inside Airbnb, n.d.), so dollar figures are rough; activity also fell in the later year (Figure 5). Ratings are lifetime averages near five stars.</w:t>
+        <w:t xml:space="preserve"> Inside Airbnb's 50% review rate sits within published estimates of 30.5%–72% (Inside Airbnb, n.d.), so dollar figures are rough. Ratings are lifetime averages, and the text tool reads English best.</w:t>
       </w:r>
     </w:p>
     <w:p>
@@ -4830,7 +4820,7 @@
         <w:rPr>
           <w:rFonts w:ascii="Arial" w:hAnsi="Arial" w:eastAsia="Arial" w:cs="Arial"/>
         </w:rPr>
-        <w:t xml:space="preserve"> Homes that left Airbnb are missing, revenue uses June–July prices, and new, unpriced and outer-area listings are not covered.</w:t>
+        <w:t xml:space="preserve"> Departed, new, unpriced and outer-area listings are missing, and revenue uses June–July prices. The two-year check uses the same snapshot.</w:t>
       </w:r>
     </w:p>
     <w:p>
@@ -4845,13 +4835,13 @@
           <w:rFonts w:ascii="Arial" w:hAnsi="Arial" w:eastAsia="Arial" w:cs="Arial"/>
           <w:b/>
         </w:rPr>
-        <w:t>Short stays inflate reviews and revenue.</w:t>
+        <w:t>Short stays inflate reviews.</w:t>
       </w:r>
       <w:r>
         <w:rPr>
           <w:rFonts w:ascii="Arial" w:hAnsi="Arial" w:eastAsia="Arial" w:cs="Arial"/>
         </w:rPr>
-        <w:t xml:space="preserve"> A one-night minimum allows more stays for the same nights, so part of its effect is built into the target, and counting each stay as three nights may overstate revenue.</w:t>
+        <w:t xml:space="preserve"> A one-night minimum allows more stays for the same nights booked.</w:t>
       </w:r>
     </w:p>
     <w:p>
@@ -4872,7 +4862,7 @@
         <w:rPr>
           <w:rFonts w:ascii="Arial" w:hAnsi="Arial" w:eastAsia="Arial" w:cs="Arial"/>
         </w:rPr>
-        <w:t xml:space="preserve"> Settings may respond to earlier performance, and we chose the inputs, rule and priority groups after seeing all homes, so the tests may overstate the gain.</w:t>
+        <w:t xml:space="preserve"> Settings may respond to past performance, and we chose the inputs, rule and priority groups after seeing all homes.</w:t>
       </w:r>
     </w:p>
     <w:p>
@@ -4906,7 +4896,70 @@
         <w:rPr>
           <w:rFonts w:ascii="Arial" w:hAnsi="Arial" w:eastAsia="Arial" w:cs="Arial"/>
         </w:rPr>
-        <w:t>Next, collect rent and cost quotes, track paid nights and net cash flow to test whether review activity identifies good businesses, analyse review text in the priority groups, and recheck the groups, model and two-setting rule on the next snapshot.</w:t>
+        <w:t>Future work should:</w:t>
+      </w:r>
+    </w:p>
+    <w:p>
+      <w:pPr>
+        <w:widowControl/>
+        <w:spacing w:after="80" w:line="259" w:lineRule="auto"/>
+        <w:ind w:left="432" w:hanging="432"/>
+        <w:jc w:val="left"/>
+      </w:pPr>
+      <w:r>
+        <w:rPr>
+          <w:rFonts w:ascii="Arial" w:hAnsi="Arial" w:eastAsia="Arial" w:cs="Arial"/>
+        </w:rPr>
+        <w:t>1.</w:t>
+        <w:tab/>
+      </w:r>
+      <w:r>
+        <w:rPr>
+          <w:rFonts w:ascii="Arial" w:hAnsi="Arial" w:eastAsia="Arial" w:cs="Arial"/>
+        </w:rPr>
+        <w:t>collect rent and cost quotes and track paid nights and net cash flow, to test whether busy homes are also profitable;</w:t>
+      </w:r>
+    </w:p>
+    <w:p>
+      <w:pPr>
+        <w:widowControl/>
+        <w:spacing w:after="80" w:line="259" w:lineRule="auto"/>
+        <w:ind w:left="432" w:hanging="432"/>
+        <w:jc w:val="left"/>
+      </w:pPr>
+      <w:r>
+        <w:rPr>
+          <w:rFonts w:ascii="Arial" w:hAnsi="Arial" w:eastAsia="Arial" w:cs="Arial"/>
+        </w:rPr>
+        <w:t>2.</w:t>
+        <w:tab/>
+      </w:r>
+      <w:r>
+        <w:rPr>
+          <w:rFonts w:ascii="Arial" w:hAnsi="Arial" w:eastAsia="Arial" w:cs="Arial"/>
+        </w:rPr>
+        <w:t>retest the groups, model and two-setting rule, unchanged, on the next snapshot;</w:t>
+      </w:r>
+    </w:p>
+    <w:p>
+      <w:pPr>
+        <w:widowControl/>
+        <w:spacing w:after="80" w:line="259" w:lineRule="auto"/>
+        <w:ind w:left="432" w:hanging="432"/>
+        <w:jc w:val="left"/>
+      </w:pPr>
+      <w:r>
+        <w:rPr>
+          <w:rFonts w:ascii="Arial" w:hAnsi="Arial" w:eastAsia="Arial" w:cs="Arial"/>
+        </w:rPr>
+        <w:t>3.</w:t>
+        <w:tab/>
+      </w:r>
+      <w:r>
+        <w:rPr>
+          <w:rFonts w:ascii="Arial" w:hAnsi="Arial" w:eastAsia="Arial" w:cs="Arial"/>
+        </w:rPr>
+        <w:t>read the negative reviews of priority-group homes to find problems an operator can fix.</w:t>
       </w:r>
     </w:p>
     <w:p>
@@ -5010,6 +5063,44 @@
         <w:rPr>
           <w:rFonts w:ascii="Arial" w:hAnsi="Arial" w:eastAsia="Arial" w:cs="Arial"/>
         </w:rPr>
+        <w:t xml:space="preserve">Hutto, C., &amp; Gilbert, E. (2014). VADER: A parsimonious rule-based model for sentiment analysis of social media text. </w:t>
+      </w:r>
+      <w:r>
+        <w:rPr>
+          <w:rFonts w:ascii="Arial" w:hAnsi="Arial" w:eastAsia="Arial" w:cs="Arial"/>
+          <w:i/>
+        </w:rPr>
+        <w:t>Proceedings of the International AAAI Conference on Web and Social Media, 8</w:t>
+      </w:r>
+      <w:r>
+        <w:rPr>
+          <w:rFonts w:ascii="Arial" w:hAnsi="Arial" w:eastAsia="Arial" w:cs="Arial"/>
+        </w:rPr>
+        <w:t xml:space="preserve">(1), 216–225. </w:t>
+      </w:r>
+      <w:hyperlink r:id="rId27">
+        <w:r>
+          <w:rPr>
+            <w:rFonts w:ascii="Arial" w:hAnsi="Arial" w:eastAsia="Arial" w:cs="Arial"/>
+            <w:color w:val="0563C1"/>
+            <w:u w:val="single"/>
+          </w:rPr>
+          <w:t xml:space="preserve">https://doi.org/10.1609/icwsm.v8i1.14550</w:t>
+        </w:r>
+      </w:hyperlink>
+    </w:p>
+    <w:p>
+      <w:pPr>
+        <w:keepLines/>
+        <w:widowControl/>
+        <w:spacing w:after="120" w:line="360" w:lineRule="auto"/>
+        <w:ind w:left="720" w:hanging="720"/>
+        <w:jc w:val="left"/>
+      </w:pPr>
+      <w:r>
+        <w:rPr>
+          <w:rFonts w:ascii="Arial" w:hAnsi="Arial" w:eastAsia="Arial" w:cs="Arial"/>
+        </w:rPr>
         <w:t xml:space="preserve">Inside Airbnb. (n.d.). </w:t>
       </w:r>
       <w:r>
@@ -5025,7 +5116,7 @@
         </w:rPr>
         <w:t xml:space="preserve">. Retrieved October 16, 2026, from </w:t>
       </w:r>
-      <w:hyperlink r:id="rId27">
+      <w:hyperlink r:id="rId28">
         <w:r>
           <w:rPr>
             <w:rFonts w:ascii="Arial" w:hAnsi="Arial" w:eastAsia="Arial" w:cs="Arial"/>
@@ -5101,7 +5192,7 @@
         </w:rPr>
         <w:t xml:space="preserve"> (Version 4.5.3) [Computer software]. R Foundation for Statistical Computing. </w:t>
       </w:r>
-      <w:hyperlink r:id="rId28">
+      <w:hyperlink r:id="rId29">
         <w:r>
           <w:rPr>
             <w:rFonts w:ascii="Arial" w:hAnsi="Arial" w:eastAsia="Arial" w:cs="Arial"/>
@@ -5139,7 +5230,7 @@
         </w:rPr>
         <w:t xml:space="preserve">. Retrieved October 16, 2026, from </w:t>
       </w:r>
-      <w:hyperlink r:id="rId29">
+      <w:hyperlink r:id="rId30">
         <w:r>
           <w:rPr>
             <w:rFonts w:ascii="Arial" w:hAnsi="Arial" w:eastAsia="Arial" w:cs="Arial"/>
@@ -5210,7 +5301,7 @@
         <w:rPr>
           <w:rFonts w:ascii="Arial" w:hAnsi="Arial" w:eastAsia="Arial" w:cs="Arial"/>
         </w:rPr>
-        <w:t>Appendix A. Model Details</w:t>
+        <w:t>Appendix A. Model Details and Further Checks</w:t>
       </w:r>
     </w:p>
     <w:p>
@@ -5223,7 +5314,7 @@
         <w:rPr>
           <w:rFonts w:ascii="Arial" w:hAnsi="Arial" w:eastAsia="Arial" w:cs="Arial"/>
         </w:rPr>
-        <w:t>Group median prices and stand-ins for missing minimum stays use only homes each model was built on. In Table A1, each odds ratio (from the input's average weight over the 50 fits) multiplies the odds of being busy (busy homes per quiet home); above 1 raises the chance, below 1 lowers it.</w:t>
+        <w:t>In Table A1, each odds ratio multiplies the odds of being busy (busy homes per home that is not busy), averaged over the 50 fits; above 1 raises the chance, below 1 lowers it.</w:t>
       </w:r>
     </w:p>
     <w:p>
@@ -6157,7 +6248,7 @@
         <w:rPr>
           <w:rFonts w:ascii="Arial" w:hAnsi="Arial" w:eastAsia="Arial" w:cs="Arial"/>
         </w:rPr>
-        <w:t>The ranges show stability across fits, not confidence intervals; those including 1 (for example, Yarra Ranges) leave the direction uncertain. Across all 14 groups, the model ranked a random busy home above a random quiet one 71% of the time, against 60% for group rates (AUC 0.71 and 0.60). Treating same-host homes as related widens margins of error to 1.1–2.6 times ordinary ones. Inputs overlap little (variance inflation factors below 3). An ordinary test of curved price and amenity effects suggests slight curvature (p = 0.03; amenities alone, p = 0.011); treating same-host homes as related makes this unclear (amenities, p = 0.17). Full evaluation tables are in the repository (Huang &amp; Xu, 2026).</w:t>
+        <w:t>Ranges show stability across fits, not confidence intervals; those including 1 (for example, Yarra Ranges) leave the direction uncertain. Across all 14 groups, the model ranked a random busy home above a random home that was not busy 71% of the time, against 60% for group rates (AUC 0.71 and 0.60). Treating same-host homes as related widens margins of error to 1.1–2.6 times ordinary ones. Inputs overlap little (variance inflation factors below 3). An ordinary test of curved price and amenity effects suggests slight curvature (p = 0.03; amenities alone, p = 0.011), but this is unclear once same-host homes are treated as related (amenities, p = 0.17). Full evaluation tables are in the repository (Huang &amp; Xu, 2026).</w:t>
       </w:r>
     </w:p>
     <w:p>
@@ -6197,10 +6288,10 @@
         <w:tblLayout w:type="fixed"/>
       </w:tblPr>
       <w:tblGrid>
-        <w:gridCol w:w="4497"/>
-        <w:gridCol w:w="1378"/>
-        <w:gridCol w:w="2067"/>
-        <w:gridCol w:w="1922"/>
+        <w:gridCol w:w="4628"/>
+        <w:gridCol w:w="1404"/>
+        <w:gridCol w:w="1866"/>
+        <w:gridCol w:w="1966"/>
       </w:tblGrid>
       <w:tr>
         <w:trPr>
@@ -6209,7 +6300,7 @@
         </w:trPr>
         <w:tc>
           <w:tcPr>
-            <w:tcW w:type="dxa" w:w="4497"/>
+            <w:tcW w:type="dxa" w:w="4628"/>
             <w:vAlign w:val="center"/>
             <w:shd w:val="clear" w:color="auto" w:fill="E9EEF3"/>
           </w:tcPr>
@@ -6231,7 +6322,7 @@
         </w:tc>
         <w:tc>
           <w:tcPr>
-            <w:tcW w:type="dxa" w:w="1378"/>
+            <w:tcW w:type="dxa" w:w="1404"/>
             <w:vAlign w:val="center"/>
             <w:shd w:val="clear" w:color="auto" w:fill="E9EEF3"/>
           </w:tcPr>
@@ -6253,7 +6344,7 @@
         </w:tc>
         <w:tc>
           <w:tcPr>
-            <w:tcW w:type="dxa" w:w="2067"/>
+            <w:tcW w:type="dxa" w:w="1866"/>
             <w:vAlign w:val="center"/>
             <w:shd w:val="clear" w:color="auto" w:fill="E9EEF3"/>
           </w:tcPr>
@@ -6269,13 +6360,13 @@
                 <w:b/>
                 <w:sz w:val="21"/>
               </w:rPr>
-              <w:t>Below target</w:t>
+              <w:t>Not busy</w:t>
             </w:r>
           </w:p>
         </w:tc>
         <w:tc>
           <w:tcPr>
-            <w:tcW w:type="dxa" w:w="1922"/>
+            <w:tcW w:type="dxa" w:w="1966"/>
             <w:vAlign w:val="center"/>
             <w:shd w:val="clear" w:color="auto" w:fill="E9EEF3"/>
           </w:tcPr>
@@ -6302,7 +6393,7 @@
         </w:trPr>
         <w:tc>
           <w:tcPr>
-            <w:tcW w:type="dxa" w:w="4497"/>
+            <w:tcW w:type="dxa" w:w="4628"/>
             <w:vAlign w:val="center"/>
             <w:shd w:val="clear" w:color="auto" w:fill="FFFFFF"/>
           </w:tcPr>
@@ -6323,7 +6414,7 @@
         </w:tc>
         <w:tc>
           <w:tcPr>
-            <w:tcW w:type="dxa" w:w="1378"/>
+            <w:tcW w:type="dxa" w:w="1404"/>
             <w:vAlign w:val="center"/>
             <w:shd w:val="clear" w:color="auto" w:fill="FFFFFF"/>
           </w:tcPr>
@@ -6344,7 +6435,7 @@
         </w:tc>
         <w:tc>
           <w:tcPr>
-            <w:tcW w:type="dxa" w:w="2067"/>
+            <w:tcW w:type="dxa" w:w="1866"/>
             <w:vAlign w:val="center"/>
             <w:shd w:val="clear" w:color="auto" w:fill="FFFFFF"/>
           </w:tcPr>
@@ -6365,7 +6456,7 @@
         </w:tc>
         <w:tc>
           <w:tcPr>
-            <w:tcW w:type="dxa" w:w="1922"/>
+            <w:tcW w:type="dxa" w:w="1966"/>
             <w:vAlign w:val="center"/>
             <w:shd w:val="clear" w:color="auto" w:fill="FFFFFF"/>
           </w:tcPr>
@@ -6391,7 +6482,7 @@
         </w:trPr>
         <w:tc>
           <w:tcPr>
-            <w:tcW w:type="dxa" w:w="4497"/>
+            <w:tcW w:type="dxa" w:w="4628"/>
             <w:vAlign w:val="center"/>
             <w:shd w:val="clear" w:color="auto" w:fill="FFFFFF"/>
           </w:tcPr>
@@ -6411,7 +6502,7 @@
         </w:tc>
         <w:tc>
           <w:tcPr>
-            <w:tcW w:type="dxa" w:w="1378"/>
+            <w:tcW w:type="dxa" w:w="1404"/>
             <w:vAlign w:val="center"/>
             <w:shd w:val="clear" w:color="auto" w:fill="FFFFFF"/>
           </w:tcPr>
@@ -6431,7 +6522,7 @@
         </w:tc>
         <w:tc>
           <w:tcPr>
-            <w:tcW w:type="dxa" w:w="2067"/>
+            <w:tcW w:type="dxa" w:w="1866"/>
             <w:vAlign w:val="center"/>
             <w:shd w:val="clear" w:color="auto" w:fill="FFFFFF"/>
           </w:tcPr>
@@ -6451,7 +6542,7 @@
         </w:tc>
         <w:tc>
           <w:tcPr>
-            <w:tcW w:type="dxa" w:w="1922"/>
+            <w:tcW w:type="dxa" w:w="1966"/>
             <w:vAlign w:val="center"/>
             <w:shd w:val="clear" w:color="auto" w:fill="FFFFFF"/>
           </w:tcPr>
@@ -6488,8 +6579,386 @@
         <w:rPr>
           <w:rFonts w:ascii="Arial" w:hAnsi="Arial" w:eastAsia="Arial" w:cs="Arial"/>
         </w:rPr>
-        <w:t>Each home was scored by a model built without its host (five folds of hosts). Of the 969 picked, 43.7% were busy (precision), against 25.3% overall, and they included 43.1% of busy homes (recall). Accuracy (71.5%) misleads: calling every home "below target" scores 74.7%.</w:t>
+        <w:t>Each home was scored by a model built without its host (five folds of hosts). Of the 969 picked, 43.7% were busy (precision), against 25.3% overall, and they included 43.1% of busy homes (recall). Accuracy (71.5%) misleads: calling every home "not busy" scores 74.7%.</w:t>
       </w:r>
+    </w:p>
+    <w:p>
+      <w:pPr>
+        <w:keepNext/>
+        <w:widowControl/>
+        <w:spacing w:after="80" w:before="80" w:line="259" w:lineRule="auto"/>
+        <w:jc w:val="left"/>
+      </w:pPr>
+      <w:r>
+        <w:rPr>
+          <w:rFonts w:ascii="Arial" w:hAnsi="Arial" w:eastAsia="Arial" w:cs="Arial"/>
+          <w:b/>
+        </w:rPr>
+        <w:t>Table A3. Further checks</w:t>
+      </w:r>
+    </w:p>
+    <w:tbl>
+      <w:tblPr>
+        <w:tblW w:type="auto" w:w="0"/>
+        <w:tblLook w:firstColumn="1" w:firstRow="1" w:lastColumn="0" w:lastRow="0" w:noHBand="0" w:noVBand="1" w:val="04A0"/>
+        <w:tblBorders>
+          <w:top w:val="single" w:sz="4" w:color="D9D9D9"/>
+          <w:left w:val="single" w:sz="4" w:color="D9D9D9"/>
+          <w:bottom w:val="single" w:sz="4" w:color="D9D9D9"/>
+          <w:right w:val="single" w:sz="4" w:color="D9D9D9"/>
+          <w:insideH w:val="single" w:sz="4" w:color="D9D9D9"/>
+          <w:insideV w:val="single" w:sz="4" w:color="D9D9D9"/>
+        </w:tblBorders>
+        <w:tblCellMar>
+          <w:top w:w="85" w:type="dxa"/>
+          <w:left w:w="85" w:type="dxa"/>
+          <w:bottom w:w="85" w:type="dxa"/>
+          <w:right w:w="85" w:type="dxa"/>
+        </w:tblCellMar>
+        <w:jc w:val="center"/>
+        <w:tblLayout w:type="fixed"/>
+      </w:tblPr>
+      <w:tblGrid>
+        <w:gridCol w:w="4385"/>
+        <w:gridCol w:w="5480"/>
+      </w:tblGrid>
+      <w:tr>
+        <w:trPr>
+          <w:cantSplit/>
+          <w:tblHeader/>
+        </w:trPr>
+        <w:tc>
+          <w:tcPr>
+            <w:tcW w:type="dxa" w:w="4385"/>
+            <w:vAlign w:val="center"/>
+            <w:shd w:val="clear" w:color="auto" w:fill="E9EEF3"/>
+          </w:tcPr>
+          <w:p>
+            <w:pPr>
+              <w:keepNext/>
+              <w:spacing w:before="40" w:after="40" w:line="240" w:lineRule="auto"/>
+              <w:jc w:val="left"/>
+            </w:pPr>
+            <w:r>
+              <w:rPr>
+                <w:rFonts w:ascii="Arial" w:hAnsi="Arial" w:eastAsia="Arial" w:cs="Arial"/>
+                <w:b/>
+                <w:sz w:val="21"/>
+              </w:rPr>
+              <w:t>Check</w:t>
+            </w:r>
+          </w:p>
+        </w:tc>
+        <w:tc>
+          <w:tcPr>
+            <w:tcW w:type="dxa" w:w="5480"/>
+            <w:vAlign w:val="center"/>
+            <w:shd w:val="clear" w:color="auto" w:fill="E9EEF3"/>
+          </w:tcPr>
+          <w:p>
+            <w:pPr>
+              <w:keepNext/>
+              <w:spacing w:before="40" w:after="40" w:line="240" w:lineRule="auto"/>
+              <w:jc w:val="left"/>
+            </w:pPr>
+            <w:r>
+              <w:rPr>
+                <w:rFonts w:ascii="Arial" w:hAnsi="Arial" w:eastAsia="Arial" w:cs="Arial"/>
+                <w:b/>
+                <w:sz w:val="21"/>
+              </w:rPr>
+              <w:t>Result</w:t>
+            </w:r>
+          </w:p>
+        </w:tc>
+      </w:tr>
+      <w:tr>
+        <w:trPr>
+          <w:cantSplit/>
+        </w:trPr>
+        <w:tc>
+          <w:tcPr>
+            <w:tcW w:type="dxa" w:w="4385"/>
+            <w:vAlign w:val="center"/>
+            <w:shd w:val="clear" w:color="auto" w:fill="FFFFFF"/>
+          </w:tcPr>
+          <w:p>
+            <w:pPr>
+              <w:keepNext/>
+              <w:spacing w:before="40" w:after="40" w:line="240" w:lineRule="auto"/>
+              <w:jc w:val="left"/>
+            </w:pPr>
+            <w:r>
+              <w:rPr>
+                <w:rFonts w:ascii="Arial" w:hAnsi="Arial" w:eastAsia="Arial" w:cs="Arial"/>
+                <w:sz w:val="21"/>
+              </w:rPr>
+              <w:t>Top three in 1,000 host redraws</w:t>
+            </w:r>
+          </w:p>
+        </w:tc>
+        <w:tc>
+          <w:tcPr>
+            <w:tcW w:type="dxa" w:w="5480"/>
+            <w:vAlign w:val="center"/>
+            <w:shd w:val="clear" w:color="auto" w:fill="FFFFFF"/>
+          </w:tcPr>
+          <w:p>
+            <w:pPr>
+              <w:keepNext/>
+              <w:spacing w:before="40" w:after="40" w:line="240" w:lineRule="auto"/>
+              <w:jc w:val="left"/>
+            </w:pPr>
+            <w:r>
+              <w:rPr>
+                <w:rFonts w:ascii="Arial" w:hAnsi="Arial" w:eastAsia="Arial" w:cs="Arial"/>
+                <w:sz w:val="21"/>
+              </w:rPr>
+              <w:t>City 3-bed 94%, City 2-bed 90%, Yarra Ranges 64% of redraws</w:t>
+            </w:r>
+          </w:p>
+        </w:tc>
+      </w:tr>
+      <w:tr>
+        <w:trPr>
+          <w:cantSplit/>
+        </w:trPr>
+        <w:tc>
+          <w:tcPr>
+            <w:tcW w:type="dxa" w:w="4385"/>
+            <w:vAlign w:val="center"/>
+            <w:shd w:val="clear" w:color="auto" w:fill="FFFFFF"/>
+          </w:tcPr>
+          <w:p>
+            <w:pPr>
+              <w:keepNext/>
+              <w:spacing w:before="40" w:after="40" w:line="240" w:lineRule="auto"/>
+              <w:jc w:val="left"/>
+            </w:pPr>
+            <w:r>
+              <w:rPr>
+                <w:rFonts w:ascii="Arial" w:hAnsi="Arial" w:eastAsia="Arial" w:cs="Arial"/>
+                <w:sz w:val="21"/>
+              </w:rPr>
+              <w:t>Without the price rule, or without the one-year review rule</w:t>
+            </w:r>
+          </w:p>
+        </w:tc>
+        <w:tc>
+          <w:tcPr>
+            <w:tcW w:type="dxa" w:w="5480"/>
+            <w:vAlign w:val="center"/>
+            <w:shd w:val="clear" w:color="auto" w:fill="FFFFFF"/>
+          </w:tcPr>
+          <w:p>
+            <w:pPr>
+              <w:keepNext/>
+              <w:spacing w:before="40" w:after="40" w:line="240" w:lineRule="auto"/>
+              <w:jc w:val="left"/>
+            </w:pPr>
+            <w:r>
+              <w:rPr>
+                <w:rFonts w:ascii="Arial" w:hAnsi="Arial" w:eastAsia="Arial" w:cs="Arial"/>
+                <w:sz w:val="21"/>
+              </w:rPr>
+              <w:t>Same three groups; Yarra Ranges houses rank second</w:t>
+            </w:r>
+          </w:p>
+        </w:tc>
+      </w:tr>
+      <w:tr>
+        <w:trPr>
+          <w:cantSplit/>
+        </w:trPr>
+        <w:tc>
+          <w:tcPr>
+            <w:tcW w:type="dxa" w:w="4385"/>
+            <w:vAlign w:val="center"/>
+            <w:shd w:val="clear" w:color="auto" w:fill="FFFFFF"/>
+          </w:tcPr>
+          <w:p>
+            <w:pPr>
+              <w:keepNext/>
+              <w:spacing w:before="40" w:after="40" w:line="240" w:lineRule="auto"/>
+              <w:jc w:val="left"/>
+            </w:pPr>
+            <w:r>
+              <w:rPr>
+                <w:rFonts w:ascii="Arial" w:hAnsi="Arial" w:eastAsia="Arial" w:cs="Arial"/>
+                <w:sz w:val="21"/>
+              </w:rPr>
+              <w:t>Minimum group size of 30 or 75 homes</w:t>
+            </w:r>
+          </w:p>
+        </w:tc>
+        <w:tc>
+          <w:tcPr>
+            <w:tcW w:type="dxa" w:w="5480"/>
+            <w:vAlign w:val="center"/>
+            <w:shd w:val="clear" w:color="auto" w:fill="FFFFFF"/>
+          </w:tcPr>
+          <w:p>
+            <w:pPr>
+              <w:keepNext/>
+              <w:spacing w:before="40" w:after="40" w:line="240" w:lineRule="auto"/>
+              <w:jc w:val="left"/>
+            </w:pPr>
+            <w:r>
+              <w:rPr>
+                <w:rFonts w:ascii="Arial" w:hAnsi="Arial" w:eastAsia="Arial" w:cs="Arial"/>
+                <w:sz w:val="21"/>
+              </w:rPr>
+              <w:t>Same three groups, same order</w:t>
+            </w:r>
+          </w:p>
+        </w:tc>
+      </w:tr>
+      <w:tr>
+        <w:trPr>
+          <w:cantSplit/>
+        </w:trPr>
+        <w:tc>
+          <w:tcPr>
+            <w:tcW w:type="dxa" w:w="4385"/>
+            <w:vAlign w:val="center"/>
+            <w:shd w:val="clear" w:color="auto" w:fill="FFFFFF"/>
+          </w:tcPr>
+          <w:p>
+            <w:pPr>
+              <w:keepNext/>
+              <w:spacing w:before="40" w:after="40" w:line="240" w:lineRule="auto"/>
+              <w:jc w:val="left"/>
+            </w:pPr>
+            <w:r>
+              <w:rPr>
+                <w:rFonts w:ascii="Arial" w:hAnsi="Arial" w:eastAsia="Arial" w:cs="Arial"/>
+                <w:sz w:val="21"/>
+              </w:rPr>
+              <w:t>Two-year check with hosts weighted equally</w:t>
+            </w:r>
+          </w:p>
+        </w:tc>
+        <w:tc>
+          <w:tcPr>
+            <w:tcW w:type="dxa" w:w="5480"/>
+            <w:vAlign w:val="center"/>
+            <w:shd w:val="clear" w:color="auto" w:fill="FFFFFF"/>
+          </w:tcPr>
+          <w:p>
+            <w:pPr>
+              <w:keepNext/>
+              <w:spacing w:before="40" w:after="40" w:line="240" w:lineRule="auto"/>
+              <w:jc w:val="left"/>
+            </w:pPr>
+            <w:r>
+              <w:rPr>
+                <w:rFonts w:ascii="Arial" w:hAnsi="Arial" w:eastAsia="Arial" w:cs="Arial"/>
+                <w:sz w:val="21"/>
+              </w:rPr>
+              <w:t>Later-year lead of 8.7 points</w:t>
+            </w:r>
+          </w:p>
+        </w:tc>
+      </w:tr>
+      <w:tr>
+        <w:trPr>
+          <w:cantSplit/>
+        </w:trPr>
+        <w:tc>
+          <w:tcPr>
+            <w:tcW w:type="dxa" w:w="4385"/>
+            <w:vAlign w:val="center"/>
+            <w:shd w:val="clear" w:color="auto" w:fill="FFFFFF"/>
+          </w:tcPr>
+          <w:p>
+            <w:pPr>
+              <w:keepNext/>
+              <w:spacing w:before="40" w:after="40" w:line="240" w:lineRule="auto"/>
+              <w:jc w:val="left"/>
+            </w:pPr>
+            <w:r>
+              <w:rPr>
+                <w:rFonts w:ascii="Arial" w:hAnsi="Arial" w:eastAsia="Arial" w:cs="Arial"/>
+                <w:sz w:val="21"/>
+              </w:rPr>
+              <w:t>Model against random picking, 50 tests</w:t>
+            </w:r>
+          </w:p>
+        </w:tc>
+        <w:tc>
+          <w:tcPr>
+            <w:tcW w:type="dxa" w:w="5480"/>
+            <w:vAlign w:val="center"/>
+            <w:shd w:val="clear" w:color="auto" w:fill="FFFFFF"/>
+          </w:tcPr>
+          <w:p>
+            <w:pPr>
+              <w:keepNext/>
+              <w:spacing w:before="40" w:after="40" w:line="240" w:lineRule="auto"/>
+              <w:jc w:val="left"/>
+            </w:pPr>
+            <w:r>
+              <w:rPr>
+                <w:rFonts w:ascii="Arial" w:hAnsi="Arial" w:eastAsia="Arial" w:cs="Arial"/>
+                <w:sz w:val="21"/>
+              </w:rPr>
+              <w:t>Model better in 46 tests</w:t>
+            </w:r>
+          </w:p>
+        </w:tc>
+      </w:tr>
+      <w:tr>
+        <w:trPr>
+          <w:cantSplit/>
+        </w:trPr>
+        <w:tc>
+          <w:tcPr>
+            <w:tcW w:type="dxa" w:w="4385"/>
+            <w:vAlign w:val="center"/>
+            <w:shd w:val="clear" w:color="auto" w:fill="FFFFFF"/>
+          </w:tcPr>
+          <w:p>
+            <w:pPr>
+              <w:spacing w:before="40" w:after="40" w:line="240" w:lineRule="auto"/>
+              <w:jc w:val="left"/>
+            </w:pPr>
+            <w:r>
+              <w:rPr>
+                <w:rFonts w:ascii="Arial" w:hAnsi="Arial" w:eastAsia="Arial" w:cs="Arial"/>
+                <w:sz w:val="21"/>
+              </w:rPr>
+              <w:t>Reduced model (amenities only) against random picking</w:t>
+            </w:r>
+          </w:p>
+        </w:tc>
+        <w:tc>
+          <w:tcPr>
+            <w:tcW w:type="dxa" w:w="5480"/>
+            <w:vAlign w:val="center"/>
+            <w:shd w:val="clear" w:color="auto" w:fill="FFFFFF"/>
+          </w:tcPr>
+          <w:p>
+            <w:pPr>
+              <w:spacing w:before="40" w:after="40" w:line="240" w:lineRule="auto"/>
+              <w:jc w:val="left"/>
+            </w:pPr>
+            <w:r>
+              <w:rPr>
+                <w:rFonts w:ascii="Arial" w:hAnsi="Arial" w:eastAsia="Arial" w:cs="Arial"/>
+                <w:sz w:val="21"/>
+              </w:rPr>
+              <w:t>City 2-bed 38.9% vs 31.7%; City 3-bed 33.9% vs 35.9%; Yarra Ranges 49.7% vs 30.4%</w:t>
+            </w:r>
+          </w:p>
+        </w:tc>
+      </w:tr>
+    </w:tbl>
+    <w:p>
+      <w:pPr>
+        <w:widowControl/>
+        <w:spacing w:after="80" w:line="240" w:lineRule="auto"/>
+        <w:jc w:val="left"/>
+      </w:pPr>
     </w:p>
     <w:sectPr>
       <w:footerReference w:type="default" r:id="rId16"/>

</xml_diff>

<commit_message>
Apply team review: rule as a first check, review counts as past activity
The two-setting rule is described as a quick first check found in this
sample rather than as matching the model's tested hit rate. Section 2 says
review counts record past guest activity and that nights need assumptions
about review rates and stay length. The model assumption is stated in terms
of odds, the rating is labelled lifetime, and Section 3 states that the
30-review target came from the set-aside homes within the 14 groups.
Word count 2,972.
</commit_message>
<xml_diff>
--- a/final-report/report-2026-10-04/Final_Report.docx
+++ b/final-report/report-2026-10-04/Final_Report.docx
@@ -318,7 +318,7 @@
         <w:rPr>
           <w:rFonts w:ascii="Arial" w:hAnsi="Arial" w:eastAsia="Arial" w:cs="Arial"/>
         </w:rPr>
-        <w:t xml:space="preserve"> Guests can review only after a stay, so review counts track completed bookings, the best public guide to demand and occupancy. Empty nights are the operator's main risk. Review counts do not show profit (rents and costs are not in the data) or satisfaction, so we translate them into nights and revenue and check what guests wrote (Section 5.1).</w:t>
+        <w:t xml:space="preserve"> Empty nights are the operator's main risk. Guests can review only after a stay, so review counts record past guest activity, the best public guide to demand. Turning them into booked nights needs assumptions about review rates and stay length, and shorter stays bring more reviews for the same nights. Review counts show neither profit (rents and costs are not in the data) nor satisfaction, so we translate them into nights and revenue and check what guests wrote (Section 5.1).</w:t>
       </w:r>
     </w:p>
     <w:p>
@@ -331,7 +331,7 @@
         <w:rPr>
           <w:rFonts w:ascii="Arial" w:hAnsi="Arial" w:eastAsia="Arial" w:cs="Arial"/>
         </w:rPr>
-        <w:t>Since the interim report (in the project repository), we replaced its random forest with one explainable logistic regression and moved technical checks to Appendix A.</w:t>
+        <w:t>Since the interim report (in the repository), we replaced its random forest with one explainable logistic regression and moved technical checks to Appendix A.</w:t>
       </w:r>
     </w:p>
     <w:p>
@@ -439,7 +439,7 @@
         <w:rPr>
           <w:rFonts w:ascii="Arial" w:hAnsi="Arial" w:eastAsia="Arial" w:cs="Arial"/>
         </w:rPr>
-        <w:t>groups of at least 50 homes, so each group's share is stable.</w:t>
+        <w:t>groups of at least 50 homes, so each group's share rests on enough homes.</w:t>
       </w:r>
     </w:p>
     <w:p>
@@ -452,7 +452,7 @@
         <w:rPr>
           <w:rFonts w:ascii="Arial" w:hAnsi="Arial" w:eastAsia="Arial" w:cs="Arial"/>
         </w:rPr>
-        <w:t>To avoid setting the bar with the homes we compare, we first set aside one host in five (1,342 homes). The busiest quarter of their homes had 30 or more reviews, so 30 became the target. The final sample has 3,873 homes, 1,726 hosts and 14 groups in six council areas.</w:t>
+        <w:t>To avoid setting the target with the same homes we compare, we first set aside one host in five (1,342 homes). Within our 14 groups, the busiest quarter of these set-aside homes had 30 or more reviews, so 30 became the target. The final sample has 3,873 homes, 1,726 hosts and 14 groups in six council areas.</w:t>
       </w:r>
     </w:p>
     <w:p>
@@ -912,7 +912,7 @@
         <w:rPr>
           <w:rFonts w:ascii="Arial" w:hAnsi="Arial" w:eastAsia="Arial" w:cs="Arial"/>
         </w:rPr>
-        <w:t xml:space="preserve"> We compare the share of busy homes across the 14 groups and translate it into Inside Airbnb's estimated nights and revenue.</w:t>
+        <w:t xml:space="preserve"> A simple summary, not a model, ranks the 14 groups by their share of busy homes, adding Inside Airbnb's estimated nights and revenue.</w:t>
       </w:r>
     </w:p>
     <w:p>
@@ -1454,7 +1454,7 @@
         <w:rPr>
           <w:rFonts w:ascii="Arial" w:hAnsi="Arial" w:eastAsia="Arial" w:cs="Arial"/>
         </w:rPr>
-        <w:t xml:space="preserve"> In 50 tests, it is built on 70% of hosts and picks a quarter of each priority group's homes among the rest. We compare its picks with a reduced model (no price or minimum stay) and with random picking.</w:t>
+        <w:t xml:space="preserve"> In 50 tests, it is built on 70% of hosts and picks a quarter of each priority group's homes among the other 30%, against a reduced model (no price or minimum stay) and random picking.</w:t>
       </w:r>
     </w:p>
     <w:p>
@@ -1495,7 +1495,7 @@
         <w:rPr>
           <w:rFonts w:ascii="Arial" w:hAnsi="Arial" w:eastAsia="Arial" w:cs="Arial"/>
         </w:rPr>
-        <w:t>Homes of one host stay together in every check, because they can perform alike. The model assumes each 10% price step, or ten amenities, has the same effect anywhere; Appendix A finds little overlap between inputs and only weak curvature.</w:t>
+        <w:t>Homes of one host stay together in every check, because they can perform alike. The model assumes each 10% price step, or ten more amenities, changes the odds of being busy by the same proportion at any level; Appendix A finds this roughly holds and the inputs barely overlap.</w:t>
       </w:r>
     </w:p>
     <w:p>
@@ -1606,7 +1606,7 @@
         <w:rPr>
           <w:rFonts w:ascii="Arial" w:hAnsi="Arial" w:eastAsia="Arial" w:cs="Arial"/>
         </w:rPr>
-        <w:t>Busy homes were slightly cheaper, but far more often accepted one-night stays and sat in the City of Melbourne (Table 3). Their higher revenue estimate comes from their review counts, not prices.</w:t>
+        <w:t>Busy homes were slightly cheaper, but far more often accepted one-night stays and sat in the City of Melbourne (Table 3). Their much higher revenue estimate reflects their review counts, since revenue is estimated from reviews.</w:t>
       </w:r>
     </w:p>
     <w:p>
@@ -1646,10 +1646,10 @@
         <w:tblLayout w:type="fixed"/>
       </w:tblPr>
       <w:tblGrid>
-        <w:gridCol w:w="5247"/>
-        <w:gridCol w:w="1812"/>
-        <w:gridCol w:w="1402"/>
-        <w:gridCol w:w="1402"/>
+        <w:gridCol w:w="5314"/>
+        <w:gridCol w:w="1790"/>
+        <w:gridCol w:w="1380"/>
+        <w:gridCol w:w="1380"/>
       </w:tblGrid>
       <w:tr>
         <w:trPr>
@@ -1658,7 +1658,7 @@
         </w:trPr>
         <w:tc>
           <w:tcPr>
-            <w:tcW w:type="dxa" w:w="5247"/>
+            <w:tcW w:type="dxa" w:w="5314"/>
             <w:vAlign w:val="center"/>
             <w:shd w:val="clear" w:color="auto" w:fill="E9EEF3"/>
           </w:tcPr>
@@ -1680,7 +1680,7 @@
         </w:tc>
         <w:tc>
           <w:tcPr>
-            <w:tcW w:type="dxa" w:w="1812"/>
+            <w:tcW w:type="dxa" w:w="1790"/>
             <w:vAlign w:val="center"/>
             <w:shd w:val="clear" w:color="auto" w:fill="E9EEF3"/>
           </w:tcPr>
@@ -1702,7 +1702,7 @@
         </w:tc>
         <w:tc>
           <w:tcPr>
-            <w:tcW w:type="dxa" w:w="1402"/>
+            <w:tcW w:type="dxa" w:w="1380"/>
             <w:vAlign w:val="center"/>
             <w:shd w:val="clear" w:color="auto" w:fill="E9EEF3"/>
           </w:tcPr>
@@ -1724,7 +1724,7 @@
         </w:tc>
         <w:tc>
           <w:tcPr>
-            <w:tcW w:type="dxa" w:w="1402"/>
+            <w:tcW w:type="dxa" w:w="1380"/>
             <w:vAlign w:val="center"/>
             <w:shd w:val="clear" w:color="auto" w:fill="E9EEF3"/>
           </w:tcPr>
@@ -1751,7 +1751,7 @@
         </w:trPr>
         <w:tc>
           <w:tcPr>
-            <w:tcW w:type="dxa" w:w="5247"/>
+            <w:tcW w:type="dxa" w:w="5314"/>
             <w:vAlign w:val="center"/>
             <w:shd w:val="clear" w:color="auto" w:fill="FFFFFF"/>
           </w:tcPr>
@@ -1772,7 +1772,7 @@
         </w:tc>
         <w:tc>
           <w:tcPr>
-            <w:tcW w:type="dxa" w:w="1812"/>
+            <w:tcW w:type="dxa" w:w="1790"/>
             <w:vAlign w:val="center"/>
             <w:shd w:val="clear" w:color="auto" w:fill="FFFFFF"/>
           </w:tcPr>
@@ -1793,7 +1793,7 @@
         </w:tc>
         <w:tc>
           <w:tcPr>
-            <w:tcW w:type="dxa" w:w="1402"/>
+            <w:tcW w:type="dxa" w:w="1380"/>
             <w:vAlign w:val="center"/>
             <w:shd w:val="clear" w:color="auto" w:fill="FFFFFF"/>
           </w:tcPr>
@@ -1814,7 +1814,7 @@
         </w:tc>
         <w:tc>
           <w:tcPr>
-            <w:tcW w:type="dxa" w:w="1402"/>
+            <w:tcW w:type="dxa" w:w="1380"/>
             <w:vAlign w:val="center"/>
             <w:shd w:val="clear" w:color="auto" w:fill="FFFFFF"/>
           </w:tcPr>
@@ -1840,7 +1840,7 @@
         </w:trPr>
         <w:tc>
           <w:tcPr>
-            <w:tcW w:type="dxa" w:w="5247"/>
+            <w:tcW w:type="dxa" w:w="5314"/>
             <w:vAlign w:val="center"/>
             <w:shd w:val="clear" w:color="auto" w:fill="FFFFFF"/>
           </w:tcPr>
@@ -1861,7 +1861,7 @@
         </w:tc>
         <w:tc>
           <w:tcPr>
-            <w:tcW w:type="dxa" w:w="1812"/>
+            <w:tcW w:type="dxa" w:w="1790"/>
             <w:vAlign w:val="center"/>
             <w:shd w:val="clear" w:color="auto" w:fill="FFFFFF"/>
           </w:tcPr>
@@ -1882,7 +1882,7 @@
         </w:tc>
         <w:tc>
           <w:tcPr>
-            <w:tcW w:type="dxa" w:w="1402"/>
+            <w:tcW w:type="dxa" w:w="1380"/>
             <w:vAlign w:val="center"/>
             <w:shd w:val="clear" w:color="auto" w:fill="FFFFFF"/>
           </w:tcPr>
@@ -1903,7 +1903,7 @@
         </w:tc>
         <w:tc>
           <w:tcPr>
-            <w:tcW w:type="dxa" w:w="1402"/>
+            <w:tcW w:type="dxa" w:w="1380"/>
             <w:vAlign w:val="center"/>
             <w:shd w:val="clear" w:color="auto" w:fill="FFFFFF"/>
           </w:tcPr>
@@ -1929,7 +1929,7 @@
         </w:trPr>
         <w:tc>
           <w:tcPr>
-            <w:tcW w:type="dxa" w:w="5247"/>
+            <w:tcW w:type="dxa" w:w="5314"/>
             <w:vAlign w:val="center"/>
             <w:shd w:val="clear" w:color="auto" w:fill="FFFFFF"/>
           </w:tcPr>
@@ -1950,7 +1950,7 @@
         </w:tc>
         <w:tc>
           <w:tcPr>
-            <w:tcW w:type="dxa" w:w="1812"/>
+            <w:tcW w:type="dxa" w:w="1790"/>
             <w:vAlign w:val="center"/>
             <w:shd w:val="clear" w:color="auto" w:fill="FFFFFF"/>
           </w:tcPr>
@@ -1971,7 +1971,7 @@
         </w:tc>
         <w:tc>
           <w:tcPr>
-            <w:tcW w:type="dxa" w:w="1402"/>
+            <w:tcW w:type="dxa" w:w="1380"/>
             <w:vAlign w:val="center"/>
             <w:shd w:val="clear" w:color="auto" w:fill="FFFFFF"/>
           </w:tcPr>
@@ -1992,7 +1992,7 @@
         </w:tc>
         <w:tc>
           <w:tcPr>
-            <w:tcW w:type="dxa" w:w="1402"/>
+            <w:tcW w:type="dxa" w:w="1380"/>
             <w:vAlign w:val="center"/>
             <w:shd w:val="clear" w:color="auto" w:fill="FFFFFF"/>
           </w:tcPr>
@@ -2018,7 +2018,7 @@
         </w:trPr>
         <w:tc>
           <w:tcPr>
-            <w:tcW w:type="dxa" w:w="5247"/>
+            <w:tcW w:type="dxa" w:w="5314"/>
             <w:vAlign w:val="center"/>
             <w:shd w:val="clear" w:color="auto" w:fill="FFFFFF"/>
           </w:tcPr>
@@ -2039,7 +2039,7 @@
         </w:tc>
         <w:tc>
           <w:tcPr>
-            <w:tcW w:type="dxa" w:w="1812"/>
+            <w:tcW w:type="dxa" w:w="1790"/>
             <w:vAlign w:val="center"/>
             <w:shd w:val="clear" w:color="auto" w:fill="FFFFFF"/>
           </w:tcPr>
@@ -2060,7 +2060,7 @@
         </w:tc>
         <w:tc>
           <w:tcPr>
-            <w:tcW w:type="dxa" w:w="1402"/>
+            <w:tcW w:type="dxa" w:w="1380"/>
             <w:vAlign w:val="center"/>
             <w:shd w:val="clear" w:color="auto" w:fill="FFFFFF"/>
           </w:tcPr>
@@ -2081,7 +2081,7 @@
         </w:tc>
         <w:tc>
           <w:tcPr>
-            <w:tcW w:type="dxa" w:w="1402"/>
+            <w:tcW w:type="dxa" w:w="1380"/>
             <w:vAlign w:val="center"/>
             <w:shd w:val="clear" w:color="auto" w:fill="FFFFFF"/>
           </w:tcPr>
@@ -2107,7 +2107,7 @@
         </w:trPr>
         <w:tc>
           <w:tcPr>
-            <w:tcW w:type="dxa" w:w="5247"/>
+            <w:tcW w:type="dxa" w:w="5314"/>
             <w:vAlign w:val="center"/>
             <w:shd w:val="clear" w:color="auto" w:fill="FFFFFF"/>
           </w:tcPr>
@@ -2128,7 +2128,7 @@
         </w:tc>
         <w:tc>
           <w:tcPr>
-            <w:tcW w:type="dxa" w:w="1812"/>
+            <w:tcW w:type="dxa" w:w="1790"/>
             <w:vAlign w:val="center"/>
             <w:shd w:val="clear" w:color="auto" w:fill="FFFFFF"/>
           </w:tcPr>
@@ -2149,7 +2149,7 @@
         </w:tc>
         <w:tc>
           <w:tcPr>
-            <w:tcW w:type="dxa" w:w="1402"/>
+            <w:tcW w:type="dxa" w:w="1380"/>
             <w:vAlign w:val="center"/>
             <w:shd w:val="clear" w:color="auto" w:fill="FFFFFF"/>
           </w:tcPr>
@@ -2170,7 +2170,7 @@
         </w:tc>
         <w:tc>
           <w:tcPr>
-            <w:tcW w:type="dxa" w:w="1402"/>
+            <w:tcW w:type="dxa" w:w="1380"/>
             <w:vAlign w:val="center"/>
             <w:shd w:val="clear" w:color="auto" w:fill="FFFFFF"/>
           </w:tcPr>
@@ -2196,7 +2196,7 @@
         </w:trPr>
         <w:tc>
           <w:tcPr>
-            <w:tcW w:type="dxa" w:w="5247"/>
+            <w:tcW w:type="dxa" w:w="5314"/>
             <w:vAlign w:val="center"/>
             <w:shd w:val="clear" w:color="auto" w:fill="FFFFFF"/>
           </w:tcPr>
@@ -2217,7 +2217,7 @@
         </w:tc>
         <w:tc>
           <w:tcPr>
-            <w:tcW w:type="dxa" w:w="1812"/>
+            <w:tcW w:type="dxa" w:w="1790"/>
             <w:vAlign w:val="center"/>
             <w:shd w:val="clear" w:color="auto" w:fill="FFFFFF"/>
           </w:tcPr>
@@ -2238,7 +2238,7 @@
         </w:tc>
         <w:tc>
           <w:tcPr>
-            <w:tcW w:type="dxa" w:w="1402"/>
+            <w:tcW w:type="dxa" w:w="1380"/>
             <w:vAlign w:val="center"/>
             <w:shd w:val="clear" w:color="auto" w:fill="FFFFFF"/>
           </w:tcPr>
@@ -2259,7 +2259,7 @@
         </w:tc>
         <w:tc>
           <w:tcPr>
-            <w:tcW w:type="dxa" w:w="1402"/>
+            <w:tcW w:type="dxa" w:w="1380"/>
             <w:vAlign w:val="center"/>
             <w:shd w:val="clear" w:color="auto" w:fill="FFFFFF"/>
           </w:tcPr>
@@ -2285,7 +2285,7 @@
         </w:trPr>
         <w:tc>
           <w:tcPr>
-            <w:tcW w:type="dxa" w:w="5247"/>
+            <w:tcW w:type="dxa" w:w="5314"/>
             <w:vAlign w:val="center"/>
             <w:shd w:val="clear" w:color="auto" w:fill="FFFFFF"/>
           </w:tcPr>
@@ -2300,13 +2300,13 @@
                 <w:rFonts w:ascii="Arial" w:hAnsi="Arial" w:eastAsia="Arial" w:cs="Arial"/>
                 <w:sz w:val="21"/>
               </w:rPr>
-              <w:t>Mean guest rating (out of 5 stars)</w:t>
+              <w:t>Mean lifetime guest rating (out of 5 stars)</w:t>
             </w:r>
           </w:p>
         </w:tc>
         <w:tc>
           <w:tcPr>
-            <w:tcW w:type="dxa" w:w="1812"/>
+            <w:tcW w:type="dxa" w:w="1790"/>
             <w:vAlign w:val="center"/>
             <w:shd w:val="clear" w:color="auto" w:fill="FFFFFF"/>
           </w:tcPr>
@@ -2327,7 +2327,7 @@
         </w:tc>
         <w:tc>
           <w:tcPr>
-            <w:tcW w:type="dxa" w:w="1402"/>
+            <w:tcW w:type="dxa" w:w="1380"/>
             <w:vAlign w:val="center"/>
             <w:shd w:val="clear" w:color="auto" w:fill="FFFFFF"/>
           </w:tcPr>
@@ -2348,7 +2348,7 @@
         </w:tc>
         <w:tc>
           <w:tcPr>
-            <w:tcW w:type="dxa" w:w="1402"/>
+            <w:tcW w:type="dxa" w:w="1380"/>
             <w:vAlign w:val="center"/>
             <w:shd w:val="clear" w:color="auto" w:fill="FFFFFF"/>
           </w:tcPr>
@@ -2374,7 +2374,7 @@
         </w:trPr>
         <w:tc>
           <w:tcPr>
-            <w:tcW w:type="dxa" w:w="5247"/>
+            <w:tcW w:type="dxa" w:w="5314"/>
             <w:vAlign w:val="center"/>
             <w:shd w:val="clear" w:color="auto" w:fill="FFFFFF"/>
           </w:tcPr>
@@ -2394,7 +2394,7 @@
         </w:tc>
         <w:tc>
           <w:tcPr>
-            <w:tcW w:type="dxa" w:w="1812"/>
+            <w:tcW w:type="dxa" w:w="1790"/>
             <w:vAlign w:val="center"/>
             <w:shd w:val="clear" w:color="auto" w:fill="FFFFFF"/>
           </w:tcPr>
@@ -2414,7 +2414,7 @@
         </w:tc>
         <w:tc>
           <w:tcPr>
-            <w:tcW w:type="dxa" w:w="1402"/>
+            <w:tcW w:type="dxa" w:w="1380"/>
             <w:vAlign w:val="center"/>
             <w:shd w:val="clear" w:color="auto" w:fill="FFFFFF"/>
           </w:tcPr>
@@ -2434,7 +2434,7 @@
         </w:tc>
         <w:tc>
           <w:tcPr>
-            <w:tcW w:type="dxa" w:w="1402"/>
+            <w:tcW w:type="dxa" w:w="1380"/>
             <w:vAlign w:val="center"/>
             <w:shd w:val="clear" w:color="auto" w:fill="FFFFFF"/>
           </w:tcPr>
@@ -2471,7 +2471,7 @@
         <w:rPr>
           <w:rFonts w:ascii="Arial" w:hAnsi="Arial" w:eastAsia="Arial" w:cs="Arial"/>
         </w:rPr>
-        <w:t>Busy homes also had happier guests: a higher mean rating (4.84 against 4.69 stars) and fewer negative reviews (1.6% against 2.9%). We scored the 78,288 reviews with VADER, a standard word-list tool (Hutto &amp; Gilbert, 2014); about 90% read as positive in both groups. High review counts therefore reflect satisfied guests, not complaints.</w:t>
+        <w:t>Busy homes also had happier guests: a higher mean rating (4.84 against 4.69 stars) and proportionally fewer negative reviews (1.6% against 2.9%). We scored all 78,288 reviews from that year with VADER, a word-list tool (Hutto &amp; Gilbert, 2014); about 90% read as positive in both groups. So the high review counts of busy homes came with satisfied guests, not complaints.</w:t>
       </w:r>
     </w:p>
     <w:p>
@@ -3441,7 +3441,7 @@
         <w:rPr>
           <w:rFonts w:ascii="Arial" w:hAnsi="Arial" w:eastAsia="Arial" w:cs="Arial"/>
         </w:rPr>
-        <w:t xml:space="preserve"> with a two-night minimum or longer (Figure 3). Pricing 20% above similar homes lowers the chance to </w:t>
+        <w:t xml:space="preserve"> with a two-night minimum or longer (Figure 3, Table A1). Pricing 20% above similar homes lowers the chance to </w:t>
       </w:r>
       <w:r>
         <w:rPr>
@@ -3527,7 +3527,7 @@
         <w:rPr>
           <w:rFonts w:ascii="Arial" w:hAnsi="Arial" w:eastAsia="Arial" w:cs="Arial"/>
         </w:rPr>
-        <w:t xml:space="preserve"> Model-estimated chance that a typical City two-bedroom apartment is busy when one input changes, with 95% confidence intervals.</w:t>
+        <w:t xml:space="preserve"> Chance that a typical City two-bedroom apartment (one-night stays, median price and amenities) is busy as one input changes; 95% confidence intervals.</w:t>
       </w:r>
     </w:p>
     <w:p>
@@ -3540,7 +3540,7 @@
         <w:rPr>
           <w:rFonts w:ascii="Arial" w:hAnsi="Arial" w:eastAsia="Arial" w:cs="Arial"/>
         </w:rPr>
-        <w:t>A two-setting rule captures most of this (Table 5). In the priority groups, half (50.4%) of homes with one-night stays priced at or below their group median were busy, against a third (33.4%) of all their homes and 9.3% with neither setting. Only 20 of 90 Yarra Ranges houses accept one-night stays, so the rule rests mainly on City apartments.</w:t>
+        <w:t>A two-setting rule turns this into a simple check (Table 5). In the priority groups, half (50.4%) of homes with one-night stays priced at or below their group median were busy, against a third (33.4%) of all their homes and 9.3% with neither setting. Only 20 of 90 Yarra Ranges houses accept one-night stays, so the rule rests mainly on City apartments.</w:t>
       </w:r>
     </w:p>
     <w:p>
@@ -3807,7 +3807,7 @@
         <w:rPr>
           <w:rFonts w:ascii="Arial" w:hAnsi="Arial" w:eastAsia="Arial" w:cs="Arial"/>
         </w:rPr>
-        <w:t>On unseen hosts, 49.6% of the model's picks were busy, against 38.6% for the reduced model and 32.4% for random picking (Figure 4; full results in Tables A2 and A3). The rule matched the model (it picks 28% of homes), though we checked it only on the homes that suggested it. The model's value is in finding which settings matter; the client can apply them as a checklist.</w:t>
+        <w:t>The rule picks 28% of homes in this sample and suits a quick first check. The model adds evidence from homes it had not seen: in 50 tests, 49.6% of its picks were busy, against 38.6% for the reduced model and 32.4% for random picking (Figure 4, Table A3; Table A2 covers all 14 groups). The model's main value is in finding which settings matter.</w:t>
       </w:r>
     </w:p>
     <w:p>
@@ -3892,7 +3892,7 @@
         <w:rPr>
           <w:rFonts w:ascii="Arial" w:hAnsi="Arial" w:eastAsia="Arial" w:cs="Arial"/>
         </w:rPr>
-        <w:t>Ranked on the earlier year, the same three groups led ten groups (2,657 homes with two years of reviews): 33.6% of their homes reached 34 reviews, the earlier year's reference level, against 19.9% elsewhere (Figure 5). A year later they still led (27.1% against 14.9%), although Yarra Ranges houses fell to 21.4%.</w:t>
+        <w:t>We repeated the ranking on the earlier year (ten groups, 2,657 homes with two years of reviews), with a 34-review bar set the same way. The same three groups led: 33.6% of their homes reached it, against 19.9% elsewhere (Figure 5). On the same bar a year later, they still led (27.1% against 14.9%), although Yarra Ranges houses fell to 21.4%.</w:t>
       </w:r>
     </w:p>
     <w:p>
@@ -4061,7 +4061,7 @@
         <w:rPr>
           <w:rFonts w:ascii="Arial" w:hAnsi="Arial" w:eastAsia="Arial" w:cs="Arial"/>
         </w:rPr>
-        <w:t xml:space="preserve"> busy homes were rated higher and drew fewer negative reviews (Table 3).</w:t>
+        <w:t xml:space="preserve"> busy homes had higher ratings and proportionally fewer negative reviews (Table 3).</w:t>
       </w:r>
     </w:p>
     <w:p>
@@ -4089,7 +4089,7 @@
         <w:rPr>
           <w:rFonts w:ascii="Arial" w:hAnsi="Arial" w:eastAsia="Arial" w:cs="Arial"/>
         </w:rPr>
-        <w:t xml:space="preserve"> the two settings picked busy homes about as well as the model (50.4% against 49.6%), though only the model was tested on unseen hosts (Table 5, Figure 4).</w:t>
+        <w:t xml:space="preserve"> the two settings give a quick first check (Table 5). Tested on unseen hosts, 49.6% of the model's picks were busy, against 32.4% for random picking (Figure 4).</w:t>
       </w:r>
     </w:p>
     <w:p>
@@ -4157,7 +4157,7 @@
         <w:rPr>
           <w:rFonts w:ascii="Arial" w:hAnsi="Arial" w:eastAsia="Arial" w:cs="Arial"/>
         </w:rPr>
-        <w:t xml:space="preserve"> (Figure 3, Table 5). At inspection, check that building rules allow one-night stays and that this price covers costs. Trial these settings and track the results (Table 6).</w:t>
+        <w:t xml:space="preserve"> (Figure 3, Table 5); the evidence is strongest for City apartments. At inspection, check that building rules allow one-night stays and that this price covers costs. Trial these settings and track the results (Table 6).</w:t>
       </w:r>
     </w:p>
     <w:p>
@@ -4185,7 +4185,7 @@
         <w:rPr>
           <w:rFonts w:ascii="Arial" w:hAnsi="Arial" w:eastAsia="Arial" w:cs="Arial"/>
         </w:rPr>
-        <w:t xml:space="preserve"> (Figure 6). Typical weekly revenue is </w:t>
+        <w:t xml:space="preserve"> (Figure 6). Typical estimated weekly revenue is </w:t>
       </w:r>
       <w:r>
         <w:rPr>
@@ -4224,7 +4224,7 @@
         <w:rPr>
           <w:rFonts w:ascii="Arial" w:hAnsi="Arial" w:eastAsia="Arial" w:cs="Arial"/>
         </w:rPr>
-        <w:t xml:space="preserve"> for Yarra Ranges houses, but only half of homes reach it; homes that were not busy earned </w:t>
+        <w:t xml:space="preserve"> for Yarra Ranges houses, but only half of homes reach it; for homes that were not busy it was </w:t>
       </w:r>
       <w:r>
         <w:rPr>
@@ -4237,7 +4237,7 @@
         <w:rPr>
           <w:rFonts w:ascii="Arial" w:hAnsi="Arial" w:eastAsia="Arial" w:cs="Arial"/>
         </w:rPr>
-        <w:t>. Assess the remaining leases with their own cash-flow plans, and hold enough cash for a year at that lower level.</w:t>
+        <w:t>. Assess each remaining lease with its own cash-flow plan, and hold cash to cover a year's shortfall at that lower revenue.</w:t>
       </w:r>
     </w:p>
     <w:p>
@@ -4752,7 +4752,7 @@
         <w:rPr>
           <w:rFonts w:ascii="Arial" w:hAnsi="Arial" w:eastAsia="Arial" w:cs="Arial"/>
         </w:rPr>
-        <w:t xml:space="preserve"> a week in rent and running costs exceeds its group's typical AUD 590, so it is dropped. A Yarra Ranges house costing </w:t>
+        <w:t xml:space="preserve"> a week exceeds its group's typical AUD 590, so it is dropped. A Yarra Ranges house costing </w:t>
       </w:r>
       <w:r>
         <w:rPr>
@@ -4793,13 +4793,13 @@
           <w:rFonts w:ascii="Arial" w:hAnsi="Arial" w:eastAsia="Arial" w:cs="Arial"/>
           <w:b/>
         </w:rPr>
-        <w:t>Reviews are not bookings, profit or satisfaction.</w:t>
+        <w:t>Reviews measure activity indirectly.</w:t>
       </w:r>
       <w:r>
         <w:rPr>
           <w:rFonts w:ascii="Arial" w:hAnsi="Arial" w:eastAsia="Arial" w:cs="Arial"/>
         </w:rPr>
-        <w:t xml:space="preserve"> Inside Airbnb's 50% review rate sits within published estimates of 30.5%–72% (Inside Airbnb, n.d.), so dollar figures are rough. Ratings are lifetime averages, and the text tool reads English best.</w:t>
+        <w:t xml:space="preserve"> Inside Airbnb's 50% review rate sits within published estimates of 30.5%–72% (Inside Airbnb, n.d.), so nights and dollar figures are rough. Ratings are lifetime averages, and the text tool reads English best.</w:t>
       </w:r>
     </w:p>
     <w:p>
@@ -6248,7 +6248,7 @@
         <w:rPr>
           <w:rFonts w:ascii="Arial" w:hAnsi="Arial" w:eastAsia="Arial" w:cs="Arial"/>
         </w:rPr>
-        <w:t>Ranges show stability across fits, not confidence intervals; those including 1 (for example, Yarra Ranges) leave the direction uncertain. Across all 14 groups, the model ranked a random busy home above a random home that was not busy 71% of the time, against 60% for group rates (AUC 0.71 and 0.60). Treating same-host homes as related widens margins of error to 1.1–2.6 times ordinary ones. Inputs overlap little (variance inflation factors below 3). An ordinary test of curved price and amenity effects suggests slight curvature (p = 0.03; amenities alone, p = 0.011), but this is unclear once same-host homes are treated as related (amenities, p = 0.17). Full evaluation tables are in the repository (Huang &amp; Xu, 2026).</w:t>
+        <w:t>Ranges show stability across fits, not confidence intervals; those including 1 (for example, Yarra Ranges) leave the direction uncertain. Treating same-host homes as related widens margins of error to 1.1–2.6 times ordinary ones. Inputs overlap little (variance inflation factors below 3). An ordinary test of curved price and amenity effects suggests slight curvature (p = 0.03; amenities alone, p = 0.011), but this is unclear once same-host homes are treated as related (amenities, p = 0.17). Full evaluation tables are in the repository (Huang &amp; Xu, 2026).</w:t>
       </w:r>
     </w:p>
     <w:p>
@@ -6579,7 +6579,7 @@
         <w:rPr>
           <w:rFonts w:ascii="Arial" w:hAnsi="Arial" w:eastAsia="Arial" w:cs="Arial"/>
         </w:rPr>
-        <w:t>Each home was scored by a model built without its host (five folds of hosts). Of the 969 picked, 43.7% were busy (precision), against 25.3% overall, and they included 43.1% of busy homes (recall). Accuracy (71.5%) misleads: calling every home "not busy" scores 74.7%.</w:t>
+        <w:t>Each home was scored by a model built without its host (five folds of hosts). Of the 969 picked, 43.7% were busy (precision), against 25.3% overall, and they included 43.1% of busy homes (recall).</w:t>
       </w:r>
     </w:p>
     <w:p>
@@ -6619,8 +6619,8 @@
         <w:tblLayout w:type="fixed"/>
       </w:tblPr>
       <w:tblGrid>
-        <w:gridCol w:w="4385"/>
-        <w:gridCol w:w="5480"/>
+        <w:gridCol w:w="4241"/>
+        <w:gridCol w:w="5624"/>
       </w:tblGrid>
       <w:tr>
         <w:trPr>
@@ -6629,7 +6629,7 @@
         </w:trPr>
         <w:tc>
           <w:tcPr>
-            <w:tcW w:type="dxa" w:w="4385"/>
+            <w:tcW w:type="dxa" w:w="4241"/>
             <w:vAlign w:val="center"/>
             <w:shd w:val="clear" w:color="auto" w:fill="E9EEF3"/>
           </w:tcPr>
@@ -6651,7 +6651,7 @@
         </w:tc>
         <w:tc>
           <w:tcPr>
-            <w:tcW w:type="dxa" w:w="5480"/>
+            <w:tcW w:type="dxa" w:w="5624"/>
             <w:vAlign w:val="center"/>
             <w:shd w:val="clear" w:color="auto" w:fill="E9EEF3"/>
           </w:tcPr>
@@ -6678,7 +6678,7 @@
         </w:trPr>
         <w:tc>
           <w:tcPr>
-            <w:tcW w:type="dxa" w:w="4385"/>
+            <w:tcW w:type="dxa" w:w="4241"/>
             <w:vAlign w:val="center"/>
             <w:shd w:val="clear" w:color="auto" w:fill="FFFFFF"/>
           </w:tcPr>
@@ -6699,7 +6699,7 @@
         </w:tc>
         <w:tc>
           <w:tcPr>
-            <w:tcW w:type="dxa" w:w="5480"/>
+            <w:tcW w:type="dxa" w:w="5624"/>
             <w:vAlign w:val="center"/>
             <w:shd w:val="clear" w:color="auto" w:fill="FFFFFF"/>
           </w:tcPr>
@@ -6725,7 +6725,7 @@
         </w:trPr>
         <w:tc>
           <w:tcPr>
-            <w:tcW w:type="dxa" w:w="4385"/>
+            <w:tcW w:type="dxa" w:w="4241"/>
             <w:vAlign w:val="center"/>
             <w:shd w:val="clear" w:color="auto" w:fill="FFFFFF"/>
           </w:tcPr>
@@ -6746,7 +6746,7 @@
         </w:tc>
         <w:tc>
           <w:tcPr>
-            <w:tcW w:type="dxa" w:w="5480"/>
+            <w:tcW w:type="dxa" w:w="5624"/>
             <w:vAlign w:val="center"/>
             <w:shd w:val="clear" w:color="auto" w:fill="FFFFFF"/>
           </w:tcPr>
@@ -6772,54 +6772,7 @@
         </w:trPr>
         <w:tc>
           <w:tcPr>
-            <w:tcW w:type="dxa" w:w="4385"/>
-            <w:vAlign w:val="center"/>
-            <w:shd w:val="clear" w:color="auto" w:fill="FFFFFF"/>
-          </w:tcPr>
-          <w:p>
-            <w:pPr>
-              <w:keepNext/>
-              <w:spacing w:before="40" w:after="40" w:line="240" w:lineRule="auto"/>
-              <w:jc w:val="left"/>
-            </w:pPr>
-            <w:r>
-              <w:rPr>
-                <w:rFonts w:ascii="Arial" w:hAnsi="Arial" w:eastAsia="Arial" w:cs="Arial"/>
-                <w:sz w:val="21"/>
-              </w:rPr>
-              <w:t>Minimum group size of 30 or 75 homes</w:t>
-            </w:r>
-          </w:p>
-        </w:tc>
-        <w:tc>
-          <w:tcPr>
-            <w:tcW w:type="dxa" w:w="5480"/>
-            <w:vAlign w:val="center"/>
-            <w:shd w:val="clear" w:color="auto" w:fill="FFFFFF"/>
-          </w:tcPr>
-          <w:p>
-            <w:pPr>
-              <w:keepNext/>
-              <w:spacing w:before="40" w:after="40" w:line="240" w:lineRule="auto"/>
-              <w:jc w:val="left"/>
-            </w:pPr>
-            <w:r>
-              <w:rPr>
-                <w:rFonts w:ascii="Arial" w:hAnsi="Arial" w:eastAsia="Arial" w:cs="Arial"/>
-                <w:sz w:val="21"/>
-              </w:rPr>
-              <w:t>Same three groups, same order</w:t>
-            </w:r>
-          </w:p>
-        </w:tc>
-      </w:tr>
-      <w:tr>
-        <w:trPr>
-          <w:cantSplit/>
-        </w:trPr>
-        <w:tc>
-          <w:tcPr>
-            <w:tcW w:type="dxa" w:w="4385"/>
+            <w:tcW w:type="dxa" w:w="4241"/>
             <w:vAlign w:val="center"/>
             <w:shd w:val="clear" w:color="auto" w:fill="FFFFFF"/>
           </w:tcPr>
@@ -6840,7 +6793,7 @@
         </w:tc>
         <w:tc>
           <w:tcPr>
-            <w:tcW w:type="dxa" w:w="5480"/>
+            <w:tcW w:type="dxa" w:w="5624"/>
             <w:vAlign w:val="center"/>
             <w:shd w:val="clear" w:color="auto" w:fill="FFFFFF"/>
           </w:tcPr>
@@ -6866,7 +6819,7 @@
         </w:trPr>
         <w:tc>
           <w:tcPr>
-            <w:tcW w:type="dxa" w:w="4385"/>
+            <w:tcW w:type="dxa" w:w="4241"/>
             <w:vAlign w:val="center"/>
             <w:shd w:val="clear" w:color="auto" w:fill="FFFFFF"/>
           </w:tcPr>
@@ -6887,7 +6840,7 @@
         </w:tc>
         <w:tc>
           <w:tcPr>
-            <w:tcW w:type="dxa" w:w="5480"/>
+            <w:tcW w:type="dxa" w:w="5624"/>
             <w:vAlign w:val="center"/>
             <w:shd w:val="clear" w:color="auto" w:fill="FFFFFF"/>
           </w:tcPr>
@@ -6913,7 +6866,7 @@
         </w:trPr>
         <w:tc>
           <w:tcPr>
-            <w:tcW w:type="dxa" w:w="4385"/>
+            <w:tcW w:type="dxa" w:w="4241"/>
             <w:vAlign w:val="center"/>
             <w:shd w:val="clear" w:color="auto" w:fill="FFFFFF"/>
           </w:tcPr>
@@ -6927,13 +6880,13 @@
                 <w:rFonts w:ascii="Arial" w:hAnsi="Arial" w:eastAsia="Arial" w:cs="Arial"/>
                 <w:sz w:val="21"/>
               </w:rPr>
-              <w:t>Reduced model (amenities only) against random picking</w:t>
+              <w:t>Reduced model against random picking, by group</w:t>
             </w:r>
           </w:p>
         </w:tc>
         <w:tc>
           <w:tcPr>
-            <w:tcW w:type="dxa" w:w="5480"/>
+            <w:tcW w:type="dxa" w:w="5624"/>
             <w:vAlign w:val="center"/>
             <w:shd w:val="clear" w:color="auto" w:fill="FFFFFF"/>
           </w:tcPr>

</xml_diff>

<commit_message>
State group shares, review evidence and the word count precisely
Key Finding 1 and Recommendation 1 refer to each group's share of busy
homes. The review-text result is stated as measured (higher lifetime rating,
smaller share of reviews classified as negative) and called a supporting
indicator. Section 2 describes review counts as an indirect record of past
guest activity. The package check applies the 3,000-word limit to everything
before Appendix A and reports the appendix separately; results cut earlier
only for length return to Appendix A. Word: 2,634 words before the appendix.
</commit_message>
<xml_diff>
--- a/final-report/report-2026-10-04/Final_Report.docx
+++ b/final-report/report-2026-10-04/Final_Report.docx
@@ -318,7 +318,7 @@
         <w:rPr>
           <w:rFonts w:ascii="Arial" w:hAnsi="Arial" w:eastAsia="Arial" w:cs="Arial"/>
         </w:rPr>
-        <w:t xml:space="preserve"> Empty nights are the operator's main risk. Guests can review only after a stay, so review counts record past guest activity, the best public guide to demand. Turning them into booked nights needs assumptions about review rates and stay length, and shorter stays bring more reviews for the same nights. Review counts show neither profit (rents and costs are not in the data) nor satisfaction, so we translate them into nights and revenue and check what guests wrote (Section 5.1).</w:t>
+        <w:t xml:space="preserve"> Empty nights are the operator's main risk. Review counts are an indirect record of past guest activity and a public indicator of demand. Turning them into booked nights needs assumptions about review rates and stay length, and shorter stays bring more reviews for the same nights. Review counts show neither profit (rents and costs are not in the data) nor satisfaction, so we translate them into nights and revenue and check guest ratings and review text (Section 5.1).</w:t>
       </w:r>
     </w:p>
     <w:p>
@@ -1520,7 +1520,7 @@
         <w:rPr>
           <w:rFonts w:ascii="Arial" w:hAnsi="Arial" w:eastAsia="Arial" w:cs="Arial"/>
         </w:rPr>
-        <w:t>5.1 Data exploration: activity is uneven, and busy homes are well reviewed</w:t>
+        <w:t>5.1 Data exploration: activity is uneven, and busy homes are better rated</w:t>
       </w:r>
     </w:p>
     <w:p>
@@ -2471,7 +2471,7 @@
         <w:rPr>
           <w:rFonts w:ascii="Arial" w:hAnsi="Arial" w:eastAsia="Arial" w:cs="Arial"/>
         </w:rPr>
-        <w:t>Busy homes also had happier guests: a higher mean rating (4.84 against 4.69 stars) and proportionally fewer negative reviews (1.6% against 2.9%). We scored all 78,288 reviews from that year with VADER, a word-list tool (Hutto &amp; Gilbert, 2014); about 90% read as positive in both groups. So the high review counts of busy homes came with satisfied guests, not complaints.</w:t>
+        <w:t>Busy homes also had a higher mean lifetime rating (4.84 against 4.69 stars), and a smaller share of their reviews was classified as negative (1.6% against 2.9%). We scored all 78,288 reviews from that year with VADER, a word-list tool for English text (Hutto &amp; Gilbert, 2014); about 90% were classified as positive in both groups. The text score is a supporting indicator, not a tested measure of satisfaction.</w:t>
       </w:r>
     </w:p>
     <w:p>
@@ -4005,7 +4005,7 @@
         <w:rPr>
           <w:rFonts w:ascii="Arial" w:hAnsi="Arial" w:eastAsia="Arial" w:cs="Arial"/>
         </w:rPr>
-        <w:t xml:space="preserve"> City of Melbourne two- and three-bedroom apartments had the most busy homes, then, less certainly, Yarra Ranges three-bedroom houses. All three stayed ahead a year later and had above-median revenue (Figures 2 and 5, Table 4).</w:t>
+        <w:t xml:space="preserve"> City of Melbourne two- and three-bedroom apartments had the highest shares of busy homes, then, less certainly, Yarra Ranges three-bedroom houses. All three stayed ahead a year later and had above-median revenue (Figures 2 and 5, Table 4).</w:t>
       </w:r>
     </w:p>
     <w:p>
@@ -4055,13 +4055,13 @@
           <w:rFonts w:ascii="Arial" w:hAnsi="Arial" w:eastAsia="Arial" w:cs="Arial"/>
           <w:b/>
         </w:rPr>
-        <w:t>Satisfied guests:</w:t>
+        <w:t>Guest feedback:</w:t>
       </w:r>
       <w:r>
         <w:rPr>
           <w:rFonts w:ascii="Arial" w:hAnsi="Arial" w:eastAsia="Arial" w:cs="Arial"/>
         </w:rPr>
-        <w:t xml:space="preserve"> busy homes had higher ratings and proportionally fewer negative reviews (Table 3).</w:t>
+        <w:t xml:space="preserve"> busy homes had a higher mean rating and a smaller share of reviews classified as negative (Table 3).</w:t>
       </w:r>
     </w:p>
     <w:p>
@@ -4129,7 +4129,7 @@
         <w:rPr>
           <w:rFonts w:ascii="Arial" w:hAnsi="Arial" w:eastAsia="Arial" w:cs="Arial"/>
         </w:rPr>
-        <w:t xml:space="preserve"> (Figure 2, Table 4). Between leases that pass Recommendation 3, choose the larger cash-flow margin; if margins are similar, choose the group with more busy homes.</w:t>
+        <w:t xml:space="preserve"> (Figure 2, Table 4). Between leases that pass Recommendation 3, choose the larger cash-flow margin; if margins are similar, choose the group with the higher share of busy homes.</w:t>
       </w:r>
     </w:p>
     <w:p>
@@ -4799,7 +4799,7 @@
         <w:rPr>
           <w:rFonts w:ascii="Arial" w:hAnsi="Arial" w:eastAsia="Arial" w:cs="Arial"/>
         </w:rPr>
-        <w:t xml:space="preserve"> Inside Airbnb's 50% review rate sits within published estimates of 30.5%–72% (Inside Airbnb, n.d.), so nights and dollar figures are rough. Ratings are lifetime averages, and the text tool reads English best.</w:t>
+        <w:t xml:space="preserve"> Inside Airbnb's 50% review rate sits within published estimates of 30.5%–72% (Inside Airbnb, n.d.), so nights and dollar figures are rough. Ratings are lifetime averages, and VADER does not translate reviews written in other languages.</w:t>
       </w:r>
     </w:p>
     <w:p>
@@ -5314,7 +5314,7 @@
         <w:rPr>
           <w:rFonts w:ascii="Arial" w:hAnsi="Arial" w:eastAsia="Arial" w:cs="Arial"/>
         </w:rPr>
-        <w:t>In Table A1, each odds ratio multiplies the odds of being busy (busy homes per home that is not busy), averaged over the 50 fits; above 1 raises the chance, below 1 lowers it.</w:t>
+        <w:t>Group median prices, and the most common minimum stay used to fill gaps, come only from the homes each model was built on. In Table A1, each odds ratio multiplies the odds of being busy (busy homes per home that is not busy), averaged over the 50 fits; above 1 raises the chance, below 1 lowers it.</w:t>
       </w:r>
     </w:p>
     <w:p>
@@ -6248,7 +6248,7 @@
         <w:rPr>
           <w:rFonts w:ascii="Arial" w:hAnsi="Arial" w:eastAsia="Arial" w:cs="Arial"/>
         </w:rPr>
-        <w:t>Ranges show stability across fits, not confidence intervals; those including 1 (for example, Yarra Ranges) leave the direction uncertain. Treating same-host homes as related widens margins of error to 1.1–2.6 times ordinary ones. Inputs overlap little (variance inflation factors below 3). An ordinary test of curved price and amenity effects suggests slight curvature (p = 0.03; amenities alone, p = 0.011), but this is unclear once same-host homes are treated as related (amenities, p = 0.17). Full evaluation tables are in the repository (Huang &amp; Xu, 2026).</w:t>
+        <w:t>Ranges show stability across fits, not confidence intervals; those including 1 (for example, Yarra Ranges) leave the direction uncertain. Across the 50 tests on all 14 groups, the model ranked a random busy home above a random home that was not busy 71% of the time, against 60% for group rates (AUC 0.71 and 0.60). Treating same-host homes as related widens margins of error to 1.1–2.6 times ordinary ones. Inputs overlap little (variance inflation factors below 3). An ordinary test of curved price and amenity effects suggests slight curvature (p = 0.03; amenities alone, p = 0.011), but this is unclear once same-host homes are treated as related (amenities, p = 0.17). Full evaluation tables are in the repository (Huang &amp; Xu, 2026).</w:t>
       </w:r>
     </w:p>
     <w:p>
@@ -6579,7 +6579,7 @@
         <w:rPr>
           <w:rFonts w:ascii="Arial" w:hAnsi="Arial" w:eastAsia="Arial" w:cs="Arial"/>
         </w:rPr>
-        <w:t>Each home was scored by a model built without its host (five folds of hosts). Of the 969 picked, 43.7% were busy (precision), against 25.3% overall, and they included 43.1% of busy homes (recall).</w:t>
+        <w:t>Each home was scored by a model built without its host (five folds of hosts). Of the 969 picked, 43.7% were busy (precision), against 25.3% overall, and they included 43.1% of busy homes (recall). Accuracy (71.5%) is not a useful guide here, because calling every home "not busy" scores 74.7%.</w:t>
       </w:r>
     </w:p>
     <w:p>
@@ -6619,8 +6619,8 @@
         <w:tblLayout w:type="fixed"/>
       </w:tblPr>
       <w:tblGrid>
-        <w:gridCol w:w="4241"/>
-        <w:gridCol w:w="5624"/>
+        <w:gridCol w:w="4116"/>
+        <w:gridCol w:w="5749"/>
       </w:tblGrid>
       <w:tr>
         <w:trPr>
@@ -6629,7 +6629,7 @@
         </w:trPr>
         <w:tc>
           <w:tcPr>
-            <w:tcW w:type="dxa" w:w="4241"/>
+            <w:tcW w:type="dxa" w:w="4116"/>
             <w:vAlign w:val="center"/>
             <w:shd w:val="clear" w:color="auto" w:fill="E9EEF3"/>
           </w:tcPr>
@@ -6651,7 +6651,7 @@
         </w:tc>
         <w:tc>
           <w:tcPr>
-            <w:tcW w:type="dxa" w:w="5624"/>
+            <w:tcW w:type="dxa" w:w="5749"/>
             <w:vAlign w:val="center"/>
             <w:shd w:val="clear" w:color="auto" w:fill="E9EEF3"/>
           </w:tcPr>
@@ -6678,7 +6678,7 @@
         </w:trPr>
         <w:tc>
           <w:tcPr>
-            <w:tcW w:type="dxa" w:w="4241"/>
+            <w:tcW w:type="dxa" w:w="4116"/>
             <w:vAlign w:val="center"/>
             <w:shd w:val="clear" w:color="auto" w:fill="FFFFFF"/>
           </w:tcPr>
@@ -6699,7 +6699,7 @@
         </w:tc>
         <w:tc>
           <w:tcPr>
-            <w:tcW w:type="dxa" w:w="5624"/>
+            <w:tcW w:type="dxa" w:w="5749"/>
             <w:vAlign w:val="center"/>
             <w:shd w:val="clear" w:color="auto" w:fill="FFFFFF"/>
           </w:tcPr>
@@ -6725,7 +6725,7 @@
         </w:trPr>
         <w:tc>
           <w:tcPr>
-            <w:tcW w:type="dxa" w:w="4241"/>
+            <w:tcW w:type="dxa" w:w="4116"/>
             <w:vAlign w:val="center"/>
             <w:shd w:val="clear" w:color="auto" w:fill="FFFFFF"/>
           </w:tcPr>
@@ -6746,7 +6746,7 @@
         </w:tc>
         <w:tc>
           <w:tcPr>
-            <w:tcW w:type="dxa" w:w="5624"/>
+            <w:tcW w:type="dxa" w:w="5749"/>
             <w:vAlign w:val="center"/>
             <w:shd w:val="clear" w:color="auto" w:fill="FFFFFF"/>
           </w:tcPr>
@@ -6772,7 +6772,54 @@
         </w:trPr>
         <w:tc>
           <w:tcPr>
-            <w:tcW w:type="dxa" w:w="4241"/>
+            <w:tcW w:type="dxa" w:w="4116"/>
+            <w:vAlign w:val="center"/>
+            <w:shd w:val="clear" w:color="auto" w:fill="FFFFFF"/>
+          </w:tcPr>
+          <w:p>
+            <w:pPr>
+              <w:keepNext/>
+              <w:spacing w:before="40" w:after="40" w:line="240" w:lineRule="auto"/>
+              <w:jc w:val="left"/>
+            </w:pPr>
+            <w:r>
+              <w:rPr>
+                <w:rFonts w:ascii="Arial" w:hAnsi="Arial" w:eastAsia="Arial" w:cs="Arial"/>
+                <w:sz w:val="21"/>
+              </w:rPr>
+              <w:t>Minimum group size of 30 or 75 homes</w:t>
+            </w:r>
+          </w:p>
+        </w:tc>
+        <w:tc>
+          <w:tcPr>
+            <w:tcW w:type="dxa" w:w="5749"/>
+            <w:vAlign w:val="center"/>
+            <w:shd w:val="clear" w:color="auto" w:fill="FFFFFF"/>
+          </w:tcPr>
+          <w:p>
+            <w:pPr>
+              <w:keepNext/>
+              <w:spacing w:before="40" w:after="40" w:line="240" w:lineRule="auto"/>
+              <w:jc w:val="left"/>
+            </w:pPr>
+            <w:r>
+              <w:rPr>
+                <w:rFonts w:ascii="Arial" w:hAnsi="Arial" w:eastAsia="Arial" w:cs="Arial"/>
+                <w:sz w:val="21"/>
+              </w:rPr>
+              <w:t>Same three groups, same order</w:t>
+            </w:r>
+          </w:p>
+        </w:tc>
+      </w:tr>
+      <w:tr>
+        <w:trPr>
+          <w:cantSplit/>
+        </w:trPr>
+        <w:tc>
+          <w:tcPr>
+            <w:tcW w:type="dxa" w:w="4116"/>
             <w:vAlign w:val="center"/>
             <w:shd w:val="clear" w:color="auto" w:fill="FFFFFF"/>
           </w:tcPr>
@@ -6793,7 +6840,7 @@
         </w:tc>
         <w:tc>
           <w:tcPr>
-            <w:tcW w:type="dxa" w:w="5624"/>
+            <w:tcW w:type="dxa" w:w="5749"/>
             <w:vAlign w:val="center"/>
             <w:shd w:val="clear" w:color="auto" w:fill="FFFFFF"/>
           </w:tcPr>
@@ -6819,7 +6866,7 @@
         </w:trPr>
         <w:tc>
           <w:tcPr>
-            <w:tcW w:type="dxa" w:w="4241"/>
+            <w:tcW w:type="dxa" w:w="4116"/>
             <w:vAlign w:val="center"/>
             <w:shd w:val="clear" w:color="auto" w:fill="FFFFFF"/>
           </w:tcPr>
@@ -6840,7 +6887,7 @@
         </w:tc>
         <w:tc>
           <w:tcPr>
-            <w:tcW w:type="dxa" w:w="5624"/>
+            <w:tcW w:type="dxa" w:w="5749"/>
             <w:vAlign w:val="center"/>
             <w:shd w:val="clear" w:color="auto" w:fill="FFFFFF"/>
           </w:tcPr>
@@ -6866,7 +6913,54 @@
         </w:trPr>
         <w:tc>
           <w:tcPr>
-            <w:tcW w:type="dxa" w:w="4241"/>
+            <w:tcW w:type="dxa" w:w="4116"/>
+            <w:vAlign w:val="center"/>
+            <w:shd w:val="clear" w:color="auto" w:fill="FFFFFF"/>
+          </w:tcPr>
+          <w:p>
+            <w:pPr>
+              <w:keepNext/>
+              <w:spacing w:before="40" w:after="40" w:line="240" w:lineRule="auto"/>
+              <w:jc w:val="left"/>
+            </w:pPr>
+            <w:r>
+              <w:rPr>
+                <w:rFonts w:ascii="Arial" w:hAnsi="Arial" w:eastAsia="Arial" w:cs="Arial"/>
+                <w:sz w:val="21"/>
+              </w:rPr>
+              <w:t>Model picks 10%, 25% or 50% of each priority group</w:t>
+            </w:r>
+          </w:p>
+        </w:tc>
+        <w:tc>
+          <w:tcPr>
+            <w:tcW w:type="dxa" w:w="5749"/>
+            <w:vAlign w:val="center"/>
+            <w:shd w:val="clear" w:color="auto" w:fill="FFFFFF"/>
+          </w:tcPr>
+          <w:p>
+            <w:pPr>
+              <w:keepNext/>
+              <w:spacing w:before="40" w:after="40" w:line="240" w:lineRule="auto"/>
+              <w:jc w:val="left"/>
+            </w:pPr>
+            <w:r>
+              <w:rPr>
+                <w:rFonts w:ascii="Arial" w:hAnsi="Arial" w:eastAsia="Arial" w:cs="Arial"/>
+                <w:sz w:val="21"/>
+              </w:rPr>
+              <w:t>54.5%, 49.6% and 43.1% of picks busy; they include 17.1%, 38.3% and 66.7% of busy homes</w:t>
+            </w:r>
+          </w:p>
+        </w:tc>
+      </w:tr>
+      <w:tr>
+        <w:trPr>
+          <w:cantSplit/>
+        </w:trPr>
+        <w:tc>
+          <w:tcPr>
+            <w:tcW w:type="dxa" w:w="4116"/>
             <w:vAlign w:val="center"/>
             <w:shd w:val="clear" w:color="auto" w:fill="FFFFFF"/>
           </w:tcPr>
@@ -6886,7 +6980,7 @@
         </w:tc>
         <w:tc>
           <w:tcPr>
-            <w:tcW w:type="dxa" w:w="5624"/>
+            <w:tcW w:type="dxa" w:w="5749"/>
             <w:vAlign w:val="center"/>
             <w:shd w:val="clear" w:color="auto" w:fill="FFFFFF"/>
           </w:tcPr>

</xml_diff>

<commit_message>
Finalize Group 2 report wording and submission documents
</commit_message>
<xml_diff>
--- a/final-report/report-2026-10-04/Final_Report.docx
+++ b/final-report/report-2026-10-04/Final_Report.docx
@@ -932,7 +932,7 @@
         <w:rPr>
           <w:rFonts w:ascii="Arial" w:hAnsi="Arial" w:eastAsia="Arial" w:cs="Arial"/>
         </w:rPr>
-        <w:t xml:space="preserve"> A logistic regression estimates each home's chance of being busy from six inputs, holding the others fixed (Table 2; R Core Team, 2026). This separates location from how a home is run. We also test a simpler two-setting rule: one-night stays, and a price at or below the group median.</w:t>
+        <w:t xml:space="preserve"> A logistic regression estimates each home's chance of being busy from six inputs, holding the others fixed (Table 2; R Core Team, 2026). This separates location from how a home is run. We then distil this into a simpler two-setting rule: one-night stays, and a price at or below the group median.</w:t>
       </w:r>
     </w:p>
     <w:p>
@@ -3540,7 +3540,7 @@
         <w:rPr>
           <w:rFonts w:ascii="Arial" w:hAnsi="Arial" w:eastAsia="Arial" w:cs="Arial"/>
         </w:rPr>
-        <w:t>A two-setting rule turns this into a simple check (Table 5). In the priority groups, half (50.4%) of homes with one-night stays priced at or below their group median were busy, against a third (33.4%) of all their homes and 9.3% with neither setting. Only 20 of 90 Yarra Ranges houses accept one-night stays, so the rule rests mainly on City apartments.</w:t>
+        <w:t>A two-setting rule turns this into a simple check (Table 5). In the priority groups, half (50.4%) of homes with one-night stays priced at or below their group median were busy, against a third (33.4%) of all homes in these groups and 9.3% with neither setting. Only 20 of 90 Yarra Ranges houses accept one-night stays, so the rule rests mainly on City apartments.</w:t>
       </w:r>
     </w:p>
     <w:p>
@@ -3892,7 +3892,7 @@
         <w:rPr>
           <w:rFonts w:ascii="Arial" w:hAnsi="Arial" w:eastAsia="Arial" w:cs="Arial"/>
         </w:rPr>
-        <w:t>We repeated the ranking on the earlier year (ten groups, 2,657 homes with two years of reviews), with a 34-review bar set the same way. The same three groups led: 33.6% of their homes reached it, against 19.9% elsewhere (Figure 5). On the same bar a year later, they still led (27.1% against 14.9%), although Yarra Ranges houses fell to 21.4%.</w:t>
+        <w:t>We repeated the ranking on the earlier year (ten groups, 2,657 homes with two years of reviews), with a 34-review threshold set from the earlier year's reference homes. The same three groups led: 33.6% of their homes reached it, against 19.9% elsewhere (Figure 5). On the same threshold a year later, they still led (27.1% against 14.9%), although Yarra Ranges houses fell to 21.4%.</w:t>
       </w:r>
     </w:p>
     <w:p>

</xml_diff>